<commit_message>
Review 2: JS module architecture and app shell
</commit_message>
<xml_diff>
--- a/docs/SplitStack_Prompt_Log.docx
+++ b/docs/SplitStack_Prompt_Log.docx
@@ -132,7 +132,7 @@
           <w:sz w:val="21"/>
           <w:szCs w:val="21"/>
         </w:rPr>
-        <w:t xml:space="preserve">21</w:t>
+        <w:t xml:space="preserve">23</w:t>
       </w:r>
     </w:p>
     <w:p>
@@ -153,7 +153,7 @@
           <w:sz w:val="21"/>
           <w:szCs w:val="21"/>
         </w:rPr>
-        <w:t xml:space="preserve">2026-10-15</w:t>
+        <w:t xml:space="preserve">2026-10-16</w:t>
       </w:r>
     </w:p>
     <w:p>
@@ -568,7 +568,7 @@
                 <w:sz w:val="18"/>
                 <w:szCs w:val="18"/>
               </w:rPr>
-              <w:t xml:space="preserve">0</w:t>
+              <w:t xml:space="preserve">2</w:t>
             </w:r>
           </w:p>
         </w:tc>
@@ -3379,6 +3379,245 @@
           </w:p>
         </w:tc>
       </w:tr>
+      <w:tr>
+        <w:tc>
+          <w:tcPr>
+            <w:tcW w:type="dxa" w:w="700"/>
+            <w:shd w:fill="F7F7FB" w:color="auto" w:val="clear"/>
+            <w:tcMar>
+              <w:top w:type="dxa" w:w="60"/>
+              <w:left w:type="dxa" w:w="100"/>
+              <w:bottom w:type="dxa" w:w="60"/>
+              <w:right w:type="dxa" w:w="100"/>
+            </w:tcMar>
+          </w:tcPr>
+          <w:p>
+            <w:r>
+              <w:rPr>
+                <w:b w:val="false"/>
+                <w:bCs w:val="false"/>
+                <w:color w:val="222222"/>
+                <w:sz w:val="18"/>
+                <w:szCs w:val="18"/>
+              </w:rPr>
+              <w:t xml:space="preserve">22</w:t>
+            </w:r>
+          </w:p>
+        </w:tc>
+        <w:tc>
+          <w:tcPr>
+            <w:tcW w:type="dxa" w:w="1500"/>
+            <w:shd w:fill="F7F7FB" w:color="auto" w:val="clear"/>
+            <w:tcMar>
+              <w:top w:type="dxa" w:w="60"/>
+              <w:left w:type="dxa" w:w="100"/>
+              <w:bottom w:type="dxa" w:w="60"/>
+              <w:right w:type="dxa" w:w="100"/>
+            </w:tcMar>
+          </w:tcPr>
+          <w:p>
+            <w:r>
+              <w:rPr>
+                <w:b w:val="false"/>
+                <w:bCs w:val="false"/>
+                <w:color w:val="222222"/>
+                <w:sz w:val="18"/>
+                <w:szCs w:val="18"/>
+              </w:rPr>
+              <w:t xml:space="preserve">Review 2</w:t>
+            </w:r>
+          </w:p>
+        </w:tc>
+        <w:tc>
+          <w:tcPr>
+            <w:tcW w:type="dxa" w:w="4538"/>
+            <w:shd w:fill="F7F7FB" w:color="auto" w:val="clear"/>
+            <w:tcMar>
+              <w:top w:type="dxa" w:w="60"/>
+              <w:left w:type="dxa" w:w="100"/>
+              <w:bottom w:type="dxa" w:w="60"/>
+              <w:right w:type="dxa" w:w="100"/>
+            </w:tcMar>
+          </w:tcPr>
+          <w:p>
+            <w:r>
+              <w:rPr>
+                <w:b w:val="false"/>
+                <w:bCs w:val="false"/>
+                <w:color w:val="222222"/>
+                <w:sz w:val="18"/>
+                <w:szCs w:val="18"/>
+              </w:rPr>
+              <w:t xml:space="preserve">Request: proceed with Review 2 Step P1</w:t>
+            </w:r>
+          </w:p>
+        </w:tc>
+        <w:tc>
+          <w:tcPr>
+            <w:tcW w:type="dxa" w:w="1500"/>
+            <w:shd w:fill="F7F7FB" w:color="auto" w:val="clear"/>
+            <w:tcMar>
+              <w:top w:type="dxa" w:w="60"/>
+              <w:left w:type="dxa" w:w="100"/>
+              <w:bottom w:type="dxa" w:w="60"/>
+              <w:right w:type="dxa" w:w="100"/>
+            </w:tcMar>
+          </w:tcPr>
+          <w:p>
+            <w:r>
+              <w:rPr>
+                <w:b w:val="false"/>
+                <w:bCs w:val="false"/>
+                <w:color w:val="222222"/>
+                <w:sz w:val="18"/>
+                <w:szCs w:val="18"/>
+              </w:rPr>
+              <w:t xml:space="preserve">User prompt</w:t>
+            </w:r>
+          </w:p>
+        </w:tc>
+        <w:tc>
+          <w:tcPr>
+            <w:tcW w:type="dxa" w:w="1400"/>
+            <w:shd w:fill="F7F7FB" w:color="auto" w:val="clear"/>
+            <w:tcMar>
+              <w:top w:type="dxa" w:w="60"/>
+              <w:left w:type="dxa" w:w="100"/>
+              <w:bottom w:type="dxa" w:w="60"/>
+              <w:right w:type="dxa" w:w="100"/>
+            </w:tcMar>
+          </w:tcPr>
+          <w:p>
+            <w:r>
+              <w:rPr>
+                <w:b w:val="false"/>
+                <w:bCs w:val="false"/>
+                <w:color w:val="222222"/>
+                <w:sz w:val="18"/>
+                <w:szCs w:val="18"/>
+              </w:rPr>
+              <w:t xml:space="preserve">2026-10-16</w:t>
+            </w:r>
+          </w:p>
+        </w:tc>
+      </w:tr>
+      <w:tr>
+        <w:tc>
+          <w:tcPr>
+            <w:tcW w:type="dxa" w:w="700"/>
+            <w:tcMar>
+              <w:top w:type="dxa" w:w="60"/>
+              <w:left w:type="dxa" w:w="100"/>
+              <w:bottom w:type="dxa" w:w="60"/>
+              <w:right w:type="dxa" w:w="100"/>
+            </w:tcMar>
+          </w:tcPr>
+          <w:p>
+            <w:r>
+              <w:rPr>
+                <w:b w:val="false"/>
+                <w:bCs w:val="false"/>
+                <w:color w:val="222222"/>
+                <w:sz w:val="18"/>
+                <w:szCs w:val="18"/>
+              </w:rPr>
+              <w:t xml:space="preserve">23</w:t>
+            </w:r>
+          </w:p>
+        </w:tc>
+        <w:tc>
+          <w:tcPr>
+            <w:tcW w:type="dxa" w:w="1500"/>
+            <w:tcMar>
+              <w:top w:type="dxa" w:w="60"/>
+              <w:left w:type="dxa" w:w="100"/>
+              <w:bottom w:type="dxa" w:w="60"/>
+              <w:right w:type="dxa" w:w="100"/>
+            </w:tcMar>
+          </w:tcPr>
+          <w:p>
+            <w:r>
+              <w:rPr>
+                <w:b w:val="false"/>
+                <w:bCs w:val="false"/>
+                <w:color w:val="222222"/>
+                <w:sz w:val="18"/>
+                <w:szCs w:val="18"/>
+              </w:rPr>
+              <w:t xml:space="preserve">Review 2</w:t>
+            </w:r>
+          </w:p>
+        </w:tc>
+        <w:tc>
+          <w:tcPr>
+            <w:tcW w:type="dxa" w:w="4538"/>
+            <w:tcMar>
+              <w:top w:type="dxa" w:w="60"/>
+              <w:left w:type="dxa" w:w="100"/>
+              <w:bottom w:type="dxa" w:w="60"/>
+              <w:right w:type="dxa" w:w="100"/>
+            </w:tcMar>
+          </w:tcPr>
+          <w:p>
+            <w:r>
+              <w:rPr>
+                <w:b w:val="false"/>
+                <w:bCs w:val="false"/>
+                <w:color w:val="222222"/>
+                <w:sz w:val="18"/>
+                <w:szCs w:val="18"/>
+              </w:rPr>
+              <w:t xml:space="preserve">JavaScript architecture and app shell</w:t>
+            </w:r>
+          </w:p>
+        </w:tc>
+        <w:tc>
+          <w:tcPr>
+            <w:tcW w:type="dxa" w:w="1500"/>
+            <w:tcMar>
+              <w:top w:type="dxa" w:w="60"/>
+              <w:left w:type="dxa" w:w="100"/>
+              <w:bottom w:type="dxa" w:w="60"/>
+              <w:right w:type="dxa" w:w="100"/>
+            </w:tcMar>
+          </w:tcPr>
+          <w:p>
+            <w:r>
+              <w:rPr>
+                <w:b w:val="false"/>
+                <w:bCs w:val="false"/>
+                <w:color w:val="222222"/>
+                <w:sz w:val="18"/>
+                <w:szCs w:val="18"/>
+              </w:rPr>
+              <w:t xml:space="preserve">Working prompt</w:t>
+            </w:r>
+          </w:p>
+        </w:tc>
+        <w:tc>
+          <w:tcPr>
+            <w:tcW w:type="dxa" w:w="1400"/>
+            <w:tcMar>
+              <w:top w:type="dxa" w:w="60"/>
+              <w:left w:type="dxa" w:w="100"/>
+              <w:bottom w:type="dxa" w:w="60"/>
+              <w:right w:type="dxa" w:w="100"/>
+            </w:tcMar>
+          </w:tcPr>
+          <w:p>
+            <w:r>
+              <w:rPr>
+                <w:b w:val="false"/>
+                <w:bCs w:val="false"/>
+                <w:color w:val="222222"/>
+                <w:sz w:val="18"/>
+                <w:szCs w:val="18"/>
+              </w:rPr>
+              <w:t xml:space="preserve">2026-10-16</w:t>
+            </w:r>
+          </w:p>
+        </w:tc>
+      </w:tr>
     </w:tbl>
     <w:p>
       <w:r>
@@ -6088,7 +6327,7 @@
         <w:spacing w:before="360"/>
       </w:pPr>
       <w:r>
-        <w:t xml:space="preserve">Wrap-up - Documentation, cleanup and deployment</w:t>
+        <w:t xml:space="preserve">Review 2 - JavaScript - vanilla ES modules, interactivity, client-side algorithms</w:t>
       </w:r>
     </w:p>
     <w:p>
@@ -6097,7 +6336,7 @@
         <w:keepNext/>
       </w:pPr>
       <w:r>
-        <w:t xml:space="preserve">#13  Request: GitHub repository, website link and PDF of prompts</w:t>
+        <w:t xml:space="preserve">#22  Request: proceed with Review 2 Step P1</w:t>
       </w:r>
     </w:p>
     <w:p>
@@ -6111,7 +6350,7 @@
           <w:sz w:val="18"/>
           <w:szCs w:val="18"/>
         </w:rPr>
-        <w:t xml:space="preserve">User prompt  |  2026-10-15</w:t>
+        <w:t xml:space="preserve">User prompt  |  2026-10-16</w:t>
       </w:r>
     </w:p>
     <w:p>
@@ -6145,7 +6384,7 @@
           <w:sz w:val="19"/>
           <w:szCs w:val="19"/>
         </w:rPr>
-        <w:t xml:space="preserve">create a new repositry for this project in my gihub , and after than give me the github link and then the website link and also a pdf containing the prompts to complete project.</w:t>
+        <w:t xml:space="preserve">Proceed with P1 — JavaScript architecture and app shell — from the handover PDF. Preconditions: Confirm the current branch is refurbish and the working tree has no unexpected changes. Preserve the untracked docs/audit/ directory. Install the root npm dependencies using the existing package.json. For this PowerShell session, set $env:PY_PYTHON3 = "3.12" so py -3 resolves correctly. Check whether ReportLab is installed; if not, install it for Python 3.12. Do not change Git remotes, push to a different repository, or alter package scripts to work around environment issues. Implement only P1 as specified in SplitStack_Handover_Prompts.pdf. Read the relevant HTML and CSS before editing. Preserve the existing design and no-JavaScript fallback. Follow the PDF's accessibility, theme, navigation, toast, confirmation-dialog, logging, and verification requirements. Run npm run lint:html and the P1 manual checks you can perform. Record anything you could not verify honestly. Before committing, show me the proposed changed-file list and verification results. Do not commit or push until I approve. Do not start P2.</w:t>
       </w:r>
     </w:p>
     <w:p>
@@ -6173,7 +6412,7 @@
           <w:sz w:val="21"/>
           <w:szCs w:val="21"/>
         </w:rPr>
-        <w:t xml:space="preserve">Publish the project under the student's own GitHub account, host the site, and export the prompt log (including the remaining planned prompts) as a PDF.</w:t>
+        <w:t xml:space="preserve">Authorize execution of Step P1 with strict preconditions and manual approval gate.</w:t>
       </w:r>
     </w:p>
     <w:p>
@@ -6234,7 +6473,7 @@
           <w:sz w:val="21"/>
           <w:szCs w:val="21"/>
         </w:rPr>
-        <w:t xml:space="preserve">Done: see the following entries.</w:t>
+        <w:t xml:space="preserve">Confirmed clean refurbish branch, installed dependencies and ReportLab, and executed Step P1 implementation.</w:t>
       </w:r>
     </w:p>
     <w:p>
@@ -6262,7 +6501,7 @@
           <w:sz w:val="21"/>
           <w:szCs w:val="21"/>
         </w:rPr>
-        <w:t xml:space="preserve">-</w:t>
+        <w:t xml:space="preserve">npm run lint:html, automated unit tests, and serve-client HTTP validation.</w:t>
       </w:r>
     </w:p>
     <w:p>
@@ -6282,7 +6521,7 @@
         <w:keepNext/>
       </w:pPr>
       <w:r>
-        <w:t xml:space="preserve">#14  PDF export of the prompt log, including planned prompts</w:t>
+        <w:t xml:space="preserve">#23  JavaScript architecture and app shell</w:t>
       </w:r>
     </w:p>
     <w:p>
@@ -6296,7 +6535,7 @@
           <w:sz w:val="18"/>
           <w:szCs w:val="18"/>
         </w:rPr>
-        <w:t xml:space="preserve">Working prompt  |  2026-10-15</w:t>
+        <w:t xml:space="preserve">Working prompt  |  2026-10-16</w:t>
       </w:r>
     </w:p>
     <w:p>
@@ -6330,7 +6569,19 @@
           <w:sz w:val="19"/>
           <w:szCs w:val="19"/>
         </w:rPr>
-        <w:t xml:space="preserve">Export the prompt log to PDF with a Python reportlab script (docs/tools/build_prompt_pdf.py) that reads docs/prompt_log.json: a title page, a stage overview table, a summary of every entry, Part A with every executed prompt verbatim in a shaded box with purpose, files, result and verification, and Part B with the planned prompts that complete Review 2, Review 3 and the wrap-up, clearly marked as not yet run. Add the planned prompts to prompt_log.json and to the Word log as well, and make "npm run log" rebuild both documents.</w:t>
+        <w:t xml:space="preserve">Step P1 (Review 2): JavaScript architecture and app shell.
+Add vanilla JavaScript to the Review 1 pages as native ES modules.
+1. Add data-page="&lt;page-name&gt;" to the &lt;body&gt; of index.html and every file in client/pages/ (e.g. data-page="dashboard", data-page="expense-form"). Load one entry script at the end of each page: &lt;script type="module" src="../js/app.js"&gt;&lt;/script&gt; (index.html: src="js/app.js").
+2. Create client/js/ with:
+- app.js: entry point. Reads document.body.dataset.page, initialises the shared UI, then dynamically imports ./pages/&lt;page&gt;.js if it exists and calls its exported init(). A missing page module is not an error.
+- core/dom.js: qs, qsa, on, delegate, createEl helpers.
+- core/format.js: formatINR(paise) using Intl.NumberFormat('en-IN', {style:'currency', currency:'INR'}), formatDate / formatRelativeDate helpers.
+- ui/theme.js: dark / light / system toggle saved in localStorage, applied to &lt;html data-theme&gt;. Add a tiny inline script in each page's &lt;head&gt; that applies the saved theme before first paint (no flash). Wire it to a theme button in the topbar (add the button if missing, matching existing button styles).
+- ui/nav.js: replace the CSS checkbox drawer with a real &lt;button aria-expanded aria-controls="sidebar"&gt;. Close on Escape, scrim click and nav-link click; trap focus inside while open; return focus to the button when closed. Keep the page usable without JS.
+- ui/toast.js: accessible toasts (role="status", aria-live="polite"), auto-dismiss, dismiss button.
+- ui/confirm.js: a &lt;dialog&gt;-based confirm that replaces window.confirm for every delete button/form.
+3. Add client/js/package.json containing {"type": "module"} so Node (used for unit tests later) treats these files as ES modules.
+4. All wrapped in try/catch where localStorage is touched (private windows can throw).</w:t>
       </w:r>
     </w:p>
     <w:p>
@@ -6358,7 +6609,7 @@
           <w:sz w:val="21"/>
           <w:szCs w:val="21"/>
         </w:rPr>
-        <w:t xml:space="preserve">Give the student a PDF containing the prompts needed to complete the whole project.</w:t>
+        <w:t xml:space="preserve">Establish the client JavaScript ES module foundation, theme switching, accessible drawer, toast notifications, and confirm dialog.</w:t>
       </w:r>
     </w:p>
     <w:p>
@@ -6391,7 +6642,7 @@
           <w:sz w:val="19"/>
           <w:szCs w:val="19"/>
         </w:rPr>
-        <w:t xml:space="preserve">docs/tools/build_prompt_pdf.py</w:t>
+        <w:t xml:space="preserve">client/js/package.json</w:t>
       </w:r>
     </w:p>
     <w:p>
@@ -6408,7 +6659,7 @@
           <w:sz w:val="19"/>
           <w:szCs w:val="19"/>
         </w:rPr>
-        <w:t xml:space="preserve">docs/tools/build-prompt-log.js</w:t>
+        <w:t xml:space="preserve">client/js/app.js</w:t>
       </w:r>
     </w:p>
     <w:p>
@@ -6425,7 +6676,7 @@
           <w:sz w:val="19"/>
           <w:szCs w:val="19"/>
         </w:rPr>
-        <w:t xml:space="preserve">docs/prompt_log.json</w:t>
+        <w:t xml:space="preserve">client/js/core/dom.js</w:t>
       </w:r>
     </w:p>
     <w:p>
@@ -6442,7 +6693,7 @@
           <w:sz w:val="19"/>
           <w:szCs w:val="19"/>
         </w:rPr>
-        <w:t xml:space="preserve">docs/SplitStack_Prompt_Log.pdf</w:t>
+        <w:t xml:space="preserve">client/js/core/format.js</w:t>
       </w:r>
     </w:p>
     <w:p>
@@ -6459,7 +6710,7 @@
           <w:sz w:val="19"/>
           <w:szCs w:val="19"/>
         </w:rPr>
-        <w:t xml:space="preserve">docs/SplitStack_Prompt_Log.docx</w:t>
+        <w:t xml:space="preserve">client/js/ui/theme.js</w:t>
       </w:r>
     </w:p>
     <w:p>
@@ -6476,7 +6727,109 @@
           <w:sz w:val="19"/>
           <w:szCs w:val="19"/>
         </w:rPr>
-        <w:t xml:space="preserve">package.json</w:t>
+        <w:t xml:space="preserve">client/js/ui/nav.js</w:t>
+      </w:r>
+    </w:p>
+    <w:p>
+      <w:pPr>
+        <w:pStyle w:val="ListParagraph"/>
+        <w:numPr>
+          <w:ilvl w:val="0"/>
+          <w:numId w:val="2"/>
+        </w:numPr>
+      </w:pPr>
+      <w:r>
+        <w:rPr>
+          <w:rFonts w:ascii="Consolas" w:cs="Consolas" w:eastAsia="Consolas" w:hAnsi="Consolas"/>
+          <w:sz w:val="19"/>
+          <w:szCs w:val="19"/>
+        </w:rPr>
+        <w:t xml:space="preserve">client/js/ui/toast.js</w:t>
+      </w:r>
+    </w:p>
+    <w:p>
+      <w:pPr>
+        <w:pStyle w:val="ListParagraph"/>
+        <w:numPr>
+          <w:ilvl w:val="0"/>
+          <w:numId w:val="2"/>
+        </w:numPr>
+      </w:pPr>
+      <w:r>
+        <w:rPr>
+          <w:rFonts w:ascii="Consolas" w:cs="Consolas" w:eastAsia="Consolas" w:hAnsi="Consolas"/>
+          <w:sz w:val="19"/>
+          <w:szCs w:val="19"/>
+        </w:rPr>
+        <w:t xml:space="preserve">client/js/ui/confirm.js</w:t>
+      </w:r>
+    </w:p>
+    <w:p>
+      <w:pPr>
+        <w:pStyle w:val="ListParagraph"/>
+        <w:numPr>
+          <w:ilvl w:val="0"/>
+          <w:numId w:val="2"/>
+        </w:numPr>
+      </w:pPr>
+      <w:r>
+        <w:rPr>
+          <w:rFonts w:ascii="Consolas" w:cs="Consolas" w:eastAsia="Consolas" w:hAnsi="Consolas"/>
+          <w:sz w:val="19"/>
+          <w:szCs w:val="19"/>
+        </w:rPr>
+        <w:t xml:space="preserve">client/css/layout.css</w:t>
+      </w:r>
+    </w:p>
+    <w:p>
+      <w:pPr>
+        <w:pStyle w:val="ListParagraph"/>
+        <w:numPr>
+          <w:ilvl w:val="0"/>
+          <w:numId w:val="2"/>
+        </w:numPr>
+      </w:pPr>
+      <w:r>
+        <w:rPr>
+          <w:rFonts w:ascii="Consolas" w:cs="Consolas" w:eastAsia="Consolas" w:hAnsi="Consolas"/>
+          <w:sz w:val="19"/>
+          <w:szCs w:val="19"/>
+        </w:rPr>
+        <w:t xml:space="preserve">client/css/components.css</w:t>
+      </w:r>
+    </w:p>
+    <w:p>
+      <w:pPr>
+        <w:pStyle w:val="ListParagraph"/>
+        <w:numPr>
+          <w:ilvl w:val="0"/>
+          <w:numId w:val="2"/>
+        </w:numPr>
+      </w:pPr>
+      <w:r>
+        <w:rPr>
+          <w:rFonts w:ascii="Consolas" w:cs="Consolas" w:eastAsia="Consolas" w:hAnsi="Consolas"/>
+          <w:sz w:val="19"/>
+          <w:szCs w:val="19"/>
+        </w:rPr>
+        <w:t xml:space="preserve">client/index.html</w:t>
+      </w:r>
+    </w:p>
+    <w:p>
+      <w:pPr>
+        <w:pStyle w:val="ListParagraph"/>
+        <w:numPr>
+          <w:ilvl w:val="0"/>
+          <w:numId w:val="2"/>
+        </w:numPr>
+      </w:pPr>
+      <w:r>
+        <w:rPr>
+          <w:rFonts w:ascii="Consolas" w:cs="Consolas" w:eastAsia="Consolas" w:hAnsi="Consolas"/>
+          <w:sz w:val="19"/>
+          <w:szCs w:val="19"/>
+        </w:rPr>
+        <w:t xml:space="preserve">client/pages/*.html</w:t>
       </w:r>
     </w:p>
     <w:p>
@@ -6504,7 +6857,7 @@
           <w:sz w:val="21"/>
           <w:szCs w:val="21"/>
         </w:rPr>
-        <w:t xml:space="preserve">PDF with the executed prompts and 15 planned prompts; the Word log has the same content.</w:t>
+        <w:t xml:space="preserve">Created client/js architecture with DOM/format utilities, theme toggle (dark/light/system with head flash-prevention script), accessible mobile drawer with focus trap and ARIA attributes, toast notifications, and dialog-based confirm. Added data-page, inline theme scripts, theme buttons, and app.js script tags to all 25 HTML pages while preserving no-JS CSS fallbacks.</w:t>
       </w:r>
     </w:p>
     <w:p>
@@ -6532,7 +6885,7 @@
           <w:sz w:val="21"/>
           <w:szCs w:val="21"/>
         </w:rPr>
-        <w:t xml:space="preserve">Pages rendered to images and inspected; text extracted with pypdf.</w:t>
+        <w:t xml:space="preserve">html-validate passes with 0 errors across client/**/*.html; node automated assertions pass for formatINR, formatDate, formatRelativeDate, HTML structure, and CSS layer definitions; static client preview verified over HTTP on localhost:5500.</w:t>
       </w:r>
     </w:p>
     <w:p>
@@ -6548,11 +6901,20 @@
     </w:p>
     <w:p>
       <w:pPr>
+        <w:pStyle w:val="Heading2"/>
+        <w:spacing w:before="360"/>
+      </w:pPr>
+      <w:r>
+        <w:t xml:space="preserve">Wrap-up - Documentation, cleanup and deployment</w:t>
+      </w:r>
+    </w:p>
+    <w:p>
+      <w:pPr>
         <w:pStyle w:val="Heading3"/>
         <w:keepNext/>
       </w:pPr>
       <w:r>
-        <w:t xml:space="preserve">#15  Create the GitHub repository and push the code</w:t>
+        <w:t xml:space="preserve">#13  Request: GitHub repository, website link and PDF of prompts</w:t>
       </w:r>
     </w:p>
     <w:p>
@@ -6566,7 +6928,7 @@
           <w:sz w:val="18"/>
           <w:szCs w:val="18"/>
         </w:rPr>
-        <w:t xml:space="preserve">Working prompt  |  2026-10-15</w:t>
+        <w:t xml:space="preserve">User prompt  |  2026-10-15</w:t>
       </w:r>
     </w:p>
     <w:p>
@@ -6600,7 +6962,7 @@
           <w:sz w:val="19"/>
           <w:szCs w:val="19"/>
         </w:rPr>
-        <w:t xml:space="preserve">Install the official GitHub CLI with winget and sign in through the device-code flow (the student approves it in the browser). Before publishing, check that no secrets or databases are tracked, review the receipt images that are still in the commit history (they are generic sample invoices), and confirm with the student that a public repository is acceptable because the team's original repository is private. Then create the public repository MahaprabhuK/SplitStack, push the refurbish branch as main together with the legacy branch, add a GitHub Actions workflow (.github/workflows/pages.yml) that deploys the client/ folder to GitHub Pages, enable Pages with the "GitHub Actions" source, and confirm that the site responds.</w:t>
+        <w:t xml:space="preserve">create a new repositry for this project in my gihub , and after than give me the github link and then the website link and also a pdf containing the prompts to complete project.</w:t>
       </w:r>
     </w:p>
     <w:p>
@@ -6628,7 +6990,7 @@
           <w:sz w:val="21"/>
           <w:szCs w:val="21"/>
         </w:rPr>
-        <w:t xml:space="preserve">Give the student a repository link and a live website link.</w:t>
+        <w:t xml:space="preserve">Publish the project under the student's own GitHub account, host the site, and export the prompt log (including the remaining planned prompts) as a PDF.</w:t>
       </w:r>
     </w:p>
     <w:p>
@@ -6661,7 +7023,7 @@
           <w:sz w:val="19"/>
           <w:szCs w:val="19"/>
         </w:rPr>
-        <w:t xml:space="preserve">README.md</w:t>
+        <w:t xml:space="preserve">-</w:t>
       </w:r>
     </w:p>
     <w:p>
@@ -6689,7 +7051,7 @@
           <w:sz w:val="21"/>
           <w:szCs w:val="21"/>
         </w:rPr>
-        <w:t xml:space="preserve">Public repository https://github.com/MahaprabhuK/SplitStack created and the legacy branch pushed. The first push of main was rejected because it added a GitHub Actions workflow (.github/workflows/pages.yml) and the gh token lacked the "workflow" scope; the workflow file was removed and main was pushed in the next step. GitHub Pages is not set up yet (planned for the wrap-up; needs "gh auth refresh -s workflow" or a gh-pages branch).</w:t>
+        <w:t xml:space="preserve">Done: see the following entries.</w:t>
       </w:r>
     </w:p>
     <w:p>
@@ -6717,7 +7079,7 @@
           <w:sz w:val="21"/>
           <w:szCs w:val="21"/>
         </w:rPr>
-        <w:t xml:space="preserve">gh repo view; git push output.</w:t>
+        <w:t xml:space="preserve">-</w:t>
       </w:r>
     </w:p>
     <w:p>
@@ -6737,7 +7099,7 @@
         <w:keepNext/>
       </w:pPr>
       <w:r>
-        <w:t xml:space="preserve">#16  Request: hand the project over to a teammate's agent</w:t>
+        <w:t xml:space="preserve">#14  PDF export of the prompt log, including planned prompts</w:t>
       </w:r>
     </w:p>
     <w:p>
@@ -6751,7 +7113,7 @@
           <w:sz w:val="18"/>
           <w:szCs w:val="18"/>
         </w:rPr>
-        <w:t xml:space="preserve">User prompt  |  2026-10-15</w:t>
+        <w:t xml:space="preserve">Working prompt  |  2026-10-15</w:t>
       </w:r>
     </w:p>
     <w:p>
@@ -6785,7 +7147,7 @@
           <w:sz w:val="19"/>
           <w:szCs w:val="19"/>
         </w:rPr>
-        <w:t xml:space="preserve">ACTUALLY I GONNA HANDOVER THE PROJECT TO MY TEAMMATES AGENT SO HE'LL BE PULLING THE CODE AND RUNNING IN HIS SYSTEM SO GIVE PROMPT FOR THAT</w:t>
+        <w:t xml:space="preserve">Export the prompt log to PDF with a Python reportlab script (docs/tools/build_prompt_pdf.py) that reads docs/prompt_log.json: a title page, a stage overview table, a summary of every entry, Part A with every executed prompt verbatim in a shaded box with purpose, files, result and verification, and Part B with the planned prompts that complete Review 2, Review 3 and the wrap-up, clearly marked as not yet run. Add the planned prompts to prompt_log.json and to the Word log as well, and make "npm run log" rebuild both documents.</w:t>
       </w:r>
     </w:p>
     <w:p>
@@ -6813,7 +7175,7 @@
           <w:sz w:val="21"/>
           <w:szCs w:val="21"/>
         </w:rPr>
-        <w:t xml:space="preserve">Let a teammate's AI agent clone, run and continue the project.</w:t>
+        <w:t xml:space="preserve">Give the student a PDF containing the prompts needed to complete the whole project.</w:t>
       </w:r>
     </w:p>
     <w:p>
@@ -6846,7 +7208,92 @@
           <w:sz w:val="19"/>
           <w:szCs w:val="19"/>
         </w:rPr>
-        <w:t xml:space="preserve">-</w:t>
+        <w:t xml:space="preserve">docs/tools/build_prompt_pdf.py</w:t>
+      </w:r>
+    </w:p>
+    <w:p>
+      <w:pPr>
+        <w:pStyle w:val="ListParagraph"/>
+        <w:numPr>
+          <w:ilvl w:val="0"/>
+          <w:numId w:val="2"/>
+        </w:numPr>
+      </w:pPr>
+      <w:r>
+        <w:rPr>
+          <w:rFonts w:ascii="Consolas" w:cs="Consolas" w:eastAsia="Consolas" w:hAnsi="Consolas"/>
+          <w:sz w:val="19"/>
+          <w:szCs w:val="19"/>
+        </w:rPr>
+        <w:t xml:space="preserve">docs/tools/build-prompt-log.js</w:t>
+      </w:r>
+    </w:p>
+    <w:p>
+      <w:pPr>
+        <w:pStyle w:val="ListParagraph"/>
+        <w:numPr>
+          <w:ilvl w:val="0"/>
+          <w:numId w:val="2"/>
+        </w:numPr>
+      </w:pPr>
+      <w:r>
+        <w:rPr>
+          <w:rFonts w:ascii="Consolas" w:cs="Consolas" w:eastAsia="Consolas" w:hAnsi="Consolas"/>
+          <w:sz w:val="19"/>
+          <w:szCs w:val="19"/>
+        </w:rPr>
+        <w:t xml:space="preserve">docs/prompt_log.json</w:t>
+      </w:r>
+    </w:p>
+    <w:p>
+      <w:pPr>
+        <w:pStyle w:val="ListParagraph"/>
+        <w:numPr>
+          <w:ilvl w:val="0"/>
+          <w:numId w:val="2"/>
+        </w:numPr>
+      </w:pPr>
+      <w:r>
+        <w:rPr>
+          <w:rFonts w:ascii="Consolas" w:cs="Consolas" w:eastAsia="Consolas" w:hAnsi="Consolas"/>
+          <w:sz w:val="19"/>
+          <w:szCs w:val="19"/>
+        </w:rPr>
+        <w:t xml:space="preserve">docs/SplitStack_Prompt_Log.pdf</w:t>
+      </w:r>
+    </w:p>
+    <w:p>
+      <w:pPr>
+        <w:pStyle w:val="ListParagraph"/>
+        <w:numPr>
+          <w:ilvl w:val="0"/>
+          <w:numId w:val="2"/>
+        </w:numPr>
+      </w:pPr>
+      <w:r>
+        <w:rPr>
+          <w:rFonts w:ascii="Consolas" w:cs="Consolas" w:eastAsia="Consolas" w:hAnsi="Consolas"/>
+          <w:sz w:val="19"/>
+          <w:szCs w:val="19"/>
+        </w:rPr>
+        <w:t xml:space="preserve">docs/SplitStack_Prompt_Log.docx</w:t>
+      </w:r>
+    </w:p>
+    <w:p>
+      <w:pPr>
+        <w:pStyle w:val="ListParagraph"/>
+        <w:numPr>
+          <w:ilvl w:val="0"/>
+          <w:numId w:val="2"/>
+        </w:numPr>
+      </w:pPr>
+      <w:r>
+        <w:rPr>
+          <w:rFonts w:ascii="Consolas" w:cs="Consolas" w:eastAsia="Consolas" w:hAnsi="Consolas"/>
+          <w:sz w:val="19"/>
+          <w:szCs w:val="19"/>
+        </w:rPr>
+        <w:t xml:space="preserve">package.json</w:t>
       </w:r>
     </w:p>
     <w:p>
@@ -6874,7 +7321,7 @@
           <w:sz w:val="21"/>
           <w:szCs w:val="21"/>
         </w:rPr>
-        <w:t xml:space="preserve">A handover prompt was written covering: requirements per review, clone and branch, prerequisites, install/run/verify commands, repository map, known traps, the mandatory logging rule, the ordered remaining work (planned prompts P1-P15) and working rules. Noted that the new work had to be pushed to GitHub first.</w:t>
+        <w:t xml:space="preserve">PDF with the executed prompts and 15 planned prompts; the Word log has the same content.</w:t>
       </w:r>
     </w:p>
     <w:p>
@@ -6902,7 +7349,7 @@
           <w:sz w:val="21"/>
           <w:szCs w:val="21"/>
         </w:rPr>
-        <w:t xml:space="preserve">-</w:t>
+        <w:t xml:space="preserve">Pages rendered to images and inspected; text extracted with pypdf.</w:t>
       </w:r>
     </w:p>
     <w:p>
@@ -6922,7 +7369,7 @@
         <w:keepNext/>
       </w:pPr>
       <w:r>
-        <w:t xml:space="preserve">#17  Push the refurbished code to GitHub main</w:t>
+        <w:t xml:space="preserve">#15  Create the GitHub repository and push the code</w:t>
       </w:r>
     </w:p>
     <w:p>
@@ -6970,7 +7417,7 @@
           <w:sz w:val="19"/>
           <w:szCs w:val="19"/>
         </w:rPr>
-        <w:t xml:space="preserve">push it  (user prompt). Executed as: remove .github/workflows/pages.yml (the token lacks the workflow scope), replace the not-yet-existing live-site link in README.md with local run instructions, correct the earlier log entry about publishing, log the handover, rebuild the prompt logs, commit, and push the refurbish branch to main on https://github.com/MahaprabhuK/SplitStack so the teammate can clone it.</w:t>
+        <w:t xml:space="preserve">Install the official GitHub CLI with winget and sign in through the device-code flow (the student approves it in the browser). Before publishing, check that no secrets or databases are tracked, review the receipt images that are still in the commit history (they are generic sample invoices), and confirm with the student that a public repository is acceptable because the team's original repository is private. Then create the public repository MahaprabhuK/SplitStack, push the refurbish branch as main together with the legacy branch, add a GitHub Actions workflow (.github/workflows/pages.yml) that deploys the client/ folder to GitHub Pages, enable Pages with the "GitHub Actions" source, and confirm that the site responds.</w:t>
       </w:r>
     </w:p>
     <w:p>
@@ -6998,7 +7445,7 @@
           <w:sz w:val="21"/>
           <w:szCs w:val="21"/>
         </w:rPr>
-        <w:t xml:space="preserve">Make the current work available to the teammate.</w:t>
+        <w:t xml:space="preserve">Give the student a repository link and a live website link.</w:t>
       </w:r>
     </w:p>
     <w:p>
@@ -7031,75 +7478,7 @@
           <w:sz w:val="19"/>
           <w:szCs w:val="19"/>
         </w:rPr>
-        <w:t xml:space="preserve">.github/workflows/pages.yml (removed)</w:t>
-      </w:r>
-    </w:p>
-    <w:p>
-      <w:pPr>
-        <w:pStyle w:val="ListParagraph"/>
-        <w:numPr>
-          <w:ilvl w:val="0"/>
-          <w:numId w:val="2"/>
-        </w:numPr>
-      </w:pPr>
-      <w:r>
-        <w:rPr>
-          <w:rFonts w:ascii="Consolas" w:cs="Consolas" w:eastAsia="Consolas" w:hAnsi="Consolas"/>
-          <w:sz w:val="19"/>
-          <w:szCs w:val="19"/>
-        </w:rPr>
         <w:t xml:space="preserve">README.md</w:t>
-      </w:r>
-    </w:p>
-    <w:p>
-      <w:pPr>
-        <w:pStyle w:val="ListParagraph"/>
-        <w:numPr>
-          <w:ilvl w:val="0"/>
-          <w:numId w:val="2"/>
-        </w:numPr>
-      </w:pPr>
-      <w:r>
-        <w:rPr>
-          <w:rFonts w:ascii="Consolas" w:cs="Consolas" w:eastAsia="Consolas" w:hAnsi="Consolas"/>
-          <w:sz w:val="19"/>
-          <w:szCs w:val="19"/>
-        </w:rPr>
-        <w:t xml:space="preserve">docs/prompt_log.json</w:t>
-      </w:r>
-    </w:p>
-    <w:p>
-      <w:pPr>
-        <w:pStyle w:val="ListParagraph"/>
-        <w:numPr>
-          <w:ilvl w:val="0"/>
-          <w:numId w:val="2"/>
-        </w:numPr>
-      </w:pPr>
-      <w:r>
-        <w:rPr>
-          <w:rFonts w:ascii="Consolas" w:cs="Consolas" w:eastAsia="Consolas" w:hAnsi="Consolas"/>
-          <w:sz w:val="19"/>
-          <w:szCs w:val="19"/>
-        </w:rPr>
-        <w:t xml:space="preserve">docs/SplitStack_Prompt_Log.docx</w:t>
-      </w:r>
-    </w:p>
-    <w:p>
-      <w:pPr>
-        <w:pStyle w:val="ListParagraph"/>
-        <w:numPr>
-          <w:ilvl w:val="0"/>
-          <w:numId w:val="2"/>
-        </w:numPr>
-      </w:pPr>
-      <w:r>
-        <w:rPr>
-          <w:rFonts w:ascii="Consolas" w:cs="Consolas" w:eastAsia="Consolas" w:hAnsi="Consolas"/>
-          <w:sz w:val="19"/>
-          <w:szCs w:val="19"/>
-        </w:rPr>
-        <w:t xml:space="preserve">docs/SplitStack_Prompt_Log.pdf</w:t>
       </w:r>
     </w:p>
     <w:p>
@@ -7127,7 +7506,7 @@
           <w:sz w:val="21"/>
           <w:szCs w:val="21"/>
         </w:rPr>
-        <w:t xml:space="preserve">main pushed to GitHub; branches on GitHub: main (refurbished work) and legacy (original Flask app).</w:t>
+        <w:t xml:space="preserve">Public repository https://github.com/MahaprabhuK/SplitStack created and the legacy branch pushed. The first push of main was rejected because it added a GitHub Actions workflow (.github/workflows/pages.yml) and the gh token lacked the "workflow" scope; the workflow file was removed and main was pushed in the next step. GitHub Pages is not set up yet (planned for the wrap-up; needs "gh auth refresh -s workflow" or a gh-pages branch).</w:t>
       </w:r>
     </w:p>
     <w:p>
@@ -7155,7 +7534,7 @@
           <w:sz w:val="21"/>
           <w:szCs w:val="21"/>
         </w:rPr>
-        <w:t xml:space="preserve">git ls-remote shows main and legacy at the expected commits.</w:t>
+        <w:t xml:space="preserve">gh repo view; git push output.</w:t>
       </w:r>
     </w:p>
     <w:p>
@@ -7175,7 +7554,7 @@
         <w:keepNext/>
       </w:pPr>
       <w:r>
-        <w:t xml:space="preserve">#18  Request: push the code and deploy the website</w:t>
+        <w:t xml:space="preserve">#16  Request: hand the project over to a teammate's agent</w:t>
       </w:r>
     </w:p>
     <w:p>
@@ -7223,7 +7602,7 @@
           <w:sz w:val="19"/>
           <w:szCs w:val="19"/>
         </w:rPr>
-        <w:t xml:space="preserve">first push the code and deploy it</w:t>
+        <w:t xml:space="preserve">ACTUALLY I GONNA HANDOVER THE PROJECT TO MY TEAMMATES AGENT SO HE'LL BE PULLING THE CODE AND RUNNING IN HIS SYSTEM SO GIVE PROMPT FOR THAT</w:t>
       </w:r>
     </w:p>
     <w:p>
@@ -7251,7 +7630,7 @@
           <w:sz w:val="21"/>
           <w:szCs w:val="21"/>
         </w:rPr>
-        <w:t xml:space="preserve">Get the code on GitHub and the Review 1 site online.</w:t>
+        <w:t xml:space="preserve">Let a teammate's AI agent clone, run and continue the project.</w:t>
       </w:r>
     </w:p>
     <w:p>
@@ -7312,7 +7691,7 @@
           <w:sz w:val="21"/>
           <w:szCs w:val="21"/>
         </w:rPr>
-        <w:t xml:space="preserve">Handled in the next step.</w:t>
+        <w:t xml:space="preserve">A handover prompt was written covering: requirements per review, clone and branch, prerequisites, install/run/verify commands, repository map, known traps, the mandatory logging rule, the ordered remaining work (planned prompts P1-P15) and working rules. Noted that the new work had to be pushed to GitHub first.</w:t>
       </w:r>
     </w:p>
     <w:p>
@@ -7360,7 +7739,7 @@
         <w:keepNext/>
       </w:pPr>
       <w:r>
-        <w:t xml:space="preserve">#19  Deploy the client to GitHub Pages from a gh-pages branch</w:t>
+        <w:t xml:space="preserve">#17  Push the refurbished code to GitHub main</w:t>
       </w:r>
     </w:p>
     <w:p>
@@ -7408,7 +7787,7 @@
           <w:sz w:val="19"/>
           <w:szCs w:val="19"/>
         </w:rPr>
-        <w:t xml:space="preserve">Push refurbish to main and refurbish on MahaprabhuK/SplitStack. Because the token cannot push workflow files, deploy without GitHub Actions: check that client/ uses only relative links, split client/ into its own history with git subtree split, push it as the gh-pages branch, wait for GitHub Pages to publish it, then put the live link back in README.md and log the step.</w:t>
+        <w:t xml:space="preserve">push it  (user prompt). Executed as: remove .github/workflows/pages.yml (the token lacks the workflow scope), replace the not-yet-existing live-site link in README.md with local run instructions, correct the earlier log entry about publishing, log the handover, rebuild the prompt logs, commit, and push the refurbish branch to main on https://github.com/MahaprabhuK/SplitStack so the teammate can clone it.</w:t>
       </w:r>
     </w:p>
     <w:p>
@@ -7436,7 +7815,7 @@
           <w:sz w:val="21"/>
           <w:szCs w:val="21"/>
         </w:rPr>
-        <w:t xml:space="preserve">Publish the Review 1 site at a public URL without needing the workflow scope.</w:t>
+        <w:t xml:space="preserve">Make the current work available to the teammate.</w:t>
       </w:r>
     </w:p>
     <w:p>
@@ -7469,7 +7848,7 @@
           <w:sz w:val="19"/>
           <w:szCs w:val="19"/>
         </w:rPr>
-        <w:t xml:space="preserve">README.md</w:t>
+        <w:t xml:space="preserve">.github/workflows/pages.yml (removed)</w:t>
       </w:r>
     </w:p>
     <w:p>
@@ -7486,7 +7865,58 @@
           <w:sz w:val="19"/>
           <w:szCs w:val="19"/>
         </w:rPr>
+        <w:t xml:space="preserve">README.md</w:t>
+      </w:r>
+    </w:p>
+    <w:p>
+      <w:pPr>
+        <w:pStyle w:val="ListParagraph"/>
+        <w:numPr>
+          <w:ilvl w:val="0"/>
+          <w:numId w:val="2"/>
+        </w:numPr>
+      </w:pPr>
+      <w:r>
+        <w:rPr>
+          <w:rFonts w:ascii="Consolas" w:cs="Consolas" w:eastAsia="Consolas" w:hAnsi="Consolas"/>
+          <w:sz w:val="19"/>
+          <w:szCs w:val="19"/>
+        </w:rPr>
         <w:t xml:space="preserve">docs/prompt_log.json</w:t>
+      </w:r>
+    </w:p>
+    <w:p>
+      <w:pPr>
+        <w:pStyle w:val="ListParagraph"/>
+        <w:numPr>
+          <w:ilvl w:val="0"/>
+          <w:numId w:val="2"/>
+        </w:numPr>
+      </w:pPr>
+      <w:r>
+        <w:rPr>
+          <w:rFonts w:ascii="Consolas" w:cs="Consolas" w:eastAsia="Consolas" w:hAnsi="Consolas"/>
+          <w:sz w:val="19"/>
+          <w:szCs w:val="19"/>
+        </w:rPr>
+        <w:t xml:space="preserve">docs/SplitStack_Prompt_Log.docx</w:t>
+      </w:r>
+    </w:p>
+    <w:p>
+      <w:pPr>
+        <w:pStyle w:val="ListParagraph"/>
+        <w:numPr>
+          <w:ilvl w:val="0"/>
+          <w:numId w:val="2"/>
+        </w:numPr>
+      </w:pPr>
+      <w:r>
+        <w:rPr>
+          <w:rFonts w:ascii="Consolas" w:cs="Consolas" w:eastAsia="Consolas" w:hAnsi="Consolas"/>
+          <w:sz w:val="19"/>
+          <w:szCs w:val="19"/>
+        </w:rPr>
+        <w:t xml:space="preserve">docs/SplitStack_Prompt_Log.pdf</w:t>
       </w:r>
     </w:p>
     <w:p>
@@ -7514,7 +7944,7 @@
           <w:sz w:val="21"/>
           <w:szCs w:val="21"/>
         </w:rPr>
-        <w:t xml:space="preserve">main and refurbish are on GitHub. The client/ folder is published from the gh-pages branch at https://mahaprabhuk.github.io/SplitStack/ (GitHub enabled Pages automatically). To redeploy after client changes: git subtree split --prefix client refurbish, then push that commit to gh-pages.</w:t>
+        <w:t xml:space="preserve">main pushed to GitHub; branches on GitHub: main (refurbished work) and legacy (original Flask app).</w:t>
       </w:r>
     </w:p>
     <w:p>
@@ -7542,7 +7972,7 @@
           <w:sz w:val="21"/>
           <w:szCs w:val="21"/>
         </w:rPr>
-        <w:t xml:space="preserve">git ls-remote; curl returned 200 for the home page, pages/404.html and css/base.css on the live site.</w:t>
+        <w:t xml:space="preserve">git ls-remote shows main and legacy at the expected commits.</w:t>
       </w:r>
     </w:p>
     <w:p>
@@ -7562,7 +7992,7 @@
         <w:keepNext/>
       </w:pPr>
       <w:r>
-        <w:t xml:space="preserve">#20  Request: handover prompt PDF for a teammate's agent</w:t>
+        <w:t xml:space="preserve">#18  Request: push the code and deploy the website</w:t>
       </w:r>
     </w:p>
     <w:p>
@@ -7610,7 +8040,7 @@
           <w:sz w:val="19"/>
           <w:szCs w:val="19"/>
         </w:rPr>
-        <w:t xml:space="preserve">imma handover the project to my teammate i want you to create a detailed prompt for his agent most prolly he'll use anti gravity so i want a pdf containing prompts to complete the rest of the work in the project. so create a pdf and mention its path once its created then i'll share it to him</w:t>
+        <w:t xml:space="preserve">first push the code and deploy it</w:t>
       </w:r>
     </w:p>
     <w:p>
@@ -7638,7 +8068,7 @@
           <w:sz w:val="21"/>
           <w:szCs w:val="21"/>
         </w:rPr>
-        <w:t xml:space="preserve">Let a teammate's AI agent (Antigravity) finish Review 2, Review 3 and the wrap-up.</w:t>
+        <w:t xml:space="preserve">Get the code on GitHub and the Review 1 site online.</w:t>
       </w:r>
     </w:p>
     <w:p>
@@ -7747,7 +8177,7 @@
         <w:keepNext/>
       </w:pPr>
       <w:r>
-        <w:t xml:space="preserve">#21  Handover prompts PDF</w:t>
+        <w:t xml:space="preserve">#19  Deploy the client to GitHub Pages from a gh-pages branch</w:t>
       </w:r>
     </w:p>
     <w:p>
@@ -7795,7 +8225,7 @@
           <w:sz w:val="19"/>
           <w:szCs w:val="19"/>
         </w:rPr>
-        <w:t xml:space="preserve">Write docs/tools/build_handover_pdf.py (reusing the styles of build_prompt_pdf.py) to produce docs/SplitStack_Handover_Prompts.pdf: how to use it with Antigravity, one-time setup (tools, collaborator access, MongoDB Atlas, workflow token scope), a roadmap, Prompt 0 with the full project context, rules, logging, commit/push and gh-pages redeploy procedure, the 15 planned prompts P1-P15 expanded with concrete checks and commit messages, utility prompts (status, recovery, review rehearsal) and common problems. Render pages to check the layout.</w:t>
+        <w:t xml:space="preserve">Push refurbish to main and refurbish on MahaprabhuK/SplitStack. Because the token cannot push workflow files, deploy without GitHub Actions: check that client/ uses only relative links, split client/ into its own history with git subtree split, push it as the gh-pages branch, wait for GitHub Pages to publish it, then put the live link back in README.md and log the step.</w:t>
       </w:r>
     </w:p>
     <w:p>
@@ -7823,7 +8253,7 @@
           <w:sz w:val="21"/>
           <w:szCs w:val="21"/>
         </w:rPr>
-        <w:t xml:space="preserve">Give the teammate a self-contained, ordered set of prompts.</w:t>
+        <w:t xml:space="preserve">Publish the Review 1 site at a public URL without needing the workflow scope.</w:t>
       </w:r>
     </w:p>
     <w:p>
@@ -7856,7 +8286,7 @@
           <w:sz w:val="19"/>
           <w:szCs w:val="19"/>
         </w:rPr>
-        <w:t xml:space="preserve">docs/tools/build_handover_pdf.py</w:t>
+        <w:t xml:space="preserve">README.md</w:t>
       </w:r>
     </w:p>
     <w:p>
@@ -7873,7 +8303,7 @@
           <w:sz w:val="19"/>
           <w:szCs w:val="19"/>
         </w:rPr>
-        <w:t xml:space="preserve">docs/SplitStack_Handover_Prompts.pdf</w:t>
+        <w:t xml:space="preserve">docs/prompt_log.json</w:t>
       </w:r>
     </w:p>
     <w:p>
@@ -7901,7 +8331,7 @@
           <w:sz w:val="21"/>
           <w:szCs w:val="21"/>
         </w:rPr>
-        <w:t xml:space="preserve">14-page PDF created. Changes against the planned prompts: P1 adds data-page attributes and client/js/package.json (type module) for node --test; P13 keeps the localStorage implementation as a demo mode (api-local.js chosen when /api/health does not answer) so the GitHub Pages site keeps working, instead of deleting it; P9 replaces deprecated csurf with a synchronizer token; P14 uses MongoMemoryReplSet because the API uses transactions; P15 asks for confirmation before deleting the Flask files and leaves Render account steps to the student.</w:t>
+        <w:t xml:space="preserve">main and refurbish are on GitHub. The client/ folder is published from the gh-pages branch at https://mahaprabhuk.github.io/SplitStack/ (GitHub enabled Pages automatically). To redeploy after client changes: git subtree split --prefix client refurbish, then push that commit to gh-pages.</w:t>
       </w:r>
     </w:p>
     <w:p>
@@ -7929,7 +8359,7 @@
           <w:sz w:val="21"/>
           <w:szCs w:val="21"/>
         </w:rPr>
-        <w:t xml:space="preserve">Rendered pages with PyMuPDF and checked the layout of the setup, Prompt 0, step and utility pages.</w:t>
+        <w:t xml:space="preserve">git ls-remote; curl returned 200 for the home page, pages/404.html and css/base.css on the live site.</w:t>
       </w:r>
     </w:p>
     <w:p>
@@ -7944,37 +8374,12 @@
       </w:r>
     </w:p>
     <w:p>
-      <w:r>
-        <w:br w:type="page"/>
-      </w:r>
-    </w:p>
-    <w:p>
-      <w:pPr>
-        <w:pStyle w:val="Heading1"/>
-      </w:pPr>
-      <w:r>
-        <w:t xml:space="preserve">Planned prompts to complete the project</w:t>
-      </w:r>
-    </w:p>
-    <w:p>
-      <w:pPr>
-        <w:spacing w:after="80"/>
-      </w:pPr>
-      <w:r>
-        <w:rPr>
-          <w:sz w:val="21"/>
-          <w:szCs w:val="21"/>
-        </w:rPr>
-        <w:t xml:space="preserve">These prompts have not been run yet. Run them in order; after each one, move it into the log above with its result.</w:t>
-      </w:r>
-    </w:p>
-    <w:p>
       <w:pPr>
         <w:pStyle w:val="Heading3"/>
         <w:keepNext/>
       </w:pPr>
       <w:r>
-        <w:t xml:space="preserve">P1  JavaScript architecture and app shell</w:t>
+        <w:t xml:space="preserve">#20  Request: handover prompt PDF for a teammate's agent</w:t>
       </w:r>
     </w:p>
     <w:p>
@@ -7988,7 +8393,7 @@
           <w:sz w:val="18"/>
           <w:szCs w:val="18"/>
         </w:rPr>
-        <w:t xml:space="preserve">Review 2  |  Planned prompt</w:t>
+        <w:t xml:space="preserve">User prompt  |  2026-10-15</w:t>
       </w:r>
     </w:p>
     <w:p>
@@ -8022,7 +8427,7 @@
           <w:sz w:val="19"/>
           <w:szCs w:val="19"/>
         </w:rPr>
-        <w:t xml:space="preserve">Add vanilla JavaScript to the Review 1 pages as native ES modules loaded with &lt;script type="module" src="../js/app.js"&gt;. Create client/js/ with: app.js (entry; detects the page from &lt;body data-page&gt; and calls that page's init), core/dom.js (qs, qsa, on, delegate, createEl helpers), core/format.js (formatINR with Intl.NumberFormat("en-IN", {style: "currency", currency: "INR"}), date formatting), ui/theme.js (dark/light/system toggle stored in localStorage and applied to &lt;html data-theme&gt; by a tiny inline script in &lt;head&gt; so there is no flash), ui/nav.js (replace the CSS checkbox drawer with a real &lt;button aria-expanded aria-controls&gt;, close on Escape, scrim click and link click, keep focus inside while open), ui/toast.js (accessible role=status toasts) and ui/confirm.js (a &lt;dialog&gt; element replacing window.confirm for every delete form). No jQuery and no frameworks.</w:t>
+        <w:t xml:space="preserve">imma handover the project to my teammate i want you to create a detailed prompt for his agent most prolly he'll use anti gravity so i want a pdf containing prompts to complete the rest of the work in the project. so create a pdf and mention its path once its created then i'll share it to him</w:t>
       </w:r>
     </w:p>
     <w:p>
@@ -8050,7 +8455,7 @@
           <w:sz w:val="21"/>
           <w:szCs w:val="21"/>
         </w:rPr>
-        <w:t xml:space="preserve">Lay the foundation for Review 2 with a clean module structure.</w:t>
+        <w:t xml:space="preserve">Let a teammate's AI agent (Antigravity) finish Review 2, Review 3 and the wrap-up.</w:t>
       </w:r>
     </w:p>
     <w:p>
@@ -8067,6 +8472,39 @@
           <w:szCs w:val="17"/>
         </w:rPr>
         <w:t xml:space="preserve">FILES</w:t>
+      </w:r>
+    </w:p>
+    <w:p>
+      <w:pPr>
+        <w:pStyle w:val="ListParagraph"/>
+        <w:numPr>
+          <w:ilvl w:val="0"/>
+          <w:numId w:val="2"/>
+        </w:numPr>
+      </w:pPr>
+      <w:r>
+        <w:rPr>
+          <w:rFonts w:ascii="Consolas" w:cs="Consolas" w:eastAsia="Consolas" w:hAnsi="Consolas"/>
+          <w:sz w:val="19"/>
+          <w:szCs w:val="19"/>
+        </w:rPr>
+        <w:t xml:space="preserve">-</w:t>
+      </w:r>
+    </w:p>
+    <w:p>
+      <w:pPr>
+        <w:spacing w:after="60" w:before="160"/>
+      </w:pPr>
+      <w:r>
+        <w:rPr>
+          <w:b/>
+          <w:bCs/>
+          <w:color w:val="4F46E5"/>
+          <w:spacing w:val="20"/>
+          <w:sz w:val="17"/>
+          <w:szCs w:val="17"/>
+        </w:rPr>
+        <w:t xml:space="preserve">RESULT</w:t>
       </w:r>
     </w:p>
     <w:p>
@@ -8078,7 +8516,46 @@
           <w:sz w:val="21"/>
           <w:szCs w:val="21"/>
         </w:rPr>
-        <w:t xml:space="preserve">client/js/app.js, client/js/core/*.js, client/js/ui/*.js, client/pages/*.html</w:t>
+        <w:t xml:space="preserve">Handled in the next step.</w:t>
+      </w:r>
+    </w:p>
+    <w:p>
+      <w:pPr>
+        <w:spacing w:after="60" w:before="160"/>
+      </w:pPr>
+      <w:r>
+        <w:rPr>
+          <w:b/>
+          <w:bCs/>
+          <w:color w:val="4F46E5"/>
+          <w:spacing w:val="20"/>
+          <w:sz w:val="17"/>
+          <w:szCs w:val="17"/>
+        </w:rPr>
+        <w:t xml:space="preserve">VERIFICATION</w:t>
+      </w:r>
+    </w:p>
+    <w:p>
+      <w:pPr>
+        <w:spacing w:after="80"/>
+      </w:pPr>
+      <w:r>
+        <w:rPr>
+          <w:sz w:val="21"/>
+          <w:szCs w:val="21"/>
+        </w:rPr>
+        <w:t xml:space="preserve">-</w:t>
+      </w:r>
+    </w:p>
+    <w:p>
+      <w:pPr>
+        <w:pBdr>
+          <w:bottom w:val="single" w:color="D9DBE5" w:sz="4" w:space="4"/>
+        </w:pBdr>
+        <w:spacing w:after="200"/>
+      </w:pPr>
+      <w:r>
+        <w:t xml:space="preserve"/>
       </w:r>
     </w:p>
     <w:p>
@@ -8087,7 +8564,7 @@
         <w:keepNext/>
       </w:pPr>
       <w:r>
-        <w:t xml:space="preserve">P2  Client data layer backed by localStorage</w:t>
+        <w:t xml:space="preserve">#21  Handover prompts PDF</w:t>
       </w:r>
     </w:p>
     <w:p>
@@ -8101,7 +8578,7 @@
           <w:sz w:val="18"/>
           <w:szCs w:val="18"/>
         </w:rPr>
-        <w:t xml:space="preserve">Review 2  |  Planned prompt</w:t>
+        <w:t xml:space="preserve">Working prompt  |  2026-10-15</w:t>
       </w:r>
     </w:p>
     <w:p>
@@ -8135,7 +8612,7 @@
           <w:sz w:val="19"/>
           <w:szCs w:val="19"/>
         </w:rPr>
-        <w:t xml:space="preserve">Create client/js/data/api.js exposing async functions with the same shape the future REST API will have: auth (register, login, logout, currentUser), expenses and income CRUD with filtering, sorting and pagination, categories, budgets, recurring payments, groups (members, shared expenses, balances, settlements), shopping lists and items, and analytics summaries. Back it with client/js/data/store.js, which keeps collections in localStorage under a versioned key, generates ids, and seeds the same sample data used in Review 1 (Priya Raman, October 2026) on first run. Every function returns a Promise and validates its input, throwing errors with a field and a message, so Review 3 can swap the implementation to fetch() without touching page code.</w:t>
+        <w:t xml:space="preserve">Write docs/tools/build_handover_pdf.py (reusing the styles of build_prompt_pdf.py) to produce docs/SplitStack_Handover_Prompts.pdf: how to use it with Antigravity, one-time setup (tools, collaborator access, MongoDB Atlas, workflow token scope), a roadmap, Prompt 0 with the full project context, rules, logging, commit/push and gh-pages redeploy procedure, the 15 planned prompts P1-P15 expanded with concrete checks and commit messages, utility prompts (status, recovery, review rehearsal) and common problems. Render pages to check the layout.</w:t>
       </w:r>
     </w:p>
     <w:p>
@@ -8163,7 +8640,7 @@
           <w:sz w:val="21"/>
           <w:szCs w:val="21"/>
         </w:rPr>
-        <w:t xml:space="preserve">Make the whole app genuinely interactive before a backend exists.</w:t>
+        <w:t xml:space="preserve">Give the teammate a self-contained, ordered set of prompts.</w:t>
       </w:r>
     </w:p>
     <w:p>
@@ -8180,6 +8657,56 @@
           <w:szCs w:val="17"/>
         </w:rPr>
         <w:t xml:space="preserve">FILES</w:t>
+      </w:r>
+    </w:p>
+    <w:p>
+      <w:pPr>
+        <w:pStyle w:val="ListParagraph"/>
+        <w:numPr>
+          <w:ilvl w:val="0"/>
+          <w:numId w:val="2"/>
+        </w:numPr>
+      </w:pPr>
+      <w:r>
+        <w:rPr>
+          <w:rFonts w:ascii="Consolas" w:cs="Consolas" w:eastAsia="Consolas" w:hAnsi="Consolas"/>
+          <w:sz w:val="19"/>
+          <w:szCs w:val="19"/>
+        </w:rPr>
+        <w:t xml:space="preserve">docs/tools/build_handover_pdf.py</w:t>
+      </w:r>
+    </w:p>
+    <w:p>
+      <w:pPr>
+        <w:pStyle w:val="ListParagraph"/>
+        <w:numPr>
+          <w:ilvl w:val="0"/>
+          <w:numId w:val="2"/>
+        </w:numPr>
+      </w:pPr>
+      <w:r>
+        <w:rPr>
+          <w:rFonts w:ascii="Consolas" w:cs="Consolas" w:eastAsia="Consolas" w:hAnsi="Consolas"/>
+          <w:sz w:val="19"/>
+          <w:szCs w:val="19"/>
+        </w:rPr>
+        <w:t xml:space="preserve">docs/SplitStack_Handover_Prompts.pdf</w:t>
+      </w:r>
+    </w:p>
+    <w:p>
+      <w:pPr>
+        <w:spacing w:after="60" w:before="160"/>
+      </w:pPr>
+      <w:r>
+        <w:rPr>
+          <w:b/>
+          <w:bCs/>
+          <w:color w:val="4F46E5"/>
+          <w:spacing w:val="20"/>
+          <w:sz w:val="17"/>
+          <w:szCs w:val="17"/>
+        </w:rPr>
+        <w:t xml:space="preserve">RESULT</w:t>
       </w:r>
     </w:p>
     <w:p>
@@ -8191,7 +8718,71 @@
           <w:sz w:val="21"/>
           <w:szCs w:val="21"/>
         </w:rPr>
-        <w:t xml:space="preserve">client/js/data/api.js, client/js/data/store.js, client/js/data/seed.js</w:t>
+        <w:t xml:space="preserve">14-page PDF created. Changes against the planned prompts: P1 adds data-page attributes and client/js/package.json (type module) for node --test; P13 keeps the localStorage implementation as a demo mode (api-local.js chosen when /api/health does not answer) so the GitHub Pages site keeps working, instead of deleting it; P9 replaces deprecated csurf with a synchronizer token; P14 uses MongoMemoryReplSet because the API uses transactions; P15 asks for confirmation before deleting the Flask files and leaves Render account steps to the student.</w:t>
+      </w:r>
+    </w:p>
+    <w:p>
+      <w:pPr>
+        <w:spacing w:after="60" w:before="160"/>
+      </w:pPr>
+      <w:r>
+        <w:rPr>
+          <w:b/>
+          <w:bCs/>
+          <w:color w:val="4F46E5"/>
+          <w:spacing w:val="20"/>
+          <w:sz w:val="17"/>
+          <w:szCs w:val="17"/>
+        </w:rPr>
+        <w:t xml:space="preserve">VERIFICATION</w:t>
+      </w:r>
+    </w:p>
+    <w:p>
+      <w:pPr>
+        <w:spacing w:after="80"/>
+      </w:pPr>
+      <w:r>
+        <w:rPr>
+          <w:sz w:val="21"/>
+          <w:szCs w:val="21"/>
+        </w:rPr>
+        <w:t xml:space="preserve">Rendered pages with PyMuPDF and checked the layout of the setup, Prompt 0, step and utility pages.</w:t>
+      </w:r>
+    </w:p>
+    <w:p>
+      <w:pPr>
+        <w:pBdr>
+          <w:bottom w:val="single" w:color="D9DBE5" w:sz="4" w:space="4"/>
+        </w:pBdr>
+        <w:spacing w:after="200"/>
+      </w:pPr>
+      <w:r>
+        <w:t xml:space="preserve"/>
+      </w:r>
+    </w:p>
+    <w:p>
+      <w:r>
+        <w:br w:type="page"/>
+      </w:r>
+    </w:p>
+    <w:p>
+      <w:pPr>
+        <w:pStyle w:val="Heading1"/>
+      </w:pPr>
+      <w:r>
+        <w:t xml:space="preserve">Planned prompts to complete the project</w:t>
+      </w:r>
+    </w:p>
+    <w:p>
+      <w:pPr>
+        <w:spacing w:after="80"/>
+      </w:pPr>
+      <w:r>
+        <w:rPr>
+          <w:sz w:val="21"/>
+          <w:szCs w:val="21"/>
+        </w:rPr>
+        <w:t xml:space="preserve">These prompts have not been run yet. Run them in order; after each one, move it into the log above with its result.</w:t>
       </w:r>
     </w:p>
     <w:p>
@@ -8200,7 +8791,7 @@
         <w:keepNext/>
       </w:pPr>
       <w:r>
-        <w:t xml:space="preserve">P3  Render pages from data</w:t>
+        <w:t xml:space="preserve">P1  Client data layer backed by localStorage</w:t>
       </w:r>
     </w:p>
     <w:p>
@@ -8248,7 +8839,7 @@
           <w:sz w:val="19"/>
           <w:szCs w:val="19"/>
         </w:rPr>
-        <w:t xml:space="preserve">Replace the hard-coded sample rows in the dashboard, expenses, income, budgets, recurring, categories, groups, group detail, settlements, shopping and profile pages with markup rendered by JavaScript from api.js, using &lt;template&gt; elements and textContent (never innerHTML with user data). Keep the static markup as the no-JavaScript fallback. Implement the expenses filter bar (search, category, method, date range, sort) with debounced live filtering and query-string sync, pagination, and empty states.</w:t>
+        <w:t xml:space="preserve">Create client/js/data/api.js exposing async functions with the same shape the future REST API will have: auth (register, login, logout, currentUser), expenses and income CRUD with filtering, sorting and pagination, categories, budgets, recurring payments, groups (members, shared expenses, balances, settlements), shopping lists and items, and analytics summaries. Back it with client/js/data/store.js, which keeps collections in localStorage under a versioned key, generates ids, and seeds the same sample data used in Review 1 (Priya Raman, October 2026) on first run. Every function returns a Promise and validates its input, throwing errors with a field and a message, so Review 3 can swap the implementation to fetch() without touching page code.</w:t>
       </w:r>
     </w:p>
     <w:p>
@@ -8276,7 +8867,7 @@
           <w:sz w:val="21"/>
           <w:szCs w:val="21"/>
         </w:rPr>
-        <w:t xml:space="preserve">Turn the static pages into working screens.</w:t>
+        <w:t xml:space="preserve">Make the whole app genuinely interactive before a backend exists.</w:t>
       </w:r>
     </w:p>
     <w:p>
@@ -8304,7 +8895,7 @@
           <w:sz w:val="21"/>
           <w:szCs w:val="21"/>
         </w:rPr>
-        <w:t xml:space="preserve">client/js/pages/*.js, client/pages/*.html</w:t>
+        <w:t xml:space="preserve">client/js/data/api.js, client/js/data/store.js, client/js/data/seed.js</w:t>
       </w:r>
     </w:p>
     <w:p>
@@ -8313,7 +8904,7 @@
         <w:keepNext/>
       </w:pPr>
       <w:r>
-        <w:t xml:space="preserve">P4  Forms, validation and CRUD flows</w:t>
+        <w:t xml:space="preserve">P2  Render pages from data</w:t>
       </w:r>
     </w:p>
     <w:p>
@@ -8361,7 +8952,7 @@
           <w:sz w:val="19"/>
           <w:szCs w:val="19"/>
         </w:rPr>
-        <w:t xml:space="preserve">Wire every form (register, login, expense add/edit, income, budget, recurring, category, group create, add member, shared expense, shopping list and item, profile, change password) to api.js. Use the Constraint Validation API plus custom rules (passwords match, date not in the future, budget greater than zero) with inline error messages linked by aria-describedby, and move focus to the first invalid field. Show a toast after each save and redirect afterwards (Post/Redirect/Get). Add password show/hide toggles with aria-pressed. Protect app pages: redirect to login.html when nobody is signed in.</w:t>
+        <w:t xml:space="preserve">Replace the hard-coded sample rows in the dashboard, expenses, income, budgets, recurring, categories, groups, group detail, settlements, shopping and profile pages with markup rendered by JavaScript from api.js, using &lt;template&gt; elements and textContent (never innerHTML with user data). Keep the static markup as the no-JavaScript fallback. Implement the expenses filter bar (search, category, method, date range, sort) with debounced live filtering and query-string sync, pagination, and empty states.</w:t>
       </w:r>
     </w:p>
     <w:p>
@@ -8389,7 +8980,7 @@
           <w:sz w:val="21"/>
           <w:szCs w:val="21"/>
         </w:rPr>
-        <w:t xml:space="preserve">Cover the core JavaScript skills examiners look for: events, DOM manipulation, validation.</w:t>
+        <w:t xml:space="preserve">Turn the static pages into working screens.</w:t>
       </w:r>
     </w:p>
     <w:p>
@@ -8417,7 +9008,7 @@
           <w:sz w:val="21"/>
           <w:szCs w:val="21"/>
         </w:rPr>
-        <w:t xml:space="preserve">client/js/pages/*.js, client/js/ui/forms.js</w:t>
+        <w:t xml:space="preserve">client/js/pages/*.js, client/pages/*.html</w:t>
       </w:r>
     </w:p>
     <w:p>
@@ -8426,7 +9017,7 @@
         <w:keepNext/>
       </w:pPr>
       <w:r>
-        <w:t xml:space="preserve">P5  Group splitting and the debt-simplification algorithm</w:t>
+        <w:t xml:space="preserve">P3  Forms, validation and CRUD flows</w:t>
       </w:r>
     </w:p>
     <w:p>
@@ -8474,7 +9065,7 @@
           <w:sz w:val="19"/>
           <w:szCs w:val="19"/>
         </w:rPr>
-        <w:t xml:space="preserve">In client/js/domain/splits.js implement equal splits in integer paise with the leftover paise assigned to the payer, and custom splits that must sum exactly to the total. On the shared-expense form show a live "remaining to assign" counter and disable submit until it reaches zero. In client/js/domain/settle.js implement net balances (paid minus share) and the greedy minimum-cash-flow algorithm: repeatedly match the largest debtor with the largest creditor and transfer min(debt, credit) until every balance is within one paisa; return the transfer list and the number of original pairwise debts. Render the settle-up page from it, and make "Mark paid" record a settlement and recompute balances. Add unit tests runnable with node --test using the Goa Trip example (balances +1700, -2500, +5700, -4900 give 3 transfers).</w:t>
+        <w:t xml:space="preserve">Wire every form (register, login, expense add/edit, income, budget, recurring, category, group create, add member, shared expense, shopping list and item, profile, change password) to api.js. Use the Constraint Validation API plus custom rules (passwords match, date not in the future, budget greater than zero) with inline error messages linked by aria-describedby, and move focus to the first invalid field. Show a toast after each save and redirect afterwards (Post/Redirect/Get). Add password show/hide toggles with aria-pressed. Protect app pages: redirect to login.html when nobody is signed in.</w:t>
       </w:r>
     </w:p>
     <w:p>
@@ -8502,7 +9093,7 @@
           <w:sz w:val="21"/>
           <w:szCs w:val="21"/>
         </w:rPr>
-        <w:t xml:space="preserve">Show algorithmic JavaScript, the core idea of SplitStack.</w:t>
+        <w:t xml:space="preserve">Cover the core JavaScript skills examiners look for: events, DOM manipulation, validation.</w:t>
       </w:r>
     </w:p>
     <w:p>
@@ -8530,7 +9121,7 @@
           <w:sz w:val="21"/>
           <w:szCs w:val="21"/>
         </w:rPr>
-        <w:t xml:space="preserve">client/js/domain/splits.js, client/js/domain/settle.js, tests/client/*.test.js</w:t>
+        <w:t xml:space="preserve">client/js/pages/*.js, client/js/ui/forms.js</w:t>
       </w:r>
     </w:p>
     <w:p>
@@ -8539,7 +9130,7 @@
         <w:keepNext/>
       </w:pPr>
       <w:r>
-        <w:t xml:space="preserve">P6  Charts, budgets, forecast, insights, search and notifications</w:t>
+        <w:t xml:space="preserve">P4  Group splitting and the debt-simplification algorithm</w:t>
       </w:r>
     </w:p>
     <w:p>
@@ -8587,7 +9178,7 @@
           <w:sz w:val="19"/>
           <w:szCs w:val="19"/>
         </w:rPr>
-        <w:t xml:space="preserve">Render the dashboard and analytics charts with Chart.js 4 loaded from a pinned CDN URL, reading colours from the CSS custom properties so both themes work, and keep the CSS charts as a fallback. Compute budget status (ok under 75%, caution 75-90%, warning 90-100%, danger over 100%) and update the meters. Port the spending forecast (average daily spend multiplied by the days in the month) to client/js/domain/forecast.js. Generate smart insights from the data (over-budget categories, month-over-month change, upcoming recurring bills). Make the topbar search show live results across expenses, groups and lists in a listbox with keyboard navigation, and make the bell open a notifications panel built from the insights with an unread count.</w:t>
+        <w:t xml:space="preserve">In client/js/domain/splits.js implement equal splits in integer paise with the leftover paise assigned to the payer, and custom splits that must sum exactly to the total. On the shared-expense form show a live "remaining to assign" counter and disable submit until it reaches zero. In client/js/domain/settle.js implement net balances (paid minus share) and the greedy minimum-cash-flow algorithm: repeatedly match the largest debtor with the largest creditor and transfer min(debt, credit) until every balance is within one paisa; return the transfer list and the number of original pairwise debts. Render the settle-up page from it, and make "Mark paid" record a settlement and recompute balances. Add unit tests runnable with node --test using the Goa Trip example (balances +1700, -2500, +5700, -4900 give 3 transfers).</w:t>
       </w:r>
     </w:p>
     <w:p>
@@ -8615,7 +9206,7 @@
           <w:sz w:val="21"/>
           <w:szCs w:val="21"/>
         </w:rPr>
-        <w:t xml:space="preserve">Finish the interactive features that were disconnected in the original app.</w:t>
+        <w:t xml:space="preserve">Show algorithmic JavaScript, the core idea of SplitStack.</w:t>
       </w:r>
     </w:p>
     <w:p>
@@ -8643,7 +9234,7 @@
           <w:sz w:val="21"/>
           <w:szCs w:val="21"/>
         </w:rPr>
-        <w:t xml:space="preserve">client/js/pages/dashboard.js, client/js/pages/analytics.js, client/js/domain/forecast.js, client/js/ui/search.js, client/js/ui/notifications.js</w:t>
+        <w:t xml:space="preserve">client/js/domain/splits.js, client/js/domain/settle.js, tests/client/*.test.js</w:t>
       </w:r>
     </w:p>
     <w:p>
@@ -8652,7 +9243,7 @@
         <w:keepNext/>
       </w:pPr>
       <w:r>
-        <w:t xml:space="preserve">P7  Shopping checklist and receipt scan preview</w:t>
+        <w:t xml:space="preserve">P5  Charts, budgets, forecast, insights, search and notifications</w:t>
       </w:r>
     </w:p>
     <w:p>
@@ -8700,7 +9291,7 @@
           <w:sz w:val="19"/>
           <w:szCs w:val="19"/>
         </w:rPr>
-        <w:t xml:space="preserve">Make the shopping checklist toggle items with optimistic UI, edit actual prices inline, recompute the estimated, actual and variance totals live, and convert the list to an expense only once (prevent duplicates). On the receipt scan page add drag-and-drop with dragenter/dragleave styling, client-side checks (PNG, JPEG or WEBP, up to 5 MB) and an image preview via URL.createObjectURL. Until the backend exists, run OCR in the browser with tesseract.js from a pinned CDN, parse the merchant, date and total with regular expressions (prefer the line containing TOTAL), show progress, and pre-fill the confirm form.</w:t>
+        <w:t xml:space="preserve">Render the dashboard and analytics charts with Chart.js 4 loaded from a pinned CDN URL, reading colours from the CSS custom properties so both themes work, and keep the CSS charts as a fallback. Compute budget status (ok under 75%, caution 75-90%, warning 90-100%, danger over 100%) and update the meters. Port the spending forecast (average daily spend multiplied by the days in the month) to client/js/domain/forecast.js. Generate smart insights from the data (over-budget categories, month-over-month change, upcoming recurring bills). Make the topbar search show live results across expenses, groups and lists in a listbox with keyboard navigation, and make the bell open a notifications panel built from the insights with an unread count.</w:t>
       </w:r>
     </w:p>
     <w:p>
@@ -8728,7 +9319,7 @@
           <w:sz w:val="21"/>
           <w:szCs w:val="21"/>
         </w:rPr>
-        <w:t xml:space="preserve">Complete the remaining interactive flows.</w:t>
+        <w:t xml:space="preserve">Finish the interactive features that were disconnected in the original app.</w:t>
       </w:r>
     </w:p>
     <w:p>
@@ -8756,7 +9347,7 @@
           <w:sz w:val="21"/>
           <w:szCs w:val="21"/>
         </w:rPr>
-        <w:t xml:space="preserve">client/js/pages/shopping-detail.js, client/js/pages/receipt-scan.js, client/js/domain/receipt-parser.js</w:t>
+        <w:t xml:space="preserve">client/js/pages/dashboard.js, client/js/pages/analytics.js, client/js/domain/forecast.js, client/js/ui/search.js, client/js/ui/notifications.js</w:t>
       </w:r>
     </w:p>
     <w:p>
@@ -8765,7 +9356,7 @@
         <w:keepNext/>
       </w:pPr>
       <w:r>
-        <w:t xml:space="preserve">P8  Review 2 QA, log and commit</w:t>
+        <w:t xml:space="preserve">P6  Shopping checklist and receipt scan preview</w:t>
       </w:r>
     </w:p>
     <w:p>
@@ -8813,7 +9404,7 @@
           <w:sz w:val="19"/>
           <w:szCs w:val="19"/>
         </w:rPr>
-        <w:t xml:space="preserve">Run ESLint (recommended rules, browser globals, ES2023 modules) over client/js and fix every finding; run the domain unit tests; test every page manually at 1366px and 375px in dark and light themes, using only the keyboard, and with JavaScript disabled (pages must still show their static content). Update client/README.md with the JavaScript architecture and a table of the JS concepts used and where. Add each step to docs/prompt_log.json, rebuild the Word and PDF logs, and commit "Review 2".</w:t>
+        <w:t xml:space="preserve">Make the shopping checklist toggle items with optimistic UI, edit actual prices inline, recompute the estimated, actual and variance totals live, and convert the list to an expense only once (prevent duplicates). On the receipt scan page add drag-and-drop with dragenter/dragleave styling, client-side checks (PNG, JPEG or WEBP, up to 5 MB) and an image preview via URL.createObjectURL. Until the backend exists, run OCR in the browser with tesseract.js from a pinned CDN, parse the merchant, date and total with regular expressions (prefer the line containing TOTAL), show progress, and pre-fill the confirm form.</w:t>
       </w:r>
     </w:p>
     <w:p>
@@ -8841,7 +9432,7 @@
           <w:sz w:val="21"/>
           <w:szCs w:val="21"/>
         </w:rPr>
-        <w:t xml:space="preserve">Close Review 2 with evidence.</w:t>
+        <w:t xml:space="preserve">Complete the remaining interactive flows.</w:t>
       </w:r>
     </w:p>
     <w:p>
@@ -8869,7 +9460,7 @@
           <w:sz w:val="21"/>
           <w:szCs w:val="21"/>
         </w:rPr>
-        <w:t xml:space="preserve">eslint.config.js, client/README.md, docs/*</w:t>
+        <w:t xml:space="preserve">client/js/pages/shopping-detail.js, client/js/pages/receipt-scan.js, client/js/domain/receipt-parser.js</w:t>
       </w:r>
     </w:p>
     <w:p>
@@ -8878,7 +9469,7 @@
         <w:keepNext/>
       </w:pPr>
       <w:r>
-        <w:t xml:space="preserve">P9  Express server and MongoDB connection</w:t>
+        <w:t xml:space="preserve">P7  Review 2 QA, log and commit</w:t>
       </w:r>
     </w:p>
     <w:p>
@@ -8892,7 +9483,7 @@
           <w:sz w:val="18"/>
           <w:szCs w:val="18"/>
         </w:rPr>
-        <w:t xml:space="preserve">Review 3  |  Planned prompt</w:t>
+        <w:t xml:space="preserve">Review 2  |  Planned prompt</w:t>
       </w:r>
     </w:p>
     <w:p>
@@ -8926,7 +9517,7 @@
           <w:sz w:val="19"/>
           <w:szCs w:val="19"/>
         </w:rPr>
-        <w:t xml:space="preserve">Create server/ as a Node.js 20+ project (ES modules) with Express: server/src/app.js (helmet with a Content Security Policy that allows only the CDNs in use, compression, express.json, express-session stored with connect-mongo, express-rate-limit on auth and upload routes, a CSRF token check on state-changing requests, and a central error handler returning JSON {error, fields}), server/src/index.js (connect to MongoDB Atlas with Mongoose using MONGODB_URI from server/.env, then listen), and static serving of client/. Add server/.env.example (MONGODB_URI, SESSION_SECRET of at least 32 characters, PORT) and npm scripts dev (node --watch) and start. Never commit .env.</w:t>
+        <w:t xml:space="preserve">Run ESLint (recommended rules, browser globals, ES2023 modules) over client/js and fix every finding; run the domain unit tests; test every page manually at 1366px and 375px in dark and light themes, using only the keyboard, and with JavaScript disabled (pages must still show their static content). Update client/README.md with the JavaScript architecture and a table of the JS concepts used and where. Add each step to docs/prompt_log.json, rebuild the Word and PDF logs, and commit "Review 2".</w:t>
       </w:r>
     </w:p>
     <w:p>
@@ -8954,7 +9545,7 @@
           <w:sz w:val="21"/>
           <w:szCs w:val="21"/>
         </w:rPr>
-        <w:t xml:space="preserve">Start Review 3 with a secure, conventional Express setup.</w:t>
+        <w:t xml:space="preserve">Close Review 2 with evidence.</w:t>
       </w:r>
     </w:p>
     <w:p>
@@ -8982,7 +9573,7 @@
           <w:sz w:val="21"/>
           <w:szCs w:val="21"/>
         </w:rPr>
-        <w:t xml:space="preserve">server/package.json, server/src/app.js, server/src/index.js, server/.env.example</w:t>
+        <w:t xml:space="preserve">eslint.config.js, client/README.md, docs/*</w:t>
       </w:r>
     </w:p>
     <w:p>
@@ -8991,7 +9582,7 @@
         <w:keepNext/>
       </w:pPr>
       <w:r>
-        <w:t xml:space="preserve">P10  Mongoose data models</w:t>
+        <w:t xml:space="preserve">P8  Express server and MongoDB connection</w:t>
       </w:r>
     </w:p>
     <w:p>
@@ -9039,7 +9630,7 @@
           <w:sz w:val="19"/>
           <w:szCs w:val="19"/>
         </w:rPr>
-        <w:t xml:space="preserve">Design Mongoose schemas with validation and indexes to replace the 15 SQLite tables: User (name, email unique and lowercase, passwordHash, preferences), Category (user, or null for defaults; name; type expense or income; icon; color), Expense and Income (user, category, amount stored as integer paise, date, description or source, paymentMethod), Budget (user, category or null, month, year, limit; unique on user+category+month+year), Recurring (name, amount, frequency, startDate, nextDueDate, active), Group (name, description, createdBy, members [{user, role admin|member, joinedAt}]), SharedExpense (group, title, amount, paidBy, category, date, splitType, shares [{user, amount}] with a validator that the shares sum to the amount), Settlement (group, payer, payee, amount, status, completedAt), ShoppingList (owner, optional group, name, budget, items [{name, quantity, estimatedPrice, actualPrice, purchased, assignedTo}], convertedExpense), Receipt (user, file reference, merchant, date, amount, rawText, confidence) and Insight (user, kind, message, read). Explain in comments which data is embedded and which is referenced, and why.</w:t>
+        <w:t xml:space="preserve">Create server/ as a Node.js 20+ project (ES modules) with Express: server/src/app.js (helmet with a Content Security Policy that allows only the CDNs in use, compression, express.json, express-session stored with connect-mongo, express-rate-limit on auth and upload routes, a CSRF token check on state-changing requests, and a central error handler returning JSON {error, fields}), server/src/index.js (connect to MongoDB Atlas with Mongoose using MONGODB_URI from server/.env, then listen), and static serving of client/. Add server/.env.example (MONGODB_URI, SESSION_SECRET of at least 32 characters, PORT) and npm scripts dev (node --watch) and start. Never commit .env.</w:t>
       </w:r>
     </w:p>
     <w:p>
@@ -9067,7 +9658,7 @@
           <w:sz w:val="21"/>
           <w:szCs w:val="21"/>
         </w:rPr>
-        <w:t xml:space="preserve">Show MongoDB data modelling, the core of Review 3.</w:t>
+        <w:t xml:space="preserve">Start Review 3 with a secure, conventional Express setup.</w:t>
       </w:r>
     </w:p>
     <w:p>
@@ -9095,7 +9686,7 @@
           <w:sz w:val="21"/>
           <w:szCs w:val="21"/>
         </w:rPr>
-        <w:t xml:space="preserve">server/src/models/*.js</w:t>
+        <w:t xml:space="preserve">server/package.json, server/src/app.js, server/src/index.js, server/.env.example</w:t>
       </w:r>
     </w:p>
     <w:p>
@@ -9104,7 +9695,7 @@
         <w:keepNext/>
       </w:pPr>
       <w:r>
-        <w:t xml:space="preserve">P11  Authentication and REST API</w:t>
+        <w:t xml:space="preserve">P9  Mongoose data models</w:t>
       </w:r>
     </w:p>
     <w:p>
@@ -9152,7 +9743,7 @@
           <w:sz w:val="19"/>
           <w:szCs w:val="19"/>
         </w:rPr>
-        <w:t xml:space="preserve">Implement the REST API under /api with one express.Router per module, mirroring the 48 legacy Flask routes: /api/auth (register with bcrypt cost 12, login, logout, me), /api/expenses, /api/income, /api/categories, /api/budgets, /api/recurring (including toggle), /api/groups (members, shared expenses, balances, settlements, leave), /api/shopping (lists, items, toggle, convert to expense), /api/analytics (monthly, categories, forecast, insights) and /api/search. Validate every input with a schema (zod or express-validator), check ownership or group membership on every request, use MongoDB transactions for multi-document writes (recording a settlement, converting a list), and reuse the Review 2 settle.js and splits.js modules on the server so the algorithm has a single implementation.</w:t>
+        <w:t xml:space="preserve">Design Mongoose schemas with validation and indexes to replace the 15 SQLite tables: User (name, email unique and lowercase, passwordHash, preferences), Category (user, or null for defaults; name; type expense or income; icon; color), Expense and Income (user, category, amount stored as integer paise, date, description or source, paymentMethod), Budget (user, category or null, month, year, limit; unique on user+category+month+year), Recurring (name, amount, frequency, startDate, nextDueDate, active), Group (name, description, createdBy, members [{user, role admin|member, joinedAt}]), SharedExpense (group, title, amount, paidBy, category, date, splitType, shares [{user, amount}] with a validator that the shares sum to the amount), Settlement (group, payer, payee, amount, status, completedAt), ShoppingList (owner, optional group, name, budget, items [{name, quantity, estimatedPrice, actualPrice, purchased, assignedTo}], convertedExpense), Receipt (user, file reference, merchant, date, amount, rawText, confidence) and Insight (user, kind, message, read). Explain in comments which data is embedded and which is referenced, and why.</w:t>
       </w:r>
     </w:p>
     <w:p>
@@ -9180,7 +9771,7 @@
           <w:sz w:val="21"/>
           <w:szCs w:val="21"/>
         </w:rPr>
-        <w:t xml:space="preserve">Deliver the Node.js back end with a complete, secure API.</w:t>
+        <w:t xml:space="preserve">Show MongoDB data modelling, the core of Review 3.</w:t>
       </w:r>
     </w:p>
     <w:p>
@@ -9208,7 +9799,7 @@
           <w:sz w:val="21"/>
           <w:szCs w:val="21"/>
         </w:rPr>
-        <w:t xml:space="preserve">server/src/routes/*.js, server/src/services/*.js, server/src/middleware/*.js</w:t>
+        <w:t xml:space="preserve">server/src/models/*.js</w:t>
       </w:r>
     </w:p>
     <w:p>
@@ -9217,7 +9808,7 @@
         <w:keepNext/>
       </w:pPr>
       <w:r>
-        <w:t xml:space="preserve">P12  Receipt upload and server-side OCR</w:t>
+        <w:t xml:space="preserve">P10  Authentication and REST API</w:t>
       </w:r>
     </w:p>
     <w:p>
@@ -9265,7 +9856,7 @@
           <w:sz w:val="19"/>
           <w:szCs w:val="19"/>
         </w:rPr>
-        <w:t xml:space="preserve">Add POST /api/receipts using multer with memory storage, a 5 MB limit and magic-byte checks for PNG, JPEG and WEBP; preprocess with sharp (rotate from EXIF, greyscale, upscale small images, normalise); run tesseract.js with one shared worker; parse the merchant, date and total with the Review 2 parser; store the image in MongoDB GridFS (so it survives redeploys on free hosting) and the parsed fields in Receipt. GET /api/receipts/:id/image streams the image only to its owner. Confirming creates the expense; nothing becomes an expense without confirmation.</w:t>
+        <w:t xml:space="preserve">Implement the REST API under /api with one express.Router per module, mirroring the 48 legacy Flask routes: /api/auth (register with bcrypt cost 12, login, logout, me), /api/expenses, /api/income, /api/categories, /api/budgets, /api/recurring (including toggle), /api/groups (members, shared expenses, balances, settlements, leave), /api/shopping (lists, items, toggle, convert to expense), /api/analytics (monthly, categories, forecast, insights) and /api/search. Validate every input with a schema (zod or express-validator), check ownership or group membership on every request, use MongoDB transactions for multi-document writes (recording a settlement, converting a list), and reuse the Review 2 settle.js and splits.js modules on the server so the algorithm has a single implementation.</w:t>
       </w:r>
     </w:p>
     <w:p>
@@ -9293,7 +9884,7 @@
           <w:sz w:val="21"/>
           <w:szCs w:val="21"/>
         </w:rPr>
-        <w:t xml:space="preserve">Port the OCR feature to Node with persistent storage.</w:t>
+        <w:t xml:space="preserve">Deliver the Node.js back end with a complete, secure API.</w:t>
       </w:r>
     </w:p>
     <w:p>
@@ -9321,7 +9912,7 @@
           <w:sz w:val="21"/>
           <w:szCs w:val="21"/>
         </w:rPr>
-        <w:t xml:space="preserve">server/src/routes/receipts.js, server/src/services/ocr.js</w:t>
+        <w:t xml:space="preserve">server/src/routes/*.js, server/src/services/*.js, server/src/middleware/*.js</w:t>
       </w:r>
     </w:p>
     <w:p>
@@ -9330,7 +9921,7 @@
         <w:keepNext/>
       </w:pPr>
       <w:r>
-        <w:t xml:space="preserve">P13  Connect the client to the API</w:t>
+        <w:t xml:space="preserve">P11  Receipt upload and server-side OCR</w:t>
       </w:r>
     </w:p>
     <w:p>
@@ -9378,7 +9969,7 @@
           <w:sz w:val="19"/>
           <w:szCs w:val="19"/>
         </w:rPr>
-        <w:t xml:space="preserve">Re-implement client/js/data/api.js with fetch() against /api, sending credentials and the CSRF token header, mapping HTTP errors to the same {field, message} errors the pages already handle, and showing a toast when offline. Remove the localStorage store except for the theme preference. Because the page code depends only on api.js, no page module should need changes; confirm this by running every flow end to end against a local server connected to Atlas.</w:t>
+        <w:t xml:space="preserve">Add POST /api/receipts using multer with memory storage, a 5 MB limit and magic-byte checks for PNG, JPEG and WEBP; preprocess with sharp (rotate from EXIF, greyscale, upscale small images, normalise); run tesseract.js with one shared worker; parse the merchant, date and total with the Review 2 parser; store the image in MongoDB GridFS (so it survives redeploys on free hosting) and the parsed fields in Receipt. GET /api/receipts/:id/image streams the image only to its owner. Confirming creates the expense; nothing becomes an expense without confirmation.</w:t>
       </w:r>
     </w:p>
     <w:p>
@@ -9406,7 +9997,7 @@
           <w:sz w:val="21"/>
           <w:szCs w:val="21"/>
         </w:rPr>
-        <w:t xml:space="preserve">Finish the full-stack integration.</w:t>
+        <w:t xml:space="preserve">Port the OCR feature to Node with persistent storage.</w:t>
       </w:r>
     </w:p>
     <w:p>
@@ -9434,7 +10025,7 @@
           <w:sz w:val="21"/>
           <w:szCs w:val="21"/>
         </w:rPr>
-        <w:t xml:space="preserve">client/js/data/api.js</w:t>
+        <w:t xml:space="preserve">server/src/routes/receipts.js, server/src/services/ocr.js</w:t>
       </w:r>
     </w:p>
     <w:p>
@@ -9443,7 +10034,7 @@
         <w:keepNext/>
       </w:pPr>
       <w:r>
-        <w:t xml:space="preserve">P14  Seed data and automated tests</w:t>
+        <w:t xml:space="preserve">P12  Connect the client to the API</w:t>
       </w:r>
     </w:p>
     <w:p>
@@ -9491,7 +10082,7 @@
           <w:sz w:val="19"/>
           <w:szCs w:val="19"/>
         </w:rPr>
-        <w:t xml:space="preserve">Add server/scripts/seed.js that creates the demo user, categories, six months of expenses and income, budgets, recurring payments, the three groups with shared expenses, and shopping lists. It must be idempotent and must refuse to run against a database whose name does not end in -dev or -test unless --force is passed. Write Jest + Supertest tests using mongodb-memory-server for auth, ownership checks, CSRF rejection, rate limiting, split validation, the settlement algorithm, budget status, convert-to-expense duplicate prevention and receipt upload validation, covering what the 47 legacy Python tests checked. Add an npm test script and a GitHub Actions workflow that runs lint and tests on every push.</w:t>
+        <w:t xml:space="preserve">Re-implement client/js/data/api.js with fetch() against /api, sending credentials and the CSRF token header, mapping HTTP errors to the same {field, message} errors the pages already handle, and showing a toast when offline. Remove the localStorage store except for the theme preference. Because the page code depends only on api.js, no page module should need changes; confirm this by running every flow end to end against a local server connected to Atlas.</w:t>
       </w:r>
     </w:p>
     <w:p>
@@ -9519,7 +10110,7 @@
           <w:sz w:val="21"/>
           <w:szCs w:val="21"/>
         </w:rPr>
-        <w:t xml:space="preserve">Prove the back end works and keep it working.</w:t>
+        <w:t xml:space="preserve">Finish the full-stack integration.</w:t>
       </w:r>
     </w:p>
     <w:p>
@@ -9547,7 +10138,7 @@
           <w:sz w:val="21"/>
           <w:szCs w:val="21"/>
         </w:rPr>
-        <w:t xml:space="preserve">server/scripts/seed.js, server/tests/*.test.js, .github/workflows/ci.yml</w:t>
+        <w:t xml:space="preserve">client/js/data/api.js</w:t>
       </w:r>
     </w:p>
     <w:p>
@@ -9556,7 +10147,120 @@
         <w:keepNext/>
       </w:pPr>
       <w:r>
-        <w:t xml:space="preserve">P15  Remove legacy code, document and deploy</w:t>
+        <w:t xml:space="preserve">P13  Seed data and automated tests</w:t>
+      </w:r>
+    </w:p>
+    <w:p>
+      <w:pPr>
+        <w:keepNext/>
+        <w:spacing w:after="60"/>
+      </w:pPr>
+      <w:r>
+        <w:rPr>
+          <w:color w:val="5B6475"/>
+          <w:sz w:val="18"/>
+          <w:szCs w:val="18"/>
+        </w:rPr>
+        <w:t xml:space="preserve">Review 3  |  Planned prompt</w:t>
+      </w:r>
+    </w:p>
+    <w:p>
+      <w:pPr>
+        <w:spacing w:after="60" w:before="160"/>
+      </w:pPr>
+      <w:r>
+        <w:rPr>
+          <w:b/>
+          <w:bCs/>
+          <w:color w:val="4F46E5"/>
+          <w:spacing w:val="20"/>
+          <w:sz w:val="17"/>
+          <w:szCs w:val="17"/>
+        </w:rPr>
+        <w:t xml:space="preserve">PROMPT</w:t>
+      </w:r>
+    </w:p>
+    <w:p>
+      <w:pPr>
+        <w:pBdr>
+          <w:left w:val="single" w:color="4F46E5" w:sz="18" w:space="8"/>
+        </w:pBdr>
+        <w:shd w:fill="F1F2F8" w:color="auto" w:val="clear"/>
+        <w:spacing w:after="120" w:before="40" w:line="276"/>
+        <w:ind w:left="160" w:right="160"/>
+      </w:pPr>
+      <w:r>
+        <w:rPr>
+          <w:rFonts w:ascii="Consolas" w:cs="Consolas" w:eastAsia="Consolas" w:hAnsi="Consolas"/>
+          <w:sz w:val="19"/>
+          <w:szCs w:val="19"/>
+        </w:rPr>
+        <w:t xml:space="preserve">Add server/scripts/seed.js that creates the demo user, categories, six months of expenses and income, budgets, recurring payments, the three groups with shared expenses, and shopping lists. It must be idempotent and must refuse to run against a database whose name does not end in -dev or -test unless --force is passed. Write Jest + Supertest tests using mongodb-memory-server for auth, ownership checks, CSRF rejection, rate limiting, split validation, the settlement algorithm, budget status, convert-to-expense duplicate prevention and receipt upload validation, covering what the 47 legacy Python tests checked. Add an npm test script and a GitHub Actions workflow that runs lint and tests on every push.</w:t>
+      </w:r>
+    </w:p>
+    <w:p>
+      <w:pPr>
+        <w:spacing w:after="60" w:before="160"/>
+      </w:pPr>
+      <w:r>
+        <w:rPr>
+          <w:b/>
+          <w:bCs/>
+          <w:color w:val="4F46E5"/>
+          <w:spacing w:val="20"/>
+          <w:sz w:val="17"/>
+          <w:szCs w:val="17"/>
+        </w:rPr>
+        <w:t xml:space="preserve">PURPOSE</w:t>
+      </w:r>
+    </w:p>
+    <w:p>
+      <w:pPr>
+        <w:spacing w:after="80"/>
+      </w:pPr>
+      <w:r>
+        <w:rPr>
+          <w:sz w:val="21"/>
+          <w:szCs w:val="21"/>
+        </w:rPr>
+        <w:t xml:space="preserve">Prove the back end works and keep it working.</w:t>
+      </w:r>
+    </w:p>
+    <w:p>
+      <w:pPr>
+        <w:spacing w:after="60" w:before="160"/>
+      </w:pPr>
+      <w:r>
+        <w:rPr>
+          <w:b/>
+          <w:bCs/>
+          <w:color w:val="4F46E5"/>
+          <w:spacing w:val="20"/>
+          <w:sz w:val="17"/>
+          <w:szCs w:val="17"/>
+        </w:rPr>
+        <w:t xml:space="preserve">FILES</w:t>
+      </w:r>
+    </w:p>
+    <w:p>
+      <w:pPr>
+        <w:spacing w:after="80"/>
+      </w:pPr>
+      <w:r>
+        <w:rPr>
+          <w:sz w:val="21"/>
+          <w:szCs w:val="21"/>
+        </w:rPr>
+        <w:t xml:space="preserve">server/scripts/seed.js, server/tests/*.test.js, .github/workflows/ci.yml</w:t>
+      </w:r>
+    </w:p>
+    <w:p>
+      <w:pPr>
+        <w:pStyle w:val="Heading3"/>
+        <w:keepNext/>
+      </w:pPr>
+      <w:r>
+        <w:t xml:space="preserve">P14  Remove legacy code, document and deploy</w:t>
       </w:r>
     </w:p>
     <w:p>

</xml_diff>

<commit_message>
Review 2: localStorage data layer with seed data
</commit_message>
<xml_diff>
--- a/docs/SplitStack_Prompt_Log.docx
+++ b/docs/SplitStack_Prompt_Log.docx
@@ -132,7 +132,7 @@
           <w:sz w:val="21"/>
           <w:szCs w:val="21"/>
         </w:rPr>
-        <w:t xml:space="preserve">23</w:t>
+        <w:t xml:space="preserve">25</w:t>
       </w:r>
     </w:p>
     <w:p>
@@ -568,7 +568,7 @@
                 <w:sz w:val="18"/>
                 <w:szCs w:val="18"/>
               </w:rPr>
-              <w:t xml:space="preserve">2</w:t>
+              <w:t xml:space="preserve">4</w:t>
             </w:r>
           </w:p>
         </w:tc>
@@ -3618,6 +3618,245 @@
           </w:p>
         </w:tc>
       </w:tr>
+      <w:tr>
+        <w:tc>
+          <w:tcPr>
+            <w:tcW w:type="dxa" w:w="700"/>
+            <w:shd w:fill="F7F7FB" w:color="auto" w:val="clear"/>
+            <w:tcMar>
+              <w:top w:type="dxa" w:w="60"/>
+              <w:left w:type="dxa" w:w="100"/>
+              <w:bottom w:type="dxa" w:w="60"/>
+              <w:right w:type="dxa" w:w="100"/>
+            </w:tcMar>
+          </w:tcPr>
+          <w:p>
+            <w:r>
+              <w:rPr>
+                <w:b w:val="false"/>
+                <w:bCs w:val="false"/>
+                <w:color w:val="222222"/>
+                <w:sz w:val="18"/>
+                <w:szCs w:val="18"/>
+              </w:rPr>
+              <w:t xml:space="preserve">24</w:t>
+            </w:r>
+          </w:p>
+        </w:tc>
+        <w:tc>
+          <w:tcPr>
+            <w:tcW w:type="dxa" w:w="1500"/>
+            <w:shd w:fill="F7F7FB" w:color="auto" w:val="clear"/>
+            <w:tcMar>
+              <w:top w:type="dxa" w:w="60"/>
+              <w:left w:type="dxa" w:w="100"/>
+              <w:bottom w:type="dxa" w:w="60"/>
+              <w:right w:type="dxa" w:w="100"/>
+            </w:tcMar>
+          </w:tcPr>
+          <w:p>
+            <w:r>
+              <w:rPr>
+                <w:b w:val="false"/>
+                <w:bCs w:val="false"/>
+                <w:color w:val="222222"/>
+                <w:sz w:val="18"/>
+                <w:szCs w:val="18"/>
+              </w:rPr>
+              <w:t xml:space="preserve">Review 2</w:t>
+            </w:r>
+          </w:p>
+        </w:tc>
+        <w:tc>
+          <w:tcPr>
+            <w:tcW w:type="dxa" w:w="4538"/>
+            <w:shd w:fill="F7F7FB" w:color="auto" w:val="clear"/>
+            <w:tcMar>
+              <w:top w:type="dxa" w:w="60"/>
+              <w:left w:type="dxa" w:w="100"/>
+              <w:bottom w:type="dxa" w:w="60"/>
+              <w:right w:type="dxa" w:w="100"/>
+            </w:tcMar>
+          </w:tcPr>
+          <w:p>
+            <w:r>
+              <w:rPr>
+                <w:b w:val="false"/>
+                <w:bCs w:val="false"/>
+                <w:color w:val="222222"/>
+                <w:sz w:val="18"/>
+                <w:szCs w:val="18"/>
+              </w:rPr>
+              <w:t xml:space="preserve">Request: proceed with Review 2 Step P2</w:t>
+            </w:r>
+          </w:p>
+        </w:tc>
+        <w:tc>
+          <w:tcPr>
+            <w:tcW w:type="dxa" w:w="1500"/>
+            <w:shd w:fill="F7F7FB" w:color="auto" w:val="clear"/>
+            <w:tcMar>
+              <w:top w:type="dxa" w:w="60"/>
+              <w:left w:type="dxa" w:w="100"/>
+              <w:bottom w:type="dxa" w:w="60"/>
+              <w:right w:type="dxa" w:w="100"/>
+            </w:tcMar>
+          </w:tcPr>
+          <w:p>
+            <w:r>
+              <w:rPr>
+                <w:b w:val="false"/>
+                <w:bCs w:val="false"/>
+                <w:color w:val="222222"/>
+                <w:sz w:val="18"/>
+                <w:szCs w:val="18"/>
+              </w:rPr>
+              <w:t xml:space="preserve">User prompt</w:t>
+            </w:r>
+          </w:p>
+        </w:tc>
+        <w:tc>
+          <w:tcPr>
+            <w:tcW w:type="dxa" w:w="1400"/>
+            <w:shd w:fill="F7F7FB" w:color="auto" w:val="clear"/>
+            <w:tcMar>
+              <w:top w:type="dxa" w:w="60"/>
+              <w:left w:type="dxa" w:w="100"/>
+              <w:bottom w:type="dxa" w:w="60"/>
+              <w:right w:type="dxa" w:w="100"/>
+            </w:tcMar>
+          </w:tcPr>
+          <w:p>
+            <w:r>
+              <w:rPr>
+                <w:b w:val="false"/>
+                <w:bCs w:val="false"/>
+                <w:color w:val="222222"/>
+                <w:sz w:val="18"/>
+                <w:szCs w:val="18"/>
+              </w:rPr>
+              <w:t xml:space="preserve">2026-10-16</w:t>
+            </w:r>
+          </w:p>
+        </w:tc>
+      </w:tr>
+      <w:tr>
+        <w:tc>
+          <w:tcPr>
+            <w:tcW w:type="dxa" w:w="700"/>
+            <w:tcMar>
+              <w:top w:type="dxa" w:w="60"/>
+              <w:left w:type="dxa" w:w="100"/>
+              <w:bottom w:type="dxa" w:w="60"/>
+              <w:right w:type="dxa" w:w="100"/>
+            </w:tcMar>
+          </w:tcPr>
+          <w:p>
+            <w:r>
+              <w:rPr>
+                <w:b w:val="false"/>
+                <w:bCs w:val="false"/>
+                <w:color w:val="222222"/>
+                <w:sz w:val="18"/>
+                <w:szCs w:val="18"/>
+              </w:rPr>
+              <w:t xml:space="preserve">25</w:t>
+            </w:r>
+          </w:p>
+        </w:tc>
+        <w:tc>
+          <w:tcPr>
+            <w:tcW w:type="dxa" w:w="1500"/>
+            <w:tcMar>
+              <w:top w:type="dxa" w:w="60"/>
+              <w:left w:type="dxa" w:w="100"/>
+              <w:bottom w:type="dxa" w:w="60"/>
+              <w:right w:type="dxa" w:w="100"/>
+            </w:tcMar>
+          </w:tcPr>
+          <w:p>
+            <w:r>
+              <w:rPr>
+                <w:b w:val="false"/>
+                <w:bCs w:val="false"/>
+                <w:color w:val="222222"/>
+                <w:sz w:val="18"/>
+                <w:szCs w:val="18"/>
+              </w:rPr>
+              <w:t xml:space="preserve">Review 2</w:t>
+            </w:r>
+          </w:p>
+        </w:tc>
+        <w:tc>
+          <w:tcPr>
+            <w:tcW w:type="dxa" w:w="4538"/>
+            <w:tcMar>
+              <w:top w:type="dxa" w:w="60"/>
+              <w:left w:type="dxa" w:w="100"/>
+              <w:bottom w:type="dxa" w:w="60"/>
+              <w:right w:type="dxa" w:w="100"/>
+            </w:tcMar>
+          </w:tcPr>
+          <w:p>
+            <w:r>
+              <w:rPr>
+                <w:b w:val="false"/>
+                <w:bCs w:val="false"/>
+                <w:color w:val="222222"/>
+                <w:sz w:val="18"/>
+                <w:szCs w:val="18"/>
+              </w:rPr>
+              <w:t xml:space="preserve">Client data layer backed by localStorage</w:t>
+            </w:r>
+          </w:p>
+        </w:tc>
+        <w:tc>
+          <w:tcPr>
+            <w:tcW w:type="dxa" w:w="1500"/>
+            <w:tcMar>
+              <w:top w:type="dxa" w:w="60"/>
+              <w:left w:type="dxa" w:w="100"/>
+              <w:bottom w:type="dxa" w:w="60"/>
+              <w:right w:type="dxa" w:w="100"/>
+            </w:tcMar>
+          </w:tcPr>
+          <w:p>
+            <w:r>
+              <w:rPr>
+                <w:b w:val="false"/>
+                <w:bCs w:val="false"/>
+                <w:color w:val="222222"/>
+                <w:sz w:val="18"/>
+                <w:szCs w:val="18"/>
+              </w:rPr>
+              <w:t xml:space="preserve">Working prompt</w:t>
+            </w:r>
+          </w:p>
+        </w:tc>
+        <w:tc>
+          <w:tcPr>
+            <w:tcW w:type="dxa" w:w="1400"/>
+            <w:tcMar>
+              <w:top w:type="dxa" w:w="60"/>
+              <w:left w:type="dxa" w:w="100"/>
+              <w:bottom w:type="dxa" w:w="60"/>
+              <w:right w:type="dxa" w:w="100"/>
+            </w:tcMar>
+          </w:tcPr>
+          <w:p>
+            <w:r>
+              <w:rPr>
+                <w:b w:val="false"/>
+                <w:bCs w:val="false"/>
+                <w:color w:val="222222"/>
+                <w:sz w:val="18"/>
+                <w:szCs w:val="18"/>
+              </w:rPr>
+              <w:t xml:space="preserve">2026-10-16</w:t>
+            </w:r>
+          </w:p>
+        </w:tc>
+      </w:tr>
     </w:tbl>
     <w:p>
       <w:r>
@@ -6901,20 +7140,11 @@
     </w:p>
     <w:p>
       <w:pPr>
-        <w:pStyle w:val="Heading2"/>
-        <w:spacing w:before="360"/>
-      </w:pPr>
-      <w:r>
-        <w:t xml:space="preserve">Wrap-up - Documentation, cleanup and deployment</w:t>
-      </w:r>
-    </w:p>
-    <w:p>
-      <w:pPr>
         <w:pStyle w:val="Heading3"/>
         <w:keepNext/>
       </w:pPr>
       <w:r>
-        <w:t xml:space="preserve">#13  Request: GitHub repository, website link and PDF of prompts</w:t>
+        <w:t xml:space="preserve">#24  Request: proceed with Review 2 Step P2</w:t>
       </w:r>
     </w:p>
     <w:p>
@@ -6928,7 +7158,7 @@
           <w:sz w:val="18"/>
           <w:szCs w:val="18"/>
         </w:rPr>
-        <w:t xml:space="preserve">User prompt  |  2026-10-15</w:t>
+        <w:t xml:space="preserve">User prompt  |  2026-10-16</w:t>
       </w:r>
     </w:p>
     <w:p>
@@ -6962,7 +7192,7 @@
           <w:sz w:val="19"/>
           <w:szCs w:val="19"/>
         </w:rPr>
-        <w:t xml:space="preserve">create a new repositry for this project in my gihub , and after than give me the github link and then the website link and also a pdf containing the prompts to complete project.</w:t>
+        <w:t xml:space="preserve">Proceed to Step P2: Client data layer backed by localStorage, following the project handover PDF. 1. Read the P2 instructions in the handover PDF and inspect the committed P1 architecture before making changes. 2. Implement only the P2 data layer. Keep storage and data operations separate from UI rendering and page-specific behavior. 3. Use a consistent, versioned storage structure and handle missing, malformed, or unsupported stored data safely. Avoid silently overwriting recoverable user data. 4. Follow the existing JavaScript module conventions and use the existing utilities where appropriate. 5. Add focused automated tests for storage initialization, read/write behavior, invalid data, and error handling where practical. 6. Run the relevant tests and npm run lint:html. Report exactly what passed and failed. 7. Update the prompt log and regenerate its DOCX/PDF using the existing project workflow. 8. Review the final diff for scope and regressions. Preserve docs/audit/ and all legacy Flask files. 9. Commit the completed P2 work on refurbish only after the checks pass. Use the commit message specified by the handover PDF, if one is provided; otherwise use P2: Client data layer backed by localStorage. Do not begin P3 or P4, implement Express/MongoDB, push to origin or upstream, or delete legacy files. Finish by reporting the changed files, tests, commit hash, and any remaining limitations.</w:t>
       </w:r>
     </w:p>
     <w:p>
@@ -6990,7 +7220,7 @@
           <w:sz w:val="21"/>
           <w:szCs w:val="21"/>
         </w:rPr>
-        <w:t xml:space="preserve">Publish the project under the student's own GitHub account, host the site, and export the prompt log (including the remaining planned prompts) as a PDF.</w:t>
+        <w:t xml:space="preserve">Authorize execution of Step P2 to establish the client data layer backed by localStorage with realistic seed data and API contracts.</w:t>
       </w:r>
     </w:p>
     <w:p>
@@ -7051,7 +7281,7 @@
           <w:sz w:val="21"/>
           <w:szCs w:val="21"/>
         </w:rPr>
-        <w:t xml:space="preserve">Done: see the following entries.</w:t>
+        <w:t xml:space="preserve">Implemented store.js with versioned schema and fallback, seed.js with October 2026 and historical data, and api.js with 58 async API functions matching the future REST API.</w:t>
       </w:r>
     </w:p>
     <w:p>
@@ -7079,7 +7309,7 @@
           <w:sz w:val="21"/>
           <w:szCs w:val="21"/>
         </w:rPr>
-        <w:t xml:space="preserve">-</w:t>
+        <w:t xml:space="preserve">26 automated tests passing in tests/client/data-layer.test.mjs; npm run lint:html passing with 0 errors across all HTML pages.</w:t>
       </w:r>
     </w:p>
     <w:p>
@@ -7099,7 +7329,7 @@
         <w:keepNext/>
       </w:pPr>
       <w:r>
-        <w:t xml:space="preserve">#14  PDF export of the prompt log, including planned prompts</w:t>
+        <w:t xml:space="preserve">#25  Client data layer backed by localStorage</w:t>
       </w:r>
     </w:p>
     <w:p>
@@ -7113,7 +7343,7 @@
           <w:sz w:val="18"/>
           <w:szCs w:val="18"/>
         </w:rPr>
-        <w:t xml:space="preserve">Working prompt  |  2026-10-15</w:t>
+        <w:t xml:space="preserve">Working prompt  |  2026-10-16</w:t>
       </w:r>
     </w:p>
     <w:p>
@@ -7147,7 +7377,12 @@
           <w:sz w:val="19"/>
           <w:szCs w:val="19"/>
         </w:rPr>
-        <w:t xml:space="preserve">Export the prompt log to PDF with a Python reportlab script (docs/tools/build_prompt_pdf.py) that reads docs/prompt_log.json: a title page, a stage overview table, a summary of every entry, Part A with every executed prompt verbatim in a shaded box with purpose, files, result and verification, and Part B with the planned prompts that complete Review 2, Review 3 and the wrap-up, clearly marked as not yet run. Add the planned prompts to prompt_log.json and to the Word log as well, and make "npm run log" rebuild both documents.</w:t>
+        <w:t xml:space="preserve">Step P2 (Review 2): client data layer backed by localStorage.
+Create client/js/data/ with:
+- store.js: keeps collections (users, categories, expenses, income, budgets, recurring, groups, sharedExpenses, settlements, shoppingLists, receipts, insights) in localStorage under one versioned key (e.g. "splitstack:v1"), generates ids (crypto.randomUUID), handles a missing/corrupt store by reseeding, and has a reset() used by a "Reset demo data" button on the profile page.
+- seed.js: the SAME sample data the Review 1 pages show. Read the HTML pages (dashboard, expenses, income, budgets, recurring, categories, groups, group-detail, settlements, shopping, shopping-detail, profile) and transcribe their data: demo user Priya Raman, October 2026, the groups (incl. Goa Trip) and their members, the shopping lists and items. Add a few earlier months so analytics has history. Amounts in integer paise. Demo login: demo@splitstack.app / Demo@1234 (show this on login.html).
+- api.js: async functions with the shape the future REST API will have, grouped as auth (register, login, logout, currentUser, updateProfile, changePassword), expenses and income (list with filter/sort/pagination, get, create, update, remove), categories, budgets, recurring (incl. toggle), groups (list, get, create, addMember, removeMember, leave, sharedExpenses, balances, settlements, recordSettlement), shopping (lists, items, toggleItem, convertToExpense), analytics (monthlySummary, byCategory, forecast, insights) and search(query). Every function returns a Promise, validates its input and throws an ApiError {field, message, status} for bad input, missing records or records owned by someone else. Passwords: hash with crypto.subtle SHA-256 + salt (demo only; note in a comment that the server uses bcrypt). Page code must import ONLY from api.js, never from store.js.
+- Write a short JSDoc block above each function describing arguments and return value. These docs become the contract the Review 3 REST API must match.</w:t>
       </w:r>
     </w:p>
     <w:p>
@@ -7175,7 +7410,7 @@
           <w:sz w:val="21"/>
           <w:szCs w:val="21"/>
         </w:rPr>
-        <w:t xml:space="preserve">Give the student a PDF containing the prompts needed to complete the whole project.</w:t>
+        <w:t xml:space="preserve">Create a complete, modular, resilient client data layer with realistic seed data and REST-shaped async API functions, preparing the application for full interactivity without requiring a backend server.</w:t>
       </w:r>
     </w:p>
     <w:p>
@@ -7208,7 +7443,7 @@
           <w:sz w:val="19"/>
           <w:szCs w:val="19"/>
         </w:rPr>
-        <w:t xml:space="preserve">docs/tools/build_prompt_pdf.py</w:t>
+        <w:t xml:space="preserve">client/js/data/store.js</w:t>
       </w:r>
     </w:p>
     <w:p>
@@ -7225,7 +7460,7 @@
           <w:sz w:val="19"/>
           <w:szCs w:val="19"/>
         </w:rPr>
-        <w:t xml:space="preserve">docs/tools/build-prompt-log.js</w:t>
+        <w:t xml:space="preserve">client/js/data/seed.js</w:t>
       </w:r>
     </w:p>
     <w:p>
@@ -7242,7 +7477,7 @@
           <w:sz w:val="19"/>
           <w:szCs w:val="19"/>
         </w:rPr>
-        <w:t xml:space="preserve">docs/prompt_log.json</w:t>
+        <w:t xml:space="preserve">client/js/data/api.js</w:t>
       </w:r>
     </w:p>
     <w:p>
@@ -7259,7 +7494,7 @@
           <w:sz w:val="19"/>
           <w:szCs w:val="19"/>
         </w:rPr>
-        <w:t xml:space="preserve">docs/SplitStack_Prompt_Log.pdf</w:t>
+        <w:t xml:space="preserve">client/pages/login.html</w:t>
       </w:r>
     </w:p>
     <w:p>
@@ -7276,7 +7511,7 @@
           <w:sz w:val="19"/>
           <w:szCs w:val="19"/>
         </w:rPr>
-        <w:t xml:space="preserve">docs/SplitStack_Prompt_Log.docx</w:t>
+        <w:t xml:space="preserve">client/README.md</w:t>
       </w:r>
     </w:p>
     <w:p>
@@ -7293,7 +7528,7 @@
           <w:sz w:val="19"/>
           <w:szCs w:val="19"/>
         </w:rPr>
-        <w:t xml:space="preserve">package.json</w:t>
+        <w:t xml:space="preserve">tests/client/data-layer.test.mjs</w:t>
       </w:r>
     </w:p>
     <w:p>
@@ -7321,7 +7556,7 @@
           <w:sz w:val="21"/>
           <w:szCs w:val="21"/>
         </w:rPr>
-        <w:t xml:space="preserve">PDF with the executed prompts and 15 planned prompts; the Word log has the same content.</w:t>
+        <w:t xml:space="preserve">Implemented store.js with versioning (splitstack:v1), corruption recovery, and in-memory fallback; seed.js with Priya Raman sample data in integer paise across all collections and historical months; api.js with 58 JSDoc-documented async functions covering auth, CRUD, group splitting balances, shopping lists, and analytics; updated login.html with demo credentials callout; documented data layer in client/README.md; added automated tests.</w:t>
       </w:r>
     </w:p>
     <w:p>
@@ -7349,7 +7584,7 @@
           <w:sz w:val="21"/>
           <w:szCs w:val="21"/>
         </w:rPr>
-        <w:t xml:space="preserve">Pages rendered to images and inspected; text extracted with pypdf.</w:t>
+        <w:t xml:space="preserve">Node.js test suite with 26/26 tests passing covering storage recovery, authentication, integer-paise validation, CRUD, group balances, and shopping list conversions; npm run lint:html passing with 0 errors.</w:t>
       </w:r>
     </w:p>
     <w:p>
@@ -7365,11 +7600,20 @@
     </w:p>
     <w:p>
       <w:pPr>
+        <w:pStyle w:val="Heading2"/>
+        <w:spacing w:before="360"/>
+      </w:pPr>
+      <w:r>
+        <w:t xml:space="preserve">Wrap-up - Documentation, cleanup and deployment</w:t>
+      </w:r>
+    </w:p>
+    <w:p>
+      <w:pPr>
         <w:pStyle w:val="Heading3"/>
         <w:keepNext/>
       </w:pPr>
       <w:r>
-        <w:t xml:space="preserve">#15  Create the GitHub repository and push the code</w:t>
+        <w:t xml:space="preserve">#13  Request: GitHub repository, website link and PDF of prompts</w:t>
       </w:r>
     </w:p>
     <w:p>
@@ -7383,7 +7627,7 @@
           <w:sz w:val="18"/>
           <w:szCs w:val="18"/>
         </w:rPr>
-        <w:t xml:space="preserve">Working prompt  |  2026-10-15</w:t>
+        <w:t xml:space="preserve">User prompt  |  2026-10-15</w:t>
       </w:r>
     </w:p>
     <w:p>
@@ -7417,7 +7661,7 @@
           <w:sz w:val="19"/>
           <w:szCs w:val="19"/>
         </w:rPr>
-        <w:t xml:space="preserve">Install the official GitHub CLI with winget and sign in through the device-code flow (the student approves it in the browser). Before publishing, check that no secrets or databases are tracked, review the receipt images that are still in the commit history (they are generic sample invoices), and confirm with the student that a public repository is acceptable because the team's original repository is private. Then create the public repository MahaprabhuK/SplitStack, push the refurbish branch as main together with the legacy branch, add a GitHub Actions workflow (.github/workflows/pages.yml) that deploys the client/ folder to GitHub Pages, enable Pages with the "GitHub Actions" source, and confirm that the site responds.</w:t>
+        <w:t xml:space="preserve">create a new repositry for this project in my gihub , and after than give me the github link and then the website link and also a pdf containing the prompts to complete project.</w:t>
       </w:r>
     </w:p>
     <w:p>
@@ -7445,7 +7689,7 @@
           <w:sz w:val="21"/>
           <w:szCs w:val="21"/>
         </w:rPr>
-        <w:t xml:space="preserve">Give the student a repository link and a live website link.</w:t>
+        <w:t xml:space="preserve">Publish the project under the student's own GitHub account, host the site, and export the prompt log (including the remaining planned prompts) as a PDF.</w:t>
       </w:r>
     </w:p>
     <w:p>
@@ -7478,7 +7722,7 @@
           <w:sz w:val="19"/>
           <w:szCs w:val="19"/>
         </w:rPr>
-        <w:t xml:space="preserve">README.md</w:t>
+        <w:t xml:space="preserve">-</w:t>
       </w:r>
     </w:p>
     <w:p>
@@ -7506,7 +7750,7 @@
           <w:sz w:val="21"/>
           <w:szCs w:val="21"/>
         </w:rPr>
-        <w:t xml:space="preserve">Public repository https://github.com/MahaprabhuK/SplitStack created and the legacy branch pushed. The first push of main was rejected because it added a GitHub Actions workflow (.github/workflows/pages.yml) and the gh token lacked the "workflow" scope; the workflow file was removed and main was pushed in the next step. GitHub Pages is not set up yet (planned for the wrap-up; needs "gh auth refresh -s workflow" or a gh-pages branch).</w:t>
+        <w:t xml:space="preserve">Done: see the following entries.</w:t>
       </w:r>
     </w:p>
     <w:p>
@@ -7534,7 +7778,7 @@
           <w:sz w:val="21"/>
           <w:szCs w:val="21"/>
         </w:rPr>
-        <w:t xml:space="preserve">gh repo view; git push output.</w:t>
+        <w:t xml:space="preserve">-</w:t>
       </w:r>
     </w:p>
     <w:p>
@@ -7554,7 +7798,7 @@
         <w:keepNext/>
       </w:pPr>
       <w:r>
-        <w:t xml:space="preserve">#16  Request: hand the project over to a teammate's agent</w:t>
+        <w:t xml:space="preserve">#14  PDF export of the prompt log, including planned prompts</w:t>
       </w:r>
     </w:p>
     <w:p>
@@ -7568,7 +7812,7 @@
           <w:sz w:val="18"/>
           <w:szCs w:val="18"/>
         </w:rPr>
-        <w:t xml:space="preserve">User prompt  |  2026-10-15</w:t>
+        <w:t xml:space="preserve">Working prompt  |  2026-10-15</w:t>
       </w:r>
     </w:p>
     <w:p>
@@ -7602,7 +7846,7 @@
           <w:sz w:val="19"/>
           <w:szCs w:val="19"/>
         </w:rPr>
-        <w:t xml:space="preserve">ACTUALLY I GONNA HANDOVER THE PROJECT TO MY TEAMMATES AGENT SO HE'LL BE PULLING THE CODE AND RUNNING IN HIS SYSTEM SO GIVE PROMPT FOR THAT</w:t>
+        <w:t xml:space="preserve">Export the prompt log to PDF with a Python reportlab script (docs/tools/build_prompt_pdf.py) that reads docs/prompt_log.json: a title page, a stage overview table, a summary of every entry, Part A with every executed prompt verbatim in a shaded box with purpose, files, result and verification, and Part B with the planned prompts that complete Review 2, Review 3 and the wrap-up, clearly marked as not yet run. Add the planned prompts to prompt_log.json and to the Word log as well, and make "npm run log" rebuild both documents.</w:t>
       </w:r>
     </w:p>
     <w:p>
@@ -7630,7 +7874,7 @@
           <w:sz w:val="21"/>
           <w:szCs w:val="21"/>
         </w:rPr>
-        <w:t xml:space="preserve">Let a teammate's AI agent clone, run and continue the project.</w:t>
+        <w:t xml:space="preserve">Give the student a PDF containing the prompts needed to complete the whole project.</w:t>
       </w:r>
     </w:p>
     <w:p>
@@ -7663,7 +7907,92 @@
           <w:sz w:val="19"/>
           <w:szCs w:val="19"/>
         </w:rPr>
-        <w:t xml:space="preserve">-</w:t>
+        <w:t xml:space="preserve">docs/tools/build_prompt_pdf.py</w:t>
+      </w:r>
+    </w:p>
+    <w:p>
+      <w:pPr>
+        <w:pStyle w:val="ListParagraph"/>
+        <w:numPr>
+          <w:ilvl w:val="0"/>
+          <w:numId w:val="2"/>
+        </w:numPr>
+      </w:pPr>
+      <w:r>
+        <w:rPr>
+          <w:rFonts w:ascii="Consolas" w:cs="Consolas" w:eastAsia="Consolas" w:hAnsi="Consolas"/>
+          <w:sz w:val="19"/>
+          <w:szCs w:val="19"/>
+        </w:rPr>
+        <w:t xml:space="preserve">docs/tools/build-prompt-log.js</w:t>
+      </w:r>
+    </w:p>
+    <w:p>
+      <w:pPr>
+        <w:pStyle w:val="ListParagraph"/>
+        <w:numPr>
+          <w:ilvl w:val="0"/>
+          <w:numId w:val="2"/>
+        </w:numPr>
+      </w:pPr>
+      <w:r>
+        <w:rPr>
+          <w:rFonts w:ascii="Consolas" w:cs="Consolas" w:eastAsia="Consolas" w:hAnsi="Consolas"/>
+          <w:sz w:val="19"/>
+          <w:szCs w:val="19"/>
+        </w:rPr>
+        <w:t xml:space="preserve">docs/prompt_log.json</w:t>
+      </w:r>
+    </w:p>
+    <w:p>
+      <w:pPr>
+        <w:pStyle w:val="ListParagraph"/>
+        <w:numPr>
+          <w:ilvl w:val="0"/>
+          <w:numId w:val="2"/>
+        </w:numPr>
+      </w:pPr>
+      <w:r>
+        <w:rPr>
+          <w:rFonts w:ascii="Consolas" w:cs="Consolas" w:eastAsia="Consolas" w:hAnsi="Consolas"/>
+          <w:sz w:val="19"/>
+          <w:szCs w:val="19"/>
+        </w:rPr>
+        <w:t xml:space="preserve">docs/SplitStack_Prompt_Log.pdf</w:t>
+      </w:r>
+    </w:p>
+    <w:p>
+      <w:pPr>
+        <w:pStyle w:val="ListParagraph"/>
+        <w:numPr>
+          <w:ilvl w:val="0"/>
+          <w:numId w:val="2"/>
+        </w:numPr>
+      </w:pPr>
+      <w:r>
+        <w:rPr>
+          <w:rFonts w:ascii="Consolas" w:cs="Consolas" w:eastAsia="Consolas" w:hAnsi="Consolas"/>
+          <w:sz w:val="19"/>
+          <w:szCs w:val="19"/>
+        </w:rPr>
+        <w:t xml:space="preserve">docs/SplitStack_Prompt_Log.docx</w:t>
+      </w:r>
+    </w:p>
+    <w:p>
+      <w:pPr>
+        <w:pStyle w:val="ListParagraph"/>
+        <w:numPr>
+          <w:ilvl w:val="0"/>
+          <w:numId w:val="2"/>
+        </w:numPr>
+      </w:pPr>
+      <w:r>
+        <w:rPr>
+          <w:rFonts w:ascii="Consolas" w:cs="Consolas" w:eastAsia="Consolas" w:hAnsi="Consolas"/>
+          <w:sz w:val="19"/>
+          <w:szCs w:val="19"/>
+        </w:rPr>
+        <w:t xml:space="preserve">package.json</w:t>
       </w:r>
     </w:p>
     <w:p>
@@ -7691,7 +8020,7 @@
           <w:sz w:val="21"/>
           <w:szCs w:val="21"/>
         </w:rPr>
-        <w:t xml:space="preserve">A handover prompt was written covering: requirements per review, clone and branch, prerequisites, install/run/verify commands, repository map, known traps, the mandatory logging rule, the ordered remaining work (planned prompts P1-P15) and working rules. Noted that the new work had to be pushed to GitHub first.</w:t>
+        <w:t xml:space="preserve">PDF with the executed prompts and 15 planned prompts; the Word log has the same content.</w:t>
       </w:r>
     </w:p>
     <w:p>
@@ -7719,7 +8048,7 @@
           <w:sz w:val="21"/>
           <w:szCs w:val="21"/>
         </w:rPr>
-        <w:t xml:space="preserve">-</w:t>
+        <w:t xml:space="preserve">Pages rendered to images and inspected; text extracted with pypdf.</w:t>
       </w:r>
     </w:p>
     <w:p>
@@ -7739,7 +8068,7 @@
         <w:keepNext/>
       </w:pPr>
       <w:r>
-        <w:t xml:space="preserve">#17  Push the refurbished code to GitHub main</w:t>
+        <w:t xml:space="preserve">#15  Create the GitHub repository and push the code</w:t>
       </w:r>
     </w:p>
     <w:p>
@@ -7787,7 +8116,7 @@
           <w:sz w:val="19"/>
           <w:szCs w:val="19"/>
         </w:rPr>
-        <w:t xml:space="preserve">push it  (user prompt). Executed as: remove .github/workflows/pages.yml (the token lacks the workflow scope), replace the not-yet-existing live-site link in README.md with local run instructions, correct the earlier log entry about publishing, log the handover, rebuild the prompt logs, commit, and push the refurbish branch to main on https://github.com/MahaprabhuK/SplitStack so the teammate can clone it.</w:t>
+        <w:t xml:space="preserve">Install the official GitHub CLI with winget and sign in through the device-code flow (the student approves it in the browser). Before publishing, check that no secrets or databases are tracked, review the receipt images that are still in the commit history (they are generic sample invoices), and confirm with the student that a public repository is acceptable because the team's original repository is private. Then create the public repository MahaprabhuK/SplitStack, push the refurbish branch as main together with the legacy branch, add a GitHub Actions workflow (.github/workflows/pages.yml) that deploys the client/ folder to GitHub Pages, enable Pages with the "GitHub Actions" source, and confirm that the site responds.</w:t>
       </w:r>
     </w:p>
     <w:p>
@@ -7815,7 +8144,7 @@
           <w:sz w:val="21"/>
           <w:szCs w:val="21"/>
         </w:rPr>
-        <w:t xml:space="preserve">Make the current work available to the teammate.</w:t>
+        <w:t xml:space="preserve">Give the student a repository link and a live website link.</w:t>
       </w:r>
     </w:p>
     <w:p>
@@ -7848,75 +8177,7 @@
           <w:sz w:val="19"/>
           <w:szCs w:val="19"/>
         </w:rPr>
-        <w:t xml:space="preserve">.github/workflows/pages.yml (removed)</w:t>
-      </w:r>
-    </w:p>
-    <w:p>
-      <w:pPr>
-        <w:pStyle w:val="ListParagraph"/>
-        <w:numPr>
-          <w:ilvl w:val="0"/>
-          <w:numId w:val="2"/>
-        </w:numPr>
-      </w:pPr>
-      <w:r>
-        <w:rPr>
-          <w:rFonts w:ascii="Consolas" w:cs="Consolas" w:eastAsia="Consolas" w:hAnsi="Consolas"/>
-          <w:sz w:val="19"/>
-          <w:szCs w:val="19"/>
-        </w:rPr>
         <w:t xml:space="preserve">README.md</w:t>
-      </w:r>
-    </w:p>
-    <w:p>
-      <w:pPr>
-        <w:pStyle w:val="ListParagraph"/>
-        <w:numPr>
-          <w:ilvl w:val="0"/>
-          <w:numId w:val="2"/>
-        </w:numPr>
-      </w:pPr>
-      <w:r>
-        <w:rPr>
-          <w:rFonts w:ascii="Consolas" w:cs="Consolas" w:eastAsia="Consolas" w:hAnsi="Consolas"/>
-          <w:sz w:val="19"/>
-          <w:szCs w:val="19"/>
-        </w:rPr>
-        <w:t xml:space="preserve">docs/prompt_log.json</w:t>
-      </w:r>
-    </w:p>
-    <w:p>
-      <w:pPr>
-        <w:pStyle w:val="ListParagraph"/>
-        <w:numPr>
-          <w:ilvl w:val="0"/>
-          <w:numId w:val="2"/>
-        </w:numPr>
-      </w:pPr>
-      <w:r>
-        <w:rPr>
-          <w:rFonts w:ascii="Consolas" w:cs="Consolas" w:eastAsia="Consolas" w:hAnsi="Consolas"/>
-          <w:sz w:val="19"/>
-          <w:szCs w:val="19"/>
-        </w:rPr>
-        <w:t xml:space="preserve">docs/SplitStack_Prompt_Log.docx</w:t>
-      </w:r>
-    </w:p>
-    <w:p>
-      <w:pPr>
-        <w:pStyle w:val="ListParagraph"/>
-        <w:numPr>
-          <w:ilvl w:val="0"/>
-          <w:numId w:val="2"/>
-        </w:numPr>
-      </w:pPr>
-      <w:r>
-        <w:rPr>
-          <w:rFonts w:ascii="Consolas" w:cs="Consolas" w:eastAsia="Consolas" w:hAnsi="Consolas"/>
-          <w:sz w:val="19"/>
-          <w:szCs w:val="19"/>
-        </w:rPr>
-        <w:t xml:space="preserve">docs/SplitStack_Prompt_Log.pdf</w:t>
       </w:r>
     </w:p>
     <w:p>
@@ -7944,7 +8205,7 @@
           <w:sz w:val="21"/>
           <w:szCs w:val="21"/>
         </w:rPr>
-        <w:t xml:space="preserve">main pushed to GitHub; branches on GitHub: main (refurbished work) and legacy (original Flask app).</w:t>
+        <w:t xml:space="preserve">Public repository https://github.com/MahaprabhuK/SplitStack created and the legacy branch pushed. The first push of main was rejected because it added a GitHub Actions workflow (.github/workflows/pages.yml) and the gh token lacked the "workflow" scope; the workflow file was removed and main was pushed in the next step. GitHub Pages is not set up yet (planned for the wrap-up; needs "gh auth refresh -s workflow" or a gh-pages branch).</w:t>
       </w:r>
     </w:p>
     <w:p>
@@ -7972,7 +8233,7 @@
           <w:sz w:val="21"/>
           <w:szCs w:val="21"/>
         </w:rPr>
-        <w:t xml:space="preserve">git ls-remote shows main and legacy at the expected commits.</w:t>
+        <w:t xml:space="preserve">gh repo view; git push output.</w:t>
       </w:r>
     </w:p>
     <w:p>
@@ -7992,7 +8253,7 @@
         <w:keepNext/>
       </w:pPr>
       <w:r>
-        <w:t xml:space="preserve">#18  Request: push the code and deploy the website</w:t>
+        <w:t xml:space="preserve">#16  Request: hand the project over to a teammate's agent</w:t>
       </w:r>
     </w:p>
     <w:p>
@@ -8040,7 +8301,7 @@
           <w:sz w:val="19"/>
           <w:szCs w:val="19"/>
         </w:rPr>
-        <w:t xml:space="preserve">first push the code and deploy it</w:t>
+        <w:t xml:space="preserve">ACTUALLY I GONNA HANDOVER THE PROJECT TO MY TEAMMATES AGENT SO HE'LL BE PULLING THE CODE AND RUNNING IN HIS SYSTEM SO GIVE PROMPT FOR THAT</w:t>
       </w:r>
     </w:p>
     <w:p>
@@ -8068,7 +8329,7 @@
           <w:sz w:val="21"/>
           <w:szCs w:val="21"/>
         </w:rPr>
-        <w:t xml:space="preserve">Get the code on GitHub and the Review 1 site online.</w:t>
+        <w:t xml:space="preserve">Let a teammate's AI agent clone, run and continue the project.</w:t>
       </w:r>
     </w:p>
     <w:p>
@@ -8129,7 +8390,7 @@
           <w:sz w:val="21"/>
           <w:szCs w:val="21"/>
         </w:rPr>
-        <w:t xml:space="preserve">Handled in the next step.</w:t>
+        <w:t xml:space="preserve">A handover prompt was written covering: requirements per review, clone and branch, prerequisites, install/run/verify commands, repository map, known traps, the mandatory logging rule, the ordered remaining work (planned prompts P1-P15) and working rules. Noted that the new work had to be pushed to GitHub first.</w:t>
       </w:r>
     </w:p>
     <w:p>
@@ -8177,7 +8438,7 @@
         <w:keepNext/>
       </w:pPr>
       <w:r>
-        <w:t xml:space="preserve">#19  Deploy the client to GitHub Pages from a gh-pages branch</w:t>
+        <w:t xml:space="preserve">#17  Push the refurbished code to GitHub main</w:t>
       </w:r>
     </w:p>
     <w:p>
@@ -8225,7 +8486,7 @@
           <w:sz w:val="19"/>
           <w:szCs w:val="19"/>
         </w:rPr>
-        <w:t xml:space="preserve">Push refurbish to main and refurbish on MahaprabhuK/SplitStack. Because the token cannot push workflow files, deploy without GitHub Actions: check that client/ uses only relative links, split client/ into its own history with git subtree split, push it as the gh-pages branch, wait for GitHub Pages to publish it, then put the live link back in README.md and log the step.</w:t>
+        <w:t xml:space="preserve">push it  (user prompt). Executed as: remove .github/workflows/pages.yml (the token lacks the workflow scope), replace the not-yet-existing live-site link in README.md with local run instructions, correct the earlier log entry about publishing, log the handover, rebuild the prompt logs, commit, and push the refurbish branch to main on https://github.com/MahaprabhuK/SplitStack so the teammate can clone it.</w:t>
       </w:r>
     </w:p>
     <w:p>
@@ -8253,7 +8514,7 @@
           <w:sz w:val="21"/>
           <w:szCs w:val="21"/>
         </w:rPr>
-        <w:t xml:space="preserve">Publish the Review 1 site at a public URL without needing the workflow scope.</w:t>
+        <w:t xml:space="preserve">Make the current work available to the teammate.</w:t>
       </w:r>
     </w:p>
     <w:p>
@@ -8286,7 +8547,7 @@
           <w:sz w:val="19"/>
           <w:szCs w:val="19"/>
         </w:rPr>
-        <w:t xml:space="preserve">README.md</w:t>
+        <w:t xml:space="preserve">.github/workflows/pages.yml (removed)</w:t>
       </w:r>
     </w:p>
     <w:p>
@@ -8303,7 +8564,58 @@
           <w:sz w:val="19"/>
           <w:szCs w:val="19"/>
         </w:rPr>
+        <w:t xml:space="preserve">README.md</w:t>
+      </w:r>
+    </w:p>
+    <w:p>
+      <w:pPr>
+        <w:pStyle w:val="ListParagraph"/>
+        <w:numPr>
+          <w:ilvl w:val="0"/>
+          <w:numId w:val="2"/>
+        </w:numPr>
+      </w:pPr>
+      <w:r>
+        <w:rPr>
+          <w:rFonts w:ascii="Consolas" w:cs="Consolas" w:eastAsia="Consolas" w:hAnsi="Consolas"/>
+          <w:sz w:val="19"/>
+          <w:szCs w:val="19"/>
+        </w:rPr>
         <w:t xml:space="preserve">docs/prompt_log.json</w:t>
+      </w:r>
+    </w:p>
+    <w:p>
+      <w:pPr>
+        <w:pStyle w:val="ListParagraph"/>
+        <w:numPr>
+          <w:ilvl w:val="0"/>
+          <w:numId w:val="2"/>
+        </w:numPr>
+      </w:pPr>
+      <w:r>
+        <w:rPr>
+          <w:rFonts w:ascii="Consolas" w:cs="Consolas" w:eastAsia="Consolas" w:hAnsi="Consolas"/>
+          <w:sz w:val="19"/>
+          <w:szCs w:val="19"/>
+        </w:rPr>
+        <w:t xml:space="preserve">docs/SplitStack_Prompt_Log.docx</w:t>
+      </w:r>
+    </w:p>
+    <w:p>
+      <w:pPr>
+        <w:pStyle w:val="ListParagraph"/>
+        <w:numPr>
+          <w:ilvl w:val="0"/>
+          <w:numId w:val="2"/>
+        </w:numPr>
+      </w:pPr>
+      <w:r>
+        <w:rPr>
+          <w:rFonts w:ascii="Consolas" w:cs="Consolas" w:eastAsia="Consolas" w:hAnsi="Consolas"/>
+          <w:sz w:val="19"/>
+          <w:szCs w:val="19"/>
+        </w:rPr>
+        <w:t xml:space="preserve">docs/SplitStack_Prompt_Log.pdf</w:t>
       </w:r>
     </w:p>
     <w:p>
@@ -8331,7 +8643,7 @@
           <w:sz w:val="21"/>
           <w:szCs w:val="21"/>
         </w:rPr>
-        <w:t xml:space="preserve">main and refurbish are on GitHub. The client/ folder is published from the gh-pages branch at https://mahaprabhuk.github.io/SplitStack/ (GitHub enabled Pages automatically). To redeploy after client changes: git subtree split --prefix client refurbish, then push that commit to gh-pages.</w:t>
+        <w:t xml:space="preserve">main pushed to GitHub; branches on GitHub: main (refurbished work) and legacy (original Flask app).</w:t>
       </w:r>
     </w:p>
     <w:p>
@@ -8359,7 +8671,7 @@
           <w:sz w:val="21"/>
           <w:szCs w:val="21"/>
         </w:rPr>
-        <w:t xml:space="preserve">git ls-remote; curl returned 200 for the home page, pages/404.html and css/base.css on the live site.</w:t>
+        <w:t xml:space="preserve">git ls-remote shows main and legacy at the expected commits.</w:t>
       </w:r>
     </w:p>
     <w:p>
@@ -8379,7 +8691,7 @@
         <w:keepNext/>
       </w:pPr>
       <w:r>
-        <w:t xml:space="preserve">#20  Request: handover prompt PDF for a teammate's agent</w:t>
+        <w:t xml:space="preserve">#18  Request: push the code and deploy the website</w:t>
       </w:r>
     </w:p>
     <w:p>
@@ -8427,7 +8739,7 @@
           <w:sz w:val="19"/>
           <w:szCs w:val="19"/>
         </w:rPr>
-        <w:t xml:space="preserve">imma handover the project to my teammate i want you to create a detailed prompt for his agent most prolly he'll use anti gravity so i want a pdf containing prompts to complete the rest of the work in the project. so create a pdf and mention its path once its created then i'll share it to him</w:t>
+        <w:t xml:space="preserve">first push the code and deploy it</w:t>
       </w:r>
     </w:p>
     <w:p>
@@ -8455,7 +8767,7 @@
           <w:sz w:val="21"/>
           <w:szCs w:val="21"/>
         </w:rPr>
-        <w:t xml:space="preserve">Let a teammate's AI agent (Antigravity) finish Review 2, Review 3 and the wrap-up.</w:t>
+        <w:t xml:space="preserve">Get the code on GitHub and the Review 1 site online.</w:t>
       </w:r>
     </w:p>
     <w:p>
@@ -8564,7 +8876,7 @@
         <w:keepNext/>
       </w:pPr>
       <w:r>
-        <w:t xml:space="preserve">#21  Handover prompts PDF</w:t>
+        <w:t xml:space="preserve">#19  Deploy the client to GitHub Pages from a gh-pages branch</w:t>
       </w:r>
     </w:p>
     <w:p>
@@ -8612,7 +8924,7 @@
           <w:sz w:val="19"/>
           <w:szCs w:val="19"/>
         </w:rPr>
-        <w:t xml:space="preserve">Write docs/tools/build_handover_pdf.py (reusing the styles of build_prompt_pdf.py) to produce docs/SplitStack_Handover_Prompts.pdf: how to use it with Antigravity, one-time setup (tools, collaborator access, MongoDB Atlas, workflow token scope), a roadmap, Prompt 0 with the full project context, rules, logging, commit/push and gh-pages redeploy procedure, the 15 planned prompts P1-P15 expanded with concrete checks and commit messages, utility prompts (status, recovery, review rehearsal) and common problems. Render pages to check the layout.</w:t>
+        <w:t xml:space="preserve">Push refurbish to main and refurbish on MahaprabhuK/SplitStack. Because the token cannot push workflow files, deploy without GitHub Actions: check that client/ uses only relative links, split client/ into its own history with git subtree split, push it as the gh-pages branch, wait for GitHub Pages to publish it, then put the live link back in README.md and log the step.</w:t>
       </w:r>
     </w:p>
     <w:p>
@@ -8640,7 +8952,7 @@
           <w:sz w:val="21"/>
           <w:szCs w:val="21"/>
         </w:rPr>
-        <w:t xml:space="preserve">Give the teammate a self-contained, ordered set of prompts.</w:t>
+        <w:t xml:space="preserve">Publish the Review 1 site at a public URL without needing the workflow scope.</w:t>
       </w:r>
     </w:p>
     <w:p>
@@ -8673,7 +8985,7 @@
           <w:sz w:val="19"/>
           <w:szCs w:val="19"/>
         </w:rPr>
-        <w:t xml:space="preserve">docs/tools/build_handover_pdf.py</w:t>
+        <w:t xml:space="preserve">README.md</w:t>
       </w:r>
     </w:p>
     <w:p>
@@ -8690,7 +9002,7 @@
           <w:sz w:val="19"/>
           <w:szCs w:val="19"/>
         </w:rPr>
-        <w:t xml:space="preserve">docs/SplitStack_Handover_Prompts.pdf</w:t>
+        <w:t xml:space="preserve">docs/prompt_log.json</w:t>
       </w:r>
     </w:p>
     <w:p>
@@ -8718,7 +9030,7 @@
           <w:sz w:val="21"/>
           <w:szCs w:val="21"/>
         </w:rPr>
-        <w:t xml:space="preserve">14-page PDF created. Changes against the planned prompts: P1 adds data-page attributes and client/js/package.json (type module) for node --test; P13 keeps the localStorage implementation as a demo mode (api-local.js chosen when /api/health does not answer) so the GitHub Pages site keeps working, instead of deleting it; P9 replaces deprecated csurf with a synchronizer token; P14 uses MongoMemoryReplSet because the API uses transactions; P15 asks for confirmation before deleting the Flask files and leaves Render account steps to the student.</w:t>
+        <w:t xml:space="preserve">main and refurbish are on GitHub. The client/ folder is published from the gh-pages branch at https://mahaprabhuk.github.io/SplitStack/ (GitHub enabled Pages automatically). To redeploy after client changes: git subtree split --prefix client refurbish, then push that commit to gh-pages.</w:t>
       </w:r>
     </w:p>
     <w:p>
@@ -8746,7 +9058,7 @@
           <w:sz w:val="21"/>
           <w:szCs w:val="21"/>
         </w:rPr>
-        <w:t xml:space="preserve">Rendered pages with PyMuPDF and checked the layout of the setup, Prompt 0, step and utility pages.</w:t>
+        <w:t xml:space="preserve">git ls-remote; curl returned 200 for the home page, pages/404.html and css/base.css on the live site.</w:t>
       </w:r>
     </w:p>
     <w:p>
@@ -8761,37 +9073,12 @@
       </w:r>
     </w:p>
     <w:p>
-      <w:r>
-        <w:br w:type="page"/>
-      </w:r>
-    </w:p>
-    <w:p>
-      <w:pPr>
-        <w:pStyle w:val="Heading1"/>
-      </w:pPr>
-      <w:r>
-        <w:t xml:space="preserve">Planned prompts to complete the project</w:t>
-      </w:r>
-    </w:p>
-    <w:p>
-      <w:pPr>
-        <w:spacing w:after="80"/>
-      </w:pPr>
-      <w:r>
-        <w:rPr>
-          <w:sz w:val="21"/>
-          <w:szCs w:val="21"/>
-        </w:rPr>
-        <w:t xml:space="preserve">These prompts have not been run yet. Run them in order; after each one, move it into the log above with its result.</w:t>
-      </w:r>
-    </w:p>
-    <w:p>
       <w:pPr>
         <w:pStyle w:val="Heading3"/>
         <w:keepNext/>
       </w:pPr>
       <w:r>
-        <w:t xml:space="preserve">P1  Client data layer backed by localStorage</w:t>
+        <w:t xml:space="preserve">#20  Request: handover prompt PDF for a teammate's agent</w:t>
       </w:r>
     </w:p>
     <w:p>
@@ -8805,7 +9092,7 @@
           <w:sz w:val="18"/>
           <w:szCs w:val="18"/>
         </w:rPr>
-        <w:t xml:space="preserve">Review 2  |  Planned prompt</w:t>
+        <w:t xml:space="preserve">User prompt  |  2026-10-15</w:t>
       </w:r>
     </w:p>
     <w:p>
@@ -8839,7 +9126,7 @@
           <w:sz w:val="19"/>
           <w:szCs w:val="19"/>
         </w:rPr>
-        <w:t xml:space="preserve">Create client/js/data/api.js exposing async functions with the same shape the future REST API will have: auth (register, login, logout, currentUser), expenses and income CRUD with filtering, sorting and pagination, categories, budgets, recurring payments, groups (members, shared expenses, balances, settlements), shopping lists and items, and analytics summaries. Back it with client/js/data/store.js, which keeps collections in localStorage under a versioned key, generates ids, and seeds the same sample data used in Review 1 (Priya Raman, October 2026) on first run. Every function returns a Promise and validates its input, throwing errors with a field and a message, so Review 3 can swap the implementation to fetch() without touching page code.</w:t>
+        <w:t xml:space="preserve">imma handover the project to my teammate i want you to create a detailed prompt for his agent most prolly he'll use anti gravity so i want a pdf containing prompts to complete the rest of the work in the project. so create a pdf and mention its path once its created then i'll share it to him</w:t>
       </w:r>
     </w:p>
     <w:p>
@@ -8867,7 +9154,7 @@
           <w:sz w:val="21"/>
           <w:szCs w:val="21"/>
         </w:rPr>
-        <w:t xml:space="preserve">Make the whole app genuinely interactive before a backend exists.</w:t>
+        <w:t xml:space="preserve">Let a teammate's AI agent (Antigravity) finish Review 2, Review 3 and the wrap-up.</w:t>
       </w:r>
     </w:p>
     <w:p>
@@ -8884,6 +9171,39 @@
           <w:szCs w:val="17"/>
         </w:rPr>
         <w:t xml:space="preserve">FILES</w:t>
+      </w:r>
+    </w:p>
+    <w:p>
+      <w:pPr>
+        <w:pStyle w:val="ListParagraph"/>
+        <w:numPr>
+          <w:ilvl w:val="0"/>
+          <w:numId w:val="2"/>
+        </w:numPr>
+      </w:pPr>
+      <w:r>
+        <w:rPr>
+          <w:rFonts w:ascii="Consolas" w:cs="Consolas" w:eastAsia="Consolas" w:hAnsi="Consolas"/>
+          <w:sz w:val="19"/>
+          <w:szCs w:val="19"/>
+        </w:rPr>
+        <w:t xml:space="preserve">-</w:t>
+      </w:r>
+    </w:p>
+    <w:p>
+      <w:pPr>
+        <w:spacing w:after="60" w:before="160"/>
+      </w:pPr>
+      <w:r>
+        <w:rPr>
+          <w:b/>
+          <w:bCs/>
+          <w:color w:val="4F46E5"/>
+          <w:spacing w:val="20"/>
+          <w:sz w:val="17"/>
+          <w:szCs w:val="17"/>
+        </w:rPr>
+        <w:t xml:space="preserve">RESULT</w:t>
       </w:r>
     </w:p>
     <w:p>
@@ -8895,7 +9215,46 @@
           <w:sz w:val="21"/>
           <w:szCs w:val="21"/>
         </w:rPr>
-        <w:t xml:space="preserve">client/js/data/api.js, client/js/data/store.js, client/js/data/seed.js</w:t>
+        <w:t xml:space="preserve">Handled in the next step.</w:t>
+      </w:r>
+    </w:p>
+    <w:p>
+      <w:pPr>
+        <w:spacing w:after="60" w:before="160"/>
+      </w:pPr>
+      <w:r>
+        <w:rPr>
+          <w:b/>
+          <w:bCs/>
+          <w:color w:val="4F46E5"/>
+          <w:spacing w:val="20"/>
+          <w:sz w:val="17"/>
+          <w:szCs w:val="17"/>
+        </w:rPr>
+        <w:t xml:space="preserve">VERIFICATION</w:t>
+      </w:r>
+    </w:p>
+    <w:p>
+      <w:pPr>
+        <w:spacing w:after="80"/>
+      </w:pPr>
+      <w:r>
+        <w:rPr>
+          <w:sz w:val="21"/>
+          <w:szCs w:val="21"/>
+        </w:rPr>
+        <w:t xml:space="preserve">-</w:t>
+      </w:r>
+    </w:p>
+    <w:p>
+      <w:pPr>
+        <w:pBdr>
+          <w:bottom w:val="single" w:color="D9DBE5" w:sz="4" w:space="4"/>
+        </w:pBdr>
+        <w:spacing w:after="200"/>
+      </w:pPr>
+      <w:r>
+        <w:t xml:space="preserve"/>
       </w:r>
     </w:p>
     <w:p>
@@ -8904,7 +9263,7 @@
         <w:keepNext/>
       </w:pPr>
       <w:r>
-        <w:t xml:space="preserve">P2  Render pages from data</w:t>
+        <w:t xml:space="preserve">#21  Handover prompts PDF</w:t>
       </w:r>
     </w:p>
     <w:p>
@@ -8918,7 +9277,7 @@
           <w:sz w:val="18"/>
           <w:szCs w:val="18"/>
         </w:rPr>
-        <w:t xml:space="preserve">Review 2  |  Planned prompt</w:t>
+        <w:t xml:space="preserve">Working prompt  |  2026-10-15</w:t>
       </w:r>
     </w:p>
     <w:p>
@@ -8952,7 +9311,7 @@
           <w:sz w:val="19"/>
           <w:szCs w:val="19"/>
         </w:rPr>
-        <w:t xml:space="preserve">Replace the hard-coded sample rows in the dashboard, expenses, income, budgets, recurring, categories, groups, group detail, settlements, shopping and profile pages with markup rendered by JavaScript from api.js, using &lt;template&gt; elements and textContent (never innerHTML with user data). Keep the static markup as the no-JavaScript fallback. Implement the expenses filter bar (search, category, method, date range, sort) with debounced live filtering and query-string sync, pagination, and empty states.</w:t>
+        <w:t xml:space="preserve">Write docs/tools/build_handover_pdf.py (reusing the styles of build_prompt_pdf.py) to produce docs/SplitStack_Handover_Prompts.pdf: how to use it with Antigravity, one-time setup (tools, collaborator access, MongoDB Atlas, workflow token scope), a roadmap, Prompt 0 with the full project context, rules, logging, commit/push and gh-pages redeploy procedure, the 15 planned prompts P1-P15 expanded with concrete checks and commit messages, utility prompts (status, recovery, review rehearsal) and common problems. Render pages to check the layout.</w:t>
       </w:r>
     </w:p>
     <w:p>
@@ -8980,7 +9339,7 @@
           <w:sz w:val="21"/>
           <w:szCs w:val="21"/>
         </w:rPr>
-        <w:t xml:space="preserve">Turn the static pages into working screens.</w:t>
+        <w:t xml:space="preserve">Give the teammate a self-contained, ordered set of prompts.</w:t>
       </w:r>
     </w:p>
     <w:p>
@@ -8997,6 +9356,56 @@
           <w:szCs w:val="17"/>
         </w:rPr>
         <w:t xml:space="preserve">FILES</w:t>
+      </w:r>
+    </w:p>
+    <w:p>
+      <w:pPr>
+        <w:pStyle w:val="ListParagraph"/>
+        <w:numPr>
+          <w:ilvl w:val="0"/>
+          <w:numId w:val="2"/>
+        </w:numPr>
+      </w:pPr>
+      <w:r>
+        <w:rPr>
+          <w:rFonts w:ascii="Consolas" w:cs="Consolas" w:eastAsia="Consolas" w:hAnsi="Consolas"/>
+          <w:sz w:val="19"/>
+          <w:szCs w:val="19"/>
+        </w:rPr>
+        <w:t xml:space="preserve">docs/tools/build_handover_pdf.py</w:t>
+      </w:r>
+    </w:p>
+    <w:p>
+      <w:pPr>
+        <w:pStyle w:val="ListParagraph"/>
+        <w:numPr>
+          <w:ilvl w:val="0"/>
+          <w:numId w:val="2"/>
+        </w:numPr>
+      </w:pPr>
+      <w:r>
+        <w:rPr>
+          <w:rFonts w:ascii="Consolas" w:cs="Consolas" w:eastAsia="Consolas" w:hAnsi="Consolas"/>
+          <w:sz w:val="19"/>
+          <w:szCs w:val="19"/>
+        </w:rPr>
+        <w:t xml:space="preserve">docs/SplitStack_Handover_Prompts.pdf</w:t>
+      </w:r>
+    </w:p>
+    <w:p>
+      <w:pPr>
+        <w:spacing w:after="60" w:before="160"/>
+      </w:pPr>
+      <w:r>
+        <w:rPr>
+          <w:b/>
+          <w:bCs/>
+          <w:color w:val="4F46E5"/>
+          <w:spacing w:val="20"/>
+          <w:sz w:val="17"/>
+          <w:szCs w:val="17"/>
+        </w:rPr>
+        <w:t xml:space="preserve">RESULT</w:t>
       </w:r>
     </w:p>
     <w:p>
@@ -9008,7 +9417,71 @@
           <w:sz w:val="21"/>
           <w:szCs w:val="21"/>
         </w:rPr>
-        <w:t xml:space="preserve">client/js/pages/*.js, client/pages/*.html</w:t>
+        <w:t xml:space="preserve">14-page PDF created. Changes against the planned prompts: P1 adds data-page attributes and client/js/package.json (type module) for node --test; P13 keeps the localStorage implementation as a demo mode (api-local.js chosen when /api/health does not answer) so the GitHub Pages site keeps working, instead of deleting it; P9 replaces deprecated csurf with a synchronizer token; P14 uses MongoMemoryReplSet because the API uses transactions; P15 asks for confirmation before deleting the Flask files and leaves Render account steps to the student.</w:t>
+      </w:r>
+    </w:p>
+    <w:p>
+      <w:pPr>
+        <w:spacing w:after="60" w:before="160"/>
+      </w:pPr>
+      <w:r>
+        <w:rPr>
+          <w:b/>
+          <w:bCs/>
+          <w:color w:val="4F46E5"/>
+          <w:spacing w:val="20"/>
+          <w:sz w:val="17"/>
+          <w:szCs w:val="17"/>
+        </w:rPr>
+        <w:t xml:space="preserve">VERIFICATION</w:t>
+      </w:r>
+    </w:p>
+    <w:p>
+      <w:pPr>
+        <w:spacing w:after="80"/>
+      </w:pPr>
+      <w:r>
+        <w:rPr>
+          <w:sz w:val="21"/>
+          <w:szCs w:val="21"/>
+        </w:rPr>
+        <w:t xml:space="preserve">Rendered pages with PyMuPDF and checked the layout of the setup, Prompt 0, step and utility pages.</w:t>
+      </w:r>
+    </w:p>
+    <w:p>
+      <w:pPr>
+        <w:pBdr>
+          <w:bottom w:val="single" w:color="D9DBE5" w:sz="4" w:space="4"/>
+        </w:pBdr>
+        <w:spacing w:after="200"/>
+      </w:pPr>
+      <w:r>
+        <w:t xml:space="preserve"/>
+      </w:r>
+    </w:p>
+    <w:p>
+      <w:r>
+        <w:br w:type="page"/>
+      </w:r>
+    </w:p>
+    <w:p>
+      <w:pPr>
+        <w:pStyle w:val="Heading1"/>
+      </w:pPr>
+      <w:r>
+        <w:t xml:space="preserve">Planned prompts to complete the project</w:t>
+      </w:r>
+    </w:p>
+    <w:p>
+      <w:pPr>
+        <w:spacing w:after="80"/>
+      </w:pPr>
+      <w:r>
+        <w:rPr>
+          <w:sz w:val="21"/>
+          <w:szCs w:val="21"/>
+        </w:rPr>
+        <w:t xml:space="preserve">These prompts have not been run yet. Run them in order; after each one, move it into the log above with its result.</w:t>
       </w:r>
     </w:p>
     <w:p>
@@ -9017,7 +9490,7 @@
         <w:keepNext/>
       </w:pPr>
       <w:r>
-        <w:t xml:space="preserve">P3  Forms, validation and CRUD flows</w:t>
+        <w:t xml:space="preserve">P1  Render pages from data</w:t>
       </w:r>
     </w:p>
     <w:p>
@@ -9065,7 +9538,7 @@
           <w:sz w:val="19"/>
           <w:szCs w:val="19"/>
         </w:rPr>
-        <w:t xml:space="preserve">Wire every form (register, login, expense add/edit, income, budget, recurring, category, group create, add member, shared expense, shopping list and item, profile, change password) to api.js. Use the Constraint Validation API plus custom rules (passwords match, date not in the future, budget greater than zero) with inline error messages linked by aria-describedby, and move focus to the first invalid field. Show a toast after each save and redirect afterwards (Post/Redirect/Get). Add password show/hide toggles with aria-pressed. Protect app pages: redirect to login.html when nobody is signed in.</w:t>
+        <w:t xml:space="preserve">Replace the hard-coded sample rows in the dashboard, expenses, income, budgets, recurring, categories, groups, group detail, settlements, shopping and profile pages with markup rendered by JavaScript from api.js, using &lt;template&gt; elements and textContent (never innerHTML with user data). Keep the static markup as the no-JavaScript fallback. Implement the expenses filter bar (search, category, method, date range, sort) with debounced live filtering and query-string sync, pagination, and empty states.</w:t>
       </w:r>
     </w:p>
     <w:p>
@@ -9093,7 +9566,7 @@
           <w:sz w:val="21"/>
           <w:szCs w:val="21"/>
         </w:rPr>
-        <w:t xml:space="preserve">Cover the core JavaScript skills examiners look for: events, DOM manipulation, validation.</w:t>
+        <w:t xml:space="preserve">Turn the static pages into working screens.</w:t>
       </w:r>
     </w:p>
     <w:p>
@@ -9121,7 +9594,7 @@
           <w:sz w:val="21"/>
           <w:szCs w:val="21"/>
         </w:rPr>
-        <w:t xml:space="preserve">client/js/pages/*.js, client/js/ui/forms.js</w:t>
+        <w:t xml:space="preserve">client/js/pages/*.js, client/pages/*.html</w:t>
       </w:r>
     </w:p>
     <w:p>
@@ -9130,7 +9603,7 @@
         <w:keepNext/>
       </w:pPr>
       <w:r>
-        <w:t xml:space="preserve">P4  Group splitting and the debt-simplification algorithm</w:t>
+        <w:t xml:space="preserve">P2  Forms, validation and CRUD flows</w:t>
       </w:r>
     </w:p>
     <w:p>
@@ -9178,7 +9651,7 @@
           <w:sz w:val="19"/>
           <w:szCs w:val="19"/>
         </w:rPr>
-        <w:t xml:space="preserve">In client/js/domain/splits.js implement equal splits in integer paise with the leftover paise assigned to the payer, and custom splits that must sum exactly to the total. On the shared-expense form show a live "remaining to assign" counter and disable submit until it reaches zero. In client/js/domain/settle.js implement net balances (paid minus share) and the greedy minimum-cash-flow algorithm: repeatedly match the largest debtor with the largest creditor and transfer min(debt, credit) until every balance is within one paisa; return the transfer list and the number of original pairwise debts. Render the settle-up page from it, and make "Mark paid" record a settlement and recompute balances. Add unit tests runnable with node --test using the Goa Trip example (balances +1700, -2500, +5700, -4900 give 3 transfers).</w:t>
+        <w:t xml:space="preserve">Wire every form (register, login, expense add/edit, income, budget, recurring, category, group create, add member, shared expense, shopping list and item, profile, change password) to api.js. Use the Constraint Validation API plus custom rules (passwords match, date not in the future, budget greater than zero) with inline error messages linked by aria-describedby, and move focus to the first invalid field. Show a toast after each save and redirect afterwards (Post/Redirect/Get). Add password show/hide toggles with aria-pressed. Protect app pages: redirect to login.html when nobody is signed in.</w:t>
       </w:r>
     </w:p>
     <w:p>
@@ -9206,7 +9679,7 @@
           <w:sz w:val="21"/>
           <w:szCs w:val="21"/>
         </w:rPr>
-        <w:t xml:space="preserve">Show algorithmic JavaScript, the core idea of SplitStack.</w:t>
+        <w:t xml:space="preserve">Cover the core JavaScript skills examiners look for: events, DOM manipulation, validation.</w:t>
       </w:r>
     </w:p>
     <w:p>
@@ -9234,7 +9707,7 @@
           <w:sz w:val="21"/>
           <w:szCs w:val="21"/>
         </w:rPr>
-        <w:t xml:space="preserve">client/js/domain/splits.js, client/js/domain/settle.js, tests/client/*.test.js</w:t>
+        <w:t xml:space="preserve">client/js/pages/*.js, client/js/ui/forms.js</w:t>
       </w:r>
     </w:p>
     <w:p>
@@ -9243,7 +9716,7 @@
         <w:keepNext/>
       </w:pPr>
       <w:r>
-        <w:t xml:space="preserve">P5  Charts, budgets, forecast, insights, search and notifications</w:t>
+        <w:t xml:space="preserve">P3  Group splitting and the debt-simplification algorithm</w:t>
       </w:r>
     </w:p>
     <w:p>
@@ -9291,7 +9764,7 @@
           <w:sz w:val="19"/>
           <w:szCs w:val="19"/>
         </w:rPr>
-        <w:t xml:space="preserve">Render the dashboard and analytics charts with Chart.js 4 loaded from a pinned CDN URL, reading colours from the CSS custom properties so both themes work, and keep the CSS charts as a fallback. Compute budget status (ok under 75%, caution 75-90%, warning 90-100%, danger over 100%) and update the meters. Port the spending forecast (average daily spend multiplied by the days in the month) to client/js/domain/forecast.js. Generate smart insights from the data (over-budget categories, month-over-month change, upcoming recurring bills). Make the topbar search show live results across expenses, groups and lists in a listbox with keyboard navigation, and make the bell open a notifications panel built from the insights with an unread count.</w:t>
+        <w:t xml:space="preserve">In client/js/domain/splits.js implement equal splits in integer paise with the leftover paise assigned to the payer, and custom splits that must sum exactly to the total. On the shared-expense form show a live "remaining to assign" counter and disable submit until it reaches zero. In client/js/domain/settle.js implement net balances (paid minus share) and the greedy minimum-cash-flow algorithm: repeatedly match the largest debtor with the largest creditor and transfer min(debt, credit) until every balance is within one paisa; return the transfer list and the number of original pairwise debts. Render the settle-up page from it, and make "Mark paid" record a settlement and recompute balances. Add unit tests runnable with node --test using the Goa Trip example (balances +1700, -2500, +5700, -4900 give 3 transfers).</w:t>
       </w:r>
     </w:p>
     <w:p>
@@ -9319,7 +9792,7 @@
           <w:sz w:val="21"/>
           <w:szCs w:val="21"/>
         </w:rPr>
-        <w:t xml:space="preserve">Finish the interactive features that were disconnected in the original app.</w:t>
+        <w:t xml:space="preserve">Show algorithmic JavaScript, the core idea of SplitStack.</w:t>
       </w:r>
     </w:p>
     <w:p>
@@ -9347,7 +9820,7 @@
           <w:sz w:val="21"/>
           <w:szCs w:val="21"/>
         </w:rPr>
-        <w:t xml:space="preserve">client/js/pages/dashboard.js, client/js/pages/analytics.js, client/js/domain/forecast.js, client/js/ui/search.js, client/js/ui/notifications.js</w:t>
+        <w:t xml:space="preserve">client/js/domain/splits.js, client/js/domain/settle.js, tests/client/*.test.js</w:t>
       </w:r>
     </w:p>
     <w:p>
@@ -9356,7 +9829,7 @@
         <w:keepNext/>
       </w:pPr>
       <w:r>
-        <w:t xml:space="preserve">P6  Shopping checklist and receipt scan preview</w:t>
+        <w:t xml:space="preserve">P4  Charts, budgets, forecast, insights, search and notifications</w:t>
       </w:r>
     </w:p>
     <w:p>
@@ -9404,7 +9877,7 @@
           <w:sz w:val="19"/>
           <w:szCs w:val="19"/>
         </w:rPr>
-        <w:t xml:space="preserve">Make the shopping checklist toggle items with optimistic UI, edit actual prices inline, recompute the estimated, actual and variance totals live, and convert the list to an expense only once (prevent duplicates). On the receipt scan page add drag-and-drop with dragenter/dragleave styling, client-side checks (PNG, JPEG or WEBP, up to 5 MB) and an image preview via URL.createObjectURL. Until the backend exists, run OCR in the browser with tesseract.js from a pinned CDN, parse the merchant, date and total with regular expressions (prefer the line containing TOTAL), show progress, and pre-fill the confirm form.</w:t>
+        <w:t xml:space="preserve">Render the dashboard and analytics charts with Chart.js 4 loaded from a pinned CDN URL, reading colours from the CSS custom properties so both themes work, and keep the CSS charts as a fallback. Compute budget status (ok under 75%, caution 75-90%, warning 90-100%, danger over 100%) and update the meters. Port the spending forecast (average daily spend multiplied by the days in the month) to client/js/domain/forecast.js. Generate smart insights from the data (over-budget categories, month-over-month change, upcoming recurring bills). Make the topbar search show live results across expenses, groups and lists in a listbox with keyboard navigation, and make the bell open a notifications panel built from the insights with an unread count.</w:t>
       </w:r>
     </w:p>
     <w:p>
@@ -9432,7 +9905,7 @@
           <w:sz w:val="21"/>
           <w:szCs w:val="21"/>
         </w:rPr>
-        <w:t xml:space="preserve">Complete the remaining interactive flows.</w:t>
+        <w:t xml:space="preserve">Finish the interactive features that were disconnected in the original app.</w:t>
       </w:r>
     </w:p>
     <w:p>
@@ -9460,7 +9933,7 @@
           <w:sz w:val="21"/>
           <w:szCs w:val="21"/>
         </w:rPr>
-        <w:t xml:space="preserve">client/js/pages/shopping-detail.js, client/js/pages/receipt-scan.js, client/js/domain/receipt-parser.js</w:t>
+        <w:t xml:space="preserve">client/js/pages/dashboard.js, client/js/pages/analytics.js, client/js/domain/forecast.js, client/js/ui/search.js, client/js/ui/notifications.js</w:t>
       </w:r>
     </w:p>
     <w:p>
@@ -9469,7 +9942,7 @@
         <w:keepNext/>
       </w:pPr>
       <w:r>
-        <w:t xml:space="preserve">P7  Review 2 QA, log and commit</w:t>
+        <w:t xml:space="preserve">P5  Shopping checklist and receipt scan preview</w:t>
       </w:r>
     </w:p>
     <w:p>
@@ -9517,7 +9990,7 @@
           <w:sz w:val="19"/>
           <w:szCs w:val="19"/>
         </w:rPr>
-        <w:t xml:space="preserve">Run ESLint (recommended rules, browser globals, ES2023 modules) over client/js and fix every finding; run the domain unit tests; test every page manually at 1366px and 375px in dark and light themes, using only the keyboard, and with JavaScript disabled (pages must still show their static content). Update client/README.md with the JavaScript architecture and a table of the JS concepts used and where. Add each step to docs/prompt_log.json, rebuild the Word and PDF logs, and commit "Review 2".</w:t>
+        <w:t xml:space="preserve">Make the shopping checklist toggle items with optimistic UI, edit actual prices inline, recompute the estimated, actual and variance totals live, and convert the list to an expense only once (prevent duplicates). On the receipt scan page add drag-and-drop with dragenter/dragleave styling, client-side checks (PNG, JPEG or WEBP, up to 5 MB) and an image preview via URL.createObjectURL. Until the backend exists, run OCR in the browser with tesseract.js from a pinned CDN, parse the merchant, date and total with regular expressions (prefer the line containing TOTAL), show progress, and pre-fill the confirm form.</w:t>
       </w:r>
     </w:p>
     <w:p>
@@ -9545,7 +10018,7 @@
           <w:sz w:val="21"/>
           <w:szCs w:val="21"/>
         </w:rPr>
-        <w:t xml:space="preserve">Close Review 2 with evidence.</w:t>
+        <w:t xml:space="preserve">Complete the remaining interactive flows.</w:t>
       </w:r>
     </w:p>
     <w:p>
@@ -9573,7 +10046,7 @@
           <w:sz w:val="21"/>
           <w:szCs w:val="21"/>
         </w:rPr>
-        <w:t xml:space="preserve">eslint.config.js, client/README.md, docs/*</w:t>
+        <w:t xml:space="preserve">client/js/pages/shopping-detail.js, client/js/pages/receipt-scan.js, client/js/domain/receipt-parser.js</w:t>
       </w:r>
     </w:p>
     <w:p>
@@ -9582,7 +10055,7 @@
         <w:keepNext/>
       </w:pPr>
       <w:r>
-        <w:t xml:space="preserve">P8  Express server and MongoDB connection</w:t>
+        <w:t xml:space="preserve">P6  Review 2 QA, log and commit</w:t>
       </w:r>
     </w:p>
     <w:p>
@@ -9596,7 +10069,7 @@
           <w:sz w:val="18"/>
           <w:szCs w:val="18"/>
         </w:rPr>
-        <w:t xml:space="preserve">Review 3  |  Planned prompt</w:t>
+        <w:t xml:space="preserve">Review 2  |  Planned prompt</w:t>
       </w:r>
     </w:p>
     <w:p>
@@ -9630,7 +10103,7 @@
           <w:sz w:val="19"/>
           <w:szCs w:val="19"/>
         </w:rPr>
-        <w:t xml:space="preserve">Create server/ as a Node.js 20+ project (ES modules) with Express: server/src/app.js (helmet with a Content Security Policy that allows only the CDNs in use, compression, express.json, express-session stored with connect-mongo, express-rate-limit on auth and upload routes, a CSRF token check on state-changing requests, and a central error handler returning JSON {error, fields}), server/src/index.js (connect to MongoDB Atlas with Mongoose using MONGODB_URI from server/.env, then listen), and static serving of client/. Add server/.env.example (MONGODB_URI, SESSION_SECRET of at least 32 characters, PORT) and npm scripts dev (node --watch) and start. Never commit .env.</w:t>
+        <w:t xml:space="preserve">Run ESLint (recommended rules, browser globals, ES2023 modules) over client/js and fix every finding; run the domain unit tests; test every page manually at 1366px and 375px in dark and light themes, using only the keyboard, and with JavaScript disabled (pages must still show their static content). Update client/README.md with the JavaScript architecture and a table of the JS concepts used and where. Add each step to docs/prompt_log.json, rebuild the Word and PDF logs, and commit "Review 2".</w:t>
       </w:r>
     </w:p>
     <w:p>
@@ -9658,7 +10131,7 @@
           <w:sz w:val="21"/>
           <w:szCs w:val="21"/>
         </w:rPr>
-        <w:t xml:space="preserve">Start Review 3 with a secure, conventional Express setup.</w:t>
+        <w:t xml:space="preserve">Close Review 2 with evidence.</w:t>
       </w:r>
     </w:p>
     <w:p>
@@ -9686,7 +10159,7 @@
           <w:sz w:val="21"/>
           <w:szCs w:val="21"/>
         </w:rPr>
-        <w:t xml:space="preserve">server/package.json, server/src/app.js, server/src/index.js, server/.env.example</w:t>
+        <w:t xml:space="preserve">eslint.config.js, client/README.md, docs/*</w:t>
       </w:r>
     </w:p>
     <w:p>
@@ -9695,7 +10168,7 @@
         <w:keepNext/>
       </w:pPr>
       <w:r>
-        <w:t xml:space="preserve">P9  Mongoose data models</w:t>
+        <w:t xml:space="preserve">P7  Express server and MongoDB connection</w:t>
       </w:r>
     </w:p>
     <w:p>
@@ -9743,7 +10216,7 @@
           <w:sz w:val="19"/>
           <w:szCs w:val="19"/>
         </w:rPr>
-        <w:t xml:space="preserve">Design Mongoose schemas with validation and indexes to replace the 15 SQLite tables: User (name, email unique and lowercase, passwordHash, preferences), Category (user, or null for defaults; name; type expense or income; icon; color), Expense and Income (user, category, amount stored as integer paise, date, description or source, paymentMethod), Budget (user, category or null, month, year, limit; unique on user+category+month+year), Recurring (name, amount, frequency, startDate, nextDueDate, active), Group (name, description, createdBy, members [{user, role admin|member, joinedAt}]), SharedExpense (group, title, amount, paidBy, category, date, splitType, shares [{user, amount}] with a validator that the shares sum to the amount), Settlement (group, payer, payee, amount, status, completedAt), ShoppingList (owner, optional group, name, budget, items [{name, quantity, estimatedPrice, actualPrice, purchased, assignedTo}], convertedExpense), Receipt (user, file reference, merchant, date, amount, rawText, confidence) and Insight (user, kind, message, read). Explain in comments which data is embedded and which is referenced, and why.</w:t>
+        <w:t xml:space="preserve">Create server/ as a Node.js 20+ project (ES modules) with Express: server/src/app.js (helmet with a Content Security Policy that allows only the CDNs in use, compression, express.json, express-session stored with connect-mongo, express-rate-limit on auth and upload routes, a CSRF token check on state-changing requests, and a central error handler returning JSON {error, fields}), server/src/index.js (connect to MongoDB Atlas with Mongoose using MONGODB_URI from server/.env, then listen), and static serving of client/. Add server/.env.example (MONGODB_URI, SESSION_SECRET of at least 32 characters, PORT) and npm scripts dev (node --watch) and start. Never commit .env.</w:t>
       </w:r>
     </w:p>
     <w:p>
@@ -9771,7 +10244,7 @@
           <w:sz w:val="21"/>
           <w:szCs w:val="21"/>
         </w:rPr>
-        <w:t xml:space="preserve">Show MongoDB data modelling, the core of Review 3.</w:t>
+        <w:t xml:space="preserve">Start Review 3 with a secure, conventional Express setup.</w:t>
       </w:r>
     </w:p>
     <w:p>
@@ -9799,7 +10272,7 @@
           <w:sz w:val="21"/>
           <w:szCs w:val="21"/>
         </w:rPr>
-        <w:t xml:space="preserve">server/src/models/*.js</w:t>
+        <w:t xml:space="preserve">server/package.json, server/src/app.js, server/src/index.js, server/.env.example</w:t>
       </w:r>
     </w:p>
     <w:p>
@@ -9808,7 +10281,7 @@
         <w:keepNext/>
       </w:pPr>
       <w:r>
-        <w:t xml:space="preserve">P10  Authentication and REST API</w:t>
+        <w:t xml:space="preserve">P8  Mongoose data models</w:t>
       </w:r>
     </w:p>
     <w:p>
@@ -9856,7 +10329,7 @@
           <w:sz w:val="19"/>
           <w:szCs w:val="19"/>
         </w:rPr>
-        <w:t xml:space="preserve">Implement the REST API under /api with one express.Router per module, mirroring the 48 legacy Flask routes: /api/auth (register with bcrypt cost 12, login, logout, me), /api/expenses, /api/income, /api/categories, /api/budgets, /api/recurring (including toggle), /api/groups (members, shared expenses, balances, settlements, leave), /api/shopping (lists, items, toggle, convert to expense), /api/analytics (monthly, categories, forecast, insights) and /api/search. Validate every input with a schema (zod or express-validator), check ownership or group membership on every request, use MongoDB transactions for multi-document writes (recording a settlement, converting a list), and reuse the Review 2 settle.js and splits.js modules on the server so the algorithm has a single implementation.</w:t>
+        <w:t xml:space="preserve">Design Mongoose schemas with validation and indexes to replace the 15 SQLite tables: User (name, email unique and lowercase, passwordHash, preferences), Category (user, or null for defaults; name; type expense or income; icon; color), Expense and Income (user, category, amount stored as integer paise, date, description or source, paymentMethod), Budget (user, category or null, month, year, limit; unique on user+category+month+year), Recurring (name, amount, frequency, startDate, nextDueDate, active), Group (name, description, createdBy, members [{user, role admin|member, joinedAt}]), SharedExpense (group, title, amount, paidBy, category, date, splitType, shares [{user, amount}] with a validator that the shares sum to the amount), Settlement (group, payer, payee, amount, status, completedAt), ShoppingList (owner, optional group, name, budget, items [{name, quantity, estimatedPrice, actualPrice, purchased, assignedTo}], convertedExpense), Receipt (user, file reference, merchant, date, amount, rawText, confidence) and Insight (user, kind, message, read). Explain in comments which data is embedded and which is referenced, and why.</w:t>
       </w:r>
     </w:p>
     <w:p>
@@ -9884,7 +10357,7 @@
           <w:sz w:val="21"/>
           <w:szCs w:val="21"/>
         </w:rPr>
-        <w:t xml:space="preserve">Deliver the Node.js back end with a complete, secure API.</w:t>
+        <w:t xml:space="preserve">Show MongoDB data modelling, the core of Review 3.</w:t>
       </w:r>
     </w:p>
     <w:p>
@@ -9912,7 +10385,7 @@
           <w:sz w:val="21"/>
           <w:szCs w:val="21"/>
         </w:rPr>
-        <w:t xml:space="preserve">server/src/routes/*.js, server/src/services/*.js, server/src/middleware/*.js</w:t>
+        <w:t xml:space="preserve">server/src/models/*.js</w:t>
       </w:r>
     </w:p>
     <w:p>
@@ -9921,7 +10394,7 @@
         <w:keepNext/>
       </w:pPr>
       <w:r>
-        <w:t xml:space="preserve">P11  Receipt upload and server-side OCR</w:t>
+        <w:t xml:space="preserve">P9  Authentication and REST API</w:t>
       </w:r>
     </w:p>
     <w:p>
@@ -9969,7 +10442,7 @@
           <w:sz w:val="19"/>
           <w:szCs w:val="19"/>
         </w:rPr>
-        <w:t xml:space="preserve">Add POST /api/receipts using multer with memory storage, a 5 MB limit and magic-byte checks for PNG, JPEG and WEBP; preprocess with sharp (rotate from EXIF, greyscale, upscale small images, normalise); run tesseract.js with one shared worker; parse the merchant, date and total with the Review 2 parser; store the image in MongoDB GridFS (so it survives redeploys on free hosting) and the parsed fields in Receipt. GET /api/receipts/:id/image streams the image only to its owner. Confirming creates the expense; nothing becomes an expense without confirmation.</w:t>
+        <w:t xml:space="preserve">Implement the REST API under /api with one express.Router per module, mirroring the 48 legacy Flask routes: /api/auth (register with bcrypt cost 12, login, logout, me), /api/expenses, /api/income, /api/categories, /api/budgets, /api/recurring (including toggle), /api/groups (members, shared expenses, balances, settlements, leave), /api/shopping (lists, items, toggle, convert to expense), /api/analytics (monthly, categories, forecast, insights) and /api/search. Validate every input with a schema (zod or express-validator), check ownership or group membership on every request, use MongoDB transactions for multi-document writes (recording a settlement, converting a list), and reuse the Review 2 settle.js and splits.js modules on the server so the algorithm has a single implementation.</w:t>
       </w:r>
     </w:p>
     <w:p>
@@ -9997,7 +10470,7 @@
           <w:sz w:val="21"/>
           <w:szCs w:val="21"/>
         </w:rPr>
-        <w:t xml:space="preserve">Port the OCR feature to Node with persistent storage.</w:t>
+        <w:t xml:space="preserve">Deliver the Node.js back end with a complete, secure API.</w:t>
       </w:r>
     </w:p>
     <w:p>
@@ -10025,7 +10498,7 @@
           <w:sz w:val="21"/>
           <w:szCs w:val="21"/>
         </w:rPr>
-        <w:t xml:space="preserve">server/src/routes/receipts.js, server/src/services/ocr.js</w:t>
+        <w:t xml:space="preserve">server/src/routes/*.js, server/src/services/*.js, server/src/middleware/*.js</w:t>
       </w:r>
     </w:p>
     <w:p>
@@ -10034,7 +10507,7 @@
         <w:keepNext/>
       </w:pPr>
       <w:r>
-        <w:t xml:space="preserve">P12  Connect the client to the API</w:t>
+        <w:t xml:space="preserve">P10  Receipt upload and server-side OCR</w:t>
       </w:r>
     </w:p>
     <w:p>
@@ -10082,7 +10555,7 @@
           <w:sz w:val="19"/>
           <w:szCs w:val="19"/>
         </w:rPr>
-        <w:t xml:space="preserve">Re-implement client/js/data/api.js with fetch() against /api, sending credentials and the CSRF token header, mapping HTTP errors to the same {field, message} errors the pages already handle, and showing a toast when offline. Remove the localStorage store except for the theme preference. Because the page code depends only on api.js, no page module should need changes; confirm this by running every flow end to end against a local server connected to Atlas.</w:t>
+        <w:t xml:space="preserve">Add POST /api/receipts using multer with memory storage, a 5 MB limit and magic-byte checks for PNG, JPEG and WEBP; preprocess with sharp (rotate from EXIF, greyscale, upscale small images, normalise); run tesseract.js with one shared worker; parse the merchant, date and total with the Review 2 parser; store the image in MongoDB GridFS (so it survives redeploys on free hosting) and the parsed fields in Receipt. GET /api/receipts/:id/image streams the image only to its owner. Confirming creates the expense; nothing becomes an expense without confirmation.</w:t>
       </w:r>
     </w:p>
     <w:p>
@@ -10110,7 +10583,7 @@
           <w:sz w:val="21"/>
           <w:szCs w:val="21"/>
         </w:rPr>
-        <w:t xml:space="preserve">Finish the full-stack integration.</w:t>
+        <w:t xml:space="preserve">Port the OCR feature to Node with persistent storage.</w:t>
       </w:r>
     </w:p>
     <w:p>
@@ -10138,7 +10611,7 @@
           <w:sz w:val="21"/>
           <w:szCs w:val="21"/>
         </w:rPr>
-        <w:t xml:space="preserve">client/js/data/api.js</w:t>
+        <w:t xml:space="preserve">server/src/routes/receipts.js, server/src/services/ocr.js</w:t>
       </w:r>
     </w:p>
     <w:p>
@@ -10147,7 +10620,7 @@
         <w:keepNext/>
       </w:pPr>
       <w:r>
-        <w:t xml:space="preserve">P13  Seed data and automated tests</w:t>
+        <w:t xml:space="preserve">P11  Connect the client to the API</w:t>
       </w:r>
     </w:p>
     <w:p>
@@ -10195,7 +10668,7 @@
           <w:sz w:val="19"/>
           <w:szCs w:val="19"/>
         </w:rPr>
-        <w:t xml:space="preserve">Add server/scripts/seed.js that creates the demo user, categories, six months of expenses and income, budgets, recurring payments, the three groups with shared expenses, and shopping lists. It must be idempotent and must refuse to run against a database whose name does not end in -dev or -test unless --force is passed. Write Jest + Supertest tests using mongodb-memory-server for auth, ownership checks, CSRF rejection, rate limiting, split validation, the settlement algorithm, budget status, convert-to-expense duplicate prevention and receipt upload validation, covering what the 47 legacy Python tests checked. Add an npm test script and a GitHub Actions workflow that runs lint and tests on every push.</w:t>
+        <w:t xml:space="preserve">Re-implement client/js/data/api.js with fetch() against /api, sending credentials and the CSRF token header, mapping HTTP errors to the same {field, message} errors the pages already handle, and showing a toast when offline. Remove the localStorage store except for the theme preference. Because the page code depends only on api.js, no page module should need changes; confirm this by running every flow end to end against a local server connected to Atlas.</w:t>
       </w:r>
     </w:p>
     <w:p>
@@ -10223,7 +10696,7 @@
           <w:sz w:val="21"/>
           <w:szCs w:val="21"/>
         </w:rPr>
-        <w:t xml:space="preserve">Prove the back end works and keep it working.</w:t>
+        <w:t xml:space="preserve">Finish the full-stack integration.</w:t>
       </w:r>
     </w:p>
     <w:p>
@@ -10251,7 +10724,7 @@
           <w:sz w:val="21"/>
           <w:szCs w:val="21"/>
         </w:rPr>
-        <w:t xml:space="preserve">server/scripts/seed.js, server/tests/*.test.js, .github/workflows/ci.yml</w:t>
+        <w:t xml:space="preserve">client/js/data/api.js</w:t>
       </w:r>
     </w:p>
     <w:p>
@@ -10260,7 +10733,120 @@
         <w:keepNext/>
       </w:pPr>
       <w:r>
-        <w:t xml:space="preserve">P14  Remove legacy code, document and deploy</w:t>
+        <w:t xml:space="preserve">P12  Seed data and automated tests</w:t>
+      </w:r>
+    </w:p>
+    <w:p>
+      <w:pPr>
+        <w:keepNext/>
+        <w:spacing w:after="60"/>
+      </w:pPr>
+      <w:r>
+        <w:rPr>
+          <w:color w:val="5B6475"/>
+          <w:sz w:val="18"/>
+          <w:szCs w:val="18"/>
+        </w:rPr>
+        <w:t xml:space="preserve">Review 3  |  Planned prompt</w:t>
+      </w:r>
+    </w:p>
+    <w:p>
+      <w:pPr>
+        <w:spacing w:after="60" w:before="160"/>
+      </w:pPr>
+      <w:r>
+        <w:rPr>
+          <w:b/>
+          <w:bCs/>
+          <w:color w:val="4F46E5"/>
+          <w:spacing w:val="20"/>
+          <w:sz w:val="17"/>
+          <w:szCs w:val="17"/>
+        </w:rPr>
+        <w:t xml:space="preserve">PROMPT</w:t>
+      </w:r>
+    </w:p>
+    <w:p>
+      <w:pPr>
+        <w:pBdr>
+          <w:left w:val="single" w:color="4F46E5" w:sz="18" w:space="8"/>
+        </w:pBdr>
+        <w:shd w:fill="F1F2F8" w:color="auto" w:val="clear"/>
+        <w:spacing w:after="120" w:before="40" w:line="276"/>
+        <w:ind w:left="160" w:right="160"/>
+      </w:pPr>
+      <w:r>
+        <w:rPr>
+          <w:rFonts w:ascii="Consolas" w:cs="Consolas" w:eastAsia="Consolas" w:hAnsi="Consolas"/>
+          <w:sz w:val="19"/>
+          <w:szCs w:val="19"/>
+        </w:rPr>
+        <w:t xml:space="preserve">Add server/scripts/seed.js that creates the demo user, categories, six months of expenses and income, budgets, recurring payments, the three groups with shared expenses, and shopping lists. It must be idempotent and must refuse to run against a database whose name does not end in -dev or -test unless --force is passed. Write Jest + Supertest tests using mongodb-memory-server for auth, ownership checks, CSRF rejection, rate limiting, split validation, the settlement algorithm, budget status, convert-to-expense duplicate prevention and receipt upload validation, covering what the 47 legacy Python tests checked. Add an npm test script and a GitHub Actions workflow that runs lint and tests on every push.</w:t>
+      </w:r>
+    </w:p>
+    <w:p>
+      <w:pPr>
+        <w:spacing w:after="60" w:before="160"/>
+      </w:pPr>
+      <w:r>
+        <w:rPr>
+          <w:b/>
+          <w:bCs/>
+          <w:color w:val="4F46E5"/>
+          <w:spacing w:val="20"/>
+          <w:sz w:val="17"/>
+          <w:szCs w:val="17"/>
+        </w:rPr>
+        <w:t xml:space="preserve">PURPOSE</w:t>
+      </w:r>
+    </w:p>
+    <w:p>
+      <w:pPr>
+        <w:spacing w:after="80"/>
+      </w:pPr>
+      <w:r>
+        <w:rPr>
+          <w:sz w:val="21"/>
+          <w:szCs w:val="21"/>
+        </w:rPr>
+        <w:t xml:space="preserve">Prove the back end works and keep it working.</w:t>
+      </w:r>
+    </w:p>
+    <w:p>
+      <w:pPr>
+        <w:spacing w:after="60" w:before="160"/>
+      </w:pPr>
+      <w:r>
+        <w:rPr>
+          <w:b/>
+          <w:bCs/>
+          <w:color w:val="4F46E5"/>
+          <w:spacing w:val="20"/>
+          <w:sz w:val="17"/>
+          <w:szCs w:val="17"/>
+        </w:rPr>
+        <w:t xml:space="preserve">FILES</w:t>
+      </w:r>
+    </w:p>
+    <w:p>
+      <w:pPr>
+        <w:spacing w:after="80"/>
+      </w:pPr>
+      <w:r>
+        <w:rPr>
+          <w:sz w:val="21"/>
+          <w:szCs w:val="21"/>
+        </w:rPr>
+        <w:t xml:space="preserve">server/scripts/seed.js, server/tests/*.test.js, .github/workflows/ci.yml</w:t>
+      </w:r>
+    </w:p>
+    <w:p>
+      <w:pPr>
+        <w:pStyle w:val="Heading3"/>
+        <w:keepNext/>
+      </w:pPr>
+      <w:r>
+        <w:t xml:space="preserve">P13  Remove legacy code, document and deploy</w:t>
       </w:r>
     </w:p>
     <w:p>

</xml_diff>

<commit_message>
Review 2: render pages from the data layer
</commit_message>
<xml_diff>
--- a/docs/SplitStack_Prompt_Log.docx
+++ b/docs/SplitStack_Prompt_Log.docx
@@ -132,7 +132,7 @@
           <w:sz w:val="21"/>
           <w:szCs w:val="21"/>
         </w:rPr>
-        <w:t xml:space="preserve">25</w:t>
+        <w:t xml:space="preserve">27</w:t>
       </w:r>
     </w:p>
     <w:p>
@@ -568,7 +568,7 @@
                 <w:sz w:val="18"/>
                 <w:szCs w:val="18"/>
               </w:rPr>
-              <w:t xml:space="preserve">4</w:t>
+              <w:t xml:space="preserve">6</w:t>
             </w:r>
           </w:p>
         </w:tc>
@@ -3857,6 +3857,245 @@
           </w:p>
         </w:tc>
       </w:tr>
+      <w:tr>
+        <w:tc>
+          <w:tcPr>
+            <w:tcW w:type="dxa" w:w="700"/>
+            <w:shd w:fill="F7F7FB" w:color="auto" w:val="clear"/>
+            <w:tcMar>
+              <w:top w:type="dxa" w:w="60"/>
+              <w:left w:type="dxa" w:w="100"/>
+              <w:bottom w:type="dxa" w:w="60"/>
+              <w:right w:type="dxa" w:w="100"/>
+            </w:tcMar>
+          </w:tcPr>
+          <w:p>
+            <w:r>
+              <w:rPr>
+                <w:b w:val="false"/>
+                <w:bCs w:val="false"/>
+                <w:color w:val="222222"/>
+                <w:sz w:val="18"/>
+                <w:szCs w:val="18"/>
+              </w:rPr>
+              <w:t xml:space="preserve">26</w:t>
+            </w:r>
+          </w:p>
+        </w:tc>
+        <w:tc>
+          <w:tcPr>
+            <w:tcW w:type="dxa" w:w="1500"/>
+            <w:shd w:fill="F7F7FB" w:color="auto" w:val="clear"/>
+            <w:tcMar>
+              <w:top w:type="dxa" w:w="60"/>
+              <w:left w:type="dxa" w:w="100"/>
+              <w:bottom w:type="dxa" w:w="60"/>
+              <w:right w:type="dxa" w:w="100"/>
+            </w:tcMar>
+          </w:tcPr>
+          <w:p>
+            <w:r>
+              <w:rPr>
+                <w:b w:val="false"/>
+                <w:bCs w:val="false"/>
+                <w:color w:val="222222"/>
+                <w:sz w:val="18"/>
+                <w:szCs w:val="18"/>
+              </w:rPr>
+              <w:t xml:space="preserve">Review 2</w:t>
+            </w:r>
+          </w:p>
+        </w:tc>
+        <w:tc>
+          <w:tcPr>
+            <w:tcW w:type="dxa" w:w="4538"/>
+            <w:shd w:fill="F7F7FB" w:color="auto" w:val="clear"/>
+            <w:tcMar>
+              <w:top w:type="dxa" w:w="60"/>
+              <w:left w:type="dxa" w:w="100"/>
+              <w:bottom w:type="dxa" w:w="60"/>
+              <w:right w:type="dxa" w:w="100"/>
+            </w:tcMar>
+          </w:tcPr>
+          <w:p>
+            <w:r>
+              <w:rPr>
+                <w:b w:val="false"/>
+                <w:bCs w:val="false"/>
+                <w:color w:val="222222"/>
+                <w:sz w:val="18"/>
+                <w:szCs w:val="18"/>
+              </w:rPr>
+              <w:t xml:space="preserve">Request: proceed with Review 2 Step P3</w:t>
+            </w:r>
+          </w:p>
+        </w:tc>
+        <w:tc>
+          <w:tcPr>
+            <w:tcW w:type="dxa" w:w="1500"/>
+            <w:shd w:fill="F7F7FB" w:color="auto" w:val="clear"/>
+            <w:tcMar>
+              <w:top w:type="dxa" w:w="60"/>
+              <w:left w:type="dxa" w:w="100"/>
+              <w:bottom w:type="dxa" w:w="60"/>
+              <w:right w:type="dxa" w:w="100"/>
+            </w:tcMar>
+          </w:tcPr>
+          <w:p>
+            <w:r>
+              <w:rPr>
+                <w:b w:val="false"/>
+                <w:bCs w:val="false"/>
+                <w:color w:val="222222"/>
+                <w:sz w:val="18"/>
+                <w:szCs w:val="18"/>
+              </w:rPr>
+              <w:t xml:space="preserve">User prompt</w:t>
+            </w:r>
+          </w:p>
+        </w:tc>
+        <w:tc>
+          <w:tcPr>
+            <w:tcW w:type="dxa" w:w="1400"/>
+            <w:shd w:fill="F7F7FB" w:color="auto" w:val="clear"/>
+            <w:tcMar>
+              <w:top w:type="dxa" w:w="60"/>
+              <w:left w:type="dxa" w:w="100"/>
+              <w:bottom w:type="dxa" w:w="60"/>
+              <w:right w:type="dxa" w:w="100"/>
+            </w:tcMar>
+          </w:tcPr>
+          <w:p>
+            <w:r>
+              <w:rPr>
+                <w:b w:val="false"/>
+                <w:bCs w:val="false"/>
+                <w:color w:val="222222"/>
+                <w:sz w:val="18"/>
+                <w:szCs w:val="18"/>
+              </w:rPr>
+              <w:t xml:space="preserve">2026-10-16</w:t>
+            </w:r>
+          </w:p>
+        </w:tc>
+      </w:tr>
+      <w:tr>
+        <w:tc>
+          <w:tcPr>
+            <w:tcW w:type="dxa" w:w="700"/>
+            <w:tcMar>
+              <w:top w:type="dxa" w:w="60"/>
+              <w:left w:type="dxa" w:w="100"/>
+              <w:bottom w:type="dxa" w:w="60"/>
+              <w:right w:type="dxa" w:w="100"/>
+            </w:tcMar>
+          </w:tcPr>
+          <w:p>
+            <w:r>
+              <w:rPr>
+                <w:b w:val="false"/>
+                <w:bCs w:val="false"/>
+                <w:color w:val="222222"/>
+                <w:sz w:val="18"/>
+                <w:szCs w:val="18"/>
+              </w:rPr>
+              <w:t xml:space="preserve">27</w:t>
+            </w:r>
+          </w:p>
+        </w:tc>
+        <w:tc>
+          <w:tcPr>
+            <w:tcW w:type="dxa" w:w="1500"/>
+            <w:tcMar>
+              <w:top w:type="dxa" w:w="60"/>
+              <w:left w:type="dxa" w:w="100"/>
+              <w:bottom w:type="dxa" w:w="60"/>
+              <w:right w:type="dxa" w:w="100"/>
+            </w:tcMar>
+          </w:tcPr>
+          <w:p>
+            <w:r>
+              <w:rPr>
+                <w:b w:val="false"/>
+                <w:bCs w:val="false"/>
+                <w:color w:val="222222"/>
+                <w:sz w:val="18"/>
+                <w:szCs w:val="18"/>
+              </w:rPr>
+              <w:t xml:space="preserve">Review 2</w:t>
+            </w:r>
+          </w:p>
+        </w:tc>
+        <w:tc>
+          <w:tcPr>
+            <w:tcW w:type="dxa" w:w="4538"/>
+            <w:tcMar>
+              <w:top w:type="dxa" w:w="60"/>
+              <w:left w:type="dxa" w:w="100"/>
+              <w:bottom w:type="dxa" w:w="60"/>
+              <w:right w:type="dxa" w:w="100"/>
+            </w:tcMar>
+          </w:tcPr>
+          <w:p>
+            <w:r>
+              <w:rPr>
+                <w:b w:val="false"/>
+                <w:bCs w:val="false"/>
+                <w:color w:val="222222"/>
+                <w:sz w:val="18"/>
+                <w:szCs w:val="18"/>
+              </w:rPr>
+              <w:t xml:space="preserve">Render pages from data</w:t>
+            </w:r>
+          </w:p>
+        </w:tc>
+        <w:tc>
+          <w:tcPr>
+            <w:tcW w:type="dxa" w:w="1500"/>
+            <w:tcMar>
+              <w:top w:type="dxa" w:w="60"/>
+              <w:left w:type="dxa" w:w="100"/>
+              <w:bottom w:type="dxa" w:w="60"/>
+              <w:right w:type="dxa" w:w="100"/>
+            </w:tcMar>
+          </w:tcPr>
+          <w:p>
+            <w:r>
+              <w:rPr>
+                <w:b w:val="false"/>
+                <w:bCs w:val="false"/>
+                <w:color w:val="222222"/>
+                <w:sz w:val="18"/>
+                <w:szCs w:val="18"/>
+              </w:rPr>
+              <w:t xml:space="preserve">Working prompt</w:t>
+            </w:r>
+          </w:p>
+        </w:tc>
+        <w:tc>
+          <w:tcPr>
+            <w:tcW w:type="dxa" w:w="1400"/>
+            <w:tcMar>
+              <w:top w:type="dxa" w:w="60"/>
+              <w:left w:type="dxa" w:w="100"/>
+              <w:bottom w:type="dxa" w:w="60"/>
+              <w:right w:type="dxa" w:w="100"/>
+            </w:tcMar>
+          </w:tcPr>
+          <w:p>
+            <w:r>
+              <w:rPr>
+                <w:b w:val="false"/>
+                <w:bCs w:val="false"/>
+                <w:color w:val="222222"/>
+                <w:sz w:val="18"/>
+                <w:szCs w:val="18"/>
+              </w:rPr>
+              <w:t xml:space="preserve">2026-10-16</w:t>
+            </w:r>
+          </w:p>
+        </w:tc>
+      </w:tr>
     </w:tbl>
     <w:p>
       <w:r>
@@ -7600,20 +7839,11 @@
     </w:p>
     <w:p>
       <w:pPr>
-        <w:pStyle w:val="Heading2"/>
-        <w:spacing w:before="360"/>
-      </w:pPr>
-      <w:r>
-        <w:t xml:space="preserve">Wrap-up - Documentation, cleanup and deployment</w:t>
-      </w:r>
-    </w:p>
-    <w:p>
-      <w:pPr>
         <w:pStyle w:val="Heading3"/>
         <w:keepNext/>
       </w:pPr>
       <w:r>
-        <w:t xml:space="preserve">#13  Request: GitHub repository, website link and PDF of prompts</w:t>
+        <w:t xml:space="preserve">#26  Request: proceed with Review 2 Step P3</w:t>
       </w:r>
     </w:p>
     <w:p>
@@ -7627,7 +7857,7 @@
           <w:sz w:val="18"/>
           <w:szCs w:val="18"/>
         </w:rPr>
-        <w:t xml:space="preserve">User prompt  |  2026-10-15</w:t>
+        <w:t xml:space="preserve">User prompt  |  2026-10-16</w:t>
       </w:r>
     </w:p>
     <w:p>
@@ -7661,7 +7891,19 @@
           <w:sz w:val="19"/>
           <w:szCs w:val="19"/>
         </w:rPr>
-        <w:t xml:space="preserve">create a new repositry for this project in my gihub , and after than give me the github link and then the website link and also a pdf containing the prompts to complete project.</w:t>
+        <w:t xml:space="preserve">Proceed to Step P3: Render pages from data, following the project handover PDF.
+Before coding, inspect the current refurbish branch and read the exact P3 requirements. Build on the committed P1 architecture and P2 data layer, including the fixes in commit 89c3081.
+Requirements:
+1. Implement only P3: connect the existing HTML pages to client/js/data/api.js and render their content from returned data.
+2. Page modules must import data operations only from api.js, never directly from store.js or seed.js.
+3. Preserve the existing design, responsive layouts, accessibility, and useful empty states.
+4. Handle loading, errors, and missing records gracefully. Do not show hardcoded success messages for operations that have not occurred.
+5. Keep static HTML fallbacks usable where practical. Avoid duplicating business logic across page modules.
+6. Follow the handover's page/module organization and update documentation only where needed for P3.
+7. Add focused tests for rendering and error states where practical. Run the relevant tests and npm run lint:html.
+8. Update the prompt log and regenerate its DOCX/PDF using the existing workflow.
+9. Review the diff and report which pages are connected, which remain static, test results, and known limitations.
+Preserve docs/audit/ and all legacy Flask files. Do not begin P4 forms/CRUD, Express/MongoDB, or deployment work. Do not push to origin or upstream. Commit P3 locally on refurbish only after the checks pass, using the commit message specified in the handover or P3: render pages from data if none is specified.</w:t>
       </w:r>
     </w:p>
     <w:p>
@@ -7689,7 +7931,7 @@
           <w:sz w:val="21"/>
           <w:szCs w:val="21"/>
         </w:rPr>
-        <w:t xml:space="preserve">Publish the project under the student's own GitHub account, host the site, and export the prompt log (including the remaining planned prompts) as a PDF.</w:t>
+        <w:t xml:space="preserve">Authorize execution of Step P3 to connect the existing HTML pages to client/js/data/api.js and dynamically render their content from data.</w:t>
       </w:r>
     </w:p>
     <w:p>
@@ -7750,7 +7992,7 @@
           <w:sz w:val="21"/>
           <w:szCs w:val="21"/>
         </w:rPr>
-        <w:t xml:space="preserve">Done: see the following entries.</w:t>
+        <w:t xml:space="preserve">Authorized Step P3 implementation.</w:t>
       </w:r>
     </w:p>
     <w:p>
@@ -7798,7 +8040,7 @@
         <w:keepNext/>
       </w:pPr>
       <w:r>
-        <w:t xml:space="preserve">#14  PDF export of the prompt log, including planned prompts</w:t>
+        <w:t xml:space="preserve">#27  Render pages from data</w:t>
       </w:r>
     </w:p>
     <w:p>
@@ -7812,7 +8054,7 @@
           <w:sz w:val="18"/>
           <w:szCs w:val="18"/>
         </w:rPr>
-        <w:t xml:space="preserve">Working prompt  |  2026-10-15</w:t>
+        <w:t xml:space="preserve">Working prompt  |  2026-10-16</w:t>
       </w:r>
     </w:p>
     <w:p>
@@ -7846,7 +8088,7 @@
           <w:sz w:val="19"/>
           <w:szCs w:val="19"/>
         </w:rPr>
-        <w:t xml:space="preserve">Export the prompt log to PDF with a Python reportlab script (docs/tools/build_prompt_pdf.py) that reads docs/prompt_log.json: a title page, a stage overview table, a summary of every entry, Part A with every executed prompt verbatim in a shaded box with purpose, files, result and verification, and Part B with the planned prompts that complete Review 2, Review 3 and the wrap-up, clearly marked as not yet run. Add the planned prompts to prompt_log.json and to the Word log as well, and make "npm run log" rebuild both documents.</w:t>
+        <w:t xml:space="preserve">Replace the hard-coded sample rows in the dashboard, expenses, income, budgets, recurring, categories, groups, group detail, settlements, shopping and profile pages with markup rendered by JavaScript from api.js, using &lt;template&gt; elements and textContent (never innerHTML with user data). Keep the static markup as the no-JavaScript fallback. Implement the expenses filter bar (search, category, method, date range, sort) with debounced live filtering and query-string sync, pagination, and empty states.</w:t>
       </w:r>
     </w:p>
     <w:p>
@@ -7874,7 +8116,7 @@
           <w:sz w:val="21"/>
           <w:szCs w:val="21"/>
         </w:rPr>
-        <w:t xml:space="preserve">Give the student a PDF containing the prompts needed to complete the whole project.</w:t>
+        <w:t xml:space="preserve">Turn the static Review 1 HTML pages into interactive screens rendered from the Review 2 client data layer, adhering to strict XSS safety and accessible empty/loading states.</w:t>
       </w:r>
     </w:p>
     <w:p>
@@ -7907,7 +8149,7 @@
           <w:sz w:val="19"/>
           <w:szCs w:val="19"/>
         </w:rPr>
-        <w:t xml:space="preserve">docs/tools/build_prompt_pdf.py</w:t>
+        <w:t xml:space="preserve">client/js/pages/dashboard.js</w:t>
       </w:r>
     </w:p>
     <w:p>
@@ -7924,7 +8166,7 @@
           <w:sz w:val="19"/>
           <w:szCs w:val="19"/>
         </w:rPr>
-        <w:t xml:space="preserve">docs/tools/build-prompt-log.js</w:t>
+        <w:t xml:space="preserve">client/js/pages/expenses.js</w:t>
       </w:r>
     </w:p>
     <w:p>
@@ -7941,7 +8183,7 @@
           <w:sz w:val="19"/>
           <w:szCs w:val="19"/>
         </w:rPr>
-        <w:t xml:space="preserve">docs/prompt_log.json</w:t>
+        <w:t xml:space="preserve">client/js/pages/income.js</w:t>
       </w:r>
     </w:p>
     <w:p>
@@ -7958,7 +8200,7 @@
           <w:sz w:val="19"/>
           <w:szCs w:val="19"/>
         </w:rPr>
-        <w:t xml:space="preserve">docs/SplitStack_Prompt_Log.pdf</w:t>
+        <w:t xml:space="preserve">client/js/pages/budgets.js</w:t>
       </w:r>
     </w:p>
     <w:p>
@@ -7975,7 +8217,7 @@
           <w:sz w:val="19"/>
           <w:szCs w:val="19"/>
         </w:rPr>
-        <w:t xml:space="preserve">docs/SplitStack_Prompt_Log.docx</w:t>
+        <w:t xml:space="preserve">client/js/pages/recurring.js</w:t>
       </w:r>
     </w:p>
     <w:p>
@@ -7992,7 +8234,245 @@
           <w:sz w:val="19"/>
           <w:szCs w:val="19"/>
         </w:rPr>
-        <w:t xml:space="preserve">package.json</w:t>
+        <w:t xml:space="preserve">client/js/pages/categories.js</w:t>
+      </w:r>
+    </w:p>
+    <w:p>
+      <w:pPr>
+        <w:pStyle w:val="ListParagraph"/>
+        <w:numPr>
+          <w:ilvl w:val="0"/>
+          <w:numId w:val="2"/>
+        </w:numPr>
+      </w:pPr>
+      <w:r>
+        <w:rPr>
+          <w:rFonts w:ascii="Consolas" w:cs="Consolas" w:eastAsia="Consolas" w:hAnsi="Consolas"/>
+          <w:sz w:val="19"/>
+          <w:szCs w:val="19"/>
+        </w:rPr>
+        <w:t xml:space="preserve">client/js/pages/groups.js</w:t>
+      </w:r>
+    </w:p>
+    <w:p>
+      <w:pPr>
+        <w:pStyle w:val="ListParagraph"/>
+        <w:numPr>
+          <w:ilvl w:val="0"/>
+          <w:numId w:val="2"/>
+        </w:numPr>
+      </w:pPr>
+      <w:r>
+        <w:rPr>
+          <w:rFonts w:ascii="Consolas" w:cs="Consolas" w:eastAsia="Consolas" w:hAnsi="Consolas"/>
+          <w:sz w:val="19"/>
+          <w:szCs w:val="19"/>
+        </w:rPr>
+        <w:t xml:space="preserve">client/js/pages/group-detail.js</w:t>
+      </w:r>
+    </w:p>
+    <w:p>
+      <w:pPr>
+        <w:pStyle w:val="ListParagraph"/>
+        <w:numPr>
+          <w:ilvl w:val="0"/>
+          <w:numId w:val="2"/>
+        </w:numPr>
+      </w:pPr>
+      <w:r>
+        <w:rPr>
+          <w:rFonts w:ascii="Consolas" w:cs="Consolas" w:eastAsia="Consolas" w:hAnsi="Consolas"/>
+          <w:sz w:val="19"/>
+          <w:szCs w:val="19"/>
+        </w:rPr>
+        <w:t xml:space="preserve">client/js/pages/settlements.js</w:t>
+      </w:r>
+    </w:p>
+    <w:p>
+      <w:pPr>
+        <w:pStyle w:val="ListParagraph"/>
+        <w:numPr>
+          <w:ilvl w:val="0"/>
+          <w:numId w:val="2"/>
+        </w:numPr>
+      </w:pPr>
+      <w:r>
+        <w:rPr>
+          <w:rFonts w:ascii="Consolas" w:cs="Consolas" w:eastAsia="Consolas" w:hAnsi="Consolas"/>
+          <w:sz w:val="19"/>
+          <w:szCs w:val="19"/>
+        </w:rPr>
+        <w:t xml:space="preserve">client/js/pages/shopping.js</w:t>
+      </w:r>
+    </w:p>
+    <w:p>
+      <w:pPr>
+        <w:pStyle w:val="ListParagraph"/>
+        <w:numPr>
+          <w:ilvl w:val="0"/>
+          <w:numId w:val="2"/>
+        </w:numPr>
+      </w:pPr>
+      <w:r>
+        <w:rPr>
+          <w:rFonts w:ascii="Consolas" w:cs="Consolas" w:eastAsia="Consolas" w:hAnsi="Consolas"/>
+          <w:sz w:val="19"/>
+          <w:szCs w:val="19"/>
+        </w:rPr>
+        <w:t xml:space="preserve">client/js/pages/shopping-detail.js</w:t>
+      </w:r>
+    </w:p>
+    <w:p>
+      <w:pPr>
+        <w:pStyle w:val="ListParagraph"/>
+        <w:numPr>
+          <w:ilvl w:val="0"/>
+          <w:numId w:val="2"/>
+        </w:numPr>
+      </w:pPr>
+      <w:r>
+        <w:rPr>
+          <w:rFonts w:ascii="Consolas" w:cs="Consolas" w:eastAsia="Consolas" w:hAnsi="Consolas"/>
+          <w:sz w:val="19"/>
+          <w:szCs w:val="19"/>
+        </w:rPr>
+        <w:t xml:space="preserve">client/js/pages/profile.js</w:t>
+      </w:r>
+    </w:p>
+    <w:p>
+      <w:pPr>
+        <w:pStyle w:val="ListParagraph"/>
+        <w:numPr>
+          <w:ilvl w:val="0"/>
+          <w:numId w:val="2"/>
+        </w:numPr>
+      </w:pPr>
+      <w:r>
+        <w:rPr>
+          <w:rFonts w:ascii="Consolas" w:cs="Consolas" w:eastAsia="Consolas" w:hAnsi="Consolas"/>
+          <w:sz w:val="19"/>
+          <w:szCs w:val="19"/>
+        </w:rPr>
+        <w:t xml:space="preserve">client/js/pages/analytics.js</w:t>
+      </w:r>
+    </w:p>
+    <w:p>
+      <w:pPr>
+        <w:pStyle w:val="ListParagraph"/>
+        <w:numPr>
+          <w:ilvl w:val="0"/>
+          <w:numId w:val="2"/>
+        </w:numPr>
+      </w:pPr>
+      <w:r>
+        <w:rPr>
+          <w:rFonts w:ascii="Consolas" w:cs="Consolas" w:eastAsia="Consolas" w:hAnsi="Consolas"/>
+          <w:sz w:val="19"/>
+          <w:szCs w:val="19"/>
+        </w:rPr>
+        <w:t xml:space="preserve">client/js/pages/expense-edit.js</w:t>
+      </w:r>
+    </w:p>
+    <w:p>
+      <w:pPr>
+        <w:pStyle w:val="ListParagraph"/>
+        <w:numPr>
+          <w:ilvl w:val="0"/>
+          <w:numId w:val="2"/>
+        </w:numPr>
+      </w:pPr>
+      <w:r>
+        <w:rPr>
+          <w:rFonts w:ascii="Consolas" w:cs="Consolas" w:eastAsia="Consolas" w:hAnsi="Consolas"/>
+          <w:sz w:val="19"/>
+          <w:szCs w:val="19"/>
+        </w:rPr>
+        <w:t xml:space="preserve">client/js/core/render.js</w:t>
+      </w:r>
+    </w:p>
+    <w:p>
+      <w:pPr>
+        <w:pStyle w:val="ListParagraph"/>
+        <w:numPr>
+          <w:ilvl w:val="0"/>
+          <w:numId w:val="2"/>
+        </w:numPr>
+      </w:pPr>
+      <w:r>
+        <w:rPr>
+          <w:rFonts w:ascii="Consolas" w:cs="Consolas" w:eastAsia="Consolas" w:hAnsi="Consolas"/>
+          <w:sz w:val="19"/>
+          <w:szCs w:val="19"/>
+        </w:rPr>
+        <w:t xml:space="preserve">client/js/ui/user.js</w:t>
+      </w:r>
+    </w:p>
+    <w:p>
+      <w:pPr>
+        <w:pStyle w:val="ListParagraph"/>
+        <w:numPr>
+          <w:ilvl w:val="0"/>
+          <w:numId w:val="2"/>
+        </w:numPr>
+      </w:pPr>
+      <w:r>
+        <w:rPr>
+          <w:rFonts w:ascii="Consolas" w:cs="Consolas" w:eastAsia="Consolas" w:hAnsi="Consolas"/>
+          <w:sz w:val="19"/>
+          <w:szCs w:val="19"/>
+        </w:rPr>
+        <w:t xml:space="preserve">client/js/app.js</w:t>
+      </w:r>
+    </w:p>
+    <w:p>
+      <w:pPr>
+        <w:pStyle w:val="ListParagraph"/>
+        <w:numPr>
+          <w:ilvl w:val="0"/>
+          <w:numId w:val="2"/>
+        </w:numPr>
+      </w:pPr>
+      <w:r>
+        <w:rPr>
+          <w:rFonts w:ascii="Consolas" w:cs="Consolas" w:eastAsia="Consolas" w:hAnsi="Consolas"/>
+          <w:sz w:val="19"/>
+          <w:szCs w:val="19"/>
+        </w:rPr>
+        <w:t xml:space="preserve">client/pages/profile.html</w:t>
+      </w:r>
+    </w:p>
+    <w:p>
+      <w:pPr>
+        <w:pStyle w:val="ListParagraph"/>
+        <w:numPr>
+          <w:ilvl w:val="0"/>
+          <w:numId w:val="2"/>
+        </w:numPr>
+      </w:pPr>
+      <w:r>
+        <w:rPr>
+          <w:rFonts w:ascii="Consolas" w:cs="Consolas" w:eastAsia="Consolas" w:hAnsi="Consolas"/>
+          <w:sz w:val="19"/>
+          <w:szCs w:val="19"/>
+        </w:rPr>
+        <w:t xml:space="preserve">client/README.md</w:t>
+      </w:r>
+    </w:p>
+    <w:p>
+      <w:pPr>
+        <w:pStyle w:val="ListParagraph"/>
+        <w:numPr>
+          <w:ilvl w:val="0"/>
+          <w:numId w:val="2"/>
+        </w:numPr>
+      </w:pPr>
+      <w:r>
+        <w:rPr>
+          <w:rFonts w:ascii="Consolas" w:cs="Consolas" w:eastAsia="Consolas" w:hAnsi="Consolas"/>
+          <w:sz w:val="19"/>
+          <w:szCs w:val="19"/>
+        </w:rPr>
+        <w:t xml:space="preserve">tests/client/render.test.mjs</w:t>
       </w:r>
     </w:p>
     <w:p>
@@ -8020,7 +8500,7 @@
           <w:sz w:val="21"/>
           <w:szCs w:val="21"/>
         </w:rPr>
-        <w:t xml:space="preserve">PDF with the executed prompts and 15 planned prompts; the Word log has the same content.</w:t>
+        <w:t xml:space="preserve">Created 14 modular page scripts in client/js/pages/ importing exclusively from api.js; implemented live debounced expenses filter bar with URL sync and pagination; created core rendering helpers for safe XSS-free DOM creation, aria-busy loading states, and accessible empty/error states; wired user profile display and reset demo data; added comprehensive rendering test suite.</w:t>
       </w:r>
     </w:p>
     <w:p>
@@ -8048,7 +8528,7 @@
           <w:sz w:val="21"/>
           <w:szCs w:val="21"/>
         </w:rPr>
-        <w:t xml:space="preserve">Pages rendered to images and inspected; text extracted with pypdf.</w:t>
+        <w:t xml:space="preserve">All 47 unit/integration tests passing (30 data layer + 17 rendering/UI); npm run lint:html passing with 0 errors across all 25 HTML files.</w:t>
       </w:r>
     </w:p>
     <w:p>
@@ -8064,11 +8544,20 @@
     </w:p>
     <w:p>
       <w:pPr>
+        <w:pStyle w:val="Heading2"/>
+        <w:spacing w:before="360"/>
+      </w:pPr>
+      <w:r>
+        <w:t xml:space="preserve">Wrap-up - Documentation, cleanup and deployment</w:t>
+      </w:r>
+    </w:p>
+    <w:p>
+      <w:pPr>
         <w:pStyle w:val="Heading3"/>
         <w:keepNext/>
       </w:pPr>
       <w:r>
-        <w:t xml:space="preserve">#15  Create the GitHub repository and push the code</w:t>
+        <w:t xml:space="preserve">#13  Request: GitHub repository, website link and PDF of prompts</w:t>
       </w:r>
     </w:p>
     <w:p>
@@ -8082,7 +8571,7 @@
           <w:sz w:val="18"/>
           <w:szCs w:val="18"/>
         </w:rPr>
-        <w:t xml:space="preserve">Working prompt  |  2026-10-15</w:t>
+        <w:t xml:space="preserve">User prompt  |  2026-10-15</w:t>
       </w:r>
     </w:p>
     <w:p>
@@ -8116,7 +8605,7 @@
           <w:sz w:val="19"/>
           <w:szCs w:val="19"/>
         </w:rPr>
-        <w:t xml:space="preserve">Install the official GitHub CLI with winget and sign in through the device-code flow (the student approves it in the browser). Before publishing, check that no secrets or databases are tracked, review the receipt images that are still in the commit history (they are generic sample invoices), and confirm with the student that a public repository is acceptable because the team's original repository is private. Then create the public repository MahaprabhuK/SplitStack, push the refurbish branch as main together with the legacy branch, add a GitHub Actions workflow (.github/workflows/pages.yml) that deploys the client/ folder to GitHub Pages, enable Pages with the "GitHub Actions" source, and confirm that the site responds.</w:t>
+        <w:t xml:space="preserve">create a new repositry for this project in my gihub , and after than give me the github link and then the website link and also a pdf containing the prompts to complete project.</w:t>
       </w:r>
     </w:p>
     <w:p>
@@ -8144,7 +8633,7 @@
           <w:sz w:val="21"/>
           <w:szCs w:val="21"/>
         </w:rPr>
-        <w:t xml:space="preserve">Give the student a repository link and a live website link.</w:t>
+        <w:t xml:space="preserve">Publish the project under the student's own GitHub account, host the site, and export the prompt log (including the remaining planned prompts) as a PDF.</w:t>
       </w:r>
     </w:p>
     <w:p>
@@ -8177,7 +8666,7 @@
           <w:sz w:val="19"/>
           <w:szCs w:val="19"/>
         </w:rPr>
-        <w:t xml:space="preserve">README.md</w:t>
+        <w:t xml:space="preserve">-</w:t>
       </w:r>
     </w:p>
     <w:p>
@@ -8205,7 +8694,7 @@
           <w:sz w:val="21"/>
           <w:szCs w:val="21"/>
         </w:rPr>
-        <w:t xml:space="preserve">Public repository https://github.com/MahaprabhuK/SplitStack created and the legacy branch pushed. The first push of main was rejected because it added a GitHub Actions workflow (.github/workflows/pages.yml) and the gh token lacked the "workflow" scope; the workflow file was removed and main was pushed in the next step. GitHub Pages is not set up yet (planned for the wrap-up; needs "gh auth refresh -s workflow" or a gh-pages branch).</w:t>
+        <w:t xml:space="preserve">Done: see the following entries.</w:t>
       </w:r>
     </w:p>
     <w:p>
@@ -8233,7 +8722,7 @@
           <w:sz w:val="21"/>
           <w:szCs w:val="21"/>
         </w:rPr>
-        <w:t xml:space="preserve">gh repo view; git push output.</w:t>
+        <w:t xml:space="preserve">-</w:t>
       </w:r>
     </w:p>
     <w:p>
@@ -8253,7 +8742,7 @@
         <w:keepNext/>
       </w:pPr>
       <w:r>
-        <w:t xml:space="preserve">#16  Request: hand the project over to a teammate's agent</w:t>
+        <w:t xml:space="preserve">#14  PDF export of the prompt log, including planned prompts</w:t>
       </w:r>
     </w:p>
     <w:p>
@@ -8267,7 +8756,7 @@
           <w:sz w:val="18"/>
           <w:szCs w:val="18"/>
         </w:rPr>
-        <w:t xml:space="preserve">User prompt  |  2026-10-15</w:t>
+        <w:t xml:space="preserve">Working prompt  |  2026-10-15</w:t>
       </w:r>
     </w:p>
     <w:p>
@@ -8301,7 +8790,7 @@
           <w:sz w:val="19"/>
           <w:szCs w:val="19"/>
         </w:rPr>
-        <w:t xml:space="preserve">ACTUALLY I GONNA HANDOVER THE PROJECT TO MY TEAMMATES AGENT SO HE'LL BE PULLING THE CODE AND RUNNING IN HIS SYSTEM SO GIVE PROMPT FOR THAT</w:t>
+        <w:t xml:space="preserve">Export the prompt log to PDF with a Python reportlab script (docs/tools/build_prompt_pdf.py) that reads docs/prompt_log.json: a title page, a stage overview table, a summary of every entry, Part A with every executed prompt verbatim in a shaded box with purpose, files, result and verification, and Part B with the planned prompts that complete Review 2, Review 3 and the wrap-up, clearly marked as not yet run. Add the planned prompts to prompt_log.json and to the Word log as well, and make "npm run log" rebuild both documents.</w:t>
       </w:r>
     </w:p>
     <w:p>
@@ -8329,7 +8818,7 @@
           <w:sz w:val="21"/>
           <w:szCs w:val="21"/>
         </w:rPr>
-        <w:t xml:space="preserve">Let a teammate's AI agent clone, run and continue the project.</w:t>
+        <w:t xml:space="preserve">Give the student a PDF containing the prompts needed to complete the whole project.</w:t>
       </w:r>
     </w:p>
     <w:p>
@@ -8362,7 +8851,92 @@
           <w:sz w:val="19"/>
           <w:szCs w:val="19"/>
         </w:rPr>
-        <w:t xml:space="preserve">-</w:t>
+        <w:t xml:space="preserve">docs/tools/build_prompt_pdf.py</w:t>
+      </w:r>
+    </w:p>
+    <w:p>
+      <w:pPr>
+        <w:pStyle w:val="ListParagraph"/>
+        <w:numPr>
+          <w:ilvl w:val="0"/>
+          <w:numId w:val="2"/>
+        </w:numPr>
+      </w:pPr>
+      <w:r>
+        <w:rPr>
+          <w:rFonts w:ascii="Consolas" w:cs="Consolas" w:eastAsia="Consolas" w:hAnsi="Consolas"/>
+          <w:sz w:val="19"/>
+          <w:szCs w:val="19"/>
+        </w:rPr>
+        <w:t xml:space="preserve">docs/tools/build-prompt-log.js</w:t>
+      </w:r>
+    </w:p>
+    <w:p>
+      <w:pPr>
+        <w:pStyle w:val="ListParagraph"/>
+        <w:numPr>
+          <w:ilvl w:val="0"/>
+          <w:numId w:val="2"/>
+        </w:numPr>
+      </w:pPr>
+      <w:r>
+        <w:rPr>
+          <w:rFonts w:ascii="Consolas" w:cs="Consolas" w:eastAsia="Consolas" w:hAnsi="Consolas"/>
+          <w:sz w:val="19"/>
+          <w:szCs w:val="19"/>
+        </w:rPr>
+        <w:t xml:space="preserve">docs/prompt_log.json</w:t>
+      </w:r>
+    </w:p>
+    <w:p>
+      <w:pPr>
+        <w:pStyle w:val="ListParagraph"/>
+        <w:numPr>
+          <w:ilvl w:val="0"/>
+          <w:numId w:val="2"/>
+        </w:numPr>
+      </w:pPr>
+      <w:r>
+        <w:rPr>
+          <w:rFonts w:ascii="Consolas" w:cs="Consolas" w:eastAsia="Consolas" w:hAnsi="Consolas"/>
+          <w:sz w:val="19"/>
+          <w:szCs w:val="19"/>
+        </w:rPr>
+        <w:t xml:space="preserve">docs/SplitStack_Prompt_Log.pdf</w:t>
+      </w:r>
+    </w:p>
+    <w:p>
+      <w:pPr>
+        <w:pStyle w:val="ListParagraph"/>
+        <w:numPr>
+          <w:ilvl w:val="0"/>
+          <w:numId w:val="2"/>
+        </w:numPr>
+      </w:pPr>
+      <w:r>
+        <w:rPr>
+          <w:rFonts w:ascii="Consolas" w:cs="Consolas" w:eastAsia="Consolas" w:hAnsi="Consolas"/>
+          <w:sz w:val="19"/>
+          <w:szCs w:val="19"/>
+        </w:rPr>
+        <w:t xml:space="preserve">docs/SplitStack_Prompt_Log.docx</w:t>
+      </w:r>
+    </w:p>
+    <w:p>
+      <w:pPr>
+        <w:pStyle w:val="ListParagraph"/>
+        <w:numPr>
+          <w:ilvl w:val="0"/>
+          <w:numId w:val="2"/>
+        </w:numPr>
+      </w:pPr>
+      <w:r>
+        <w:rPr>
+          <w:rFonts w:ascii="Consolas" w:cs="Consolas" w:eastAsia="Consolas" w:hAnsi="Consolas"/>
+          <w:sz w:val="19"/>
+          <w:szCs w:val="19"/>
+        </w:rPr>
+        <w:t xml:space="preserve">package.json</w:t>
       </w:r>
     </w:p>
     <w:p>
@@ -8390,7 +8964,7 @@
           <w:sz w:val="21"/>
           <w:szCs w:val="21"/>
         </w:rPr>
-        <w:t xml:space="preserve">A handover prompt was written covering: requirements per review, clone and branch, prerequisites, install/run/verify commands, repository map, known traps, the mandatory logging rule, the ordered remaining work (planned prompts P1-P15) and working rules. Noted that the new work had to be pushed to GitHub first.</w:t>
+        <w:t xml:space="preserve">PDF with the executed prompts and 15 planned prompts; the Word log has the same content.</w:t>
       </w:r>
     </w:p>
     <w:p>
@@ -8418,7 +8992,7 @@
           <w:sz w:val="21"/>
           <w:szCs w:val="21"/>
         </w:rPr>
-        <w:t xml:space="preserve">-</w:t>
+        <w:t xml:space="preserve">Pages rendered to images and inspected; text extracted with pypdf.</w:t>
       </w:r>
     </w:p>
     <w:p>
@@ -8438,7 +9012,7 @@
         <w:keepNext/>
       </w:pPr>
       <w:r>
-        <w:t xml:space="preserve">#17  Push the refurbished code to GitHub main</w:t>
+        <w:t xml:space="preserve">#15  Create the GitHub repository and push the code</w:t>
       </w:r>
     </w:p>
     <w:p>
@@ -8486,7 +9060,7 @@
           <w:sz w:val="19"/>
           <w:szCs w:val="19"/>
         </w:rPr>
-        <w:t xml:space="preserve">push it  (user prompt). Executed as: remove .github/workflows/pages.yml (the token lacks the workflow scope), replace the not-yet-existing live-site link in README.md with local run instructions, correct the earlier log entry about publishing, log the handover, rebuild the prompt logs, commit, and push the refurbish branch to main on https://github.com/MahaprabhuK/SplitStack so the teammate can clone it.</w:t>
+        <w:t xml:space="preserve">Install the official GitHub CLI with winget and sign in through the device-code flow (the student approves it in the browser). Before publishing, check that no secrets or databases are tracked, review the receipt images that are still in the commit history (they are generic sample invoices), and confirm with the student that a public repository is acceptable because the team's original repository is private. Then create the public repository MahaprabhuK/SplitStack, push the refurbish branch as main together with the legacy branch, add a GitHub Actions workflow (.github/workflows/pages.yml) that deploys the client/ folder to GitHub Pages, enable Pages with the "GitHub Actions" source, and confirm that the site responds.</w:t>
       </w:r>
     </w:p>
     <w:p>
@@ -8514,7 +9088,7 @@
           <w:sz w:val="21"/>
           <w:szCs w:val="21"/>
         </w:rPr>
-        <w:t xml:space="preserve">Make the current work available to the teammate.</w:t>
+        <w:t xml:space="preserve">Give the student a repository link and a live website link.</w:t>
       </w:r>
     </w:p>
     <w:p>
@@ -8547,75 +9121,7 @@
           <w:sz w:val="19"/>
           <w:szCs w:val="19"/>
         </w:rPr>
-        <w:t xml:space="preserve">.github/workflows/pages.yml (removed)</w:t>
-      </w:r>
-    </w:p>
-    <w:p>
-      <w:pPr>
-        <w:pStyle w:val="ListParagraph"/>
-        <w:numPr>
-          <w:ilvl w:val="0"/>
-          <w:numId w:val="2"/>
-        </w:numPr>
-      </w:pPr>
-      <w:r>
-        <w:rPr>
-          <w:rFonts w:ascii="Consolas" w:cs="Consolas" w:eastAsia="Consolas" w:hAnsi="Consolas"/>
-          <w:sz w:val="19"/>
-          <w:szCs w:val="19"/>
-        </w:rPr>
         <w:t xml:space="preserve">README.md</w:t>
-      </w:r>
-    </w:p>
-    <w:p>
-      <w:pPr>
-        <w:pStyle w:val="ListParagraph"/>
-        <w:numPr>
-          <w:ilvl w:val="0"/>
-          <w:numId w:val="2"/>
-        </w:numPr>
-      </w:pPr>
-      <w:r>
-        <w:rPr>
-          <w:rFonts w:ascii="Consolas" w:cs="Consolas" w:eastAsia="Consolas" w:hAnsi="Consolas"/>
-          <w:sz w:val="19"/>
-          <w:szCs w:val="19"/>
-        </w:rPr>
-        <w:t xml:space="preserve">docs/prompt_log.json</w:t>
-      </w:r>
-    </w:p>
-    <w:p>
-      <w:pPr>
-        <w:pStyle w:val="ListParagraph"/>
-        <w:numPr>
-          <w:ilvl w:val="0"/>
-          <w:numId w:val="2"/>
-        </w:numPr>
-      </w:pPr>
-      <w:r>
-        <w:rPr>
-          <w:rFonts w:ascii="Consolas" w:cs="Consolas" w:eastAsia="Consolas" w:hAnsi="Consolas"/>
-          <w:sz w:val="19"/>
-          <w:szCs w:val="19"/>
-        </w:rPr>
-        <w:t xml:space="preserve">docs/SplitStack_Prompt_Log.docx</w:t>
-      </w:r>
-    </w:p>
-    <w:p>
-      <w:pPr>
-        <w:pStyle w:val="ListParagraph"/>
-        <w:numPr>
-          <w:ilvl w:val="0"/>
-          <w:numId w:val="2"/>
-        </w:numPr>
-      </w:pPr>
-      <w:r>
-        <w:rPr>
-          <w:rFonts w:ascii="Consolas" w:cs="Consolas" w:eastAsia="Consolas" w:hAnsi="Consolas"/>
-          <w:sz w:val="19"/>
-          <w:szCs w:val="19"/>
-        </w:rPr>
-        <w:t xml:space="preserve">docs/SplitStack_Prompt_Log.pdf</w:t>
       </w:r>
     </w:p>
     <w:p>
@@ -8643,7 +9149,7 @@
           <w:sz w:val="21"/>
           <w:szCs w:val="21"/>
         </w:rPr>
-        <w:t xml:space="preserve">main pushed to GitHub; branches on GitHub: main (refurbished work) and legacy (original Flask app).</w:t>
+        <w:t xml:space="preserve">Public repository https://github.com/MahaprabhuK/SplitStack created and the legacy branch pushed. The first push of main was rejected because it added a GitHub Actions workflow (.github/workflows/pages.yml) and the gh token lacked the "workflow" scope; the workflow file was removed and main was pushed in the next step. GitHub Pages is not set up yet (planned for the wrap-up; needs "gh auth refresh -s workflow" or a gh-pages branch).</w:t>
       </w:r>
     </w:p>
     <w:p>
@@ -8671,7 +9177,7 @@
           <w:sz w:val="21"/>
           <w:szCs w:val="21"/>
         </w:rPr>
-        <w:t xml:space="preserve">git ls-remote shows main and legacy at the expected commits.</w:t>
+        <w:t xml:space="preserve">gh repo view; git push output.</w:t>
       </w:r>
     </w:p>
     <w:p>
@@ -8691,7 +9197,7 @@
         <w:keepNext/>
       </w:pPr>
       <w:r>
-        <w:t xml:space="preserve">#18  Request: push the code and deploy the website</w:t>
+        <w:t xml:space="preserve">#16  Request: hand the project over to a teammate's agent</w:t>
       </w:r>
     </w:p>
     <w:p>
@@ -8739,7 +9245,7 @@
           <w:sz w:val="19"/>
           <w:szCs w:val="19"/>
         </w:rPr>
-        <w:t xml:space="preserve">first push the code and deploy it</w:t>
+        <w:t xml:space="preserve">ACTUALLY I GONNA HANDOVER THE PROJECT TO MY TEAMMATES AGENT SO HE'LL BE PULLING THE CODE AND RUNNING IN HIS SYSTEM SO GIVE PROMPT FOR THAT</w:t>
       </w:r>
     </w:p>
     <w:p>
@@ -8767,7 +9273,7 @@
           <w:sz w:val="21"/>
           <w:szCs w:val="21"/>
         </w:rPr>
-        <w:t xml:space="preserve">Get the code on GitHub and the Review 1 site online.</w:t>
+        <w:t xml:space="preserve">Let a teammate's AI agent clone, run and continue the project.</w:t>
       </w:r>
     </w:p>
     <w:p>
@@ -8828,7 +9334,7 @@
           <w:sz w:val="21"/>
           <w:szCs w:val="21"/>
         </w:rPr>
-        <w:t xml:space="preserve">Handled in the next step.</w:t>
+        <w:t xml:space="preserve">A handover prompt was written covering: requirements per review, clone and branch, prerequisites, install/run/verify commands, repository map, known traps, the mandatory logging rule, the ordered remaining work (planned prompts P1-P15) and working rules. Noted that the new work had to be pushed to GitHub first.</w:t>
       </w:r>
     </w:p>
     <w:p>
@@ -8876,7 +9382,7 @@
         <w:keepNext/>
       </w:pPr>
       <w:r>
-        <w:t xml:space="preserve">#19  Deploy the client to GitHub Pages from a gh-pages branch</w:t>
+        <w:t xml:space="preserve">#17  Push the refurbished code to GitHub main</w:t>
       </w:r>
     </w:p>
     <w:p>
@@ -8924,7 +9430,7 @@
           <w:sz w:val="19"/>
           <w:szCs w:val="19"/>
         </w:rPr>
-        <w:t xml:space="preserve">Push refurbish to main and refurbish on MahaprabhuK/SplitStack. Because the token cannot push workflow files, deploy without GitHub Actions: check that client/ uses only relative links, split client/ into its own history with git subtree split, push it as the gh-pages branch, wait for GitHub Pages to publish it, then put the live link back in README.md and log the step.</w:t>
+        <w:t xml:space="preserve">push it  (user prompt). Executed as: remove .github/workflows/pages.yml (the token lacks the workflow scope), replace the not-yet-existing live-site link in README.md with local run instructions, correct the earlier log entry about publishing, log the handover, rebuild the prompt logs, commit, and push the refurbish branch to main on https://github.com/MahaprabhuK/SplitStack so the teammate can clone it.</w:t>
       </w:r>
     </w:p>
     <w:p>
@@ -8952,7 +9458,7 @@
           <w:sz w:val="21"/>
           <w:szCs w:val="21"/>
         </w:rPr>
-        <w:t xml:space="preserve">Publish the Review 1 site at a public URL without needing the workflow scope.</w:t>
+        <w:t xml:space="preserve">Make the current work available to the teammate.</w:t>
       </w:r>
     </w:p>
     <w:p>
@@ -8985,7 +9491,7 @@
           <w:sz w:val="19"/>
           <w:szCs w:val="19"/>
         </w:rPr>
-        <w:t xml:space="preserve">README.md</w:t>
+        <w:t xml:space="preserve">.github/workflows/pages.yml (removed)</w:t>
       </w:r>
     </w:p>
     <w:p>
@@ -9002,7 +9508,58 @@
           <w:sz w:val="19"/>
           <w:szCs w:val="19"/>
         </w:rPr>
+        <w:t xml:space="preserve">README.md</w:t>
+      </w:r>
+    </w:p>
+    <w:p>
+      <w:pPr>
+        <w:pStyle w:val="ListParagraph"/>
+        <w:numPr>
+          <w:ilvl w:val="0"/>
+          <w:numId w:val="2"/>
+        </w:numPr>
+      </w:pPr>
+      <w:r>
+        <w:rPr>
+          <w:rFonts w:ascii="Consolas" w:cs="Consolas" w:eastAsia="Consolas" w:hAnsi="Consolas"/>
+          <w:sz w:val="19"/>
+          <w:szCs w:val="19"/>
+        </w:rPr>
         <w:t xml:space="preserve">docs/prompt_log.json</w:t>
+      </w:r>
+    </w:p>
+    <w:p>
+      <w:pPr>
+        <w:pStyle w:val="ListParagraph"/>
+        <w:numPr>
+          <w:ilvl w:val="0"/>
+          <w:numId w:val="2"/>
+        </w:numPr>
+      </w:pPr>
+      <w:r>
+        <w:rPr>
+          <w:rFonts w:ascii="Consolas" w:cs="Consolas" w:eastAsia="Consolas" w:hAnsi="Consolas"/>
+          <w:sz w:val="19"/>
+          <w:szCs w:val="19"/>
+        </w:rPr>
+        <w:t xml:space="preserve">docs/SplitStack_Prompt_Log.docx</w:t>
+      </w:r>
+    </w:p>
+    <w:p>
+      <w:pPr>
+        <w:pStyle w:val="ListParagraph"/>
+        <w:numPr>
+          <w:ilvl w:val="0"/>
+          <w:numId w:val="2"/>
+        </w:numPr>
+      </w:pPr>
+      <w:r>
+        <w:rPr>
+          <w:rFonts w:ascii="Consolas" w:cs="Consolas" w:eastAsia="Consolas" w:hAnsi="Consolas"/>
+          <w:sz w:val="19"/>
+          <w:szCs w:val="19"/>
+        </w:rPr>
+        <w:t xml:space="preserve">docs/SplitStack_Prompt_Log.pdf</w:t>
       </w:r>
     </w:p>
     <w:p>
@@ -9030,7 +9587,7 @@
           <w:sz w:val="21"/>
           <w:szCs w:val="21"/>
         </w:rPr>
-        <w:t xml:space="preserve">main and refurbish are on GitHub. The client/ folder is published from the gh-pages branch at https://mahaprabhuk.github.io/SplitStack/ (GitHub enabled Pages automatically). To redeploy after client changes: git subtree split --prefix client refurbish, then push that commit to gh-pages.</w:t>
+        <w:t xml:space="preserve">main pushed to GitHub; branches on GitHub: main (refurbished work) and legacy (original Flask app).</w:t>
       </w:r>
     </w:p>
     <w:p>
@@ -9058,7 +9615,7 @@
           <w:sz w:val="21"/>
           <w:szCs w:val="21"/>
         </w:rPr>
-        <w:t xml:space="preserve">git ls-remote; curl returned 200 for the home page, pages/404.html and css/base.css on the live site.</w:t>
+        <w:t xml:space="preserve">git ls-remote shows main and legacy at the expected commits.</w:t>
       </w:r>
     </w:p>
     <w:p>
@@ -9078,7 +9635,7 @@
         <w:keepNext/>
       </w:pPr>
       <w:r>
-        <w:t xml:space="preserve">#20  Request: handover prompt PDF for a teammate's agent</w:t>
+        <w:t xml:space="preserve">#18  Request: push the code and deploy the website</w:t>
       </w:r>
     </w:p>
     <w:p>
@@ -9126,7 +9683,7 @@
           <w:sz w:val="19"/>
           <w:szCs w:val="19"/>
         </w:rPr>
-        <w:t xml:space="preserve">imma handover the project to my teammate i want you to create a detailed prompt for his agent most prolly he'll use anti gravity so i want a pdf containing prompts to complete the rest of the work in the project. so create a pdf and mention its path once its created then i'll share it to him</w:t>
+        <w:t xml:space="preserve">first push the code and deploy it</w:t>
       </w:r>
     </w:p>
     <w:p>
@@ -9154,7 +9711,7 @@
           <w:sz w:val="21"/>
           <w:szCs w:val="21"/>
         </w:rPr>
-        <w:t xml:space="preserve">Let a teammate's AI agent (Antigravity) finish Review 2, Review 3 and the wrap-up.</w:t>
+        <w:t xml:space="preserve">Get the code on GitHub and the Review 1 site online.</w:t>
       </w:r>
     </w:p>
     <w:p>
@@ -9263,7 +9820,7 @@
         <w:keepNext/>
       </w:pPr>
       <w:r>
-        <w:t xml:space="preserve">#21  Handover prompts PDF</w:t>
+        <w:t xml:space="preserve">#19  Deploy the client to GitHub Pages from a gh-pages branch</w:t>
       </w:r>
     </w:p>
     <w:p>
@@ -9311,7 +9868,7 @@
           <w:sz w:val="19"/>
           <w:szCs w:val="19"/>
         </w:rPr>
-        <w:t xml:space="preserve">Write docs/tools/build_handover_pdf.py (reusing the styles of build_prompt_pdf.py) to produce docs/SplitStack_Handover_Prompts.pdf: how to use it with Antigravity, one-time setup (tools, collaborator access, MongoDB Atlas, workflow token scope), a roadmap, Prompt 0 with the full project context, rules, logging, commit/push and gh-pages redeploy procedure, the 15 planned prompts P1-P15 expanded with concrete checks and commit messages, utility prompts (status, recovery, review rehearsal) and common problems. Render pages to check the layout.</w:t>
+        <w:t xml:space="preserve">Push refurbish to main and refurbish on MahaprabhuK/SplitStack. Because the token cannot push workflow files, deploy without GitHub Actions: check that client/ uses only relative links, split client/ into its own history with git subtree split, push it as the gh-pages branch, wait for GitHub Pages to publish it, then put the live link back in README.md and log the step.</w:t>
       </w:r>
     </w:p>
     <w:p>
@@ -9339,7 +9896,7 @@
           <w:sz w:val="21"/>
           <w:szCs w:val="21"/>
         </w:rPr>
-        <w:t xml:space="preserve">Give the teammate a self-contained, ordered set of prompts.</w:t>
+        <w:t xml:space="preserve">Publish the Review 1 site at a public URL without needing the workflow scope.</w:t>
       </w:r>
     </w:p>
     <w:p>
@@ -9372,7 +9929,7 @@
           <w:sz w:val="19"/>
           <w:szCs w:val="19"/>
         </w:rPr>
-        <w:t xml:space="preserve">docs/tools/build_handover_pdf.py</w:t>
+        <w:t xml:space="preserve">README.md</w:t>
       </w:r>
     </w:p>
     <w:p>
@@ -9389,7 +9946,7 @@
           <w:sz w:val="19"/>
           <w:szCs w:val="19"/>
         </w:rPr>
-        <w:t xml:space="preserve">docs/SplitStack_Handover_Prompts.pdf</w:t>
+        <w:t xml:space="preserve">docs/prompt_log.json</w:t>
       </w:r>
     </w:p>
     <w:p>
@@ -9417,7 +9974,7 @@
           <w:sz w:val="21"/>
           <w:szCs w:val="21"/>
         </w:rPr>
-        <w:t xml:space="preserve">14-page PDF created. Changes against the planned prompts: P1 adds data-page attributes and client/js/package.json (type module) for node --test; P13 keeps the localStorage implementation as a demo mode (api-local.js chosen when /api/health does not answer) so the GitHub Pages site keeps working, instead of deleting it; P9 replaces deprecated csurf with a synchronizer token; P14 uses MongoMemoryReplSet because the API uses transactions; P15 asks for confirmation before deleting the Flask files and leaves Render account steps to the student.</w:t>
+        <w:t xml:space="preserve">main and refurbish are on GitHub. The client/ folder is published from the gh-pages branch at https://mahaprabhuk.github.io/SplitStack/ (GitHub enabled Pages automatically). To redeploy after client changes: git subtree split --prefix client refurbish, then push that commit to gh-pages.</w:t>
       </w:r>
     </w:p>
     <w:p>
@@ -9445,7 +10002,7 @@
           <w:sz w:val="21"/>
           <w:szCs w:val="21"/>
         </w:rPr>
-        <w:t xml:space="preserve">Rendered pages with PyMuPDF and checked the layout of the setup, Prompt 0, step and utility pages.</w:t>
+        <w:t xml:space="preserve">git ls-remote; curl returned 200 for the home page, pages/404.html and css/base.css on the live site.</w:t>
       </w:r>
     </w:p>
     <w:p>
@@ -9460,37 +10017,12 @@
       </w:r>
     </w:p>
     <w:p>
-      <w:r>
-        <w:br w:type="page"/>
-      </w:r>
-    </w:p>
-    <w:p>
-      <w:pPr>
-        <w:pStyle w:val="Heading1"/>
-      </w:pPr>
-      <w:r>
-        <w:t xml:space="preserve">Planned prompts to complete the project</w:t>
-      </w:r>
-    </w:p>
-    <w:p>
-      <w:pPr>
-        <w:spacing w:after="80"/>
-      </w:pPr>
-      <w:r>
-        <w:rPr>
-          <w:sz w:val="21"/>
-          <w:szCs w:val="21"/>
-        </w:rPr>
-        <w:t xml:space="preserve">These prompts have not been run yet. Run them in order; after each one, move it into the log above with its result.</w:t>
-      </w:r>
-    </w:p>
-    <w:p>
       <w:pPr>
         <w:pStyle w:val="Heading3"/>
         <w:keepNext/>
       </w:pPr>
       <w:r>
-        <w:t xml:space="preserve">P1  Render pages from data</w:t>
+        <w:t xml:space="preserve">#20  Request: handover prompt PDF for a teammate's agent</w:t>
       </w:r>
     </w:p>
     <w:p>
@@ -9504,7 +10036,7 @@
           <w:sz w:val="18"/>
           <w:szCs w:val="18"/>
         </w:rPr>
-        <w:t xml:space="preserve">Review 2  |  Planned prompt</w:t>
+        <w:t xml:space="preserve">User prompt  |  2026-10-15</w:t>
       </w:r>
     </w:p>
     <w:p>
@@ -9538,7 +10070,7 @@
           <w:sz w:val="19"/>
           <w:szCs w:val="19"/>
         </w:rPr>
-        <w:t xml:space="preserve">Replace the hard-coded sample rows in the dashboard, expenses, income, budgets, recurring, categories, groups, group detail, settlements, shopping and profile pages with markup rendered by JavaScript from api.js, using &lt;template&gt; elements and textContent (never innerHTML with user data). Keep the static markup as the no-JavaScript fallback. Implement the expenses filter bar (search, category, method, date range, sort) with debounced live filtering and query-string sync, pagination, and empty states.</w:t>
+        <w:t xml:space="preserve">imma handover the project to my teammate i want you to create a detailed prompt for his agent most prolly he'll use anti gravity so i want a pdf containing prompts to complete the rest of the work in the project. so create a pdf and mention its path once its created then i'll share it to him</w:t>
       </w:r>
     </w:p>
     <w:p>
@@ -9566,7 +10098,7 @@
           <w:sz w:val="21"/>
           <w:szCs w:val="21"/>
         </w:rPr>
-        <w:t xml:space="preserve">Turn the static pages into working screens.</w:t>
+        <w:t xml:space="preserve">Let a teammate's AI agent (Antigravity) finish Review 2, Review 3 and the wrap-up.</w:t>
       </w:r>
     </w:p>
     <w:p>
@@ -9583,6 +10115,39 @@
           <w:szCs w:val="17"/>
         </w:rPr>
         <w:t xml:space="preserve">FILES</w:t>
+      </w:r>
+    </w:p>
+    <w:p>
+      <w:pPr>
+        <w:pStyle w:val="ListParagraph"/>
+        <w:numPr>
+          <w:ilvl w:val="0"/>
+          <w:numId w:val="2"/>
+        </w:numPr>
+      </w:pPr>
+      <w:r>
+        <w:rPr>
+          <w:rFonts w:ascii="Consolas" w:cs="Consolas" w:eastAsia="Consolas" w:hAnsi="Consolas"/>
+          <w:sz w:val="19"/>
+          <w:szCs w:val="19"/>
+        </w:rPr>
+        <w:t xml:space="preserve">-</w:t>
+      </w:r>
+    </w:p>
+    <w:p>
+      <w:pPr>
+        <w:spacing w:after="60" w:before="160"/>
+      </w:pPr>
+      <w:r>
+        <w:rPr>
+          <w:b/>
+          <w:bCs/>
+          <w:color w:val="4F46E5"/>
+          <w:spacing w:val="20"/>
+          <w:sz w:val="17"/>
+          <w:szCs w:val="17"/>
+        </w:rPr>
+        <w:t xml:space="preserve">RESULT</w:t>
       </w:r>
     </w:p>
     <w:p>
@@ -9594,7 +10159,46 @@
           <w:sz w:val="21"/>
           <w:szCs w:val="21"/>
         </w:rPr>
-        <w:t xml:space="preserve">client/js/pages/*.js, client/pages/*.html</w:t>
+        <w:t xml:space="preserve">Handled in the next step.</w:t>
+      </w:r>
+    </w:p>
+    <w:p>
+      <w:pPr>
+        <w:spacing w:after="60" w:before="160"/>
+      </w:pPr>
+      <w:r>
+        <w:rPr>
+          <w:b/>
+          <w:bCs/>
+          <w:color w:val="4F46E5"/>
+          <w:spacing w:val="20"/>
+          <w:sz w:val="17"/>
+          <w:szCs w:val="17"/>
+        </w:rPr>
+        <w:t xml:space="preserve">VERIFICATION</w:t>
+      </w:r>
+    </w:p>
+    <w:p>
+      <w:pPr>
+        <w:spacing w:after="80"/>
+      </w:pPr>
+      <w:r>
+        <w:rPr>
+          <w:sz w:val="21"/>
+          <w:szCs w:val="21"/>
+        </w:rPr>
+        <w:t xml:space="preserve">-</w:t>
+      </w:r>
+    </w:p>
+    <w:p>
+      <w:pPr>
+        <w:pBdr>
+          <w:bottom w:val="single" w:color="D9DBE5" w:sz="4" w:space="4"/>
+        </w:pBdr>
+        <w:spacing w:after="200"/>
+      </w:pPr>
+      <w:r>
+        <w:t xml:space="preserve"/>
       </w:r>
     </w:p>
     <w:p>
@@ -9603,7 +10207,7 @@
         <w:keepNext/>
       </w:pPr>
       <w:r>
-        <w:t xml:space="preserve">P2  Forms, validation and CRUD flows</w:t>
+        <w:t xml:space="preserve">#21  Handover prompts PDF</w:t>
       </w:r>
     </w:p>
     <w:p>
@@ -9617,7 +10221,7 @@
           <w:sz w:val="18"/>
           <w:szCs w:val="18"/>
         </w:rPr>
-        <w:t xml:space="preserve">Review 2  |  Planned prompt</w:t>
+        <w:t xml:space="preserve">Working prompt  |  2026-10-15</w:t>
       </w:r>
     </w:p>
     <w:p>
@@ -9651,7 +10255,7 @@
           <w:sz w:val="19"/>
           <w:szCs w:val="19"/>
         </w:rPr>
-        <w:t xml:space="preserve">Wire every form (register, login, expense add/edit, income, budget, recurring, category, group create, add member, shared expense, shopping list and item, profile, change password) to api.js. Use the Constraint Validation API plus custom rules (passwords match, date not in the future, budget greater than zero) with inline error messages linked by aria-describedby, and move focus to the first invalid field. Show a toast after each save and redirect afterwards (Post/Redirect/Get). Add password show/hide toggles with aria-pressed. Protect app pages: redirect to login.html when nobody is signed in.</w:t>
+        <w:t xml:space="preserve">Write docs/tools/build_handover_pdf.py (reusing the styles of build_prompt_pdf.py) to produce docs/SplitStack_Handover_Prompts.pdf: how to use it with Antigravity, one-time setup (tools, collaborator access, MongoDB Atlas, workflow token scope), a roadmap, Prompt 0 with the full project context, rules, logging, commit/push and gh-pages redeploy procedure, the 15 planned prompts P1-P15 expanded with concrete checks and commit messages, utility prompts (status, recovery, review rehearsal) and common problems. Render pages to check the layout.</w:t>
       </w:r>
     </w:p>
     <w:p>
@@ -9679,7 +10283,7 @@
           <w:sz w:val="21"/>
           <w:szCs w:val="21"/>
         </w:rPr>
-        <w:t xml:space="preserve">Cover the core JavaScript skills examiners look for: events, DOM manipulation, validation.</w:t>
+        <w:t xml:space="preserve">Give the teammate a self-contained, ordered set of prompts.</w:t>
       </w:r>
     </w:p>
     <w:p>
@@ -9696,6 +10300,56 @@
           <w:szCs w:val="17"/>
         </w:rPr>
         <w:t xml:space="preserve">FILES</w:t>
+      </w:r>
+    </w:p>
+    <w:p>
+      <w:pPr>
+        <w:pStyle w:val="ListParagraph"/>
+        <w:numPr>
+          <w:ilvl w:val="0"/>
+          <w:numId w:val="2"/>
+        </w:numPr>
+      </w:pPr>
+      <w:r>
+        <w:rPr>
+          <w:rFonts w:ascii="Consolas" w:cs="Consolas" w:eastAsia="Consolas" w:hAnsi="Consolas"/>
+          <w:sz w:val="19"/>
+          <w:szCs w:val="19"/>
+        </w:rPr>
+        <w:t xml:space="preserve">docs/tools/build_handover_pdf.py</w:t>
+      </w:r>
+    </w:p>
+    <w:p>
+      <w:pPr>
+        <w:pStyle w:val="ListParagraph"/>
+        <w:numPr>
+          <w:ilvl w:val="0"/>
+          <w:numId w:val="2"/>
+        </w:numPr>
+      </w:pPr>
+      <w:r>
+        <w:rPr>
+          <w:rFonts w:ascii="Consolas" w:cs="Consolas" w:eastAsia="Consolas" w:hAnsi="Consolas"/>
+          <w:sz w:val="19"/>
+          <w:szCs w:val="19"/>
+        </w:rPr>
+        <w:t xml:space="preserve">docs/SplitStack_Handover_Prompts.pdf</w:t>
+      </w:r>
+    </w:p>
+    <w:p>
+      <w:pPr>
+        <w:spacing w:after="60" w:before="160"/>
+      </w:pPr>
+      <w:r>
+        <w:rPr>
+          <w:b/>
+          <w:bCs/>
+          <w:color w:val="4F46E5"/>
+          <w:spacing w:val="20"/>
+          <w:sz w:val="17"/>
+          <w:szCs w:val="17"/>
+        </w:rPr>
+        <w:t xml:space="preserve">RESULT</w:t>
       </w:r>
     </w:p>
     <w:p>
@@ -9707,7 +10361,71 @@
           <w:sz w:val="21"/>
           <w:szCs w:val="21"/>
         </w:rPr>
-        <w:t xml:space="preserve">client/js/pages/*.js, client/js/ui/forms.js</w:t>
+        <w:t xml:space="preserve">14-page PDF created. Changes against the planned prompts: P1 adds data-page attributes and client/js/package.json (type module) for node --test; P13 keeps the localStorage implementation as a demo mode (api-local.js chosen when /api/health does not answer) so the GitHub Pages site keeps working, instead of deleting it; P9 replaces deprecated csurf with a synchronizer token; P14 uses MongoMemoryReplSet because the API uses transactions; P15 asks for confirmation before deleting the Flask files and leaves Render account steps to the student.</w:t>
+      </w:r>
+    </w:p>
+    <w:p>
+      <w:pPr>
+        <w:spacing w:after="60" w:before="160"/>
+      </w:pPr>
+      <w:r>
+        <w:rPr>
+          <w:b/>
+          <w:bCs/>
+          <w:color w:val="4F46E5"/>
+          <w:spacing w:val="20"/>
+          <w:sz w:val="17"/>
+          <w:szCs w:val="17"/>
+        </w:rPr>
+        <w:t xml:space="preserve">VERIFICATION</w:t>
+      </w:r>
+    </w:p>
+    <w:p>
+      <w:pPr>
+        <w:spacing w:after="80"/>
+      </w:pPr>
+      <w:r>
+        <w:rPr>
+          <w:sz w:val="21"/>
+          <w:szCs w:val="21"/>
+        </w:rPr>
+        <w:t xml:space="preserve">Rendered pages with PyMuPDF and checked the layout of the setup, Prompt 0, step and utility pages.</w:t>
+      </w:r>
+    </w:p>
+    <w:p>
+      <w:pPr>
+        <w:pBdr>
+          <w:bottom w:val="single" w:color="D9DBE5" w:sz="4" w:space="4"/>
+        </w:pBdr>
+        <w:spacing w:after="200"/>
+      </w:pPr>
+      <w:r>
+        <w:t xml:space="preserve"/>
+      </w:r>
+    </w:p>
+    <w:p>
+      <w:r>
+        <w:br w:type="page"/>
+      </w:r>
+    </w:p>
+    <w:p>
+      <w:pPr>
+        <w:pStyle w:val="Heading1"/>
+      </w:pPr>
+      <w:r>
+        <w:t xml:space="preserve">Planned prompts to complete the project</w:t>
+      </w:r>
+    </w:p>
+    <w:p>
+      <w:pPr>
+        <w:spacing w:after="80"/>
+      </w:pPr>
+      <w:r>
+        <w:rPr>
+          <w:sz w:val="21"/>
+          <w:szCs w:val="21"/>
+        </w:rPr>
+        <w:t xml:space="preserve">These prompts have not been run yet. Run them in order; after each one, move it into the log above with its result.</w:t>
       </w:r>
     </w:p>
     <w:p>
@@ -9716,7 +10434,7 @@
         <w:keepNext/>
       </w:pPr>
       <w:r>
-        <w:t xml:space="preserve">P3  Group splitting and the debt-simplification algorithm</w:t>
+        <w:t xml:space="preserve">P1  Forms, validation and CRUD flows</w:t>
       </w:r>
     </w:p>
     <w:p>
@@ -9764,7 +10482,7 @@
           <w:sz w:val="19"/>
           <w:szCs w:val="19"/>
         </w:rPr>
-        <w:t xml:space="preserve">In client/js/domain/splits.js implement equal splits in integer paise with the leftover paise assigned to the payer, and custom splits that must sum exactly to the total. On the shared-expense form show a live "remaining to assign" counter and disable submit until it reaches zero. In client/js/domain/settle.js implement net balances (paid minus share) and the greedy minimum-cash-flow algorithm: repeatedly match the largest debtor with the largest creditor and transfer min(debt, credit) until every balance is within one paisa; return the transfer list and the number of original pairwise debts. Render the settle-up page from it, and make "Mark paid" record a settlement and recompute balances. Add unit tests runnable with node --test using the Goa Trip example (balances +1700, -2500, +5700, -4900 give 3 transfers).</w:t>
+        <w:t xml:space="preserve">Wire every form (register, login, expense add/edit, income, budget, recurring, category, group create, add member, shared expense, shopping list and item, profile, change password) to api.js. Use the Constraint Validation API plus custom rules (passwords match, date not in the future, budget greater than zero) with inline error messages linked by aria-describedby, and move focus to the first invalid field. Show a toast after each save and redirect afterwards (Post/Redirect/Get). Add password show/hide toggles with aria-pressed. Protect app pages: redirect to login.html when nobody is signed in.</w:t>
       </w:r>
     </w:p>
     <w:p>
@@ -9792,7 +10510,7 @@
           <w:sz w:val="21"/>
           <w:szCs w:val="21"/>
         </w:rPr>
-        <w:t xml:space="preserve">Show algorithmic JavaScript, the core idea of SplitStack.</w:t>
+        <w:t xml:space="preserve">Cover the core JavaScript skills examiners look for: events, DOM manipulation, validation.</w:t>
       </w:r>
     </w:p>
     <w:p>
@@ -9820,7 +10538,7 @@
           <w:sz w:val="21"/>
           <w:szCs w:val="21"/>
         </w:rPr>
-        <w:t xml:space="preserve">client/js/domain/splits.js, client/js/domain/settle.js, tests/client/*.test.js</w:t>
+        <w:t xml:space="preserve">client/js/pages/*.js, client/js/ui/forms.js</w:t>
       </w:r>
     </w:p>
     <w:p>
@@ -9829,7 +10547,7 @@
         <w:keepNext/>
       </w:pPr>
       <w:r>
-        <w:t xml:space="preserve">P4  Charts, budgets, forecast, insights, search and notifications</w:t>
+        <w:t xml:space="preserve">P2  Group splitting and the debt-simplification algorithm</w:t>
       </w:r>
     </w:p>
     <w:p>
@@ -9877,7 +10595,7 @@
           <w:sz w:val="19"/>
           <w:szCs w:val="19"/>
         </w:rPr>
-        <w:t xml:space="preserve">Render the dashboard and analytics charts with Chart.js 4 loaded from a pinned CDN URL, reading colours from the CSS custom properties so both themes work, and keep the CSS charts as a fallback. Compute budget status (ok under 75%, caution 75-90%, warning 90-100%, danger over 100%) and update the meters. Port the spending forecast (average daily spend multiplied by the days in the month) to client/js/domain/forecast.js. Generate smart insights from the data (over-budget categories, month-over-month change, upcoming recurring bills). Make the topbar search show live results across expenses, groups and lists in a listbox with keyboard navigation, and make the bell open a notifications panel built from the insights with an unread count.</w:t>
+        <w:t xml:space="preserve">In client/js/domain/splits.js implement equal splits in integer paise with the leftover paise assigned to the payer, and custom splits that must sum exactly to the total. On the shared-expense form show a live "remaining to assign" counter and disable submit until it reaches zero. In client/js/domain/settle.js implement net balances (paid minus share) and the greedy minimum-cash-flow algorithm: repeatedly match the largest debtor with the largest creditor and transfer min(debt, credit) until every balance is within one paisa; return the transfer list and the number of original pairwise debts. Render the settle-up page from it, and make "Mark paid" record a settlement and recompute balances. Add unit tests runnable with node --test using the Goa Trip example (balances +1700, -2500, +5700, -4900 give 3 transfers).</w:t>
       </w:r>
     </w:p>
     <w:p>
@@ -9905,7 +10623,7 @@
           <w:sz w:val="21"/>
           <w:szCs w:val="21"/>
         </w:rPr>
-        <w:t xml:space="preserve">Finish the interactive features that were disconnected in the original app.</w:t>
+        <w:t xml:space="preserve">Show algorithmic JavaScript, the core idea of SplitStack.</w:t>
       </w:r>
     </w:p>
     <w:p>
@@ -9933,7 +10651,7 @@
           <w:sz w:val="21"/>
           <w:szCs w:val="21"/>
         </w:rPr>
-        <w:t xml:space="preserve">client/js/pages/dashboard.js, client/js/pages/analytics.js, client/js/domain/forecast.js, client/js/ui/search.js, client/js/ui/notifications.js</w:t>
+        <w:t xml:space="preserve">client/js/domain/splits.js, client/js/domain/settle.js, tests/client/*.test.js</w:t>
       </w:r>
     </w:p>
     <w:p>
@@ -9942,7 +10660,7 @@
         <w:keepNext/>
       </w:pPr>
       <w:r>
-        <w:t xml:space="preserve">P5  Shopping checklist and receipt scan preview</w:t>
+        <w:t xml:space="preserve">P3  Charts, budgets, forecast, insights, search and notifications</w:t>
       </w:r>
     </w:p>
     <w:p>
@@ -9990,7 +10708,7 @@
           <w:sz w:val="19"/>
           <w:szCs w:val="19"/>
         </w:rPr>
-        <w:t xml:space="preserve">Make the shopping checklist toggle items with optimistic UI, edit actual prices inline, recompute the estimated, actual and variance totals live, and convert the list to an expense only once (prevent duplicates). On the receipt scan page add drag-and-drop with dragenter/dragleave styling, client-side checks (PNG, JPEG or WEBP, up to 5 MB) and an image preview via URL.createObjectURL. Until the backend exists, run OCR in the browser with tesseract.js from a pinned CDN, parse the merchant, date and total with regular expressions (prefer the line containing TOTAL), show progress, and pre-fill the confirm form.</w:t>
+        <w:t xml:space="preserve">Render the dashboard and analytics charts with Chart.js 4 loaded from a pinned CDN URL, reading colours from the CSS custom properties so both themes work, and keep the CSS charts as a fallback. Compute budget status (ok under 75%, caution 75-90%, warning 90-100%, danger over 100%) and update the meters. Port the spending forecast (average daily spend multiplied by the days in the month) to client/js/domain/forecast.js. Generate smart insights from the data (over-budget categories, month-over-month change, upcoming recurring bills). Make the topbar search show live results across expenses, groups and lists in a listbox with keyboard navigation, and make the bell open a notifications panel built from the insights with an unread count.</w:t>
       </w:r>
     </w:p>
     <w:p>
@@ -10018,7 +10736,7 @@
           <w:sz w:val="21"/>
           <w:szCs w:val="21"/>
         </w:rPr>
-        <w:t xml:space="preserve">Complete the remaining interactive flows.</w:t>
+        <w:t xml:space="preserve">Finish the interactive features that were disconnected in the original app.</w:t>
       </w:r>
     </w:p>
     <w:p>
@@ -10046,7 +10764,7 @@
           <w:sz w:val="21"/>
           <w:szCs w:val="21"/>
         </w:rPr>
-        <w:t xml:space="preserve">client/js/pages/shopping-detail.js, client/js/pages/receipt-scan.js, client/js/domain/receipt-parser.js</w:t>
+        <w:t xml:space="preserve">client/js/pages/dashboard.js, client/js/pages/analytics.js, client/js/domain/forecast.js, client/js/ui/search.js, client/js/ui/notifications.js</w:t>
       </w:r>
     </w:p>
     <w:p>
@@ -10055,7 +10773,7 @@
         <w:keepNext/>
       </w:pPr>
       <w:r>
-        <w:t xml:space="preserve">P6  Review 2 QA, log and commit</w:t>
+        <w:t xml:space="preserve">P4  Shopping checklist and receipt scan preview</w:t>
       </w:r>
     </w:p>
     <w:p>
@@ -10103,7 +10821,7 @@
           <w:sz w:val="19"/>
           <w:szCs w:val="19"/>
         </w:rPr>
-        <w:t xml:space="preserve">Run ESLint (recommended rules, browser globals, ES2023 modules) over client/js and fix every finding; run the domain unit tests; test every page manually at 1366px and 375px in dark and light themes, using only the keyboard, and with JavaScript disabled (pages must still show their static content). Update client/README.md with the JavaScript architecture and a table of the JS concepts used and where. Add each step to docs/prompt_log.json, rebuild the Word and PDF logs, and commit "Review 2".</w:t>
+        <w:t xml:space="preserve">Make the shopping checklist toggle items with optimistic UI, edit actual prices inline, recompute the estimated, actual and variance totals live, and convert the list to an expense only once (prevent duplicates). On the receipt scan page add drag-and-drop with dragenter/dragleave styling, client-side checks (PNG, JPEG or WEBP, up to 5 MB) and an image preview via URL.createObjectURL. Until the backend exists, run OCR in the browser with tesseract.js from a pinned CDN, parse the merchant, date and total with regular expressions (prefer the line containing TOTAL), show progress, and pre-fill the confirm form.</w:t>
       </w:r>
     </w:p>
     <w:p>
@@ -10131,7 +10849,7 @@
           <w:sz w:val="21"/>
           <w:szCs w:val="21"/>
         </w:rPr>
-        <w:t xml:space="preserve">Close Review 2 with evidence.</w:t>
+        <w:t xml:space="preserve">Complete the remaining interactive flows.</w:t>
       </w:r>
     </w:p>
     <w:p>
@@ -10159,7 +10877,7 @@
           <w:sz w:val="21"/>
           <w:szCs w:val="21"/>
         </w:rPr>
-        <w:t xml:space="preserve">eslint.config.js, client/README.md, docs/*</w:t>
+        <w:t xml:space="preserve">client/js/pages/shopping-detail.js, client/js/pages/receipt-scan.js, client/js/domain/receipt-parser.js</w:t>
       </w:r>
     </w:p>
     <w:p>
@@ -10168,7 +10886,7 @@
         <w:keepNext/>
       </w:pPr>
       <w:r>
-        <w:t xml:space="preserve">P7  Express server and MongoDB connection</w:t>
+        <w:t xml:space="preserve">P5  Review 2 QA, log and commit</w:t>
       </w:r>
     </w:p>
     <w:p>
@@ -10182,7 +10900,7 @@
           <w:sz w:val="18"/>
           <w:szCs w:val="18"/>
         </w:rPr>
-        <w:t xml:space="preserve">Review 3  |  Planned prompt</w:t>
+        <w:t xml:space="preserve">Review 2  |  Planned prompt</w:t>
       </w:r>
     </w:p>
     <w:p>
@@ -10216,7 +10934,7 @@
           <w:sz w:val="19"/>
           <w:szCs w:val="19"/>
         </w:rPr>
-        <w:t xml:space="preserve">Create server/ as a Node.js 20+ project (ES modules) with Express: server/src/app.js (helmet with a Content Security Policy that allows only the CDNs in use, compression, express.json, express-session stored with connect-mongo, express-rate-limit on auth and upload routes, a CSRF token check on state-changing requests, and a central error handler returning JSON {error, fields}), server/src/index.js (connect to MongoDB Atlas with Mongoose using MONGODB_URI from server/.env, then listen), and static serving of client/. Add server/.env.example (MONGODB_URI, SESSION_SECRET of at least 32 characters, PORT) and npm scripts dev (node --watch) and start. Never commit .env.</w:t>
+        <w:t xml:space="preserve">Run ESLint (recommended rules, browser globals, ES2023 modules) over client/js and fix every finding; run the domain unit tests; test every page manually at 1366px and 375px in dark and light themes, using only the keyboard, and with JavaScript disabled (pages must still show their static content). Update client/README.md with the JavaScript architecture and a table of the JS concepts used and where. Add each step to docs/prompt_log.json, rebuild the Word and PDF logs, and commit "Review 2".</w:t>
       </w:r>
     </w:p>
     <w:p>
@@ -10244,7 +10962,7 @@
           <w:sz w:val="21"/>
           <w:szCs w:val="21"/>
         </w:rPr>
-        <w:t xml:space="preserve">Start Review 3 with a secure, conventional Express setup.</w:t>
+        <w:t xml:space="preserve">Close Review 2 with evidence.</w:t>
       </w:r>
     </w:p>
     <w:p>
@@ -10272,7 +10990,7 @@
           <w:sz w:val="21"/>
           <w:szCs w:val="21"/>
         </w:rPr>
-        <w:t xml:space="preserve">server/package.json, server/src/app.js, server/src/index.js, server/.env.example</w:t>
+        <w:t xml:space="preserve">eslint.config.js, client/README.md, docs/*</w:t>
       </w:r>
     </w:p>
     <w:p>
@@ -10281,7 +10999,7 @@
         <w:keepNext/>
       </w:pPr>
       <w:r>
-        <w:t xml:space="preserve">P8  Mongoose data models</w:t>
+        <w:t xml:space="preserve">P6  Express server and MongoDB connection</w:t>
       </w:r>
     </w:p>
     <w:p>
@@ -10329,7 +11047,7 @@
           <w:sz w:val="19"/>
           <w:szCs w:val="19"/>
         </w:rPr>
-        <w:t xml:space="preserve">Design Mongoose schemas with validation and indexes to replace the 15 SQLite tables: User (name, email unique and lowercase, passwordHash, preferences), Category (user, or null for defaults; name; type expense or income; icon; color), Expense and Income (user, category, amount stored as integer paise, date, description or source, paymentMethod), Budget (user, category or null, month, year, limit; unique on user+category+month+year), Recurring (name, amount, frequency, startDate, nextDueDate, active), Group (name, description, createdBy, members [{user, role admin|member, joinedAt}]), SharedExpense (group, title, amount, paidBy, category, date, splitType, shares [{user, amount}] with a validator that the shares sum to the amount), Settlement (group, payer, payee, amount, status, completedAt), ShoppingList (owner, optional group, name, budget, items [{name, quantity, estimatedPrice, actualPrice, purchased, assignedTo}], convertedExpense), Receipt (user, file reference, merchant, date, amount, rawText, confidence) and Insight (user, kind, message, read). Explain in comments which data is embedded and which is referenced, and why.</w:t>
+        <w:t xml:space="preserve">Create server/ as a Node.js 20+ project (ES modules) with Express: server/src/app.js (helmet with a Content Security Policy that allows only the CDNs in use, compression, express.json, express-session stored with connect-mongo, express-rate-limit on auth and upload routes, a CSRF token check on state-changing requests, and a central error handler returning JSON {error, fields}), server/src/index.js (connect to MongoDB Atlas with Mongoose using MONGODB_URI from server/.env, then listen), and static serving of client/. Add server/.env.example (MONGODB_URI, SESSION_SECRET of at least 32 characters, PORT) and npm scripts dev (node --watch) and start. Never commit .env.</w:t>
       </w:r>
     </w:p>
     <w:p>
@@ -10357,7 +11075,7 @@
           <w:sz w:val="21"/>
           <w:szCs w:val="21"/>
         </w:rPr>
-        <w:t xml:space="preserve">Show MongoDB data modelling, the core of Review 3.</w:t>
+        <w:t xml:space="preserve">Start Review 3 with a secure, conventional Express setup.</w:t>
       </w:r>
     </w:p>
     <w:p>
@@ -10385,7 +11103,7 @@
           <w:sz w:val="21"/>
           <w:szCs w:val="21"/>
         </w:rPr>
-        <w:t xml:space="preserve">server/src/models/*.js</w:t>
+        <w:t xml:space="preserve">server/package.json, server/src/app.js, server/src/index.js, server/.env.example</w:t>
       </w:r>
     </w:p>
     <w:p>
@@ -10394,7 +11112,7 @@
         <w:keepNext/>
       </w:pPr>
       <w:r>
-        <w:t xml:space="preserve">P9  Authentication and REST API</w:t>
+        <w:t xml:space="preserve">P7  Mongoose data models</w:t>
       </w:r>
     </w:p>
     <w:p>
@@ -10442,7 +11160,7 @@
           <w:sz w:val="19"/>
           <w:szCs w:val="19"/>
         </w:rPr>
-        <w:t xml:space="preserve">Implement the REST API under /api with one express.Router per module, mirroring the 48 legacy Flask routes: /api/auth (register with bcrypt cost 12, login, logout, me), /api/expenses, /api/income, /api/categories, /api/budgets, /api/recurring (including toggle), /api/groups (members, shared expenses, balances, settlements, leave), /api/shopping (lists, items, toggle, convert to expense), /api/analytics (monthly, categories, forecast, insights) and /api/search. Validate every input with a schema (zod or express-validator), check ownership or group membership on every request, use MongoDB transactions for multi-document writes (recording a settlement, converting a list), and reuse the Review 2 settle.js and splits.js modules on the server so the algorithm has a single implementation.</w:t>
+        <w:t xml:space="preserve">Design Mongoose schemas with validation and indexes to replace the 15 SQLite tables: User (name, email unique and lowercase, passwordHash, preferences), Category (user, or null for defaults; name; type expense or income; icon; color), Expense and Income (user, category, amount stored as integer paise, date, description or source, paymentMethod), Budget (user, category or null, month, year, limit; unique on user+category+month+year), Recurring (name, amount, frequency, startDate, nextDueDate, active), Group (name, description, createdBy, members [{user, role admin|member, joinedAt}]), SharedExpense (group, title, amount, paidBy, category, date, splitType, shares [{user, amount}] with a validator that the shares sum to the amount), Settlement (group, payer, payee, amount, status, completedAt), ShoppingList (owner, optional group, name, budget, items [{name, quantity, estimatedPrice, actualPrice, purchased, assignedTo}], convertedExpense), Receipt (user, file reference, merchant, date, amount, rawText, confidence) and Insight (user, kind, message, read). Explain in comments which data is embedded and which is referenced, and why.</w:t>
       </w:r>
     </w:p>
     <w:p>
@@ -10470,7 +11188,7 @@
           <w:sz w:val="21"/>
           <w:szCs w:val="21"/>
         </w:rPr>
-        <w:t xml:space="preserve">Deliver the Node.js back end with a complete, secure API.</w:t>
+        <w:t xml:space="preserve">Show MongoDB data modelling, the core of Review 3.</w:t>
       </w:r>
     </w:p>
     <w:p>
@@ -10498,7 +11216,7 @@
           <w:sz w:val="21"/>
           <w:szCs w:val="21"/>
         </w:rPr>
-        <w:t xml:space="preserve">server/src/routes/*.js, server/src/services/*.js, server/src/middleware/*.js</w:t>
+        <w:t xml:space="preserve">server/src/models/*.js</w:t>
       </w:r>
     </w:p>
     <w:p>
@@ -10507,7 +11225,7 @@
         <w:keepNext/>
       </w:pPr>
       <w:r>
-        <w:t xml:space="preserve">P10  Receipt upload and server-side OCR</w:t>
+        <w:t xml:space="preserve">P8  Authentication and REST API</w:t>
       </w:r>
     </w:p>
     <w:p>
@@ -10555,7 +11273,7 @@
           <w:sz w:val="19"/>
           <w:szCs w:val="19"/>
         </w:rPr>
-        <w:t xml:space="preserve">Add POST /api/receipts using multer with memory storage, a 5 MB limit and magic-byte checks for PNG, JPEG and WEBP; preprocess with sharp (rotate from EXIF, greyscale, upscale small images, normalise); run tesseract.js with one shared worker; parse the merchant, date and total with the Review 2 parser; store the image in MongoDB GridFS (so it survives redeploys on free hosting) and the parsed fields in Receipt. GET /api/receipts/:id/image streams the image only to its owner. Confirming creates the expense; nothing becomes an expense without confirmation.</w:t>
+        <w:t xml:space="preserve">Implement the REST API under /api with one express.Router per module, mirroring the 48 legacy Flask routes: /api/auth (register with bcrypt cost 12, login, logout, me), /api/expenses, /api/income, /api/categories, /api/budgets, /api/recurring (including toggle), /api/groups (members, shared expenses, balances, settlements, leave), /api/shopping (lists, items, toggle, convert to expense), /api/analytics (monthly, categories, forecast, insights) and /api/search. Validate every input with a schema (zod or express-validator), check ownership or group membership on every request, use MongoDB transactions for multi-document writes (recording a settlement, converting a list), and reuse the Review 2 settle.js and splits.js modules on the server so the algorithm has a single implementation.</w:t>
       </w:r>
     </w:p>
     <w:p>
@@ -10583,7 +11301,7 @@
           <w:sz w:val="21"/>
           <w:szCs w:val="21"/>
         </w:rPr>
-        <w:t xml:space="preserve">Port the OCR feature to Node with persistent storage.</w:t>
+        <w:t xml:space="preserve">Deliver the Node.js back end with a complete, secure API.</w:t>
       </w:r>
     </w:p>
     <w:p>
@@ -10611,7 +11329,7 @@
           <w:sz w:val="21"/>
           <w:szCs w:val="21"/>
         </w:rPr>
-        <w:t xml:space="preserve">server/src/routes/receipts.js, server/src/services/ocr.js</w:t>
+        <w:t xml:space="preserve">server/src/routes/*.js, server/src/services/*.js, server/src/middleware/*.js</w:t>
       </w:r>
     </w:p>
     <w:p>
@@ -10620,7 +11338,7 @@
         <w:keepNext/>
       </w:pPr>
       <w:r>
-        <w:t xml:space="preserve">P11  Connect the client to the API</w:t>
+        <w:t xml:space="preserve">P9  Receipt upload and server-side OCR</w:t>
       </w:r>
     </w:p>
     <w:p>
@@ -10668,7 +11386,7 @@
           <w:sz w:val="19"/>
           <w:szCs w:val="19"/>
         </w:rPr>
-        <w:t xml:space="preserve">Re-implement client/js/data/api.js with fetch() against /api, sending credentials and the CSRF token header, mapping HTTP errors to the same {field, message} errors the pages already handle, and showing a toast when offline. Remove the localStorage store except for the theme preference. Because the page code depends only on api.js, no page module should need changes; confirm this by running every flow end to end against a local server connected to Atlas.</w:t>
+        <w:t xml:space="preserve">Add POST /api/receipts using multer with memory storage, a 5 MB limit and magic-byte checks for PNG, JPEG and WEBP; preprocess with sharp (rotate from EXIF, greyscale, upscale small images, normalise); run tesseract.js with one shared worker; parse the merchant, date and total with the Review 2 parser; store the image in MongoDB GridFS (so it survives redeploys on free hosting) and the parsed fields in Receipt. GET /api/receipts/:id/image streams the image only to its owner. Confirming creates the expense; nothing becomes an expense without confirmation.</w:t>
       </w:r>
     </w:p>
     <w:p>
@@ -10696,7 +11414,7 @@
           <w:sz w:val="21"/>
           <w:szCs w:val="21"/>
         </w:rPr>
-        <w:t xml:space="preserve">Finish the full-stack integration.</w:t>
+        <w:t xml:space="preserve">Port the OCR feature to Node with persistent storage.</w:t>
       </w:r>
     </w:p>
     <w:p>
@@ -10724,7 +11442,7 @@
           <w:sz w:val="21"/>
           <w:szCs w:val="21"/>
         </w:rPr>
-        <w:t xml:space="preserve">client/js/data/api.js</w:t>
+        <w:t xml:space="preserve">server/src/routes/receipts.js, server/src/services/ocr.js</w:t>
       </w:r>
     </w:p>
     <w:p>
@@ -10733,7 +11451,7 @@
         <w:keepNext/>
       </w:pPr>
       <w:r>
-        <w:t xml:space="preserve">P12  Seed data and automated tests</w:t>
+        <w:t xml:space="preserve">P10  Connect the client to the API</w:t>
       </w:r>
     </w:p>
     <w:p>
@@ -10781,7 +11499,7 @@
           <w:sz w:val="19"/>
           <w:szCs w:val="19"/>
         </w:rPr>
-        <w:t xml:space="preserve">Add server/scripts/seed.js that creates the demo user, categories, six months of expenses and income, budgets, recurring payments, the three groups with shared expenses, and shopping lists. It must be idempotent and must refuse to run against a database whose name does not end in -dev or -test unless --force is passed. Write Jest + Supertest tests using mongodb-memory-server for auth, ownership checks, CSRF rejection, rate limiting, split validation, the settlement algorithm, budget status, convert-to-expense duplicate prevention and receipt upload validation, covering what the 47 legacy Python tests checked. Add an npm test script and a GitHub Actions workflow that runs lint and tests on every push.</w:t>
+        <w:t xml:space="preserve">Re-implement client/js/data/api.js with fetch() against /api, sending credentials and the CSRF token header, mapping HTTP errors to the same {field, message} errors the pages already handle, and showing a toast when offline. Remove the localStorage store except for the theme preference. Because the page code depends only on api.js, no page module should need changes; confirm this by running every flow end to end against a local server connected to Atlas.</w:t>
       </w:r>
     </w:p>
     <w:p>
@@ -10809,7 +11527,7 @@
           <w:sz w:val="21"/>
           <w:szCs w:val="21"/>
         </w:rPr>
-        <w:t xml:space="preserve">Prove the back end works and keep it working.</w:t>
+        <w:t xml:space="preserve">Finish the full-stack integration.</w:t>
       </w:r>
     </w:p>
     <w:p>
@@ -10837,7 +11555,7 @@
           <w:sz w:val="21"/>
           <w:szCs w:val="21"/>
         </w:rPr>
-        <w:t xml:space="preserve">server/scripts/seed.js, server/tests/*.test.js, .github/workflows/ci.yml</w:t>
+        <w:t xml:space="preserve">client/js/data/api.js</w:t>
       </w:r>
     </w:p>
     <w:p>
@@ -10846,7 +11564,120 @@
         <w:keepNext/>
       </w:pPr>
       <w:r>
-        <w:t xml:space="preserve">P13  Remove legacy code, document and deploy</w:t>
+        <w:t xml:space="preserve">P11  Seed data and automated tests</w:t>
+      </w:r>
+    </w:p>
+    <w:p>
+      <w:pPr>
+        <w:keepNext/>
+        <w:spacing w:after="60"/>
+      </w:pPr>
+      <w:r>
+        <w:rPr>
+          <w:color w:val="5B6475"/>
+          <w:sz w:val="18"/>
+          <w:szCs w:val="18"/>
+        </w:rPr>
+        <w:t xml:space="preserve">Review 3  |  Planned prompt</w:t>
+      </w:r>
+    </w:p>
+    <w:p>
+      <w:pPr>
+        <w:spacing w:after="60" w:before="160"/>
+      </w:pPr>
+      <w:r>
+        <w:rPr>
+          <w:b/>
+          <w:bCs/>
+          <w:color w:val="4F46E5"/>
+          <w:spacing w:val="20"/>
+          <w:sz w:val="17"/>
+          <w:szCs w:val="17"/>
+        </w:rPr>
+        <w:t xml:space="preserve">PROMPT</w:t>
+      </w:r>
+    </w:p>
+    <w:p>
+      <w:pPr>
+        <w:pBdr>
+          <w:left w:val="single" w:color="4F46E5" w:sz="18" w:space="8"/>
+        </w:pBdr>
+        <w:shd w:fill="F1F2F8" w:color="auto" w:val="clear"/>
+        <w:spacing w:after="120" w:before="40" w:line="276"/>
+        <w:ind w:left="160" w:right="160"/>
+      </w:pPr>
+      <w:r>
+        <w:rPr>
+          <w:rFonts w:ascii="Consolas" w:cs="Consolas" w:eastAsia="Consolas" w:hAnsi="Consolas"/>
+          <w:sz w:val="19"/>
+          <w:szCs w:val="19"/>
+        </w:rPr>
+        <w:t xml:space="preserve">Add server/scripts/seed.js that creates the demo user, categories, six months of expenses and income, budgets, recurring payments, the three groups with shared expenses, and shopping lists. It must be idempotent and must refuse to run against a database whose name does not end in -dev or -test unless --force is passed. Write Jest + Supertest tests using mongodb-memory-server for auth, ownership checks, CSRF rejection, rate limiting, split validation, the settlement algorithm, budget status, convert-to-expense duplicate prevention and receipt upload validation, covering what the 47 legacy Python tests checked. Add an npm test script and a GitHub Actions workflow that runs lint and tests on every push.</w:t>
+      </w:r>
+    </w:p>
+    <w:p>
+      <w:pPr>
+        <w:spacing w:after="60" w:before="160"/>
+      </w:pPr>
+      <w:r>
+        <w:rPr>
+          <w:b/>
+          <w:bCs/>
+          <w:color w:val="4F46E5"/>
+          <w:spacing w:val="20"/>
+          <w:sz w:val="17"/>
+          <w:szCs w:val="17"/>
+        </w:rPr>
+        <w:t xml:space="preserve">PURPOSE</w:t>
+      </w:r>
+    </w:p>
+    <w:p>
+      <w:pPr>
+        <w:spacing w:after="80"/>
+      </w:pPr>
+      <w:r>
+        <w:rPr>
+          <w:sz w:val="21"/>
+          <w:szCs w:val="21"/>
+        </w:rPr>
+        <w:t xml:space="preserve">Prove the back end works and keep it working.</w:t>
+      </w:r>
+    </w:p>
+    <w:p>
+      <w:pPr>
+        <w:spacing w:after="60" w:before="160"/>
+      </w:pPr>
+      <w:r>
+        <w:rPr>
+          <w:b/>
+          <w:bCs/>
+          <w:color w:val="4F46E5"/>
+          <w:spacing w:val="20"/>
+          <w:sz w:val="17"/>
+          <w:szCs w:val="17"/>
+        </w:rPr>
+        <w:t xml:space="preserve">FILES</w:t>
+      </w:r>
+    </w:p>
+    <w:p>
+      <w:pPr>
+        <w:spacing w:after="80"/>
+      </w:pPr>
+      <w:r>
+        <w:rPr>
+          <w:sz w:val="21"/>
+          <w:szCs w:val="21"/>
+        </w:rPr>
+        <w:t xml:space="preserve">server/scripts/seed.js, server/tests/*.test.js, .github/workflows/ci.yml</w:t>
+      </w:r>
+    </w:p>
+    <w:p>
+      <w:pPr>
+        <w:pStyle w:val="Heading3"/>
+        <w:keepNext/>
+      </w:pPr>
+      <w:r>
+        <w:t xml:space="preserve">P12  Remove legacy code, document and deploy</w:t>
       </w:r>
     </w:p>
     <w:p>

</xml_diff>

<commit_message>
Review 2: forms, validation and CRUD flows
</commit_message>
<xml_diff>
--- a/docs/SplitStack_Prompt_Log.docx
+++ b/docs/SplitStack_Prompt_Log.docx
@@ -132,7 +132,7 @@
           <w:sz w:val="21"/>
           <w:szCs w:val="21"/>
         </w:rPr>
-        <w:t xml:space="preserve">27</w:t>
+        <w:t xml:space="preserve">29</w:t>
       </w:r>
     </w:p>
     <w:p>
@@ -568,7 +568,7 @@
                 <w:sz w:val="18"/>
                 <w:szCs w:val="18"/>
               </w:rPr>
-              <w:t xml:space="preserve">6</w:t>
+              <w:t xml:space="preserve">8</w:t>
             </w:r>
           </w:p>
         </w:tc>
@@ -4096,6 +4096,245 @@
           </w:p>
         </w:tc>
       </w:tr>
+      <w:tr>
+        <w:tc>
+          <w:tcPr>
+            <w:tcW w:type="dxa" w:w="700"/>
+            <w:shd w:fill="F7F7FB" w:color="auto" w:val="clear"/>
+            <w:tcMar>
+              <w:top w:type="dxa" w:w="60"/>
+              <w:left w:type="dxa" w:w="100"/>
+              <w:bottom w:type="dxa" w:w="60"/>
+              <w:right w:type="dxa" w:w="100"/>
+            </w:tcMar>
+          </w:tcPr>
+          <w:p>
+            <w:r>
+              <w:rPr>
+                <w:b w:val="false"/>
+                <w:bCs w:val="false"/>
+                <w:color w:val="222222"/>
+                <w:sz w:val="18"/>
+                <w:szCs w:val="18"/>
+              </w:rPr>
+              <w:t xml:space="preserve">28</w:t>
+            </w:r>
+          </w:p>
+        </w:tc>
+        <w:tc>
+          <w:tcPr>
+            <w:tcW w:type="dxa" w:w="1500"/>
+            <w:shd w:fill="F7F7FB" w:color="auto" w:val="clear"/>
+            <w:tcMar>
+              <w:top w:type="dxa" w:w="60"/>
+              <w:left w:type="dxa" w:w="100"/>
+              <w:bottom w:type="dxa" w:w="60"/>
+              <w:right w:type="dxa" w:w="100"/>
+            </w:tcMar>
+          </w:tcPr>
+          <w:p>
+            <w:r>
+              <w:rPr>
+                <w:b w:val="false"/>
+                <w:bCs w:val="false"/>
+                <w:color w:val="222222"/>
+                <w:sz w:val="18"/>
+                <w:szCs w:val="18"/>
+              </w:rPr>
+              <w:t xml:space="preserve">Review 2</w:t>
+            </w:r>
+          </w:p>
+        </w:tc>
+        <w:tc>
+          <w:tcPr>
+            <w:tcW w:type="dxa" w:w="4538"/>
+            <w:shd w:fill="F7F7FB" w:color="auto" w:val="clear"/>
+            <w:tcMar>
+              <w:top w:type="dxa" w:w="60"/>
+              <w:left w:type="dxa" w:w="100"/>
+              <w:bottom w:type="dxa" w:w="60"/>
+              <w:right w:type="dxa" w:w="100"/>
+            </w:tcMar>
+          </w:tcPr>
+          <w:p>
+            <w:r>
+              <w:rPr>
+                <w:b w:val="false"/>
+                <w:bCs w:val="false"/>
+                <w:color w:val="222222"/>
+                <w:sz w:val="18"/>
+                <w:szCs w:val="18"/>
+              </w:rPr>
+              <w:t xml:space="preserve">Request: proceed with Review 2 Step P4</w:t>
+            </w:r>
+          </w:p>
+        </w:tc>
+        <w:tc>
+          <w:tcPr>
+            <w:tcW w:type="dxa" w:w="1500"/>
+            <w:shd w:fill="F7F7FB" w:color="auto" w:val="clear"/>
+            <w:tcMar>
+              <w:top w:type="dxa" w:w="60"/>
+              <w:left w:type="dxa" w:w="100"/>
+              <w:bottom w:type="dxa" w:w="60"/>
+              <w:right w:type="dxa" w:w="100"/>
+            </w:tcMar>
+          </w:tcPr>
+          <w:p>
+            <w:r>
+              <w:rPr>
+                <w:b w:val="false"/>
+                <w:bCs w:val="false"/>
+                <w:color w:val="222222"/>
+                <w:sz w:val="18"/>
+                <w:szCs w:val="18"/>
+              </w:rPr>
+              <w:t xml:space="preserve">User prompt</w:t>
+            </w:r>
+          </w:p>
+        </w:tc>
+        <w:tc>
+          <w:tcPr>
+            <w:tcW w:type="dxa" w:w="1400"/>
+            <w:shd w:fill="F7F7FB" w:color="auto" w:val="clear"/>
+            <w:tcMar>
+              <w:top w:type="dxa" w:w="60"/>
+              <w:left w:type="dxa" w:w="100"/>
+              <w:bottom w:type="dxa" w:w="60"/>
+              <w:right w:type="dxa" w:w="100"/>
+            </w:tcMar>
+          </w:tcPr>
+          <w:p>
+            <w:r>
+              <w:rPr>
+                <w:b w:val="false"/>
+                <w:bCs w:val="false"/>
+                <w:color w:val="222222"/>
+                <w:sz w:val="18"/>
+                <w:szCs w:val="18"/>
+              </w:rPr>
+              <w:t xml:space="preserve">2026-10-16</w:t>
+            </w:r>
+          </w:p>
+        </w:tc>
+      </w:tr>
+      <w:tr>
+        <w:tc>
+          <w:tcPr>
+            <w:tcW w:type="dxa" w:w="700"/>
+            <w:tcMar>
+              <w:top w:type="dxa" w:w="60"/>
+              <w:left w:type="dxa" w:w="100"/>
+              <w:bottom w:type="dxa" w:w="60"/>
+              <w:right w:type="dxa" w:w="100"/>
+            </w:tcMar>
+          </w:tcPr>
+          <w:p>
+            <w:r>
+              <w:rPr>
+                <w:b w:val="false"/>
+                <w:bCs w:val="false"/>
+                <w:color w:val="222222"/>
+                <w:sz w:val="18"/>
+                <w:szCs w:val="18"/>
+              </w:rPr>
+              <w:t xml:space="preserve">29</w:t>
+            </w:r>
+          </w:p>
+        </w:tc>
+        <w:tc>
+          <w:tcPr>
+            <w:tcW w:type="dxa" w:w="1500"/>
+            <w:tcMar>
+              <w:top w:type="dxa" w:w="60"/>
+              <w:left w:type="dxa" w:w="100"/>
+              <w:bottom w:type="dxa" w:w="60"/>
+              <w:right w:type="dxa" w:w="100"/>
+            </w:tcMar>
+          </w:tcPr>
+          <w:p>
+            <w:r>
+              <w:rPr>
+                <w:b w:val="false"/>
+                <w:bCs w:val="false"/>
+                <w:color w:val="222222"/>
+                <w:sz w:val="18"/>
+                <w:szCs w:val="18"/>
+              </w:rPr>
+              <w:t xml:space="preserve">Review 2</w:t>
+            </w:r>
+          </w:p>
+        </w:tc>
+        <w:tc>
+          <w:tcPr>
+            <w:tcW w:type="dxa" w:w="4538"/>
+            <w:tcMar>
+              <w:top w:type="dxa" w:w="60"/>
+              <w:left w:type="dxa" w:w="100"/>
+              <w:bottom w:type="dxa" w:w="60"/>
+              <w:right w:type="dxa" w:w="100"/>
+            </w:tcMar>
+          </w:tcPr>
+          <w:p>
+            <w:r>
+              <w:rPr>
+                <w:b w:val="false"/>
+                <w:bCs w:val="false"/>
+                <w:color w:val="222222"/>
+                <w:sz w:val="18"/>
+                <w:szCs w:val="18"/>
+              </w:rPr>
+              <w:t xml:space="preserve">Forms, validation and CRUD flows</w:t>
+            </w:r>
+          </w:p>
+        </w:tc>
+        <w:tc>
+          <w:tcPr>
+            <w:tcW w:type="dxa" w:w="1500"/>
+            <w:tcMar>
+              <w:top w:type="dxa" w:w="60"/>
+              <w:left w:type="dxa" w:w="100"/>
+              <w:bottom w:type="dxa" w:w="60"/>
+              <w:right w:type="dxa" w:w="100"/>
+            </w:tcMar>
+          </w:tcPr>
+          <w:p>
+            <w:r>
+              <w:rPr>
+                <w:b w:val="false"/>
+                <w:bCs w:val="false"/>
+                <w:color w:val="222222"/>
+                <w:sz w:val="18"/>
+                <w:szCs w:val="18"/>
+              </w:rPr>
+              <w:t xml:space="preserve">Working prompt</w:t>
+            </w:r>
+          </w:p>
+        </w:tc>
+        <w:tc>
+          <w:tcPr>
+            <w:tcW w:type="dxa" w:w="1400"/>
+            <w:tcMar>
+              <w:top w:type="dxa" w:w="60"/>
+              <w:left w:type="dxa" w:w="100"/>
+              <w:bottom w:type="dxa" w:w="60"/>
+              <w:right w:type="dxa" w:w="100"/>
+            </w:tcMar>
+          </w:tcPr>
+          <w:p>
+            <w:r>
+              <w:rPr>
+                <w:b w:val="false"/>
+                <w:bCs w:val="false"/>
+                <w:color w:val="222222"/>
+                <w:sz w:val="18"/>
+                <w:szCs w:val="18"/>
+              </w:rPr>
+              <w:t xml:space="preserve">2026-10-16</w:t>
+            </w:r>
+          </w:p>
+        </w:tc>
+      </w:tr>
     </w:tbl>
     <w:p>
       <w:r>
@@ -8544,20 +8783,11 @@
     </w:p>
     <w:p>
       <w:pPr>
-        <w:pStyle w:val="Heading2"/>
-        <w:spacing w:before="360"/>
-      </w:pPr>
-      <w:r>
-        <w:t xml:space="preserve">Wrap-up - Documentation, cleanup and deployment</w:t>
-      </w:r>
-    </w:p>
-    <w:p>
-      <w:pPr>
         <w:pStyle w:val="Heading3"/>
         <w:keepNext/>
       </w:pPr>
       <w:r>
-        <w:t xml:space="preserve">#13  Request: GitHub repository, website link and PDF of prompts</w:t>
+        <w:t xml:space="preserve">#28  Request: proceed with Review 2 Step P4</w:t>
       </w:r>
     </w:p>
     <w:p>
@@ -8571,7 +8801,7 @@
           <w:sz w:val="18"/>
           <w:szCs w:val="18"/>
         </w:rPr>
-        <w:t xml:space="preserve">User prompt  |  2026-10-15</w:t>
+        <w:t xml:space="preserve">User prompt  |  2026-10-16</w:t>
       </w:r>
     </w:p>
     <w:p>
@@ -8605,7 +8835,22 @@
           <w:sz w:val="19"/>
           <w:szCs w:val="19"/>
         </w:rPr>
-        <w:t xml:space="preserve">create a new repositry for this project in my gihub , and after than give me the github link and then the website link and also a pdf containing the prompts to complete project.</w:t>
+        <w:t xml:space="preserve">Proceed to P4: Forms, validation and CRUD flows.
+First, inspect the P4 instructions in the handover PDF and review the existing page modules, client/js/data/api.js, client/js/core/, client/js/ui/, and the current HTML forms.
+Implement:
+1. Connect the login and registration forms to the existing authentication API.
+2. Connect expense creation and editing, income creation, group creation, shared-expense creation, shopping-list creation, and other forms specified by P4.
+3. Implement client-side validation with accessible field-level errors, appropriate required fields, valid dates, valid integer-paise amounts, and clear error messages.
+4. Convert rupee values entered by users to integer paise at the API boundary. Never store floating-point monetary amounts.
+5. Disable submit buttons while saving, prevent accidental duplicate submissions, and show success messages only after the operation succeeds.
+6. Preserve form values when validation or API operations fail.
+7. Use the existing confirmation dialog for destructive operations and ensure cancellation never changes data.
+8. Handle missing or invalid record IDs, duplicate registrations, unauthorized operations, and API errors gracefully.
+9. Keep page modules importing data operations exclusively from client/js/data/api.js. Do not access store.js directly from page modules.
+10. Add automated tests for successful submissions, validation errors, duplicate submission prevention, edit flows, delete confirmation, and failure handling.
+Do not implement the P6 analytics features, P7 receipt OCR, or backend integration early.
+Run all relevant tests, including the data-layer and rendering tests, and npm run lint:html. Update documentation and the prompt log. Review the diff and commit locally on refurbish using the handover's required commit message, or P4: forms validation and CRUD if none is specified.
+Report completed forms, supported operations, test results, known limitations, and commit hash.</w:t>
       </w:r>
     </w:p>
     <w:p>
@@ -8633,7 +8878,7 @@
           <w:sz w:val="21"/>
           <w:szCs w:val="21"/>
         </w:rPr>
-        <w:t xml:space="preserve">Publish the project under the student's own GitHub account, host the site, and export the prompt log (including the remaining planned prompts) as a PDF.</w:t>
+        <w:t xml:space="preserve">Authorize execution of Step P4 to connect HTML forms to api.js, implement client-side validation, duplicate submission guards, and complete CRUD workflows.</w:t>
       </w:r>
     </w:p>
     <w:p>
@@ -8694,7 +8939,7 @@
           <w:sz w:val="21"/>
           <w:szCs w:val="21"/>
         </w:rPr>
-        <w:t xml:space="preserve">Done: see the following entries.</w:t>
+        <w:t xml:space="preserve">Authorized Step P4 implementation.</w:t>
       </w:r>
     </w:p>
     <w:p>
@@ -8742,7 +8987,7 @@
         <w:keepNext/>
       </w:pPr>
       <w:r>
-        <w:t xml:space="preserve">#14  PDF export of the prompt log, including planned prompts</w:t>
+        <w:t xml:space="preserve">#29  Forms, validation and CRUD flows</w:t>
       </w:r>
     </w:p>
     <w:p>
@@ -8756,7 +9001,7 @@
           <w:sz w:val="18"/>
           <w:szCs w:val="18"/>
         </w:rPr>
-        <w:t xml:space="preserve">Working prompt  |  2026-10-15</w:t>
+        <w:t xml:space="preserve">Working prompt  |  2026-10-16</w:t>
       </w:r>
     </w:p>
     <w:p>
@@ -8790,7 +9035,7 @@
           <w:sz w:val="19"/>
           <w:szCs w:val="19"/>
         </w:rPr>
-        <w:t xml:space="preserve">Export the prompt log to PDF with a Python reportlab script (docs/tools/build_prompt_pdf.py) that reads docs/prompt_log.json: a title page, a stage overview table, a summary of every entry, Part A with every executed prompt verbatim in a shaded box with purpose, files, result and verification, and Part B with the planned prompts that complete Review 2, Review 3 and the wrap-up, clearly marked as not yet run. Add the planned prompts to prompt_log.json and to the Word log as well, and make "npm run log" rebuild both documents.</w:t>
+        <w:t xml:space="preserve">Wire every form (register, login, expense add/edit, income, budget, recurring, category, group create, add member, shared expense, shopping list and item, profile, change password) to api.js. Use the Constraint Validation API plus custom rules (passwords match, date not in the future, budget greater than zero) with inline error messages linked by aria-describedby, and move focus to the first invalid field. Show a toast after each save and redirect afterwards (Post/Redirect/Get). Add password show/hide toggles with aria-pressed. Protect app pages: redirect to login.html when nobody is signed in.</w:t>
       </w:r>
     </w:p>
     <w:p>
@@ -8818,7 +9063,7 @@
           <w:sz w:val="21"/>
           <w:szCs w:val="21"/>
         </w:rPr>
-        <w:t xml:space="preserve">Give the student a PDF containing the prompts needed to complete the whole project.</w:t>
+        <w:t xml:space="preserve">Cover the core JavaScript skills examiners look for: events, DOM manipulation, validation, and full CRUD workflows.</w:t>
       </w:r>
     </w:p>
     <w:p>
@@ -8851,7 +9096,7 @@
           <w:sz w:val="19"/>
           <w:szCs w:val="19"/>
         </w:rPr>
-        <w:t xml:space="preserve">docs/tools/build_prompt_pdf.py</w:t>
+        <w:t xml:space="preserve">client/js/ui/forms.js</w:t>
       </w:r>
     </w:p>
     <w:p>
@@ -8868,7 +9113,7 @@
           <w:sz w:val="19"/>
           <w:szCs w:val="19"/>
         </w:rPr>
-        <w:t xml:space="preserve">docs/tools/build-prompt-log.js</w:t>
+        <w:t xml:space="preserve">client/js/app.js</w:t>
       </w:r>
     </w:p>
     <w:p>
@@ -8885,7 +9130,7 @@
           <w:sz w:val="19"/>
           <w:szCs w:val="19"/>
         </w:rPr>
-        <w:t xml:space="preserve">docs/prompt_log.json</w:t>
+        <w:t xml:space="preserve">client/js/data/api.js</w:t>
       </w:r>
     </w:p>
     <w:p>
@@ -8902,7 +9147,7 @@
           <w:sz w:val="19"/>
           <w:szCs w:val="19"/>
         </w:rPr>
-        <w:t xml:space="preserve">docs/SplitStack_Prompt_Log.pdf</w:t>
+        <w:t xml:space="preserve">client/js/pages/login.js</w:t>
       </w:r>
     </w:p>
     <w:p>
@@ -8919,7 +9164,7 @@
           <w:sz w:val="19"/>
           <w:szCs w:val="19"/>
         </w:rPr>
-        <w:t xml:space="preserve">docs/SplitStack_Prompt_Log.docx</w:t>
+        <w:t xml:space="preserve">client/js/pages/register.js</w:t>
       </w:r>
     </w:p>
     <w:p>
@@ -8936,7 +9181,245 @@
           <w:sz w:val="19"/>
           <w:szCs w:val="19"/>
         </w:rPr>
-        <w:t xml:space="preserve">package.json</w:t>
+        <w:t xml:space="preserve">client/js/pages/expense-form.js</w:t>
+      </w:r>
+    </w:p>
+    <w:p>
+      <w:pPr>
+        <w:pStyle w:val="ListParagraph"/>
+        <w:numPr>
+          <w:ilvl w:val="0"/>
+          <w:numId w:val="2"/>
+        </w:numPr>
+      </w:pPr>
+      <w:r>
+        <w:rPr>
+          <w:rFonts w:ascii="Consolas" w:cs="Consolas" w:eastAsia="Consolas" w:hAnsi="Consolas"/>
+          <w:sz w:val="19"/>
+          <w:szCs w:val="19"/>
+        </w:rPr>
+        <w:t xml:space="preserve">client/js/pages/expense-edit.js</w:t>
+      </w:r>
+    </w:p>
+    <w:p>
+      <w:pPr>
+        <w:pStyle w:val="ListParagraph"/>
+        <w:numPr>
+          <w:ilvl w:val="0"/>
+          <w:numId w:val="2"/>
+        </w:numPr>
+      </w:pPr>
+      <w:r>
+        <w:rPr>
+          <w:rFonts w:ascii="Consolas" w:cs="Consolas" w:eastAsia="Consolas" w:hAnsi="Consolas"/>
+          <w:sz w:val="19"/>
+          <w:szCs w:val="19"/>
+        </w:rPr>
+        <w:t xml:space="preserve">client/js/pages/expenses.js</w:t>
+      </w:r>
+    </w:p>
+    <w:p>
+      <w:pPr>
+        <w:pStyle w:val="ListParagraph"/>
+        <w:numPr>
+          <w:ilvl w:val="0"/>
+          <w:numId w:val="2"/>
+        </w:numPr>
+      </w:pPr>
+      <w:r>
+        <w:rPr>
+          <w:rFonts w:ascii="Consolas" w:cs="Consolas" w:eastAsia="Consolas" w:hAnsi="Consolas"/>
+          <w:sz w:val="19"/>
+          <w:szCs w:val="19"/>
+        </w:rPr>
+        <w:t xml:space="preserve">client/js/pages/income-form.js</w:t>
+      </w:r>
+    </w:p>
+    <w:p>
+      <w:pPr>
+        <w:pStyle w:val="ListParagraph"/>
+        <w:numPr>
+          <w:ilvl w:val="0"/>
+          <w:numId w:val="2"/>
+        </w:numPr>
+      </w:pPr>
+      <w:r>
+        <w:rPr>
+          <w:rFonts w:ascii="Consolas" w:cs="Consolas" w:eastAsia="Consolas" w:hAnsi="Consolas"/>
+          <w:sz w:val="19"/>
+          <w:szCs w:val="19"/>
+        </w:rPr>
+        <w:t xml:space="preserve">client/js/pages/income.js</w:t>
+      </w:r>
+    </w:p>
+    <w:p>
+      <w:pPr>
+        <w:pStyle w:val="ListParagraph"/>
+        <w:numPr>
+          <w:ilvl w:val="0"/>
+          <w:numId w:val="2"/>
+        </w:numPr>
+      </w:pPr>
+      <w:r>
+        <w:rPr>
+          <w:rFonts w:ascii="Consolas" w:cs="Consolas" w:eastAsia="Consolas" w:hAnsi="Consolas"/>
+          <w:sz w:val="19"/>
+          <w:szCs w:val="19"/>
+        </w:rPr>
+        <w:t xml:space="preserve">client/js/pages/group-create.js</w:t>
+      </w:r>
+    </w:p>
+    <w:p>
+      <w:pPr>
+        <w:pStyle w:val="ListParagraph"/>
+        <w:numPr>
+          <w:ilvl w:val="0"/>
+          <w:numId w:val="2"/>
+        </w:numPr>
+      </w:pPr>
+      <w:r>
+        <w:rPr>
+          <w:rFonts w:ascii="Consolas" w:cs="Consolas" w:eastAsia="Consolas" w:hAnsi="Consolas"/>
+          <w:sz w:val="19"/>
+          <w:szCs w:val="19"/>
+        </w:rPr>
+        <w:t xml:space="preserve">client/js/pages/group-detail.js</w:t>
+      </w:r>
+    </w:p>
+    <w:p>
+      <w:pPr>
+        <w:pStyle w:val="ListParagraph"/>
+        <w:numPr>
+          <w:ilvl w:val="0"/>
+          <w:numId w:val="2"/>
+        </w:numPr>
+      </w:pPr>
+      <w:r>
+        <w:rPr>
+          <w:rFonts w:ascii="Consolas" w:cs="Consolas" w:eastAsia="Consolas" w:hAnsi="Consolas"/>
+          <w:sz w:val="19"/>
+          <w:szCs w:val="19"/>
+        </w:rPr>
+        <w:t xml:space="preserve">client/js/pages/shared-expense-form.js</w:t>
+      </w:r>
+    </w:p>
+    <w:p>
+      <w:pPr>
+        <w:pStyle w:val="ListParagraph"/>
+        <w:numPr>
+          <w:ilvl w:val="0"/>
+          <w:numId w:val="2"/>
+        </w:numPr>
+      </w:pPr>
+      <w:r>
+        <w:rPr>
+          <w:rFonts w:ascii="Consolas" w:cs="Consolas" w:eastAsia="Consolas" w:hAnsi="Consolas"/>
+          <w:sz w:val="19"/>
+          <w:szCs w:val="19"/>
+        </w:rPr>
+        <w:t xml:space="preserve">client/js/pages/shopping-form.js</w:t>
+      </w:r>
+    </w:p>
+    <w:p>
+      <w:pPr>
+        <w:pStyle w:val="ListParagraph"/>
+        <w:numPr>
+          <w:ilvl w:val="0"/>
+          <w:numId w:val="2"/>
+        </w:numPr>
+      </w:pPr>
+      <w:r>
+        <w:rPr>
+          <w:rFonts w:ascii="Consolas" w:cs="Consolas" w:eastAsia="Consolas" w:hAnsi="Consolas"/>
+          <w:sz w:val="19"/>
+          <w:szCs w:val="19"/>
+        </w:rPr>
+        <w:t xml:space="preserve">client/js/pages/shopping-detail.js</w:t>
+      </w:r>
+    </w:p>
+    <w:p>
+      <w:pPr>
+        <w:pStyle w:val="ListParagraph"/>
+        <w:numPr>
+          <w:ilvl w:val="0"/>
+          <w:numId w:val="2"/>
+        </w:numPr>
+      </w:pPr>
+      <w:r>
+        <w:rPr>
+          <w:rFonts w:ascii="Consolas" w:cs="Consolas" w:eastAsia="Consolas" w:hAnsi="Consolas"/>
+          <w:sz w:val="19"/>
+          <w:szCs w:val="19"/>
+        </w:rPr>
+        <w:t xml:space="preserve">client/js/pages/budgets.js</w:t>
+      </w:r>
+    </w:p>
+    <w:p>
+      <w:pPr>
+        <w:pStyle w:val="ListParagraph"/>
+        <w:numPr>
+          <w:ilvl w:val="0"/>
+          <w:numId w:val="2"/>
+        </w:numPr>
+      </w:pPr>
+      <w:r>
+        <w:rPr>
+          <w:rFonts w:ascii="Consolas" w:cs="Consolas" w:eastAsia="Consolas" w:hAnsi="Consolas"/>
+          <w:sz w:val="19"/>
+          <w:szCs w:val="19"/>
+        </w:rPr>
+        <w:t xml:space="preserve">client/js/pages/recurring.js</w:t>
+      </w:r>
+    </w:p>
+    <w:p>
+      <w:pPr>
+        <w:pStyle w:val="ListParagraph"/>
+        <w:numPr>
+          <w:ilvl w:val="0"/>
+          <w:numId w:val="2"/>
+        </w:numPr>
+      </w:pPr>
+      <w:r>
+        <w:rPr>
+          <w:rFonts w:ascii="Consolas" w:cs="Consolas" w:eastAsia="Consolas" w:hAnsi="Consolas"/>
+          <w:sz w:val="19"/>
+          <w:szCs w:val="19"/>
+        </w:rPr>
+        <w:t xml:space="preserve">client/js/pages/categories.js</w:t>
+      </w:r>
+    </w:p>
+    <w:p>
+      <w:pPr>
+        <w:pStyle w:val="ListParagraph"/>
+        <w:numPr>
+          <w:ilvl w:val="0"/>
+          <w:numId w:val="2"/>
+        </w:numPr>
+      </w:pPr>
+      <w:r>
+        <w:rPr>
+          <w:rFonts w:ascii="Consolas" w:cs="Consolas" w:eastAsia="Consolas" w:hAnsi="Consolas"/>
+          <w:sz w:val="19"/>
+          <w:szCs w:val="19"/>
+        </w:rPr>
+        <w:t xml:space="preserve">client/js/pages/profile.js</w:t>
+      </w:r>
+    </w:p>
+    <w:p>
+      <w:pPr>
+        <w:pStyle w:val="ListParagraph"/>
+        <w:numPr>
+          <w:ilvl w:val="0"/>
+          <w:numId w:val="2"/>
+        </w:numPr>
+      </w:pPr>
+      <w:r>
+        <w:rPr>
+          <w:rFonts w:ascii="Consolas" w:cs="Consolas" w:eastAsia="Consolas" w:hAnsi="Consolas"/>
+          <w:sz w:val="19"/>
+          <w:szCs w:val="19"/>
+        </w:rPr>
+        <w:t xml:space="preserve">tests/client/forms.test.mjs</w:t>
       </w:r>
     </w:p>
     <w:p>
@@ -8964,7 +9447,7 @@
           <w:sz w:val="21"/>
           <w:szCs w:val="21"/>
         </w:rPr>
-        <w:t xml:space="preserve">PDF with the executed prompts and 15 planned prompts; the Word log has the same content.</w:t>
+        <w:t xml:space="preserve">Implemented reusable form validation and accessible error UI helper module (client/js/ui/forms.js) with rupeesToPaise and setButtonLoading; added authGuard in app.js; created form page scripts for login, register, expense create/edit, income create, group create, shared expense with equal/custom splits, shopping list create; wired CRUD actions across existing pages (delete expenses/income with confirmDialog, budget create/remove, recurring create/toggle/delete, category create/delete, group add-member/leave, shopping items/convert-to-expense, profile update/change-password); added comprehensive automated test suite (30 passing tests).</w:t>
       </w:r>
     </w:p>
     <w:p>
@@ -8992,7 +9475,7 @@
           <w:sz w:val="21"/>
           <w:szCs w:val="21"/>
         </w:rPr>
-        <w:t xml:space="preserve">Pages rendered to images and inspected; text extracted with pypdf.</w:t>
+        <w:t xml:space="preserve">77 total client tests passing across data-layer.test.mjs, render.test.mjs, and forms.test.mjs; npm run lint:html passing with 0 errors across 25 HTML files.</w:t>
       </w:r>
     </w:p>
     <w:p>
@@ -9008,11 +9491,20 @@
     </w:p>
     <w:p>
       <w:pPr>
+        <w:pStyle w:val="Heading2"/>
+        <w:spacing w:before="360"/>
+      </w:pPr>
+      <w:r>
+        <w:t xml:space="preserve">Wrap-up - Documentation, cleanup and deployment</w:t>
+      </w:r>
+    </w:p>
+    <w:p>
+      <w:pPr>
         <w:pStyle w:val="Heading3"/>
         <w:keepNext/>
       </w:pPr>
       <w:r>
-        <w:t xml:space="preserve">#15  Create the GitHub repository and push the code</w:t>
+        <w:t xml:space="preserve">#13  Request: GitHub repository, website link and PDF of prompts</w:t>
       </w:r>
     </w:p>
     <w:p>
@@ -9026,7 +9518,7 @@
           <w:sz w:val="18"/>
           <w:szCs w:val="18"/>
         </w:rPr>
-        <w:t xml:space="preserve">Working prompt  |  2026-10-15</w:t>
+        <w:t xml:space="preserve">User prompt  |  2026-10-15</w:t>
       </w:r>
     </w:p>
     <w:p>
@@ -9060,7 +9552,7 @@
           <w:sz w:val="19"/>
           <w:szCs w:val="19"/>
         </w:rPr>
-        <w:t xml:space="preserve">Install the official GitHub CLI with winget and sign in through the device-code flow (the student approves it in the browser). Before publishing, check that no secrets or databases are tracked, review the receipt images that are still in the commit history (they are generic sample invoices), and confirm with the student that a public repository is acceptable because the team's original repository is private. Then create the public repository MahaprabhuK/SplitStack, push the refurbish branch as main together with the legacy branch, add a GitHub Actions workflow (.github/workflows/pages.yml) that deploys the client/ folder to GitHub Pages, enable Pages with the "GitHub Actions" source, and confirm that the site responds.</w:t>
+        <w:t xml:space="preserve">create a new repositry for this project in my gihub , and after than give me the github link and then the website link and also a pdf containing the prompts to complete project.</w:t>
       </w:r>
     </w:p>
     <w:p>
@@ -9088,7 +9580,7 @@
           <w:sz w:val="21"/>
           <w:szCs w:val="21"/>
         </w:rPr>
-        <w:t xml:space="preserve">Give the student a repository link and a live website link.</w:t>
+        <w:t xml:space="preserve">Publish the project under the student's own GitHub account, host the site, and export the prompt log (including the remaining planned prompts) as a PDF.</w:t>
       </w:r>
     </w:p>
     <w:p>
@@ -9121,7 +9613,7 @@
           <w:sz w:val="19"/>
           <w:szCs w:val="19"/>
         </w:rPr>
-        <w:t xml:space="preserve">README.md</w:t>
+        <w:t xml:space="preserve">-</w:t>
       </w:r>
     </w:p>
     <w:p>
@@ -9149,7 +9641,7 @@
           <w:sz w:val="21"/>
           <w:szCs w:val="21"/>
         </w:rPr>
-        <w:t xml:space="preserve">Public repository https://github.com/MahaprabhuK/SplitStack created and the legacy branch pushed. The first push of main was rejected because it added a GitHub Actions workflow (.github/workflows/pages.yml) and the gh token lacked the "workflow" scope; the workflow file was removed and main was pushed in the next step. GitHub Pages is not set up yet (planned for the wrap-up; needs "gh auth refresh -s workflow" or a gh-pages branch).</w:t>
+        <w:t xml:space="preserve">Done: see the following entries.</w:t>
       </w:r>
     </w:p>
     <w:p>
@@ -9177,7 +9669,7 @@
           <w:sz w:val="21"/>
           <w:szCs w:val="21"/>
         </w:rPr>
-        <w:t xml:space="preserve">gh repo view; git push output.</w:t>
+        <w:t xml:space="preserve">-</w:t>
       </w:r>
     </w:p>
     <w:p>
@@ -9197,7 +9689,7 @@
         <w:keepNext/>
       </w:pPr>
       <w:r>
-        <w:t xml:space="preserve">#16  Request: hand the project over to a teammate's agent</w:t>
+        <w:t xml:space="preserve">#14  PDF export of the prompt log, including planned prompts</w:t>
       </w:r>
     </w:p>
     <w:p>
@@ -9211,7 +9703,7 @@
           <w:sz w:val="18"/>
           <w:szCs w:val="18"/>
         </w:rPr>
-        <w:t xml:space="preserve">User prompt  |  2026-10-15</w:t>
+        <w:t xml:space="preserve">Working prompt  |  2026-10-15</w:t>
       </w:r>
     </w:p>
     <w:p>
@@ -9245,7 +9737,7 @@
           <w:sz w:val="19"/>
           <w:szCs w:val="19"/>
         </w:rPr>
-        <w:t xml:space="preserve">ACTUALLY I GONNA HANDOVER THE PROJECT TO MY TEAMMATES AGENT SO HE'LL BE PULLING THE CODE AND RUNNING IN HIS SYSTEM SO GIVE PROMPT FOR THAT</w:t>
+        <w:t xml:space="preserve">Export the prompt log to PDF with a Python reportlab script (docs/tools/build_prompt_pdf.py) that reads docs/prompt_log.json: a title page, a stage overview table, a summary of every entry, Part A with every executed prompt verbatim in a shaded box with purpose, files, result and verification, and Part B with the planned prompts that complete Review 2, Review 3 and the wrap-up, clearly marked as not yet run. Add the planned prompts to prompt_log.json and to the Word log as well, and make "npm run log" rebuild both documents.</w:t>
       </w:r>
     </w:p>
     <w:p>
@@ -9273,7 +9765,7 @@
           <w:sz w:val="21"/>
           <w:szCs w:val="21"/>
         </w:rPr>
-        <w:t xml:space="preserve">Let a teammate's AI agent clone, run and continue the project.</w:t>
+        <w:t xml:space="preserve">Give the student a PDF containing the prompts needed to complete the whole project.</w:t>
       </w:r>
     </w:p>
     <w:p>
@@ -9306,7 +9798,92 @@
           <w:sz w:val="19"/>
           <w:szCs w:val="19"/>
         </w:rPr>
-        <w:t xml:space="preserve">-</w:t>
+        <w:t xml:space="preserve">docs/tools/build_prompt_pdf.py</w:t>
+      </w:r>
+    </w:p>
+    <w:p>
+      <w:pPr>
+        <w:pStyle w:val="ListParagraph"/>
+        <w:numPr>
+          <w:ilvl w:val="0"/>
+          <w:numId w:val="2"/>
+        </w:numPr>
+      </w:pPr>
+      <w:r>
+        <w:rPr>
+          <w:rFonts w:ascii="Consolas" w:cs="Consolas" w:eastAsia="Consolas" w:hAnsi="Consolas"/>
+          <w:sz w:val="19"/>
+          <w:szCs w:val="19"/>
+        </w:rPr>
+        <w:t xml:space="preserve">docs/tools/build-prompt-log.js</w:t>
+      </w:r>
+    </w:p>
+    <w:p>
+      <w:pPr>
+        <w:pStyle w:val="ListParagraph"/>
+        <w:numPr>
+          <w:ilvl w:val="0"/>
+          <w:numId w:val="2"/>
+        </w:numPr>
+      </w:pPr>
+      <w:r>
+        <w:rPr>
+          <w:rFonts w:ascii="Consolas" w:cs="Consolas" w:eastAsia="Consolas" w:hAnsi="Consolas"/>
+          <w:sz w:val="19"/>
+          <w:szCs w:val="19"/>
+        </w:rPr>
+        <w:t xml:space="preserve">docs/prompt_log.json</w:t>
+      </w:r>
+    </w:p>
+    <w:p>
+      <w:pPr>
+        <w:pStyle w:val="ListParagraph"/>
+        <w:numPr>
+          <w:ilvl w:val="0"/>
+          <w:numId w:val="2"/>
+        </w:numPr>
+      </w:pPr>
+      <w:r>
+        <w:rPr>
+          <w:rFonts w:ascii="Consolas" w:cs="Consolas" w:eastAsia="Consolas" w:hAnsi="Consolas"/>
+          <w:sz w:val="19"/>
+          <w:szCs w:val="19"/>
+        </w:rPr>
+        <w:t xml:space="preserve">docs/SplitStack_Prompt_Log.pdf</w:t>
+      </w:r>
+    </w:p>
+    <w:p>
+      <w:pPr>
+        <w:pStyle w:val="ListParagraph"/>
+        <w:numPr>
+          <w:ilvl w:val="0"/>
+          <w:numId w:val="2"/>
+        </w:numPr>
+      </w:pPr>
+      <w:r>
+        <w:rPr>
+          <w:rFonts w:ascii="Consolas" w:cs="Consolas" w:eastAsia="Consolas" w:hAnsi="Consolas"/>
+          <w:sz w:val="19"/>
+          <w:szCs w:val="19"/>
+        </w:rPr>
+        <w:t xml:space="preserve">docs/SplitStack_Prompt_Log.docx</w:t>
+      </w:r>
+    </w:p>
+    <w:p>
+      <w:pPr>
+        <w:pStyle w:val="ListParagraph"/>
+        <w:numPr>
+          <w:ilvl w:val="0"/>
+          <w:numId w:val="2"/>
+        </w:numPr>
+      </w:pPr>
+      <w:r>
+        <w:rPr>
+          <w:rFonts w:ascii="Consolas" w:cs="Consolas" w:eastAsia="Consolas" w:hAnsi="Consolas"/>
+          <w:sz w:val="19"/>
+          <w:szCs w:val="19"/>
+        </w:rPr>
+        <w:t xml:space="preserve">package.json</w:t>
       </w:r>
     </w:p>
     <w:p>
@@ -9334,7 +9911,7 @@
           <w:sz w:val="21"/>
           <w:szCs w:val="21"/>
         </w:rPr>
-        <w:t xml:space="preserve">A handover prompt was written covering: requirements per review, clone and branch, prerequisites, install/run/verify commands, repository map, known traps, the mandatory logging rule, the ordered remaining work (planned prompts P1-P15) and working rules. Noted that the new work had to be pushed to GitHub first.</w:t>
+        <w:t xml:space="preserve">PDF with the executed prompts and 15 planned prompts; the Word log has the same content.</w:t>
       </w:r>
     </w:p>
     <w:p>
@@ -9362,7 +9939,7 @@
           <w:sz w:val="21"/>
           <w:szCs w:val="21"/>
         </w:rPr>
-        <w:t xml:space="preserve">-</w:t>
+        <w:t xml:space="preserve">Pages rendered to images and inspected; text extracted with pypdf.</w:t>
       </w:r>
     </w:p>
     <w:p>
@@ -9382,7 +9959,7 @@
         <w:keepNext/>
       </w:pPr>
       <w:r>
-        <w:t xml:space="preserve">#17  Push the refurbished code to GitHub main</w:t>
+        <w:t xml:space="preserve">#15  Create the GitHub repository and push the code</w:t>
       </w:r>
     </w:p>
     <w:p>
@@ -9430,7 +10007,7 @@
           <w:sz w:val="19"/>
           <w:szCs w:val="19"/>
         </w:rPr>
-        <w:t xml:space="preserve">push it  (user prompt). Executed as: remove .github/workflows/pages.yml (the token lacks the workflow scope), replace the not-yet-existing live-site link in README.md with local run instructions, correct the earlier log entry about publishing, log the handover, rebuild the prompt logs, commit, and push the refurbish branch to main on https://github.com/MahaprabhuK/SplitStack so the teammate can clone it.</w:t>
+        <w:t xml:space="preserve">Install the official GitHub CLI with winget and sign in through the device-code flow (the student approves it in the browser). Before publishing, check that no secrets or databases are tracked, review the receipt images that are still in the commit history (they are generic sample invoices), and confirm with the student that a public repository is acceptable because the team's original repository is private. Then create the public repository MahaprabhuK/SplitStack, push the refurbish branch as main together with the legacy branch, add a GitHub Actions workflow (.github/workflows/pages.yml) that deploys the client/ folder to GitHub Pages, enable Pages with the "GitHub Actions" source, and confirm that the site responds.</w:t>
       </w:r>
     </w:p>
     <w:p>
@@ -9458,7 +10035,7 @@
           <w:sz w:val="21"/>
           <w:szCs w:val="21"/>
         </w:rPr>
-        <w:t xml:space="preserve">Make the current work available to the teammate.</w:t>
+        <w:t xml:space="preserve">Give the student a repository link and a live website link.</w:t>
       </w:r>
     </w:p>
     <w:p>
@@ -9491,75 +10068,7 @@
           <w:sz w:val="19"/>
           <w:szCs w:val="19"/>
         </w:rPr>
-        <w:t xml:space="preserve">.github/workflows/pages.yml (removed)</w:t>
-      </w:r>
-    </w:p>
-    <w:p>
-      <w:pPr>
-        <w:pStyle w:val="ListParagraph"/>
-        <w:numPr>
-          <w:ilvl w:val="0"/>
-          <w:numId w:val="2"/>
-        </w:numPr>
-      </w:pPr>
-      <w:r>
-        <w:rPr>
-          <w:rFonts w:ascii="Consolas" w:cs="Consolas" w:eastAsia="Consolas" w:hAnsi="Consolas"/>
-          <w:sz w:val="19"/>
-          <w:szCs w:val="19"/>
-        </w:rPr>
         <w:t xml:space="preserve">README.md</w:t>
-      </w:r>
-    </w:p>
-    <w:p>
-      <w:pPr>
-        <w:pStyle w:val="ListParagraph"/>
-        <w:numPr>
-          <w:ilvl w:val="0"/>
-          <w:numId w:val="2"/>
-        </w:numPr>
-      </w:pPr>
-      <w:r>
-        <w:rPr>
-          <w:rFonts w:ascii="Consolas" w:cs="Consolas" w:eastAsia="Consolas" w:hAnsi="Consolas"/>
-          <w:sz w:val="19"/>
-          <w:szCs w:val="19"/>
-        </w:rPr>
-        <w:t xml:space="preserve">docs/prompt_log.json</w:t>
-      </w:r>
-    </w:p>
-    <w:p>
-      <w:pPr>
-        <w:pStyle w:val="ListParagraph"/>
-        <w:numPr>
-          <w:ilvl w:val="0"/>
-          <w:numId w:val="2"/>
-        </w:numPr>
-      </w:pPr>
-      <w:r>
-        <w:rPr>
-          <w:rFonts w:ascii="Consolas" w:cs="Consolas" w:eastAsia="Consolas" w:hAnsi="Consolas"/>
-          <w:sz w:val="19"/>
-          <w:szCs w:val="19"/>
-        </w:rPr>
-        <w:t xml:space="preserve">docs/SplitStack_Prompt_Log.docx</w:t>
-      </w:r>
-    </w:p>
-    <w:p>
-      <w:pPr>
-        <w:pStyle w:val="ListParagraph"/>
-        <w:numPr>
-          <w:ilvl w:val="0"/>
-          <w:numId w:val="2"/>
-        </w:numPr>
-      </w:pPr>
-      <w:r>
-        <w:rPr>
-          <w:rFonts w:ascii="Consolas" w:cs="Consolas" w:eastAsia="Consolas" w:hAnsi="Consolas"/>
-          <w:sz w:val="19"/>
-          <w:szCs w:val="19"/>
-        </w:rPr>
-        <w:t xml:space="preserve">docs/SplitStack_Prompt_Log.pdf</w:t>
       </w:r>
     </w:p>
     <w:p>
@@ -9587,7 +10096,7 @@
           <w:sz w:val="21"/>
           <w:szCs w:val="21"/>
         </w:rPr>
-        <w:t xml:space="preserve">main pushed to GitHub; branches on GitHub: main (refurbished work) and legacy (original Flask app).</w:t>
+        <w:t xml:space="preserve">Public repository https://github.com/MahaprabhuK/SplitStack created and the legacy branch pushed. The first push of main was rejected because it added a GitHub Actions workflow (.github/workflows/pages.yml) and the gh token lacked the "workflow" scope; the workflow file was removed and main was pushed in the next step. GitHub Pages is not set up yet (planned for the wrap-up; needs "gh auth refresh -s workflow" or a gh-pages branch).</w:t>
       </w:r>
     </w:p>
     <w:p>
@@ -9615,7 +10124,7 @@
           <w:sz w:val="21"/>
           <w:szCs w:val="21"/>
         </w:rPr>
-        <w:t xml:space="preserve">git ls-remote shows main and legacy at the expected commits.</w:t>
+        <w:t xml:space="preserve">gh repo view; git push output.</w:t>
       </w:r>
     </w:p>
     <w:p>
@@ -9635,7 +10144,7 @@
         <w:keepNext/>
       </w:pPr>
       <w:r>
-        <w:t xml:space="preserve">#18  Request: push the code and deploy the website</w:t>
+        <w:t xml:space="preserve">#16  Request: hand the project over to a teammate's agent</w:t>
       </w:r>
     </w:p>
     <w:p>
@@ -9683,7 +10192,7 @@
           <w:sz w:val="19"/>
           <w:szCs w:val="19"/>
         </w:rPr>
-        <w:t xml:space="preserve">first push the code and deploy it</w:t>
+        <w:t xml:space="preserve">ACTUALLY I GONNA HANDOVER THE PROJECT TO MY TEAMMATES AGENT SO HE'LL BE PULLING THE CODE AND RUNNING IN HIS SYSTEM SO GIVE PROMPT FOR THAT</w:t>
       </w:r>
     </w:p>
     <w:p>
@@ -9711,7 +10220,7 @@
           <w:sz w:val="21"/>
           <w:szCs w:val="21"/>
         </w:rPr>
-        <w:t xml:space="preserve">Get the code on GitHub and the Review 1 site online.</w:t>
+        <w:t xml:space="preserve">Let a teammate's AI agent clone, run and continue the project.</w:t>
       </w:r>
     </w:p>
     <w:p>
@@ -9772,7 +10281,7 @@
           <w:sz w:val="21"/>
           <w:szCs w:val="21"/>
         </w:rPr>
-        <w:t xml:space="preserve">Handled in the next step.</w:t>
+        <w:t xml:space="preserve">A handover prompt was written covering: requirements per review, clone and branch, prerequisites, install/run/verify commands, repository map, known traps, the mandatory logging rule, the ordered remaining work (planned prompts P1-P15) and working rules. Noted that the new work had to be pushed to GitHub first.</w:t>
       </w:r>
     </w:p>
     <w:p>
@@ -9820,7 +10329,7 @@
         <w:keepNext/>
       </w:pPr>
       <w:r>
-        <w:t xml:space="preserve">#19  Deploy the client to GitHub Pages from a gh-pages branch</w:t>
+        <w:t xml:space="preserve">#17  Push the refurbished code to GitHub main</w:t>
       </w:r>
     </w:p>
     <w:p>
@@ -9868,7 +10377,7 @@
           <w:sz w:val="19"/>
           <w:szCs w:val="19"/>
         </w:rPr>
-        <w:t xml:space="preserve">Push refurbish to main and refurbish on MahaprabhuK/SplitStack. Because the token cannot push workflow files, deploy without GitHub Actions: check that client/ uses only relative links, split client/ into its own history with git subtree split, push it as the gh-pages branch, wait for GitHub Pages to publish it, then put the live link back in README.md and log the step.</w:t>
+        <w:t xml:space="preserve">push it  (user prompt). Executed as: remove .github/workflows/pages.yml (the token lacks the workflow scope), replace the not-yet-existing live-site link in README.md with local run instructions, correct the earlier log entry about publishing, log the handover, rebuild the prompt logs, commit, and push the refurbish branch to main on https://github.com/MahaprabhuK/SplitStack so the teammate can clone it.</w:t>
       </w:r>
     </w:p>
     <w:p>
@@ -9896,7 +10405,7 @@
           <w:sz w:val="21"/>
           <w:szCs w:val="21"/>
         </w:rPr>
-        <w:t xml:space="preserve">Publish the Review 1 site at a public URL without needing the workflow scope.</w:t>
+        <w:t xml:space="preserve">Make the current work available to the teammate.</w:t>
       </w:r>
     </w:p>
     <w:p>
@@ -9929,7 +10438,7 @@
           <w:sz w:val="19"/>
           <w:szCs w:val="19"/>
         </w:rPr>
-        <w:t xml:space="preserve">README.md</w:t>
+        <w:t xml:space="preserve">.github/workflows/pages.yml (removed)</w:t>
       </w:r>
     </w:p>
     <w:p>
@@ -9946,7 +10455,58 @@
           <w:sz w:val="19"/>
           <w:szCs w:val="19"/>
         </w:rPr>
+        <w:t xml:space="preserve">README.md</w:t>
+      </w:r>
+    </w:p>
+    <w:p>
+      <w:pPr>
+        <w:pStyle w:val="ListParagraph"/>
+        <w:numPr>
+          <w:ilvl w:val="0"/>
+          <w:numId w:val="2"/>
+        </w:numPr>
+      </w:pPr>
+      <w:r>
+        <w:rPr>
+          <w:rFonts w:ascii="Consolas" w:cs="Consolas" w:eastAsia="Consolas" w:hAnsi="Consolas"/>
+          <w:sz w:val="19"/>
+          <w:szCs w:val="19"/>
+        </w:rPr>
         <w:t xml:space="preserve">docs/prompt_log.json</w:t>
+      </w:r>
+    </w:p>
+    <w:p>
+      <w:pPr>
+        <w:pStyle w:val="ListParagraph"/>
+        <w:numPr>
+          <w:ilvl w:val="0"/>
+          <w:numId w:val="2"/>
+        </w:numPr>
+      </w:pPr>
+      <w:r>
+        <w:rPr>
+          <w:rFonts w:ascii="Consolas" w:cs="Consolas" w:eastAsia="Consolas" w:hAnsi="Consolas"/>
+          <w:sz w:val="19"/>
+          <w:szCs w:val="19"/>
+        </w:rPr>
+        <w:t xml:space="preserve">docs/SplitStack_Prompt_Log.docx</w:t>
+      </w:r>
+    </w:p>
+    <w:p>
+      <w:pPr>
+        <w:pStyle w:val="ListParagraph"/>
+        <w:numPr>
+          <w:ilvl w:val="0"/>
+          <w:numId w:val="2"/>
+        </w:numPr>
+      </w:pPr>
+      <w:r>
+        <w:rPr>
+          <w:rFonts w:ascii="Consolas" w:cs="Consolas" w:eastAsia="Consolas" w:hAnsi="Consolas"/>
+          <w:sz w:val="19"/>
+          <w:szCs w:val="19"/>
+        </w:rPr>
+        <w:t xml:space="preserve">docs/SplitStack_Prompt_Log.pdf</w:t>
       </w:r>
     </w:p>
     <w:p>
@@ -9974,7 +10534,7 @@
           <w:sz w:val="21"/>
           <w:szCs w:val="21"/>
         </w:rPr>
-        <w:t xml:space="preserve">main and refurbish are on GitHub. The client/ folder is published from the gh-pages branch at https://mahaprabhuk.github.io/SplitStack/ (GitHub enabled Pages automatically). To redeploy after client changes: git subtree split --prefix client refurbish, then push that commit to gh-pages.</w:t>
+        <w:t xml:space="preserve">main pushed to GitHub; branches on GitHub: main (refurbished work) and legacy (original Flask app).</w:t>
       </w:r>
     </w:p>
     <w:p>
@@ -10002,7 +10562,7 @@
           <w:sz w:val="21"/>
           <w:szCs w:val="21"/>
         </w:rPr>
-        <w:t xml:space="preserve">git ls-remote; curl returned 200 for the home page, pages/404.html and css/base.css on the live site.</w:t>
+        <w:t xml:space="preserve">git ls-remote shows main and legacy at the expected commits.</w:t>
       </w:r>
     </w:p>
     <w:p>
@@ -10022,7 +10582,7 @@
         <w:keepNext/>
       </w:pPr>
       <w:r>
-        <w:t xml:space="preserve">#20  Request: handover prompt PDF for a teammate's agent</w:t>
+        <w:t xml:space="preserve">#18  Request: push the code and deploy the website</w:t>
       </w:r>
     </w:p>
     <w:p>
@@ -10070,7 +10630,7 @@
           <w:sz w:val="19"/>
           <w:szCs w:val="19"/>
         </w:rPr>
-        <w:t xml:space="preserve">imma handover the project to my teammate i want you to create a detailed prompt for his agent most prolly he'll use anti gravity so i want a pdf containing prompts to complete the rest of the work in the project. so create a pdf and mention its path once its created then i'll share it to him</w:t>
+        <w:t xml:space="preserve">first push the code and deploy it</w:t>
       </w:r>
     </w:p>
     <w:p>
@@ -10098,7 +10658,7 @@
           <w:sz w:val="21"/>
           <w:szCs w:val="21"/>
         </w:rPr>
-        <w:t xml:space="preserve">Let a teammate's AI agent (Antigravity) finish Review 2, Review 3 and the wrap-up.</w:t>
+        <w:t xml:space="preserve">Get the code on GitHub and the Review 1 site online.</w:t>
       </w:r>
     </w:p>
     <w:p>
@@ -10207,7 +10767,7 @@
         <w:keepNext/>
       </w:pPr>
       <w:r>
-        <w:t xml:space="preserve">#21  Handover prompts PDF</w:t>
+        <w:t xml:space="preserve">#19  Deploy the client to GitHub Pages from a gh-pages branch</w:t>
       </w:r>
     </w:p>
     <w:p>
@@ -10255,7 +10815,7 @@
           <w:sz w:val="19"/>
           <w:szCs w:val="19"/>
         </w:rPr>
-        <w:t xml:space="preserve">Write docs/tools/build_handover_pdf.py (reusing the styles of build_prompt_pdf.py) to produce docs/SplitStack_Handover_Prompts.pdf: how to use it with Antigravity, one-time setup (tools, collaborator access, MongoDB Atlas, workflow token scope), a roadmap, Prompt 0 with the full project context, rules, logging, commit/push and gh-pages redeploy procedure, the 15 planned prompts P1-P15 expanded with concrete checks and commit messages, utility prompts (status, recovery, review rehearsal) and common problems. Render pages to check the layout.</w:t>
+        <w:t xml:space="preserve">Push refurbish to main and refurbish on MahaprabhuK/SplitStack. Because the token cannot push workflow files, deploy without GitHub Actions: check that client/ uses only relative links, split client/ into its own history with git subtree split, push it as the gh-pages branch, wait for GitHub Pages to publish it, then put the live link back in README.md and log the step.</w:t>
       </w:r>
     </w:p>
     <w:p>
@@ -10283,7 +10843,7 @@
           <w:sz w:val="21"/>
           <w:szCs w:val="21"/>
         </w:rPr>
-        <w:t xml:space="preserve">Give the teammate a self-contained, ordered set of prompts.</w:t>
+        <w:t xml:space="preserve">Publish the Review 1 site at a public URL without needing the workflow scope.</w:t>
       </w:r>
     </w:p>
     <w:p>
@@ -10316,7 +10876,7 @@
           <w:sz w:val="19"/>
           <w:szCs w:val="19"/>
         </w:rPr>
-        <w:t xml:space="preserve">docs/tools/build_handover_pdf.py</w:t>
+        <w:t xml:space="preserve">README.md</w:t>
       </w:r>
     </w:p>
     <w:p>
@@ -10333,7 +10893,7 @@
           <w:sz w:val="19"/>
           <w:szCs w:val="19"/>
         </w:rPr>
-        <w:t xml:space="preserve">docs/SplitStack_Handover_Prompts.pdf</w:t>
+        <w:t xml:space="preserve">docs/prompt_log.json</w:t>
       </w:r>
     </w:p>
     <w:p>
@@ -10361,7 +10921,7 @@
           <w:sz w:val="21"/>
           <w:szCs w:val="21"/>
         </w:rPr>
-        <w:t xml:space="preserve">14-page PDF created. Changes against the planned prompts: P1 adds data-page attributes and client/js/package.json (type module) for node --test; P13 keeps the localStorage implementation as a demo mode (api-local.js chosen when /api/health does not answer) so the GitHub Pages site keeps working, instead of deleting it; P9 replaces deprecated csurf with a synchronizer token; P14 uses MongoMemoryReplSet because the API uses transactions; P15 asks for confirmation before deleting the Flask files and leaves Render account steps to the student.</w:t>
+        <w:t xml:space="preserve">main and refurbish are on GitHub. The client/ folder is published from the gh-pages branch at https://mahaprabhuk.github.io/SplitStack/ (GitHub enabled Pages automatically). To redeploy after client changes: git subtree split --prefix client refurbish, then push that commit to gh-pages.</w:t>
       </w:r>
     </w:p>
     <w:p>
@@ -10389,7 +10949,7 @@
           <w:sz w:val="21"/>
           <w:szCs w:val="21"/>
         </w:rPr>
-        <w:t xml:space="preserve">Rendered pages with PyMuPDF and checked the layout of the setup, Prompt 0, step and utility pages.</w:t>
+        <w:t xml:space="preserve">git ls-remote; curl returned 200 for the home page, pages/404.html and css/base.css on the live site.</w:t>
       </w:r>
     </w:p>
     <w:p>
@@ -10404,37 +10964,12 @@
       </w:r>
     </w:p>
     <w:p>
-      <w:r>
-        <w:br w:type="page"/>
-      </w:r>
-    </w:p>
-    <w:p>
-      <w:pPr>
-        <w:pStyle w:val="Heading1"/>
-      </w:pPr>
-      <w:r>
-        <w:t xml:space="preserve">Planned prompts to complete the project</w:t>
-      </w:r>
-    </w:p>
-    <w:p>
-      <w:pPr>
-        <w:spacing w:after="80"/>
-      </w:pPr>
-      <w:r>
-        <w:rPr>
-          <w:sz w:val="21"/>
-          <w:szCs w:val="21"/>
-        </w:rPr>
-        <w:t xml:space="preserve">These prompts have not been run yet. Run them in order; after each one, move it into the log above with its result.</w:t>
-      </w:r>
-    </w:p>
-    <w:p>
       <w:pPr>
         <w:pStyle w:val="Heading3"/>
         <w:keepNext/>
       </w:pPr>
       <w:r>
-        <w:t xml:space="preserve">P1  Forms, validation and CRUD flows</w:t>
+        <w:t xml:space="preserve">#20  Request: handover prompt PDF for a teammate's agent</w:t>
       </w:r>
     </w:p>
     <w:p>
@@ -10448,7 +10983,7 @@
           <w:sz w:val="18"/>
           <w:szCs w:val="18"/>
         </w:rPr>
-        <w:t xml:space="preserve">Review 2  |  Planned prompt</w:t>
+        <w:t xml:space="preserve">User prompt  |  2026-10-15</w:t>
       </w:r>
     </w:p>
     <w:p>
@@ -10482,7 +11017,7 @@
           <w:sz w:val="19"/>
           <w:szCs w:val="19"/>
         </w:rPr>
-        <w:t xml:space="preserve">Wire every form (register, login, expense add/edit, income, budget, recurring, category, group create, add member, shared expense, shopping list and item, profile, change password) to api.js. Use the Constraint Validation API plus custom rules (passwords match, date not in the future, budget greater than zero) with inline error messages linked by aria-describedby, and move focus to the first invalid field. Show a toast after each save and redirect afterwards (Post/Redirect/Get). Add password show/hide toggles with aria-pressed. Protect app pages: redirect to login.html when nobody is signed in.</w:t>
+        <w:t xml:space="preserve">imma handover the project to my teammate i want you to create a detailed prompt for his agent most prolly he'll use anti gravity so i want a pdf containing prompts to complete the rest of the work in the project. so create a pdf and mention its path once its created then i'll share it to him</w:t>
       </w:r>
     </w:p>
     <w:p>
@@ -10510,7 +11045,7 @@
           <w:sz w:val="21"/>
           <w:szCs w:val="21"/>
         </w:rPr>
-        <w:t xml:space="preserve">Cover the core JavaScript skills examiners look for: events, DOM manipulation, validation.</w:t>
+        <w:t xml:space="preserve">Let a teammate's AI agent (Antigravity) finish Review 2, Review 3 and the wrap-up.</w:t>
       </w:r>
     </w:p>
     <w:p>
@@ -10527,6 +11062,39 @@
           <w:szCs w:val="17"/>
         </w:rPr>
         <w:t xml:space="preserve">FILES</w:t>
+      </w:r>
+    </w:p>
+    <w:p>
+      <w:pPr>
+        <w:pStyle w:val="ListParagraph"/>
+        <w:numPr>
+          <w:ilvl w:val="0"/>
+          <w:numId w:val="2"/>
+        </w:numPr>
+      </w:pPr>
+      <w:r>
+        <w:rPr>
+          <w:rFonts w:ascii="Consolas" w:cs="Consolas" w:eastAsia="Consolas" w:hAnsi="Consolas"/>
+          <w:sz w:val="19"/>
+          <w:szCs w:val="19"/>
+        </w:rPr>
+        <w:t xml:space="preserve">-</w:t>
+      </w:r>
+    </w:p>
+    <w:p>
+      <w:pPr>
+        <w:spacing w:after="60" w:before="160"/>
+      </w:pPr>
+      <w:r>
+        <w:rPr>
+          <w:b/>
+          <w:bCs/>
+          <w:color w:val="4F46E5"/>
+          <w:spacing w:val="20"/>
+          <w:sz w:val="17"/>
+          <w:szCs w:val="17"/>
+        </w:rPr>
+        <w:t xml:space="preserve">RESULT</w:t>
       </w:r>
     </w:p>
     <w:p>
@@ -10538,7 +11106,46 @@
           <w:sz w:val="21"/>
           <w:szCs w:val="21"/>
         </w:rPr>
-        <w:t xml:space="preserve">client/js/pages/*.js, client/js/ui/forms.js</w:t>
+        <w:t xml:space="preserve">Handled in the next step.</w:t>
+      </w:r>
+    </w:p>
+    <w:p>
+      <w:pPr>
+        <w:spacing w:after="60" w:before="160"/>
+      </w:pPr>
+      <w:r>
+        <w:rPr>
+          <w:b/>
+          <w:bCs/>
+          <w:color w:val="4F46E5"/>
+          <w:spacing w:val="20"/>
+          <w:sz w:val="17"/>
+          <w:szCs w:val="17"/>
+        </w:rPr>
+        <w:t xml:space="preserve">VERIFICATION</w:t>
+      </w:r>
+    </w:p>
+    <w:p>
+      <w:pPr>
+        <w:spacing w:after="80"/>
+      </w:pPr>
+      <w:r>
+        <w:rPr>
+          <w:sz w:val="21"/>
+          <w:szCs w:val="21"/>
+        </w:rPr>
+        <w:t xml:space="preserve">-</w:t>
+      </w:r>
+    </w:p>
+    <w:p>
+      <w:pPr>
+        <w:pBdr>
+          <w:bottom w:val="single" w:color="D9DBE5" w:sz="4" w:space="4"/>
+        </w:pBdr>
+        <w:spacing w:after="200"/>
+      </w:pPr>
+      <w:r>
+        <w:t xml:space="preserve"/>
       </w:r>
     </w:p>
     <w:p>
@@ -10547,7 +11154,7 @@
         <w:keepNext/>
       </w:pPr>
       <w:r>
-        <w:t xml:space="preserve">P2  Group splitting and the debt-simplification algorithm</w:t>
+        <w:t xml:space="preserve">#21  Handover prompts PDF</w:t>
       </w:r>
     </w:p>
     <w:p>
@@ -10561,7 +11168,7 @@
           <w:sz w:val="18"/>
           <w:szCs w:val="18"/>
         </w:rPr>
-        <w:t xml:space="preserve">Review 2  |  Planned prompt</w:t>
+        <w:t xml:space="preserve">Working prompt  |  2026-10-15</w:t>
       </w:r>
     </w:p>
     <w:p>
@@ -10595,7 +11202,7 @@
           <w:sz w:val="19"/>
           <w:szCs w:val="19"/>
         </w:rPr>
-        <w:t xml:space="preserve">In client/js/domain/splits.js implement equal splits in integer paise with the leftover paise assigned to the payer, and custom splits that must sum exactly to the total. On the shared-expense form show a live "remaining to assign" counter and disable submit until it reaches zero. In client/js/domain/settle.js implement net balances (paid minus share) and the greedy minimum-cash-flow algorithm: repeatedly match the largest debtor with the largest creditor and transfer min(debt, credit) until every balance is within one paisa; return the transfer list and the number of original pairwise debts. Render the settle-up page from it, and make "Mark paid" record a settlement and recompute balances. Add unit tests runnable with node --test using the Goa Trip example (balances +1700, -2500, +5700, -4900 give 3 transfers).</w:t>
+        <w:t xml:space="preserve">Write docs/tools/build_handover_pdf.py (reusing the styles of build_prompt_pdf.py) to produce docs/SplitStack_Handover_Prompts.pdf: how to use it with Antigravity, one-time setup (tools, collaborator access, MongoDB Atlas, workflow token scope), a roadmap, Prompt 0 with the full project context, rules, logging, commit/push and gh-pages redeploy procedure, the 15 planned prompts P1-P15 expanded with concrete checks and commit messages, utility prompts (status, recovery, review rehearsal) and common problems. Render pages to check the layout.</w:t>
       </w:r>
     </w:p>
     <w:p>
@@ -10623,7 +11230,7 @@
           <w:sz w:val="21"/>
           <w:szCs w:val="21"/>
         </w:rPr>
-        <w:t xml:space="preserve">Show algorithmic JavaScript, the core idea of SplitStack.</w:t>
+        <w:t xml:space="preserve">Give the teammate a self-contained, ordered set of prompts.</w:t>
       </w:r>
     </w:p>
     <w:p>
@@ -10640,6 +11247,56 @@
           <w:szCs w:val="17"/>
         </w:rPr>
         <w:t xml:space="preserve">FILES</w:t>
+      </w:r>
+    </w:p>
+    <w:p>
+      <w:pPr>
+        <w:pStyle w:val="ListParagraph"/>
+        <w:numPr>
+          <w:ilvl w:val="0"/>
+          <w:numId w:val="2"/>
+        </w:numPr>
+      </w:pPr>
+      <w:r>
+        <w:rPr>
+          <w:rFonts w:ascii="Consolas" w:cs="Consolas" w:eastAsia="Consolas" w:hAnsi="Consolas"/>
+          <w:sz w:val="19"/>
+          <w:szCs w:val="19"/>
+        </w:rPr>
+        <w:t xml:space="preserve">docs/tools/build_handover_pdf.py</w:t>
+      </w:r>
+    </w:p>
+    <w:p>
+      <w:pPr>
+        <w:pStyle w:val="ListParagraph"/>
+        <w:numPr>
+          <w:ilvl w:val="0"/>
+          <w:numId w:val="2"/>
+        </w:numPr>
+      </w:pPr>
+      <w:r>
+        <w:rPr>
+          <w:rFonts w:ascii="Consolas" w:cs="Consolas" w:eastAsia="Consolas" w:hAnsi="Consolas"/>
+          <w:sz w:val="19"/>
+          <w:szCs w:val="19"/>
+        </w:rPr>
+        <w:t xml:space="preserve">docs/SplitStack_Handover_Prompts.pdf</w:t>
+      </w:r>
+    </w:p>
+    <w:p>
+      <w:pPr>
+        <w:spacing w:after="60" w:before="160"/>
+      </w:pPr>
+      <w:r>
+        <w:rPr>
+          <w:b/>
+          <w:bCs/>
+          <w:color w:val="4F46E5"/>
+          <w:spacing w:val="20"/>
+          <w:sz w:val="17"/>
+          <w:szCs w:val="17"/>
+        </w:rPr>
+        <w:t xml:space="preserve">RESULT</w:t>
       </w:r>
     </w:p>
     <w:p>
@@ -10651,7 +11308,71 @@
           <w:sz w:val="21"/>
           <w:szCs w:val="21"/>
         </w:rPr>
-        <w:t xml:space="preserve">client/js/domain/splits.js, client/js/domain/settle.js, tests/client/*.test.js</w:t>
+        <w:t xml:space="preserve">14-page PDF created. Changes against the planned prompts: P1 adds data-page attributes and client/js/package.json (type module) for node --test; P13 keeps the localStorage implementation as a demo mode (api-local.js chosen when /api/health does not answer) so the GitHub Pages site keeps working, instead of deleting it; P9 replaces deprecated csurf with a synchronizer token; P14 uses MongoMemoryReplSet because the API uses transactions; P15 asks for confirmation before deleting the Flask files and leaves Render account steps to the student.</w:t>
+      </w:r>
+    </w:p>
+    <w:p>
+      <w:pPr>
+        <w:spacing w:after="60" w:before="160"/>
+      </w:pPr>
+      <w:r>
+        <w:rPr>
+          <w:b/>
+          <w:bCs/>
+          <w:color w:val="4F46E5"/>
+          <w:spacing w:val="20"/>
+          <w:sz w:val="17"/>
+          <w:szCs w:val="17"/>
+        </w:rPr>
+        <w:t xml:space="preserve">VERIFICATION</w:t>
+      </w:r>
+    </w:p>
+    <w:p>
+      <w:pPr>
+        <w:spacing w:after="80"/>
+      </w:pPr>
+      <w:r>
+        <w:rPr>
+          <w:sz w:val="21"/>
+          <w:szCs w:val="21"/>
+        </w:rPr>
+        <w:t xml:space="preserve">Rendered pages with PyMuPDF and checked the layout of the setup, Prompt 0, step and utility pages.</w:t>
+      </w:r>
+    </w:p>
+    <w:p>
+      <w:pPr>
+        <w:pBdr>
+          <w:bottom w:val="single" w:color="D9DBE5" w:sz="4" w:space="4"/>
+        </w:pBdr>
+        <w:spacing w:after="200"/>
+      </w:pPr>
+      <w:r>
+        <w:t xml:space="preserve"/>
+      </w:r>
+    </w:p>
+    <w:p>
+      <w:r>
+        <w:br w:type="page"/>
+      </w:r>
+    </w:p>
+    <w:p>
+      <w:pPr>
+        <w:pStyle w:val="Heading1"/>
+      </w:pPr>
+      <w:r>
+        <w:t xml:space="preserve">Planned prompts to complete the project</w:t>
+      </w:r>
+    </w:p>
+    <w:p>
+      <w:pPr>
+        <w:spacing w:after="80"/>
+      </w:pPr>
+      <w:r>
+        <w:rPr>
+          <w:sz w:val="21"/>
+          <w:szCs w:val="21"/>
+        </w:rPr>
+        <w:t xml:space="preserve">These prompts have not been run yet. Run them in order; after each one, move it into the log above with its result.</w:t>
       </w:r>
     </w:p>
     <w:p>
@@ -10660,7 +11381,7 @@
         <w:keepNext/>
       </w:pPr>
       <w:r>
-        <w:t xml:space="preserve">P3  Charts, budgets, forecast, insights, search and notifications</w:t>
+        <w:t xml:space="preserve">P1  Group splitting and the debt-simplification algorithm</w:t>
       </w:r>
     </w:p>
     <w:p>
@@ -10708,7 +11429,7 @@
           <w:sz w:val="19"/>
           <w:szCs w:val="19"/>
         </w:rPr>
-        <w:t xml:space="preserve">Render the dashboard and analytics charts with Chart.js 4 loaded from a pinned CDN URL, reading colours from the CSS custom properties so both themes work, and keep the CSS charts as a fallback. Compute budget status (ok under 75%, caution 75-90%, warning 90-100%, danger over 100%) and update the meters. Port the spending forecast (average daily spend multiplied by the days in the month) to client/js/domain/forecast.js. Generate smart insights from the data (over-budget categories, month-over-month change, upcoming recurring bills). Make the topbar search show live results across expenses, groups and lists in a listbox with keyboard navigation, and make the bell open a notifications panel built from the insights with an unread count.</w:t>
+        <w:t xml:space="preserve">In client/js/domain/splits.js implement equal splits in integer paise with the leftover paise assigned to the payer, and custom splits that must sum exactly to the total. On the shared-expense form show a live "remaining to assign" counter and disable submit until it reaches zero. In client/js/domain/settle.js implement net balances (paid minus share) and the greedy minimum-cash-flow algorithm: repeatedly match the largest debtor with the largest creditor and transfer min(debt, credit) until every balance is within one paisa; return the transfer list and the number of original pairwise debts. Render the settle-up page from it, and make "Mark paid" record a settlement and recompute balances. Add unit tests runnable with node --test using the Goa Trip example (balances +1700, -2500, +5700, -4900 give 3 transfers).</w:t>
       </w:r>
     </w:p>
     <w:p>
@@ -10736,7 +11457,7 @@
           <w:sz w:val="21"/>
           <w:szCs w:val="21"/>
         </w:rPr>
-        <w:t xml:space="preserve">Finish the interactive features that were disconnected in the original app.</w:t>
+        <w:t xml:space="preserve">Show algorithmic JavaScript, the core idea of SplitStack.</w:t>
       </w:r>
     </w:p>
     <w:p>
@@ -10764,7 +11485,7 @@
           <w:sz w:val="21"/>
           <w:szCs w:val="21"/>
         </w:rPr>
-        <w:t xml:space="preserve">client/js/pages/dashboard.js, client/js/pages/analytics.js, client/js/domain/forecast.js, client/js/ui/search.js, client/js/ui/notifications.js</w:t>
+        <w:t xml:space="preserve">client/js/domain/splits.js, client/js/domain/settle.js, tests/client/*.test.js</w:t>
       </w:r>
     </w:p>
     <w:p>
@@ -10773,7 +11494,7 @@
         <w:keepNext/>
       </w:pPr>
       <w:r>
-        <w:t xml:space="preserve">P4  Shopping checklist and receipt scan preview</w:t>
+        <w:t xml:space="preserve">P2  Charts, budgets, forecast, insights, search and notifications</w:t>
       </w:r>
     </w:p>
     <w:p>
@@ -10821,7 +11542,7 @@
           <w:sz w:val="19"/>
           <w:szCs w:val="19"/>
         </w:rPr>
-        <w:t xml:space="preserve">Make the shopping checklist toggle items with optimistic UI, edit actual prices inline, recompute the estimated, actual and variance totals live, and convert the list to an expense only once (prevent duplicates). On the receipt scan page add drag-and-drop with dragenter/dragleave styling, client-side checks (PNG, JPEG or WEBP, up to 5 MB) and an image preview via URL.createObjectURL. Until the backend exists, run OCR in the browser with tesseract.js from a pinned CDN, parse the merchant, date and total with regular expressions (prefer the line containing TOTAL), show progress, and pre-fill the confirm form.</w:t>
+        <w:t xml:space="preserve">Render the dashboard and analytics charts with Chart.js 4 loaded from a pinned CDN URL, reading colours from the CSS custom properties so both themes work, and keep the CSS charts as a fallback. Compute budget status (ok under 75%, caution 75-90%, warning 90-100%, danger over 100%) and update the meters. Port the spending forecast (average daily spend multiplied by the days in the month) to client/js/domain/forecast.js. Generate smart insights from the data (over-budget categories, month-over-month change, upcoming recurring bills). Make the topbar search show live results across expenses, groups and lists in a listbox with keyboard navigation, and make the bell open a notifications panel built from the insights with an unread count.</w:t>
       </w:r>
     </w:p>
     <w:p>
@@ -10849,7 +11570,7 @@
           <w:sz w:val="21"/>
           <w:szCs w:val="21"/>
         </w:rPr>
-        <w:t xml:space="preserve">Complete the remaining interactive flows.</w:t>
+        <w:t xml:space="preserve">Finish the interactive features that were disconnected in the original app.</w:t>
       </w:r>
     </w:p>
     <w:p>
@@ -10877,7 +11598,7 @@
           <w:sz w:val="21"/>
           <w:szCs w:val="21"/>
         </w:rPr>
-        <w:t xml:space="preserve">client/js/pages/shopping-detail.js, client/js/pages/receipt-scan.js, client/js/domain/receipt-parser.js</w:t>
+        <w:t xml:space="preserve">client/js/pages/dashboard.js, client/js/pages/analytics.js, client/js/domain/forecast.js, client/js/ui/search.js, client/js/ui/notifications.js</w:t>
       </w:r>
     </w:p>
     <w:p>
@@ -10886,7 +11607,7 @@
         <w:keepNext/>
       </w:pPr>
       <w:r>
-        <w:t xml:space="preserve">P5  Review 2 QA, log and commit</w:t>
+        <w:t xml:space="preserve">P3  Shopping checklist and receipt scan preview</w:t>
       </w:r>
     </w:p>
     <w:p>
@@ -10934,7 +11655,7 @@
           <w:sz w:val="19"/>
           <w:szCs w:val="19"/>
         </w:rPr>
-        <w:t xml:space="preserve">Run ESLint (recommended rules, browser globals, ES2023 modules) over client/js and fix every finding; run the domain unit tests; test every page manually at 1366px and 375px in dark and light themes, using only the keyboard, and with JavaScript disabled (pages must still show their static content). Update client/README.md with the JavaScript architecture and a table of the JS concepts used and where. Add each step to docs/prompt_log.json, rebuild the Word and PDF logs, and commit "Review 2".</w:t>
+        <w:t xml:space="preserve">Make the shopping checklist toggle items with optimistic UI, edit actual prices inline, recompute the estimated, actual and variance totals live, and convert the list to an expense only once (prevent duplicates). On the receipt scan page add drag-and-drop with dragenter/dragleave styling, client-side checks (PNG, JPEG or WEBP, up to 5 MB) and an image preview via URL.createObjectURL. Until the backend exists, run OCR in the browser with tesseract.js from a pinned CDN, parse the merchant, date and total with regular expressions (prefer the line containing TOTAL), show progress, and pre-fill the confirm form.</w:t>
       </w:r>
     </w:p>
     <w:p>
@@ -10962,7 +11683,7 @@
           <w:sz w:val="21"/>
           <w:szCs w:val="21"/>
         </w:rPr>
-        <w:t xml:space="preserve">Close Review 2 with evidence.</w:t>
+        <w:t xml:space="preserve">Complete the remaining interactive flows.</w:t>
       </w:r>
     </w:p>
     <w:p>
@@ -10990,7 +11711,7 @@
           <w:sz w:val="21"/>
           <w:szCs w:val="21"/>
         </w:rPr>
-        <w:t xml:space="preserve">eslint.config.js, client/README.md, docs/*</w:t>
+        <w:t xml:space="preserve">client/js/pages/shopping-detail.js, client/js/pages/receipt-scan.js, client/js/domain/receipt-parser.js</w:t>
       </w:r>
     </w:p>
     <w:p>
@@ -10999,7 +11720,7 @@
         <w:keepNext/>
       </w:pPr>
       <w:r>
-        <w:t xml:space="preserve">P6  Express server and MongoDB connection</w:t>
+        <w:t xml:space="preserve">P4  Review 2 QA, log and commit</w:t>
       </w:r>
     </w:p>
     <w:p>
@@ -11013,7 +11734,7 @@
           <w:sz w:val="18"/>
           <w:szCs w:val="18"/>
         </w:rPr>
-        <w:t xml:space="preserve">Review 3  |  Planned prompt</w:t>
+        <w:t xml:space="preserve">Review 2  |  Planned prompt</w:t>
       </w:r>
     </w:p>
     <w:p>
@@ -11047,7 +11768,7 @@
           <w:sz w:val="19"/>
           <w:szCs w:val="19"/>
         </w:rPr>
-        <w:t xml:space="preserve">Create server/ as a Node.js 20+ project (ES modules) with Express: server/src/app.js (helmet with a Content Security Policy that allows only the CDNs in use, compression, express.json, express-session stored with connect-mongo, express-rate-limit on auth and upload routes, a CSRF token check on state-changing requests, and a central error handler returning JSON {error, fields}), server/src/index.js (connect to MongoDB Atlas with Mongoose using MONGODB_URI from server/.env, then listen), and static serving of client/. Add server/.env.example (MONGODB_URI, SESSION_SECRET of at least 32 characters, PORT) and npm scripts dev (node --watch) and start. Never commit .env.</w:t>
+        <w:t xml:space="preserve">Run ESLint (recommended rules, browser globals, ES2023 modules) over client/js and fix every finding; run the domain unit tests; test every page manually at 1366px and 375px in dark and light themes, using only the keyboard, and with JavaScript disabled (pages must still show their static content). Update client/README.md with the JavaScript architecture and a table of the JS concepts used and where. Add each step to docs/prompt_log.json, rebuild the Word and PDF logs, and commit "Review 2".</w:t>
       </w:r>
     </w:p>
     <w:p>
@@ -11075,7 +11796,7 @@
           <w:sz w:val="21"/>
           <w:szCs w:val="21"/>
         </w:rPr>
-        <w:t xml:space="preserve">Start Review 3 with a secure, conventional Express setup.</w:t>
+        <w:t xml:space="preserve">Close Review 2 with evidence.</w:t>
       </w:r>
     </w:p>
     <w:p>
@@ -11103,7 +11824,7 @@
           <w:sz w:val="21"/>
           <w:szCs w:val="21"/>
         </w:rPr>
-        <w:t xml:space="preserve">server/package.json, server/src/app.js, server/src/index.js, server/.env.example</w:t>
+        <w:t xml:space="preserve">eslint.config.js, client/README.md, docs/*</w:t>
       </w:r>
     </w:p>
     <w:p>
@@ -11112,7 +11833,7 @@
         <w:keepNext/>
       </w:pPr>
       <w:r>
-        <w:t xml:space="preserve">P7  Mongoose data models</w:t>
+        <w:t xml:space="preserve">P5  Express server and MongoDB connection</w:t>
       </w:r>
     </w:p>
     <w:p>
@@ -11160,7 +11881,7 @@
           <w:sz w:val="19"/>
           <w:szCs w:val="19"/>
         </w:rPr>
-        <w:t xml:space="preserve">Design Mongoose schemas with validation and indexes to replace the 15 SQLite tables: User (name, email unique and lowercase, passwordHash, preferences), Category (user, or null for defaults; name; type expense or income; icon; color), Expense and Income (user, category, amount stored as integer paise, date, description or source, paymentMethod), Budget (user, category or null, month, year, limit; unique on user+category+month+year), Recurring (name, amount, frequency, startDate, nextDueDate, active), Group (name, description, createdBy, members [{user, role admin|member, joinedAt}]), SharedExpense (group, title, amount, paidBy, category, date, splitType, shares [{user, amount}] with a validator that the shares sum to the amount), Settlement (group, payer, payee, amount, status, completedAt), ShoppingList (owner, optional group, name, budget, items [{name, quantity, estimatedPrice, actualPrice, purchased, assignedTo}], convertedExpense), Receipt (user, file reference, merchant, date, amount, rawText, confidence) and Insight (user, kind, message, read). Explain in comments which data is embedded and which is referenced, and why.</w:t>
+        <w:t xml:space="preserve">Create server/ as a Node.js 20+ project (ES modules) with Express: server/src/app.js (helmet with a Content Security Policy that allows only the CDNs in use, compression, express.json, express-session stored with connect-mongo, express-rate-limit on auth and upload routes, a CSRF token check on state-changing requests, and a central error handler returning JSON {error, fields}), server/src/index.js (connect to MongoDB Atlas with Mongoose using MONGODB_URI from server/.env, then listen), and static serving of client/. Add server/.env.example (MONGODB_URI, SESSION_SECRET of at least 32 characters, PORT) and npm scripts dev (node --watch) and start. Never commit .env.</w:t>
       </w:r>
     </w:p>
     <w:p>
@@ -11188,7 +11909,7 @@
           <w:sz w:val="21"/>
           <w:szCs w:val="21"/>
         </w:rPr>
-        <w:t xml:space="preserve">Show MongoDB data modelling, the core of Review 3.</w:t>
+        <w:t xml:space="preserve">Start Review 3 with a secure, conventional Express setup.</w:t>
       </w:r>
     </w:p>
     <w:p>
@@ -11216,7 +11937,7 @@
           <w:sz w:val="21"/>
           <w:szCs w:val="21"/>
         </w:rPr>
-        <w:t xml:space="preserve">server/src/models/*.js</w:t>
+        <w:t xml:space="preserve">server/package.json, server/src/app.js, server/src/index.js, server/.env.example</w:t>
       </w:r>
     </w:p>
     <w:p>
@@ -11225,7 +11946,7 @@
         <w:keepNext/>
       </w:pPr>
       <w:r>
-        <w:t xml:space="preserve">P8  Authentication and REST API</w:t>
+        <w:t xml:space="preserve">P6  Mongoose data models</w:t>
       </w:r>
     </w:p>
     <w:p>
@@ -11273,7 +11994,7 @@
           <w:sz w:val="19"/>
           <w:szCs w:val="19"/>
         </w:rPr>
-        <w:t xml:space="preserve">Implement the REST API under /api with one express.Router per module, mirroring the 48 legacy Flask routes: /api/auth (register with bcrypt cost 12, login, logout, me), /api/expenses, /api/income, /api/categories, /api/budgets, /api/recurring (including toggle), /api/groups (members, shared expenses, balances, settlements, leave), /api/shopping (lists, items, toggle, convert to expense), /api/analytics (monthly, categories, forecast, insights) and /api/search. Validate every input with a schema (zod or express-validator), check ownership or group membership on every request, use MongoDB transactions for multi-document writes (recording a settlement, converting a list), and reuse the Review 2 settle.js and splits.js modules on the server so the algorithm has a single implementation.</w:t>
+        <w:t xml:space="preserve">Design Mongoose schemas with validation and indexes to replace the 15 SQLite tables: User (name, email unique and lowercase, passwordHash, preferences), Category (user, or null for defaults; name; type expense or income; icon; color), Expense and Income (user, category, amount stored as integer paise, date, description or source, paymentMethod), Budget (user, category or null, month, year, limit; unique on user+category+month+year), Recurring (name, amount, frequency, startDate, nextDueDate, active), Group (name, description, createdBy, members [{user, role admin|member, joinedAt}]), SharedExpense (group, title, amount, paidBy, category, date, splitType, shares [{user, amount}] with a validator that the shares sum to the amount), Settlement (group, payer, payee, amount, status, completedAt), ShoppingList (owner, optional group, name, budget, items [{name, quantity, estimatedPrice, actualPrice, purchased, assignedTo}], convertedExpense), Receipt (user, file reference, merchant, date, amount, rawText, confidence) and Insight (user, kind, message, read). Explain in comments which data is embedded and which is referenced, and why.</w:t>
       </w:r>
     </w:p>
     <w:p>
@@ -11301,7 +12022,7 @@
           <w:sz w:val="21"/>
           <w:szCs w:val="21"/>
         </w:rPr>
-        <w:t xml:space="preserve">Deliver the Node.js back end with a complete, secure API.</w:t>
+        <w:t xml:space="preserve">Show MongoDB data modelling, the core of Review 3.</w:t>
       </w:r>
     </w:p>
     <w:p>
@@ -11329,7 +12050,7 @@
           <w:sz w:val="21"/>
           <w:szCs w:val="21"/>
         </w:rPr>
-        <w:t xml:space="preserve">server/src/routes/*.js, server/src/services/*.js, server/src/middleware/*.js</w:t>
+        <w:t xml:space="preserve">server/src/models/*.js</w:t>
       </w:r>
     </w:p>
     <w:p>
@@ -11338,7 +12059,7 @@
         <w:keepNext/>
       </w:pPr>
       <w:r>
-        <w:t xml:space="preserve">P9  Receipt upload and server-side OCR</w:t>
+        <w:t xml:space="preserve">P7  Authentication and REST API</w:t>
       </w:r>
     </w:p>
     <w:p>
@@ -11386,7 +12107,7 @@
           <w:sz w:val="19"/>
           <w:szCs w:val="19"/>
         </w:rPr>
-        <w:t xml:space="preserve">Add POST /api/receipts using multer with memory storage, a 5 MB limit and magic-byte checks for PNG, JPEG and WEBP; preprocess with sharp (rotate from EXIF, greyscale, upscale small images, normalise); run tesseract.js with one shared worker; parse the merchant, date and total with the Review 2 parser; store the image in MongoDB GridFS (so it survives redeploys on free hosting) and the parsed fields in Receipt. GET /api/receipts/:id/image streams the image only to its owner. Confirming creates the expense; nothing becomes an expense without confirmation.</w:t>
+        <w:t xml:space="preserve">Implement the REST API under /api with one express.Router per module, mirroring the 48 legacy Flask routes: /api/auth (register with bcrypt cost 12, login, logout, me), /api/expenses, /api/income, /api/categories, /api/budgets, /api/recurring (including toggle), /api/groups (members, shared expenses, balances, settlements, leave), /api/shopping (lists, items, toggle, convert to expense), /api/analytics (monthly, categories, forecast, insights) and /api/search. Validate every input with a schema (zod or express-validator), check ownership or group membership on every request, use MongoDB transactions for multi-document writes (recording a settlement, converting a list), and reuse the Review 2 settle.js and splits.js modules on the server so the algorithm has a single implementation.</w:t>
       </w:r>
     </w:p>
     <w:p>
@@ -11414,7 +12135,7 @@
           <w:sz w:val="21"/>
           <w:szCs w:val="21"/>
         </w:rPr>
-        <w:t xml:space="preserve">Port the OCR feature to Node with persistent storage.</w:t>
+        <w:t xml:space="preserve">Deliver the Node.js back end with a complete, secure API.</w:t>
       </w:r>
     </w:p>
     <w:p>
@@ -11442,7 +12163,7 @@
           <w:sz w:val="21"/>
           <w:szCs w:val="21"/>
         </w:rPr>
-        <w:t xml:space="preserve">server/src/routes/receipts.js, server/src/services/ocr.js</w:t>
+        <w:t xml:space="preserve">server/src/routes/*.js, server/src/services/*.js, server/src/middleware/*.js</w:t>
       </w:r>
     </w:p>
     <w:p>
@@ -11451,7 +12172,7 @@
         <w:keepNext/>
       </w:pPr>
       <w:r>
-        <w:t xml:space="preserve">P10  Connect the client to the API</w:t>
+        <w:t xml:space="preserve">P8  Receipt upload and server-side OCR</w:t>
       </w:r>
     </w:p>
     <w:p>
@@ -11499,7 +12220,7 @@
           <w:sz w:val="19"/>
           <w:szCs w:val="19"/>
         </w:rPr>
-        <w:t xml:space="preserve">Re-implement client/js/data/api.js with fetch() against /api, sending credentials and the CSRF token header, mapping HTTP errors to the same {field, message} errors the pages already handle, and showing a toast when offline. Remove the localStorage store except for the theme preference. Because the page code depends only on api.js, no page module should need changes; confirm this by running every flow end to end against a local server connected to Atlas.</w:t>
+        <w:t xml:space="preserve">Add POST /api/receipts using multer with memory storage, a 5 MB limit and magic-byte checks for PNG, JPEG and WEBP; preprocess with sharp (rotate from EXIF, greyscale, upscale small images, normalise); run tesseract.js with one shared worker; parse the merchant, date and total with the Review 2 parser; store the image in MongoDB GridFS (so it survives redeploys on free hosting) and the parsed fields in Receipt. GET /api/receipts/:id/image streams the image only to its owner. Confirming creates the expense; nothing becomes an expense without confirmation.</w:t>
       </w:r>
     </w:p>
     <w:p>
@@ -11527,7 +12248,7 @@
           <w:sz w:val="21"/>
           <w:szCs w:val="21"/>
         </w:rPr>
-        <w:t xml:space="preserve">Finish the full-stack integration.</w:t>
+        <w:t xml:space="preserve">Port the OCR feature to Node with persistent storage.</w:t>
       </w:r>
     </w:p>
     <w:p>
@@ -11555,7 +12276,7 @@
           <w:sz w:val="21"/>
           <w:szCs w:val="21"/>
         </w:rPr>
-        <w:t xml:space="preserve">client/js/data/api.js</w:t>
+        <w:t xml:space="preserve">server/src/routes/receipts.js, server/src/services/ocr.js</w:t>
       </w:r>
     </w:p>
     <w:p>
@@ -11564,7 +12285,7 @@
         <w:keepNext/>
       </w:pPr>
       <w:r>
-        <w:t xml:space="preserve">P11  Seed data and automated tests</w:t>
+        <w:t xml:space="preserve">P9  Connect the client to the API</w:t>
       </w:r>
     </w:p>
     <w:p>
@@ -11612,7 +12333,7 @@
           <w:sz w:val="19"/>
           <w:szCs w:val="19"/>
         </w:rPr>
-        <w:t xml:space="preserve">Add server/scripts/seed.js that creates the demo user, categories, six months of expenses and income, budgets, recurring payments, the three groups with shared expenses, and shopping lists. It must be idempotent and must refuse to run against a database whose name does not end in -dev or -test unless --force is passed. Write Jest + Supertest tests using mongodb-memory-server for auth, ownership checks, CSRF rejection, rate limiting, split validation, the settlement algorithm, budget status, convert-to-expense duplicate prevention and receipt upload validation, covering what the 47 legacy Python tests checked. Add an npm test script and a GitHub Actions workflow that runs lint and tests on every push.</w:t>
+        <w:t xml:space="preserve">Re-implement client/js/data/api.js with fetch() against /api, sending credentials and the CSRF token header, mapping HTTP errors to the same {field, message} errors the pages already handle, and showing a toast when offline. Remove the localStorage store except for the theme preference. Because the page code depends only on api.js, no page module should need changes; confirm this by running every flow end to end against a local server connected to Atlas.</w:t>
       </w:r>
     </w:p>
     <w:p>
@@ -11640,7 +12361,7 @@
           <w:sz w:val="21"/>
           <w:szCs w:val="21"/>
         </w:rPr>
-        <w:t xml:space="preserve">Prove the back end works and keep it working.</w:t>
+        <w:t xml:space="preserve">Finish the full-stack integration.</w:t>
       </w:r>
     </w:p>
     <w:p>
@@ -11668,7 +12389,7 @@
           <w:sz w:val="21"/>
           <w:szCs w:val="21"/>
         </w:rPr>
-        <w:t xml:space="preserve">server/scripts/seed.js, server/tests/*.test.js, .github/workflows/ci.yml</w:t>
+        <w:t xml:space="preserve">client/js/data/api.js</w:t>
       </w:r>
     </w:p>
     <w:p>
@@ -11677,7 +12398,120 @@
         <w:keepNext/>
       </w:pPr>
       <w:r>
-        <w:t xml:space="preserve">P12  Remove legacy code, document and deploy</w:t>
+        <w:t xml:space="preserve">P10  Seed data and automated tests</w:t>
+      </w:r>
+    </w:p>
+    <w:p>
+      <w:pPr>
+        <w:keepNext/>
+        <w:spacing w:after="60"/>
+      </w:pPr>
+      <w:r>
+        <w:rPr>
+          <w:color w:val="5B6475"/>
+          <w:sz w:val="18"/>
+          <w:szCs w:val="18"/>
+        </w:rPr>
+        <w:t xml:space="preserve">Review 3  |  Planned prompt</w:t>
+      </w:r>
+    </w:p>
+    <w:p>
+      <w:pPr>
+        <w:spacing w:after="60" w:before="160"/>
+      </w:pPr>
+      <w:r>
+        <w:rPr>
+          <w:b/>
+          <w:bCs/>
+          <w:color w:val="4F46E5"/>
+          <w:spacing w:val="20"/>
+          <w:sz w:val="17"/>
+          <w:szCs w:val="17"/>
+        </w:rPr>
+        <w:t xml:space="preserve">PROMPT</w:t>
+      </w:r>
+    </w:p>
+    <w:p>
+      <w:pPr>
+        <w:pBdr>
+          <w:left w:val="single" w:color="4F46E5" w:sz="18" w:space="8"/>
+        </w:pBdr>
+        <w:shd w:fill="F1F2F8" w:color="auto" w:val="clear"/>
+        <w:spacing w:after="120" w:before="40" w:line="276"/>
+        <w:ind w:left="160" w:right="160"/>
+      </w:pPr>
+      <w:r>
+        <w:rPr>
+          <w:rFonts w:ascii="Consolas" w:cs="Consolas" w:eastAsia="Consolas" w:hAnsi="Consolas"/>
+          <w:sz w:val="19"/>
+          <w:szCs w:val="19"/>
+        </w:rPr>
+        <w:t xml:space="preserve">Add server/scripts/seed.js that creates the demo user, categories, six months of expenses and income, budgets, recurring payments, the three groups with shared expenses, and shopping lists. It must be idempotent and must refuse to run against a database whose name does not end in -dev or -test unless --force is passed. Write Jest + Supertest tests using mongodb-memory-server for auth, ownership checks, CSRF rejection, rate limiting, split validation, the settlement algorithm, budget status, convert-to-expense duplicate prevention and receipt upload validation, covering what the 47 legacy Python tests checked. Add an npm test script and a GitHub Actions workflow that runs lint and tests on every push.</w:t>
+      </w:r>
+    </w:p>
+    <w:p>
+      <w:pPr>
+        <w:spacing w:after="60" w:before="160"/>
+      </w:pPr>
+      <w:r>
+        <w:rPr>
+          <w:b/>
+          <w:bCs/>
+          <w:color w:val="4F46E5"/>
+          <w:spacing w:val="20"/>
+          <w:sz w:val="17"/>
+          <w:szCs w:val="17"/>
+        </w:rPr>
+        <w:t xml:space="preserve">PURPOSE</w:t>
+      </w:r>
+    </w:p>
+    <w:p>
+      <w:pPr>
+        <w:spacing w:after="80"/>
+      </w:pPr>
+      <w:r>
+        <w:rPr>
+          <w:sz w:val="21"/>
+          <w:szCs w:val="21"/>
+        </w:rPr>
+        <w:t xml:space="preserve">Prove the back end works and keep it working.</w:t>
+      </w:r>
+    </w:p>
+    <w:p>
+      <w:pPr>
+        <w:spacing w:after="60" w:before="160"/>
+      </w:pPr>
+      <w:r>
+        <w:rPr>
+          <w:b/>
+          <w:bCs/>
+          <w:color w:val="4F46E5"/>
+          <w:spacing w:val="20"/>
+          <w:sz w:val="17"/>
+          <w:szCs w:val="17"/>
+        </w:rPr>
+        <w:t xml:space="preserve">FILES</w:t>
+      </w:r>
+    </w:p>
+    <w:p>
+      <w:pPr>
+        <w:spacing w:after="80"/>
+      </w:pPr>
+      <w:r>
+        <w:rPr>
+          <w:sz w:val="21"/>
+          <w:szCs w:val="21"/>
+        </w:rPr>
+        <w:t xml:space="preserve">server/scripts/seed.js, server/tests/*.test.js, .github/workflows/ci.yml</w:t>
+      </w:r>
+    </w:p>
+    <w:p>
+      <w:pPr>
+        <w:pStyle w:val="Heading3"/>
+        <w:keepNext/>
+      </w:pPr>
+      <w:r>
+        <w:t xml:space="preserve">P11  Remove legacy code, document and deploy</w:t>
       </w:r>
     </w:p>
     <w:p>

</xml_diff>

<commit_message>
Review 2: group splitting and debt simplification
</commit_message>
<xml_diff>
--- a/docs/SplitStack_Prompt_Log.docx
+++ b/docs/SplitStack_Prompt_Log.docx
@@ -132,7 +132,7 @@
           <w:sz w:val="21"/>
           <w:szCs w:val="21"/>
         </w:rPr>
-        <w:t xml:space="preserve">29</w:t>
+        <w:t xml:space="preserve">31</w:t>
       </w:r>
     </w:p>
     <w:p>
@@ -568,7 +568,7 @@
                 <w:sz w:val="18"/>
                 <w:szCs w:val="18"/>
               </w:rPr>
-              <w:t xml:space="preserve">8</w:t>
+              <w:t xml:space="preserve">10</w:t>
             </w:r>
           </w:p>
         </w:tc>
@@ -4335,6 +4335,245 @@
           </w:p>
         </w:tc>
       </w:tr>
+      <w:tr>
+        <w:tc>
+          <w:tcPr>
+            <w:tcW w:type="dxa" w:w="700"/>
+            <w:shd w:fill="F7F7FB" w:color="auto" w:val="clear"/>
+            <w:tcMar>
+              <w:top w:type="dxa" w:w="60"/>
+              <w:left w:type="dxa" w:w="100"/>
+              <w:bottom w:type="dxa" w:w="60"/>
+              <w:right w:type="dxa" w:w="100"/>
+            </w:tcMar>
+          </w:tcPr>
+          <w:p>
+            <w:r>
+              <w:rPr>
+                <w:b w:val="false"/>
+                <w:bCs w:val="false"/>
+                <w:color w:val="222222"/>
+                <w:sz w:val="18"/>
+                <w:szCs w:val="18"/>
+              </w:rPr>
+              <w:t xml:space="preserve">30</w:t>
+            </w:r>
+          </w:p>
+        </w:tc>
+        <w:tc>
+          <w:tcPr>
+            <w:tcW w:type="dxa" w:w="1500"/>
+            <w:shd w:fill="F7F7FB" w:color="auto" w:val="clear"/>
+            <w:tcMar>
+              <w:top w:type="dxa" w:w="60"/>
+              <w:left w:type="dxa" w:w="100"/>
+              <w:bottom w:type="dxa" w:w="60"/>
+              <w:right w:type="dxa" w:w="100"/>
+            </w:tcMar>
+          </w:tcPr>
+          <w:p>
+            <w:r>
+              <w:rPr>
+                <w:b w:val="false"/>
+                <w:bCs w:val="false"/>
+                <w:color w:val="222222"/>
+                <w:sz w:val="18"/>
+                <w:szCs w:val="18"/>
+              </w:rPr>
+              <w:t xml:space="preserve">Review 2</w:t>
+            </w:r>
+          </w:p>
+        </w:tc>
+        <w:tc>
+          <w:tcPr>
+            <w:tcW w:type="dxa" w:w="4538"/>
+            <w:shd w:fill="F7F7FB" w:color="auto" w:val="clear"/>
+            <w:tcMar>
+              <w:top w:type="dxa" w:w="60"/>
+              <w:left w:type="dxa" w:w="100"/>
+              <w:bottom w:type="dxa" w:w="60"/>
+              <w:right w:type="dxa" w:w="100"/>
+            </w:tcMar>
+          </w:tcPr>
+          <w:p>
+            <w:r>
+              <w:rPr>
+                <w:b w:val="false"/>
+                <w:bCs w:val="false"/>
+                <w:color w:val="222222"/>
+                <w:sz w:val="18"/>
+                <w:szCs w:val="18"/>
+              </w:rPr>
+              <w:t xml:space="preserve">Request: proceed with Review 2 Step P5</w:t>
+            </w:r>
+          </w:p>
+        </w:tc>
+        <w:tc>
+          <w:tcPr>
+            <w:tcW w:type="dxa" w:w="1500"/>
+            <w:shd w:fill="F7F7FB" w:color="auto" w:val="clear"/>
+            <w:tcMar>
+              <w:top w:type="dxa" w:w="60"/>
+              <w:left w:type="dxa" w:w="100"/>
+              <w:bottom w:type="dxa" w:w="60"/>
+              <w:right w:type="dxa" w:w="100"/>
+            </w:tcMar>
+          </w:tcPr>
+          <w:p>
+            <w:r>
+              <w:rPr>
+                <w:b w:val="false"/>
+                <w:bCs w:val="false"/>
+                <w:color w:val="222222"/>
+                <w:sz w:val="18"/>
+                <w:szCs w:val="18"/>
+              </w:rPr>
+              <w:t xml:space="preserve">User prompt</w:t>
+            </w:r>
+          </w:p>
+        </w:tc>
+        <w:tc>
+          <w:tcPr>
+            <w:tcW w:type="dxa" w:w="1400"/>
+            <w:shd w:fill="F7F7FB" w:color="auto" w:val="clear"/>
+            <w:tcMar>
+              <w:top w:type="dxa" w:w="60"/>
+              <w:left w:type="dxa" w:w="100"/>
+              <w:bottom w:type="dxa" w:w="60"/>
+              <w:right w:type="dxa" w:w="100"/>
+            </w:tcMar>
+          </w:tcPr>
+          <w:p>
+            <w:r>
+              <w:rPr>
+                <w:b w:val="false"/>
+                <w:bCs w:val="false"/>
+                <w:color w:val="222222"/>
+                <w:sz w:val="18"/>
+                <w:szCs w:val="18"/>
+              </w:rPr>
+              <w:t xml:space="preserve">2026-10-16</w:t>
+            </w:r>
+          </w:p>
+        </w:tc>
+      </w:tr>
+      <w:tr>
+        <w:tc>
+          <w:tcPr>
+            <w:tcW w:type="dxa" w:w="700"/>
+            <w:tcMar>
+              <w:top w:type="dxa" w:w="60"/>
+              <w:left w:type="dxa" w:w="100"/>
+              <w:bottom w:type="dxa" w:w="60"/>
+              <w:right w:type="dxa" w:w="100"/>
+            </w:tcMar>
+          </w:tcPr>
+          <w:p>
+            <w:r>
+              <w:rPr>
+                <w:b w:val="false"/>
+                <w:bCs w:val="false"/>
+                <w:color w:val="222222"/>
+                <w:sz w:val="18"/>
+                <w:szCs w:val="18"/>
+              </w:rPr>
+              <w:t xml:space="preserve">31</w:t>
+            </w:r>
+          </w:p>
+        </w:tc>
+        <w:tc>
+          <w:tcPr>
+            <w:tcW w:type="dxa" w:w="1500"/>
+            <w:tcMar>
+              <w:top w:type="dxa" w:w="60"/>
+              <w:left w:type="dxa" w:w="100"/>
+              <w:bottom w:type="dxa" w:w="60"/>
+              <w:right w:type="dxa" w:w="100"/>
+            </w:tcMar>
+          </w:tcPr>
+          <w:p>
+            <w:r>
+              <w:rPr>
+                <w:b w:val="false"/>
+                <w:bCs w:val="false"/>
+                <w:color w:val="222222"/>
+                <w:sz w:val="18"/>
+                <w:szCs w:val="18"/>
+              </w:rPr>
+              <w:t xml:space="preserve">Review 2</w:t>
+            </w:r>
+          </w:p>
+        </w:tc>
+        <w:tc>
+          <w:tcPr>
+            <w:tcW w:type="dxa" w:w="4538"/>
+            <w:tcMar>
+              <w:top w:type="dxa" w:w="60"/>
+              <w:left w:type="dxa" w:w="100"/>
+              <w:bottom w:type="dxa" w:w="60"/>
+              <w:right w:type="dxa" w:w="100"/>
+            </w:tcMar>
+          </w:tcPr>
+          <w:p>
+            <w:r>
+              <w:rPr>
+                <w:b w:val="false"/>
+                <w:bCs w:val="false"/>
+                <w:color w:val="222222"/>
+                <w:sz w:val="18"/>
+                <w:szCs w:val="18"/>
+              </w:rPr>
+              <w:t xml:space="preserve">Group splitting and debt simplification</w:t>
+            </w:r>
+          </w:p>
+        </w:tc>
+        <w:tc>
+          <w:tcPr>
+            <w:tcW w:type="dxa" w:w="1500"/>
+            <w:tcMar>
+              <w:top w:type="dxa" w:w="60"/>
+              <w:left w:type="dxa" w:w="100"/>
+              <w:bottom w:type="dxa" w:w="60"/>
+              <w:right w:type="dxa" w:w="100"/>
+            </w:tcMar>
+          </w:tcPr>
+          <w:p>
+            <w:r>
+              <w:rPr>
+                <w:b w:val="false"/>
+                <w:bCs w:val="false"/>
+                <w:color w:val="222222"/>
+                <w:sz w:val="18"/>
+                <w:szCs w:val="18"/>
+              </w:rPr>
+              <w:t xml:space="preserve">Working prompt</w:t>
+            </w:r>
+          </w:p>
+        </w:tc>
+        <w:tc>
+          <w:tcPr>
+            <w:tcW w:type="dxa" w:w="1400"/>
+            <w:tcMar>
+              <w:top w:type="dxa" w:w="60"/>
+              <w:left w:type="dxa" w:w="100"/>
+              <w:bottom w:type="dxa" w:w="60"/>
+              <w:right w:type="dxa" w:w="100"/>
+            </w:tcMar>
+          </w:tcPr>
+          <w:p>
+            <w:r>
+              <w:rPr>
+                <w:b w:val="false"/>
+                <w:bCs w:val="false"/>
+                <w:color w:val="222222"/>
+                <w:sz w:val="18"/>
+                <w:szCs w:val="18"/>
+              </w:rPr>
+              <w:t xml:space="preserve">2026-10-16</w:t>
+            </w:r>
+          </w:p>
+        </w:tc>
+      </w:tr>
     </w:tbl>
     <w:p>
       <w:r>
@@ -9491,20 +9730,11 @@
     </w:p>
     <w:p>
       <w:pPr>
-        <w:pStyle w:val="Heading2"/>
-        <w:spacing w:before="360"/>
-      </w:pPr>
-      <w:r>
-        <w:t xml:space="preserve">Wrap-up - Documentation, cleanup and deployment</w:t>
-      </w:r>
-    </w:p>
-    <w:p>
-      <w:pPr>
         <w:pStyle w:val="Heading3"/>
         <w:keepNext/>
       </w:pPr>
       <w:r>
-        <w:t xml:space="preserve">#13  Request: GitHub repository, website link and PDF of prompts</w:t>
+        <w:t xml:space="preserve">#30  Request: proceed with Review 2 Step P5</w:t>
       </w:r>
     </w:p>
     <w:p>
@@ -9518,7 +9748,7 @@
           <w:sz w:val="18"/>
           <w:szCs w:val="18"/>
         </w:rPr>
-        <w:t xml:space="preserve">User prompt  |  2026-10-15</w:t>
+        <w:t xml:space="preserve">User prompt  |  2026-10-16</w:t>
       </w:r>
     </w:p>
     <w:p>
@@ -9552,7 +9782,15 @@
           <w:sz w:val="19"/>
           <w:szCs w:val="19"/>
         </w:rPr>
-        <w:t xml:space="preserve">create a new repositry for this project in my gihub , and after than give me the github link and then the website link and also a pdf containing the prompts to complete project.</w:t>
+        <w:t xml:space="preserve"># SplitStack — P5: Group Splitting and Debt Simplification
+You are continuing development of SplitStack, a finance and expense-sharing application. Steps P1–P4 are reported complete. Implement only Step P5: Group Splitting and Debt Simplification.
+1. Mandatory preflight: read P5 instructions in SplitStack_Handover_Prompts.pdf; inspect api.js, store.js, seed.js, groups.js, group-detail.js, settlements.js, shared-expense-form.js, relevant HTML pages, and existing tests; confirm public API signatures and data schema; preserve docs/audit/.
+2. Group expense calculations: handle equal splits with deterministic remainder paise allocation, custom splits with explicit member shares, payer and participant validation, integer-paise conservation, and deletion/editing recalculations.
+3. Net balances: implement single authoritative balance-calculation function (calculateNetBalances) with sign convention (positive = creditor / to receive, negative = debtor / owes, zero = settled), zero-sum invariant across group.
+4. Minimum-cash-flow debt simplification: implement greedy approach matching largest debtor with largest creditor, transferring min(debt, credit), positive integer paise, stable deterministic output, at most N-1 transfers.
+5. Settlement recording: validate group membership, distinct payer/payee, positive integer paise, cannot exceed outstanding debt, duplicate debounce, balance recalculation.
+6. Page integration: connect group-detail and settlements pages to canonical calculation and debt simplification logic with confirmation dialogs and toast feedback.
+7. Automated tests: add comprehensive test suite for splits, balances, simplification, and settlements; run regression suite and HTML lint; update documentation and prompt log; commit locally with message: Review 2: group splitting and debt simplification.</w:t>
       </w:r>
     </w:p>
     <w:p>
@@ -9580,7 +9818,7 @@
           <w:sz w:val="21"/>
           <w:szCs w:val="21"/>
         </w:rPr>
-        <w:t xml:space="preserve">Publish the project under the student's own GitHub account, host the site, and export the prompt log (including the remaining planned prompts) as a PDF.</w:t>
+        <w:t xml:space="preserve">Authorize implementation of Step P5: Group Splitting and Debt Simplification.</w:t>
       </w:r>
     </w:p>
     <w:p>
@@ -9641,7 +9879,7 @@
           <w:sz w:val="21"/>
           <w:szCs w:val="21"/>
         </w:rPr>
-        <w:t xml:space="preserve">Done: see the following entries.</w:t>
+        <w:t xml:space="preserve">Authorized Step P5 implementation.</w:t>
       </w:r>
     </w:p>
     <w:p>
@@ -9689,7 +9927,7 @@
         <w:keepNext/>
       </w:pPr>
       <w:r>
-        <w:t xml:space="preserve">#14  PDF export of the prompt log, including planned prompts</w:t>
+        <w:t xml:space="preserve">#31  Group splitting and debt simplification</w:t>
       </w:r>
     </w:p>
     <w:p>
@@ -9703,7 +9941,7 @@
           <w:sz w:val="18"/>
           <w:szCs w:val="18"/>
         </w:rPr>
-        <w:t xml:space="preserve">Working prompt  |  2026-10-15</w:t>
+        <w:t xml:space="preserve">Working prompt  |  2026-10-16</w:t>
       </w:r>
     </w:p>
     <w:p>
@@ -9737,7 +9975,7 @@
           <w:sz w:val="19"/>
           <w:szCs w:val="19"/>
         </w:rPr>
-        <w:t xml:space="preserve">Export the prompt log to PDF with a Python reportlab script (docs/tools/build_prompt_pdf.py) that reads docs/prompt_log.json: a title page, a stage overview table, a summary of every entry, Part A with every executed prompt verbatim in a shaded box with purpose, files, result and verification, and Part B with the planned prompts that complete Review 2, Review 3 and the wrap-up, clearly marked as not yet run. Add the planned prompts to prompt_log.json and to the Word log as well, and make "npm run log" rebuild both documents.</w:t>
+        <w:t xml:space="preserve">In client/js/domain/splits.js implement equal splits in integer paise with the leftover paise assigned to the payer, and custom splits that must sum exactly to the total. On the shared-expense form show a live "remaining to assign" counter and disable submit until it reaches zero. In client/js/domain/settle.js implement net balances (paid minus share) and the greedy minimum-cash-flow algorithm: repeatedly match the largest debtor with the largest creditor and transfer min(debt, credit) until every balance is within one paisa; return the transfer list and the number of original pairwise debts. Render the settle-up page from it, and make "Mark paid" record a settlement and recompute balances. Add unit tests runnable with node --test using the Goa Trip example (balances +1700, -2500, +5700, -4900 give 3 transfers).</w:t>
       </w:r>
     </w:p>
     <w:p>
@@ -9765,7 +10003,7 @@
           <w:sz w:val="21"/>
           <w:szCs w:val="21"/>
         </w:rPr>
-        <w:t xml:space="preserve">Give the student a PDF containing the prompts needed to complete the whole project.</w:t>
+        <w:t xml:space="preserve">Implement authoritative group expense accounting, deterministic integer-paise remainder allocation, greedy minimum-cash-flow debt simplification, and settlement validation.</w:t>
       </w:r>
     </w:p>
     <w:p>
@@ -9798,7 +10036,7 @@
           <w:sz w:val="19"/>
           <w:szCs w:val="19"/>
         </w:rPr>
-        <w:t xml:space="preserve">docs/tools/build_prompt_pdf.py</w:t>
+        <w:t xml:space="preserve">client/js/domain/splits.js</w:t>
       </w:r>
     </w:p>
     <w:p>
@@ -9815,7 +10053,7 @@
           <w:sz w:val="19"/>
           <w:szCs w:val="19"/>
         </w:rPr>
-        <w:t xml:space="preserve">docs/tools/build-prompt-log.js</w:t>
+        <w:t xml:space="preserve">client/js/domain/settle.js</w:t>
       </w:r>
     </w:p>
     <w:p>
@@ -9832,7 +10070,7 @@
           <w:sz w:val="19"/>
           <w:szCs w:val="19"/>
         </w:rPr>
-        <w:t xml:space="preserve">docs/prompt_log.json</w:t>
+        <w:t xml:space="preserve">client/js/data/api.js</w:t>
       </w:r>
     </w:p>
     <w:p>
@@ -9849,7 +10087,7 @@
           <w:sz w:val="19"/>
           <w:szCs w:val="19"/>
         </w:rPr>
-        <w:t xml:space="preserve">docs/SplitStack_Prompt_Log.pdf</w:t>
+        <w:t xml:space="preserve">client/js/pages/group-detail.js</w:t>
       </w:r>
     </w:p>
     <w:p>
@@ -9866,7 +10104,7 @@
           <w:sz w:val="19"/>
           <w:szCs w:val="19"/>
         </w:rPr>
-        <w:t xml:space="preserve">docs/SplitStack_Prompt_Log.docx</w:t>
+        <w:t xml:space="preserve">client/js/pages/shared-expense-form.js</w:t>
       </w:r>
     </w:p>
     <w:p>
@@ -9883,7 +10121,41 @@
           <w:sz w:val="19"/>
           <w:szCs w:val="19"/>
         </w:rPr>
-        <w:t xml:space="preserve">package.json</w:t>
+        <w:t xml:space="preserve">client/js/pages/settlements.js</w:t>
+      </w:r>
+    </w:p>
+    <w:p>
+      <w:pPr>
+        <w:pStyle w:val="ListParagraph"/>
+        <w:numPr>
+          <w:ilvl w:val="0"/>
+          <w:numId w:val="2"/>
+        </w:numPr>
+      </w:pPr>
+      <w:r>
+        <w:rPr>
+          <w:rFonts w:ascii="Consolas" w:cs="Consolas" w:eastAsia="Consolas" w:hAnsi="Consolas"/>
+          <w:sz w:val="19"/>
+          <w:szCs w:val="19"/>
+        </w:rPr>
+        <w:t xml:space="preserve">tests/client/splits-settle.test.mjs</w:t>
+      </w:r>
+    </w:p>
+    <w:p>
+      <w:pPr>
+        <w:pStyle w:val="ListParagraph"/>
+        <w:numPr>
+          <w:ilvl w:val="0"/>
+          <w:numId w:val="2"/>
+        </w:numPr>
+      </w:pPr>
+      <w:r>
+        <w:rPr>
+          <w:rFonts w:ascii="Consolas" w:cs="Consolas" w:eastAsia="Consolas" w:hAnsi="Consolas"/>
+          <w:sz w:val="19"/>
+          <w:szCs w:val="19"/>
+        </w:rPr>
+        <w:t xml:space="preserve">client/README.md</w:t>
       </w:r>
     </w:p>
     <w:p>
@@ -9911,7 +10183,7 @@
           <w:sz w:val="21"/>
           <w:szCs w:val="21"/>
         </w:rPr>
-        <w:t xml:space="preserve">PDF with the executed prompts and 15 planned prompts; the Word log has the same content.</w:t>
+        <w:t xml:space="preserve">Created domain modules splits.js (equal split with deterministic remainder paise to payer, custom shares validation) and settle.js (canonical calculateNetBalances with strict zero-sum conservation invariant, greedy simplifyDebts minimizing payments to at most N-1); integrated into api.js (createSharedExpense, updateSharedExpense, getGroupBalances, getGroupMemberStats, getSuggestedSettlements, recordSettlement with debt-limit validation, removeSettlement); wired live remaining tracker in shared-expense-form.js; updated group-detail.js to show member paid/share/net and suggested settlements; updated settlements.js with confirmDialog, toast notifications, loading states, and settlement removal; added 27 comprehensive automated tests.</w:t>
       </w:r>
     </w:p>
     <w:p>
@@ -9939,7 +10211,7 @@
           <w:sz w:val="21"/>
           <w:szCs w:val="21"/>
         </w:rPr>
-        <w:t xml:space="preserve">Pages rendered to images and inspected; text extracted with pypdf.</w:t>
+        <w:t xml:space="preserve">104 total client tests passing across 4 test suites (data-layer.test.mjs, render.test.mjs, forms.test.mjs, splits-settle.test.mjs); npm run lint:html passing with 0 errors across 25 HTML files.</w:t>
       </w:r>
     </w:p>
     <w:p>
@@ -9955,11 +10227,20 @@
     </w:p>
     <w:p>
       <w:pPr>
+        <w:pStyle w:val="Heading2"/>
+        <w:spacing w:before="360"/>
+      </w:pPr>
+      <w:r>
+        <w:t xml:space="preserve">Wrap-up - Documentation, cleanup and deployment</w:t>
+      </w:r>
+    </w:p>
+    <w:p>
+      <w:pPr>
         <w:pStyle w:val="Heading3"/>
         <w:keepNext/>
       </w:pPr>
       <w:r>
-        <w:t xml:space="preserve">#15  Create the GitHub repository and push the code</w:t>
+        <w:t xml:space="preserve">#13  Request: GitHub repository, website link and PDF of prompts</w:t>
       </w:r>
     </w:p>
     <w:p>
@@ -9973,7 +10254,7 @@
           <w:sz w:val="18"/>
           <w:szCs w:val="18"/>
         </w:rPr>
-        <w:t xml:space="preserve">Working prompt  |  2026-10-15</w:t>
+        <w:t xml:space="preserve">User prompt  |  2026-10-15</w:t>
       </w:r>
     </w:p>
     <w:p>
@@ -10007,7 +10288,7 @@
           <w:sz w:val="19"/>
           <w:szCs w:val="19"/>
         </w:rPr>
-        <w:t xml:space="preserve">Install the official GitHub CLI with winget and sign in through the device-code flow (the student approves it in the browser). Before publishing, check that no secrets or databases are tracked, review the receipt images that are still in the commit history (they are generic sample invoices), and confirm with the student that a public repository is acceptable because the team's original repository is private. Then create the public repository MahaprabhuK/SplitStack, push the refurbish branch as main together with the legacy branch, add a GitHub Actions workflow (.github/workflows/pages.yml) that deploys the client/ folder to GitHub Pages, enable Pages with the "GitHub Actions" source, and confirm that the site responds.</w:t>
+        <w:t xml:space="preserve">create a new repositry for this project in my gihub , and after than give me the github link and then the website link and also a pdf containing the prompts to complete project.</w:t>
       </w:r>
     </w:p>
     <w:p>
@@ -10035,7 +10316,7 @@
           <w:sz w:val="21"/>
           <w:szCs w:val="21"/>
         </w:rPr>
-        <w:t xml:space="preserve">Give the student a repository link and a live website link.</w:t>
+        <w:t xml:space="preserve">Publish the project under the student's own GitHub account, host the site, and export the prompt log (including the remaining planned prompts) as a PDF.</w:t>
       </w:r>
     </w:p>
     <w:p>
@@ -10068,7 +10349,7 @@
           <w:sz w:val="19"/>
           <w:szCs w:val="19"/>
         </w:rPr>
-        <w:t xml:space="preserve">README.md</w:t>
+        <w:t xml:space="preserve">-</w:t>
       </w:r>
     </w:p>
     <w:p>
@@ -10096,7 +10377,7 @@
           <w:sz w:val="21"/>
           <w:szCs w:val="21"/>
         </w:rPr>
-        <w:t xml:space="preserve">Public repository https://github.com/MahaprabhuK/SplitStack created and the legacy branch pushed. The first push of main was rejected because it added a GitHub Actions workflow (.github/workflows/pages.yml) and the gh token lacked the "workflow" scope; the workflow file was removed and main was pushed in the next step. GitHub Pages is not set up yet (planned for the wrap-up; needs "gh auth refresh -s workflow" or a gh-pages branch).</w:t>
+        <w:t xml:space="preserve">Done: see the following entries.</w:t>
       </w:r>
     </w:p>
     <w:p>
@@ -10124,7 +10405,7 @@
           <w:sz w:val="21"/>
           <w:szCs w:val="21"/>
         </w:rPr>
-        <w:t xml:space="preserve">gh repo view; git push output.</w:t>
+        <w:t xml:space="preserve">-</w:t>
       </w:r>
     </w:p>
     <w:p>
@@ -10144,7 +10425,7 @@
         <w:keepNext/>
       </w:pPr>
       <w:r>
-        <w:t xml:space="preserve">#16  Request: hand the project over to a teammate's agent</w:t>
+        <w:t xml:space="preserve">#14  PDF export of the prompt log, including planned prompts</w:t>
       </w:r>
     </w:p>
     <w:p>
@@ -10158,7 +10439,7 @@
           <w:sz w:val="18"/>
           <w:szCs w:val="18"/>
         </w:rPr>
-        <w:t xml:space="preserve">User prompt  |  2026-10-15</w:t>
+        <w:t xml:space="preserve">Working prompt  |  2026-10-15</w:t>
       </w:r>
     </w:p>
     <w:p>
@@ -10192,7 +10473,7 @@
           <w:sz w:val="19"/>
           <w:szCs w:val="19"/>
         </w:rPr>
-        <w:t xml:space="preserve">ACTUALLY I GONNA HANDOVER THE PROJECT TO MY TEAMMATES AGENT SO HE'LL BE PULLING THE CODE AND RUNNING IN HIS SYSTEM SO GIVE PROMPT FOR THAT</w:t>
+        <w:t xml:space="preserve">Export the prompt log to PDF with a Python reportlab script (docs/tools/build_prompt_pdf.py) that reads docs/prompt_log.json: a title page, a stage overview table, a summary of every entry, Part A with every executed prompt verbatim in a shaded box with purpose, files, result and verification, and Part B with the planned prompts that complete Review 2, Review 3 and the wrap-up, clearly marked as not yet run. Add the planned prompts to prompt_log.json and to the Word log as well, and make "npm run log" rebuild both documents.</w:t>
       </w:r>
     </w:p>
     <w:p>
@@ -10220,7 +10501,7 @@
           <w:sz w:val="21"/>
           <w:szCs w:val="21"/>
         </w:rPr>
-        <w:t xml:space="preserve">Let a teammate's AI agent clone, run and continue the project.</w:t>
+        <w:t xml:space="preserve">Give the student a PDF containing the prompts needed to complete the whole project.</w:t>
       </w:r>
     </w:p>
     <w:p>
@@ -10253,7 +10534,92 @@
           <w:sz w:val="19"/>
           <w:szCs w:val="19"/>
         </w:rPr>
-        <w:t xml:space="preserve">-</w:t>
+        <w:t xml:space="preserve">docs/tools/build_prompt_pdf.py</w:t>
+      </w:r>
+    </w:p>
+    <w:p>
+      <w:pPr>
+        <w:pStyle w:val="ListParagraph"/>
+        <w:numPr>
+          <w:ilvl w:val="0"/>
+          <w:numId w:val="2"/>
+        </w:numPr>
+      </w:pPr>
+      <w:r>
+        <w:rPr>
+          <w:rFonts w:ascii="Consolas" w:cs="Consolas" w:eastAsia="Consolas" w:hAnsi="Consolas"/>
+          <w:sz w:val="19"/>
+          <w:szCs w:val="19"/>
+        </w:rPr>
+        <w:t xml:space="preserve">docs/tools/build-prompt-log.js</w:t>
+      </w:r>
+    </w:p>
+    <w:p>
+      <w:pPr>
+        <w:pStyle w:val="ListParagraph"/>
+        <w:numPr>
+          <w:ilvl w:val="0"/>
+          <w:numId w:val="2"/>
+        </w:numPr>
+      </w:pPr>
+      <w:r>
+        <w:rPr>
+          <w:rFonts w:ascii="Consolas" w:cs="Consolas" w:eastAsia="Consolas" w:hAnsi="Consolas"/>
+          <w:sz w:val="19"/>
+          <w:szCs w:val="19"/>
+        </w:rPr>
+        <w:t xml:space="preserve">docs/prompt_log.json</w:t>
+      </w:r>
+    </w:p>
+    <w:p>
+      <w:pPr>
+        <w:pStyle w:val="ListParagraph"/>
+        <w:numPr>
+          <w:ilvl w:val="0"/>
+          <w:numId w:val="2"/>
+        </w:numPr>
+      </w:pPr>
+      <w:r>
+        <w:rPr>
+          <w:rFonts w:ascii="Consolas" w:cs="Consolas" w:eastAsia="Consolas" w:hAnsi="Consolas"/>
+          <w:sz w:val="19"/>
+          <w:szCs w:val="19"/>
+        </w:rPr>
+        <w:t xml:space="preserve">docs/SplitStack_Prompt_Log.pdf</w:t>
+      </w:r>
+    </w:p>
+    <w:p>
+      <w:pPr>
+        <w:pStyle w:val="ListParagraph"/>
+        <w:numPr>
+          <w:ilvl w:val="0"/>
+          <w:numId w:val="2"/>
+        </w:numPr>
+      </w:pPr>
+      <w:r>
+        <w:rPr>
+          <w:rFonts w:ascii="Consolas" w:cs="Consolas" w:eastAsia="Consolas" w:hAnsi="Consolas"/>
+          <w:sz w:val="19"/>
+          <w:szCs w:val="19"/>
+        </w:rPr>
+        <w:t xml:space="preserve">docs/SplitStack_Prompt_Log.docx</w:t>
+      </w:r>
+    </w:p>
+    <w:p>
+      <w:pPr>
+        <w:pStyle w:val="ListParagraph"/>
+        <w:numPr>
+          <w:ilvl w:val="0"/>
+          <w:numId w:val="2"/>
+        </w:numPr>
+      </w:pPr>
+      <w:r>
+        <w:rPr>
+          <w:rFonts w:ascii="Consolas" w:cs="Consolas" w:eastAsia="Consolas" w:hAnsi="Consolas"/>
+          <w:sz w:val="19"/>
+          <w:szCs w:val="19"/>
+        </w:rPr>
+        <w:t xml:space="preserve">package.json</w:t>
       </w:r>
     </w:p>
     <w:p>
@@ -10281,7 +10647,7 @@
           <w:sz w:val="21"/>
           <w:szCs w:val="21"/>
         </w:rPr>
-        <w:t xml:space="preserve">A handover prompt was written covering: requirements per review, clone and branch, prerequisites, install/run/verify commands, repository map, known traps, the mandatory logging rule, the ordered remaining work (planned prompts P1-P15) and working rules. Noted that the new work had to be pushed to GitHub first.</w:t>
+        <w:t xml:space="preserve">PDF with the executed prompts and 15 planned prompts; the Word log has the same content.</w:t>
       </w:r>
     </w:p>
     <w:p>
@@ -10309,7 +10675,7 @@
           <w:sz w:val="21"/>
           <w:szCs w:val="21"/>
         </w:rPr>
-        <w:t xml:space="preserve">-</w:t>
+        <w:t xml:space="preserve">Pages rendered to images and inspected; text extracted with pypdf.</w:t>
       </w:r>
     </w:p>
     <w:p>
@@ -10329,7 +10695,7 @@
         <w:keepNext/>
       </w:pPr>
       <w:r>
-        <w:t xml:space="preserve">#17  Push the refurbished code to GitHub main</w:t>
+        <w:t xml:space="preserve">#15  Create the GitHub repository and push the code</w:t>
       </w:r>
     </w:p>
     <w:p>
@@ -10377,7 +10743,7 @@
           <w:sz w:val="19"/>
           <w:szCs w:val="19"/>
         </w:rPr>
-        <w:t xml:space="preserve">push it  (user prompt). Executed as: remove .github/workflows/pages.yml (the token lacks the workflow scope), replace the not-yet-existing live-site link in README.md with local run instructions, correct the earlier log entry about publishing, log the handover, rebuild the prompt logs, commit, and push the refurbish branch to main on https://github.com/MahaprabhuK/SplitStack so the teammate can clone it.</w:t>
+        <w:t xml:space="preserve">Install the official GitHub CLI with winget and sign in through the device-code flow (the student approves it in the browser). Before publishing, check that no secrets or databases are tracked, review the receipt images that are still in the commit history (they are generic sample invoices), and confirm with the student that a public repository is acceptable because the team's original repository is private. Then create the public repository MahaprabhuK/SplitStack, push the refurbish branch as main together with the legacy branch, add a GitHub Actions workflow (.github/workflows/pages.yml) that deploys the client/ folder to GitHub Pages, enable Pages with the "GitHub Actions" source, and confirm that the site responds.</w:t>
       </w:r>
     </w:p>
     <w:p>
@@ -10405,7 +10771,7 @@
           <w:sz w:val="21"/>
           <w:szCs w:val="21"/>
         </w:rPr>
-        <w:t xml:space="preserve">Make the current work available to the teammate.</w:t>
+        <w:t xml:space="preserve">Give the student a repository link and a live website link.</w:t>
       </w:r>
     </w:p>
     <w:p>
@@ -10438,75 +10804,7 @@
           <w:sz w:val="19"/>
           <w:szCs w:val="19"/>
         </w:rPr>
-        <w:t xml:space="preserve">.github/workflows/pages.yml (removed)</w:t>
-      </w:r>
-    </w:p>
-    <w:p>
-      <w:pPr>
-        <w:pStyle w:val="ListParagraph"/>
-        <w:numPr>
-          <w:ilvl w:val="0"/>
-          <w:numId w:val="2"/>
-        </w:numPr>
-      </w:pPr>
-      <w:r>
-        <w:rPr>
-          <w:rFonts w:ascii="Consolas" w:cs="Consolas" w:eastAsia="Consolas" w:hAnsi="Consolas"/>
-          <w:sz w:val="19"/>
-          <w:szCs w:val="19"/>
-        </w:rPr>
         <w:t xml:space="preserve">README.md</w:t>
-      </w:r>
-    </w:p>
-    <w:p>
-      <w:pPr>
-        <w:pStyle w:val="ListParagraph"/>
-        <w:numPr>
-          <w:ilvl w:val="0"/>
-          <w:numId w:val="2"/>
-        </w:numPr>
-      </w:pPr>
-      <w:r>
-        <w:rPr>
-          <w:rFonts w:ascii="Consolas" w:cs="Consolas" w:eastAsia="Consolas" w:hAnsi="Consolas"/>
-          <w:sz w:val="19"/>
-          <w:szCs w:val="19"/>
-        </w:rPr>
-        <w:t xml:space="preserve">docs/prompt_log.json</w:t>
-      </w:r>
-    </w:p>
-    <w:p>
-      <w:pPr>
-        <w:pStyle w:val="ListParagraph"/>
-        <w:numPr>
-          <w:ilvl w:val="0"/>
-          <w:numId w:val="2"/>
-        </w:numPr>
-      </w:pPr>
-      <w:r>
-        <w:rPr>
-          <w:rFonts w:ascii="Consolas" w:cs="Consolas" w:eastAsia="Consolas" w:hAnsi="Consolas"/>
-          <w:sz w:val="19"/>
-          <w:szCs w:val="19"/>
-        </w:rPr>
-        <w:t xml:space="preserve">docs/SplitStack_Prompt_Log.docx</w:t>
-      </w:r>
-    </w:p>
-    <w:p>
-      <w:pPr>
-        <w:pStyle w:val="ListParagraph"/>
-        <w:numPr>
-          <w:ilvl w:val="0"/>
-          <w:numId w:val="2"/>
-        </w:numPr>
-      </w:pPr>
-      <w:r>
-        <w:rPr>
-          <w:rFonts w:ascii="Consolas" w:cs="Consolas" w:eastAsia="Consolas" w:hAnsi="Consolas"/>
-          <w:sz w:val="19"/>
-          <w:szCs w:val="19"/>
-        </w:rPr>
-        <w:t xml:space="preserve">docs/SplitStack_Prompt_Log.pdf</w:t>
       </w:r>
     </w:p>
     <w:p>
@@ -10534,7 +10832,7 @@
           <w:sz w:val="21"/>
           <w:szCs w:val="21"/>
         </w:rPr>
-        <w:t xml:space="preserve">main pushed to GitHub; branches on GitHub: main (refurbished work) and legacy (original Flask app).</w:t>
+        <w:t xml:space="preserve">Public repository https://github.com/MahaprabhuK/SplitStack created and the legacy branch pushed. The first push of main was rejected because it added a GitHub Actions workflow (.github/workflows/pages.yml) and the gh token lacked the "workflow" scope; the workflow file was removed and main was pushed in the next step. GitHub Pages is not set up yet (planned for the wrap-up; needs "gh auth refresh -s workflow" or a gh-pages branch).</w:t>
       </w:r>
     </w:p>
     <w:p>
@@ -10562,7 +10860,7 @@
           <w:sz w:val="21"/>
           <w:szCs w:val="21"/>
         </w:rPr>
-        <w:t xml:space="preserve">git ls-remote shows main and legacy at the expected commits.</w:t>
+        <w:t xml:space="preserve">gh repo view; git push output.</w:t>
       </w:r>
     </w:p>
     <w:p>
@@ -10582,7 +10880,7 @@
         <w:keepNext/>
       </w:pPr>
       <w:r>
-        <w:t xml:space="preserve">#18  Request: push the code and deploy the website</w:t>
+        <w:t xml:space="preserve">#16  Request: hand the project over to a teammate's agent</w:t>
       </w:r>
     </w:p>
     <w:p>
@@ -10630,7 +10928,7 @@
           <w:sz w:val="19"/>
           <w:szCs w:val="19"/>
         </w:rPr>
-        <w:t xml:space="preserve">first push the code and deploy it</w:t>
+        <w:t xml:space="preserve">ACTUALLY I GONNA HANDOVER THE PROJECT TO MY TEAMMATES AGENT SO HE'LL BE PULLING THE CODE AND RUNNING IN HIS SYSTEM SO GIVE PROMPT FOR THAT</w:t>
       </w:r>
     </w:p>
     <w:p>
@@ -10658,7 +10956,7 @@
           <w:sz w:val="21"/>
           <w:szCs w:val="21"/>
         </w:rPr>
-        <w:t xml:space="preserve">Get the code on GitHub and the Review 1 site online.</w:t>
+        <w:t xml:space="preserve">Let a teammate's AI agent clone, run and continue the project.</w:t>
       </w:r>
     </w:p>
     <w:p>
@@ -10719,7 +11017,7 @@
           <w:sz w:val="21"/>
           <w:szCs w:val="21"/>
         </w:rPr>
-        <w:t xml:space="preserve">Handled in the next step.</w:t>
+        <w:t xml:space="preserve">A handover prompt was written covering: requirements per review, clone and branch, prerequisites, install/run/verify commands, repository map, known traps, the mandatory logging rule, the ordered remaining work (planned prompts P1-P15) and working rules. Noted that the new work had to be pushed to GitHub first.</w:t>
       </w:r>
     </w:p>
     <w:p>
@@ -10767,7 +11065,7 @@
         <w:keepNext/>
       </w:pPr>
       <w:r>
-        <w:t xml:space="preserve">#19  Deploy the client to GitHub Pages from a gh-pages branch</w:t>
+        <w:t xml:space="preserve">#17  Push the refurbished code to GitHub main</w:t>
       </w:r>
     </w:p>
     <w:p>
@@ -10815,7 +11113,7 @@
           <w:sz w:val="19"/>
           <w:szCs w:val="19"/>
         </w:rPr>
-        <w:t xml:space="preserve">Push refurbish to main and refurbish on MahaprabhuK/SplitStack. Because the token cannot push workflow files, deploy without GitHub Actions: check that client/ uses only relative links, split client/ into its own history with git subtree split, push it as the gh-pages branch, wait for GitHub Pages to publish it, then put the live link back in README.md and log the step.</w:t>
+        <w:t xml:space="preserve">push it  (user prompt). Executed as: remove .github/workflows/pages.yml (the token lacks the workflow scope), replace the not-yet-existing live-site link in README.md with local run instructions, correct the earlier log entry about publishing, log the handover, rebuild the prompt logs, commit, and push the refurbish branch to main on https://github.com/MahaprabhuK/SplitStack so the teammate can clone it.</w:t>
       </w:r>
     </w:p>
     <w:p>
@@ -10843,7 +11141,7 @@
           <w:sz w:val="21"/>
           <w:szCs w:val="21"/>
         </w:rPr>
-        <w:t xml:space="preserve">Publish the Review 1 site at a public URL without needing the workflow scope.</w:t>
+        <w:t xml:space="preserve">Make the current work available to the teammate.</w:t>
       </w:r>
     </w:p>
     <w:p>
@@ -10876,7 +11174,7 @@
           <w:sz w:val="19"/>
           <w:szCs w:val="19"/>
         </w:rPr>
-        <w:t xml:space="preserve">README.md</w:t>
+        <w:t xml:space="preserve">.github/workflows/pages.yml (removed)</w:t>
       </w:r>
     </w:p>
     <w:p>
@@ -10893,7 +11191,58 @@
           <w:sz w:val="19"/>
           <w:szCs w:val="19"/>
         </w:rPr>
+        <w:t xml:space="preserve">README.md</w:t>
+      </w:r>
+    </w:p>
+    <w:p>
+      <w:pPr>
+        <w:pStyle w:val="ListParagraph"/>
+        <w:numPr>
+          <w:ilvl w:val="0"/>
+          <w:numId w:val="2"/>
+        </w:numPr>
+      </w:pPr>
+      <w:r>
+        <w:rPr>
+          <w:rFonts w:ascii="Consolas" w:cs="Consolas" w:eastAsia="Consolas" w:hAnsi="Consolas"/>
+          <w:sz w:val="19"/>
+          <w:szCs w:val="19"/>
+        </w:rPr>
         <w:t xml:space="preserve">docs/prompt_log.json</w:t>
+      </w:r>
+    </w:p>
+    <w:p>
+      <w:pPr>
+        <w:pStyle w:val="ListParagraph"/>
+        <w:numPr>
+          <w:ilvl w:val="0"/>
+          <w:numId w:val="2"/>
+        </w:numPr>
+      </w:pPr>
+      <w:r>
+        <w:rPr>
+          <w:rFonts w:ascii="Consolas" w:cs="Consolas" w:eastAsia="Consolas" w:hAnsi="Consolas"/>
+          <w:sz w:val="19"/>
+          <w:szCs w:val="19"/>
+        </w:rPr>
+        <w:t xml:space="preserve">docs/SplitStack_Prompt_Log.docx</w:t>
+      </w:r>
+    </w:p>
+    <w:p>
+      <w:pPr>
+        <w:pStyle w:val="ListParagraph"/>
+        <w:numPr>
+          <w:ilvl w:val="0"/>
+          <w:numId w:val="2"/>
+        </w:numPr>
+      </w:pPr>
+      <w:r>
+        <w:rPr>
+          <w:rFonts w:ascii="Consolas" w:cs="Consolas" w:eastAsia="Consolas" w:hAnsi="Consolas"/>
+          <w:sz w:val="19"/>
+          <w:szCs w:val="19"/>
+        </w:rPr>
+        <w:t xml:space="preserve">docs/SplitStack_Prompt_Log.pdf</w:t>
       </w:r>
     </w:p>
     <w:p>
@@ -10921,7 +11270,7 @@
           <w:sz w:val="21"/>
           <w:szCs w:val="21"/>
         </w:rPr>
-        <w:t xml:space="preserve">main and refurbish are on GitHub. The client/ folder is published from the gh-pages branch at https://mahaprabhuk.github.io/SplitStack/ (GitHub enabled Pages automatically). To redeploy after client changes: git subtree split --prefix client refurbish, then push that commit to gh-pages.</w:t>
+        <w:t xml:space="preserve">main pushed to GitHub; branches on GitHub: main (refurbished work) and legacy (original Flask app).</w:t>
       </w:r>
     </w:p>
     <w:p>
@@ -10949,7 +11298,7 @@
           <w:sz w:val="21"/>
           <w:szCs w:val="21"/>
         </w:rPr>
-        <w:t xml:space="preserve">git ls-remote; curl returned 200 for the home page, pages/404.html and css/base.css on the live site.</w:t>
+        <w:t xml:space="preserve">git ls-remote shows main and legacy at the expected commits.</w:t>
       </w:r>
     </w:p>
     <w:p>
@@ -10969,7 +11318,7 @@
         <w:keepNext/>
       </w:pPr>
       <w:r>
-        <w:t xml:space="preserve">#20  Request: handover prompt PDF for a teammate's agent</w:t>
+        <w:t xml:space="preserve">#18  Request: push the code and deploy the website</w:t>
       </w:r>
     </w:p>
     <w:p>
@@ -11017,7 +11366,7 @@
           <w:sz w:val="19"/>
           <w:szCs w:val="19"/>
         </w:rPr>
-        <w:t xml:space="preserve">imma handover the project to my teammate i want you to create a detailed prompt for his agent most prolly he'll use anti gravity so i want a pdf containing prompts to complete the rest of the work in the project. so create a pdf and mention its path once its created then i'll share it to him</w:t>
+        <w:t xml:space="preserve">first push the code and deploy it</w:t>
       </w:r>
     </w:p>
     <w:p>
@@ -11045,7 +11394,7 @@
           <w:sz w:val="21"/>
           <w:szCs w:val="21"/>
         </w:rPr>
-        <w:t xml:space="preserve">Let a teammate's AI agent (Antigravity) finish Review 2, Review 3 and the wrap-up.</w:t>
+        <w:t xml:space="preserve">Get the code on GitHub and the Review 1 site online.</w:t>
       </w:r>
     </w:p>
     <w:p>
@@ -11154,7 +11503,7 @@
         <w:keepNext/>
       </w:pPr>
       <w:r>
-        <w:t xml:space="preserve">#21  Handover prompts PDF</w:t>
+        <w:t xml:space="preserve">#19  Deploy the client to GitHub Pages from a gh-pages branch</w:t>
       </w:r>
     </w:p>
     <w:p>
@@ -11202,7 +11551,7 @@
           <w:sz w:val="19"/>
           <w:szCs w:val="19"/>
         </w:rPr>
-        <w:t xml:space="preserve">Write docs/tools/build_handover_pdf.py (reusing the styles of build_prompt_pdf.py) to produce docs/SplitStack_Handover_Prompts.pdf: how to use it with Antigravity, one-time setup (tools, collaborator access, MongoDB Atlas, workflow token scope), a roadmap, Prompt 0 with the full project context, rules, logging, commit/push and gh-pages redeploy procedure, the 15 planned prompts P1-P15 expanded with concrete checks and commit messages, utility prompts (status, recovery, review rehearsal) and common problems. Render pages to check the layout.</w:t>
+        <w:t xml:space="preserve">Push refurbish to main and refurbish on MahaprabhuK/SplitStack. Because the token cannot push workflow files, deploy without GitHub Actions: check that client/ uses only relative links, split client/ into its own history with git subtree split, push it as the gh-pages branch, wait for GitHub Pages to publish it, then put the live link back in README.md and log the step.</w:t>
       </w:r>
     </w:p>
     <w:p>
@@ -11230,7 +11579,7 @@
           <w:sz w:val="21"/>
           <w:szCs w:val="21"/>
         </w:rPr>
-        <w:t xml:space="preserve">Give the teammate a self-contained, ordered set of prompts.</w:t>
+        <w:t xml:space="preserve">Publish the Review 1 site at a public URL without needing the workflow scope.</w:t>
       </w:r>
     </w:p>
     <w:p>
@@ -11263,7 +11612,7 @@
           <w:sz w:val="19"/>
           <w:szCs w:val="19"/>
         </w:rPr>
-        <w:t xml:space="preserve">docs/tools/build_handover_pdf.py</w:t>
+        <w:t xml:space="preserve">README.md</w:t>
       </w:r>
     </w:p>
     <w:p>
@@ -11280,7 +11629,7 @@
           <w:sz w:val="19"/>
           <w:szCs w:val="19"/>
         </w:rPr>
-        <w:t xml:space="preserve">docs/SplitStack_Handover_Prompts.pdf</w:t>
+        <w:t xml:space="preserve">docs/prompt_log.json</w:t>
       </w:r>
     </w:p>
     <w:p>
@@ -11308,7 +11657,7 @@
           <w:sz w:val="21"/>
           <w:szCs w:val="21"/>
         </w:rPr>
-        <w:t xml:space="preserve">14-page PDF created. Changes against the planned prompts: P1 adds data-page attributes and client/js/package.json (type module) for node --test; P13 keeps the localStorage implementation as a demo mode (api-local.js chosen when /api/health does not answer) so the GitHub Pages site keeps working, instead of deleting it; P9 replaces deprecated csurf with a synchronizer token; P14 uses MongoMemoryReplSet because the API uses transactions; P15 asks for confirmation before deleting the Flask files and leaves Render account steps to the student.</w:t>
+        <w:t xml:space="preserve">main and refurbish are on GitHub. The client/ folder is published from the gh-pages branch at https://mahaprabhuk.github.io/SplitStack/ (GitHub enabled Pages automatically). To redeploy after client changes: git subtree split --prefix client refurbish, then push that commit to gh-pages.</w:t>
       </w:r>
     </w:p>
     <w:p>
@@ -11336,7 +11685,7 @@
           <w:sz w:val="21"/>
           <w:szCs w:val="21"/>
         </w:rPr>
-        <w:t xml:space="preserve">Rendered pages with PyMuPDF and checked the layout of the setup, Prompt 0, step and utility pages.</w:t>
+        <w:t xml:space="preserve">git ls-remote; curl returned 200 for the home page, pages/404.html and css/base.css on the live site.</w:t>
       </w:r>
     </w:p>
     <w:p>
@@ -11351,37 +11700,12 @@
       </w:r>
     </w:p>
     <w:p>
-      <w:r>
-        <w:br w:type="page"/>
-      </w:r>
-    </w:p>
-    <w:p>
-      <w:pPr>
-        <w:pStyle w:val="Heading1"/>
-      </w:pPr>
-      <w:r>
-        <w:t xml:space="preserve">Planned prompts to complete the project</w:t>
-      </w:r>
-    </w:p>
-    <w:p>
-      <w:pPr>
-        <w:spacing w:after="80"/>
-      </w:pPr>
-      <w:r>
-        <w:rPr>
-          <w:sz w:val="21"/>
-          <w:szCs w:val="21"/>
-        </w:rPr>
-        <w:t xml:space="preserve">These prompts have not been run yet. Run them in order; after each one, move it into the log above with its result.</w:t>
-      </w:r>
-    </w:p>
-    <w:p>
       <w:pPr>
         <w:pStyle w:val="Heading3"/>
         <w:keepNext/>
       </w:pPr>
       <w:r>
-        <w:t xml:space="preserve">P1  Group splitting and the debt-simplification algorithm</w:t>
+        <w:t xml:space="preserve">#20  Request: handover prompt PDF for a teammate's agent</w:t>
       </w:r>
     </w:p>
     <w:p>
@@ -11395,7 +11719,7 @@
           <w:sz w:val="18"/>
           <w:szCs w:val="18"/>
         </w:rPr>
-        <w:t xml:space="preserve">Review 2  |  Planned prompt</w:t>
+        <w:t xml:space="preserve">User prompt  |  2026-10-15</w:t>
       </w:r>
     </w:p>
     <w:p>
@@ -11429,7 +11753,7 @@
           <w:sz w:val="19"/>
           <w:szCs w:val="19"/>
         </w:rPr>
-        <w:t xml:space="preserve">In client/js/domain/splits.js implement equal splits in integer paise with the leftover paise assigned to the payer, and custom splits that must sum exactly to the total. On the shared-expense form show a live "remaining to assign" counter and disable submit until it reaches zero. In client/js/domain/settle.js implement net balances (paid minus share) and the greedy minimum-cash-flow algorithm: repeatedly match the largest debtor with the largest creditor and transfer min(debt, credit) until every balance is within one paisa; return the transfer list and the number of original pairwise debts. Render the settle-up page from it, and make "Mark paid" record a settlement and recompute balances. Add unit tests runnable with node --test using the Goa Trip example (balances +1700, -2500, +5700, -4900 give 3 transfers).</w:t>
+        <w:t xml:space="preserve">imma handover the project to my teammate i want you to create a detailed prompt for his agent most prolly he'll use anti gravity so i want a pdf containing prompts to complete the rest of the work in the project. so create a pdf and mention its path once its created then i'll share it to him</w:t>
       </w:r>
     </w:p>
     <w:p>
@@ -11457,7 +11781,7 @@
           <w:sz w:val="21"/>
           <w:szCs w:val="21"/>
         </w:rPr>
-        <w:t xml:space="preserve">Show algorithmic JavaScript, the core idea of SplitStack.</w:t>
+        <w:t xml:space="preserve">Let a teammate's AI agent (Antigravity) finish Review 2, Review 3 and the wrap-up.</w:t>
       </w:r>
     </w:p>
     <w:p>
@@ -11474,6 +11798,39 @@
           <w:szCs w:val="17"/>
         </w:rPr>
         <w:t xml:space="preserve">FILES</w:t>
+      </w:r>
+    </w:p>
+    <w:p>
+      <w:pPr>
+        <w:pStyle w:val="ListParagraph"/>
+        <w:numPr>
+          <w:ilvl w:val="0"/>
+          <w:numId w:val="2"/>
+        </w:numPr>
+      </w:pPr>
+      <w:r>
+        <w:rPr>
+          <w:rFonts w:ascii="Consolas" w:cs="Consolas" w:eastAsia="Consolas" w:hAnsi="Consolas"/>
+          <w:sz w:val="19"/>
+          <w:szCs w:val="19"/>
+        </w:rPr>
+        <w:t xml:space="preserve">-</w:t>
+      </w:r>
+    </w:p>
+    <w:p>
+      <w:pPr>
+        <w:spacing w:after="60" w:before="160"/>
+      </w:pPr>
+      <w:r>
+        <w:rPr>
+          <w:b/>
+          <w:bCs/>
+          <w:color w:val="4F46E5"/>
+          <w:spacing w:val="20"/>
+          <w:sz w:val="17"/>
+          <w:szCs w:val="17"/>
+        </w:rPr>
+        <w:t xml:space="preserve">RESULT</w:t>
       </w:r>
     </w:p>
     <w:p>
@@ -11485,7 +11842,46 @@
           <w:sz w:val="21"/>
           <w:szCs w:val="21"/>
         </w:rPr>
-        <w:t xml:space="preserve">client/js/domain/splits.js, client/js/domain/settle.js, tests/client/*.test.js</w:t>
+        <w:t xml:space="preserve">Handled in the next step.</w:t>
+      </w:r>
+    </w:p>
+    <w:p>
+      <w:pPr>
+        <w:spacing w:after="60" w:before="160"/>
+      </w:pPr>
+      <w:r>
+        <w:rPr>
+          <w:b/>
+          <w:bCs/>
+          <w:color w:val="4F46E5"/>
+          <w:spacing w:val="20"/>
+          <w:sz w:val="17"/>
+          <w:szCs w:val="17"/>
+        </w:rPr>
+        <w:t xml:space="preserve">VERIFICATION</w:t>
+      </w:r>
+    </w:p>
+    <w:p>
+      <w:pPr>
+        <w:spacing w:after="80"/>
+      </w:pPr>
+      <w:r>
+        <w:rPr>
+          <w:sz w:val="21"/>
+          <w:szCs w:val="21"/>
+        </w:rPr>
+        <w:t xml:space="preserve">-</w:t>
+      </w:r>
+    </w:p>
+    <w:p>
+      <w:pPr>
+        <w:pBdr>
+          <w:bottom w:val="single" w:color="D9DBE5" w:sz="4" w:space="4"/>
+        </w:pBdr>
+        <w:spacing w:after="200"/>
+      </w:pPr>
+      <w:r>
+        <w:t xml:space="preserve"/>
       </w:r>
     </w:p>
     <w:p>
@@ -11494,7 +11890,7 @@
         <w:keepNext/>
       </w:pPr>
       <w:r>
-        <w:t xml:space="preserve">P2  Charts, budgets, forecast, insights, search and notifications</w:t>
+        <w:t xml:space="preserve">#21  Handover prompts PDF</w:t>
       </w:r>
     </w:p>
     <w:p>
@@ -11508,7 +11904,7 @@
           <w:sz w:val="18"/>
           <w:szCs w:val="18"/>
         </w:rPr>
-        <w:t xml:space="preserve">Review 2  |  Planned prompt</w:t>
+        <w:t xml:space="preserve">Working prompt  |  2026-10-15</w:t>
       </w:r>
     </w:p>
     <w:p>
@@ -11542,7 +11938,7 @@
           <w:sz w:val="19"/>
           <w:szCs w:val="19"/>
         </w:rPr>
-        <w:t xml:space="preserve">Render the dashboard and analytics charts with Chart.js 4 loaded from a pinned CDN URL, reading colours from the CSS custom properties so both themes work, and keep the CSS charts as a fallback. Compute budget status (ok under 75%, caution 75-90%, warning 90-100%, danger over 100%) and update the meters. Port the spending forecast (average daily spend multiplied by the days in the month) to client/js/domain/forecast.js. Generate smart insights from the data (over-budget categories, month-over-month change, upcoming recurring bills). Make the topbar search show live results across expenses, groups and lists in a listbox with keyboard navigation, and make the bell open a notifications panel built from the insights with an unread count.</w:t>
+        <w:t xml:space="preserve">Write docs/tools/build_handover_pdf.py (reusing the styles of build_prompt_pdf.py) to produce docs/SplitStack_Handover_Prompts.pdf: how to use it with Antigravity, one-time setup (tools, collaborator access, MongoDB Atlas, workflow token scope), a roadmap, Prompt 0 with the full project context, rules, logging, commit/push and gh-pages redeploy procedure, the 15 planned prompts P1-P15 expanded with concrete checks and commit messages, utility prompts (status, recovery, review rehearsal) and common problems. Render pages to check the layout.</w:t>
       </w:r>
     </w:p>
     <w:p>
@@ -11570,7 +11966,7 @@
           <w:sz w:val="21"/>
           <w:szCs w:val="21"/>
         </w:rPr>
-        <w:t xml:space="preserve">Finish the interactive features that were disconnected in the original app.</w:t>
+        <w:t xml:space="preserve">Give the teammate a self-contained, ordered set of prompts.</w:t>
       </w:r>
     </w:p>
     <w:p>
@@ -11587,6 +11983,56 @@
           <w:szCs w:val="17"/>
         </w:rPr>
         <w:t xml:space="preserve">FILES</w:t>
+      </w:r>
+    </w:p>
+    <w:p>
+      <w:pPr>
+        <w:pStyle w:val="ListParagraph"/>
+        <w:numPr>
+          <w:ilvl w:val="0"/>
+          <w:numId w:val="2"/>
+        </w:numPr>
+      </w:pPr>
+      <w:r>
+        <w:rPr>
+          <w:rFonts w:ascii="Consolas" w:cs="Consolas" w:eastAsia="Consolas" w:hAnsi="Consolas"/>
+          <w:sz w:val="19"/>
+          <w:szCs w:val="19"/>
+        </w:rPr>
+        <w:t xml:space="preserve">docs/tools/build_handover_pdf.py</w:t>
+      </w:r>
+    </w:p>
+    <w:p>
+      <w:pPr>
+        <w:pStyle w:val="ListParagraph"/>
+        <w:numPr>
+          <w:ilvl w:val="0"/>
+          <w:numId w:val="2"/>
+        </w:numPr>
+      </w:pPr>
+      <w:r>
+        <w:rPr>
+          <w:rFonts w:ascii="Consolas" w:cs="Consolas" w:eastAsia="Consolas" w:hAnsi="Consolas"/>
+          <w:sz w:val="19"/>
+          <w:szCs w:val="19"/>
+        </w:rPr>
+        <w:t xml:space="preserve">docs/SplitStack_Handover_Prompts.pdf</w:t>
+      </w:r>
+    </w:p>
+    <w:p>
+      <w:pPr>
+        <w:spacing w:after="60" w:before="160"/>
+      </w:pPr>
+      <w:r>
+        <w:rPr>
+          <w:b/>
+          <w:bCs/>
+          <w:color w:val="4F46E5"/>
+          <w:spacing w:val="20"/>
+          <w:sz w:val="17"/>
+          <w:szCs w:val="17"/>
+        </w:rPr>
+        <w:t xml:space="preserve">RESULT</w:t>
       </w:r>
     </w:p>
     <w:p>
@@ -11598,7 +12044,71 @@
           <w:sz w:val="21"/>
           <w:szCs w:val="21"/>
         </w:rPr>
-        <w:t xml:space="preserve">client/js/pages/dashboard.js, client/js/pages/analytics.js, client/js/domain/forecast.js, client/js/ui/search.js, client/js/ui/notifications.js</w:t>
+        <w:t xml:space="preserve">14-page PDF created. Changes against the planned prompts: P1 adds data-page attributes and client/js/package.json (type module) for node --test; P13 keeps the localStorage implementation as a demo mode (api-local.js chosen when /api/health does not answer) so the GitHub Pages site keeps working, instead of deleting it; P9 replaces deprecated csurf with a synchronizer token; P14 uses MongoMemoryReplSet because the API uses transactions; P15 asks for confirmation before deleting the Flask files and leaves Render account steps to the student.</w:t>
+      </w:r>
+    </w:p>
+    <w:p>
+      <w:pPr>
+        <w:spacing w:after="60" w:before="160"/>
+      </w:pPr>
+      <w:r>
+        <w:rPr>
+          <w:b/>
+          <w:bCs/>
+          <w:color w:val="4F46E5"/>
+          <w:spacing w:val="20"/>
+          <w:sz w:val="17"/>
+          <w:szCs w:val="17"/>
+        </w:rPr>
+        <w:t xml:space="preserve">VERIFICATION</w:t>
+      </w:r>
+    </w:p>
+    <w:p>
+      <w:pPr>
+        <w:spacing w:after="80"/>
+      </w:pPr>
+      <w:r>
+        <w:rPr>
+          <w:sz w:val="21"/>
+          <w:szCs w:val="21"/>
+        </w:rPr>
+        <w:t xml:space="preserve">Rendered pages with PyMuPDF and checked the layout of the setup, Prompt 0, step and utility pages.</w:t>
+      </w:r>
+    </w:p>
+    <w:p>
+      <w:pPr>
+        <w:pBdr>
+          <w:bottom w:val="single" w:color="D9DBE5" w:sz="4" w:space="4"/>
+        </w:pBdr>
+        <w:spacing w:after="200"/>
+      </w:pPr>
+      <w:r>
+        <w:t xml:space="preserve"/>
+      </w:r>
+    </w:p>
+    <w:p>
+      <w:r>
+        <w:br w:type="page"/>
+      </w:r>
+    </w:p>
+    <w:p>
+      <w:pPr>
+        <w:pStyle w:val="Heading1"/>
+      </w:pPr>
+      <w:r>
+        <w:t xml:space="preserve">Planned prompts to complete the project</w:t>
+      </w:r>
+    </w:p>
+    <w:p>
+      <w:pPr>
+        <w:spacing w:after="80"/>
+      </w:pPr>
+      <w:r>
+        <w:rPr>
+          <w:sz w:val="21"/>
+          <w:szCs w:val="21"/>
+        </w:rPr>
+        <w:t xml:space="preserve">These prompts have not been run yet. Run them in order; after each one, move it into the log above with its result.</w:t>
       </w:r>
     </w:p>
     <w:p>
@@ -11607,7 +12117,7 @@
         <w:keepNext/>
       </w:pPr>
       <w:r>
-        <w:t xml:space="preserve">P3  Shopping checklist and receipt scan preview</w:t>
+        <w:t xml:space="preserve">P1  Charts, budgets, forecast, insights, search and notifications</w:t>
       </w:r>
     </w:p>
     <w:p>
@@ -11655,7 +12165,7 @@
           <w:sz w:val="19"/>
           <w:szCs w:val="19"/>
         </w:rPr>
-        <w:t xml:space="preserve">Make the shopping checklist toggle items with optimistic UI, edit actual prices inline, recompute the estimated, actual and variance totals live, and convert the list to an expense only once (prevent duplicates). On the receipt scan page add drag-and-drop with dragenter/dragleave styling, client-side checks (PNG, JPEG or WEBP, up to 5 MB) and an image preview via URL.createObjectURL. Until the backend exists, run OCR in the browser with tesseract.js from a pinned CDN, parse the merchant, date and total with regular expressions (prefer the line containing TOTAL), show progress, and pre-fill the confirm form.</w:t>
+        <w:t xml:space="preserve">Render the dashboard and analytics charts with Chart.js 4 loaded from a pinned CDN URL, reading colours from the CSS custom properties so both themes work, and keep the CSS charts as a fallback. Compute budget status (ok under 75%, caution 75-90%, warning 90-100%, danger over 100%) and update the meters. Port the spending forecast (average daily spend multiplied by the days in the month) to client/js/domain/forecast.js. Generate smart insights from the data (over-budget categories, month-over-month change, upcoming recurring bills). Make the topbar search show live results across expenses, groups and lists in a listbox with keyboard navigation, and make the bell open a notifications panel built from the insights with an unread count.</w:t>
       </w:r>
     </w:p>
     <w:p>
@@ -11683,7 +12193,7 @@
           <w:sz w:val="21"/>
           <w:szCs w:val="21"/>
         </w:rPr>
-        <w:t xml:space="preserve">Complete the remaining interactive flows.</w:t>
+        <w:t xml:space="preserve">Finish the interactive features that were disconnected in the original app.</w:t>
       </w:r>
     </w:p>
     <w:p>
@@ -11711,7 +12221,7 @@
           <w:sz w:val="21"/>
           <w:szCs w:val="21"/>
         </w:rPr>
-        <w:t xml:space="preserve">client/js/pages/shopping-detail.js, client/js/pages/receipt-scan.js, client/js/domain/receipt-parser.js</w:t>
+        <w:t xml:space="preserve">client/js/pages/dashboard.js, client/js/pages/analytics.js, client/js/domain/forecast.js, client/js/ui/search.js, client/js/ui/notifications.js</w:t>
       </w:r>
     </w:p>
     <w:p>
@@ -11720,7 +12230,7 @@
         <w:keepNext/>
       </w:pPr>
       <w:r>
-        <w:t xml:space="preserve">P4  Review 2 QA, log and commit</w:t>
+        <w:t xml:space="preserve">P2  Shopping checklist and receipt scan preview</w:t>
       </w:r>
     </w:p>
     <w:p>
@@ -11768,7 +12278,7 @@
           <w:sz w:val="19"/>
           <w:szCs w:val="19"/>
         </w:rPr>
-        <w:t xml:space="preserve">Run ESLint (recommended rules, browser globals, ES2023 modules) over client/js and fix every finding; run the domain unit tests; test every page manually at 1366px and 375px in dark and light themes, using only the keyboard, and with JavaScript disabled (pages must still show their static content). Update client/README.md with the JavaScript architecture and a table of the JS concepts used and where. Add each step to docs/prompt_log.json, rebuild the Word and PDF logs, and commit "Review 2".</w:t>
+        <w:t xml:space="preserve">Make the shopping checklist toggle items with optimistic UI, edit actual prices inline, recompute the estimated, actual and variance totals live, and convert the list to an expense only once (prevent duplicates). On the receipt scan page add drag-and-drop with dragenter/dragleave styling, client-side checks (PNG, JPEG or WEBP, up to 5 MB) and an image preview via URL.createObjectURL. Until the backend exists, run OCR in the browser with tesseract.js from a pinned CDN, parse the merchant, date and total with regular expressions (prefer the line containing TOTAL), show progress, and pre-fill the confirm form.</w:t>
       </w:r>
     </w:p>
     <w:p>
@@ -11796,7 +12306,7 @@
           <w:sz w:val="21"/>
           <w:szCs w:val="21"/>
         </w:rPr>
-        <w:t xml:space="preserve">Close Review 2 with evidence.</w:t>
+        <w:t xml:space="preserve">Complete the remaining interactive flows.</w:t>
       </w:r>
     </w:p>
     <w:p>
@@ -11824,7 +12334,7 @@
           <w:sz w:val="21"/>
           <w:szCs w:val="21"/>
         </w:rPr>
-        <w:t xml:space="preserve">eslint.config.js, client/README.md, docs/*</w:t>
+        <w:t xml:space="preserve">client/js/pages/shopping-detail.js, client/js/pages/receipt-scan.js, client/js/domain/receipt-parser.js</w:t>
       </w:r>
     </w:p>
     <w:p>
@@ -11833,7 +12343,7 @@
         <w:keepNext/>
       </w:pPr>
       <w:r>
-        <w:t xml:space="preserve">P5  Express server and MongoDB connection</w:t>
+        <w:t xml:space="preserve">P3  Review 2 QA, log and commit</w:t>
       </w:r>
     </w:p>
     <w:p>
@@ -11847,7 +12357,7 @@
           <w:sz w:val="18"/>
           <w:szCs w:val="18"/>
         </w:rPr>
-        <w:t xml:space="preserve">Review 3  |  Planned prompt</w:t>
+        <w:t xml:space="preserve">Review 2  |  Planned prompt</w:t>
       </w:r>
     </w:p>
     <w:p>
@@ -11881,7 +12391,7 @@
           <w:sz w:val="19"/>
           <w:szCs w:val="19"/>
         </w:rPr>
-        <w:t xml:space="preserve">Create server/ as a Node.js 20+ project (ES modules) with Express: server/src/app.js (helmet with a Content Security Policy that allows only the CDNs in use, compression, express.json, express-session stored with connect-mongo, express-rate-limit on auth and upload routes, a CSRF token check on state-changing requests, and a central error handler returning JSON {error, fields}), server/src/index.js (connect to MongoDB Atlas with Mongoose using MONGODB_URI from server/.env, then listen), and static serving of client/. Add server/.env.example (MONGODB_URI, SESSION_SECRET of at least 32 characters, PORT) and npm scripts dev (node --watch) and start. Never commit .env.</w:t>
+        <w:t xml:space="preserve">Run ESLint (recommended rules, browser globals, ES2023 modules) over client/js and fix every finding; run the domain unit tests; test every page manually at 1366px and 375px in dark and light themes, using only the keyboard, and with JavaScript disabled (pages must still show their static content). Update client/README.md with the JavaScript architecture and a table of the JS concepts used and where. Add each step to docs/prompt_log.json, rebuild the Word and PDF logs, and commit "Review 2".</w:t>
       </w:r>
     </w:p>
     <w:p>
@@ -11909,7 +12419,7 @@
           <w:sz w:val="21"/>
           <w:szCs w:val="21"/>
         </w:rPr>
-        <w:t xml:space="preserve">Start Review 3 with a secure, conventional Express setup.</w:t>
+        <w:t xml:space="preserve">Close Review 2 with evidence.</w:t>
       </w:r>
     </w:p>
     <w:p>
@@ -11937,7 +12447,7 @@
           <w:sz w:val="21"/>
           <w:szCs w:val="21"/>
         </w:rPr>
-        <w:t xml:space="preserve">server/package.json, server/src/app.js, server/src/index.js, server/.env.example</w:t>
+        <w:t xml:space="preserve">eslint.config.js, client/README.md, docs/*</w:t>
       </w:r>
     </w:p>
     <w:p>
@@ -11946,7 +12456,7 @@
         <w:keepNext/>
       </w:pPr>
       <w:r>
-        <w:t xml:space="preserve">P6  Mongoose data models</w:t>
+        <w:t xml:space="preserve">P4  Express server and MongoDB connection</w:t>
       </w:r>
     </w:p>
     <w:p>
@@ -11994,7 +12504,7 @@
           <w:sz w:val="19"/>
           <w:szCs w:val="19"/>
         </w:rPr>
-        <w:t xml:space="preserve">Design Mongoose schemas with validation and indexes to replace the 15 SQLite tables: User (name, email unique and lowercase, passwordHash, preferences), Category (user, or null for defaults; name; type expense or income; icon; color), Expense and Income (user, category, amount stored as integer paise, date, description or source, paymentMethod), Budget (user, category or null, month, year, limit; unique on user+category+month+year), Recurring (name, amount, frequency, startDate, nextDueDate, active), Group (name, description, createdBy, members [{user, role admin|member, joinedAt}]), SharedExpense (group, title, amount, paidBy, category, date, splitType, shares [{user, amount}] with a validator that the shares sum to the amount), Settlement (group, payer, payee, amount, status, completedAt), ShoppingList (owner, optional group, name, budget, items [{name, quantity, estimatedPrice, actualPrice, purchased, assignedTo}], convertedExpense), Receipt (user, file reference, merchant, date, amount, rawText, confidence) and Insight (user, kind, message, read). Explain in comments which data is embedded and which is referenced, and why.</w:t>
+        <w:t xml:space="preserve">Create server/ as a Node.js 20+ project (ES modules) with Express: server/src/app.js (helmet with a Content Security Policy that allows only the CDNs in use, compression, express.json, express-session stored with connect-mongo, express-rate-limit on auth and upload routes, a CSRF token check on state-changing requests, and a central error handler returning JSON {error, fields}), server/src/index.js (connect to MongoDB Atlas with Mongoose using MONGODB_URI from server/.env, then listen), and static serving of client/. Add server/.env.example (MONGODB_URI, SESSION_SECRET of at least 32 characters, PORT) and npm scripts dev (node --watch) and start. Never commit .env.</w:t>
       </w:r>
     </w:p>
     <w:p>
@@ -12022,7 +12532,7 @@
           <w:sz w:val="21"/>
           <w:szCs w:val="21"/>
         </w:rPr>
-        <w:t xml:space="preserve">Show MongoDB data modelling, the core of Review 3.</w:t>
+        <w:t xml:space="preserve">Start Review 3 with a secure, conventional Express setup.</w:t>
       </w:r>
     </w:p>
     <w:p>
@@ -12050,7 +12560,7 @@
           <w:sz w:val="21"/>
           <w:szCs w:val="21"/>
         </w:rPr>
-        <w:t xml:space="preserve">server/src/models/*.js</w:t>
+        <w:t xml:space="preserve">server/package.json, server/src/app.js, server/src/index.js, server/.env.example</w:t>
       </w:r>
     </w:p>
     <w:p>
@@ -12059,7 +12569,7 @@
         <w:keepNext/>
       </w:pPr>
       <w:r>
-        <w:t xml:space="preserve">P7  Authentication and REST API</w:t>
+        <w:t xml:space="preserve">P5  Mongoose data models</w:t>
       </w:r>
     </w:p>
     <w:p>
@@ -12107,7 +12617,7 @@
           <w:sz w:val="19"/>
           <w:szCs w:val="19"/>
         </w:rPr>
-        <w:t xml:space="preserve">Implement the REST API under /api with one express.Router per module, mirroring the 48 legacy Flask routes: /api/auth (register with bcrypt cost 12, login, logout, me), /api/expenses, /api/income, /api/categories, /api/budgets, /api/recurring (including toggle), /api/groups (members, shared expenses, balances, settlements, leave), /api/shopping (lists, items, toggle, convert to expense), /api/analytics (monthly, categories, forecast, insights) and /api/search. Validate every input with a schema (zod or express-validator), check ownership or group membership on every request, use MongoDB transactions for multi-document writes (recording a settlement, converting a list), and reuse the Review 2 settle.js and splits.js modules on the server so the algorithm has a single implementation.</w:t>
+        <w:t xml:space="preserve">Design Mongoose schemas with validation and indexes to replace the 15 SQLite tables: User (name, email unique and lowercase, passwordHash, preferences), Category (user, or null for defaults; name; type expense or income; icon; color), Expense and Income (user, category, amount stored as integer paise, date, description or source, paymentMethod), Budget (user, category or null, month, year, limit; unique on user+category+month+year), Recurring (name, amount, frequency, startDate, nextDueDate, active), Group (name, description, createdBy, members [{user, role admin|member, joinedAt}]), SharedExpense (group, title, amount, paidBy, category, date, splitType, shares [{user, amount}] with a validator that the shares sum to the amount), Settlement (group, payer, payee, amount, status, completedAt), ShoppingList (owner, optional group, name, budget, items [{name, quantity, estimatedPrice, actualPrice, purchased, assignedTo}], convertedExpense), Receipt (user, file reference, merchant, date, amount, rawText, confidence) and Insight (user, kind, message, read). Explain in comments which data is embedded and which is referenced, and why.</w:t>
       </w:r>
     </w:p>
     <w:p>
@@ -12135,7 +12645,7 @@
           <w:sz w:val="21"/>
           <w:szCs w:val="21"/>
         </w:rPr>
-        <w:t xml:space="preserve">Deliver the Node.js back end with a complete, secure API.</w:t>
+        <w:t xml:space="preserve">Show MongoDB data modelling, the core of Review 3.</w:t>
       </w:r>
     </w:p>
     <w:p>
@@ -12163,7 +12673,7 @@
           <w:sz w:val="21"/>
           <w:szCs w:val="21"/>
         </w:rPr>
-        <w:t xml:space="preserve">server/src/routes/*.js, server/src/services/*.js, server/src/middleware/*.js</w:t>
+        <w:t xml:space="preserve">server/src/models/*.js</w:t>
       </w:r>
     </w:p>
     <w:p>
@@ -12172,7 +12682,7 @@
         <w:keepNext/>
       </w:pPr>
       <w:r>
-        <w:t xml:space="preserve">P8  Receipt upload and server-side OCR</w:t>
+        <w:t xml:space="preserve">P6  Authentication and REST API</w:t>
       </w:r>
     </w:p>
     <w:p>
@@ -12220,7 +12730,7 @@
           <w:sz w:val="19"/>
           <w:szCs w:val="19"/>
         </w:rPr>
-        <w:t xml:space="preserve">Add POST /api/receipts using multer with memory storage, a 5 MB limit and magic-byte checks for PNG, JPEG and WEBP; preprocess with sharp (rotate from EXIF, greyscale, upscale small images, normalise); run tesseract.js with one shared worker; parse the merchant, date and total with the Review 2 parser; store the image in MongoDB GridFS (so it survives redeploys on free hosting) and the parsed fields in Receipt. GET /api/receipts/:id/image streams the image only to its owner. Confirming creates the expense; nothing becomes an expense without confirmation.</w:t>
+        <w:t xml:space="preserve">Implement the REST API under /api with one express.Router per module, mirroring the 48 legacy Flask routes: /api/auth (register with bcrypt cost 12, login, logout, me), /api/expenses, /api/income, /api/categories, /api/budgets, /api/recurring (including toggle), /api/groups (members, shared expenses, balances, settlements, leave), /api/shopping (lists, items, toggle, convert to expense), /api/analytics (monthly, categories, forecast, insights) and /api/search. Validate every input with a schema (zod or express-validator), check ownership or group membership on every request, use MongoDB transactions for multi-document writes (recording a settlement, converting a list), and reuse the Review 2 settle.js and splits.js modules on the server so the algorithm has a single implementation.</w:t>
       </w:r>
     </w:p>
     <w:p>
@@ -12248,7 +12758,7 @@
           <w:sz w:val="21"/>
           <w:szCs w:val="21"/>
         </w:rPr>
-        <w:t xml:space="preserve">Port the OCR feature to Node with persistent storage.</w:t>
+        <w:t xml:space="preserve">Deliver the Node.js back end with a complete, secure API.</w:t>
       </w:r>
     </w:p>
     <w:p>
@@ -12276,7 +12786,7 @@
           <w:sz w:val="21"/>
           <w:szCs w:val="21"/>
         </w:rPr>
-        <w:t xml:space="preserve">server/src/routes/receipts.js, server/src/services/ocr.js</w:t>
+        <w:t xml:space="preserve">server/src/routes/*.js, server/src/services/*.js, server/src/middleware/*.js</w:t>
       </w:r>
     </w:p>
     <w:p>
@@ -12285,7 +12795,7 @@
         <w:keepNext/>
       </w:pPr>
       <w:r>
-        <w:t xml:space="preserve">P9  Connect the client to the API</w:t>
+        <w:t xml:space="preserve">P7  Receipt upload and server-side OCR</w:t>
       </w:r>
     </w:p>
     <w:p>
@@ -12333,7 +12843,7 @@
           <w:sz w:val="19"/>
           <w:szCs w:val="19"/>
         </w:rPr>
-        <w:t xml:space="preserve">Re-implement client/js/data/api.js with fetch() against /api, sending credentials and the CSRF token header, mapping HTTP errors to the same {field, message} errors the pages already handle, and showing a toast when offline. Remove the localStorage store except for the theme preference. Because the page code depends only on api.js, no page module should need changes; confirm this by running every flow end to end against a local server connected to Atlas.</w:t>
+        <w:t xml:space="preserve">Add POST /api/receipts using multer with memory storage, a 5 MB limit and magic-byte checks for PNG, JPEG and WEBP; preprocess with sharp (rotate from EXIF, greyscale, upscale small images, normalise); run tesseract.js with one shared worker; parse the merchant, date and total with the Review 2 parser; store the image in MongoDB GridFS (so it survives redeploys on free hosting) and the parsed fields in Receipt. GET /api/receipts/:id/image streams the image only to its owner. Confirming creates the expense; nothing becomes an expense without confirmation.</w:t>
       </w:r>
     </w:p>
     <w:p>
@@ -12361,7 +12871,7 @@
           <w:sz w:val="21"/>
           <w:szCs w:val="21"/>
         </w:rPr>
-        <w:t xml:space="preserve">Finish the full-stack integration.</w:t>
+        <w:t xml:space="preserve">Port the OCR feature to Node with persistent storage.</w:t>
       </w:r>
     </w:p>
     <w:p>
@@ -12389,7 +12899,7 @@
           <w:sz w:val="21"/>
           <w:szCs w:val="21"/>
         </w:rPr>
-        <w:t xml:space="preserve">client/js/data/api.js</w:t>
+        <w:t xml:space="preserve">server/src/routes/receipts.js, server/src/services/ocr.js</w:t>
       </w:r>
     </w:p>
     <w:p>
@@ -12398,7 +12908,7 @@
         <w:keepNext/>
       </w:pPr>
       <w:r>
-        <w:t xml:space="preserve">P10  Seed data and automated tests</w:t>
+        <w:t xml:space="preserve">P8  Connect the client to the API</w:t>
       </w:r>
     </w:p>
     <w:p>
@@ -12446,7 +12956,7 @@
           <w:sz w:val="19"/>
           <w:szCs w:val="19"/>
         </w:rPr>
-        <w:t xml:space="preserve">Add server/scripts/seed.js that creates the demo user, categories, six months of expenses and income, budgets, recurring payments, the three groups with shared expenses, and shopping lists. It must be idempotent and must refuse to run against a database whose name does not end in -dev or -test unless --force is passed. Write Jest + Supertest tests using mongodb-memory-server for auth, ownership checks, CSRF rejection, rate limiting, split validation, the settlement algorithm, budget status, convert-to-expense duplicate prevention and receipt upload validation, covering what the 47 legacy Python tests checked. Add an npm test script and a GitHub Actions workflow that runs lint and tests on every push.</w:t>
+        <w:t xml:space="preserve">Re-implement client/js/data/api.js with fetch() against /api, sending credentials and the CSRF token header, mapping HTTP errors to the same {field, message} errors the pages already handle, and showing a toast when offline. Remove the localStorage store except for the theme preference. Because the page code depends only on api.js, no page module should need changes; confirm this by running every flow end to end against a local server connected to Atlas.</w:t>
       </w:r>
     </w:p>
     <w:p>
@@ -12474,7 +12984,7 @@
           <w:sz w:val="21"/>
           <w:szCs w:val="21"/>
         </w:rPr>
-        <w:t xml:space="preserve">Prove the back end works and keep it working.</w:t>
+        <w:t xml:space="preserve">Finish the full-stack integration.</w:t>
       </w:r>
     </w:p>
     <w:p>
@@ -12502,7 +13012,7 @@
           <w:sz w:val="21"/>
           <w:szCs w:val="21"/>
         </w:rPr>
-        <w:t xml:space="preserve">server/scripts/seed.js, server/tests/*.test.js, .github/workflows/ci.yml</w:t>
+        <w:t xml:space="preserve">client/js/data/api.js</w:t>
       </w:r>
     </w:p>
     <w:p>
@@ -12511,7 +13021,120 @@
         <w:keepNext/>
       </w:pPr>
       <w:r>
-        <w:t xml:space="preserve">P11  Remove legacy code, document and deploy</w:t>
+        <w:t xml:space="preserve">P9  Seed data and automated tests</w:t>
+      </w:r>
+    </w:p>
+    <w:p>
+      <w:pPr>
+        <w:keepNext/>
+        <w:spacing w:after="60"/>
+      </w:pPr>
+      <w:r>
+        <w:rPr>
+          <w:color w:val="5B6475"/>
+          <w:sz w:val="18"/>
+          <w:szCs w:val="18"/>
+        </w:rPr>
+        <w:t xml:space="preserve">Review 3  |  Planned prompt</w:t>
+      </w:r>
+    </w:p>
+    <w:p>
+      <w:pPr>
+        <w:spacing w:after="60" w:before="160"/>
+      </w:pPr>
+      <w:r>
+        <w:rPr>
+          <w:b/>
+          <w:bCs/>
+          <w:color w:val="4F46E5"/>
+          <w:spacing w:val="20"/>
+          <w:sz w:val="17"/>
+          <w:szCs w:val="17"/>
+        </w:rPr>
+        <w:t xml:space="preserve">PROMPT</w:t>
+      </w:r>
+    </w:p>
+    <w:p>
+      <w:pPr>
+        <w:pBdr>
+          <w:left w:val="single" w:color="4F46E5" w:sz="18" w:space="8"/>
+        </w:pBdr>
+        <w:shd w:fill="F1F2F8" w:color="auto" w:val="clear"/>
+        <w:spacing w:after="120" w:before="40" w:line="276"/>
+        <w:ind w:left="160" w:right="160"/>
+      </w:pPr>
+      <w:r>
+        <w:rPr>
+          <w:rFonts w:ascii="Consolas" w:cs="Consolas" w:eastAsia="Consolas" w:hAnsi="Consolas"/>
+          <w:sz w:val="19"/>
+          <w:szCs w:val="19"/>
+        </w:rPr>
+        <w:t xml:space="preserve">Add server/scripts/seed.js that creates the demo user, categories, six months of expenses and income, budgets, recurring payments, the three groups with shared expenses, and shopping lists. It must be idempotent and must refuse to run against a database whose name does not end in -dev or -test unless --force is passed. Write Jest + Supertest tests using mongodb-memory-server for auth, ownership checks, CSRF rejection, rate limiting, split validation, the settlement algorithm, budget status, convert-to-expense duplicate prevention and receipt upload validation, covering what the 47 legacy Python tests checked. Add an npm test script and a GitHub Actions workflow that runs lint and tests on every push.</w:t>
+      </w:r>
+    </w:p>
+    <w:p>
+      <w:pPr>
+        <w:spacing w:after="60" w:before="160"/>
+      </w:pPr>
+      <w:r>
+        <w:rPr>
+          <w:b/>
+          <w:bCs/>
+          <w:color w:val="4F46E5"/>
+          <w:spacing w:val="20"/>
+          <w:sz w:val="17"/>
+          <w:szCs w:val="17"/>
+        </w:rPr>
+        <w:t xml:space="preserve">PURPOSE</w:t>
+      </w:r>
+    </w:p>
+    <w:p>
+      <w:pPr>
+        <w:spacing w:after="80"/>
+      </w:pPr>
+      <w:r>
+        <w:rPr>
+          <w:sz w:val="21"/>
+          <w:szCs w:val="21"/>
+        </w:rPr>
+        <w:t xml:space="preserve">Prove the back end works and keep it working.</w:t>
+      </w:r>
+    </w:p>
+    <w:p>
+      <w:pPr>
+        <w:spacing w:after="60" w:before="160"/>
+      </w:pPr>
+      <w:r>
+        <w:rPr>
+          <w:b/>
+          <w:bCs/>
+          <w:color w:val="4F46E5"/>
+          <w:spacing w:val="20"/>
+          <w:sz w:val="17"/>
+          <w:szCs w:val="17"/>
+        </w:rPr>
+        <w:t xml:space="preserve">FILES</w:t>
+      </w:r>
+    </w:p>
+    <w:p>
+      <w:pPr>
+        <w:spacing w:after="80"/>
+      </w:pPr>
+      <w:r>
+        <w:rPr>
+          <w:sz w:val="21"/>
+          <w:szCs w:val="21"/>
+        </w:rPr>
+        <w:t xml:space="preserve">server/scripts/seed.js, server/tests/*.test.js, .github/workflows/ci.yml</w:t>
+      </w:r>
+    </w:p>
+    <w:p>
+      <w:pPr>
+        <w:pStyle w:val="Heading3"/>
+        <w:keepNext/>
+      </w:pPr>
+      <w:r>
+        <w:t xml:space="preserve">P10  Remove legacy code, document and deploy</w:t>
       </w:r>
     </w:p>
     <w:p>

</xml_diff>

<commit_message>
Review 2: charts, budgets, forecast, insights, search, notifications
</commit_message>
<xml_diff>
--- a/docs/SplitStack_Prompt_Log.docx
+++ b/docs/SplitStack_Prompt_Log.docx
@@ -132,7 +132,7 @@
           <w:sz w:val="21"/>
           <w:szCs w:val="21"/>
         </w:rPr>
-        <w:t xml:space="preserve">31</w:t>
+        <w:t xml:space="preserve">33</w:t>
       </w:r>
     </w:p>
     <w:p>
@@ -568,7 +568,7 @@
                 <w:sz w:val="18"/>
                 <w:szCs w:val="18"/>
               </w:rPr>
-              <w:t xml:space="preserve">10</w:t>
+              <w:t xml:space="preserve">12</w:t>
             </w:r>
           </w:p>
         </w:tc>
@@ -4574,6 +4574,245 @@
           </w:p>
         </w:tc>
       </w:tr>
+      <w:tr>
+        <w:tc>
+          <w:tcPr>
+            <w:tcW w:type="dxa" w:w="700"/>
+            <w:shd w:fill="F7F7FB" w:color="auto" w:val="clear"/>
+            <w:tcMar>
+              <w:top w:type="dxa" w:w="60"/>
+              <w:left w:type="dxa" w:w="100"/>
+              <w:bottom w:type="dxa" w:w="60"/>
+              <w:right w:type="dxa" w:w="100"/>
+            </w:tcMar>
+          </w:tcPr>
+          <w:p>
+            <w:r>
+              <w:rPr>
+                <w:b w:val="false"/>
+                <w:bCs w:val="false"/>
+                <w:color w:val="222222"/>
+                <w:sz w:val="18"/>
+                <w:szCs w:val="18"/>
+              </w:rPr>
+              <w:t xml:space="preserve">32</w:t>
+            </w:r>
+          </w:p>
+        </w:tc>
+        <w:tc>
+          <w:tcPr>
+            <w:tcW w:type="dxa" w:w="1500"/>
+            <w:shd w:fill="F7F7FB" w:color="auto" w:val="clear"/>
+            <w:tcMar>
+              <w:top w:type="dxa" w:w="60"/>
+              <w:left w:type="dxa" w:w="100"/>
+              <w:bottom w:type="dxa" w:w="60"/>
+              <w:right w:type="dxa" w:w="100"/>
+            </w:tcMar>
+          </w:tcPr>
+          <w:p>
+            <w:r>
+              <w:rPr>
+                <w:b w:val="false"/>
+                <w:bCs w:val="false"/>
+                <w:color w:val="222222"/>
+                <w:sz w:val="18"/>
+                <w:szCs w:val="18"/>
+              </w:rPr>
+              <w:t xml:space="preserve">Review 2</w:t>
+            </w:r>
+          </w:p>
+        </w:tc>
+        <w:tc>
+          <w:tcPr>
+            <w:tcW w:type="dxa" w:w="4538"/>
+            <w:shd w:fill="F7F7FB" w:color="auto" w:val="clear"/>
+            <w:tcMar>
+              <w:top w:type="dxa" w:w="60"/>
+              <w:left w:type="dxa" w:w="100"/>
+              <w:bottom w:type="dxa" w:w="60"/>
+              <w:right w:type="dxa" w:w="100"/>
+            </w:tcMar>
+          </w:tcPr>
+          <w:p>
+            <w:r>
+              <w:rPr>
+                <w:b w:val="false"/>
+                <w:bCs w:val="false"/>
+                <w:color w:val="222222"/>
+                <w:sz w:val="18"/>
+                <w:szCs w:val="18"/>
+              </w:rPr>
+              <w:t xml:space="preserve">Request: proceed with Review 2 Step P6</w:t>
+            </w:r>
+          </w:p>
+        </w:tc>
+        <w:tc>
+          <w:tcPr>
+            <w:tcW w:type="dxa" w:w="1500"/>
+            <w:shd w:fill="F7F7FB" w:color="auto" w:val="clear"/>
+            <w:tcMar>
+              <w:top w:type="dxa" w:w="60"/>
+              <w:left w:type="dxa" w:w="100"/>
+              <w:bottom w:type="dxa" w:w="60"/>
+              <w:right w:type="dxa" w:w="100"/>
+            </w:tcMar>
+          </w:tcPr>
+          <w:p>
+            <w:r>
+              <w:rPr>
+                <w:b w:val="false"/>
+                <w:bCs w:val="false"/>
+                <w:color w:val="222222"/>
+                <w:sz w:val="18"/>
+                <w:szCs w:val="18"/>
+              </w:rPr>
+              <w:t xml:space="preserve">User prompt</w:t>
+            </w:r>
+          </w:p>
+        </w:tc>
+        <w:tc>
+          <w:tcPr>
+            <w:tcW w:type="dxa" w:w="1400"/>
+            <w:shd w:fill="F7F7FB" w:color="auto" w:val="clear"/>
+            <w:tcMar>
+              <w:top w:type="dxa" w:w="60"/>
+              <w:left w:type="dxa" w:w="100"/>
+              <w:bottom w:type="dxa" w:w="60"/>
+              <w:right w:type="dxa" w:w="100"/>
+            </w:tcMar>
+          </w:tcPr>
+          <w:p>
+            <w:r>
+              <w:rPr>
+                <w:b w:val="false"/>
+                <w:bCs w:val="false"/>
+                <w:color w:val="222222"/>
+                <w:sz w:val="18"/>
+                <w:szCs w:val="18"/>
+              </w:rPr>
+              <w:t xml:space="preserve">2026-10-16</w:t>
+            </w:r>
+          </w:p>
+        </w:tc>
+      </w:tr>
+      <w:tr>
+        <w:tc>
+          <w:tcPr>
+            <w:tcW w:type="dxa" w:w="700"/>
+            <w:tcMar>
+              <w:top w:type="dxa" w:w="60"/>
+              <w:left w:type="dxa" w:w="100"/>
+              <w:bottom w:type="dxa" w:w="60"/>
+              <w:right w:type="dxa" w:w="100"/>
+            </w:tcMar>
+          </w:tcPr>
+          <w:p>
+            <w:r>
+              <w:rPr>
+                <w:b w:val="false"/>
+                <w:bCs w:val="false"/>
+                <w:color w:val="222222"/>
+                <w:sz w:val="18"/>
+                <w:szCs w:val="18"/>
+              </w:rPr>
+              <w:t xml:space="preserve">33</w:t>
+            </w:r>
+          </w:p>
+        </w:tc>
+        <w:tc>
+          <w:tcPr>
+            <w:tcW w:type="dxa" w:w="1500"/>
+            <w:tcMar>
+              <w:top w:type="dxa" w:w="60"/>
+              <w:left w:type="dxa" w:w="100"/>
+              <w:bottom w:type="dxa" w:w="60"/>
+              <w:right w:type="dxa" w:w="100"/>
+            </w:tcMar>
+          </w:tcPr>
+          <w:p>
+            <w:r>
+              <w:rPr>
+                <w:b w:val="false"/>
+                <w:bCs w:val="false"/>
+                <w:color w:val="222222"/>
+                <w:sz w:val="18"/>
+                <w:szCs w:val="18"/>
+              </w:rPr>
+              <w:t xml:space="preserve">Review 2</w:t>
+            </w:r>
+          </w:p>
+        </w:tc>
+        <w:tc>
+          <w:tcPr>
+            <w:tcW w:type="dxa" w:w="4538"/>
+            <w:tcMar>
+              <w:top w:type="dxa" w:w="60"/>
+              <w:left w:type="dxa" w:w="100"/>
+              <w:bottom w:type="dxa" w:w="60"/>
+              <w:right w:type="dxa" w:w="100"/>
+            </w:tcMar>
+          </w:tcPr>
+          <w:p>
+            <w:r>
+              <w:rPr>
+                <w:b w:val="false"/>
+                <w:bCs w:val="false"/>
+                <w:color w:val="222222"/>
+                <w:sz w:val="18"/>
+                <w:szCs w:val="18"/>
+              </w:rPr>
+              <w:t xml:space="preserve">Charts, budgets, forecast, insights, search and notifications</w:t>
+            </w:r>
+          </w:p>
+        </w:tc>
+        <w:tc>
+          <w:tcPr>
+            <w:tcW w:type="dxa" w:w="1500"/>
+            <w:tcMar>
+              <w:top w:type="dxa" w:w="60"/>
+              <w:left w:type="dxa" w:w="100"/>
+              <w:bottom w:type="dxa" w:w="60"/>
+              <w:right w:type="dxa" w:w="100"/>
+            </w:tcMar>
+          </w:tcPr>
+          <w:p>
+            <w:r>
+              <w:rPr>
+                <w:b w:val="false"/>
+                <w:bCs w:val="false"/>
+                <w:color w:val="222222"/>
+                <w:sz w:val="18"/>
+                <w:szCs w:val="18"/>
+              </w:rPr>
+              <w:t xml:space="preserve">Working prompt</w:t>
+            </w:r>
+          </w:p>
+        </w:tc>
+        <w:tc>
+          <w:tcPr>
+            <w:tcW w:type="dxa" w:w="1400"/>
+            <w:tcMar>
+              <w:top w:type="dxa" w:w="60"/>
+              <w:left w:type="dxa" w:w="100"/>
+              <w:bottom w:type="dxa" w:w="60"/>
+              <w:right w:type="dxa" w:w="100"/>
+            </w:tcMar>
+          </w:tcPr>
+          <w:p>
+            <w:r>
+              <w:rPr>
+                <w:b w:val="false"/>
+                <w:bCs w:val="false"/>
+                <w:color w:val="222222"/>
+                <w:sz w:val="18"/>
+                <w:szCs w:val="18"/>
+              </w:rPr>
+              <w:t xml:space="preserve">2026-10-16</w:t>
+            </w:r>
+          </w:p>
+        </w:tc>
+      </w:tr>
     </w:tbl>
     <w:p>
       <w:r>
@@ -10227,20 +10466,11 @@
     </w:p>
     <w:p>
       <w:pPr>
-        <w:pStyle w:val="Heading2"/>
-        <w:spacing w:before="360"/>
-      </w:pPr>
-      <w:r>
-        <w:t xml:space="preserve">Wrap-up - Documentation, cleanup and deployment</w:t>
-      </w:r>
-    </w:p>
-    <w:p>
-      <w:pPr>
         <w:pStyle w:val="Heading3"/>
         <w:keepNext/>
       </w:pPr>
       <w:r>
-        <w:t xml:space="preserve">#13  Request: GitHub repository, website link and PDF of prompts</w:t>
+        <w:t xml:space="preserve">#32  Request: proceed with Review 2 Step P6</w:t>
       </w:r>
     </w:p>
     <w:p>
@@ -10254,7 +10484,7 @@
           <w:sz w:val="18"/>
           <w:szCs w:val="18"/>
         </w:rPr>
-        <w:t xml:space="preserve">User prompt  |  2026-10-15</w:t>
+        <w:t xml:space="preserve">User prompt  |  2026-10-16</w:t>
       </w:r>
     </w:p>
     <w:p>
@@ -10288,7 +10518,17 @@
           <w:sz w:val="19"/>
           <w:szCs w:val="19"/>
         </w:rPr>
-        <w:t xml:space="preserve">create a new repositry for this project in my gihub , and after than give me the github link and then the website link and also a pdf containing the prompts to complete project.</w:t>
+        <w:t xml:space="preserve"># SplitStack — P6: Analytics, Charts, Forecasts, Insights, Search &amp; Notifications
+You are continuing development of SplitStack, a personal finance and expense-sharing application. P1–P5 are reported complete. Implement only P6, following the project handover instructions.
+1. Mandatory preflight: read P6 in SplitStack_Handover_Prompts.pdf; inspect project structure, REFURBISH_PLAN.md, analytics/budget/recurring/search/notification modules, api.js, store.js, seed.js, splits.js, settle.js, analytics.js, budgets.js, dashboard.js, HTML/CSS, and tests; verify git branch refurbish and latest commit; preserve docs/audit/.
+2. Scope and boundaries: implement financial analytics/charts, budget tracking/forecasting, explainable spending insights, search/filter improvements, and in-app notifications. Do not implement P7 OCR or backend P9+.
+3. Analytics data layer: improve reusable functions behind api.js; keep calculations independent of DOM; integer paise for stored amounts; respect active user and data isolation; distinguish personal transactions from group expenses; handle sparse data.
+4. Financial analytics and charts: implement visualizations using real data (trends, category spend, net savings, budget usage); dynamic updates on filter changes; accessible titles/legends/tables; prevent duplicate chart instances.
+5. Budget tracking and forecasting: linear spending velocity projection in domain/forecast.js; minimum 3 transactions data sufficiency rule; explainable estimates; risk classification (danger, warning, caution, ok).
+6. Spending insights: deterministic insights from real data in domain/insights.js (budget danger/warning, &gt;=20% month-over-month category trend, upcoming recurring bills in 7 days, group balances).
+7. Search and filtering: topbar global combobox search in ui/search.js with 200ms debounce across expenses, income, groups, shopping lists; case-insensitive; clear filters restoration; pagination consistency.
+8. In-app notifications: topbar bell indicator in ui/notifications.js; dropdown panel; read status persistence per user in store.js.
+9. Automated tests: add forecast, insights, and search/notification tests; run all client tests; run npm run lint:html; update documentation and prompt log; commit locally with message: Review 2: charts, budgets, forecast, insights, search, notifications.</w:t>
       </w:r>
     </w:p>
     <w:p>
@@ -10316,7 +10556,7 @@
           <w:sz w:val="21"/>
           <w:szCs w:val="21"/>
         </w:rPr>
-        <w:t xml:space="preserve">Publish the project under the student's own GitHub account, host the site, and export the prompt log (including the remaining planned prompts) as a PDF.</w:t>
+        <w:t xml:space="preserve">Authorize implementation of Step P6: Analytics, Charts, Forecasts, Insights, Search &amp; Notifications.</w:t>
       </w:r>
     </w:p>
     <w:p>
@@ -10377,7 +10617,7 @@
           <w:sz w:val="21"/>
           <w:szCs w:val="21"/>
         </w:rPr>
-        <w:t xml:space="preserve">Done: see the following entries.</w:t>
+        <w:t xml:space="preserve">Authorized Step P6 implementation.</w:t>
       </w:r>
     </w:p>
     <w:p>
@@ -10425,7 +10665,7 @@
         <w:keepNext/>
       </w:pPr>
       <w:r>
-        <w:t xml:space="preserve">#14  PDF export of the prompt log, including planned prompts</w:t>
+        <w:t xml:space="preserve">#33  Charts, budgets, forecast, insights, search and notifications</w:t>
       </w:r>
     </w:p>
     <w:p>
@@ -10439,7 +10679,7 @@
           <w:sz w:val="18"/>
           <w:szCs w:val="18"/>
         </w:rPr>
-        <w:t xml:space="preserve">Working prompt  |  2026-10-15</w:t>
+        <w:t xml:space="preserve">Working prompt  |  2026-10-16</w:t>
       </w:r>
     </w:p>
     <w:p>
@@ -10473,7 +10713,7 @@
           <w:sz w:val="19"/>
           <w:szCs w:val="19"/>
         </w:rPr>
-        <w:t xml:space="preserve">Export the prompt log to PDF with a Python reportlab script (docs/tools/build_prompt_pdf.py) that reads docs/prompt_log.json: a title page, a stage overview table, a summary of every entry, Part A with every executed prompt verbatim in a shaded box with purpose, files, result and verification, and Part B with the planned prompts that complete Review 2, Review 3 and the wrap-up, clearly marked as not yet run. Add the planned prompts to prompt_log.json and to the Word log as well, and make "npm run log" rebuild both documents.</w:t>
+        <w:t xml:space="preserve">Render the dashboard and analytics charts with Chart.js 4 loaded from a pinned CDN URL, reading colours from the CSS custom properties so both themes work, and keep the CSS charts as a fallback. Compute budget status (ok under 75%, caution 75-90%, warning 90-100%, danger over 100%) and update the meters. Port the spending forecast (average daily spend multiplied by the days in the month) to client/js/domain/forecast.js. Generate smart insights from the data (over-budget categories, month-over-month change, upcoming recurring bills). Make the topbar search show live results across expenses, groups and lists in a listbox with keyboard navigation, and make the bell open a notifications panel built from the insights with an unread count.</w:t>
       </w:r>
     </w:p>
     <w:p>
@@ -10501,7 +10741,7 @@
           <w:sz w:val="21"/>
           <w:szCs w:val="21"/>
         </w:rPr>
-        <w:t xml:space="preserve">Give the student a PDF containing the prompts needed to complete the whole project.</w:t>
+        <w:t xml:space="preserve">Finish the interactive features that were disconnected in the original app.</w:t>
       </w:r>
     </w:p>
     <w:p>
@@ -10534,7 +10774,7 @@
           <w:sz w:val="19"/>
           <w:szCs w:val="19"/>
         </w:rPr>
-        <w:t xml:space="preserve">docs/tools/build_prompt_pdf.py</w:t>
+        <w:t xml:space="preserve">client/js/domain/forecast.js</w:t>
       </w:r>
     </w:p>
     <w:p>
@@ -10551,7 +10791,7 @@
           <w:sz w:val="19"/>
           <w:szCs w:val="19"/>
         </w:rPr>
-        <w:t xml:space="preserve">docs/tools/build-prompt-log.js</w:t>
+        <w:t xml:space="preserve">client/js/domain/insights.js</w:t>
       </w:r>
     </w:p>
     <w:p>
@@ -10568,7 +10808,7 @@
           <w:sz w:val="19"/>
           <w:szCs w:val="19"/>
         </w:rPr>
-        <w:t xml:space="preserve">docs/prompt_log.json</w:t>
+        <w:t xml:space="preserve">client/js/ui/charts.js</w:t>
       </w:r>
     </w:p>
     <w:p>
@@ -10585,7 +10825,7 @@
           <w:sz w:val="19"/>
           <w:szCs w:val="19"/>
         </w:rPr>
-        <w:t xml:space="preserve">docs/SplitStack_Prompt_Log.pdf</w:t>
+        <w:t xml:space="preserve">client/js/ui/search.js</w:t>
       </w:r>
     </w:p>
     <w:p>
@@ -10602,7 +10842,7 @@
           <w:sz w:val="19"/>
           <w:szCs w:val="19"/>
         </w:rPr>
-        <w:t xml:space="preserve">docs/SplitStack_Prompt_Log.docx</w:t>
+        <w:t xml:space="preserve">client/js/ui/notifications.js</w:t>
       </w:r>
     </w:p>
     <w:p>
@@ -10619,7 +10859,177 @@
           <w:sz w:val="19"/>
           <w:szCs w:val="19"/>
         </w:rPr>
+        <w:t xml:space="preserve">client/js/pages/dashboard.js</w:t>
+      </w:r>
+    </w:p>
+    <w:p>
+      <w:pPr>
+        <w:pStyle w:val="ListParagraph"/>
+        <w:numPr>
+          <w:ilvl w:val="0"/>
+          <w:numId w:val="2"/>
+        </w:numPr>
+      </w:pPr>
+      <w:r>
+        <w:rPr>
+          <w:rFonts w:ascii="Consolas" w:cs="Consolas" w:eastAsia="Consolas" w:hAnsi="Consolas"/>
+          <w:sz w:val="19"/>
+          <w:szCs w:val="19"/>
+        </w:rPr>
+        <w:t xml:space="preserve">client/js/pages/analytics.js</w:t>
+      </w:r>
+    </w:p>
+    <w:p>
+      <w:pPr>
+        <w:pStyle w:val="ListParagraph"/>
+        <w:numPr>
+          <w:ilvl w:val="0"/>
+          <w:numId w:val="2"/>
+        </w:numPr>
+      </w:pPr>
+      <w:r>
+        <w:rPr>
+          <w:rFonts w:ascii="Consolas" w:cs="Consolas" w:eastAsia="Consolas" w:hAnsi="Consolas"/>
+          <w:sz w:val="19"/>
+          <w:szCs w:val="19"/>
+        </w:rPr>
+        <w:t xml:space="preserve">client/js/pages/budgets.js</w:t>
+      </w:r>
+    </w:p>
+    <w:p>
+      <w:pPr>
+        <w:pStyle w:val="ListParagraph"/>
+        <w:numPr>
+          <w:ilvl w:val="0"/>
+          <w:numId w:val="2"/>
+        </w:numPr>
+      </w:pPr>
+      <w:r>
+        <w:rPr>
+          <w:rFonts w:ascii="Consolas" w:cs="Consolas" w:eastAsia="Consolas" w:hAnsi="Consolas"/>
+          <w:sz w:val="19"/>
+          <w:szCs w:val="19"/>
+        </w:rPr>
+        <w:t xml:space="preserve">client/js/data/api.js</w:t>
+      </w:r>
+    </w:p>
+    <w:p>
+      <w:pPr>
+        <w:pStyle w:val="ListParagraph"/>
+        <w:numPr>
+          <w:ilvl w:val="0"/>
+          <w:numId w:val="2"/>
+        </w:numPr>
+      </w:pPr>
+      <w:r>
+        <w:rPr>
+          <w:rFonts w:ascii="Consolas" w:cs="Consolas" w:eastAsia="Consolas" w:hAnsi="Consolas"/>
+          <w:sz w:val="19"/>
+          <w:szCs w:val="19"/>
+        </w:rPr>
+        <w:t xml:space="preserve">client/js/app.js</w:t>
+      </w:r>
+    </w:p>
+    <w:p>
+      <w:pPr>
+        <w:pStyle w:val="ListParagraph"/>
+        <w:numPr>
+          <w:ilvl w:val="0"/>
+          <w:numId w:val="2"/>
+        </w:numPr>
+      </w:pPr>
+      <w:r>
+        <w:rPr>
+          <w:rFonts w:ascii="Consolas" w:cs="Consolas" w:eastAsia="Consolas" w:hAnsi="Consolas"/>
+          <w:sz w:val="19"/>
+          <w:szCs w:val="19"/>
+        </w:rPr>
+        <w:t xml:space="preserve">client/css/components.css</w:t>
+      </w:r>
+    </w:p>
+    <w:p>
+      <w:pPr>
+        <w:pStyle w:val="ListParagraph"/>
+        <w:numPr>
+          <w:ilvl w:val="0"/>
+          <w:numId w:val="2"/>
+        </w:numPr>
+      </w:pPr>
+      <w:r>
+        <w:rPr>
+          <w:rFonts w:ascii="Consolas" w:cs="Consolas" w:eastAsia="Consolas" w:hAnsi="Consolas"/>
+          <w:sz w:val="19"/>
+          <w:szCs w:val="19"/>
+        </w:rPr>
         <w:t xml:space="preserve">package.json</w:t>
+      </w:r>
+    </w:p>
+    <w:p>
+      <w:pPr>
+        <w:pStyle w:val="ListParagraph"/>
+        <w:numPr>
+          <w:ilvl w:val="0"/>
+          <w:numId w:val="2"/>
+        </w:numPr>
+      </w:pPr>
+      <w:r>
+        <w:rPr>
+          <w:rFonts w:ascii="Consolas" w:cs="Consolas" w:eastAsia="Consolas" w:hAnsi="Consolas"/>
+          <w:sz w:val="19"/>
+          <w:szCs w:val="19"/>
+        </w:rPr>
+        <w:t xml:space="preserve">tests/client/forecast.test.mjs</w:t>
+      </w:r>
+    </w:p>
+    <w:p>
+      <w:pPr>
+        <w:pStyle w:val="ListParagraph"/>
+        <w:numPr>
+          <w:ilvl w:val="0"/>
+          <w:numId w:val="2"/>
+        </w:numPr>
+      </w:pPr>
+      <w:r>
+        <w:rPr>
+          <w:rFonts w:ascii="Consolas" w:cs="Consolas" w:eastAsia="Consolas" w:hAnsi="Consolas"/>
+          <w:sz w:val="19"/>
+          <w:szCs w:val="19"/>
+        </w:rPr>
+        <w:t xml:space="preserve">tests/client/insights.test.mjs</w:t>
+      </w:r>
+    </w:p>
+    <w:p>
+      <w:pPr>
+        <w:pStyle w:val="ListParagraph"/>
+        <w:numPr>
+          <w:ilvl w:val="0"/>
+          <w:numId w:val="2"/>
+        </w:numPr>
+      </w:pPr>
+      <w:r>
+        <w:rPr>
+          <w:rFonts w:ascii="Consolas" w:cs="Consolas" w:eastAsia="Consolas" w:hAnsi="Consolas"/>
+          <w:sz w:val="19"/>
+          <w:szCs w:val="19"/>
+        </w:rPr>
+        <w:t xml:space="preserve">tests/client/search-notifications.test.mjs</w:t>
+      </w:r>
+    </w:p>
+    <w:p>
+      <w:pPr>
+        <w:pStyle w:val="ListParagraph"/>
+        <w:numPr>
+          <w:ilvl w:val="0"/>
+          <w:numId w:val="2"/>
+        </w:numPr>
+      </w:pPr>
+      <w:r>
+        <w:rPr>
+          <w:rFonts w:ascii="Consolas" w:cs="Consolas" w:eastAsia="Consolas" w:hAnsi="Consolas"/>
+          <w:sz w:val="19"/>
+          <w:szCs w:val="19"/>
+        </w:rPr>
+        <w:t xml:space="preserve">client/README.md</w:t>
       </w:r>
     </w:p>
     <w:p>
@@ -10647,7 +11057,7 @@
           <w:sz w:val="21"/>
           <w:szCs w:val="21"/>
         </w:rPr>
-        <w:t xml:space="preserve">PDF with the executed prompts and 15 planned prompts; the Word log has the same content.</w:t>
+        <w:t xml:space="preserve">Created forecast.js domain module with daily velocity model, data sufficiency threshold (&gt;= 3 transactions), and budget risk classification; created insights.js domain module with deterministic budget alerts, month-over-month category trend tracking (&gt;= 20%), upcoming recurring bills (next 7 days), and group balance alerts; created charts.js with Chart.js 4 dynamic loader, token palette extraction via getComputedStyle, theme observer, canvas aria-label, and CSS chart fallbacks; created search.js with 200ms debounce, WAI-ARIA combobox/listbox pattern, and keyboard navigation across expenses, income, groups, and shopping lists; created notifications.js with topbar bell badge and dropdown panel with read-state persistence in user preferences; updated dashboard.js, analytics.js, budgets.js, and app.js; added test:client script to package.json; added 41 new automated tests.</w:t>
       </w:r>
     </w:p>
     <w:p>
@@ -10675,7 +11085,7 @@
           <w:sz w:val="21"/>
           <w:szCs w:val="21"/>
         </w:rPr>
-        <w:t xml:space="preserve">Pages rendered to images and inspected; text extracted with pypdf.</w:t>
+        <w:t xml:space="preserve">145 total client tests passing across 7 test suites (data-layer.test.mjs, render.test.mjs, forms.test.mjs, splits-settle.test.mjs, forecast.test.mjs, insights.test.mjs, search-notifications.test.mjs); npm run lint:html passing with 0 errors across 25 HTML files.</w:t>
       </w:r>
     </w:p>
     <w:p>
@@ -10691,11 +11101,20 @@
     </w:p>
     <w:p>
       <w:pPr>
+        <w:pStyle w:val="Heading2"/>
+        <w:spacing w:before="360"/>
+      </w:pPr>
+      <w:r>
+        <w:t xml:space="preserve">Wrap-up - Documentation, cleanup and deployment</w:t>
+      </w:r>
+    </w:p>
+    <w:p>
+      <w:pPr>
         <w:pStyle w:val="Heading3"/>
         <w:keepNext/>
       </w:pPr>
       <w:r>
-        <w:t xml:space="preserve">#15  Create the GitHub repository and push the code</w:t>
+        <w:t xml:space="preserve">#13  Request: GitHub repository, website link and PDF of prompts</w:t>
       </w:r>
     </w:p>
     <w:p>
@@ -10709,7 +11128,7 @@
           <w:sz w:val="18"/>
           <w:szCs w:val="18"/>
         </w:rPr>
-        <w:t xml:space="preserve">Working prompt  |  2026-10-15</w:t>
+        <w:t xml:space="preserve">User prompt  |  2026-10-15</w:t>
       </w:r>
     </w:p>
     <w:p>
@@ -10743,7 +11162,7 @@
           <w:sz w:val="19"/>
           <w:szCs w:val="19"/>
         </w:rPr>
-        <w:t xml:space="preserve">Install the official GitHub CLI with winget and sign in through the device-code flow (the student approves it in the browser). Before publishing, check that no secrets or databases are tracked, review the receipt images that are still in the commit history (they are generic sample invoices), and confirm with the student that a public repository is acceptable because the team's original repository is private. Then create the public repository MahaprabhuK/SplitStack, push the refurbish branch as main together with the legacy branch, add a GitHub Actions workflow (.github/workflows/pages.yml) that deploys the client/ folder to GitHub Pages, enable Pages with the "GitHub Actions" source, and confirm that the site responds.</w:t>
+        <w:t xml:space="preserve">create a new repositry for this project in my gihub , and after than give me the github link and then the website link and also a pdf containing the prompts to complete project.</w:t>
       </w:r>
     </w:p>
     <w:p>
@@ -10771,7 +11190,7 @@
           <w:sz w:val="21"/>
           <w:szCs w:val="21"/>
         </w:rPr>
-        <w:t xml:space="preserve">Give the student a repository link and a live website link.</w:t>
+        <w:t xml:space="preserve">Publish the project under the student's own GitHub account, host the site, and export the prompt log (including the remaining planned prompts) as a PDF.</w:t>
       </w:r>
     </w:p>
     <w:p>
@@ -10804,7 +11223,7 @@
           <w:sz w:val="19"/>
           <w:szCs w:val="19"/>
         </w:rPr>
-        <w:t xml:space="preserve">README.md</w:t>
+        <w:t xml:space="preserve">-</w:t>
       </w:r>
     </w:p>
     <w:p>
@@ -10832,7 +11251,7 @@
           <w:sz w:val="21"/>
           <w:szCs w:val="21"/>
         </w:rPr>
-        <w:t xml:space="preserve">Public repository https://github.com/MahaprabhuK/SplitStack created and the legacy branch pushed. The first push of main was rejected because it added a GitHub Actions workflow (.github/workflows/pages.yml) and the gh token lacked the "workflow" scope; the workflow file was removed and main was pushed in the next step. GitHub Pages is not set up yet (planned for the wrap-up; needs "gh auth refresh -s workflow" or a gh-pages branch).</w:t>
+        <w:t xml:space="preserve">Done: see the following entries.</w:t>
       </w:r>
     </w:p>
     <w:p>
@@ -10860,7 +11279,7 @@
           <w:sz w:val="21"/>
           <w:szCs w:val="21"/>
         </w:rPr>
-        <w:t xml:space="preserve">gh repo view; git push output.</w:t>
+        <w:t xml:space="preserve">-</w:t>
       </w:r>
     </w:p>
     <w:p>
@@ -10880,7 +11299,7 @@
         <w:keepNext/>
       </w:pPr>
       <w:r>
-        <w:t xml:space="preserve">#16  Request: hand the project over to a teammate's agent</w:t>
+        <w:t xml:space="preserve">#14  PDF export of the prompt log, including planned prompts</w:t>
       </w:r>
     </w:p>
     <w:p>
@@ -10894,7 +11313,7 @@
           <w:sz w:val="18"/>
           <w:szCs w:val="18"/>
         </w:rPr>
-        <w:t xml:space="preserve">User prompt  |  2026-10-15</w:t>
+        <w:t xml:space="preserve">Working prompt  |  2026-10-15</w:t>
       </w:r>
     </w:p>
     <w:p>
@@ -10928,7 +11347,7 @@
           <w:sz w:val="19"/>
           <w:szCs w:val="19"/>
         </w:rPr>
-        <w:t xml:space="preserve">ACTUALLY I GONNA HANDOVER THE PROJECT TO MY TEAMMATES AGENT SO HE'LL BE PULLING THE CODE AND RUNNING IN HIS SYSTEM SO GIVE PROMPT FOR THAT</w:t>
+        <w:t xml:space="preserve">Export the prompt log to PDF with a Python reportlab script (docs/tools/build_prompt_pdf.py) that reads docs/prompt_log.json: a title page, a stage overview table, a summary of every entry, Part A with every executed prompt verbatim in a shaded box with purpose, files, result and verification, and Part B with the planned prompts that complete Review 2, Review 3 and the wrap-up, clearly marked as not yet run. Add the planned prompts to prompt_log.json and to the Word log as well, and make "npm run log" rebuild both documents.</w:t>
       </w:r>
     </w:p>
     <w:p>
@@ -10956,7 +11375,7 @@
           <w:sz w:val="21"/>
           <w:szCs w:val="21"/>
         </w:rPr>
-        <w:t xml:space="preserve">Let a teammate's AI agent clone, run and continue the project.</w:t>
+        <w:t xml:space="preserve">Give the student a PDF containing the prompts needed to complete the whole project.</w:t>
       </w:r>
     </w:p>
     <w:p>
@@ -10989,7 +11408,92 @@
           <w:sz w:val="19"/>
           <w:szCs w:val="19"/>
         </w:rPr>
-        <w:t xml:space="preserve">-</w:t>
+        <w:t xml:space="preserve">docs/tools/build_prompt_pdf.py</w:t>
+      </w:r>
+    </w:p>
+    <w:p>
+      <w:pPr>
+        <w:pStyle w:val="ListParagraph"/>
+        <w:numPr>
+          <w:ilvl w:val="0"/>
+          <w:numId w:val="2"/>
+        </w:numPr>
+      </w:pPr>
+      <w:r>
+        <w:rPr>
+          <w:rFonts w:ascii="Consolas" w:cs="Consolas" w:eastAsia="Consolas" w:hAnsi="Consolas"/>
+          <w:sz w:val="19"/>
+          <w:szCs w:val="19"/>
+        </w:rPr>
+        <w:t xml:space="preserve">docs/tools/build-prompt-log.js</w:t>
+      </w:r>
+    </w:p>
+    <w:p>
+      <w:pPr>
+        <w:pStyle w:val="ListParagraph"/>
+        <w:numPr>
+          <w:ilvl w:val="0"/>
+          <w:numId w:val="2"/>
+        </w:numPr>
+      </w:pPr>
+      <w:r>
+        <w:rPr>
+          <w:rFonts w:ascii="Consolas" w:cs="Consolas" w:eastAsia="Consolas" w:hAnsi="Consolas"/>
+          <w:sz w:val="19"/>
+          <w:szCs w:val="19"/>
+        </w:rPr>
+        <w:t xml:space="preserve">docs/prompt_log.json</w:t>
+      </w:r>
+    </w:p>
+    <w:p>
+      <w:pPr>
+        <w:pStyle w:val="ListParagraph"/>
+        <w:numPr>
+          <w:ilvl w:val="0"/>
+          <w:numId w:val="2"/>
+        </w:numPr>
+      </w:pPr>
+      <w:r>
+        <w:rPr>
+          <w:rFonts w:ascii="Consolas" w:cs="Consolas" w:eastAsia="Consolas" w:hAnsi="Consolas"/>
+          <w:sz w:val="19"/>
+          <w:szCs w:val="19"/>
+        </w:rPr>
+        <w:t xml:space="preserve">docs/SplitStack_Prompt_Log.pdf</w:t>
+      </w:r>
+    </w:p>
+    <w:p>
+      <w:pPr>
+        <w:pStyle w:val="ListParagraph"/>
+        <w:numPr>
+          <w:ilvl w:val="0"/>
+          <w:numId w:val="2"/>
+        </w:numPr>
+      </w:pPr>
+      <w:r>
+        <w:rPr>
+          <w:rFonts w:ascii="Consolas" w:cs="Consolas" w:eastAsia="Consolas" w:hAnsi="Consolas"/>
+          <w:sz w:val="19"/>
+          <w:szCs w:val="19"/>
+        </w:rPr>
+        <w:t xml:space="preserve">docs/SplitStack_Prompt_Log.docx</w:t>
+      </w:r>
+    </w:p>
+    <w:p>
+      <w:pPr>
+        <w:pStyle w:val="ListParagraph"/>
+        <w:numPr>
+          <w:ilvl w:val="0"/>
+          <w:numId w:val="2"/>
+        </w:numPr>
+      </w:pPr>
+      <w:r>
+        <w:rPr>
+          <w:rFonts w:ascii="Consolas" w:cs="Consolas" w:eastAsia="Consolas" w:hAnsi="Consolas"/>
+          <w:sz w:val="19"/>
+          <w:szCs w:val="19"/>
+        </w:rPr>
+        <w:t xml:space="preserve">package.json</w:t>
       </w:r>
     </w:p>
     <w:p>
@@ -11017,7 +11521,7 @@
           <w:sz w:val="21"/>
           <w:szCs w:val="21"/>
         </w:rPr>
-        <w:t xml:space="preserve">A handover prompt was written covering: requirements per review, clone and branch, prerequisites, install/run/verify commands, repository map, known traps, the mandatory logging rule, the ordered remaining work (planned prompts P1-P15) and working rules. Noted that the new work had to be pushed to GitHub first.</w:t>
+        <w:t xml:space="preserve">PDF with the executed prompts and 15 planned prompts; the Word log has the same content.</w:t>
       </w:r>
     </w:p>
     <w:p>
@@ -11045,7 +11549,7 @@
           <w:sz w:val="21"/>
           <w:szCs w:val="21"/>
         </w:rPr>
-        <w:t xml:space="preserve">-</w:t>
+        <w:t xml:space="preserve">Pages rendered to images and inspected; text extracted with pypdf.</w:t>
       </w:r>
     </w:p>
     <w:p>
@@ -11065,7 +11569,7 @@
         <w:keepNext/>
       </w:pPr>
       <w:r>
-        <w:t xml:space="preserve">#17  Push the refurbished code to GitHub main</w:t>
+        <w:t xml:space="preserve">#15  Create the GitHub repository and push the code</w:t>
       </w:r>
     </w:p>
     <w:p>
@@ -11113,7 +11617,7 @@
           <w:sz w:val="19"/>
           <w:szCs w:val="19"/>
         </w:rPr>
-        <w:t xml:space="preserve">push it  (user prompt). Executed as: remove .github/workflows/pages.yml (the token lacks the workflow scope), replace the not-yet-existing live-site link in README.md with local run instructions, correct the earlier log entry about publishing, log the handover, rebuild the prompt logs, commit, and push the refurbish branch to main on https://github.com/MahaprabhuK/SplitStack so the teammate can clone it.</w:t>
+        <w:t xml:space="preserve">Install the official GitHub CLI with winget and sign in through the device-code flow (the student approves it in the browser). Before publishing, check that no secrets or databases are tracked, review the receipt images that are still in the commit history (they are generic sample invoices), and confirm with the student that a public repository is acceptable because the team's original repository is private. Then create the public repository MahaprabhuK/SplitStack, push the refurbish branch as main together with the legacy branch, add a GitHub Actions workflow (.github/workflows/pages.yml) that deploys the client/ folder to GitHub Pages, enable Pages with the "GitHub Actions" source, and confirm that the site responds.</w:t>
       </w:r>
     </w:p>
     <w:p>
@@ -11141,7 +11645,7 @@
           <w:sz w:val="21"/>
           <w:szCs w:val="21"/>
         </w:rPr>
-        <w:t xml:space="preserve">Make the current work available to the teammate.</w:t>
+        <w:t xml:space="preserve">Give the student a repository link and a live website link.</w:t>
       </w:r>
     </w:p>
     <w:p>
@@ -11174,75 +11678,7 @@
           <w:sz w:val="19"/>
           <w:szCs w:val="19"/>
         </w:rPr>
-        <w:t xml:space="preserve">.github/workflows/pages.yml (removed)</w:t>
-      </w:r>
-    </w:p>
-    <w:p>
-      <w:pPr>
-        <w:pStyle w:val="ListParagraph"/>
-        <w:numPr>
-          <w:ilvl w:val="0"/>
-          <w:numId w:val="2"/>
-        </w:numPr>
-      </w:pPr>
-      <w:r>
-        <w:rPr>
-          <w:rFonts w:ascii="Consolas" w:cs="Consolas" w:eastAsia="Consolas" w:hAnsi="Consolas"/>
-          <w:sz w:val="19"/>
-          <w:szCs w:val="19"/>
-        </w:rPr>
         <w:t xml:space="preserve">README.md</w:t>
-      </w:r>
-    </w:p>
-    <w:p>
-      <w:pPr>
-        <w:pStyle w:val="ListParagraph"/>
-        <w:numPr>
-          <w:ilvl w:val="0"/>
-          <w:numId w:val="2"/>
-        </w:numPr>
-      </w:pPr>
-      <w:r>
-        <w:rPr>
-          <w:rFonts w:ascii="Consolas" w:cs="Consolas" w:eastAsia="Consolas" w:hAnsi="Consolas"/>
-          <w:sz w:val="19"/>
-          <w:szCs w:val="19"/>
-        </w:rPr>
-        <w:t xml:space="preserve">docs/prompt_log.json</w:t>
-      </w:r>
-    </w:p>
-    <w:p>
-      <w:pPr>
-        <w:pStyle w:val="ListParagraph"/>
-        <w:numPr>
-          <w:ilvl w:val="0"/>
-          <w:numId w:val="2"/>
-        </w:numPr>
-      </w:pPr>
-      <w:r>
-        <w:rPr>
-          <w:rFonts w:ascii="Consolas" w:cs="Consolas" w:eastAsia="Consolas" w:hAnsi="Consolas"/>
-          <w:sz w:val="19"/>
-          <w:szCs w:val="19"/>
-        </w:rPr>
-        <w:t xml:space="preserve">docs/SplitStack_Prompt_Log.docx</w:t>
-      </w:r>
-    </w:p>
-    <w:p>
-      <w:pPr>
-        <w:pStyle w:val="ListParagraph"/>
-        <w:numPr>
-          <w:ilvl w:val="0"/>
-          <w:numId w:val="2"/>
-        </w:numPr>
-      </w:pPr>
-      <w:r>
-        <w:rPr>
-          <w:rFonts w:ascii="Consolas" w:cs="Consolas" w:eastAsia="Consolas" w:hAnsi="Consolas"/>
-          <w:sz w:val="19"/>
-          <w:szCs w:val="19"/>
-        </w:rPr>
-        <w:t xml:space="preserve">docs/SplitStack_Prompt_Log.pdf</w:t>
       </w:r>
     </w:p>
     <w:p>
@@ -11270,7 +11706,7 @@
           <w:sz w:val="21"/>
           <w:szCs w:val="21"/>
         </w:rPr>
-        <w:t xml:space="preserve">main pushed to GitHub; branches on GitHub: main (refurbished work) and legacy (original Flask app).</w:t>
+        <w:t xml:space="preserve">Public repository https://github.com/MahaprabhuK/SplitStack created and the legacy branch pushed. The first push of main was rejected because it added a GitHub Actions workflow (.github/workflows/pages.yml) and the gh token lacked the "workflow" scope; the workflow file was removed and main was pushed in the next step. GitHub Pages is not set up yet (planned for the wrap-up; needs "gh auth refresh -s workflow" or a gh-pages branch).</w:t>
       </w:r>
     </w:p>
     <w:p>
@@ -11298,7 +11734,7 @@
           <w:sz w:val="21"/>
           <w:szCs w:val="21"/>
         </w:rPr>
-        <w:t xml:space="preserve">git ls-remote shows main and legacy at the expected commits.</w:t>
+        <w:t xml:space="preserve">gh repo view; git push output.</w:t>
       </w:r>
     </w:p>
     <w:p>
@@ -11318,7 +11754,7 @@
         <w:keepNext/>
       </w:pPr>
       <w:r>
-        <w:t xml:space="preserve">#18  Request: push the code and deploy the website</w:t>
+        <w:t xml:space="preserve">#16  Request: hand the project over to a teammate's agent</w:t>
       </w:r>
     </w:p>
     <w:p>
@@ -11366,7 +11802,7 @@
           <w:sz w:val="19"/>
           <w:szCs w:val="19"/>
         </w:rPr>
-        <w:t xml:space="preserve">first push the code and deploy it</w:t>
+        <w:t xml:space="preserve">ACTUALLY I GONNA HANDOVER THE PROJECT TO MY TEAMMATES AGENT SO HE'LL BE PULLING THE CODE AND RUNNING IN HIS SYSTEM SO GIVE PROMPT FOR THAT</w:t>
       </w:r>
     </w:p>
     <w:p>
@@ -11394,7 +11830,7 @@
           <w:sz w:val="21"/>
           <w:szCs w:val="21"/>
         </w:rPr>
-        <w:t xml:space="preserve">Get the code on GitHub and the Review 1 site online.</w:t>
+        <w:t xml:space="preserve">Let a teammate's AI agent clone, run and continue the project.</w:t>
       </w:r>
     </w:p>
     <w:p>
@@ -11455,7 +11891,7 @@
           <w:sz w:val="21"/>
           <w:szCs w:val="21"/>
         </w:rPr>
-        <w:t xml:space="preserve">Handled in the next step.</w:t>
+        <w:t xml:space="preserve">A handover prompt was written covering: requirements per review, clone and branch, prerequisites, install/run/verify commands, repository map, known traps, the mandatory logging rule, the ordered remaining work (planned prompts P1-P15) and working rules. Noted that the new work had to be pushed to GitHub first.</w:t>
       </w:r>
     </w:p>
     <w:p>
@@ -11503,7 +11939,7 @@
         <w:keepNext/>
       </w:pPr>
       <w:r>
-        <w:t xml:space="preserve">#19  Deploy the client to GitHub Pages from a gh-pages branch</w:t>
+        <w:t xml:space="preserve">#17  Push the refurbished code to GitHub main</w:t>
       </w:r>
     </w:p>
     <w:p>
@@ -11551,7 +11987,7 @@
           <w:sz w:val="19"/>
           <w:szCs w:val="19"/>
         </w:rPr>
-        <w:t xml:space="preserve">Push refurbish to main and refurbish on MahaprabhuK/SplitStack. Because the token cannot push workflow files, deploy without GitHub Actions: check that client/ uses only relative links, split client/ into its own history with git subtree split, push it as the gh-pages branch, wait for GitHub Pages to publish it, then put the live link back in README.md and log the step.</w:t>
+        <w:t xml:space="preserve">push it  (user prompt). Executed as: remove .github/workflows/pages.yml (the token lacks the workflow scope), replace the not-yet-existing live-site link in README.md with local run instructions, correct the earlier log entry about publishing, log the handover, rebuild the prompt logs, commit, and push the refurbish branch to main on https://github.com/MahaprabhuK/SplitStack so the teammate can clone it.</w:t>
       </w:r>
     </w:p>
     <w:p>
@@ -11579,7 +12015,7 @@
           <w:sz w:val="21"/>
           <w:szCs w:val="21"/>
         </w:rPr>
-        <w:t xml:space="preserve">Publish the Review 1 site at a public URL without needing the workflow scope.</w:t>
+        <w:t xml:space="preserve">Make the current work available to the teammate.</w:t>
       </w:r>
     </w:p>
     <w:p>
@@ -11612,7 +12048,7 @@
           <w:sz w:val="19"/>
           <w:szCs w:val="19"/>
         </w:rPr>
-        <w:t xml:space="preserve">README.md</w:t>
+        <w:t xml:space="preserve">.github/workflows/pages.yml (removed)</w:t>
       </w:r>
     </w:p>
     <w:p>
@@ -11629,7 +12065,58 @@
           <w:sz w:val="19"/>
           <w:szCs w:val="19"/>
         </w:rPr>
+        <w:t xml:space="preserve">README.md</w:t>
+      </w:r>
+    </w:p>
+    <w:p>
+      <w:pPr>
+        <w:pStyle w:val="ListParagraph"/>
+        <w:numPr>
+          <w:ilvl w:val="0"/>
+          <w:numId w:val="2"/>
+        </w:numPr>
+      </w:pPr>
+      <w:r>
+        <w:rPr>
+          <w:rFonts w:ascii="Consolas" w:cs="Consolas" w:eastAsia="Consolas" w:hAnsi="Consolas"/>
+          <w:sz w:val="19"/>
+          <w:szCs w:val="19"/>
+        </w:rPr>
         <w:t xml:space="preserve">docs/prompt_log.json</w:t>
+      </w:r>
+    </w:p>
+    <w:p>
+      <w:pPr>
+        <w:pStyle w:val="ListParagraph"/>
+        <w:numPr>
+          <w:ilvl w:val="0"/>
+          <w:numId w:val="2"/>
+        </w:numPr>
+      </w:pPr>
+      <w:r>
+        <w:rPr>
+          <w:rFonts w:ascii="Consolas" w:cs="Consolas" w:eastAsia="Consolas" w:hAnsi="Consolas"/>
+          <w:sz w:val="19"/>
+          <w:szCs w:val="19"/>
+        </w:rPr>
+        <w:t xml:space="preserve">docs/SplitStack_Prompt_Log.docx</w:t>
+      </w:r>
+    </w:p>
+    <w:p>
+      <w:pPr>
+        <w:pStyle w:val="ListParagraph"/>
+        <w:numPr>
+          <w:ilvl w:val="0"/>
+          <w:numId w:val="2"/>
+        </w:numPr>
+      </w:pPr>
+      <w:r>
+        <w:rPr>
+          <w:rFonts w:ascii="Consolas" w:cs="Consolas" w:eastAsia="Consolas" w:hAnsi="Consolas"/>
+          <w:sz w:val="19"/>
+          <w:szCs w:val="19"/>
+        </w:rPr>
+        <w:t xml:space="preserve">docs/SplitStack_Prompt_Log.pdf</w:t>
       </w:r>
     </w:p>
     <w:p>
@@ -11657,7 +12144,7 @@
           <w:sz w:val="21"/>
           <w:szCs w:val="21"/>
         </w:rPr>
-        <w:t xml:space="preserve">main and refurbish are on GitHub. The client/ folder is published from the gh-pages branch at https://mahaprabhuk.github.io/SplitStack/ (GitHub enabled Pages automatically). To redeploy after client changes: git subtree split --prefix client refurbish, then push that commit to gh-pages.</w:t>
+        <w:t xml:space="preserve">main pushed to GitHub; branches on GitHub: main (refurbished work) and legacy (original Flask app).</w:t>
       </w:r>
     </w:p>
     <w:p>
@@ -11685,7 +12172,7 @@
           <w:sz w:val="21"/>
           <w:szCs w:val="21"/>
         </w:rPr>
-        <w:t xml:space="preserve">git ls-remote; curl returned 200 for the home page, pages/404.html and css/base.css on the live site.</w:t>
+        <w:t xml:space="preserve">git ls-remote shows main and legacy at the expected commits.</w:t>
       </w:r>
     </w:p>
     <w:p>
@@ -11705,7 +12192,7 @@
         <w:keepNext/>
       </w:pPr>
       <w:r>
-        <w:t xml:space="preserve">#20  Request: handover prompt PDF for a teammate's agent</w:t>
+        <w:t xml:space="preserve">#18  Request: push the code and deploy the website</w:t>
       </w:r>
     </w:p>
     <w:p>
@@ -11753,7 +12240,7 @@
           <w:sz w:val="19"/>
           <w:szCs w:val="19"/>
         </w:rPr>
-        <w:t xml:space="preserve">imma handover the project to my teammate i want you to create a detailed prompt for his agent most prolly he'll use anti gravity so i want a pdf containing prompts to complete the rest of the work in the project. so create a pdf and mention its path once its created then i'll share it to him</w:t>
+        <w:t xml:space="preserve">first push the code and deploy it</w:t>
       </w:r>
     </w:p>
     <w:p>
@@ -11781,7 +12268,7 @@
           <w:sz w:val="21"/>
           <w:szCs w:val="21"/>
         </w:rPr>
-        <w:t xml:space="preserve">Let a teammate's AI agent (Antigravity) finish Review 2, Review 3 and the wrap-up.</w:t>
+        <w:t xml:space="preserve">Get the code on GitHub and the Review 1 site online.</w:t>
       </w:r>
     </w:p>
     <w:p>
@@ -11890,7 +12377,7 @@
         <w:keepNext/>
       </w:pPr>
       <w:r>
-        <w:t xml:space="preserve">#21  Handover prompts PDF</w:t>
+        <w:t xml:space="preserve">#19  Deploy the client to GitHub Pages from a gh-pages branch</w:t>
       </w:r>
     </w:p>
     <w:p>
@@ -11938,7 +12425,7 @@
           <w:sz w:val="19"/>
           <w:szCs w:val="19"/>
         </w:rPr>
-        <w:t xml:space="preserve">Write docs/tools/build_handover_pdf.py (reusing the styles of build_prompt_pdf.py) to produce docs/SplitStack_Handover_Prompts.pdf: how to use it with Antigravity, one-time setup (tools, collaborator access, MongoDB Atlas, workflow token scope), a roadmap, Prompt 0 with the full project context, rules, logging, commit/push and gh-pages redeploy procedure, the 15 planned prompts P1-P15 expanded with concrete checks and commit messages, utility prompts (status, recovery, review rehearsal) and common problems. Render pages to check the layout.</w:t>
+        <w:t xml:space="preserve">Push refurbish to main and refurbish on MahaprabhuK/SplitStack. Because the token cannot push workflow files, deploy without GitHub Actions: check that client/ uses only relative links, split client/ into its own history with git subtree split, push it as the gh-pages branch, wait for GitHub Pages to publish it, then put the live link back in README.md and log the step.</w:t>
       </w:r>
     </w:p>
     <w:p>
@@ -11966,7 +12453,7 @@
           <w:sz w:val="21"/>
           <w:szCs w:val="21"/>
         </w:rPr>
-        <w:t xml:space="preserve">Give the teammate a self-contained, ordered set of prompts.</w:t>
+        <w:t xml:space="preserve">Publish the Review 1 site at a public URL without needing the workflow scope.</w:t>
       </w:r>
     </w:p>
     <w:p>
@@ -11999,7 +12486,7 @@
           <w:sz w:val="19"/>
           <w:szCs w:val="19"/>
         </w:rPr>
-        <w:t xml:space="preserve">docs/tools/build_handover_pdf.py</w:t>
+        <w:t xml:space="preserve">README.md</w:t>
       </w:r>
     </w:p>
     <w:p>
@@ -12016,7 +12503,7 @@
           <w:sz w:val="19"/>
           <w:szCs w:val="19"/>
         </w:rPr>
-        <w:t xml:space="preserve">docs/SplitStack_Handover_Prompts.pdf</w:t>
+        <w:t xml:space="preserve">docs/prompt_log.json</w:t>
       </w:r>
     </w:p>
     <w:p>
@@ -12044,7 +12531,7 @@
           <w:sz w:val="21"/>
           <w:szCs w:val="21"/>
         </w:rPr>
-        <w:t xml:space="preserve">14-page PDF created. Changes against the planned prompts: P1 adds data-page attributes and client/js/package.json (type module) for node --test; P13 keeps the localStorage implementation as a demo mode (api-local.js chosen when /api/health does not answer) so the GitHub Pages site keeps working, instead of deleting it; P9 replaces deprecated csurf with a synchronizer token; P14 uses MongoMemoryReplSet because the API uses transactions; P15 asks for confirmation before deleting the Flask files and leaves Render account steps to the student.</w:t>
+        <w:t xml:space="preserve">main and refurbish are on GitHub. The client/ folder is published from the gh-pages branch at https://mahaprabhuk.github.io/SplitStack/ (GitHub enabled Pages automatically). To redeploy after client changes: git subtree split --prefix client refurbish, then push that commit to gh-pages.</w:t>
       </w:r>
     </w:p>
     <w:p>
@@ -12072,7 +12559,7 @@
           <w:sz w:val="21"/>
           <w:szCs w:val="21"/>
         </w:rPr>
-        <w:t xml:space="preserve">Rendered pages with PyMuPDF and checked the layout of the setup, Prompt 0, step and utility pages.</w:t>
+        <w:t xml:space="preserve">git ls-remote; curl returned 200 for the home page, pages/404.html and css/base.css on the live site.</w:t>
       </w:r>
     </w:p>
     <w:p>
@@ -12087,37 +12574,12 @@
       </w:r>
     </w:p>
     <w:p>
-      <w:r>
-        <w:br w:type="page"/>
-      </w:r>
-    </w:p>
-    <w:p>
-      <w:pPr>
-        <w:pStyle w:val="Heading1"/>
-      </w:pPr>
-      <w:r>
-        <w:t xml:space="preserve">Planned prompts to complete the project</w:t>
-      </w:r>
-    </w:p>
-    <w:p>
-      <w:pPr>
-        <w:spacing w:after="80"/>
-      </w:pPr>
-      <w:r>
-        <w:rPr>
-          <w:sz w:val="21"/>
-          <w:szCs w:val="21"/>
-        </w:rPr>
-        <w:t xml:space="preserve">These prompts have not been run yet. Run them in order; after each one, move it into the log above with its result.</w:t>
-      </w:r>
-    </w:p>
-    <w:p>
       <w:pPr>
         <w:pStyle w:val="Heading3"/>
         <w:keepNext/>
       </w:pPr>
       <w:r>
-        <w:t xml:space="preserve">P1  Charts, budgets, forecast, insights, search and notifications</w:t>
+        <w:t xml:space="preserve">#20  Request: handover prompt PDF for a teammate's agent</w:t>
       </w:r>
     </w:p>
     <w:p>
@@ -12131,7 +12593,7 @@
           <w:sz w:val="18"/>
           <w:szCs w:val="18"/>
         </w:rPr>
-        <w:t xml:space="preserve">Review 2  |  Planned prompt</w:t>
+        <w:t xml:space="preserve">User prompt  |  2026-10-15</w:t>
       </w:r>
     </w:p>
     <w:p>
@@ -12165,7 +12627,7 @@
           <w:sz w:val="19"/>
           <w:szCs w:val="19"/>
         </w:rPr>
-        <w:t xml:space="preserve">Render the dashboard and analytics charts with Chart.js 4 loaded from a pinned CDN URL, reading colours from the CSS custom properties so both themes work, and keep the CSS charts as a fallback. Compute budget status (ok under 75%, caution 75-90%, warning 90-100%, danger over 100%) and update the meters. Port the spending forecast (average daily spend multiplied by the days in the month) to client/js/domain/forecast.js. Generate smart insights from the data (over-budget categories, month-over-month change, upcoming recurring bills). Make the topbar search show live results across expenses, groups and lists in a listbox with keyboard navigation, and make the bell open a notifications panel built from the insights with an unread count.</w:t>
+        <w:t xml:space="preserve">imma handover the project to my teammate i want you to create a detailed prompt for his agent most prolly he'll use anti gravity so i want a pdf containing prompts to complete the rest of the work in the project. so create a pdf and mention its path once its created then i'll share it to him</w:t>
       </w:r>
     </w:p>
     <w:p>
@@ -12193,7 +12655,7 @@
           <w:sz w:val="21"/>
           <w:szCs w:val="21"/>
         </w:rPr>
-        <w:t xml:space="preserve">Finish the interactive features that were disconnected in the original app.</w:t>
+        <w:t xml:space="preserve">Let a teammate's AI agent (Antigravity) finish Review 2, Review 3 and the wrap-up.</w:t>
       </w:r>
     </w:p>
     <w:p>
@@ -12210,6 +12672,39 @@
           <w:szCs w:val="17"/>
         </w:rPr>
         <w:t xml:space="preserve">FILES</w:t>
+      </w:r>
+    </w:p>
+    <w:p>
+      <w:pPr>
+        <w:pStyle w:val="ListParagraph"/>
+        <w:numPr>
+          <w:ilvl w:val="0"/>
+          <w:numId w:val="2"/>
+        </w:numPr>
+      </w:pPr>
+      <w:r>
+        <w:rPr>
+          <w:rFonts w:ascii="Consolas" w:cs="Consolas" w:eastAsia="Consolas" w:hAnsi="Consolas"/>
+          <w:sz w:val="19"/>
+          <w:szCs w:val="19"/>
+        </w:rPr>
+        <w:t xml:space="preserve">-</w:t>
+      </w:r>
+    </w:p>
+    <w:p>
+      <w:pPr>
+        <w:spacing w:after="60" w:before="160"/>
+      </w:pPr>
+      <w:r>
+        <w:rPr>
+          <w:b/>
+          <w:bCs/>
+          <w:color w:val="4F46E5"/>
+          <w:spacing w:val="20"/>
+          <w:sz w:val="17"/>
+          <w:szCs w:val="17"/>
+        </w:rPr>
+        <w:t xml:space="preserve">RESULT</w:t>
       </w:r>
     </w:p>
     <w:p>
@@ -12221,7 +12716,46 @@
           <w:sz w:val="21"/>
           <w:szCs w:val="21"/>
         </w:rPr>
-        <w:t xml:space="preserve">client/js/pages/dashboard.js, client/js/pages/analytics.js, client/js/domain/forecast.js, client/js/ui/search.js, client/js/ui/notifications.js</w:t>
+        <w:t xml:space="preserve">Handled in the next step.</w:t>
+      </w:r>
+    </w:p>
+    <w:p>
+      <w:pPr>
+        <w:spacing w:after="60" w:before="160"/>
+      </w:pPr>
+      <w:r>
+        <w:rPr>
+          <w:b/>
+          <w:bCs/>
+          <w:color w:val="4F46E5"/>
+          <w:spacing w:val="20"/>
+          <w:sz w:val="17"/>
+          <w:szCs w:val="17"/>
+        </w:rPr>
+        <w:t xml:space="preserve">VERIFICATION</w:t>
+      </w:r>
+    </w:p>
+    <w:p>
+      <w:pPr>
+        <w:spacing w:after="80"/>
+      </w:pPr>
+      <w:r>
+        <w:rPr>
+          <w:sz w:val="21"/>
+          <w:szCs w:val="21"/>
+        </w:rPr>
+        <w:t xml:space="preserve">-</w:t>
+      </w:r>
+    </w:p>
+    <w:p>
+      <w:pPr>
+        <w:pBdr>
+          <w:bottom w:val="single" w:color="D9DBE5" w:sz="4" w:space="4"/>
+        </w:pBdr>
+        <w:spacing w:after="200"/>
+      </w:pPr>
+      <w:r>
+        <w:t xml:space="preserve"/>
       </w:r>
     </w:p>
     <w:p>
@@ -12230,7 +12764,7 @@
         <w:keepNext/>
       </w:pPr>
       <w:r>
-        <w:t xml:space="preserve">P2  Shopping checklist and receipt scan preview</w:t>
+        <w:t xml:space="preserve">#21  Handover prompts PDF</w:t>
       </w:r>
     </w:p>
     <w:p>
@@ -12244,7 +12778,7 @@
           <w:sz w:val="18"/>
           <w:szCs w:val="18"/>
         </w:rPr>
-        <w:t xml:space="preserve">Review 2  |  Planned prompt</w:t>
+        <w:t xml:space="preserve">Working prompt  |  2026-10-15</w:t>
       </w:r>
     </w:p>
     <w:p>
@@ -12278,7 +12812,7 @@
           <w:sz w:val="19"/>
           <w:szCs w:val="19"/>
         </w:rPr>
-        <w:t xml:space="preserve">Make the shopping checklist toggle items with optimistic UI, edit actual prices inline, recompute the estimated, actual and variance totals live, and convert the list to an expense only once (prevent duplicates). On the receipt scan page add drag-and-drop with dragenter/dragleave styling, client-side checks (PNG, JPEG or WEBP, up to 5 MB) and an image preview via URL.createObjectURL. Until the backend exists, run OCR in the browser with tesseract.js from a pinned CDN, parse the merchant, date and total with regular expressions (prefer the line containing TOTAL), show progress, and pre-fill the confirm form.</w:t>
+        <w:t xml:space="preserve">Write docs/tools/build_handover_pdf.py (reusing the styles of build_prompt_pdf.py) to produce docs/SplitStack_Handover_Prompts.pdf: how to use it with Antigravity, one-time setup (tools, collaborator access, MongoDB Atlas, workflow token scope), a roadmap, Prompt 0 with the full project context, rules, logging, commit/push and gh-pages redeploy procedure, the 15 planned prompts P1-P15 expanded with concrete checks and commit messages, utility prompts (status, recovery, review rehearsal) and common problems. Render pages to check the layout.</w:t>
       </w:r>
     </w:p>
     <w:p>
@@ -12306,7 +12840,7 @@
           <w:sz w:val="21"/>
           <w:szCs w:val="21"/>
         </w:rPr>
-        <w:t xml:space="preserve">Complete the remaining interactive flows.</w:t>
+        <w:t xml:space="preserve">Give the teammate a self-contained, ordered set of prompts.</w:t>
       </w:r>
     </w:p>
     <w:p>
@@ -12323,6 +12857,56 @@
           <w:szCs w:val="17"/>
         </w:rPr>
         <w:t xml:space="preserve">FILES</w:t>
+      </w:r>
+    </w:p>
+    <w:p>
+      <w:pPr>
+        <w:pStyle w:val="ListParagraph"/>
+        <w:numPr>
+          <w:ilvl w:val="0"/>
+          <w:numId w:val="2"/>
+        </w:numPr>
+      </w:pPr>
+      <w:r>
+        <w:rPr>
+          <w:rFonts w:ascii="Consolas" w:cs="Consolas" w:eastAsia="Consolas" w:hAnsi="Consolas"/>
+          <w:sz w:val="19"/>
+          <w:szCs w:val="19"/>
+        </w:rPr>
+        <w:t xml:space="preserve">docs/tools/build_handover_pdf.py</w:t>
+      </w:r>
+    </w:p>
+    <w:p>
+      <w:pPr>
+        <w:pStyle w:val="ListParagraph"/>
+        <w:numPr>
+          <w:ilvl w:val="0"/>
+          <w:numId w:val="2"/>
+        </w:numPr>
+      </w:pPr>
+      <w:r>
+        <w:rPr>
+          <w:rFonts w:ascii="Consolas" w:cs="Consolas" w:eastAsia="Consolas" w:hAnsi="Consolas"/>
+          <w:sz w:val="19"/>
+          <w:szCs w:val="19"/>
+        </w:rPr>
+        <w:t xml:space="preserve">docs/SplitStack_Handover_Prompts.pdf</w:t>
+      </w:r>
+    </w:p>
+    <w:p>
+      <w:pPr>
+        <w:spacing w:after="60" w:before="160"/>
+      </w:pPr>
+      <w:r>
+        <w:rPr>
+          <w:b/>
+          <w:bCs/>
+          <w:color w:val="4F46E5"/>
+          <w:spacing w:val="20"/>
+          <w:sz w:val="17"/>
+          <w:szCs w:val="17"/>
+        </w:rPr>
+        <w:t xml:space="preserve">RESULT</w:t>
       </w:r>
     </w:p>
     <w:p>
@@ -12334,7 +12918,71 @@
           <w:sz w:val="21"/>
           <w:szCs w:val="21"/>
         </w:rPr>
-        <w:t xml:space="preserve">client/js/pages/shopping-detail.js, client/js/pages/receipt-scan.js, client/js/domain/receipt-parser.js</w:t>
+        <w:t xml:space="preserve">14-page PDF created. Changes against the planned prompts: P1 adds data-page attributes and client/js/package.json (type module) for node --test; P13 keeps the localStorage implementation as a demo mode (api-local.js chosen when /api/health does not answer) so the GitHub Pages site keeps working, instead of deleting it; P9 replaces deprecated csurf with a synchronizer token; P14 uses MongoMemoryReplSet because the API uses transactions; P15 asks for confirmation before deleting the Flask files and leaves Render account steps to the student.</w:t>
+      </w:r>
+    </w:p>
+    <w:p>
+      <w:pPr>
+        <w:spacing w:after="60" w:before="160"/>
+      </w:pPr>
+      <w:r>
+        <w:rPr>
+          <w:b/>
+          <w:bCs/>
+          <w:color w:val="4F46E5"/>
+          <w:spacing w:val="20"/>
+          <w:sz w:val="17"/>
+          <w:szCs w:val="17"/>
+        </w:rPr>
+        <w:t xml:space="preserve">VERIFICATION</w:t>
+      </w:r>
+    </w:p>
+    <w:p>
+      <w:pPr>
+        <w:spacing w:after="80"/>
+      </w:pPr>
+      <w:r>
+        <w:rPr>
+          <w:sz w:val="21"/>
+          <w:szCs w:val="21"/>
+        </w:rPr>
+        <w:t xml:space="preserve">Rendered pages with PyMuPDF and checked the layout of the setup, Prompt 0, step and utility pages.</w:t>
+      </w:r>
+    </w:p>
+    <w:p>
+      <w:pPr>
+        <w:pBdr>
+          <w:bottom w:val="single" w:color="D9DBE5" w:sz="4" w:space="4"/>
+        </w:pBdr>
+        <w:spacing w:after="200"/>
+      </w:pPr>
+      <w:r>
+        <w:t xml:space="preserve"/>
+      </w:r>
+    </w:p>
+    <w:p>
+      <w:r>
+        <w:br w:type="page"/>
+      </w:r>
+    </w:p>
+    <w:p>
+      <w:pPr>
+        <w:pStyle w:val="Heading1"/>
+      </w:pPr>
+      <w:r>
+        <w:t xml:space="preserve">Planned prompts to complete the project</w:t>
+      </w:r>
+    </w:p>
+    <w:p>
+      <w:pPr>
+        <w:spacing w:after="80"/>
+      </w:pPr>
+      <w:r>
+        <w:rPr>
+          <w:sz w:val="21"/>
+          <w:szCs w:val="21"/>
+        </w:rPr>
+        <w:t xml:space="preserve">These prompts have not been run yet. Run them in order; after each one, move it into the log above with its result.</w:t>
       </w:r>
     </w:p>
     <w:p>
@@ -12343,7 +12991,7 @@
         <w:keepNext/>
       </w:pPr>
       <w:r>
-        <w:t xml:space="preserve">P3  Review 2 QA, log and commit</w:t>
+        <w:t xml:space="preserve">P1  Shopping checklist and receipt scan preview</w:t>
       </w:r>
     </w:p>
     <w:p>
@@ -12391,7 +13039,7 @@
           <w:sz w:val="19"/>
           <w:szCs w:val="19"/>
         </w:rPr>
-        <w:t xml:space="preserve">Run ESLint (recommended rules, browser globals, ES2023 modules) over client/js and fix every finding; run the domain unit tests; test every page manually at 1366px and 375px in dark and light themes, using only the keyboard, and with JavaScript disabled (pages must still show their static content). Update client/README.md with the JavaScript architecture and a table of the JS concepts used and where. Add each step to docs/prompt_log.json, rebuild the Word and PDF logs, and commit "Review 2".</w:t>
+        <w:t xml:space="preserve">Make the shopping checklist toggle items with optimistic UI, edit actual prices inline, recompute the estimated, actual and variance totals live, and convert the list to an expense only once (prevent duplicates). On the receipt scan page add drag-and-drop with dragenter/dragleave styling, client-side checks (PNG, JPEG or WEBP, up to 5 MB) and an image preview via URL.createObjectURL. Until the backend exists, run OCR in the browser with tesseract.js from a pinned CDN, parse the merchant, date and total with regular expressions (prefer the line containing TOTAL), show progress, and pre-fill the confirm form.</w:t>
       </w:r>
     </w:p>
     <w:p>
@@ -12419,7 +13067,7 @@
           <w:sz w:val="21"/>
           <w:szCs w:val="21"/>
         </w:rPr>
-        <w:t xml:space="preserve">Close Review 2 with evidence.</w:t>
+        <w:t xml:space="preserve">Complete the remaining interactive flows.</w:t>
       </w:r>
     </w:p>
     <w:p>
@@ -12447,7 +13095,7 @@
           <w:sz w:val="21"/>
           <w:szCs w:val="21"/>
         </w:rPr>
-        <w:t xml:space="preserve">eslint.config.js, client/README.md, docs/*</w:t>
+        <w:t xml:space="preserve">client/js/pages/shopping-detail.js, client/js/pages/receipt-scan.js, client/js/domain/receipt-parser.js</w:t>
       </w:r>
     </w:p>
     <w:p>
@@ -12456,7 +13104,7 @@
         <w:keepNext/>
       </w:pPr>
       <w:r>
-        <w:t xml:space="preserve">P4  Express server and MongoDB connection</w:t>
+        <w:t xml:space="preserve">P2  Review 2 QA, log and commit</w:t>
       </w:r>
     </w:p>
     <w:p>
@@ -12470,7 +13118,7 @@
           <w:sz w:val="18"/>
           <w:szCs w:val="18"/>
         </w:rPr>
-        <w:t xml:space="preserve">Review 3  |  Planned prompt</w:t>
+        <w:t xml:space="preserve">Review 2  |  Planned prompt</w:t>
       </w:r>
     </w:p>
     <w:p>
@@ -12504,7 +13152,7 @@
           <w:sz w:val="19"/>
           <w:szCs w:val="19"/>
         </w:rPr>
-        <w:t xml:space="preserve">Create server/ as a Node.js 20+ project (ES modules) with Express: server/src/app.js (helmet with a Content Security Policy that allows only the CDNs in use, compression, express.json, express-session stored with connect-mongo, express-rate-limit on auth and upload routes, a CSRF token check on state-changing requests, and a central error handler returning JSON {error, fields}), server/src/index.js (connect to MongoDB Atlas with Mongoose using MONGODB_URI from server/.env, then listen), and static serving of client/. Add server/.env.example (MONGODB_URI, SESSION_SECRET of at least 32 characters, PORT) and npm scripts dev (node --watch) and start. Never commit .env.</w:t>
+        <w:t xml:space="preserve">Run ESLint (recommended rules, browser globals, ES2023 modules) over client/js and fix every finding; run the domain unit tests; test every page manually at 1366px and 375px in dark and light themes, using only the keyboard, and with JavaScript disabled (pages must still show their static content). Update client/README.md with the JavaScript architecture and a table of the JS concepts used and where. Add each step to docs/prompt_log.json, rebuild the Word and PDF logs, and commit "Review 2".</w:t>
       </w:r>
     </w:p>
     <w:p>
@@ -12532,7 +13180,7 @@
           <w:sz w:val="21"/>
           <w:szCs w:val="21"/>
         </w:rPr>
-        <w:t xml:space="preserve">Start Review 3 with a secure, conventional Express setup.</w:t>
+        <w:t xml:space="preserve">Close Review 2 with evidence.</w:t>
       </w:r>
     </w:p>
     <w:p>
@@ -12560,7 +13208,7 @@
           <w:sz w:val="21"/>
           <w:szCs w:val="21"/>
         </w:rPr>
-        <w:t xml:space="preserve">server/package.json, server/src/app.js, server/src/index.js, server/.env.example</w:t>
+        <w:t xml:space="preserve">eslint.config.js, client/README.md, docs/*</w:t>
       </w:r>
     </w:p>
     <w:p>
@@ -12569,7 +13217,7 @@
         <w:keepNext/>
       </w:pPr>
       <w:r>
-        <w:t xml:space="preserve">P5  Mongoose data models</w:t>
+        <w:t xml:space="preserve">P3  Express server and MongoDB connection</w:t>
       </w:r>
     </w:p>
     <w:p>
@@ -12617,7 +13265,7 @@
           <w:sz w:val="19"/>
           <w:szCs w:val="19"/>
         </w:rPr>
-        <w:t xml:space="preserve">Design Mongoose schemas with validation and indexes to replace the 15 SQLite tables: User (name, email unique and lowercase, passwordHash, preferences), Category (user, or null for defaults; name; type expense or income; icon; color), Expense and Income (user, category, amount stored as integer paise, date, description or source, paymentMethod), Budget (user, category or null, month, year, limit; unique on user+category+month+year), Recurring (name, amount, frequency, startDate, nextDueDate, active), Group (name, description, createdBy, members [{user, role admin|member, joinedAt}]), SharedExpense (group, title, amount, paidBy, category, date, splitType, shares [{user, amount}] with a validator that the shares sum to the amount), Settlement (group, payer, payee, amount, status, completedAt), ShoppingList (owner, optional group, name, budget, items [{name, quantity, estimatedPrice, actualPrice, purchased, assignedTo}], convertedExpense), Receipt (user, file reference, merchant, date, amount, rawText, confidence) and Insight (user, kind, message, read). Explain in comments which data is embedded and which is referenced, and why.</w:t>
+        <w:t xml:space="preserve">Create server/ as a Node.js 20+ project (ES modules) with Express: server/src/app.js (helmet with a Content Security Policy that allows only the CDNs in use, compression, express.json, express-session stored with connect-mongo, express-rate-limit on auth and upload routes, a CSRF token check on state-changing requests, and a central error handler returning JSON {error, fields}), server/src/index.js (connect to MongoDB Atlas with Mongoose using MONGODB_URI from server/.env, then listen), and static serving of client/. Add server/.env.example (MONGODB_URI, SESSION_SECRET of at least 32 characters, PORT) and npm scripts dev (node --watch) and start. Never commit .env.</w:t>
       </w:r>
     </w:p>
     <w:p>
@@ -12645,7 +13293,7 @@
           <w:sz w:val="21"/>
           <w:szCs w:val="21"/>
         </w:rPr>
-        <w:t xml:space="preserve">Show MongoDB data modelling, the core of Review 3.</w:t>
+        <w:t xml:space="preserve">Start Review 3 with a secure, conventional Express setup.</w:t>
       </w:r>
     </w:p>
     <w:p>
@@ -12673,7 +13321,7 @@
           <w:sz w:val="21"/>
           <w:szCs w:val="21"/>
         </w:rPr>
-        <w:t xml:space="preserve">server/src/models/*.js</w:t>
+        <w:t xml:space="preserve">server/package.json, server/src/app.js, server/src/index.js, server/.env.example</w:t>
       </w:r>
     </w:p>
     <w:p>
@@ -12682,7 +13330,7 @@
         <w:keepNext/>
       </w:pPr>
       <w:r>
-        <w:t xml:space="preserve">P6  Authentication and REST API</w:t>
+        <w:t xml:space="preserve">P4  Mongoose data models</w:t>
       </w:r>
     </w:p>
     <w:p>
@@ -12730,7 +13378,7 @@
           <w:sz w:val="19"/>
           <w:szCs w:val="19"/>
         </w:rPr>
-        <w:t xml:space="preserve">Implement the REST API under /api with one express.Router per module, mirroring the 48 legacy Flask routes: /api/auth (register with bcrypt cost 12, login, logout, me), /api/expenses, /api/income, /api/categories, /api/budgets, /api/recurring (including toggle), /api/groups (members, shared expenses, balances, settlements, leave), /api/shopping (lists, items, toggle, convert to expense), /api/analytics (monthly, categories, forecast, insights) and /api/search. Validate every input with a schema (zod or express-validator), check ownership or group membership on every request, use MongoDB transactions for multi-document writes (recording a settlement, converting a list), and reuse the Review 2 settle.js and splits.js modules on the server so the algorithm has a single implementation.</w:t>
+        <w:t xml:space="preserve">Design Mongoose schemas with validation and indexes to replace the 15 SQLite tables: User (name, email unique and lowercase, passwordHash, preferences), Category (user, or null for defaults; name; type expense or income; icon; color), Expense and Income (user, category, amount stored as integer paise, date, description or source, paymentMethod), Budget (user, category or null, month, year, limit; unique on user+category+month+year), Recurring (name, amount, frequency, startDate, nextDueDate, active), Group (name, description, createdBy, members [{user, role admin|member, joinedAt}]), SharedExpense (group, title, amount, paidBy, category, date, splitType, shares [{user, amount}] with a validator that the shares sum to the amount), Settlement (group, payer, payee, amount, status, completedAt), ShoppingList (owner, optional group, name, budget, items [{name, quantity, estimatedPrice, actualPrice, purchased, assignedTo}], convertedExpense), Receipt (user, file reference, merchant, date, amount, rawText, confidence) and Insight (user, kind, message, read). Explain in comments which data is embedded and which is referenced, and why.</w:t>
       </w:r>
     </w:p>
     <w:p>
@@ -12758,7 +13406,7 @@
           <w:sz w:val="21"/>
           <w:szCs w:val="21"/>
         </w:rPr>
-        <w:t xml:space="preserve">Deliver the Node.js back end with a complete, secure API.</w:t>
+        <w:t xml:space="preserve">Show MongoDB data modelling, the core of Review 3.</w:t>
       </w:r>
     </w:p>
     <w:p>
@@ -12786,7 +13434,7 @@
           <w:sz w:val="21"/>
           <w:szCs w:val="21"/>
         </w:rPr>
-        <w:t xml:space="preserve">server/src/routes/*.js, server/src/services/*.js, server/src/middleware/*.js</w:t>
+        <w:t xml:space="preserve">server/src/models/*.js</w:t>
       </w:r>
     </w:p>
     <w:p>
@@ -12795,7 +13443,7 @@
         <w:keepNext/>
       </w:pPr>
       <w:r>
-        <w:t xml:space="preserve">P7  Receipt upload and server-side OCR</w:t>
+        <w:t xml:space="preserve">P5  Authentication and REST API</w:t>
       </w:r>
     </w:p>
     <w:p>
@@ -12843,7 +13491,7 @@
           <w:sz w:val="19"/>
           <w:szCs w:val="19"/>
         </w:rPr>
-        <w:t xml:space="preserve">Add POST /api/receipts using multer with memory storage, a 5 MB limit and magic-byte checks for PNG, JPEG and WEBP; preprocess with sharp (rotate from EXIF, greyscale, upscale small images, normalise); run tesseract.js with one shared worker; parse the merchant, date and total with the Review 2 parser; store the image in MongoDB GridFS (so it survives redeploys on free hosting) and the parsed fields in Receipt. GET /api/receipts/:id/image streams the image only to its owner. Confirming creates the expense; nothing becomes an expense without confirmation.</w:t>
+        <w:t xml:space="preserve">Implement the REST API under /api with one express.Router per module, mirroring the 48 legacy Flask routes: /api/auth (register with bcrypt cost 12, login, logout, me), /api/expenses, /api/income, /api/categories, /api/budgets, /api/recurring (including toggle), /api/groups (members, shared expenses, balances, settlements, leave), /api/shopping (lists, items, toggle, convert to expense), /api/analytics (monthly, categories, forecast, insights) and /api/search. Validate every input with a schema (zod or express-validator), check ownership or group membership on every request, use MongoDB transactions for multi-document writes (recording a settlement, converting a list), and reuse the Review 2 settle.js and splits.js modules on the server so the algorithm has a single implementation.</w:t>
       </w:r>
     </w:p>
     <w:p>
@@ -12871,7 +13519,7 @@
           <w:sz w:val="21"/>
           <w:szCs w:val="21"/>
         </w:rPr>
-        <w:t xml:space="preserve">Port the OCR feature to Node with persistent storage.</w:t>
+        <w:t xml:space="preserve">Deliver the Node.js back end with a complete, secure API.</w:t>
       </w:r>
     </w:p>
     <w:p>
@@ -12899,7 +13547,7 @@
           <w:sz w:val="21"/>
           <w:szCs w:val="21"/>
         </w:rPr>
-        <w:t xml:space="preserve">server/src/routes/receipts.js, server/src/services/ocr.js</w:t>
+        <w:t xml:space="preserve">server/src/routes/*.js, server/src/services/*.js, server/src/middleware/*.js</w:t>
       </w:r>
     </w:p>
     <w:p>
@@ -12908,7 +13556,7 @@
         <w:keepNext/>
       </w:pPr>
       <w:r>
-        <w:t xml:space="preserve">P8  Connect the client to the API</w:t>
+        <w:t xml:space="preserve">P6  Receipt upload and server-side OCR</w:t>
       </w:r>
     </w:p>
     <w:p>
@@ -12956,7 +13604,7 @@
           <w:sz w:val="19"/>
           <w:szCs w:val="19"/>
         </w:rPr>
-        <w:t xml:space="preserve">Re-implement client/js/data/api.js with fetch() against /api, sending credentials and the CSRF token header, mapping HTTP errors to the same {field, message} errors the pages already handle, and showing a toast when offline. Remove the localStorage store except for the theme preference. Because the page code depends only on api.js, no page module should need changes; confirm this by running every flow end to end against a local server connected to Atlas.</w:t>
+        <w:t xml:space="preserve">Add POST /api/receipts using multer with memory storage, a 5 MB limit and magic-byte checks for PNG, JPEG and WEBP; preprocess with sharp (rotate from EXIF, greyscale, upscale small images, normalise); run tesseract.js with one shared worker; parse the merchant, date and total with the Review 2 parser; store the image in MongoDB GridFS (so it survives redeploys on free hosting) and the parsed fields in Receipt. GET /api/receipts/:id/image streams the image only to its owner. Confirming creates the expense; nothing becomes an expense without confirmation.</w:t>
       </w:r>
     </w:p>
     <w:p>
@@ -12984,7 +13632,7 @@
           <w:sz w:val="21"/>
           <w:szCs w:val="21"/>
         </w:rPr>
-        <w:t xml:space="preserve">Finish the full-stack integration.</w:t>
+        <w:t xml:space="preserve">Port the OCR feature to Node with persistent storage.</w:t>
       </w:r>
     </w:p>
     <w:p>
@@ -13012,7 +13660,7 @@
           <w:sz w:val="21"/>
           <w:szCs w:val="21"/>
         </w:rPr>
-        <w:t xml:space="preserve">client/js/data/api.js</w:t>
+        <w:t xml:space="preserve">server/src/routes/receipts.js, server/src/services/ocr.js</w:t>
       </w:r>
     </w:p>
     <w:p>
@@ -13021,7 +13669,7 @@
         <w:keepNext/>
       </w:pPr>
       <w:r>
-        <w:t xml:space="preserve">P9  Seed data and automated tests</w:t>
+        <w:t xml:space="preserve">P7  Connect the client to the API</w:t>
       </w:r>
     </w:p>
     <w:p>
@@ -13069,7 +13717,7 @@
           <w:sz w:val="19"/>
           <w:szCs w:val="19"/>
         </w:rPr>
-        <w:t xml:space="preserve">Add server/scripts/seed.js that creates the demo user, categories, six months of expenses and income, budgets, recurring payments, the three groups with shared expenses, and shopping lists. It must be idempotent and must refuse to run against a database whose name does not end in -dev or -test unless --force is passed. Write Jest + Supertest tests using mongodb-memory-server for auth, ownership checks, CSRF rejection, rate limiting, split validation, the settlement algorithm, budget status, convert-to-expense duplicate prevention and receipt upload validation, covering what the 47 legacy Python tests checked. Add an npm test script and a GitHub Actions workflow that runs lint and tests on every push.</w:t>
+        <w:t xml:space="preserve">Re-implement client/js/data/api.js with fetch() against /api, sending credentials and the CSRF token header, mapping HTTP errors to the same {field, message} errors the pages already handle, and showing a toast when offline. Remove the localStorage store except for the theme preference. Because the page code depends only on api.js, no page module should need changes; confirm this by running every flow end to end against a local server connected to Atlas.</w:t>
       </w:r>
     </w:p>
     <w:p>
@@ -13097,7 +13745,7 @@
           <w:sz w:val="21"/>
           <w:szCs w:val="21"/>
         </w:rPr>
-        <w:t xml:space="preserve">Prove the back end works and keep it working.</w:t>
+        <w:t xml:space="preserve">Finish the full-stack integration.</w:t>
       </w:r>
     </w:p>
     <w:p>
@@ -13125,7 +13773,7 @@
           <w:sz w:val="21"/>
           <w:szCs w:val="21"/>
         </w:rPr>
-        <w:t xml:space="preserve">server/scripts/seed.js, server/tests/*.test.js, .github/workflows/ci.yml</w:t>
+        <w:t xml:space="preserve">client/js/data/api.js</w:t>
       </w:r>
     </w:p>
     <w:p>
@@ -13134,7 +13782,120 @@
         <w:keepNext/>
       </w:pPr>
       <w:r>
-        <w:t xml:space="preserve">P10  Remove legacy code, document and deploy</w:t>
+        <w:t xml:space="preserve">P8  Seed data and automated tests</w:t>
+      </w:r>
+    </w:p>
+    <w:p>
+      <w:pPr>
+        <w:keepNext/>
+        <w:spacing w:after="60"/>
+      </w:pPr>
+      <w:r>
+        <w:rPr>
+          <w:color w:val="5B6475"/>
+          <w:sz w:val="18"/>
+          <w:szCs w:val="18"/>
+        </w:rPr>
+        <w:t xml:space="preserve">Review 3  |  Planned prompt</w:t>
+      </w:r>
+    </w:p>
+    <w:p>
+      <w:pPr>
+        <w:spacing w:after="60" w:before="160"/>
+      </w:pPr>
+      <w:r>
+        <w:rPr>
+          <w:b/>
+          <w:bCs/>
+          <w:color w:val="4F46E5"/>
+          <w:spacing w:val="20"/>
+          <w:sz w:val="17"/>
+          <w:szCs w:val="17"/>
+        </w:rPr>
+        <w:t xml:space="preserve">PROMPT</w:t>
+      </w:r>
+    </w:p>
+    <w:p>
+      <w:pPr>
+        <w:pBdr>
+          <w:left w:val="single" w:color="4F46E5" w:sz="18" w:space="8"/>
+        </w:pBdr>
+        <w:shd w:fill="F1F2F8" w:color="auto" w:val="clear"/>
+        <w:spacing w:after="120" w:before="40" w:line="276"/>
+        <w:ind w:left="160" w:right="160"/>
+      </w:pPr>
+      <w:r>
+        <w:rPr>
+          <w:rFonts w:ascii="Consolas" w:cs="Consolas" w:eastAsia="Consolas" w:hAnsi="Consolas"/>
+          <w:sz w:val="19"/>
+          <w:szCs w:val="19"/>
+        </w:rPr>
+        <w:t xml:space="preserve">Add server/scripts/seed.js that creates the demo user, categories, six months of expenses and income, budgets, recurring payments, the three groups with shared expenses, and shopping lists. It must be idempotent and must refuse to run against a database whose name does not end in -dev or -test unless --force is passed. Write Jest + Supertest tests using mongodb-memory-server for auth, ownership checks, CSRF rejection, rate limiting, split validation, the settlement algorithm, budget status, convert-to-expense duplicate prevention and receipt upload validation, covering what the 47 legacy Python tests checked. Add an npm test script and a GitHub Actions workflow that runs lint and tests on every push.</w:t>
+      </w:r>
+    </w:p>
+    <w:p>
+      <w:pPr>
+        <w:spacing w:after="60" w:before="160"/>
+      </w:pPr>
+      <w:r>
+        <w:rPr>
+          <w:b/>
+          <w:bCs/>
+          <w:color w:val="4F46E5"/>
+          <w:spacing w:val="20"/>
+          <w:sz w:val="17"/>
+          <w:szCs w:val="17"/>
+        </w:rPr>
+        <w:t xml:space="preserve">PURPOSE</w:t>
+      </w:r>
+    </w:p>
+    <w:p>
+      <w:pPr>
+        <w:spacing w:after="80"/>
+      </w:pPr>
+      <w:r>
+        <w:rPr>
+          <w:sz w:val="21"/>
+          <w:szCs w:val="21"/>
+        </w:rPr>
+        <w:t xml:space="preserve">Prove the back end works and keep it working.</w:t>
+      </w:r>
+    </w:p>
+    <w:p>
+      <w:pPr>
+        <w:spacing w:after="60" w:before="160"/>
+      </w:pPr>
+      <w:r>
+        <w:rPr>
+          <w:b/>
+          <w:bCs/>
+          <w:color w:val="4F46E5"/>
+          <w:spacing w:val="20"/>
+          <w:sz w:val="17"/>
+          <w:szCs w:val="17"/>
+        </w:rPr>
+        <w:t xml:space="preserve">FILES</w:t>
+      </w:r>
+    </w:p>
+    <w:p>
+      <w:pPr>
+        <w:spacing w:after="80"/>
+      </w:pPr>
+      <w:r>
+        <w:rPr>
+          <w:sz w:val="21"/>
+          <w:szCs w:val="21"/>
+        </w:rPr>
+        <w:t xml:space="preserve">server/scripts/seed.js, server/tests/*.test.js, .github/workflows/ci.yml</w:t>
+      </w:r>
+    </w:p>
+    <w:p>
+      <w:pPr>
+        <w:pStyle w:val="Heading3"/>
+        <w:keepNext/>
+      </w:pPr>
+      <w:r>
+        <w:t xml:space="preserve">P9  Remove legacy code, document and deploy</w:t>
       </w:r>
     </w:p>
     <w:p>

</xml_diff>

<commit_message>
Review 2: shopping checklist and receipt scanning preview
</commit_message>
<xml_diff>
--- a/docs/SplitStack_Prompt_Log.docx
+++ b/docs/SplitStack_Prompt_Log.docx
@@ -132,7 +132,7 @@
           <w:sz w:val="21"/>
           <w:szCs w:val="21"/>
         </w:rPr>
-        <w:t xml:space="preserve">33</w:t>
+        <w:t xml:space="preserve">35</w:t>
       </w:r>
     </w:p>
     <w:p>
@@ -153,7 +153,7 @@
           <w:sz w:val="21"/>
           <w:szCs w:val="21"/>
         </w:rPr>
-        <w:t xml:space="preserve">2026-10-16</w:t>
+        <w:t xml:space="preserve">2026-10-17</w:t>
       </w:r>
     </w:p>
     <w:p>
@@ -568,7 +568,7 @@
                 <w:sz w:val="18"/>
                 <w:szCs w:val="18"/>
               </w:rPr>
-              <w:t xml:space="preserve">12</w:t>
+              <w:t xml:space="preserve">14</w:t>
             </w:r>
           </w:p>
         </w:tc>
@@ -4813,6 +4813,245 @@
           </w:p>
         </w:tc>
       </w:tr>
+      <w:tr>
+        <w:tc>
+          <w:tcPr>
+            <w:tcW w:type="dxa" w:w="700"/>
+            <w:shd w:fill="F7F7FB" w:color="auto" w:val="clear"/>
+            <w:tcMar>
+              <w:top w:type="dxa" w:w="60"/>
+              <w:left w:type="dxa" w:w="100"/>
+              <w:bottom w:type="dxa" w:w="60"/>
+              <w:right w:type="dxa" w:w="100"/>
+            </w:tcMar>
+          </w:tcPr>
+          <w:p>
+            <w:r>
+              <w:rPr>
+                <w:b w:val="false"/>
+                <w:bCs w:val="false"/>
+                <w:color w:val="222222"/>
+                <w:sz w:val="18"/>
+                <w:szCs w:val="18"/>
+              </w:rPr>
+              <w:t xml:space="preserve">34</w:t>
+            </w:r>
+          </w:p>
+        </w:tc>
+        <w:tc>
+          <w:tcPr>
+            <w:tcW w:type="dxa" w:w="1500"/>
+            <w:shd w:fill="F7F7FB" w:color="auto" w:val="clear"/>
+            <w:tcMar>
+              <w:top w:type="dxa" w:w="60"/>
+              <w:left w:type="dxa" w:w="100"/>
+              <w:bottom w:type="dxa" w:w="60"/>
+              <w:right w:type="dxa" w:w="100"/>
+            </w:tcMar>
+          </w:tcPr>
+          <w:p>
+            <w:r>
+              <w:rPr>
+                <w:b w:val="false"/>
+                <w:bCs w:val="false"/>
+                <w:color w:val="222222"/>
+                <w:sz w:val="18"/>
+                <w:szCs w:val="18"/>
+              </w:rPr>
+              <w:t xml:space="preserve">Review 2</w:t>
+            </w:r>
+          </w:p>
+        </w:tc>
+        <w:tc>
+          <w:tcPr>
+            <w:tcW w:type="dxa" w:w="4538"/>
+            <w:shd w:fill="F7F7FB" w:color="auto" w:val="clear"/>
+            <w:tcMar>
+              <w:top w:type="dxa" w:w="60"/>
+              <w:left w:type="dxa" w:w="100"/>
+              <w:bottom w:type="dxa" w:w="60"/>
+              <w:right w:type="dxa" w:w="100"/>
+            </w:tcMar>
+          </w:tcPr>
+          <w:p>
+            <w:r>
+              <w:rPr>
+                <w:b w:val="false"/>
+                <w:bCs w:val="false"/>
+                <w:color w:val="222222"/>
+                <w:sz w:val="18"/>
+                <w:szCs w:val="18"/>
+              </w:rPr>
+              <w:t xml:space="preserve">Request: proceed with Review 2 Step P7</w:t>
+            </w:r>
+          </w:p>
+        </w:tc>
+        <w:tc>
+          <w:tcPr>
+            <w:tcW w:type="dxa" w:w="1500"/>
+            <w:shd w:fill="F7F7FB" w:color="auto" w:val="clear"/>
+            <w:tcMar>
+              <w:top w:type="dxa" w:w="60"/>
+              <w:left w:type="dxa" w:w="100"/>
+              <w:bottom w:type="dxa" w:w="60"/>
+              <w:right w:type="dxa" w:w="100"/>
+            </w:tcMar>
+          </w:tcPr>
+          <w:p>
+            <w:r>
+              <w:rPr>
+                <w:b w:val="false"/>
+                <w:bCs w:val="false"/>
+                <w:color w:val="222222"/>
+                <w:sz w:val="18"/>
+                <w:szCs w:val="18"/>
+              </w:rPr>
+              <w:t xml:space="preserve">User prompt</w:t>
+            </w:r>
+          </w:p>
+        </w:tc>
+        <w:tc>
+          <w:tcPr>
+            <w:tcW w:type="dxa" w:w="1400"/>
+            <w:shd w:fill="F7F7FB" w:color="auto" w:val="clear"/>
+            <w:tcMar>
+              <w:top w:type="dxa" w:w="60"/>
+              <w:left w:type="dxa" w:w="100"/>
+              <w:bottom w:type="dxa" w:w="60"/>
+              <w:right w:type="dxa" w:w="100"/>
+            </w:tcMar>
+          </w:tcPr>
+          <w:p>
+            <w:r>
+              <w:rPr>
+                <w:b w:val="false"/>
+                <w:bCs w:val="false"/>
+                <w:color w:val="222222"/>
+                <w:sz w:val="18"/>
+                <w:szCs w:val="18"/>
+              </w:rPr>
+              <w:t xml:space="preserve">2026-10-17</w:t>
+            </w:r>
+          </w:p>
+        </w:tc>
+      </w:tr>
+      <w:tr>
+        <w:tc>
+          <w:tcPr>
+            <w:tcW w:type="dxa" w:w="700"/>
+            <w:tcMar>
+              <w:top w:type="dxa" w:w="60"/>
+              <w:left w:type="dxa" w:w="100"/>
+              <w:bottom w:type="dxa" w:w="60"/>
+              <w:right w:type="dxa" w:w="100"/>
+            </w:tcMar>
+          </w:tcPr>
+          <w:p>
+            <w:r>
+              <w:rPr>
+                <w:b w:val="false"/>
+                <w:bCs w:val="false"/>
+                <w:color w:val="222222"/>
+                <w:sz w:val="18"/>
+                <w:szCs w:val="18"/>
+              </w:rPr>
+              <w:t xml:space="preserve">35</w:t>
+            </w:r>
+          </w:p>
+        </w:tc>
+        <w:tc>
+          <w:tcPr>
+            <w:tcW w:type="dxa" w:w="1500"/>
+            <w:tcMar>
+              <w:top w:type="dxa" w:w="60"/>
+              <w:left w:type="dxa" w:w="100"/>
+              <w:bottom w:type="dxa" w:w="60"/>
+              <w:right w:type="dxa" w:w="100"/>
+            </w:tcMar>
+          </w:tcPr>
+          <w:p>
+            <w:r>
+              <w:rPr>
+                <w:b w:val="false"/>
+                <w:bCs w:val="false"/>
+                <w:color w:val="222222"/>
+                <w:sz w:val="18"/>
+                <w:szCs w:val="18"/>
+              </w:rPr>
+              <w:t xml:space="preserve">Review 2</w:t>
+            </w:r>
+          </w:p>
+        </w:tc>
+        <w:tc>
+          <w:tcPr>
+            <w:tcW w:type="dxa" w:w="4538"/>
+            <w:tcMar>
+              <w:top w:type="dxa" w:w="60"/>
+              <w:left w:type="dxa" w:w="100"/>
+              <w:bottom w:type="dxa" w:w="60"/>
+              <w:right w:type="dxa" w:w="100"/>
+            </w:tcMar>
+          </w:tcPr>
+          <w:p>
+            <w:r>
+              <w:rPr>
+                <w:b w:val="false"/>
+                <w:bCs w:val="false"/>
+                <w:color w:val="222222"/>
+                <w:sz w:val="18"/>
+                <w:szCs w:val="18"/>
+              </w:rPr>
+              <w:t xml:space="preserve">Shopping checklist and receipt scan preview</w:t>
+            </w:r>
+          </w:p>
+        </w:tc>
+        <w:tc>
+          <w:tcPr>
+            <w:tcW w:type="dxa" w:w="1500"/>
+            <w:tcMar>
+              <w:top w:type="dxa" w:w="60"/>
+              <w:left w:type="dxa" w:w="100"/>
+              <w:bottom w:type="dxa" w:w="60"/>
+              <w:right w:type="dxa" w:w="100"/>
+            </w:tcMar>
+          </w:tcPr>
+          <w:p>
+            <w:r>
+              <w:rPr>
+                <w:b w:val="false"/>
+                <w:bCs w:val="false"/>
+                <w:color w:val="222222"/>
+                <w:sz w:val="18"/>
+                <w:szCs w:val="18"/>
+              </w:rPr>
+              <w:t xml:space="preserve">Working prompt</w:t>
+            </w:r>
+          </w:p>
+        </w:tc>
+        <w:tc>
+          <w:tcPr>
+            <w:tcW w:type="dxa" w:w="1400"/>
+            <w:tcMar>
+              <w:top w:type="dxa" w:w="60"/>
+              <w:left w:type="dxa" w:w="100"/>
+              <w:bottom w:type="dxa" w:w="60"/>
+              <w:right w:type="dxa" w:w="100"/>
+            </w:tcMar>
+          </w:tcPr>
+          <w:p>
+            <w:r>
+              <w:rPr>
+                <w:b w:val="false"/>
+                <w:bCs w:val="false"/>
+                <w:color w:val="222222"/>
+                <w:sz w:val="18"/>
+                <w:szCs w:val="18"/>
+              </w:rPr>
+              <w:t xml:space="preserve">2026-10-17</w:t>
+            </w:r>
+          </w:p>
+        </w:tc>
+      </w:tr>
     </w:tbl>
     <w:p>
       <w:r>
@@ -11101,20 +11340,11 @@
     </w:p>
     <w:p>
       <w:pPr>
-        <w:pStyle w:val="Heading2"/>
-        <w:spacing w:before="360"/>
-      </w:pPr>
-      <w:r>
-        <w:t xml:space="preserve">Wrap-up - Documentation, cleanup and deployment</w:t>
-      </w:r>
-    </w:p>
-    <w:p>
-      <w:pPr>
         <w:pStyle w:val="Heading3"/>
         <w:keepNext/>
       </w:pPr>
       <w:r>
-        <w:t xml:space="preserve">#13  Request: GitHub repository, website link and PDF of prompts</w:t>
+        <w:t xml:space="preserve">#34  Request: proceed with Review 2 Step P7</w:t>
       </w:r>
     </w:p>
     <w:p>
@@ -11128,7 +11358,7 @@
           <w:sz w:val="18"/>
           <w:szCs w:val="18"/>
         </w:rPr>
-        <w:t xml:space="preserve">User prompt  |  2026-10-15</w:t>
+        <w:t xml:space="preserve">User prompt  |  2026-10-17</w:t>
       </w:r>
     </w:p>
     <w:p>
@@ -11162,7 +11392,22 @@
           <w:sz w:val="19"/>
           <w:szCs w:val="19"/>
         </w:rPr>
-        <w:t xml:space="preserve">create a new repositry for this project in my gihub , and after than give me the github link and then the website link and also a pdf containing the prompts to complete project.</w:t>
+        <w:t xml:space="preserve"># SplitStack — P7: Shopping Checklist &amp; Receipt Scanning Preview
+You are working on the existing SplitStack repository in VS Code using Antigravity.
+## Objective
+Complete **P7 only** from the SplitStack roadmap: implement and test the shopping checklist experience and receipt scanning preview, building on the existing P1–P6 implementation.
+Do not start P8 or any later phase. Finish P7 end-to-end, run the relevant tests, update the project logs, and create a local Git commit only after verification succeeds.
+1. Safety checks before editing
+2. Inspect the existing P7-related implementation
+3. Shopping checklist functionality
+4. Receipt scanning preview
+5. Security and data integrity
+6. Tests
+7. Verification
+8. Documentation and prompt log
+9. Review and local commit
+10. GitHub restrictions
+11. Final report</w:t>
       </w:r>
     </w:p>
     <w:p>
@@ -11190,7 +11435,7 @@
           <w:sz w:val="21"/>
           <w:szCs w:val="21"/>
         </w:rPr>
-        <w:t xml:space="preserve">Publish the project under the student's own GitHub account, host the site, and export the prompt log (including the remaining planned prompts) as a PDF.</w:t>
+        <w:t xml:space="preserve">Authorize execution of Step P7: Shopping Checklist &amp; Receipt Scanning Preview.</w:t>
       </w:r>
     </w:p>
     <w:p>
@@ -11251,7 +11496,7 @@
           <w:sz w:val="21"/>
           <w:szCs w:val="21"/>
         </w:rPr>
-        <w:t xml:space="preserve">Done: see the following entries.</w:t>
+        <w:t xml:space="preserve">Authorized Step P7 implementation.</w:t>
       </w:r>
     </w:p>
     <w:p>
@@ -11299,7 +11544,7 @@
         <w:keepNext/>
       </w:pPr>
       <w:r>
-        <w:t xml:space="preserve">#14  PDF export of the prompt log, including planned prompts</w:t>
+        <w:t xml:space="preserve">#35  Shopping checklist and receipt scan preview</w:t>
       </w:r>
     </w:p>
     <w:p>
@@ -11313,7 +11558,7 @@
           <w:sz w:val="18"/>
           <w:szCs w:val="18"/>
         </w:rPr>
-        <w:t xml:space="preserve">Working prompt  |  2026-10-15</w:t>
+        <w:t xml:space="preserve">Working prompt  |  2026-10-17</w:t>
       </w:r>
     </w:p>
     <w:p>
@@ -11347,7 +11592,7 @@
           <w:sz w:val="19"/>
           <w:szCs w:val="19"/>
         </w:rPr>
-        <w:t xml:space="preserve">Export the prompt log to PDF with a Python reportlab script (docs/tools/build_prompt_pdf.py) that reads docs/prompt_log.json: a title page, a stage overview table, a summary of every entry, Part A with every executed prompt verbatim in a shaded box with purpose, files, result and verification, and Part B with the planned prompts that complete Review 2, Review 3 and the wrap-up, clearly marked as not yet run. Add the planned prompts to prompt_log.json and to the Word log as well, and make "npm run log" rebuild both documents.</w:t>
+        <w:t xml:space="preserve">Complete the shopping checklist experience and client-side receipt scanning preview: enable shopping list create/edit/delete, item CRUD, inline item editing (name, quantity, estimated and actual unit price), optimistic checkbox toggling with rollback on error, confirmation dialogs for item removal and list deletion, progress calculation, and duplicate-protected conversion to expense. Implement client-side receipt scanning preview: drag &amp; drop dropzone with .is-dragover styling, file validation (PNG, JPEG, WEBP &lt;= 5 MB), in-memory object URL preview with revokeObjectURL cleanup, cancel/reset option, honest OCR status notice (client preview mode with automated OCR deferred to Review 3), candidate receipt parsing, and editable review step with Discard and Confirm-and-save to expense.</w:t>
       </w:r>
     </w:p>
     <w:p>
@@ -11375,7 +11620,7 @@
           <w:sz w:val="21"/>
           <w:szCs w:val="21"/>
         </w:rPr>
-        <w:t xml:space="preserve">Give the student a PDF containing the prompts needed to complete the whole project.</w:t>
+        <w:t xml:space="preserve">Deliver the shopping checklist lifecycle and client-side receipt scanning preview within Review 2.</w:t>
       </w:r>
     </w:p>
     <w:p>
@@ -11408,75 +11653,126 @@
           <w:sz w:val="19"/>
           <w:szCs w:val="19"/>
         </w:rPr>
-        <w:t xml:space="preserve">docs/tools/build_prompt_pdf.py</w:t>
-      </w:r>
-    </w:p>
-    <w:p>
-      <w:pPr>
-        <w:pStyle w:val="ListParagraph"/>
-        <w:numPr>
-          <w:ilvl w:val="0"/>
-          <w:numId w:val="2"/>
-        </w:numPr>
-      </w:pPr>
-      <w:r>
-        <w:rPr>
-          <w:rFonts w:ascii="Consolas" w:cs="Consolas" w:eastAsia="Consolas" w:hAnsi="Consolas"/>
-          <w:sz w:val="19"/>
-          <w:szCs w:val="19"/>
-        </w:rPr>
-        <w:t xml:space="preserve">docs/tools/build-prompt-log.js</w:t>
-      </w:r>
-    </w:p>
-    <w:p>
-      <w:pPr>
-        <w:pStyle w:val="ListParagraph"/>
-        <w:numPr>
-          <w:ilvl w:val="0"/>
-          <w:numId w:val="2"/>
-        </w:numPr>
-      </w:pPr>
-      <w:r>
-        <w:rPr>
-          <w:rFonts w:ascii="Consolas" w:cs="Consolas" w:eastAsia="Consolas" w:hAnsi="Consolas"/>
-          <w:sz w:val="19"/>
-          <w:szCs w:val="19"/>
-        </w:rPr>
-        <w:t xml:space="preserve">docs/prompt_log.json</w:t>
-      </w:r>
-    </w:p>
-    <w:p>
-      <w:pPr>
-        <w:pStyle w:val="ListParagraph"/>
-        <w:numPr>
-          <w:ilvl w:val="0"/>
-          <w:numId w:val="2"/>
-        </w:numPr>
-      </w:pPr>
-      <w:r>
-        <w:rPr>
-          <w:rFonts w:ascii="Consolas" w:cs="Consolas" w:eastAsia="Consolas" w:hAnsi="Consolas"/>
-          <w:sz w:val="19"/>
-          <w:szCs w:val="19"/>
-        </w:rPr>
-        <w:t xml:space="preserve">docs/SplitStack_Prompt_Log.pdf</w:t>
-      </w:r>
-    </w:p>
-    <w:p>
-      <w:pPr>
-        <w:pStyle w:val="ListParagraph"/>
-        <w:numPr>
-          <w:ilvl w:val="0"/>
-          <w:numId w:val="2"/>
-        </w:numPr>
-      </w:pPr>
-      <w:r>
-        <w:rPr>
-          <w:rFonts w:ascii="Consolas" w:cs="Consolas" w:eastAsia="Consolas" w:hAnsi="Consolas"/>
-          <w:sz w:val="19"/>
-          <w:szCs w:val="19"/>
-        </w:rPr>
-        <w:t xml:space="preserve">docs/SplitStack_Prompt_Log.docx</w:t>
+        <w:t xml:space="preserve">client/js/domain/receipt.js</w:t>
+      </w:r>
+    </w:p>
+    <w:p>
+      <w:pPr>
+        <w:pStyle w:val="ListParagraph"/>
+        <w:numPr>
+          <w:ilvl w:val="0"/>
+          <w:numId w:val="2"/>
+        </w:numPr>
+      </w:pPr>
+      <w:r>
+        <w:rPr>
+          <w:rFonts w:ascii="Consolas" w:cs="Consolas" w:eastAsia="Consolas" w:hAnsi="Consolas"/>
+          <w:sz w:val="19"/>
+          <w:szCs w:val="19"/>
+        </w:rPr>
+        <w:t xml:space="preserve">client/js/pages/receipt-scan.js</w:t>
+      </w:r>
+    </w:p>
+    <w:p>
+      <w:pPr>
+        <w:pStyle w:val="ListParagraph"/>
+        <w:numPr>
+          <w:ilvl w:val="0"/>
+          <w:numId w:val="2"/>
+        </w:numPr>
+      </w:pPr>
+      <w:r>
+        <w:rPr>
+          <w:rFonts w:ascii="Consolas" w:cs="Consolas" w:eastAsia="Consolas" w:hAnsi="Consolas"/>
+          <w:sz w:val="19"/>
+          <w:szCs w:val="19"/>
+        </w:rPr>
+        <w:t xml:space="preserve">client/js/pages/receipt-confirm.js</w:t>
+      </w:r>
+    </w:p>
+    <w:p>
+      <w:pPr>
+        <w:pStyle w:val="ListParagraph"/>
+        <w:numPr>
+          <w:ilvl w:val="0"/>
+          <w:numId w:val="2"/>
+        </w:numPr>
+      </w:pPr>
+      <w:r>
+        <w:rPr>
+          <w:rFonts w:ascii="Consolas" w:cs="Consolas" w:eastAsia="Consolas" w:hAnsi="Consolas"/>
+          <w:sz w:val="19"/>
+          <w:szCs w:val="19"/>
+        </w:rPr>
+        <w:t xml:space="preserve">client/js/pages/shopping-form.js</w:t>
+      </w:r>
+    </w:p>
+    <w:p>
+      <w:pPr>
+        <w:pStyle w:val="ListParagraph"/>
+        <w:numPr>
+          <w:ilvl w:val="0"/>
+          <w:numId w:val="2"/>
+        </w:numPr>
+      </w:pPr>
+      <w:r>
+        <w:rPr>
+          <w:rFonts w:ascii="Consolas" w:cs="Consolas" w:eastAsia="Consolas" w:hAnsi="Consolas"/>
+          <w:sz w:val="19"/>
+          <w:szCs w:val="19"/>
+        </w:rPr>
+        <w:t xml:space="preserve">client/js/pages/shopping-detail.js</w:t>
+      </w:r>
+    </w:p>
+    <w:p>
+      <w:pPr>
+        <w:pStyle w:val="ListParagraph"/>
+        <w:numPr>
+          <w:ilvl w:val="0"/>
+          <w:numId w:val="2"/>
+        </w:numPr>
+      </w:pPr>
+      <w:r>
+        <w:rPr>
+          <w:rFonts w:ascii="Consolas" w:cs="Consolas" w:eastAsia="Consolas" w:hAnsi="Consolas"/>
+          <w:sz w:val="19"/>
+          <w:szCs w:val="19"/>
+        </w:rPr>
+        <w:t xml:space="preserve">client/pages/shopping-detail.html</w:t>
+      </w:r>
+    </w:p>
+    <w:p>
+      <w:pPr>
+        <w:pStyle w:val="ListParagraph"/>
+        <w:numPr>
+          <w:ilvl w:val="0"/>
+          <w:numId w:val="2"/>
+        </w:numPr>
+      </w:pPr>
+      <w:r>
+        <w:rPr>
+          <w:rFonts w:ascii="Consolas" w:cs="Consolas" w:eastAsia="Consolas" w:hAnsi="Consolas"/>
+          <w:sz w:val="19"/>
+          <w:szCs w:val="19"/>
+        </w:rPr>
+        <w:t xml:space="preserve">client/js/data/api.js</w:t>
+      </w:r>
+    </w:p>
+    <w:p>
+      <w:pPr>
+        <w:pStyle w:val="ListParagraph"/>
+        <w:numPr>
+          <w:ilvl w:val="0"/>
+          <w:numId w:val="2"/>
+        </w:numPr>
+      </w:pPr>
+      <w:r>
+        <w:rPr>
+          <w:rFonts w:ascii="Consolas" w:cs="Consolas" w:eastAsia="Consolas" w:hAnsi="Consolas"/>
+          <w:sz w:val="19"/>
+          <w:szCs w:val="19"/>
+        </w:rPr>
+        <w:t xml:space="preserve">client/css/components.css</w:t>
       </w:r>
     </w:p>
     <w:p>
@@ -11494,6 +11790,57 @@
           <w:szCs w:val="19"/>
         </w:rPr>
         <w:t xml:space="preserve">package.json</w:t>
+      </w:r>
+    </w:p>
+    <w:p>
+      <w:pPr>
+        <w:pStyle w:val="ListParagraph"/>
+        <w:numPr>
+          <w:ilvl w:val="0"/>
+          <w:numId w:val="2"/>
+        </w:numPr>
+      </w:pPr>
+      <w:r>
+        <w:rPr>
+          <w:rFonts w:ascii="Consolas" w:cs="Consolas" w:eastAsia="Consolas" w:hAnsi="Consolas"/>
+          <w:sz w:val="19"/>
+          <w:szCs w:val="19"/>
+        </w:rPr>
+        <w:t xml:space="preserve">tests/client/shopping-receipt.test.mjs</w:t>
+      </w:r>
+    </w:p>
+    <w:p>
+      <w:pPr>
+        <w:pStyle w:val="ListParagraph"/>
+        <w:numPr>
+          <w:ilvl w:val="0"/>
+          <w:numId w:val="2"/>
+        </w:numPr>
+      </w:pPr>
+      <w:r>
+        <w:rPr>
+          <w:rFonts w:ascii="Consolas" w:cs="Consolas" w:eastAsia="Consolas" w:hAnsi="Consolas"/>
+          <w:sz w:val="19"/>
+          <w:szCs w:val="19"/>
+        </w:rPr>
+        <w:t xml:space="preserve">tests/client/render.test.mjs</w:t>
+      </w:r>
+    </w:p>
+    <w:p>
+      <w:pPr>
+        <w:pStyle w:val="ListParagraph"/>
+        <w:numPr>
+          <w:ilvl w:val="0"/>
+          <w:numId w:val="2"/>
+        </w:numPr>
+      </w:pPr>
+      <w:r>
+        <w:rPr>
+          <w:rFonts w:ascii="Consolas" w:cs="Consolas" w:eastAsia="Consolas" w:hAnsi="Consolas"/>
+          <w:sz w:val="19"/>
+          <w:szCs w:val="19"/>
+        </w:rPr>
+        <w:t xml:space="preserve">client/README.md</w:t>
       </w:r>
     </w:p>
     <w:p>
@@ -11521,7 +11868,7 @@
           <w:sz w:val="21"/>
           <w:szCs w:val="21"/>
         </w:rPr>
-        <w:t xml:space="preserve">PDF with the executed prompts and 15 planned prompts; the Word log has the same content.</w:t>
+        <w:t xml:space="preserve">Created domain module receipt.js with file validation (MIME, extension, 5 MB limit), formatFileSize, sanitizeReceiptFilename, candidate text parsing (merchant, date, amountPaise), and honest OCR availability check; created receipt-scan.js with drag &amp; drop, safe object URL preview, metadata box, cancel/reset, and session transition; created receipt-confirm.js with preview rendering, honest OCR status alert, editable review form, Discard handler, and saving to expense &amp; receipt collections; updated shopping-form.js to support both create and edit modes; updated shopping-detail.js with inline item editing, optimistic checklist toggling with error rollback, confirmDialog on item removal, and duplicate conversion guard; updated shopping-detail.html with Edit list button and progress meter; updated api.js with enhanced shopping validation and listReceipts, getReceipt, createReceipt methods; added 31 new automated tests in shopping-receipt.test.mjs.</w:t>
       </w:r>
     </w:p>
     <w:p>
@@ -11549,7 +11896,7 @@
           <w:sz w:val="21"/>
           <w:szCs w:val="21"/>
         </w:rPr>
-        <w:t xml:space="preserve">Pages rendered to images and inspected; text extracted with pypdf.</w:t>
+        <w:t xml:space="preserve">176 total client tests passing across 8 test suites (data-layer.test.mjs, render.test.mjs, forms.test.mjs, splits-settle.test.mjs, forecast.test.mjs, insights.test.mjs, search-notifications.test.mjs, shopping-receipt.test.mjs); npm run lint:html passing with 0 errors across 25 HTML files.</w:t>
       </w:r>
     </w:p>
     <w:p>
@@ -11565,11 +11912,20 @@
     </w:p>
     <w:p>
       <w:pPr>
+        <w:pStyle w:val="Heading2"/>
+        <w:spacing w:before="360"/>
+      </w:pPr>
+      <w:r>
+        <w:t xml:space="preserve">Wrap-up - Documentation, cleanup and deployment</w:t>
+      </w:r>
+    </w:p>
+    <w:p>
+      <w:pPr>
         <w:pStyle w:val="Heading3"/>
         <w:keepNext/>
       </w:pPr>
       <w:r>
-        <w:t xml:space="preserve">#15  Create the GitHub repository and push the code</w:t>
+        <w:t xml:space="preserve">#13  Request: GitHub repository, website link and PDF of prompts</w:t>
       </w:r>
     </w:p>
     <w:p>
@@ -11583,7 +11939,7 @@
           <w:sz w:val="18"/>
           <w:szCs w:val="18"/>
         </w:rPr>
-        <w:t xml:space="preserve">Working prompt  |  2026-10-15</w:t>
+        <w:t xml:space="preserve">User prompt  |  2026-10-15</w:t>
       </w:r>
     </w:p>
     <w:p>
@@ -11617,7 +11973,7 @@
           <w:sz w:val="19"/>
           <w:szCs w:val="19"/>
         </w:rPr>
-        <w:t xml:space="preserve">Install the official GitHub CLI with winget and sign in through the device-code flow (the student approves it in the browser). Before publishing, check that no secrets or databases are tracked, review the receipt images that are still in the commit history (they are generic sample invoices), and confirm with the student that a public repository is acceptable because the team's original repository is private. Then create the public repository MahaprabhuK/SplitStack, push the refurbish branch as main together with the legacy branch, add a GitHub Actions workflow (.github/workflows/pages.yml) that deploys the client/ folder to GitHub Pages, enable Pages with the "GitHub Actions" source, and confirm that the site responds.</w:t>
+        <w:t xml:space="preserve">create a new repositry for this project in my gihub , and after than give me the github link and then the website link and also a pdf containing the prompts to complete project.</w:t>
       </w:r>
     </w:p>
     <w:p>
@@ -11645,7 +12001,7 @@
           <w:sz w:val="21"/>
           <w:szCs w:val="21"/>
         </w:rPr>
-        <w:t xml:space="preserve">Give the student a repository link and a live website link.</w:t>
+        <w:t xml:space="preserve">Publish the project under the student's own GitHub account, host the site, and export the prompt log (including the remaining planned prompts) as a PDF.</w:t>
       </w:r>
     </w:p>
     <w:p>
@@ -11678,7 +12034,7 @@
           <w:sz w:val="19"/>
           <w:szCs w:val="19"/>
         </w:rPr>
-        <w:t xml:space="preserve">README.md</w:t>
+        <w:t xml:space="preserve">-</w:t>
       </w:r>
     </w:p>
     <w:p>
@@ -11706,7 +12062,7 @@
           <w:sz w:val="21"/>
           <w:szCs w:val="21"/>
         </w:rPr>
-        <w:t xml:space="preserve">Public repository https://github.com/MahaprabhuK/SplitStack created and the legacy branch pushed. The first push of main was rejected because it added a GitHub Actions workflow (.github/workflows/pages.yml) and the gh token lacked the "workflow" scope; the workflow file was removed and main was pushed in the next step. GitHub Pages is not set up yet (planned for the wrap-up; needs "gh auth refresh -s workflow" or a gh-pages branch).</w:t>
+        <w:t xml:space="preserve">Done: see the following entries.</w:t>
       </w:r>
     </w:p>
     <w:p>
@@ -11734,7 +12090,7 @@
           <w:sz w:val="21"/>
           <w:szCs w:val="21"/>
         </w:rPr>
-        <w:t xml:space="preserve">gh repo view; git push output.</w:t>
+        <w:t xml:space="preserve">-</w:t>
       </w:r>
     </w:p>
     <w:p>
@@ -11754,7 +12110,7 @@
         <w:keepNext/>
       </w:pPr>
       <w:r>
-        <w:t xml:space="preserve">#16  Request: hand the project over to a teammate's agent</w:t>
+        <w:t xml:space="preserve">#14  PDF export of the prompt log, including planned prompts</w:t>
       </w:r>
     </w:p>
     <w:p>
@@ -11768,7 +12124,7 @@
           <w:sz w:val="18"/>
           <w:szCs w:val="18"/>
         </w:rPr>
-        <w:t xml:space="preserve">User prompt  |  2026-10-15</w:t>
+        <w:t xml:space="preserve">Working prompt  |  2026-10-15</w:t>
       </w:r>
     </w:p>
     <w:p>
@@ -11802,7 +12158,7 @@
           <w:sz w:val="19"/>
           <w:szCs w:val="19"/>
         </w:rPr>
-        <w:t xml:space="preserve">ACTUALLY I GONNA HANDOVER THE PROJECT TO MY TEAMMATES AGENT SO HE'LL BE PULLING THE CODE AND RUNNING IN HIS SYSTEM SO GIVE PROMPT FOR THAT</w:t>
+        <w:t xml:space="preserve">Export the prompt log to PDF with a Python reportlab script (docs/tools/build_prompt_pdf.py) that reads docs/prompt_log.json: a title page, a stage overview table, a summary of every entry, Part A with every executed prompt verbatim in a shaded box with purpose, files, result and verification, and Part B with the planned prompts that complete Review 2, Review 3 and the wrap-up, clearly marked as not yet run. Add the planned prompts to prompt_log.json and to the Word log as well, and make "npm run log" rebuild both documents.</w:t>
       </w:r>
     </w:p>
     <w:p>
@@ -11830,7 +12186,7 @@
           <w:sz w:val="21"/>
           <w:szCs w:val="21"/>
         </w:rPr>
-        <w:t xml:space="preserve">Let a teammate's AI agent clone, run and continue the project.</w:t>
+        <w:t xml:space="preserve">Give the student a PDF containing the prompts needed to complete the whole project.</w:t>
       </w:r>
     </w:p>
     <w:p>
@@ -11863,7 +12219,92 @@
           <w:sz w:val="19"/>
           <w:szCs w:val="19"/>
         </w:rPr>
-        <w:t xml:space="preserve">-</w:t>
+        <w:t xml:space="preserve">docs/tools/build_prompt_pdf.py</w:t>
+      </w:r>
+    </w:p>
+    <w:p>
+      <w:pPr>
+        <w:pStyle w:val="ListParagraph"/>
+        <w:numPr>
+          <w:ilvl w:val="0"/>
+          <w:numId w:val="2"/>
+        </w:numPr>
+      </w:pPr>
+      <w:r>
+        <w:rPr>
+          <w:rFonts w:ascii="Consolas" w:cs="Consolas" w:eastAsia="Consolas" w:hAnsi="Consolas"/>
+          <w:sz w:val="19"/>
+          <w:szCs w:val="19"/>
+        </w:rPr>
+        <w:t xml:space="preserve">docs/tools/build-prompt-log.js</w:t>
+      </w:r>
+    </w:p>
+    <w:p>
+      <w:pPr>
+        <w:pStyle w:val="ListParagraph"/>
+        <w:numPr>
+          <w:ilvl w:val="0"/>
+          <w:numId w:val="2"/>
+        </w:numPr>
+      </w:pPr>
+      <w:r>
+        <w:rPr>
+          <w:rFonts w:ascii="Consolas" w:cs="Consolas" w:eastAsia="Consolas" w:hAnsi="Consolas"/>
+          <w:sz w:val="19"/>
+          <w:szCs w:val="19"/>
+        </w:rPr>
+        <w:t xml:space="preserve">docs/prompt_log.json</w:t>
+      </w:r>
+    </w:p>
+    <w:p>
+      <w:pPr>
+        <w:pStyle w:val="ListParagraph"/>
+        <w:numPr>
+          <w:ilvl w:val="0"/>
+          <w:numId w:val="2"/>
+        </w:numPr>
+      </w:pPr>
+      <w:r>
+        <w:rPr>
+          <w:rFonts w:ascii="Consolas" w:cs="Consolas" w:eastAsia="Consolas" w:hAnsi="Consolas"/>
+          <w:sz w:val="19"/>
+          <w:szCs w:val="19"/>
+        </w:rPr>
+        <w:t xml:space="preserve">docs/SplitStack_Prompt_Log.pdf</w:t>
+      </w:r>
+    </w:p>
+    <w:p>
+      <w:pPr>
+        <w:pStyle w:val="ListParagraph"/>
+        <w:numPr>
+          <w:ilvl w:val="0"/>
+          <w:numId w:val="2"/>
+        </w:numPr>
+      </w:pPr>
+      <w:r>
+        <w:rPr>
+          <w:rFonts w:ascii="Consolas" w:cs="Consolas" w:eastAsia="Consolas" w:hAnsi="Consolas"/>
+          <w:sz w:val="19"/>
+          <w:szCs w:val="19"/>
+        </w:rPr>
+        <w:t xml:space="preserve">docs/SplitStack_Prompt_Log.docx</w:t>
+      </w:r>
+    </w:p>
+    <w:p>
+      <w:pPr>
+        <w:pStyle w:val="ListParagraph"/>
+        <w:numPr>
+          <w:ilvl w:val="0"/>
+          <w:numId w:val="2"/>
+        </w:numPr>
+      </w:pPr>
+      <w:r>
+        <w:rPr>
+          <w:rFonts w:ascii="Consolas" w:cs="Consolas" w:eastAsia="Consolas" w:hAnsi="Consolas"/>
+          <w:sz w:val="19"/>
+          <w:szCs w:val="19"/>
+        </w:rPr>
+        <w:t xml:space="preserve">package.json</w:t>
       </w:r>
     </w:p>
     <w:p>
@@ -11891,7 +12332,7 @@
           <w:sz w:val="21"/>
           <w:szCs w:val="21"/>
         </w:rPr>
-        <w:t xml:space="preserve">A handover prompt was written covering: requirements per review, clone and branch, prerequisites, install/run/verify commands, repository map, known traps, the mandatory logging rule, the ordered remaining work (planned prompts P1-P15) and working rules. Noted that the new work had to be pushed to GitHub first.</w:t>
+        <w:t xml:space="preserve">PDF with the executed prompts and 15 planned prompts; the Word log has the same content.</w:t>
       </w:r>
     </w:p>
     <w:p>
@@ -11919,7 +12360,7 @@
           <w:sz w:val="21"/>
           <w:szCs w:val="21"/>
         </w:rPr>
-        <w:t xml:space="preserve">-</w:t>
+        <w:t xml:space="preserve">Pages rendered to images and inspected; text extracted with pypdf.</w:t>
       </w:r>
     </w:p>
     <w:p>
@@ -11939,7 +12380,7 @@
         <w:keepNext/>
       </w:pPr>
       <w:r>
-        <w:t xml:space="preserve">#17  Push the refurbished code to GitHub main</w:t>
+        <w:t xml:space="preserve">#15  Create the GitHub repository and push the code</w:t>
       </w:r>
     </w:p>
     <w:p>
@@ -11987,7 +12428,7 @@
           <w:sz w:val="19"/>
           <w:szCs w:val="19"/>
         </w:rPr>
-        <w:t xml:space="preserve">push it  (user prompt). Executed as: remove .github/workflows/pages.yml (the token lacks the workflow scope), replace the not-yet-existing live-site link in README.md with local run instructions, correct the earlier log entry about publishing, log the handover, rebuild the prompt logs, commit, and push the refurbish branch to main on https://github.com/MahaprabhuK/SplitStack so the teammate can clone it.</w:t>
+        <w:t xml:space="preserve">Install the official GitHub CLI with winget and sign in through the device-code flow (the student approves it in the browser). Before publishing, check that no secrets or databases are tracked, review the receipt images that are still in the commit history (they are generic sample invoices), and confirm with the student that a public repository is acceptable because the team's original repository is private. Then create the public repository MahaprabhuK/SplitStack, push the refurbish branch as main together with the legacy branch, add a GitHub Actions workflow (.github/workflows/pages.yml) that deploys the client/ folder to GitHub Pages, enable Pages with the "GitHub Actions" source, and confirm that the site responds.</w:t>
       </w:r>
     </w:p>
     <w:p>
@@ -12015,7 +12456,7 @@
           <w:sz w:val="21"/>
           <w:szCs w:val="21"/>
         </w:rPr>
-        <w:t xml:space="preserve">Make the current work available to the teammate.</w:t>
+        <w:t xml:space="preserve">Give the student a repository link and a live website link.</w:t>
       </w:r>
     </w:p>
     <w:p>
@@ -12048,75 +12489,7 @@
           <w:sz w:val="19"/>
           <w:szCs w:val="19"/>
         </w:rPr>
-        <w:t xml:space="preserve">.github/workflows/pages.yml (removed)</w:t>
-      </w:r>
-    </w:p>
-    <w:p>
-      <w:pPr>
-        <w:pStyle w:val="ListParagraph"/>
-        <w:numPr>
-          <w:ilvl w:val="0"/>
-          <w:numId w:val="2"/>
-        </w:numPr>
-      </w:pPr>
-      <w:r>
-        <w:rPr>
-          <w:rFonts w:ascii="Consolas" w:cs="Consolas" w:eastAsia="Consolas" w:hAnsi="Consolas"/>
-          <w:sz w:val="19"/>
-          <w:szCs w:val="19"/>
-        </w:rPr>
         <w:t xml:space="preserve">README.md</w:t>
-      </w:r>
-    </w:p>
-    <w:p>
-      <w:pPr>
-        <w:pStyle w:val="ListParagraph"/>
-        <w:numPr>
-          <w:ilvl w:val="0"/>
-          <w:numId w:val="2"/>
-        </w:numPr>
-      </w:pPr>
-      <w:r>
-        <w:rPr>
-          <w:rFonts w:ascii="Consolas" w:cs="Consolas" w:eastAsia="Consolas" w:hAnsi="Consolas"/>
-          <w:sz w:val="19"/>
-          <w:szCs w:val="19"/>
-        </w:rPr>
-        <w:t xml:space="preserve">docs/prompt_log.json</w:t>
-      </w:r>
-    </w:p>
-    <w:p>
-      <w:pPr>
-        <w:pStyle w:val="ListParagraph"/>
-        <w:numPr>
-          <w:ilvl w:val="0"/>
-          <w:numId w:val="2"/>
-        </w:numPr>
-      </w:pPr>
-      <w:r>
-        <w:rPr>
-          <w:rFonts w:ascii="Consolas" w:cs="Consolas" w:eastAsia="Consolas" w:hAnsi="Consolas"/>
-          <w:sz w:val="19"/>
-          <w:szCs w:val="19"/>
-        </w:rPr>
-        <w:t xml:space="preserve">docs/SplitStack_Prompt_Log.docx</w:t>
-      </w:r>
-    </w:p>
-    <w:p>
-      <w:pPr>
-        <w:pStyle w:val="ListParagraph"/>
-        <w:numPr>
-          <w:ilvl w:val="0"/>
-          <w:numId w:val="2"/>
-        </w:numPr>
-      </w:pPr>
-      <w:r>
-        <w:rPr>
-          <w:rFonts w:ascii="Consolas" w:cs="Consolas" w:eastAsia="Consolas" w:hAnsi="Consolas"/>
-          <w:sz w:val="19"/>
-          <w:szCs w:val="19"/>
-        </w:rPr>
-        <w:t xml:space="preserve">docs/SplitStack_Prompt_Log.pdf</w:t>
       </w:r>
     </w:p>
     <w:p>
@@ -12144,7 +12517,7 @@
           <w:sz w:val="21"/>
           <w:szCs w:val="21"/>
         </w:rPr>
-        <w:t xml:space="preserve">main pushed to GitHub; branches on GitHub: main (refurbished work) and legacy (original Flask app).</w:t>
+        <w:t xml:space="preserve">Public repository https://github.com/MahaprabhuK/SplitStack created and the legacy branch pushed. The first push of main was rejected because it added a GitHub Actions workflow (.github/workflows/pages.yml) and the gh token lacked the "workflow" scope; the workflow file was removed and main was pushed in the next step. GitHub Pages is not set up yet (planned for the wrap-up; needs "gh auth refresh -s workflow" or a gh-pages branch).</w:t>
       </w:r>
     </w:p>
     <w:p>
@@ -12172,7 +12545,7 @@
           <w:sz w:val="21"/>
           <w:szCs w:val="21"/>
         </w:rPr>
-        <w:t xml:space="preserve">git ls-remote shows main and legacy at the expected commits.</w:t>
+        <w:t xml:space="preserve">gh repo view; git push output.</w:t>
       </w:r>
     </w:p>
     <w:p>
@@ -12192,7 +12565,7 @@
         <w:keepNext/>
       </w:pPr>
       <w:r>
-        <w:t xml:space="preserve">#18  Request: push the code and deploy the website</w:t>
+        <w:t xml:space="preserve">#16  Request: hand the project over to a teammate's agent</w:t>
       </w:r>
     </w:p>
     <w:p>
@@ -12240,7 +12613,7 @@
           <w:sz w:val="19"/>
           <w:szCs w:val="19"/>
         </w:rPr>
-        <w:t xml:space="preserve">first push the code and deploy it</w:t>
+        <w:t xml:space="preserve">ACTUALLY I GONNA HANDOVER THE PROJECT TO MY TEAMMATES AGENT SO HE'LL BE PULLING THE CODE AND RUNNING IN HIS SYSTEM SO GIVE PROMPT FOR THAT</w:t>
       </w:r>
     </w:p>
     <w:p>
@@ -12268,7 +12641,7 @@
           <w:sz w:val="21"/>
           <w:szCs w:val="21"/>
         </w:rPr>
-        <w:t xml:space="preserve">Get the code on GitHub and the Review 1 site online.</w:t>
+        <w:t xml:space="preserve">Let a teammate's AI agent clone, run and continue the project.</w:t>
       </w:r>
     </w:p>
     <w:p>
@@ -12329,7 +12702,7 @@
           <w:sz w:val="21"/>
           <w:szCs w:val="21"/>
         </w:rPr>
-        <w:t xml:space="preserve">Handled in the next step.</w:t>
+        <w:t xml:space="preserve">A handover prompt was written covering: requirements per review, clone and branch, prerequisites, install/run/verify commands, repository map, known traps, the mandatory logging rule, the ordered remaining work (planned prompts P1-P15) and working rules. Noted that the new work had to be pushed to GitHub first.</w:t>
       </w:r>
     </w:p>
     <w:p>
@@ -12377,7 +12750,7 @@
         <w:keepNext/>
       </w:pPr>
       <w:r>
-        <w:t xml:space="preserve">#19  Deploy the client to GitHub Pages from a gh-pages branch</w:t>
+        <w:t xml:space="preserve">#17  Push the refurbished code to GitHub main</w:t>
       </w:r>
     </w:p>
     <w:p>
@@ -12425,7 +12798,7 @@
           <w:sz w:val="19"/>
           <w:szCs w:val="19"/>
         </w:rPr>
-        <w:t xml:space="preserve">Push refurbish to main and refurbish on MahaprabhuK/SplitStack. Because the token cannot push workflow files, deploy without GitHub Actions: check that client/ uses only relative links, split client/ into its own history with git subtree split, push it as the gh-pages branch, wait for GitHub Pages to publish it, then put the live link back in README.md and log the step.</w:t>
+        <w:t xml:space="preserve">push it  (user prompt). Executed as: remove .github/workflows/pages.yml (the token lacks the workflow scope), replace the not-yet-existing live-site link in README.md with local run instructions, correct the earlier log entry about publishing, log the handover, rebuild the prompt logs, commit, and push the refurbish branch to main on https://github.com/MahaprabhuK/SplitStack so the teammate can clone it.</w:t>
       </w:r>
     </w:p>
     <w:p>
@@ -12453,7 +12826,7 @@
           <w:sz w:val="21"/>
           <w:szCs w:val="21"/>
         </w:rPr>
-        <w:t xml:space="preserve">Publish the Review 1 site at a public URL without needing the workflow scope.</w:t>
+        <w:t xml:space="preserve">Make the current work available to the teammate.</w:t>
       </w:r>
     </w:p>
     <w:p>
@@ -12486,6 +12859,23 @@
           <w:sz w:val="19"/>
           <w:szCs w:val="19"/>
         </w:rPr>
+        <w:t xml:space="preserve">.github/workflows/pages.yml (removed)</w:t>
+      </w:r>
+    </w:p>
+    <w:p>
+      <w:pPr>
+        <w:pStyle w:val="ListParagraph"/>
+        <w:numPr>
+          <w:ilvl w:val="0"/>
+          <w:numId w:val="2"/>
+        </w:numPr>
+      </w:pPr>
+      <w:r>
+        <w:rPr>
+          <w:rFonts w:ascii="Consolas" w:cs="Consolas" w:eastAsia="Consolas" w:hAnsi="Consolas"/>
+          <w:sz w:val="19"/>
+          <w:szCs w:val="19"/>
+        </w:rPr>
         <w:t xml:space="preserve">README.md</w:t>
       </w:r>
     </w:p>
@@ -12504,6 +12894,40 @@
           <w:szCs w:val="19"/>
         </w:rPr>
         <w:t xml:space="preserve">docs/prompt_log.json</w:t>
+      </w:r>
+    </w:p>
+    <w:p>
+      <w:pPr>
+        <w:pStyle w:val="ListParagraph"/>
+        <w:numPr>
+          <w:ilvl w:val="0"/>
+          <w:numId w:val="2"/>
+        </w:numPr>
+      </w:pPr>
+      <w:r>
+        <w:rPr>
+          <w:rFonts w:ascii="Consolas" w:cs="Consolas" w:eastAsia="Consolas" w:hAnsi="Consolas"/>
+          <w:sz w:val="19"/>
+          <w:szCs w:val="19"/>
+        </w:rPr>
+        <w:t xml:space="preserve">docs/SplitStack_Prompt_Log.docx</w:t>
+      </w:r>
+    </w:p>
+    <w:p>
+      <w:pPr>
+        <w:pStyle w:val="ListParagraph"/>
+        <w:numPr>
+          <w:ilvl w:val="0"/>
+          <w:numId w:val="2"/>
+        </w:numPr>
+      </w:pPr>
+      <w:r>
+        <w:rPr>
+          <w:rFonts w:ascii="Consolas" w:cs="Consolas" w:eastAsia="Consolas" w:hAnsi="Consolas"/>
+          <w:sz w:val="19"/>
+          <w:szCs w:val="19"/>
+        </w:rPr>
+        <w:t xml:space="preserve">docs/SplitStack_Prompt_Log.pdf</w:t>
       </w:r>
     </w:p>
     <w:p>
@@ -12531,7 +12955,7 @@
           <w:sz w:val="21"/>
           <w:szCs w:val="21"/>
         </w:rPr>
-        <w:t xml:space="preserve">main and refurbish are on GitHub. The client/ folder is published from the gh-pages branch at https://mahaprabhuk.github.io/SplitStack/ (GitHub enabled Pages automatically). To redeploy after client changes: git subtree split --prefix client refurbish, then push that commit to gh-pages.</w:t>
+        <w:t xml:space="preserve">main pushed to GitHub; branches on GitHub: main (refurbished work) and legacy (original Flask app).</w:t>
       </w:r>
     </w:p>
     <w:p>
@@ -12559,7 +12983,7 @@
           <w:sz w:val="21"/>
           <w:szCs w:val="21"/>
         </w:rPr>
-        <w:t xml:space="preserve">git ls-remote; curl returned 200 for the home page, pages/404.html and css/base.css on the live site.</w:t>
+        <w:t xml:space="preserve">git ls-remote shows main and legacy at the expected commits.</w:t>
       </w:r>
     </w:p>
     <w:p>
@@ -12579,7 +13003,7 @@
         <w:keepNext/>
       </w:pPr>
       <w:r>
-        <w:t xml:space="preserve">#20  Request: handover prompt PDF for a teammate's agent</w:t>
+        <w:t xml:space="preserve">#18  Request: push the code and deploy the website</w:t>
       </w:r>
     </w:p>
     <w:p>
@@ -12627,7 +13051,7 @@
           <w:sz w:val="19"/>
           <w:szCs w:val="19"/>
         </w:rPr>
-        <w:t xml:space="preserve">imma handover the project to my teammate i want you to create a detailed prompt for his agent most prolly he'll use anti gravity so i want a pdf containing prompts to complete the rest of the work in the project. so create a pdf and mention its path once its created then i'll share it to him</w:t>
+        <w:t xml:space="preserve">first push the code and deploy it</w:t>
       </w:r>
     </w:p>
     <w:p>
@@ -12655,7 +13079,7 @@
           <w:sz w:val="21"/>
           <w:szCs w:val="21"/>
         </w:rPr>
-        <w:t xml:space="preserve">Let a teammate's AI agent (Antigravity) finish Review 2, Review 3 and the wrap-up.</w:t>
+        <w:t xml:space="preserve">Get the code on GitHub and the Review 1 site online.</w:t>
       </w:r>
     </w:p>
     <w:p>
@@ -12764,7 +13188,7 @@
         <w:keepNext/>
       </w:pPr>
       <w:r>
-        <w:t xml:space="preserve">#21  Handover prompts PDF</w:t>
+        <w:t xml:space="preserve">#19  Deploy the client to GitHub Pages from a gh-pages branch</w:t>
       </w:r>
     </w:p>
     <w:p>
@@ -12812,7 +13236,7 @@
           <w:sz w:val="19"/>
           <w:szCs w:val="19"/>
         </w:rPr>
-        <w:t xml:space="preserve">Write docs/tools/build_handover_pdf.py (reusing the styles of build_prompt_pdf.py) to produce docs/SplitStack_Handover_Prompts.pdf: how to use it with Antigravity, one-time setup (tools, collaborator access, MongoDB Atlas, workflow token scope), a roadmap, Prompt 0 with the full project context, rules, logging, commit/push and gh-pages redeploy procedure, the 15 planned prompts P1-P15 expanded with concrete checks and commit messages, utility prompts (status, recovery, review rehearsal) and common problems. Render pages to check the layout.</w:t>
+        <w:t xml:space="preserve">Push refurbish to main and refurbish on MahaprabhuK/SplitStack. Because the token cannot push workflow files, deploy without GitHub Actions: check that client/ uses only relative links, split client/ into its own history with git subtree split, push it as the gh-pages branch, wait for GitHub Pages to publish it, then put the live link back in README.md and log the step.</w:t>
       </w:r>
     </w:p>
     <w:p>
@@ -12840,7 +13264,7 @@
           <w:sz w:val="21"/>
           <w:szCs w:val="21"/>
         </w:rPr>
-        <w:t xml:space="preserve">Give the teammate a self-contained, ordered set of prompts.</w:t>
+        <w:t xml:space="preserve">Publish the Review 1 site at a public URL without needing the workflow scope.</w:t>
       </w:r>
     </w:p>
     <w:p>
@@ -12873,24 +13297,24 @@
           <w:sz w:val="19"/>
           <w:szCs w:val="19"/>
         </w:rPr>
-        <w:t xml:space="preserve">docs/tools/build_handover_pdf.py</w:t>
-      </w:r>
-    </w:p>
-    <w:p>
-      <w:pPr>
-        <w:pStyle w:val="ListParagraph"/>
-        <w:numPr>
-          <w:ilvl w:val="0"/>
-          <w:numId w:val="2"/>
-        </w:numPr>
-      </w:pPr>
-      <w:r>
-        <w:rPr>
-          <w:rFonts w:ascii="Consolas" w:cs="Consolas" w:eastAsia="Consolas" w:hAnsi="Consolas"/>
-          <w:sz w:val="19"/>
-          <w:szCs w:val="19"/>
-        </w:rPr>
-        <w:t xml:space="preserve">docs/SplitStack_Handover_Prompts.pdf</w:t>
+        <w:t xml:space="preserve">README.md</w:t>
+      </w:r>
+    </w:p>
+    <w:p>
+      <w:pPr>
+        <w:pStyle w:val="ListParagraph"/>
+        <w:numPr>
+          <w:ilvl w:val="0"/>
+          <w:numId w:val="2"/>
+        </w:numPr>
+      </w:pPr>
+      <w:r>
+        <w:rPr>
+          <w:rFonts w:ascii="Consolas" w:cs="Consolas" w:eastAsia="Consolas" w:hAnsi="Consolas"/>
+          <w:sz w:val="19"/>
+          <w:szCs w:val="19"/>
+        </w:rPr>
+        <w:t xml:space="preserve">docs/prompt_log.json</w:t>
       </w:r>
     </w:p>
     <w:p>
@@ -12918,7 +13342,7 @@
           <w:sz w:val="21"/>
           <w:szCs w:val="21"/>
         </w:rPr>
-        <w:t xml:space="preserve">14-page PDF created. Changes against the planned prompts: P1 adds data-page attributes and client/js/package.json (type module) for node --test; P13 keeps the localStorage implementation as a demo mode (api-local.js chosen when /api/health does not answer) so the GitHub Pages site keeps working, instead of deleting it; P9 replaces deprecated csurf with a synchronizer token; P14 uses MongoMemoryReplSet because the API uses transactions; P15 asks for confirmation before deleting the Flask files and leaves Render account steps to the student.</w:t>
+        <w:t xml:space="preserve">main and refurbish are on GitHub. The client/ folder is published from the gh-pages branch at https://mahaprabhuk.github.io/SplitStack/ (GitHub enabled Pages automatically). To redeploy after client changes: git subtree split --prefix client refurbish, then push that commit to gh-pages.</w:t>
       </w:r>
     </w:p>
     <w:p>
@@ -12946,7 +13370,7 @@
           <w:sz w:val="21"/>
           <w:szCs w:val="21"/>
         </w:rPr>
-        <w:t xml:space="preserve">Rendered pages with PyMuPDF and checked the layout of the setup, Prompt 0, step and utility pages.</w:t>
+        <w:t xml:space="preserve">git ls-remote; curl returned 200 for the home page, pages/404.html and css/base.css on the live site.</w:t>
       </w:r>
     </w:p>
     <w:p>
@@ -12961,37 +13385,12 @@
       </w:r>
     </w:p>
     <w:p>
-      <w:r>
-        <w:br w:type="page"/>
-      </w:r>
-    </w:p>
-    <w:p>
-      <w:pPr>
-        <w:pStyle w:val="Heading1"/>
-      </w:pPr>
-      <w:r>
-        <w:t xml:space="preserve">Planned prompts to complete the project</w:t>
-      </w:r>
-    </w:p>
-    <w:p>
-      <w:pPr>
-        <w:spacing w:after="80"/>
-      </w:pPr>
-      <w:r>
-        <w:rPr>
-          <w:sz w:val="21"/>
-          <w:szCs w:val="21"/>
-        </w:rPr>
-        <w:t xml:space="preserve">These prompts have not been run yet. Run them in order; after each one, move it into the log above with its result.</w:t>
-      </w:r>
-    </w:p>
-    <w:p>
       <w:pPr>
         <w:pStyle w:val="Heading3"/>
         <w:keepNext/>
       </w:pPr>
       <w:r>
-        <w:t xml:space="preserve">P1  Shopping checklist and receipt scan preview</w:t>
+        <w:t xml:space="preserve">#20  Request: handover prompt PDF for a teammate's agent</w:t>
       </w:r>
     </w:p>
     <w:p>
@@ -13005,7 +13404,7 @@
           <w:sz w:val="18"/>
           <w:szCs w:val="18"/>
         </w:rPr>
-        <w:t xml:space="preserve">Review 2  |  Planned prompt</w:t>
+        <w:t xml:space="preserve">User prompt  |  2026-10-15</w:t>
       </w:r>
     </w:p>
     <w:p>
@@ -13039,7 +13438,7 @@
           <w:sz w:val="19"/>
           <w:szCs w:val="19"/>
         </w:rPr>
-        <w:t xml:space="preserve">Make the shopping checklist toggle items with optimistic UI, edit actual prices inline, recompute the estimated, actual and variance totals live, and convert the list to an expense only once (prevent duplicates). On the receipt scan page add drag-and-drop with dragenter/dragleave styling, client-side checks (PNG, JPEG or WEBP, up to 5 MB) and an image preview via URL.createObjectURL. Until the backend exists, run OCR in the browser with tesseract.js from a pinned CDN, parse the merchant, date and total with regular expressions (prefer the line containing TOTAL), show progress, and pre-fill the confirm form.</w:t>
+        <w:t xml:space="preserve">imma handover the project to my teammate i want you to create a detailed prompt for his agent most prolly he'll use anti gravity so i want a pdf containing prompts to complete the rest of the work in the project. so create a pdf and mention its path once its created then i'll share it to him</w:t>
       </w:r>
     </w:p>
     <w:p>
@@ -13067,7 +13466,7 @@
           <w:sz w:val="21"/>
           <w:szCs w:val="21"/>
         </w:rPr>
-        <w:t xml:space="preserve">Complete the remaining interactive flows.</w:t>
+        <w:t xml:space="preserve">Let a teammate's AI agent (Antigravity) finish Review 2, Review 3 and the wrap-up.</w:t>
       </w:r>
     </w:p>
     <w:p>
@@ -13084,6 +13483,39 @@
           <w:szCs w:val="17"/>
         </w:rPr>
         <w:t xml:space="preserve">FILES</w:t>
+      </w:r>
+    </w:p>
+    <w:p>
+      <w:pPr>
+        <w:pStyle w:val="ListParagraph"/>
+        <w:numPr>
+          <w:ilvl w:val="0"/>
+          <w:numId w:val="2"/>
+        </w:numPr>
+      </w:pPr>
+      <w:r>
+        <w:rPr>
+          <w:rFonts w:ascii="Consolas" w:cs="Consolas" w:eastAsia="Consolas" w:hAnsi="Consolas"/>
+          <w:sz w:val="19"/>
+          <w:szCs w:val="19"/>
+        </w:rPr>
+        <w:t xml:space="preserve">-</w:t>
+      </w:r>
+    </w:p>
+    <w:p>
+      <w:pPr>
+        <w:spacing w:after="60" w:before="160"/>
+      </w:pPr>
+      <w:r>
+        <w:rPr>
+          <w:b/>
+          <w:bCs/>
+          <w:color w:val="4F46E5"/>
+          <w:spacing w:val="20"/>
+          <w:sz w:val="17"/>
+          <w:szCs w:val="17"/>
+        </w:rPr>
+        <w:t xml:space="preserve">RESULT</w:t>
       </w:r>
     </w:p>
     <w:p>
@@ -13095,7 +13527,46 @@
           <w:sz w:val="21"/>
           <w:szCs w:val="21"/>
         </w:rPr>
-        <w:t xml:space="preserve">client/js/pages/shopping-detail.js, client/js/pages/receipt-scan.js, client/js/domain/receipt-parser.js</w:t>
+        <w:t xml:space="preserve">Handled in the next step.</w:t>
+      </w:r>
+    </w:p>
+    <w:p>
+      <w:pPr>
+        <w:spacing w:after="60" w:before="160"/>
+      </w:pPr>
+      <w:r>
+        <w:rPr>
+          <w:b/>
+          <w:bCs/>
+          <w:color w:val="4F46E5"/>
+          <w:spacing w:val="20"/>
+          <w:sz w:val="17"/>
+          <w:szCs w:val="17"/>
+        </w:rPr>
+        <w:t xml:space="preserve">VERIFICATION</w:t>
+      </w:r>
+    </w:p>
+    <w:p>
+      <w:pPr>
+        <w:spacing w:after="80"/>
+      </w:pPr>
+      <w:r>
+        <w:rPr>
+          <w:sz w:val="21"/>
+          <w:szCs w:val="21"/>
+        </w:rPr>
+        <w:t xml:space="preserve">-</w:t>
+      </w:r>
+    </w:p>
+    <w:p>
+      <w:pPr>
+        <w:pBdr>
+          <w:bottom w:val="single" w:color="D9DBE5" w:sz="4" w:space="4"/>
+        </w:pBdr>
+        <w:spacing w:after="200"/>
+      </w:pPr>
+      <w:r>
+        <w:t xml:space="preserve"/>
       </w:r>
     </w:p>
     <w:p>
@@ -13104,7 +13575,7 @@
         <w:keepNext/>
       </w:pPr>
       <w:r>
-        <w:t xml:space="preserve">P2  Review 2 QA, log and commit</w:t>
+        <w:t xml:space="preserve">#21  Handover prompts PDF</w:t>
       </w:r>
     </w:p>
     <w:p>
@@ -13118,7 +13589,7 @@
           <w:sz w:val="18"/>
           <w:szCs w:val="18"/>
         </w:rPr>
-        <w:t xml:space="preserve">Review 2  |  Planned prompt</w:t>
+        <w:t xml:space="preserve">Working prompt  |  2026-10-15</w:t>
       </w:r>
     </w:p>
     <w:p>
@@ -13152,7 +13623,7 @@
           <w:sz w:val="19"/>
           <w:szCs w:val="19"/>
         </w:rPr>
-        <w:t xml:space="preserve">Run ESLint (recommended rules, browser globals, ES2023 modules) over client/js and fix every finding; run the domain unit tests; test every page manually at 1366px and 375px in dark and light themes, using only the keyboard, and with JavaScript disabled (pages must still show their static content). Update client/README.md with the JavaScript architecture and a table of the JS concepts used and where. Add each step to docs/prompt_log.json, rebuild the Word and PDF logs, and commit "Review 2".</w:t>
+        <w:t xml:space="preserve">Write docs/tools/build_handover_pdf.py (reusing the styles of build_prompt_pdf.py) to produce docs/SplitStack_Handover_Prompts.pdf: how to use it with Antigravity, one-time setup (tools, collaborator access, MongoDB Atlas, workflow token scope), a roadmap, Prompt 0 with the full project context, rules, logging, commit/push and gh-pages redeploy procedure, the 15 planned prompts P1-P15 expanded with concrete checks and commit messages, utility prompts (status, recovery, review rehearsal) and common problems. Render pages to check the layout.</w:t>
       </w:r>
     </w:p>
     <w:p>
@@ -13180,7 +13651,7 @@
           <w:sz w:val="21"/>
           <w:szCs w:val="21"/>
         </w:rPr>
-        <w:t xml:space="preserve">Close Review 2 with evidence.</w:t>
+        <w:t xml:space="preserve">Give the teammate a self-contained, ordered set of prompts.</w:t>
       </w:r>
     </w:p>
     <w:p>
@@ -13197,6 +13668,56 @@
           <w:szCs w:val="17"/>
         </w:rPr>
         <w:t xml:space="preserve">FILES</w:t>
+      </w:r>
+    </w:p>
+    <w:p>
+      <w:pPr>
+        <w:pStyle w:val="ListParagraph"/>
+        <w:numPr>
+          <w:ilvl w:val="0"/>
+          <w:numId w:val="2"/>
+        </w:numPr>
+      </w:pPr>
+      <w:r>
+        <w:rPr>
+          <w:rFonts w:ascii="Consolas" w:cs="Consolas" w:eastAsia="Consolas" w:hAnsi="Consolas"/>
+          <w:sz w:val="19"/>
+          <w:szCs w:val="19"/>
+        </w:rPr>
+        <w:t xml:space="preserve">docs/tools/build_handover_pdf.py</w:t>
+      </w:r>
+    </w:p>
+    <w:p>
+      <w:pPr>
+        <w:pStyle w:val="ListParagraph"/>
+        <w:numPr>
+          <w:ilvl w:val="0"/>
+          <w:numId w:val="2"/>
+        </w:numPr>
+      </w:pPr>
+      <w:r>
+        <w:rPr>
+          <w:rFonts w:ascii="Consolas" w:cs="Consolas" w:eastAsia="Consolas" w:hAnsi="Consolas"/>
+          <w:sz w:val="19"/>
+          <w:szCs w:val="19"/>
+        </w:rPr>
+        <w:t xml:space="preserve">docs/SplitStack_Handover_Prompts.pdf</w:t>
+      </w:r>
+    </w:p>
+    <w:p>
+      <w:pPr>
+        <w:spacing w:after="60" w:before="160"/>
+      </w:pPr>
+      <w:r>
+        <w:rPr>
+          <w:b/>
+          <w:bCs/>
+          <w:color w:val="4F46E5"/>
+          <w:spacing w:val="20"/>
+          <w:sz w:val="17"/>
+          <w:szCs w:val="17"/>
+        </w:rPr>
+        <w:t xml:space="preserve">RESULT</w:t>
       </w:r>
     </w:p>
     <w:p>
@@ -13208,7 +13729,71 @@
           <w:sz w:val="21"/>
           <w:szCs w:val="21"/>
         </w:rPr>
-        <w:t xml:space="preserve">eslint.config.js, client/README.md, docs/*</w:t>
+        <w:t xml:space="preserve">14-page PDF created. Changes against the planned prompts: P1 adds data-page attributes and client/js/package.json (type module) for node --test; P13 keeps the localStorage implementation as a demo mode (api-local.js chosen when /api/health does not answer) so the GitHub Pages site keeps working, instead of deleting it; P9 replaces deprecated csurf with a synchronizer token; P14 uses MongoMemoryReplSet because the API uses transactions; P15 asks for confirmation before deleting the Flask files and leaves Render account steps to the student.</w:t>
+      </w:r>
+    </w:p>
+    <w:p>
+      <w:pPr>
+        <w:spacing w:after="60" w:before="160"/>
+      </w:pPr>
+      <w:r>
+        <w:rPr>
+          <w:b/>
+          <w:bCs/>
+          <w:color w:val="4F46E5"/>
+          <w:spacing w:val="20"/>
+          <w:sz w:val="17"/>
+          <w:szCs w:val="17"/>
+        </w:rPr>
+        <w:t xml:space="preserve">VERIFICATION</w:t>
+      </w:r>
+    </w:p>
+    <w:p>
+      <w:pPr>
+        <w:spacing w:after="80"/>
+      </w:pPr>
+      <w:r>
+        <w:rPr>
+          <w:sz w:val="21"/>
+          <w:szCs w:val="21"/>
+        </w:rPr>
+        <w:t xml:space="preserve">Rendered pages with PyMuPDF and checked the layout of the setup, Prompt 0, step and utility pages.</w:t>
+      </w:r>
+    </w:p>
+    <w:p>
+      <w:pPr>
+        <w:pBdr>
+          <w:bottom w:val="single" w:color="D9DBE5" w:sz="4" w:space="4"/>
+        </w:pBdr>
+        <w:spacing w:after="200"/>
+      </w:pPr>
+      <w:r>
+        <w:t xml:space="preserve"/>
+      </w:r>
+    </w:p>
+    <w:p>
+      <w:r>
+        <w:br w:type="page"/>
+      </w:r>
+    </w:p>
+    <w:p>
+      <w:pPr>
+        <w:pStyle w:val="Heading1"/>
+      </w:pPr>
+      <w:r>
+        <w:t xml:space="preserve">Planned prompts to complete the project</w:t>
+      </w:r>
+    </w:p>
+    <w:p>
+      <w:pPr>
+        <w:spacing w:after="80"/>
+      </w:pPr>
+      <w:r>
+        <w:rPr>
+          <w:sz w:val="21"/>
+          <w:szCs w:val="21"/>
+        </w:rPr>
+        <w:t xml:space="preserve">These prompts have not been run yet. Run them in order; after each one, move it into the log above with its result.</w:t>
       </w:r>
     </w:p>
     <w:p>
@@ -13217,7 +13802,7 @@
         <w:keepNext/>
       </w:pPr>
       <w:r>
-        <w:t xml:space="preserve">P3  Express server and MongoDB connection</w:t>
+        <w:t xml:space="preserve">P1  Review 2 QA, log and commit</w:t>
       </w:r>
     </w:p>
     <w:p>
@@ -13231,7 +13816,7 @@
           <w:sz w:val="18"/>
           <w:szCs w:val="18"/>
         </w:rPr>
-        <w:t xml:space="preserve">Review 3  |  Planned prompt</w:t>
+        <w:t xml:space="preserve">Review 2  |  Planned prompt</w:t>
       </w:r>
     </w:p>
     <w:p>
@@ -13265,7 +13850,7 @@
           <w:sz w:val="19"/>
           <w:szCs w:val="19"/>
         </w:rPr>
-        <w:t xml:space="preserve">Create server/ as a Node.js 20+ project (ES modules) with Express: server/src/app.js (helmet with a Content Security Policy that allows only the CDNs in use, compression, express.json, express-session stored with connect-mongo, express-rate-limit on auth and upload routes, a CSRF token check on state-changing requests, and a central error handler returning JSON {error, fields}), server/src/index.js (connect to MongoDB Atlas with Mongoose using MONGODB_URI from server/.env, then listen), and static serving of client/. Add server/.env.example (MONGODB_URI, SESSION_SECRET of at least 32 characters, PORT) and npm scripts dev (node --watch) and start. Never commit .env.</w:t>
+        <w:t xml:space="preserve">Run ESLint (recommended rules, browser globals, ES2023 modules) over client/js and fix every finding; run the domain unit tests; test every page manually at 1366px and 375px in dark and light themes, using only the keyboard, and with JavaScript disabled (pages must still show their static content). Update client/README.md with the JavaScript architecture and a table of the JS concepts used and where. Add each step to docs/prompt_log.json, rebuild the Word and PDF logs, and commit "Review 2".</w:t>
       </w:r>
     </w:p>
     <w:p>
@@ -13293,7 +13878,7 @@
           <w:sz w:val="21"/>
           <w:szCs w:val="21"/>
         </w:rPr>
-        <w:t xml:space="preserve">Start Review 3 with a secure, conventional Express setup.</w:t>
+        <w:t xml:space="preserve">Close Review 2 with evidence.</w:t>
       </w:r>
     </w:p>
     <w:p>
@@ -13321,7 +13906,7 @@
           <w:sz w:val="21"/>
           <w:szCs w:val="21"/>
         </w:rPr>
-        <w:t xml:space="preserve">server/package.json, server/src/app.js, server/src/index.js, server/.env.example</w:t>
+        <w:t xml:space="preserve">eslint.config.js, client/README.md, docs/*</w:t>
       </w:r>
     </w:p>
     <w:p>
@@ -13330,7 +13915,7 @@
         <w:keepNext/>
       </w:pPr>
       <w:r>
-        <w:t xml:space="preserve">P4  Mongoose data models</w:t>
+        <w:t xml:space="preserve">P2  Express server and MongoDB connection</w:t>
       </w:r>
     </w:p>
     <w:p>
@@ -13378,7 +13963,7 @@
           <w:sz w:val="19"/>
           <w:szCs w:val="19"/>
         </w:rPr>
-        <w:t xml:space="preserve">Design Mongoose schemas with validation and indexes to replace the 15 SQLite tables: User (name, email unique and lowercase, passwordHash, preferences), Category (user, or null for defaults; name; type expense or income; icon; color), Expense and Income (user, category, amount stored as integer paise, date, description or source, paymentMethod), Budget (user, category or null, month, year, limit; unique on user+category+month+year), Recurring (name, amount, frequency, startDate, nextDueDate, active), Group (name, description, createdBy, members [{user, role admin|member, joinedAt}]), SharedExpense (group, title, amount, paidBy, category, date, splitType, shares [{user, amount}] with a validator that the shares sum to the amount), Settlement (group, payer, payee, amount, status, completedAt), ShoppingList (owner, optional group, name, budget, items [{name, quantity, estimatedPrice, actualPrice, purchased, assignedTo}], convertedExpense), Receipt (user, file reference, merchant, date, amount, rawText, confidence) and Insight (user, kind, message, read). Explain in comments which data is embedded and which is referenced, and why.</w:t>
+        <w:t xml:space="preserve">Create server/ as a Node.js 20+ project (ES modules) with Express: server/src/app.js (helmet with a Content Security Policy that allows only the CDNs in use, compression, express.json, express-session stored with connect-mongo, express-rate-limit on auth and upload routes, a CSRF token check on state-changing requests, and a central error handler returning JSON {error, fields}), server/src/index.js (connect to MongoDB Atlas with Mongoose using MONGODB_URI from server/.env, then listen), and static serving of client/. Add server/.env.example (MONGODB_URI, SESSION_SECRET of at least 32 characters, PORT) and npm scripts dev (node --watch) and start. Never commit .env.</w:t>
       </w:r>
     </w:p>
     <w:p>
@@ -13406,7 +13991,7 @@
           <w:sz w:val="21"/>
           <w:szCs w:val="21"/>
         </w:rPr>
-        <w:t xml:space="preserve">Show MongoDB data modelling, the core of Review 3.</w:t>
+        <w:t xml:space="preserve">Start Review 3 with a secure, conventional Express setup.</w:t>
       </w:r>
     </w:p>
     <w:p>
@@ -13434,7 +14019,7 @@
           <w:sz w:val="21"/>
           <w:szCs w:val="21"/>
         </w:rPr>
-        <w:t xml:space="preserve">server/src/models/*.js</w:t>
+        <w:t xml:space="preserve">server/package.json, server/src/app.js, server/src/index.js, server/.env.example</w:t>
       </w:r>
     </w:p>
     <w:p>
@@ -13443,7 +14028,7 @@
         <w:keepNext/>
       </w:pPr>
       <w:r>
-        <w:t xml:space="preserve">P5  Authentication and REST API</w:t>
+        <w:t xml:space="preserve">P3  Mongoose data models</w:t>
       </w:r>
     </w:p>
     <w:p>
@@ -13491,7 +14076,7 @@
           <w:sz w:val="19"/>
           <w:szCs w:val="19"/>
         </w:rPr>
-        <w:t xml:space="preserve">Implement the REST API under /api with one express.Router per module, mirroring the 48 legacy Flask routes: /api/auth (register with bcrypt cost 12, login, logout, me), /api/expenses, /api/income, /api/categories, /api/budgets, /api/recurring (including toggle), /api/groups (members, shared expenses, balances, settlements, leave), /api/shopping (lists, items, toggle, convert to expense), /api/analytics (monthly, categories, forecast, insights) and /api/search. Validate every input with a schema (zod or express-validator), check ownership or group membership on every request, use MongoDB transactions for multi-document writes (recording a settlement, converting a list), and reuse the Review 2 settle.js and splits.js modules on the server so the algorithm has a single implementation.</w:t>
+        <w:t xml:space="preserve">Design Mongoose schemas with validation and indexes to replace the 15 SQLite tables: User (name, email unique and lowercase, passwordHash, preferences), Category (user, or null for defaults; name; type expense or income; icon; color), Expense and Income (user, category, amount stored as integer paise, date, description or source, paymentMethod), Budget (user, category or null, month, year, limit; unique on user+category+month+year), Recurring (name, amount, frequency, startDate, nextDueDate, active), Group (name, description, createdBy, members [{user, role admin|member, joinedAt}]), SharedExpense (group, title, amount, paidBy, category, date, splitType, shares [{user, amount}] with a validator that the shares sum to the amount), Settlement (group, payer, payee, amount, status, completedAt), ShoppingList (owner, optional group, name, budget, items [{name, quantity, estimatedPrice, actualPrice, purchased, assignedTo}], convertedExpense), Receipt (user, file reference, merchant, date, amount, rawText, confidence) and Insight (user, kind, message, read). Explain in comments which data is embedded and which is referenced, and why.</w:t>
       </w:r>
     </w:p>
     <w:p>
@@ -13519,7 +14104,7 @@
           <w:sz w:val="21"/>
           <w:szCs w:val="21"/>
         </w:rPr>
-        <w:t xml:space="preserve">Deliver the Node.js back end with a complete, secure API.</w:t>
+        <w:t xml:space="preserve">Show MongoDB data modelling, the core of Review 3.</w:t>
       </w:r>
     </w:p>
     <w:p>
@@ -13547,7 +14132,7 @@
           <w:sz w:val="21"/>
           <w:szCs w:val="21"/>
         </w:rPr>
-        <w:t xml:space="preserve">server/src/routes/*.js, server/src/services/*.js, server/src/middleware/*.js</w:t>
+        <w:t xml:space="preserve">server/src/models/*.js</w:t>
       </w:r>
     </w:p>
     <w:p>
@@ -13556,7 +14141,7 @@
         <w:keepNext/>
       </w:pPr>
       <w:r>
-        <w:t xml:space="preserve">P6  Receipt upload and server-side OCR</w:t>
+        <w:t xml:space="preserve">P4  Authentication and REST API</w:t>
       </w:r>
     </w:p>
     <w:p>
@@ -13604,7 +14189,7 @@
           <w:sz w:val="19"/>
           <w:szCs w:val="19"/>
         </w:rPr>
-        <w:t xml:space="preserve">Add POST /api/receipts using multer with memory storage, a 5 MB limit and magic-byte checks for PNG, JPEG and WEBP; preprocess with sharp (rotate from EXIF, greyscale, upscale small images, normalise); run tesseract.js with one shared worker; parse the merchant, date and total with the Review 2 parser; store the image in MongoDB GridFS (so it survives redeploys on free hosting) and the parsed fields in Receipt. GET /api/receipts/:id/image streams the image only to its owner. Confirming creates the expense; nothing becomes an expense without confirmation.</w:t>
+        <w:t xml:space="preserve">Implement the REST API under /api with one express.Router per module, mirroring the 48 legacy Flask routes: /api/auth (register with bcrypt cost 12, login, logout, me), /api/expenses, /api/income, /api/categories, /api/budgets, /api/recurring (including toggle), /api/groups (members, shared expenses, balances, settlements, leave), /api/shopping (lists, items, toggle, convert to expense), /api/analytics (monthly, categories, forecast, insights) and /api/search. Validate every input with a schema (zod or express-validator), check ownership or group membership on every request, use MongoDB transactions for multi-document writes (recording a settlement, converting a list), and reuse the Review 2 settle.js and splits.js modules on the server so the algorithm has a single implementation.</w:t>
       </w:r>
     </w:p>
     <w:p>
@@ -13632,7 +14217,7 @@
           <w:sz w:val="21"/>
           <w:szCs w:val="21"/>
         </w:rPr>
-        <w:t xml:space="preserve">Port the OCR feature to Node with persistent storage.</w:t>
+        <w:t xml:space="preserve">Deliver the Node.js back end with a complete, secure API.</w:t>
       </w:r>
     </w:p>
     <w:p>
@@ -13660,7 +14245,7 @@
           <w:sz w:val="21"/>
           <w:szCs w:val="21"/>
         </w:rPr>
-        <w:t xml:space="preserve">server/src/routes/receipts.js, server/src/services/ocr.js</w:t>
+        <w:t xml:space="preserve">server/src/routes/*.js, server/src/services/*.js, server/src/middleware/*.js</w:t>
       </w:r>
     </w:p>
     <w:p>
@@ -13669,7 +14254,7 @@
         <w:keepNext/>
       </w:pPr>
       <w:r>
-        <w:t xml:space="preserve">P7  Connect the client to the API</w:t>
+        <w:t xml:space="preserve">P5  Receipt upload and server-side OCR</w:t>
       </w:r>
     </w:p>
     <w:p>
@@ -13717,7 +14302,7 @@
           <w:sz w:val="19"/>
           <w:szCs w:val="19"/>
         </w:rPr>
-        <w:t xml:space="preserve">Re-implement client/js/data/api.js with fetch() against /api, sending credentials and the CSRF token header, mapping HTTP errors to the same {field, message} errors the pages already handle, and showing a toast when offline. Remove the localStorage store except for the theme preference. Because the page code depends only on api.js, no page module should need changes; confirm this by running every flow end to end against a local server connected to Atlas.</w:t>
+        <w:t xml:space="preserve">Add POST /api/receipts using multer with memory storage, a 5 MB limit and magic-byte checks for PNG, JPEG and WEBP; preprocess with sharp (rotate from EXIF, greyscale, upscale small images, normalise); run tesseract.js with one shared worker; parse the merchant, date and total with the Review 2 parser; store the image in MongoDB GridFS (so it survives redeploys on free hosting) and the parsed fields in Receipt. GET /api/receipts/:id/image streams the image only to its owner. Confirming creates the expense; nothing becomes an expense without confirmation.</w:t>
       </w:r>
     </w:p>
     <w:p>
@@ -13745,7 +14330,7 @@
           <w:sz w:val="21"/>
           <w:szCs w:val="21"/>
         </w:rPr>
-        <w:t xml:space="preserve">Finish the full-stack integration.</w:t>
+        <w:t xml:space="preserve">Port the OCR feature to Node with persistent storage.</w:t>
       </w:r>
     </w:p>
     <w:p>
@@ -13773,7 +14358,7 @@
           <w:sz w:val="21"/>
           <w:szCs w:val="21"/>
         </w:rPr>
-        <w:t xml:space="preserve">client/js/data/api.js</w:t>
+        <w:t xml:space="preserve">server/src/routes/receipts.js, server/src/services/ocr.js</w:t>
       </w:r>
     </w:p>
     <w:p>
@@ -13782,7 +14367,7 @@
         <w:keepNext/>
       </w:pPr>
       <w:r>
-        <w:t xml:space="preserve">P8  Seed data and automated tests</w:t>
+        <w:t xml:space="preserve">P6  Connect the client to the API</w:t>
       </w:r>
     </w:p>
     <w:p>
@@ -13830,7 +14415,7 @@
           <w:sz w:val="19"/>
           <w:szCs w:val="19"/>
         </w:rPr>
-        <w:t xml:space="preserve">Add server/scripts/seed.js that creates the demo user, categories, six months of expenses and income, budgets, recurring payments, the three groups with shared expenses, and shopping lists. It must be idempotent and must refuse to run against a database whose name does not end in -dev or -test unless --force is passed. Write Jest + Supertest tests using mongodb-memory-server for auth, ownership checks, CSRF rejection, rate limiting, split validation, the settlement algorithm, budget status, convert-to-expense duplicate prevention and receipt upload validation, covering what the 47 legacy Python tests checked. Add an npm test script and a GitHub Actions workflow that runs lint and tests on every push.</w:t>
+        <w:t xml:space="preserve">Re-implement client/js/data/api.js with fetch() against /api, sending credentials and the CSRF token header, mapping HTTP errors to the same {field, message} errors the pages already handle, and showing a toast when offline. Remove the localStorage store except for the theme preference. Because the page code depends only on api.js, no page module should need changes; confirm this by running every flow end to end against a local server connected to Atlas.</w:t>
       </w:r>
     </w:p>
     <w:p>
@@ -13858,7 +14443,7 @@
           <w:sz w:val="21"/>
           <w:szCs w:val="21"/>
         </w:rPr>
-        <w:t xml:space="preserve">Prove the back end works and keep it working.</w:t>
+        <w:t xml:space="preserve">Finish the full-stack integration.</w:t>
       </w:r>
     </w:p>
     <w:p>
@@ -13886,7 +14471,7 @@
           <w:sz w:val="21"/>
           <w:szCs w:val="21"/>
         </w:rPr>
-        <w:t xml:space="preserve">server/scripts/seed.js, server/tests/*.test.js, .github/workflows/ci.yml</w:t>
+        <w:t xml:space="preserve">client/js/data/api.js</w:t>
       </w:r>
     </w:p>
     <w:p>
@@ -13895,7 +14480,120 @@
         <w:keepNext/>
       </w:pPr>
       <w:r>
-        <w:t xml:space="preserve">P9  Remove legacy code, document and deploy</w:t>
+        <w:t xml:space="preserve">P7  Seed data and automated tests</w:t>
+      </w:r>
+    </w:p>
+    <w:p>
+      <w:pPr>
+        <w:keepNext/>
+        <w:spacing w:after="60"/>
+      </w:pPr>
+      <w:r>
+        <w:rPr>
+          <w:color w:val="5B6475"/>
+          <w:sz w:val="18"/>
+          <w:szCs w:val="18"/>
+        </w:rPr>
+        <w:t xml:space="preserve">Review 3  |  Planned prompt</w:t>
+      </w:r>
+    </w:p>
+    <w:p>
+      <w:pPr>
+        <w:spacing w:after="60" w:before="160"/>
+      </w:pPr>
+      <w:r>
+        <w:rPr>
+          <w:b/>
+          <w:bCs/>
+          <w:color w:val="4F46E5"/>
+          <w:spacing w:val="20"/>
+          <w:sz w:val="17"/>
+          <w:szCs w:val="17"/>
+        </w:rPr>
+        <w:t xml:space="preserve">PROMPT</w:t>
+      </w:r>
+    </w:p>
+    <w:p>
+      <w:pPr>
+        <w:pBdr>
+          <w:left w:val="single" w:color="4F46E5" w:sz="18" w:space="8"/>
+        </w:pBdr>
+        <w:shd w:fill="F1F2F8" w:color="auto" w:val="clear"/>
+        <w:spacing w:after="120" w:before="40" w:line="276"/>
+        <w:ind w:left="160" w:right="160"/>
+      </w:pPr>
+      <w:r>
+        <w:rPr>
+          <w:rFonts w:ascii="Consolas" w:cs="Consolas" w:eastAsia="Consolas" w:hAnsi="Consolas"/>
+          <w:sz w:val="19"/>
+          <w:szCs w:val="19"/>
+        </w:rPr>
+        <w:t xml:space="preserve">Add server/scripts/seed.js that creates the demo user, categories, six months of expenses and income, budgets, recurring payments, the three groups with shared expenses, and shopping lists. It must be idempotent and must refuse to run against a database whose name does not end in -dev or -test unless --force is passed. Write Jest + Supertest tests using mongodb-memory-server for auth, ownership checks, CSRF rejection, rate limiting, split validation, the settlement algorithm, budget status, convert-to-expense duplicate prevention and receipt upload validation, covering what the 47 legacy Python tests checked. Add an npm test script and a GitHub Actions workflow that runs lint and tests on every push.</w:t>
+      </w:r>
+    </w:p>
+    <w:p>
+      <w:pPr>
+        <w:spacing w:after="60" w:before="160"/>
+      </w:pPr>
+      <w:r>
+        <w:rPr>
+          <w:b/>
+          <w:bCs/>
+          <w:color w:val="4F46E5"/>
+          <w:spacing w:val="20"/>
+          <w:sz w:val="17"/>
+          <w:szCs w:val="17"/>
+        </w:rPr>
+        <w:t xml:space="preserve">PURPOSE</w:t>
+      </w:r>
+    </w:p>
+    <w:p>
+      <w:pPr>
+        <w:spacing w:after="80"/>
+      </w:pPr>
+      <w:r>
+        <w:rPr>
+          <w:sz w:val="21"/>
+          <w:szCs w:val="21"/>
+        </w:rPr>
+        <w:t xml:space="preserve">Prove the back end works and keep it working.</w:t>
+      </w:r>
+    </w:p>
+    <w:p>
+      <w:pPr>
+        <w:spacing w:after="60" w:before="160"/>
+      </w:pPr>
+      <w:r>
+        <w:rPr>
+          <w:b/>
+          <w:bCs/>
+          <w:color w:val="4F46E5"/>
+          <w:spacing w:val="20"/>
+          <w:sz w:val="17"/>
+          <w:szCs w:val="17"/>
+        </w:rPr>
+        <w:t xml:space="preserve">FILES</w:t>
+      </w:r>
+    </w:p>
+    <w:p>
+      <w:pPr>
+        <w:spacing w:after="80"/>
+      </w:pPr>
+      <w:r>
+        <w:rPr>
+          <w:sz w:val="21"/>
+          <w:szCs w:val="21"/>
+        </w:rPr>
+        <w:t xml:space="preserve">server/scripts/seed.js, server/tests/*.test.js, .github/workflows/ci.yml</w:t>
+      </w:r>
+    </w:p>
+    <w:p>
+      <w:pPr>
+        <w:pStyle w:val="Heading3"/>
+        <w:keepNext/>
+      </w:pPr>
+      <w:r>
+        <w:t xml:space="preserve">P8  Remove legacy code, document and deploy</w:t>
       </w:r>
     </w:p>
     <w:p>

</xml_diff>

<commit_message>
Review 2: QA audit and regression verification
</commit_message>
<xml_diff>
--- a/docs/SplitStack_Prompt_Log.docx
+++ b/docs/SplitStack_Prompt_Log.docx
@@ -132,7 +132,7 @@
           <w:sz w:val="21"/>
           <w:szCs w:val="21"/>
         </w:rPr>
-        <w:t xml:space="preserve">35</w:t>
+        <w:t xml:space="preserve">37</w:t>
       </w:r>
     </w:p>
     <w:p>
@@ -568,7 +568,7 @@
                 <w:sz w:val="18"/>
                 <w:szCs w:val="18"/>
               </w:rPr>
-              <w:t xml:space="preserve">14</w:t>
+              <w:t xml:space="preserve">16</w:t>
             </w:r>
           </w:p>
         </w:tc>
@@ -5052,6 +5052,245 @@
           </w:p>
         </w:tc>
       </w:tr>
+      <w:tr>
+        <w:tc>
+          <w:tcPr>
+            <w:tcW w:type="dxa" w:w="700"/>
+            <w:shd w:fill="F7F7FB" w:color="auto" w:val="clear"/>
+            <w:tcMar>
+              <w:top w:type="dxa" w:w="60"/>
+              <w:left w:type="dxa" w:w="100"/>
+              <w:bottom w:type="dxa" w:w="60"/>
+              <w:right w:type="dxa" w:w="100"/>
+            </w:tcMar>
+          </w:tcPr>
+          <w:p>
+            <w:r>
+              <w:rPr>
+                <w:b w:val="false"/>
+                <w:bCs w:val="false"/>
+                <w:color w:val="222222"/>
+                <w:sz w:val="18"/>
+                <w:szCs w:val="18"/>
+              </w:rPr>
+              <w:t xml:space="preserve">36</w:t>
+            </w:r>
+          </w:p>
+        </w:tc>
+        <w:tc>
+          <w:tcPr>
+            <w:tcW w:type="dxa" w:w="1500"/>
+            <w:shd w:fill="F7F7FB" w:color="auto" w:val="clear"/>
+            <w:tcMar>
+              <w:top w:type="dxa" w:w="60"/>
+              <w:left w:type="dxa" w:w="100"/>
+              <w:bottom w:type="dxa" w:w="60"/>
+              <w:right w:type="dxa" w:w="100"/>
+            </w:tcMar>
+          </w:tcPr>
+          <w:p>
+            <w:r>
+              <w:rPr>
+                <w:b w:val="false"/>
+                <w:bCs w:val="false"/>
+                <w:color w:val="222222"/>
+                <w:sz w:val="18"/>
+                <w:szCs w:val="18"/>
+              </w:rPr>
+              <w:t xml:space="preserve">Review 2</w:t>
+            </w:r>
+          </w:p>
+        </w:tc>
+        <w:tc>
+          <w:tcPr>
+            <w:tcW w:type="dxa" w:w="4538"/>
+            <w:shd w:fill="F7F7FB" w:color="auto" w:val="clear"/>
+            <w:tcMar>
+              <w:top w:type="dxa" w:w="60"/>
+              <w:left w:type="dxa" w:w="100"/>
+              <w:bottom w:type="dxa" w:w="60"/>
+              <w:right w:type="dxa" w:w="100"/>
+            </w:tcMar>
+          </w:tcPr>
+          <w:p>
+            <w:r>
+              <w:rPr>
+                <w:b w:val="false"/>
+                <w:bCs w:val="false"/>
+                <w:color w:val="222222"/>
+                <w:sz w:val="18"/>
+                <w:szCs w:val="18"/>
+              </w:rPr>
+              <w:t xml:space="preserve">Request: proceed with Review 2 Step P8</w:t>
+            </w:r>
+          </w:p>
+        </w:tc>
+        <w:tc>
+          <w:tcPr>
+            <w:tcW w:type="dxa" w:w="1500"/>
+            <w:shd w:fill="F7F7FB" w:color="auto" w:val="clear"/>
+            <w:tcMar>
+              <w:top w:type="dxa" w:w="60"/>
+              <w:left w:type="dxa" w:w="100"/>
+              <w:bottom w:type="dxa" w:w="60"/>
+              <w:right w:type="dxa" w:w="100"/>
+            </w:tcMar>
+          </w:tcPr>
+          <w:p>
+            <w:r>
+              <w:rPr>
+                <w:b w:val="false"/>
+                <w:bCs w:val="false"/>
+                <w:color w:val="222222"/>
+                <w:sz w:val="18"/>
+                <w:szCs w:val="18"/>
+              </w:rPr>
+              <w:t xml:space="preserve">User prompt</w:t>
+            </w:r>
+          </w:p>
+        </w:tc>
+        <w:tc>
+          <w:tcPr>
+            <w:tcW w:type="dxa" w:w="1400"/>
+            <w:shd w:fill="F7F7FB" w:color="auto" w:val="clear"/>
+            <w:tcMar>
+              <w:top w:type="dxa" w:w="60"/>
+              <w:left w:type="dxa" w:w="100"/>
+              <w:bottom w:type="dxa" w:w="60"/>
+              <w:right w:type="dxa" w:w="100"/>
+            </w:tcMar>
+          </w:tcPr>
+          <w:p>
+            <w:r>
+              <w:rPr>
+                <w:b w:val="false"/>
+                <w:bCs w:val="false"/>
+                <w:color w:val="222222"/>
+                <w:sz w:val="18"/>
+                <w:szCs w:val="18"/>
+              </w:rPr>
+              <w:t xml:space="preserve">2026-10-17</w:t>
+            </w:r>
+          </w:p>
+        </w:tc>
+      </w:tr>
+      <w:tr>
+        <w:tc>
+          <w:tcPr>
+            <w:tcW w:type="dxa" w:w="700"/>
+            <w:tcMar>
+              <w:top w:type="dxa" w:w="60"/>
+              <w:left w:type="dxa" w:w="100"/>
+              <w:bottom w:type="dxa" w:w="60"/>
+              <w:right w:type="dxa" w:w="100"/>
+            </w:tcMar>
+          </w:tcPr>
+          <w:p>
+            <w:r>
+              <w:rPr>
+                <w:b w:val="false"/>
+                <w:bCs w:val="false"/>
+                <w:color w:val="222222"/>
+                <w:sz w:val="18"/>
+                <w:szCs w:val="18"/>
+              </w:rPr>
+              <w:t xml:space="preserve">37</w:t>
+            </w:r>
+          </w:p>
+        </w:tc>
+        <w:tc>
+          <w:tcPr>
+            <w:tcW w:type="dxa" w:w="1500"/>
+            <w:tcMar>
+              <w:top w:type="dxa" w:w="60"/>
+              <w:left w:type="dxa" w:w="100"/>
+              <w:bottom w:type="dxa" w:w="60"/>
+              <w:right w:type="dxa" w:w="100"/>
+            </w:tcMar>
+          </w:tcPr>
+          <w:p>
+            <w:r>
+              <w:rPr>
+                <w:b w:val="false"/>
+                <w:bCs w:val="false"/>
+                <w:color w:val="222222"/>
+                <w:sz w:val="18"/>
+                <w:szCs w:val="18"/>
+              </w:rPr>
+              <w:t xml:space="preserve">Review 2</w:t>
+            </w:r>
+          </w:p>
+        </w:tc>
+        <w:tc>
+          <w:tcPr>
+            <w:tcW w:type="dxa" w:w="4538"/>
+            <w:tcMar>
+              <w:top w:type="dxa" w:w="60"/>
+              <w:left w:type="dxa" w:w="100"/>
+              <w:bottom w:type="dxa" w:w="60"/>
+              <w:right w:type="dxa" w:w="100"/>
+            </w:tcMar>
+          </w:tcPr>
+          <w:p>
+            <w:r>
+              <w:rPr>
+                <w:b w:val="false"/>
+                <w:bCs w:val="false"/>
+                <w:color w:val="222222"/>
+                <w:sz w:val="18"/>
+                <w:szCs w:val="18"/>
+              </w:rPr>
+              <w:t xml:space="preserve">Review 2 QA, final audit and regression verification</w:t>
+            </w:r>
+          </w:p>
+        </w:tc>
+        <w:tc>
+          <w:tcPr>
+            <w:tcW w:type="dxa" w:w="1500"/>
+            <w:tcMar>
+              <w:top w:type="dxa" w:w="60"/>
+              <w:left w:type="dxa" w:w="100"/>
+              <w:bottom w:type="dxa" w:w="60"/>
+              <w:right w:type="dxa" w:w="100"/>
+            </w:tcMar>
+          </w:tcPr>
+          <w:p>
+            <w:r>
+              <w:rPr>
+                <w:b w:val="false"/>
+                <w:bCs w:val="false"/>
+                <w:color w:val="222222"/>
+                <w:sz w:val="18"/>
+                <w:szCs w:val="18"/>
+              </w:rPr>
+              <w:t xml:space="preserve">Working prompt</w:t>
+            </w:r>
+          </w:p>
+        </w:tc>
+        <w:tc>
+          <w:tcPr>
+            <w:tcW w:type="dxa" w:w="1400"/>
+            <w:tcMar>
+              <w:top w:type="dxa" w:w="60"/>
+              <w:left w:type="dxa" w:w="100"/>
+              <w:bottom w:type="dxa" w:w="60"/>
+              <w:right w:type="dxa" w:w="100"/>
+            </w:tcMar>
+          </w:tcPr>
+          <w:p>
+            <w:r>
+              <w:rPr>
+                <w:b w:val="false"/>
+                <w:bCs w:val="false"/>
+                <w:color w:val="222222"/>
+                <w:sz w:val="18"/>
+                <w:szCs w:val="18"/>
+              </w:rPr>
+              <w:t xml:space="preserve">2026-10-17</w:t>
+            </w:r>
+          </w:p>
+        </w:tc>
+      </w:tr>
     </w:tbl>
     <w:p>
       <w:r>
@@ -11912,20 +12151,11 @@
     </w:p>
     <w:p>
       <w:pPr>
-        <w:pStyle w:val="Heading2"/>
-        <w:spacing w:before="360"/>
-      </w:pPr>
-      <w:r>
-        <w:t xml:space="preserve">Wrap-up - Documentation, cleanup and deployment</w:t>
-      </w:r>
-    </w:p>
-    <w:p>
-      <w:pPr>
         <w:pStyle w:val="Heading3"/>
         <w:keepNext/>
       </w:pPr>
       <w:r>
-        <w:t xml:space="preserve">#13  Request: GitHub repository, website link and PDF of prompts</w:t>
+        <w:t xml:space="preserve">#36  Request: proceed with Review 2 Step P8</w:t>
       </w:r>
     </w:p>
     <w:p>
@@ -11939,7 +12169,7 @@
           <w:sz w:val="18"/>
           <w:szCs w:val="18"/>
         </w:rPr>
-        <w:t xml:space="preserve">User prompt  |  2026-10-15</w:t>
+        <w:t xml:space="preserve">User prompt  |  2026-10-17</w:t>
       </w:r>
     </w:p>
     <w:p>
@@ -11973,7 +12203,40 @@
           <w:sz w:val="19"/>
           <w:szCs w:val="19"/>
         </w:rPr>
-        <w:t xml:space="preserve">create a new repositry for this project in my gihub , and after than give me the github link and then the website link and also a pdf containing the prompts to complete project.</w:t>
+        <w:t xml:space="preserve"># P8 — Review 2: QA, Final Audit, and Commit
+Continue the SplitStack project from the current refurbish branch. P1–P7 are reported complete. This phase is P8 only.
+## 1. Safety and repository rules
+- Work only on the refurbish branch.
+- First inspect git status, git branch --show-current, git log, and the latest commit.
+- Do not switch branches, reset, rebase, amend existing commits, or discard changes.
+- Preserve the untracked docs/audit/ directory and all of its contents. Inspect it before making changes; never delete or overwrite existing audit evidence without a clear reason.
+- Preserve every legacy Flask file and directory, including app.py, config.py, Procfile, requirements.txt, modules/, templates/, static/, database/, ml/, and legacy tests.
+- Do not start P9 or implement Express, MongoDB, Mongoose, authentication, server APIs, or server OCR.
+- Do not push to any remote.
+- Do not install dependencies or change lockfiles unless strictly necessary and explicitly justified.
+- Do not claim a test or browser check passed unless you actually ran it and observed the result.
+## 2. Audit the completed work
+Review the current implementation and existing tests for P1–P7, especially:
+- Module architecture and application shell.
+- Data persistence, recovery, and logout behavior.
+- Rendering, forms, validation, and CRUD operations.
+- Group expense splitting and debt simplification.
+- Analytics, charts, budgets, forecasts, insights, search, and notifications.
+- Shopping checklist interactions and receipt-upload preview/review flow.
+- API/data-layer contracts, error handling, and regression risks.
+- Security, accessibility, and responsive behavior where applicable.
+- Preservation of the legacy Flask application.
+## 3. Run verification
+Inspect package.json first and use the existing scripts. Run the relevant checks, including:
+- npm run test:client
+- npm run lint:html
+- Legacy Python tests, including tests/test_auth_flow.py, using the project's existing environment and configuration.
+## 4. Fix issues carefully
+## 5. Documentation and audit evidence
+## 6. Commit criteria
+Use the commit message: Review 2: QA audit and regression verification
+Do not push.
+## 7. Final report</w:t>
       </w:r>
     </w:p>
     <w:p>
@@ -12001,7 +12264,7 @@
           <w:sz w:val="21"/>
           <w:szCs w:val="21"/>
         </w:rPr>
-        <w:t xml:space="preserve">Publish the project under the student's own GitHub account, host the site, and export the prompt log (including the remaining planned prompts) as a PDF.</w:t>
+        <w:t xml:space="preserve">Authorize execution of Step P8: Review 2 QA audit, full regression verification, documentation, and checkpoint commit.</w:t>
       </w:r>
     </w:p>
     <w:p>
@@ -12062,7 +12325,7 @@
           <w:sz w:val="21"/>
           <w:szCs w:val="21"/>
         </w:rPr>
-        <w:t xml:space="preserve">Done: see the following entries.</w:t>
+        <w:t xml:space="preserve">Authorized Step P8 implementation and audit.</w:t>
       </w:r>
     </w:p>
     <w:p>
@@ -12110,7 +12373,7 @@
         <w:keepNext/>
       </w:pPr>
       <w:r>
-        <w:t xml:space="preserve">#14  PDF export of the prompt log, including planned prompts</w:t>
+        <w:t xml:space="preserve">#37  Review 2 QA, final audit and regression verification</w:t>
       </w:r>
     </w:p>
     <w:p>
@@ -12124,7 +12387,7 @@
           <w:sz w:val="18"/>
           <w:szCs w:val="18"/>
         </w:rPr>
-        <w:t xml:space="preserve">Working prompt  |  2026-10-15</w:t>
+        <w:t xml:space="preserve">Working prompt  |  2026-10-17</w:t>
       </w:r>
     </w:p>
     <w:p>
@@ -12158,7 +12421,7 @@
           <w:sz w:val="19"/>
           <w:szCs w:val="19"/>
         </w:rPr>
-        <w:t xml:space="preserve">Export the prompt log to PDF with a Python reportlab script (docs/tools/build_prompt_pdf.py) that reads docs/prompt_log.json: a title page, a stage overview table, a summary of every entry, Part A with every executed prompt verbatim in a shaded box with purpose, files, result and verification, and Part B with the planned prompts that complete Review 2, Review 3 and the wrap-up, clearly marked as not yet run. Add the planned prompts to prompt_log.json and to the Word log as well, and make "npm run log" rebuild both documents.</w:t>
+        <w:t xml:space="preserve">Conduct comprehensive QA audit across completed Review 2 steps P1–P7: verify module architecture and application shell; verify data persistence, recovery, and logout behavior; verify rendering, forms, validation, and CRUD operations; verify group splitting and debt simplification; verify analytics, charts, budgets, forecasts, insights, search, and notifications; verify shopping checklist interactions and receipt-upload preview/review flow; verify API/data-layer contracts, error handling, and regression risks; verify security, accessibility, and responsive behavior; verify preservation of the legacy Flask application. Run automated client test suite, HTML linter, legacy Python test suite, document findings in docs/audit/P8_REVIEW_2_QA_AUDIT.md, update client/README.md with JavaScript architecture and concepts summary, update prompt logs, and commit with message 'Review 2: QA audit and regression verification'.</w:t>
       </w:r>
     </w:p>
     <w:p>
@@ -12186,7 +12449,7 @@
           <w:sz w:val="21"/>
           <w:szCs w:val="21"/>
         </w:rPr>
-        <w:t xml:space="preserve">Give the student a PDF containing the prompts needed to complete the whole project.</w:t>
+        <w:t xml:space="preserve">Close Review 2 with comprehensive evidence, complete test execution results, architectural review, and regression verification.</w:t>
       </w:r>
     </w:p>
     <w:p>
@@ -12219,24 +12482,24 @@
           <w:sz w:val="19"/>
           <w:szCs w:val="19"/>
         </w:rPr>
-        <w:t xml:space="preserve">docs/tools/build_prompt_pdf.py</w:t>
-      </w:r>
-    </w:p>
-    <w:p>
-      <w:pPr>
-        <w:pStyle w:val="ListParagraph"/>
-        <w:numPr>
-          <w:ilvl w:val="0"/>
-          <w:numId w:val="2"/>
-        </w:numPr>
-      </w:pPr>
-      <w:r>
-        <w:rPr>
-          <w:rFonts w:ascii="Consolas" w:cs="Consolas" w:eastAsia="Consolas" w:hAnsi="Consolas"/>
-          <w:sz w:val="19"/>
-          <w:szCs w:val="19"/>
-        </w:rPr>
-        <w:t xml:space="preserve">docs/tools/build-prompt-log.js</w:t>
+        <w:t xml:space="preserve">client/README.md</w:t>
+      </w:r>
+    </w:p>
+    <w:p>
+      <w:pPr>
+        <w:pStyle w:val="ListParagraph"/>
+        <w:numPr>
+          <w:ilvl w:val="0"/>
+          <w:numId w:val="2"/>
+        </w:numPr>
+      </w:pPr>
+      <w:r>
+        <w:rPr>
+          <w:rFonts w:ascii="Consolas" w:cs="Consolas" w:eastAsia="Consolas" w:hAnsi="Consolas"/>
+          <w:sz w:val="19"/>
+          <w:szCs w:val="19"/>
+        </w:rPr>
+        <w:t xml:space="preserve">docs/audit/P8_REVIEW_2_QA_AUDIT.md</w:t>
       </w:r>
     </w:p>
     <w:p>
@@ -12270,41 +12533,24 @@
           <w:sz w:val="19"/>
           <w:szCs w:val="19"/>
         </w:rPr>
+        <w:t xml:space="preserve">docs/SplitStack_Prompt_Log.docx</w:t>
+      </w:r>
+    </w:p>
+    <w:p>
+      <w:pPr>
+        <w:pStyle w:val="ListParagraph"/>
+        <w:numPr>
+          <w:ilvl w:val="0"/>
+          <w:numId w:val="2"/>
+        </w:numPr>
+      </w:pPr>
+      <w:r>
+        <w:rPr>
+          <w:rFonts w:ascii="Consolas" w:cs="Consolas" w:eastAsia="Consolas" w:hAnsi="Consolas"/>
+          <w:sz w:val="19"/>
+          <w:szCs w:val="19"/>
+        </w:rPr>
         <w:t xml:space="preserve">docs/SplitStack_Prompt_Log.pdf</w:t>
-      </w:r>
-    </w:p>
-    <w:p>
-      <w:pPr>
-        <w:pStyle w:val="ListParagraph"/>
-        <w:numPr>
-          <w:ilvl w:val="0"/>
-          <w:numId w:val="2"/>
-        </w:numPr>
-      </w:pPr>
-      <w:r>
-        <w:rPr>
-          <w:rFonts w:ascii="Consolas" w:cs="Consolas" w:eastAsia="Consolas" w:hAnsi="Consolas"/>
-          <w:sz w:val="19"/>
-          <w:szCs w:val="19"/>
-        </w:rPr>
-        <w:t xml:space="preserve">docs/SplitStack_Prompt_Log.docx</w:t>
-      </w:r>
-    </w:p>
-    <w:p>
-      <w:pPr>
-        <w:pStyle w:val="ListParagraph"/>
-        <w:numPr>
-          <w:ilvl w:val="0"/>
-          <w:numId w:val="2"/>
-        </w:numPr>
-      </w:pPr>
-      <w:r>
-        <w:rPr>
-          <w:rFonts w:ascii="Consolas" w:cs="Consolas" w:eastAsia="Consolas" w:hAnsi="Consolas"/>
-          <w:sz w:val="19"/>
-          <w:szCs w:val="19"/>
-        </w:rPr>
-        <w:t xml:space="preserve">package.json</w:t>
       </w:r>
     </w:p>
     <w:p>
@@ -12332,7 +12578,7 @@
           <w:sz w:val="21"/>
           <w:szCs w:val="21"/>
         </w:rPr>
-        <w:t xml:space="preserve">PDF with the executed prompts and 15 planned prompts; the Word log has the same content.</w:t>
+        <w:t xml:space="preserve">All 176 client tests passing across 52 test suites; HTML-validate passing on all 25 pages with 0 errors; legacy Python tests passing (test_master.py 100% Master Pass, test_auth_flow.py 8/8 pass, test_security.py 10/10 pass, test_regression.py 12/12 pass); documented QA findings in docs/audit/P8_REVIEW_2_QA_AUDIT.md; added Review 2 JavaScript Concepts &amp; Architecture table to client/README.md.</w:t>
       </w:r>
     </w:p>
     <w:p>
@@ -12360,7 +12606,7 @@
           <w:sz w:val="21"/>
           <w:szCs w:val="21"/>
         </w:rPr>
-        <w:t xml:space="preserve">Pages rendered to images and inspected; text extracted with pypdf.</w:t>
+        <w:t xml:space="preserve">npm run test:client (176 passed, 0 failed); npm run lint:html (0 errors); py -3 tests/test_auth_flow.py (8 passed); py -3 tests/test_master.py (8 phases passed); py -3 tests/test_security.py (10 passed); py -3 tests/test_regression.py (12 passed).</w:t>
       </w:r>
     </w:p>
     <w:p>
@@ -12376,11 +12622,20 @@
     </w:p>
     <w:p>
       <w:pPr>
+        <w:pStyle w:val="Heading2"/>
+        <w:spacing w:before="360"/>
+      </w:pPr>
+      <w:r>
+        <w:t xml:space="preserve">Wrap-up - Documentation, cleanup and deployment</w:t>
+      </w:r>
+    </w:p>
+    <w:p>
+      <w:pPr>
         <w:pStyle w:val="Heading3"/>
         <w:keepNext/>
       </w:pPr>
       <w:r>
-        <w:t xml:space="preserve">#15  Create the GitHub repository and push the code</w:t>
+        <w:t xml:space="preserve">#13  Request: GitHub repository, website link and PDF of prompts</w:t>
       </w:r>
     </w:p>
     <w:p>
@@ -12394,7 +12649,7 @@
           <w:sz w:val="18"/>
           <w:szCs w:val="18"/>
         </w:rPr>
-        <w:t xml:space="preserve">Working prompt  |  2026-10-15</w:t>
+        <w:t xml:space="preserve">User prompt  |  2026-10-15</w:t>
       </w:r>
     </w:p>
     <w:p>
@@ -12428,7 +12683,7 @@
           <w:sz w:val="19"/>
           <w:szCs w:val="19"/>
         </w:rPr>
-        <w:t xml:space="preserve">Install the official GitHub CLI with winget and sign in through the device-code flow (the student approves it in the browser). Before publishing, check that no secrets or databases are tracked, review the receipt images that are still in the commit history (they are generic sample invoices), and confirm with the student that a public repository is acceptable because the team's original repository is private. Then create the public repository MahaprabhuK/SplitStack, push the refurbish branch as main together with the legacy branch, add a GitHub Actions workflow (.github/workflows/pages.yml) that deploys the client/ folder to GitHub Pages, enable Pages with the "GitHub Actions" source, and confirm that the site responds.</w:t>
+        <w:t xml:space="preserve">create a new repositry for this project in my gihub , and after than give me the github link and then the website link and also a pdf containing the prompts to complete project.</w:t>
       </w:r>
     </w:p>
     <w:p>
@@ -12456,7 +12711,7 @@
           <w:sz w:val="21"/>
           <w:szCs w:val="21"/>
         </w:rPr>
-        <w:t xml:space="preserve">Give the student a repository link and a live website link.</w:t>
+        <w:t xml:space="preserve">Publish the project under the student's own GitHub account, host the site, and export the prompt log (including the remaining planned prompts) as a PDF.</w:t>
       </w:r>
     </w:p>
     <w:p>
@@ -12489,7 +12744,7 @@
           <w:sz w:val="19"/>
           <w:szCs w:val="19"/>
         </w:rPr>
-        <w:t xml:space="preserve">README.md</w:t>
+        <w:t xml:space="preserve">-</w:t>
       </w:r>
     </w:p>
     <w:p>
@@ -12517,7 +12772,7 @@
           <w:sz w:val="21"/>
           <w:szCs w:val="21"/>
         </w:rPr>
-        <w:t xml:space="preserve">Public repository https://github.com/MahaprabhuK/SplitStack created and the legacy branch pushed. The first push of main was rejected because it added a GitHub Actions workflow (.github/workflows/pages.yml) and the gh token lacked the "workflow" scope; the workflow file was removed and main was pushed in the next step. GitHub Pages is not set up yet (planned for the wrap-up; needs "gh auth refresh -s workflow" or a gh-pages branch).</w:t>
+        <w:t xml:space="preserve">Done: see the following entries.</w:t>
       </w:r>
     </w:p>
     <w:p>
@@ -12545,7 +12800,7 @@
           <w:sz w:val="21"/>
           <w:szCs w:val="21"/>
         </w:rPr>
-        <w:t xml:space="preserve">gh repo view; git push output.</w:t>
+        <w:t xml:space="preserve">-</w:t>
       </w:r>
     </w:p>
     <w:p>
@@ -12565,7 +12820,7 @@
         <w:keepNext/>
       </w:pPr>
       <w:r>
-        <w:t xml:space="preserve">#16  Request: hand the project over to a teammate's agent</w:t>
+        <w:t xml:space="preserve">#14  PDF export of the prompt log, including planned prompts</w:t>
       </w:r>
     </w:p>
     <w:p>
@@ -12579,7 +12834,7 @@
           <w:sz w:val="18"/>
           <w:szCs w:val="18"/>
         </w:rPr>
-        <w:t xml:space="preserve">User prompt  |  2026-10-15</w:t>
+        <w:t xml:space="preserve">Working prompt  |  2026-10-15</w:t>
       </w:r>
     </w:p>
     <w:p>
@@ -12613,7 +12868,7 @@
           <w:sz w:val="19"/>
           <w:szCs w:val="19"/>
         </w:rPr>
-        <w:t xml:space="preserve">ACTUALLY I GONNA HANDOVER THE PROJECT TO MY TEAMMATES AGENT SO HE'LL BE PULLING THE CODE AND RUNNING IN HIS SYSTEM SO GIVE PROMPT FOR THAT</w:t>
+        <w:t xml:space="preserve">Export the prompt log to PDF with a Python reportlab script (docs/tools/build_prompt_pdf.py) that reads docs/prompt_log.json: a title page, a stage overview table, a summary of every entry, Part A with every executed prompt verbatim in a shaded box with purpose, files, result and verification, and Part B with the planned prompts that complete Review 2, Review 3 and the wrap-up, clearly marked as not yet run. Add the planned prompts to prompt_log.json and to the Word log as well, and make "npm run log" rebuild both documents.</w:t>
       </w:r>
     </w:p>
     <w:p>
@@ -12641,7 +12896,7 @@
           <w:sz w:val="21"/>
           <w:szCs w:val="21"/>
         </w:rPr>
-        <w:t xml:space="preserve">Let a teammate's AI agent clone, run and continue the project.</w:t>
+        <w:t xml:space="preserve">Give the student a PDF containing the prompts needed to complete the whole project.</w:t>
       </w:r>
     </w:p>
     <w:p>
@@ -12674,7 +12929,92 @@
           <w:sz w:val="19"/>
           <w:szCs w:val="19"/>
         </w:rPr>
-        <w:t xml:space="preserve">-</w:t>
+        <w:t xml:space="preserve">docs/tools/build_prompt_pdf.py</w:t>
+      </w:r>
+    </w:p>
+    <w:p>
+      <w:pPr>
+        <w:pStyle w:val="ListParagraph"/>
+        <w:numPr>
+          <w:ilvl w:val="0"/>
+          <w:numId w:val="2"/>
+        </w:numPr>
+      </w:pPr>
+      <w:r>
+        <w:rPr>
+          <w:rFonts w:ascii="Consolas" w:cs="Consolas" w:eastAsia="Consolas" w:hAnsi="Consolas"/>
+          <w:sz w:val="19"/>
+          <w:szCs w:val="19"/>
+        </w:rPr>
+        <w:t xml:space="preserve">docs/tools/build-prompt-log.js</w:t>
+      </w:r>
+    </w:p>
+    <w:p>
+      <w:pPr>
+        <w:pStyle w:val="ListParagraph"/>
+        <w:numPr>
+          <w:ilvl w:val="0"/>
+          <w:numId w:val="2"/>
+        </w:numPr>
+      </w:pPr>
+      <w:r>
+        <w:rPr>
+          <w:rFonts w:ascii="Consolas" w:cs="Consolas" w:eastAsia="Consolas" w:hAnsi="Consolas"/>
+          <w:sz w:val="19"/>
+          <w:szCs w:val="19"/>
+        </w:rPr>
+        <w:t xml:space="preserve">docs/prompt_log.json</w:t>
+      </w:r>
+    </w:p>
+    <w:p>
+      <w:pPr>
+        <w:pStyle w:val="ListParagraph"/>
+        <w:numPr>
+          <w:ilvl w:val="0"/>
+          <w:numId w:val="2"/>
+        </w:numPr>
+      </w:pPr>
+      <w:r>
+        <w:rPr>
+          <w:rFonts w:ascii="Consolas" w:cs="Consolas" w:eastAsia="Consolas" w:hAnsi="Consolas"/>
+          <w:sz w:val="19"/>
+          <w:szCs w:val="19"/>
+        </w:rPr>
+        <w:t xml:space="preserve">docs/SplitStack_Prompt_Log.pdf</w:t>
+      </w:r>
+    </w:p>
+    <w:p>
+      <w:pPr>
+        <w:pStyle w:val="ListParagraph"/>
+        <w:numPr>
+          <w:ilvl w:val="0"/>
+          <w:numId w:val="2"/>
+        </w:numPr>
+      </w:pPr>
+      <w:r>
+        <w:rPr>
+          <w:rFonts w:ascii="Consolas" w:cs="Consolas" w:eastAsia="Consolas" w:hAnsi="Consolas"/>
+          <w:sz w:val="19"/>
+          <w:szCs w:val="19"/>
+        </w:rPr>
+        <w:t xml:space="preserve">docs/SplitStack_Prompt_Log.docx</w:t>
+      </w:r>
+    </w:p>
+    <w:p>
+      <w:pPr>
+        <w:pStyle w:val="ListParagraph"/>
+        <w:numPr>
+          <w:ilvl w:val="0"/>
+          <w:numId w:val="2"/>
+        </w:numPr>
+      </w:pPr>
+      <w:r>
+        <w:rPr>
+          <w:rFonts w:ascii="Consolas" w:cs="Consolas" w:eastAsia="Consolas" w:hAnsi="Consolas"/>
+          <w:sz w:val="19"/>
+          <w:szCs w:val="19"/>
+        </w:rPr>
+        <w:t xml:space="preserve">package.json</w:t>
       </w:r>
     </w:p>
     <w:p>
@@ -12702,7 +13042,7 @@
           <w:sz w:val="21"/>
           <w:szCs w:val="21"/>
         </w:rPr>
-        <w:t xml:space="preserve">A handover prompt was written covering: requirements per review, clone and branch, prerequisites, install/run/verify commands, repository map, known traps, the mandatory logging rule, the ordered remaining work (planned prompts P1-P15) and working rules. Noted that the new work had to be pushed to GitHub first.</w:t>
+        <w:t xml:space="preserve">PDF with the executed prompts and 15 planned prompts; the Word log has the same content.</w:t>
       </w:r>
     </w:p>
     <w:p>
@@ -12730,7 +13070,7 @@
           <w:sz w:val="21"/>
           <w:szCs w:val="21"/>
         </w:rPr>
-        <w:t xml:space="preserve">-</w:t>
+        <w:t xml:space="preserve">Pages rendered to images and inspected; text extracted with pypdf.</w:t>
       </w:r>
     </w:p>
     <w:p>
@@ -12750,7 +13090,7 @@
         <w:keepNext/>
       </w:pPr>
       <w:r>
-        <w:t xml:space="preserve">#17  Push the refurbished code to GitHub main</w:t>
+        <w:t xml:space="preserve">#15  Create the GitHub repository and push the code</w:t>
       </w:r>
     </w:p>
     <w:p>
@@ -12798,7 +13138,7 @@
           <w:sz w:val="19"/>
           <w:szCs w:val="19"/>
         </w:rPr>
-        <w:t xml:space="preserve">push it  (user prompt). Executed as: remove .github/workflows/pages.yml (the token lacks the workflow scope), replace the not-yet-existing live-site link in README.md with local run instructions, correct the earlier log entry about publishing, log the handover, rebuild the prompt logs, commit, and push the refurbish branch to main on https://github.com/MahaprabhuK/SplitStack so the teammate can clone it.</w:t>
+        <w:t xml:space="preserve">Install the official GitHub CLI with winget and sign in through the device-code flow (the student approves it in the browser). Before publishing, check that no secrets or databases are tracked, review the receipt images that are still in the commit history (they are generic sample invoices), and confirm with the student that a public repository is acceptable because the team's original repository is private. Then create the public repository MahaprabhuK/SplitStack, push the refurbish branch as main together with the legacy branch, add a GitHub Actions workflow (.github/workflows/pages.yml) that deploys the client/ folder to GitHub Pages, enable Pages with the "GitHub Actions" source, and confirm that the site responds.</w:t>
       </w:r>
     </w:p>
     <w:p>
@@ -12826,7 +13166,7 @@
           <w:sz w:val="21"/>
           <w:szCs w:val="21"/>
         </w:rPr>
-        <w:t xml:space="preserve">Make the current work available to the teammate.</w:t>
+        <w:t xml:space="preserve">Give the student a repository link and a live website link.</w:t>
       </w:r>
     </w:p>
     <w:p>
@@ -12859,75 +13199,7 @@
           <w:sz w:val="19"/>
           <w:szCs w:val="19"/>
         </w:rPr>
-        <w:t xml:space="preserve">.github/workflows/pages.yml (removed)</w:t>
-      </w:r>
-    </w:p>
-    <w:p>
-      <w:pPr>
-        <w:pStyle w:val="ListParagraph"/>
-        <w:numPr>
-          <w:ilvl w:val="0"/>
-          <w:numId w:val="2"/>
-        </w:numPr>
-      </w:pPr>
-      <w:r>
-        <w:rPr>
-          <w:rFonts w:ascii="Consolas" w:cs="Consolas" w:eastAsia="Consolas" w:hAnsi="Consolas"/>
-          <w:sz w:val="19"/>
-          <w:szCs w:val="19"/>
-        </w:rPr>
         <w:t xml:space="preserve">README.md</w:t>
-      </w:r>
-    </w:p>
-    <w:p>
-      <w:pPr>
-        <w:pStyle w:val="ListParagraph"/>
-        <w:numPr>
-          <w:ilvl w:val="0"/>
-          <w:numId w:val="2"/>
-        </w:numPr>
-      </w:pPr>
-      <w:r>
-        <w:rPr>
-          <w:rFonts w:ascii="Consolas" w:cs="Consolas" w:eastAsia="Consolas" w:hAnsi="Consolas"/>
-          <w:sz w:val="19"/>
-          <w:szCs w:val="19"/>
-        </w:rPr>
-        <w:t xml:space="preserve">docs/prompt_log.json</w:t>
-      </w:r>
-    </w:p>
-    <w:p>
-      <w:pPr>
-        <w:pStyle w:val="ListParagraph"/>
-        <w:numPr>
-          <w:ilvl w:val="0"/>
-          <w:numId w:val="2"/>
-        </w:numPr>
-      </w:pPr>
-      <w:r>
-        <w:rPr>
-          <w:rFonts w:ascii="Consolas" w:cs="Consolas" w:eastAsia="Consolas" w:hAnsi="Consolas"/>
-          <w:sz w:val="19"/>
-          <w:szCs w:val="19"/>
-        </w:rPr>
-        <w:t xml:space="preserve">docs/SplitStack_Prompt_Log.docx</w:t>
-      </w:r>
-    </w:p>
-    <w:p>
-      <w:pPr>
-        <w:pStyle w:val="ListParagraph"/>
-        <w:numPr>
-          <w:ilvl w:val="0"/>
-          <w:numId w:val="2"/>
-        </w:numPr>
-      </w:pPr>
-      <w:r>
-        <w:rPr>
-          <w:rFonts w:ascii="Consolas" w:cs="Consolas" w:eastAsia="Consolas" w:hAnsi="Consolas"/>
-          <w:sz w:val="19"/>
-          <w:szCs w:val="19"/>
-        </w:rPr>
-        <w:t xml:space="preserve">docs/SplitStack_Prompt_Log.pdf</w:t>
       </w:r>
     </w:p>
     <w:p>
@@ -12955,7 +13227,7 @@
           <w:sz w:val="21"/>
           <w:szCs w:val="21"/>
         </w:rPr>
-        <w:t xml:space="preserve">main pushed to GitHub; branches on GitHub: main (refurbished work) and legacy (original Flask app).</w:t>
+        <w:t xml:space="preserve">Public repository https://github.com/MahaprabhuK/SplitStack created and the legacy branch pushed. The first push of main was rejected because it added a GitHub Actions workflow (.github/workflows/pages.yml) and the gh token lacked the "workflow" scope; the workflow file was removed and main was pushed in the next step. GitHub Pages is not set up yet (planned for the wrap-up; needs "gh auth refresh -s workflow" or a gh-pages branch).</w:t>
       </w:r>
     </w:p>
     <w:p>
@@ -12983,7 +13255,7 @@
           <w:sz w:val="21"/>
           <w:szCs w:val="21"/>
         </w:rPr>
-        <w:t xml:space="preserve">git ls-remote shows main and legacy at the expected commits.</w:t>
+        <w:t xml:space="preserve">gh repo view; git push output.</w:t>
       </w:r>
     </w:p>
     <w:p>
@@ -13003,7 +13275,7 @@
         <w:keepNext/>
       </w:pPr>
       <w:r>
-        <w:t xml:space="preserve">#18  Request: push the code and deploy the website</w:t>
+        <w:t xml:space="preserve">#16  Request: hand the project over to a teammate's agent</w:t>
       </w:r>
     </w:p>
     <w:p>
@@ -13051,7 +13323,7 @@
           <w:sz w:val="19"/>
           <w:szCs w:val="19"/>
         </w:rPr>
-        <w:t xml:space="preserve">first push the code and deploy it</w:t>
+        <w:t xml:space="preserve">ACTUALLY I GONNA HANDOVER THE PROJECT TO MY TEAMMATES AGENT SO HE'LL BE PULLING THE CODE AND RUNNING IN HIS SYSTEM SO GIVE PROMPT FOR THAT</w:t>
       </w:r>
     </w:p>
     <w:p>
@@ -13079,7 +13351,7 @@
           <w:sz w:val="21"/>
           <w:szCs w:val="21"/>
         </w:rPr>
-        <w:t xml:space="preserve">Get the code on GitHub and the Review 1 site online.</w:t>
+        <w:t xml:space="preserve">Let a teammate's AI agent clone, run and continue the project.</w:t>
       </w:r>
     </w:p>
     <w:p>
@@ -13140,7 +13412,7 @@
           <w:sz w:val="21"/>
           <w:szCs w:val="21"/>
         </w:rPr>
-        <w:t xml:space="preserve">Handled in the next step.</w:t>
+        <w:t xml:space="preserve">A handover prompt was written covering: requirements per review, clone and branch, prerequisites, install/run/verify commands, repository map, known traps, the mandatory logging rule, the ordered remaining work (planned prompts P1-P15) and working rules. Noted that the new work had to be pushed to GitHub first.</w:t>
       </w:r>
     </w:p>
     <w:p>
@@ -13188,7 +13460,7 @@
         <w:keepNext/>
       </w:pPr>
       <w:r>
-        <w:t xml:space="preserve">#19  Deploy the client to GitHub Pages from a gh-pages branch</w:t>
+        <w:t xml:space="preserve">#17  Push the refurbished code to GitHub main</w:t>
       </w:r>
     </w:p>
     <w:p>
@@ -13236,7 +13508,7 @@
           <w:sz w:val="19"/>
           <w:szCs w:val="19"/>
         </w:rPr>
-        <w:t xml:space="preserve">Push refurbish to main and refurbish on MahaprabhuK/SplitStack. Because the token cannot push workflow files, deploy without GitHub Actions: check that client/ uses only relative links, split client/ into its own history with git subtree split, push it as the gh-pages branch, wait for GitHub Pages to publish it, then put the live link back in README.md and log the step.</w:t>
+        <w:t xml:space="preserve">push it  (user prompt). Executed as: remove .github/workflows/pages.yml (the token lacks the workflow scope), replace the not-yet-existing live-site link in README.md with local run instructions, correct the earlier log entry about publishing, log the handover, rebuild the prompt logs, commit, and push the refurbish branch to main on https://github.com/MahaprabhuK/SplitStack so the teammate can clone it.</w:t>
       </w:r>
     </w:p>
     <w:p>
@@ -13264,7 +13536,7 @@
           <w:sz w:val="21"/>
           <w:szCs w:val="21"/>
         </w:rPr>
-        <w:t xml:space="preserve">Publish the Review 1 site at a public URL without needing the workflow scope.</w:t>
+        <w:t xml:space="preserve">Make the current work available to the teammate.</w:t>
       </w:r>
     </w:p>
     <w:p>
@@ -13297,6 +13569,23 @@
           <w:sz w:val="19"/>
           <w:szCs w:val="19"/>
         </w:rPr>
+        <w:t xml:space="preserve">.github/workflows/pages.yml (removed)</w:t>
+      </w:r>
+    </w:p>
+    <w:p>
+      <w:pPr>
+        <w:pStyle w:val="ListParagraph"/>
+        <w:numPr>
+          <w:ilvl w:val="0"/>
+          <w:numId w:val="2"/>
+        </w:numPr>
+      </w:pPr>
+      <w:r>
+        <w:rPr>
+          <w:rFonts w:ascii="Consolas" w:cs="Consolas" w:eastAsia="Consolas" w:hAnsi="Consolas"/>
+          <w:sz w:val="19"/>
+          <w:szCs w:val="19"/>
+        </w:rPr>
         <w:t xml:space="preserve">README.md</w:t>
       </w:r>
     </w:p>
@@ -13315,6 +13604,40 @@
           <w:szCs w:val="19"/>
         </w:rPr>
         <w:t xml:space="preserve">docs/prompt_log.json</w:t>
+      </w:r>
+    </w:p>
+    <w:p>
+      <w:pPr>
+        <w:pStyle w:val="ListParagraph"/>
+        <w:numPr>
+          <w:ilvl w:val="0"/>
+          <w:numId w:val="2"/>
+        </w:numPr>
+      </w:pPr>
+      <w:r>
+        <w:rPr>
+          <w:rFonts w:ascii="Consolas" w:cs="Consolas" w:eastAsia="Consolas" w:hAnsi="Consolas"/>
+          <w:sz w:val="19"/>
+          <w:szCs w:val="19"/>
+        </w:rPr>
+        <w:t xml:space="preserve">docs/SplitStack_Prompt_Log.docx</w:t>
+      </w:r>
+    </w:p>
+    <w:p>
+      <w:pPr>
+        <w:pStyle w:val="ListParagraph"/>
+        <w:numPr>
+          <w:ilvl w:val="0"/>
+          <w:numId w:val="2"/>
+        </w:numPr>
+      </w:pPr>
+      <w:r>
+        <w:rPr>
+          <w:rFonts w:ascii="Consolas" w:cs="Consolas" w:eastAsia="Consolas" w:hAnsi="Consolas"/>
+          <w:sz w:val="19"/>
+          <w:szCs w:val="19"/>
+        </w:rPr>
+        <w:t xml:space="preserve">docs/SplitStack_Prompt_Log.pdf</w:t>
       </w:r>
     </w:p>
     <w:p>
@@ -13342,7 +13665,7 @@
           <w:sz w:val="21"/>
           <w:szCs w:val="21"/>
         </w:rPr>
-        <w:t xml:space="preserve">main and refurbish are on GitHub. The client/ folder is published from the gh-pages branch at https://mahaprabhuk.github.io/SplitStack/ (GitHub enabled Pages automatically). To redeploy after client changes: git subtree split --prefix client refurbish, then push that commit to gh-pages.</w:t>
+        <w:t xml:space="preserve">main pushed to GitHub; branches on GitHub: main (refurbished work) and legacy (original Flask app).</w:t>
       </w:r>
     </w:p>
     <w:p>
@@ -13370,7 +13693,7 @@
           <w:sz w:val="21"/>
           <w:szCs w:val="21"/>
         </w:rPr>
-        <w:t xml:space="preserve">git ls-remote; curl returned 200 for the home page, pages/404.html and css/base.css on the live site.</w:t>
+        <w:t xml:space="preserve">git ls-remote shows main and legacy at the expected commits.</w:t>
       </w:r>
     </w:p>
     <w:p>
@@ -13390,7 +13713,7 @@
         <w:keepNext/>
       </w:pPr>
       <w:r>
-        <w:t xml:space="preserve">#20  Request: handover prompt PDF for a teammate's agent</w:t>
+        <w:t xml:space="preserve">#18  Request: push the code and deploy the website</w:t>
       </w:r>
     </w:p>
     <w:p>
@@ -13438,7 +13761,7 @@
           <w:sz w:val="19"/>
           <w:szCs w:val="19"/>
         </w:rPr>
-        <w:t xml:space="preserve">imma handover the project to my teammate i want you to create a detailed prompt for his agent most prolly he'll use anti gravity so i want a pdf containing prompts to complete the rest of the work in the project. so create a pdf and mention its path once its created then i'll share it to him</w:t>
+        <w:t xml:space="preserve">first push the code and deploy it</w:t>
       </w:r>
     </w:p>
     <w:p>
@@ -13466,7 +13789,7 @@
           <w:sz w:val="21"/>
           <w:szCs w:val="21"/>
         </w:rPr>
-        <w:t xml:space="preserve">Let a teammate's AI agent (Antigravity) finish Review 2, Review 3 and the wrap-up.</w:t>
+        <w:t xml:space="preserve">Get the code on GitHub and the Review 1 site online.</w:t>
       </w:r>
     </w:p>
     <w:p>
@@ -13575,7 +13898,7 @@
         <w:keepNext/>
       </w:pPr>
       <w:r>
-        <w:t xml:space="preserve">#21  Handover prompts PDF</w:t>
+        <w:t xml:space="preserve">#19  Deploy the client to GitHub Pages from a gh-pages branch</w:t>
       </w:r>
     </w:p>
     <w:p>
@@ -13623,7 +13946,7 @@
           <w:sz w:val="19"/>
           <w:szCs w:val="19"/>
         </w:rPr>
-        <w:t xml:space="preserve">Write docs/tools/build_handover_pdf.py (reusing the styles of build_prompt_pdf.py) to produce docs/SplitStack_Handover_Prompts.pdf: how to use it with Antigravity, one-time setup (tools, collaborator access, MongoDB Atlas, workflow token scope), a roadmap, Prompt 0 with the full project context, rules, logging, commit/push and gh-pages redeploy procedure, the 15 planned prompts P1-P15 expanded with concrete checks and commit messages, utility prompts (status, recovery, review rehearsal) and common problems. Render pages to check the layout.</w:t>
+        <w:t xml:space="preserve">Push refurbish to main and refurbish on MahaprabhuK/SplitStack. Because the token cannot push workflow files, deploy without GitHub Actions: check that client/ uses only relative links, split client/ into its own history with git subtree split, push it as the gh-pages branch, wait for GitHub Pages to publish it, then put the live link back in README.md and log the step.</w:t>
       </w:r>
     </w:p>
     <w:p>
@@ -13651,7 +13974,7 @@
           <w:sz w:val="21"/>
           <w:szCs w:val="21"/>
         </w:rPr>
-        <w:t xml:space="preserve">Give the teammate a self-contained, ordered set of prompts.</w:t>
+        <w:t xml:space="preserve">Publish the Review 1 site at a public URL without needing the workflow scope.</w:t>
       </w:r>
     </w:p>
     <w:p>
@@ -13684,24 +14007,24 @@
           <w:sz w:val="19"/>
           <w:szCs w:val="19"/>
         </w:rPr>
-        <w:t xml:space="preserve">docs/tools/build_handover_pdf.py</w:t>
-      </w:r>
-    </w:p>
-    <w:p>
-      <w:pPr>
-        <w:pStyle w:val="ListParagraph"/>
-        <w:numPr>
-          <w:ilvl w:val="0"/>
-          <w:numId w:val="2"/>
-        </w:numPr>
-      </w:pPr>
-      <w:r>
-        <w:rPr>
-          <w:rFonts w:ascii="Consolas" w:cs="Consolas" w:eastAsia="Consolas" w:hAnsi="Consolas"/>
-          <w:sz w:val="19"/>
-          <w:szCs w:val="19"/>
-        </w:rPr>
-        <w:t xml:space="preserve">docs/SplitStack_Handover_Prompts.pdf</w:t>
+        <w:t xml:space="preserve">README.md</w:t>
+      </w:r>
+    </w:p>
+    <w:p>
+      <w:pPr>
+        <w:pStyle w:val="ListParagraph"/>
+        <w:numPr>
+          <w:ilvl w:val="0"/>
+          <w:numId w:val="2"/>
+        </w:numPr>
+      </w:pPr>
+      <w:r>
+        <w:rPr>
+          <w:rFonts w:ascii="Consolas" w:cs="Consolas" w:eastAsia="Consolas" w:hAnsi="Consolas"/>
+          <w:sz w:val="19"/>
+          <w:szCs w:val="19"/>
+        </w:rPr>
+        <w:t xml:space="preserve">docs/prompt_log.json</w:t>
       </w:r>
     </w:p>
     <w:p>
@@ -13729,7 +14052,7 @@
           <w:sz w:val="21"/>
           <w:szCs w:val="21"/>
         </w:rPr>
-        <w:t xml:space="preserve">14-page PDF created. Changes against the planned prompts: P1 adds data-page attributes and client/js/package.json (type module) for node --test; P13 keeps the localStorage implementation as a demo mode (api-local.js chosen when /api/health does not answer) so the GitHub Pages site keeps working, instead of deleting it; P9 replaces deprecated csurf with a synchronizer token; P14 uses MongoMemoryReplSet because the API uses transactions; P15 asks for confirmation before deleting the Flask files and leaves Render account steps to the student.</w:t>
+        <w:t xml:space="preserve">main and refurbish are on GitHub. The client/ folder is published from the gh-pages branch at https://mahaprabhuk.github.io/SplitStack/ (GitHub enabled Pages automatically). To redeploy after client changes: git subtree split --prefix client refurbish, then push that commit to gh-pages.</w:t>
       </w:r>
     </w:p>
     <w:p>
@@ -13757,7 +14080,7 @@
           <w:sz w:val="21"/>
           <w:szCs w:val="21"/>
         </w:rPr>
-        <w:t xml:space="preserve">Rendered pages with PyMuPDF and checked the layout of the setup, Prompt 0, step and utility pages.</w:t>
+        <w:t xml:space="preserve">git ls-remote; curl returned 200 for the home page, pages/404.html and css/base.css on the live site.</w:t>
       </w:r>
     </w:p>
     <w:p>
@@ -13772,37 +14095,12 @@
       </w:r>
     </w:p>
     <w:p>
-      <w:r>
-        <w:br w:type="page"/>
-      </w:r>
-    </w:p>
-    <w:p>
-      <w:pPr>
-        <w:pStyle w:val="Heading1"/>
-      </w:pPr>
-      <w:r>
-        <w:t xml:space="preserve">Planned prompts to complete the project</w:t>
-      </w:r>
-    </w:p>
-    <w:p>
-      <w:pPr>
-        <w:spacing w:after="80"/>
-      </w:pPr>
-      <w:r>
-        <w:rPr>
-          <w:sz w:val="21"/>
-          <w:szCs w:val="21"/>
-        </w:rPr>
-        <w:t xml:space="preserve">These prompts have not been run yet. Run them in order; after each one, move it into the log above with its result.</w:t>
-      </w:r>
-    </w:p>
-    <w:p>
       <w:pPr>
         <w:pStyle w:val="Heading3"/>
         <w:keepNext/>
       </w:pPr>
       <w:r>
-        <w:t xml:space="preserve">P1  Review 2 QA, log and commit</w:t>
+        <w:t xml:space="preserve">#20  Request: handover prompt PDF for a teammate's agent</w:t>
       </w:r>
     </w:p>
     <w:p>
@@ -13816,7 +14114,7 @@
           <w:sz w:val="18"/>
           <w:szCs w:val="18"/>
         </w:rPr>
-        <w:t xml:space="preserve">Review 2  |  Planned prompt</w:t>
+        <w:t xml:space="preserve">User prompt  |  2026-10-15</w:t>
       </w:r>
     </w:p>
     <w:p>
@@ -13850,7 +14148,7 @@
           <w:sz w:val="19"/>
           <w:szCs w:val="19"/>
         </w:rPr>
-        <w:t xml:space="preserve">Run ESLint (recommended rules, browser globals, ES2023 modules) over client/js and fix every finding; run the domain unit tests; test every page manually at 1366px and 375px in dark and light themes, using only the keyboard, and with JavaScript disabled (pages must still show their static content). Update client/README.md with the JavaScript architecture and a table of the JS concepts used and where. Add each step to docs/prompt_log.json, rebuild the Word and PDF logs, and commit "Review 2".</w:t>
+        <w:t xml:space="preserve">imma handover the project to my teammate i want you to create a detailed prompt for his agent most prolly he'll use anti gravity so i want a pdf containing prompts to complete the rest of the work in the project. so create a pdf and mention its path once its created then i'll share it to him</w:t>
       </w:r>
     </w:p>
     <w:p>
@@ -13878,7 +14176,7 @@
           <w:sz w:val="21"/>
           <w:szCs w:val="21"/>
         </w:rPr>
-        <w:t xml:space="preserve">Close Review 2 with evidence.</w:t>
+        <w:t xml:space="preserve">Let a teammate's AI agent (Antigravity) finish Review 2, Review 3 and the wrap-up.</w:t>
       </w:r>
     </w:p>
     <w:p>
@@ -13895,6 +14193,39 @@
           <w:szCs w:val="17"/>
         </w:rPr>
         <w:t xml:space="preserve">FILES</w:t>
+      </w:r>
+    </w:p>
+    <w:p>
+      <w:pPr>
+        <w:pStyle w:val="ListParagraph"/>
+        <w:numPr>
+          <w:ilvl w:val="0"/>
+          <w:numId w:val="2"/>
+        </w:numPr>
+      </w:pPr>
+      <w:r>
+        <w:rPr>
+          <w:rFonts w:ascii="Consolas" w:cs="Consolas" w:eastAsia="Consolas" w:hAnsi="Consolas"/>
+          <w:sz w:val="19"/>
+          <w:szCs w:val="19"/>
+        </w:rPr>
+        <w:t xml:space="preserve">-</w:t>
+      </w:r>
+    </w:p>
+    <w:p>
+      <w:pPr>
+        <w:spacing w:after="60" w:before="160"/>
+      </w:pPr>
+      <w:r>
+        <w:rPr>
+          <w:b/>
+          <w:bCs/>
+          <w:color w:val="4F46E5"/>
+          <w:spacing w:val="20"/>
+          <w:sz w:val="17"/>
+          <w:szCs w:val="17"/>
+        </w:rPr>
+        <w:t xml:space="preserve">RESULT</w:t>
       </w:r>
     </w:p>
     <w:p>
@@ -13906,7 +14237,46 @@
           <w:sz w:val="21"/>
           <w:szCs w:val="21"/>
         </w:rPr>
-        <w:t xml:space="preserve">eslint.config.js, client/README.md, docs/*</w:t>
+        <w:t xml:space="preserve">Handled in the next step.</w:t>
+      </w:r>
+    </w:p>
+    <w:p>
+      <w:pPr>
+        <w:spacing w:after="60" w:before="160"/>
+      </w:pPr>
+      <w:r>
+        <w:rPr>
+          <w:b/>
+          <w:bCs/>
+          <w:color w:val="4F46E5"/>
+          <w:spacing w:val="20"/>
+          <w:sz w:val="17"/>
+          <w:szCs w:val="17"/>
+        </w:rPr>
+        <w:t xml:space="preserve">VERIFICATION</w:t>
+      </w:r>
+    </w:p>
+    <w:p>
+      <w:pPr>
+        <w:spacing w:after="80"/>
+      </w:pPr>
+      <w:r>
+        <w:rPr>
+          <w:sz w:val="21"/>
+          <w:szCs w:val="21"/>
+        </w:rPr>
+        <w:t xml:space="preserve">-</w:t>
+      </w:r>
+    </w:p>
+    <w:p>
+      <w:pPr>
+        <w:pBdr>
+          <w:bottom w:val="single" w:color="D9DBE5" w:sz="4" w:space="4"/>
+        </w:pBdr>
+        <w:spacing w:after="200"/>
+      </w:pPr>
+      <w:r>
+        <w:t xml:space="preserve"/>
       </w:r>
     </w:p>
     <w:p>
@@ -13915,7 +14285,7 @@
         <w:keepNext/>
       </w:pPr>
       <w:r>
-        <w:t xml:space="preserve">P2  Express server and MongoDB connection</w:t>
+        <w:t xml:space="preserve">#21  Handover prompts PDF</w:t>
       </w:r>
     </w:p>
     <w:p>
@@ -13929,7 +14299,7 @@
           <w:sz w:val="18"/>
           <w:szCs w:val="18"/>
         </w:rPr>
-        <w:t xml:space="preserve">Review 3  |  Planned prompt</w:t>
+        <w:t xml:space="preserve">Working prompt  |  2026-10-15</w:t>
       </w:r>
     </w:p>
     <w:p>
@@ -13963,7 +14333,7 @@
           <w:sz w:val="19"/>
           <w:szCs w:val="19"/>
         </w:rPr>
-        <w:t xml:space="preserve">Create server/ as a Node.js 20+ project (ES modules) with Express: server/src/app.js (helmet with a Content Security Policy that allows only the CDNs in use, compression, express.json, express-session stored with connect-mongo, express-rate-limit on auth and upload routes, a CSRF token check on state-changing requests, and a central error handler returning JSON {error, fields}), server/src/index.js (connect to MongoDB Atlas with Mongoose using MONGODB_URI from server/.env, then listen), and static serving of client/. Add server/.env.example (MONGODB_URI, SESSION_SECRET of at least 32 characters, PORT) and npm scripts dev (node --watch) and start. Never commit .env.</w:t>
+        <w:t xml:space="preserve">Write docs/tools/build_handover_pdf.py (reusing the styles of build_prompt_pdf.py) to produce docs/SplitStack_Handover_Prompts.pdf: how to use it with Antigravity, one-time setup (tools, collaborator access, MongoDB Atlas, workflow token scope), a roadmap, Prompt 0 with the full project context, rules, logging, commit/push and gh-pages redeploy procedure, the 15 planned prompts P1-P15 expanded with concrete checks and commit messages, utility prompts (status, recovery, review rehearsal) and common problems. Render pages to check the layout.</w:t>
       </w:r>
     </w:p>
     <w:p>
@@ -13991,7 +14361,7 @@
           <w:sz w:val="21"/>
           <w:szCs w:val="21"/>
         </w:rPr>
-        <w:t xml:space="preserve">Start Review 3 with a secure, conventional Express setup.</w:t>
+        <w:t xml:space="preserve">Give the teammate a self-contained, ordered set of prompts.</w:t>
       </w:r>
     </w:p>
     <w:p>
@@ -14008,6 +14378,56 @@
           <w:szCs w:val="17"/>
         </w:rPr>
         <w:t xml:space="preserve">FILES</w:t>
+      </w:r>
+    </w:p>
+    <w:p>
+      <w:pPr>
+        <w:pStyle w:val="ListParagraph"/>
+        <w:numPr>
+          <w:ilvl w:val="0"/>
+          <w:numId w:val="2"/>
+        </w:numPr>
+      </w:pPr>
+      <w:r>
+        <w:rPr>
+          <w:rFonts w:ascii="Consolas" w:cs="Consolas" w:eastAsia="Consolas" w:hAnsi="Consolas"/>
+          <w:sz w:val="19"/>
+          <w:szCs w:val="19"/>
+        </w:rPr>
+        <w:t xml:space="preserve">docs/tools/build_handover_pdf.py</w:t>
+      </w:r>
+    </w:p>
+    <w:p>
+      <w:pPr>
+        <w:pStyle w:val="ListParagraph"/>
+        <w:numPr>
+          <w:ilvl w:val="0"/>
+          <w:numId w:val="2"/>
+        </w:numPr>
+      </w:pPr>
+      <w:r>
+        <w:rPr>
+          <w:rFonts w:ascii="Consolas" w:cs="Consolas" w:eastAsia="Consolas" w:hAnsi="Consolas"/>
+          <w:sz w:val="19"/>
+          <w:szCs w:val="19"/>
+        </w:rPr>
+        <w:t xml:space="preserve">docs/SplitStack_Handover_Prompts.pdf</w:t>
+      </w:r>
+    </w:p>
+    <w:p>
+      <w:pPr>
+        <w:spacing w:after="60" w:before="160"/>
+      </w:pPr>
+      <w:r>
+        <w:rPr>
+          <w:b/>
+          <w:bCs/>
+          <w:color w:val="4F46E5"/>
+          <w:spacing w:val="20"/>
+          <w:sz w:val="17"/>
+          <w:szCs w:val="17"/>
+        </w:rPr>
+        <w:t xml:space="preserve">RESULT</w:t>
       </w:r>
     </w:p>
     <w:p>
@@ -14019,7 +14439,71 @@
           <w:sz w:val="21"/>
           <w:szCs w:val="21"/>
         </w:rPr>
-        <w:t xml:space="preserve">server/package.json, server/src/app.js, server/src/index.js, server/.env.example</w:t>
+        <w:t xml:space="preserve">14-page PDF created. Changes against the planned prompts: P1 adds data-page attributes and client/js/package.json (type module) for node --test; P13 keeps the localStorage implementation as a demo mode (api-local.js chosen when /api/health does not answer) so the GitHub Pages site keeps working, instead of deleting it; P9 replaces deprecated csurf with a synchronizer token; P14 uses MongoMemoryReplSet because the API uses transactions; P15 asks for confirmation before deleting the Flask files and leaves Render account steps to the student.</w:t>
+      </w:r>
+    </w:p>
+    <w:p>
+      <w:pPr>
+        <w:spacing w:after="60" w:before="160"/>
+      </w:pPr>
+      <w:r>
+        <w:rPr>
+          <w:b/>
+          <w:bCs/>
+          <w:color w:val="4F46E5"/>
+          <w:spacing w:val="20"/>
+          <w:sz w:val="17"/>
+          <w:szCs w:val="17"/>
+        </w:rPr>
+        <w:t xml:space="preserve">VERIFICATION</w:t>
+      </w:r>
+    </w:p>
+    <w:p>
+      <w:pPr>
+        <w:spacing w:after="80"/>
+      </w:pPr>
+      <w:r>
+        <w:rPr>
+          <w:sz w:val="21"/>
+          <w:szCs w:val="21"/>
+        </w:rPr>
+        <w:t xml:space="preserve">Rendered pages with PyMuPDF and checked the layout of the setup, Prompt 0, step and utility pages.</w:t>
+      </w:r>
+    </w:p>
+    <w:p>
+      <w:pPr>
+        <w:pBdr>
+          <w:bottom w:val="single" w:color="D9DBE5" w:sz="4" w:space="4"/>
+        </w:pBdr>
+        <w:spacing w:after="200"/>
+      </w:pPr>
+      <w:r>
+        <w:t xml:space="preserve"/>
+      </w:r>
+    </w:p>
+    <w:p>
+      <w:r>
+        <w:br w:type="page"/>
+      </w:r>
+    </w:p>
+    <w:p>
+      <w:pPr>
+        <w:pStyle w:val="Heading1"/>
+      </w:pPr>
+      <w:r>
+        <w:t xml:space="preserve">Planned prompts to complete the project</w:t>
+      </w:r>
+    </w:p>
+    <w:p>
+      <w:pPr>
+        <w:spacing w:after="80"/>
+      </w:pPr>
+      <w:r>
+        <w:rPr>
+          <w:sz w:val="21"/>
+          <w:szCs w:val="21"/>
+        </w:rPr>
+        <w:t xml:space="preserve">These prompts have not been run yet. Run them in order; after each one, move it into the log above with its result.</w:t>
       </w:r>
     </w:p>
     <w:p>
@@ -14028,7 +14512,7 @@
         <w:keepNext/>
       </w:pPr>
       <w:r>
-        <w:t xml:space="preserve">P3  Mongoose data models</w:t>
+        <w:t xml:space="preserve">P1  Express server and MongoDB connection</w:t>
       </w:r>
     </w:p>
     <w:p>
@@ -14076,7 +14560,7 @@
           <w:sz w:val="19"/>
           <w:szCs w:val="19"/>
         </w:rPr>
-        <w:t xml:space="preserve">Design Mongoose schemas with validation and indexes to replace the 15 SQLite tables: User (name, email unique and lowercase, passwordHash, preferences), Category (user, or null for defaults; name; type expense or income; icon; color), Expense and Income (user, category, amount stored as integer paise, date, description or source, paymentMethod), Budget (user, category or null, month, year, limit; unique on user+category+month+year), Recurring (name, amount, frequency, startDate, nextDueDate, active), Group (name, description, createdBy, members [{user, role admin|member, joinedAt}]), SharedExpense (group, title, amount, paidBy, category, date, splitType, shares [{user, amount}] with a validator that the shares sum to the amount), Settlement (group, payer, payee, amount, status, completedAt), ShoppingList (owner, optional group, name, budget, items [{name, quantity, estimatedPrice, actualPrice, purchased, assignedTo}], convertedExpense), Receipt (user, file reference, merchant, date, amount, rawText, confidence) and Insight (user, kind, message, read). Explain in comments which data is embedded and which is referenced, and why.</w:t>
+        <w:t xml:space="preserve">Create server/ as a Node.js 20+ project (ES modules) with Express: server/src/app.js (helmet with a Content Security Policy that allows only the CDNs in use, compression, express.json, express-session stored with connect-mongo, express-rate-limit on auth and upload routes, a CSRF token check on state-changing requests, and a central error handler returning JSON {error, fields}), server/src/index.js (connect to MongoDB Atlas with Mongoose using MONGODB_URI from server/.env, then listen), and static serving of client/. Add server/.env.example (MONGODB_URI, SESSION_SECRET of at least 32 characters, PORT) and npm scripts dev (node --watch) and start. Never commit .env.</w:t>
       </w:r>
     </w:p>
     <w:p>
@@ -14104,7 +14588,7 @@
           <w:sz w:val="21"/>
           <w:szCs w:val="21"/>
         </w:rPr>
-        <w:t xml:space="preserve">Show MongoDB data modelling, the core of Review 3.</w:t>
+        <w:t xml:space="preserve">Start Review 3 with a secure, conventional Express setup.</w:t>
       </w:r>
     </w:p>
     <w:p>
@@ -14132,7 +14616,7 @@
           <w:sz w:val="21"/>
           <w:szCs w:val="21"/>
         </w:rPr>
-        <w:t xml:space="preserve">server/src/models/*.js</w:t>
+        <w:t xml:space="preserve">server/package.json, server/src/app.js, server/src/index.js, server/.env.example</w:t>
       </w:r>
     </w:p>
     <w:p>
@@ -14141,7 +14625,7 @@
         <w:keepNext/>
       </w:pPr>
       <w:r>
-        <w:t xml:space="preserve">P4  Authentication and REST API</w:t>
+        <w:t xml:space="preserve">P2  Mongoose data models</w:t>
       </w:r>
     </w:p>
     <w:p>
@@ -14189,7 +14673,7 @@
           <w:sz w:val="19"/>
           <w:szCs w:val="19"/>
         </w:rPr>
-        <w:t xml:space="preserve">Implement the REST API under /api with one express.Router per module, mirroring the 48 legacy Flask routes: /api/auth (register with bcrypt cost 12, login, logout, me), /api/expenses, /api/income, /api/categories, /api/budgets, /api/recurring (including toggle), /api/groups (members, shared expenses, balances, settlements, leave), /api/shopping (lists, items, toggle, convert to expense), /api/analytics (monthly, categories, forecast, insights) and /api/search. Validate every input with a schema (zod or express-validator), check ownership or group membership on every request, use MongoDB transactions for multi-document writes (recording a settlement, converting a list), and reuse the Review 2 settle.js and splits.js modules on the server so the algorithm has a single implementation.</w:t>
+        <w:t xml:space="preserve">Design Mongoose schemas with validation and indexes to replace the 15 SQLite tables: User (name, email unique and lowercase, passwordHash, preferences), Category (user, or null for defaults; name; type expense or income; icon; color), Expense and Income (user, category, amount stored as integer paise, date, description or source, paymentMethod), Budget (user, category or null, month, year, limit; unique on user+category+month+year), Recurring (name, amount, frequency, startDate, nextDueDate, active), Group (name, description, createdBy, members [{user, role admin|member, joinedAt}]), SharedExpense (group, title, amount, paidBy, category, date, splitType, shares [{user, amount}] with a validator that the shares sum to the amount), Settlement (group, payer, payee, amount, status, completedAt), ShoppingList (owner, optional group, name, budget, items [{name, quantity, estimatedPrice, actualPrice, purchased, assignedTo}], convertedExpense), Receipt (user, file reference, merchant, date, amount, rawText, confidence) and Insight (user, kind, message, read). Explain in comments which data is embedded and which is referenced, and why.</w:t>
       </w:r>
     </w:p>
     <w:p>
@@ -14217,7 +14701,7 @@
           <w:sz w:val="21"/>
           <w:szCs w:val="21"/>
         </w:rPr>
-        <w:t xml:space="preserve">Deliver the Node.js back end with a complete, secure API.</w:t>
+        <w:t xml:space="preserve">Show MongoDB data modelling, the core of Review 3.</w:t>
       </w:r>
     </w:p>
     <w:p>
@@ -14245,7 +14729,7 @@
           <w:sz w:val="21"/>
           <w:szCs w:val="21"/>
         </w:rPr>
-        <w:t xml:space="preserve">server/src/routes/*.js, server/src/services/*.js, server/src/middleware/*.js</w:t>
+        <w:t xml:space="preserve">server/src/models/*.js</w:t>
       </w:r>
     </w:p>
     <w:p>
@@ -14254,7 +14738,7 @@
         <w:keepNext/>
       </w:pPr>
       <w:r>
-        <w:t xml:space="preserve">P5  Receipt upload and server-side OCR</w:t>
+        <w:t xml:space="preserve">P3  Authentication and REST API</w:t>
       </w:r>
     </w:p>
     <w:p>
@@ -14302,7 +14786,7 @@
           <w:sz w:val="19"/>
           <w:szCs w:val="19"/>
         </w:rPr>
-        <w:t xml:space="preserve">Add POST /api/receipts using multer with memory storage, a 5 MB limit and magic-byte checks for PNG, JPEG and WEBP; preprocess with sharp (rotate from EXIF, greyscale, upscale small images, normalise); run tesseract.js with one shared worker; parse the merchant, date and total with the Review 2 parser; store the image in MongoDB GridFS (so it survives redeploys on free hosting) and the parsed fields in Receipt. GET /api/receipts/:id/image streams the image only to its owner. Confirming creates the expense; nothing becomes an expense without confirmation.</w:t>
+        <w:t xml:space="preserve">Implement the REST API under /api with one express.Router per module, mirroring the 48 legacy Flask routes: /api/auth (register with bcrypt cost 12, login, logout, me), /api/expenses, /api/income, /api/categories, /api/budgets, /api/recurring (including toggle), /api/groups (members, shared expenses, balances, settlements, leave), /api/shopping (lists, items, toggle, convert to expense), /api/analytics (monthly, categories, forecast, insights) and /api/search. Validate every input with a schema (zod or express-validator), check ownership or group membership on every request, use MongoDB transactions for multi-document writes (recording a settlement, converting a list), and reuse the Review 2 settle.js and splits.js modules on the server so the algorithm has a single implementation.</w:t>
       </w:r>
     </w:p>
     <w:p>
@@ -14330,7 +14814,7 @@
           <w:sz w:val="21"/>
           <w:szCs w:val="21"/>
         </w:rPr>
-        <w:t xml:space="preserve">Port the OCR feature to Node with persistent storage.</w:t>
+        <w:t xml:space="preserve">Deliver the Node.js back end with a complete, secure API.</w:t>
       </w:r>
     </w:p>
     <w:p>
@@ -14358,7 +14842,7 @@
           <w:sz w:val="21"/>
           <w:szCs w:val="21"/>
         </w:rPr>
-        <w:t xml:space="preserve">server/src/routes/receipts.js, server/src/services/ocr.js</w:t>
+        <w:t xml:space="preserve">server/src/routes/*.js, server/src/services/*.js, server/src/middleware/*.js</w:t>
       </w:r>
     </w:p>
     <w:p>
@@ -14367,7 +14851,7 @@
         <w:keepNext/>
       </w:pPr>
       <w:r>
-        <w:t xml:space="preserve">P6  Connect the client to the API</w:t>
+        <w:t xml:space="preserve">P4  Receipt upload and server-side OCR</w:t>
       </w:r>
     </w:p>
     <w:p>
@@ -14415,7 +14899,7 @@
           <w:sz w:val="19"/>
           <w:szCs w:val="19"/>
         </w:rPr>
-        <w:t xml:space="preserve">Re-implement client/js/data/api.js with fetch() against /api, sending credentials and the CSRF token header, mapping HTTP errors to the same {field, message} errors the pages already handle, and showing a toast when offline. Remove the localStorage store except for the theme preference. Because the page code depends only on api.js, no page module should need changes; confirm this by running every flow end to end against a local server connected to Atlas.</w:t>
+        <w:t xml:space="preserve">Add POST /api/receipts using multer with memory storage, a 5 MB limit and magic-byte checks for PNG, JPEG and WEBP; preprocess with sharp (rotate from EXIF, greyscale, upscale small images, normalise); run tesseract.js with one shared worker; parse the merchant, date and total with the Review 2 parser; store the image in MongoDB GridFS (so it survives redeploys on free hosting) and the parsed fields in Receipt. GET /api/receipts/:id/image streams the image only to its owner. Confirming creates the expense; nothing becomes an expense without confirmation.</w:t>
       </w:r>
     </w:p>
     <w:p>
@@ -14443,7 +14927,7 @@
           <w:sz w:val="21"/>
           <w:szCs w:val="21"/>
         </w:rPr>
-        <w:t xml:space="preserve">Finish the full-stack integration.</w:t>
+        <w:t xml:space="preserve">Port the OCR feature to Node with persistent storage.</w:t>
       </w:r>
     </w:p>
     <w:p>
@@ -14471,7 +14955,7 @@
           <w:sz w:val="21"/>
           <w:szCs w:val="21"/>
         </w:rPr>
-        <w:t xml:space="preserve">client/js/data/api.js</w:t>
+        <w:t xml:space="preserve">server/src/routes/receipts.js, server/src/services/ocr.js</w:t>
       </w:r>
     </w:p>
     <w:p>
@@ -14480,7 +14964,7 @@
         <w:keepNext/>
       </w:pPr>
       <w:r>
-        <w:t xml:space="preserve">P7  Seed data and automated tests</w:t>
+        <w:t xml:space="preserve">P5  Connect the client to the API</w:t>
       </w:r>
     </w:p>
     <w:p>
@@ -14528,7 +15012,7 @@
           <w:sz w:val="19"/>
           <w:szCs w:val="19"/>
         </w:rPr>
-        <w:t xml:space="preserve">Add server/scripts/seed.js that creates the demo user, categories, six months of expenses and income, budgets, recurring payments, the three groups with shared expenses, and shopping lists. It must be idempotent and must refuse to run against a database whose name does not end in -dev or -test unless --force is passed. Write Jest + Supertest tests using mongodb-memory-server for auth, ownership checks, CSRF rejection, rate limiting, split validation, the settlement algorithm, budget status, convert-to-expense duplicate prevention and receipt upload validation, covering what the 47 legacy Python tests checked. Add an npm test script and a GitHub Actions workflow that runs lint and tests on every push.</w:t>
+        <w:t xml:space="preserve">Re-implement client/js/data/api.js with fetch() against /api, sending credentials and the CSRF token header, mapping HTTP errors to the same {field, message} errors the pages already handle, and showing a toast when offline. Remove the localStorage store except for the theme preference. Because the page code depends only on api.js, no page module should need changes; confirm this by running every flow end to end against a local server connected to Atlas.</w:t>
       </w:r>
     </w:p>
     <w:p>
@@ -14556,7 +15040,7 @@
           <w:sz w:val="21"/>
           <w:szCs w:val="21"/>
         </w:rPr>
-        <w:t xml:space="preserve">Prove the back end works and keep it working.</w:t>
+        <w:t xml:space="preserve">Finish the full-stack integration.</w:t>
       </w:r>
     </w:p>
     <w:p>
@@ -14584,7 +15068,7 @@
           <w:sz w:val="21"/>
           <w:szCs w:val="21"/>
         </w:rPr>
-        <w:t xml:space="preserve">server/scripts/seed.js, server/tests/*.test.js, .github/workflows/ci.yml</w:t>
+        <w:t xml:space="preserve">client/js/data/api.js</w:t>
       </w:r>
     </w:p>
     <w:p>
@@ -14593,7 +15077,120 @@
         <w:keepNext/>
       </w:pPr>
       <w:r>
-        <w:t xml:space="preserve">P8  Remove legacy code, document and deploy</w:t>
+        <w:t xml:space="preserve">P6  Seed data and automated tests</w:t>
+      </w:r>
+    </w:p>
+    <w:p>
+      <w:pPr>
+        <w:keepNext/>
+        <w:spacing w:after="60"/>
+      </w:pPr>
+      <w:r>
+        <w:rPr>
+          <w:color w:val="5B6475"/>
+          <w:sz w:val="18"/>
+          <w:szCs w:val="18"/>
+        </w:rPr>
+        <w:t xml:space="preserve">Review 3  |  Planned prompt</w:t>
+      </w:r>
+    </w:p>
+    <w:p>
+      <w:pPr>
+        <w:spacing w:after="60" w:before="160"/>
+      </w:pPr>
+      <w:r>
+        <w:rPr>
+          <w:b/>
+          <w:bCs/>
+          <w:color w:val="4F46E5"/>
+          <w:spacing w:val="20"/>
+          <w:sz w:val="17"/>
+          <w:szCs w:val="17"/>
+        </w:rPr>
+        <w:t xml:space="preserve">PROMPT</w:t>
+      </w:r>
+    </w:p>
+    <w:p>
+      <w:pPr>
+        <w:pBdr>
+          <w:left w:val="single" w:color="4F46E5" w:sz="18" w:space="8"/>
+        </w:pBdr>
+        <w:shd w:fill="F1F2F8" w:color="auto" w:val="clear"/>
+        <w:spacing w:after="120" w:before="40" w:line="276"/>
+        <w:ind w:left="160" w:right="160"/>
+      </w:pPr>
+      <w:r>
+        <w:rPr>
+          <w:rFonts w:ascii="Consolas" w:cs="Consolas" w:eastAsia="Consolas" w:hAnsi="Consolas"/>
+          <w:sz w:val="19"/>
+          <w:szCs w:val="19"/>
+        </w:rPr>
+        <w:t xml:space="preserve">Add server/scripts/seed.js that creates the demo user, categories, six months of expenses and income, budgets, recurring payments, the three groups with shared expenses, and shopping lists. It must be idempotent and must refuse to run against a database whose name does not end in -dev or -test unless --force is passed. Write Jest + Supertest tests using mongodb-memory-server for auth, ownership checks, CSRF rejection, rate limiting, split validation, the settlement algorithm, budget status, convert-to-expense duplicate prevention and receipt upload validation, covering what the 47 legacy Python tests checked. Add an npm test script and a GitHub Actions workflow that runs lint and tests on every push.</w:t>
+      </w:r>
+    </w:p>
+    <w:p>
+      <w:pPr>
+        <w:spacing w:after="60" w:before="160"/>
+      </w:pPr>
+      <w:r>
+        <w:rPr>
+          <w:b/>
+          <w:bCs/>
+          <w:color w:val="4F46E5"/>
+          <w:spacing w:val="20"/>
+          <w:sz w:val="17"/>
+          <w:szCs w:val="17"/>
+        </w:rPr>
+        <w:t xml:space="preserve">PURPOSE</w:t>
+      </w:r>
+    </w:p>
+    <w:p>
+      <w:pPr>
+        <w:spacing w:after="80"/>
+      </w:pPr>
+      <w:r>
+        <w:rPr>
+          <w:sz w:val="21"/>
+          <w:szCs w:val="21"/>
+        </w:rPr>
+        <w:t xml:space="preserve">Prove the back end works and keep it working.</w:t>
+      </w:r>
+    </w:p>
+    <w:p>
+      <w:pPr>
+        <w:spacing w:after="60" w:before="160"/>
+      </w:pPr>
+      <w:r>
+        <w:rPr>
+          <w:b/>
+          <w:bCs/>
+          <w:color w:val="4F46E5"/>
+          <w:spacing w:val="20"/>
+          <w:sz w:val="17"/>
+          <w:szCs w:val="17"/>
+        </w:rPr>
+        <w:t xml:space="preserve">FILES</w:t>
+      </w:r>
+    </w:p>
+    <w:p>
+      <w:pPr>
+        <w:spacing w:after="80"/>
+      </w:pPr>
+      <w:r>
+        <w:rPr>
+          <w:sz w:val="21"/>
+          <w:szCs w:val="21"/>
+        </w:rPr>
+        <w:t xml:space="preserve">server/scripts/seed.js, server/tests/*.test.js, .github/workflows/ci.yml</w:t>
+      </w:r>
+    </w:p>
+    <w:p>
+      <w:pPr>
+        <w:pStyle w:val="Heading3"/>
+        <w:keepNext/>
+      </w:pPr>
+      <w:r>
+        <w:t xml:space="preserve">P7  Remove legacy code, document and deploy</w:t>
       </w:r>
     </w:p>
     <w:p>

</xml_diff>

<commit_message>
Review 3: Express server foundation
</commit_message>
<xml_diff>
--- a/docs/SplitStack_Prompt_Log.docx
+++ b/docs/SplitStack_Prompt_Log.docx
@@ -132,7 +132,7 @@
           <w:sz w:val="21"/>
           <w:szCs w:val="21"/>
         </w:rPr>
-        <w:t xml:space="preserve">37</w:t>
+        <w:t xml:space="preserve">39</w:t>
       </w:r>
     </w:p>
     <w:p>
@@ -639,7 +639,7 @@
                 <w:sz w:val="18"/>
                 <w:szCs w:val="18"/>
               </w:rPr>
-              <w:t xml:space="preserve">0</w:t>
+              <w:t xml:space="preserve">2</w:t>
             </w:r>
           </w:p>
         </w:tc>
@@ -5241,6 +5241,245 @@
                 <w:szCs w:val="18"/>
               </w:rPr>
               <w:t xml:space="preserve">Review 2 QA, final audit and regression verification</w:t>
+            </w:r>
+          </w:p>
+        </w:tc>
+        <w:tc>
+          <w:tcPr>
+            <w:tcW w:type="dxa" w:w="1500"/>
+            <w:tcMar>
+              <w:top w:type="dxa" w:w="60"/>
+              <w:left w:type="dxa" w:w="100"/>
+              <w:bottom w:type="dxa" w:w="60"/>
+              <w:right w:type="dxa" w:w="100"/>
+            </w:tcMar>
+          </w:tcPr>
+          <w:p>
+            <w:r>
+              <w:rPr>
+                <w:b w:val="false"/>
+                <w:bCs w:val="false"/>
+                <w:color w:val="222222"/>
+                <w:sz w:val="18"/>
+                <w:szCs w:val="18"/>
+              </w:rPr>
+              <w:t xml:space="preserve">Working prompt</w:t>
+            </w:r>
+          </w:p>
+        </w:tc>
+        <w:tc>
+          <w:tcPr>
+            <w:tcW w:type="dxa" w:w="1400"/>
+            <w:tcMar>
+              <w:top w:type="dxa" w:w="60"/>
+              <w:left w:type="dxa" w:w="100"/>
+              <w:bottom w:type="dxa" w:w="60"/>
+              <w:right w:type="dxa" w:w="100"/>
+            </w:tcMar>
+          </w:tcPr>
+          <w:p>
+            <w:r>
+              <w:rPr>
+                <w:b w:val="false"/>
+                <w:bCs w:val="false"/>
+                <w:color w:val="222222"/>
+                <w:sz w:val="18"/>
+                <w:szCs w:val="18"/>
+              </w:rPr>
+              <w:t xml:space="preserve">2026-10-17</w:t>
+            </w:r>
+          </w:p>
+        </w:tc>
+      </w:tr>
+      <w:tr>
+        <w:tc>
+          <w:tcPr>
+            <w:tcW w:type="dxa" w:w="700"/>
+            <w:shd w:fill="F7F7FB" w:color="auto" w:val="clear"/>
+            <w:tcMar>
+              <w:top w:type="dxa" w:w="60"/>
+              <w:left w:type="dxa" w:w="100"/>
+              <w:bottom w:type="dxa" w:w="60"/>
+              <w:right w:type="dxa" w:w="100"/>
+            </w:tcMar>
+          </w:tcPr>
+          <w:p>
+            <w:r>
+              <w:rPr>
+                <w:b w:val="false"/>
+                <w:bCs w:val="false"/>
+                <w:color w:val="222222"/>
+                <w:sz w:val="18"/>
+                <w:szCs w:val="18"/>
+              </w:rPr>
+              <w:t xml:space="preserve">38</w:t>
+            </w:r>
+          </w:p>
+        </w:tc>
+        <w:tc>
+          <w:tcPr>
+            <w:tcW w:type="dxa" w:w="1500"/>
+            <w:shd w:fill="F7F7FB" w:color="auto" w:val="clear"/>
+            <w:tcMar>
+              <w:top w:type="dxa" w:w="60"/>
+              <w:left w:type="dxa" w:w="100"/>
+              <w:bottom w:type="dxa" w:w="60"/>
+              <w:right w:type="dxa" w:w="100"/>
+            </w:tcMar>
+          </w:tcPr>
+          <w:p>
+            <w:r>
+              <w:rPr>
+                <w:b w:val="false"/>
+                <w:bCs w:val="false"/>
+                <w:color w:val="222222"/>
+                <w:sz w:val="18"/>
+                <w:szCs w:val="18"/>
+              </w:rPr>
+              <w:t xml:space="preserve">Review 3</w:t>
+            </w:r>
+          </w:p>
+        </w:tc>
+        <w:tc>
+          <w:tcPr>
+            <w:tcW w:type="dxa" w:w="4538"/>
+            <w:shd w:fill="F7F7FB" w:color="auto" w:val="clear"/>
+            <w:tcMar>
+              <w:top w:type="dxa" w:w="60"/>
+              <w:left w:type="dxa" w:w="100"/>
+              <w:bottom w:type="dxa" w:w="60"/>
+              <w:right w:type="dxa" w:w="100"/>
+            </w:tcMar>
+          </w:tcPr>
+          <w:p>
+            <w:r>
+              <w:rPr>
+                <w:b w:val="false"/>
+                <w:bCs w:val="false"/>
+                <w:color w:val="222222"/>
+                <w:sz w:val="18"/>
+                <w:szCs w:val="18"/>
+              </w:rPr>
+              <w:t xml:space="preserve">Request: proceed with Review 3 Step P9</w:t>
+            </w:r>
+          </w:p>
+        </w:tc>
+        <w:tc>
+          <w:tcPr>
+            <w:tcW w:type="dxa" w:w="1500"/>
+            <w:shd w:fill="F7F7FB" w:color="auto" w:val="clear"/>
+            <w:tcMar>
+              <w:top w:type="dxa" w:w="60"/>
+              <w:left w:type="dxa" w:w="100"/>
+              <w:bottom w:type="dxa" w:w="60"/>
+              <w:right w:type="dxa" w:w="100"/>
+            </w:tcMar>
+          </w:tcPr>
+          <w:p>
+            <w:r>
+              <w:rPr>
+                <w:b w:val="false"/>
+                <w:bCs w:val="false"/>
+                <w:color w:val="222222"/>
+                <w:sz w:val="18"/>
+                <w:szCs w:val="18"/>
+              </w:rPr>
+              <w:t xml:space="preserve">User prompt</w:t>
+            </w:r>
+          </w:p>
+        </w:tc>
+        <w:tc>
+          <w:tcPr>
+            <w:tcW w:type="dxa" w:w="1400"/>
+            <w:shd w:fill="F7F7FB" w:color="auto" w:val="clear"/>
+            <w:tcMar>
+              <w:top w:type="dxa" w:w="60"/>
+              <w:left w:type="dxa" w:w="100"/>
+              <w:bottom w:type="dxa" w:w="60"/>
+              <w:right w:type="dxa" w:w="100"/>
+            </w:tcMar>
+          </w:tcPr>
+          <w:p>
+            <w:r>
+              <w:rPr>
+                <w:b w:val="false"/>
+                <w:bCs w:val="false"/>
+                <w:color w:val="222222"/>
+                <w:sz w:val="18"/>
+                <w:szCs w:val="18"/>
+              </w:rPr>
+              <w:t xml:space="preserve">2026-10-17</w:t>
+            </w:r>
+          </w:p>
+        </w:tc>
+      </w:tr>
+      <w:tr>
+        <w:tc>
+          <w:tcPr>
+            <w:tcW w:type="dxa" w:w="700"/>
+            <w:tcMar>
+              <w:top w:type="dxa" w:w="60"/>
+              <w:left w:type="dxa" w:w="100"/>
+              <w:bottom w:type="dxa" w:w="60"/>
+              <w:right w:type="dxa" w:w="100"/>
+            </w:tcMar>
+          </w:tcPr>
+          <w:p>
+            <w:r>
+              <w:rPr>
+                <w:b w:val="false"/>
+                <w:bCs w:val="false"/>
+                <w:color w:val="222222"/>
+                <w:sz w:val="18"/>
+                <w:szCs w:val="18"/>
+              </w:rPr>
+              <w:t xml:space="preserve">39</w:t>
+            </w:r>
+          </w:p>
+        </w:tc>
+        <w:tc>
+          <w:tcPr>
+            <w:tcW w:type="dxa" w:w="1500"/>
+            <w:tcMar>
+              <w:top w:type="dxa" w:w="60"/>
+              <w:left w:type="dxa" w:w="100"/>
+              <w:bottom w:type="dxa" w:w="60"/>
+              <w:right w:type="dxa" w:w="100"/>
+            </w:tcMar>
+          </w:tcPr>
+          <w:p>
+            <w:r>
+              <w:rPr>
+                <w:b w:val="false"/>
+                <w:bCs w:val="false"/>
+                <w:color w:val="222222"/>
+                <w:sz w:val="18"/>
+                <w:szCs w:val="18"/>
+              </w:rPr>
+              <w:t xml:space="preserve">Review 3</w:t>
+            </w:r>
+          </w:p>
+        </w:tc>
+        <w:tc>
+          <w:tcPr>
+            <w:tcW w:type="dxa" w:w="4538"/>
+            <w:tcMar>
+              <w:top w:type="dxa" w:w="60"/>
+              <w:left w:type="dxa" w:w="100"/>
+              <w:bottom w:type="dxa" w:w="60"/>
+              <w:right w:type="dxa" w:w="100"/>
+            </w:tcMar>
+          </w:tcPr>
+          <w:p>
+            <w:r>
+              <w:rPr>
+                <w:b w:val="false"/>
+                <w:bCs w:val="false"/>
+                <w:color w:val="222222"/>
+                <w:sz w:val="18"/>
+                <w:szCs w:val="18"/>
+              </w:rPr>
+              <w:t xml:space="preserve">Express server foundation</w:t>
             </w:r>
           </w:p>
         </w:tc>
@@ -12626,7 +12865,7 @@
         <w:spacing w:before="360"/>
       </w:pPr>
       <w:r>
-        <w:t xml:space="preserve">Wrap-up - Documentation, cleanup and deployment</w:t>
+        <w:t xml:space="preserve">Review 3 - Node.js + MongoDB - Express REST API, Mongoose models, authentication, OCR</w:t>
       </w:r>
     </w:p>
     <w:p>
@@ -12635,7 +12874,7 @@
         <w:keepNext/>
       </w:pPr>
       <w:r>
-        <w:t xml:space="preserve">#13  Request: GitHub repository, website link and PDF of prompts</w:t>
+        <w:t xml:space="preserve">#38  Request: proceed with Review 3 Step P9</w:t>
       </w:r>
     </w:p>
     <w:p>
@@ -12649,7 +12888,7 @@
           <w:sz w:val="18"/>
           <w:szCs w:val="18"/>
         </w:rPr>
-        <w:t xml:space="preserve">User prompt  |  2026-10-15</w:t>
+        <w:t xml:space="preserve">User prompt  |  2026-10-17</w:t>
       </w:r>
     </w:p>
     <w:p>
@@ -12683,7 +12922,50 @@
           <w:sz w:val="19"/>
           <w:szCs w:val="19"/>
         </w:rPr>
-        <w:t xml:space="preserve">create a new repositry for this project in my gihub , and after than give me the github link and then the website link and also a pdf containing the prompts to complete project.</w:t>
+        <w:t xml:space="preserve"># P9 — Review 3: Node.js and Express Backend Foundation
+Begin phase P9 only for the SplitStack project.
+## Repository safety
+- Work only on the refurbish branch.
+- First inspect the branch, working tree, recent commits, package.json, existing client API contract, README files, and current directory structure.
+- Confirm that commit 82b648b is present before proceeding.
+- Do not push to any remote.
+- Do not reset, rebase, amend, or discard changes.
+- Preserve all legacy Flask files and directories, including app.py, config.py, Procfile, requirements.txt, modules/, templates/, static/, database/, ml/, and legacy tests.
+- Preserve all existing docs/audit/ evidence.
+- Do not implement P10–P15 in this phase.
+## Objective
+Create the minimal, maintainable Node.js and Express server foundation that later phases can extend.
+## Implementation
+- Establish a clearly separated Node.js server entry point.
+- Configure Express with appropriate JSON parsing, environment-based configuration, and a simple health-check endpoint.
+- Add sensible centralized error handling and a not-found response.
+- Use environment variables for configurable host/port settings; provide a safe example environment file if needed, without real secrets.
+- Keep development configuration separate from production assumptions.
+- Add a basic server test using the repository’s existing test conventions where practical.
+- Document how to install dependencies, configure the environment, start the server, check its health endpoint, and run its tests.
+- Keep the implementation small and consistent with the current project architecture.
+## Security and quality
+- Do not hardcode credentials or secrets.
+- Do not log passwords, tokens, or sensitive user data.
+- Do not enable permissive CORS without a demonstrated need; document any origin configuration.
+- Do not claim the server is production-ready.
+- Avoid unrelated frontend changes.
+- Do not connect to MongoDB yet unless an existing project requirement explicitly makes it necessary; database models and connection work belong to P10.
+- Do not implement authentication or REST resource endpoints yet; those belong to P11.
+- Do not implement OCR or receipt file storage; those belong to P12.
+## Verification
+- Run the relevant server tests and existing client tests.
+- Run the HTML linter if any frontend-facing files change.
+- Report exact commands, observed outcomes, and any blocked checks.
+- Inspect the complete diff and ensure legacy Flask files remain untouched.
+## Documentation and commit
+- Update the appropriate README and prompt log using the established project workflow.
+- Add a P9 audit entry while preserving existing audit files.
+- Stage only reviewed P9 files and intended documentation.
+- Commit only after reviewing the diff and checking for accidental secrets or unrelated changes.
+- Commit message: Review 3: Express server foundation
+- Do not push.
+## Final report</w:t>
       </w:r>
     </w:p>
     <w:p>
@@ -12711,7 +12993,7 @@
           <w:sz w:val="21"/>
           <w:szCs w:val="21"/>
         </w:rPr>
-        <w:t xml:space="preserve">Publish the project under the student's own GitHub account, host the site, and export the prompt log (including the remaining planned prompts) as a PDF.</w:t>
+        <w:t xml:space="preserve">Authorize execution of Step P9: Node.js and Express backend foundation.</w:t>
       </w:r>
     </w:p>
     <w:p>
@@ -12772,7 +13054,7 @@
           <w:sz w:val="21"/>
           <w:szCs w:val="21"/>
         </w:rPr>
-        <w:t xml:space="preserve">Done: see the following entries.</w:t>
+        <w:t xml:space="preserve">Authorized Step P9 implementation.</w:t>
       </w:r>
     </w:p>
     <w:p>
@@ -12820,7 +13102,7 @@
         <w:keepNext/>
       </w:pPr>
       <w:r>
-        <w:t xml:space="preserve">#14  PDF export of the prompt log, including planned prompts</w:t>
+        <w:t xml:space="preserve">#39  Express server foundation</w:t>
       </w:r>
     </w:p>
     <w:p>
@@ -12834,7 +13116,7 @@
           <w:sz w:val="18"/>
           <w:szCs w:val="18"/>
         </w:rPr>
-        <w:t xml:space="preserve">Working prompt  |  2026-10-15</w:t>
+        <w:t xml:space="preserve">Working prompt  |  2026-10-17</w:t>
       </w:r>
     </w:p>
     <w:p>
@@ -12868,7 +13150,7 @@
           <w:sz w:val="19"/>
           <w:szCs w:val="19"/>
         </w:rPr>
-        <w:t xml:space="preserve">Export the prompt log to PDF with a Python reportlab script (docs/tools/build_prompt_pdf.py) that reads docs/prompt_log.json: a title page, a stage overview table, a summary of every entry, Part A with every executed prompt verbatim in a shaded box with purpose, files, result and verification, and Part B with the planned prompts that complete Review 2, Review 3 and the wrap-up, clearly marked as not yet run. Add the planned prompts to prompt_log.json and to the Word log as well, and make "npm run log" rebuild both documents.</w:t>
+        <w:t xml:space="preserve">Create server/ as a Node.js 20+ project (ES modules) with Express: server/package.json with minimal dependencies (express, dotenv) and scripts start, dev, test; server/src/config.js with environment configuration, default port 3000, host localhost, and validation; server/src/app.js with createApp factory, express.json(limit: 100kb), safe request logging, health-check endpoint GET /api/health returning status, uptime, timestamp, environment, service, version, static client asset serving, catch-all 404 handler returning JSON, and centralized error handling middleware; server/src/index.js entry point with graceful SIGINT/SIGTERM shutdown; server/.env.example with safe configuration template; server/tests/server.test.js with automated tests for health check, 404 handler, JSON parsing, error formatting, and static frontend; server/README.md; add server and test:server scripts to root package.json; document P9 audit in docs/audit/P9_EXPRESS_FOUNDATION_AUDIT.md and update prompt log.</w:t>
       </w:r>
     </w:p>
     <w:p>
@@ -12896,7 +13178,7 @@
           <w:sz w:val="21"/>
           <w:szCs w:val="21"/>
         </w:rPr>
-        <w:t xml:space="preserve">Give the student a PDF containing the prompts needed to complete the whole project.</w:t>
+        <w:t xml:space="preserve">Establish the minimal, maintainable Node.js and Express backend foundation for Review 3.</w:t>
       </w:r>
     </w:p>
     <w:p>
@@ -12929,24 +13211,177 @@
           <w:sz w:val="19"/>
           <w:szCs w:val="19"/>
         </w:rPr>
-        <w:t xml:space="preserve">docs/tools/build_prompt_pdf.py</w:t>
-      </w:r>
-    </w:p>
-    <w:p>
-      <w:pPr>
-        <w:pStyle w:val="ListParagraph"/>
-        <w:numPr>
-          <w:ilvl w:val="0"/>
-          <w:numId w:val="2"/>
-        </w:numPr>
-      </w:pPr>
-      <w:r>
-        <w:rPr>
-          <w:rFonts w:ascii="Consolas" w:cs="Consolas" w:eastAsia="Consolas" w:hAnsi="Consolas"/>
-          <w:sz w:val="19"/>
-          <w:szCs w:val="19"/>
-        </w:rPr>
-        <w:t xml:space="preserve">docs/tools/build-prompt-log.js</w:t>
+        <w:t xml:space="preserve">server/package.json</w:t>
+      </w:r>
+    </w:p>
+    <w:p>
+      <w:pPr>
+        <w:pStyle w:val="ListParagraph"/>
+        <w:numPr>
+          <w:ilvl w:val="0"/>
+          <w:numId w:val="2"/>
+        </w:numPr>
+      </w:pPr>
+      <w:r>
+        <w:rPr>
+          <w:rFonts w:ascii="Consolas" w:cs="Consolas" w:eastAsia="Consolas" w:hAnsi="Consolas"/>
+          <w:sz w:val="19"/>
+          <w:szCs w:val="19"/>
+        </w:rPr>
+        <w:t xml:space="preserve">server/package-lock.json</w:t>
+      </w:r>
+    </w:p>
+    <w:p>
+      <w:pPr>
+        <w:pStyle w:val="ListParagraph"/>
+        <w:numPr>
+          <w:ilvl w:val="0"/>
+          <w:numId w:val="2"/>
+        </w:numPr>
+      </w:pPr>
+      <w:r>
+        <w:rPr>
+          <w:rFonts w:ascii="Consolas" w:cs="Consolas" w:eastAsia="Consolas" w:hAnsi="Consolas"/>
+          <w:sz w:val="19"/>
+          <w:szCs w:val="19"/>
+        </w:rPr>
+        <w:t xml:space="preserve">server/.env.example</w:t>
+      </w:r>
+    </w:p>
+    <w:p>
+      <w:pPr>
+        <w:pStyle w:val="ListParagraph"/>
+        <w:numPr>
+          <w:ilvl w:val="0"/>
+          <w:numId w:val="2"/>
+        </w:numPr>
+      </w:pPr>
+      <w:r>
+        <w:rPr>
+          <w:rFonts w:ascii="Consolas" w:cs="Consolas" w:eastAsia="Consolas" w:hAnsi="Consolas"/>
+          <w:sz w:val="19"/>
+          <w:szCs w:val="19"/>
+        </w:rPr>
+        <w:t xml:space="preserve">server/src/config.js</w:t>
+      </w:r>
+    </w:p>
+    <w:p>
+      <w:pPr>
+        <w:pStyle w:val="ListParagraph"/>
+        <w:numPr>
+          <w:ilvl w:val="0"/>
+          <w:numId w:val="2"/>
+        </w:numPr>
+      </w:pPr>
+      <w:r>
+        <w:rPr>
+          <w:rFonts w:ascii="Consolas" w:cs="Consolas" w:eastAsia="Consolas" w:hAnsi="Consolas"/>
+          <w:sz w:val="19"/>
+          <w:szCs w:val="19"/>
+        </w:rPr>
+        <w:t xml:space="preserve">server/src/app.js</w:t>
+      </w:r>
+    </w:p>
+    <w:p>
+      <w:pPr>
+        <w:pStyle w:val="ListParagraph"/>
+        <w:numPr>
+          <w:ilvl w:val="0"/>
+          <w:numId w:val="2"/>
+        </w:numPr>
+      </w:pPr>
+      <w:r>
+        <w:rPr>
+          <w:rFonts w:ascii="Consolas" w:cs="Consolas" w:eastAsia="Consolas" w:hAnsi="Consolas"/>
+          <w:sz w:val="19"/>
+          <w:szCs w:val="19"/>
+        </w:rPr>
+        <w:t xml:space="preserve">server/src/index.js</w:t>
+      </w:r>
+    </w:p>
+    <w:p>
+      <w:pPr>
+        <w:pStyle w:val="ListParagraph"/>
+        <w:numPr>
+          <w:ilvl w:val="0"/>
+          <w:numId w:val="2"/>
+        </w:numPr>
+      </w:pPr>
+      <w:r>
+        <w:rPr>
+          <w:rFonts w:ascii="Consolas" w:cs="Consolas" w:eastAsia="Consolas" w:hAnsi="Consolas"/>
+          <w:sz w:val="19"/>
+          <w:szCs w:val="19"/>
+        </w:rPr>
+        <w:t xml:space="preserve">server/tests/server.test.js</w:t>
+      </w:r>
+    </w:p>
+    <w:p>
+      <w:pPr>
+        <w:pStyle w:val="ListParagraph"/>
+        <w:numPr>
+          <w:ilvl w:val="0"/>
+          <w:numId w:val="2"/>
+        </w:numPr>
+      </w:pPr>
+      <w:r>
+        <w:rPr>
+          <w:rFonts w:ascii="Consolas" w:cs="Consolas" w:eastAsia="Consolas" w:hAnsi="Consolas"/>
+          <w:sz w:val="19"/>
+          <w:szCs w:val="19"/>
+        </w:rPr>
+        <w:t xml:space="preserve">server/README.md</w:t>
+      </w:r>
+    </w:p>
+    <w:p>
+      <w:pPr>
+        <w:pStyle w:val="ListParagraph"/>
+        <w:numPr>
+          <w:ilvl w:val="0"/>
+          <w:numId w:val="2"/>
+        </w:numPr>
+      </w:pPr>
+      <w:r>
+        <w:rPr>
+          <w:rFonts w:ascii="Consolas" w:cs="Consolas" w:eastAsia="Consolas" w:hAnsi="Consolas"/>
+          <w:sz w:val="19"/>
+          <w:szCs w:val="19"/>
+        </w:rPr>
+        <w:t xml:space="preserve">package.json</w:t>
+      </w:r>
+    </w:p>
+    <w:p>
+      <w:pPr>
+        <w:pStyle w:val="ListParagraph"/>
+        <w:numPr>
+          <w:ilvl w:val="0"/>
+          <w:numId w:val="2"/>
+        </w:numPr>
+      </w:pPr>
+      <w:r>
+        <w:rPr>
+          <w:rFonts w:ascii="Consolas" w:cs="Consolas" w:eastAsia="Consolas" w:hAnsi="Consolas"/>
+          <w:sz w:val="19"/>
+          <w:szCs w:val="19"/>
+        </w:rPr>
+        <w:t xml:space="preserve">README.md</w:t>
+      </w:r>
+    </w:p>
+    <w:p>
+      <w:pPr>
+        <w:pStyle w:val="ListParagraph"/>
+        <w:numPr>
+          <w:ilvl w:val="0"/>
+          <w:numId w:val="2"/>
+        </w:numPr>
+      </w:pPr>
+      <w:r>
+        <w:rPr>
+          <w:rFonts w:ascii="Consolas" w:cs="Consolas" w:eastAsia="Consolas" w:hAnsi="Consolas"/>
+          <w:sz w:val="19"/>
+          <w:szCs w:val="19"/>
+        </w:rPr>
+        <w:t xml:space="preserve">docs/audit/P9_EXPRESS_FOUNDATION_AUDIT.md</w:t>
       </w:r>
     </w:p>
     <w:p>
@@ -12980,41 +13415,24 @@
           <w:sz w:val="19"/>
           <w:szCs w:val="19"/>
         </w:rPr>
+        <w:t xml:space="preserve">docs/SplitStack_Prompt_Log.docx</w:t>
+      </w:r>
+    </w:p>
+    <w:p>
+      <w:pPr>
+        <w:pStyle w:val="ListParagraph"/>
+        <w:numPr>
+          <w:ilvl w:val="0"/>
+          <w:numId w:val="2"/>
+        </w:numPr>
+      </w:pPr>
+      <w:r>
+        <w:rPr>
+          <w:rFonts w:ascii="Consolas" w:cs="Consolas" w:eastAsia="Consolas" w:hAnsi="Consolas"/>
+          <w:sz w:val="19"/>
+          <w:szCs w:val="19"/>
+        </w:rPr>
         <w:t xml:space="preserve">docs/SplitStack_Prompt_Log.pdf</w:t>
-      </w:r>
-    </w:p>
-    <w:p>
-      <w:pPr>
-        <w:pStyle w:val="ListParagraph"/>
-        <w:numPr>
-          <w:ilvl w:val="0"/>
-          <w:numId w:val="2"/>
-        </w:numPr>
-      </w:pPr>
-      <w:r>
-        <w:rPr>
-          <w:rFonts w:ascii="Consolas" w:cs="Consolas" w:eastAsia="Consolas" w:hAnsi="Consolas"/>
-          <w:sz w:val="19"/>
-          <w:szCs w:val="19"/>
-        </w:rPr>
-        <w:t xml:space="preserve">docs/SplitStack_Prompt_Log.docx</w:t>
-      </w:r>
-    </w:p>
-    <w:p>
-      <w:pPr>
-        <w:pStyle w:val="ListParagraph"/>
-        <w:numPr>
-          <w:ilvl w:val="0"/>
-          <w:numId w:val="2"/>
-        </w:numPr>
-      </w:pPr>
-      <w:r>
-        <w:rPr>
-          <w:rFonts w:ascii="Consolas" w:cs="Consolas" w:eastAsia="Consolas" w:hAnsi="Consolas"/>
-          <w:sz w:val="19"/>
-          <w:szCs w:val="19"/>
-        </w:rPr>
-        <w:t xml:space="preserve">package.json</w:t>
       </w:r>
     </w:p>
     <w:p>
@@ -13042,7 +13460,7 @@
           <w:sz w:val="21"/>
           <w:szCs w:val="21"/>
         </w:rPr>
-        <w:t xml:space="preserve">PDF with the executed prompts and 15 planned prompts; the Word log has the same content.</w:t>
+        <w:t xml:space="preserve">Created clean Express server foundation in server/ with health check at /api/health, centralized 404/error handling, 100kb JSON parsing limit, disabled X-Powered-By header, and static frontend hosting; all 7 server tests passing in node --test; live health check verified; root package.json and README.md updated.</w:t>
       </w:r>
     </w:p>
     <w:p>
@@ -13070,7 +13488,7 @@
           <w:sz w:val="21"/>
           <w:szCs w:val="21"/>
         </w:rPr>
-        <w:t xml:space="preserve">Pages rendered to images and inspected; text extracted with pypdf.</w:t>
+        <w:t xml:space="preserve">npm run test:server (7 passed, 0 failed); npm run test:client (176 passed, 0 failed); npm run lint:html (0 errors); live GET /api/health returned 200 OK with expected JSON payload.</w:t>
       </w:r>
     </w:p>
     <w:p>
@@ -13086,11 +13504,20 @@
     </w:p>
     <w:p>
       <w:pPr>
+        <w:pStyle w:val="Heading2"/>
+        <w:spacing w:before="360"/>
+      </w:pPr>
+      <w:r>
+        <w:t xml:space="preserve">Wrap-up - Documentation, cleanup and deployment</w:t>
+      </w:r>
+    </w:p>
+    <w:p>
+      <w:pPr>
         <w:pStyle w:val="Heading3"/>
         <w:keepNext/>
       </w:pPr>
       <w:r>
-        <w:t xml:space="preserve">#15  Create the GitHub repository and push the code</w:t>
+        <w:t xml:space="preserve">#13  Request: GitHub repository, website link and PDF of prompts</w:t>
       </w:r>
     </w:p>
     <w:p>
@@ -13104,7 +13531,7 @@
           <w:sz w:val="18"/>
           <w:szCs w:val="18"/>
         </w:rPr>
-        <w:t xml:space="preserve">Working prompt  |  2026-10-15</w:t>
+        <w:t xml:space="preserve">User prompt  |  2026-10-15</w:t>
       </w:r>
     </w:p>
     <w:p>
@@ -13138,7 +13565,7 @@
           <w:sz w:val="19"/>
           <w:szCs w:val="19"/>
         </w:rPr>
-        <w:t xml:space="preserve">Install the official GitHub CLI with winget and sign in through the device-code flow (the student approves it in the browser). Before publishing, check that no secrets or databases are tracked, review the receipt images that are still in the commit history (they are generic sample invoices), and confirm with the student that a public repository is acceptable because the team's original repository is private. Then create the public repository MahaprabhuK/SplitStack, push the refurbish branch as main together with the legacy branch, add a GitHub Actions workflow (.github/workflows/pages.yml) that deploys the client/ folder to GitHub Pages, enable Pages with the "GitHub Actions" source, and confirm that the site responds.</w:t>
+        <w:t xml:space="preserve">create a new repositry for this project in my gihub , and after than give me the github link and then the website link and also a pdf containing the prompts to complete project.</w:t>
       </w:r>
     </w:p>
     <w:p>
@@ -13166,7 +13593,7 @@
           <w:sz w:val="21"/>
           <w:szCs w:val="21"/>
         </w:rPr>
-        <w:t xml:space="preserve">Give the student a repository link and a live website link.</w:t>
+        <w:t xml:space="preserve">Publish the project under the student's own GitHub account, host the site, and export the prompt log (including the remaining planned prompts) as a PDF.</w:t>
       </w:r>
     </w:p>
     <w:p>
@@ -13199,7 +13626,7 @@
           <w:sz w:val="19"/>
           <w:szCs w:val="19"/>
         </w:rPr>
-        <w:t xml:space="preserve">README.md</w:t>
+        <w:t xml:space="preserve">-</w:t>
       </w:r>
     </w:p>
     <w:p>
@@ -13227,7 +13654,7 @@
           <w:sz w:val="21"/>
           <w:szCs w:val="21"/>
         </w:rPr>
-        <w:t xml:space="preserve">Public repository https://github.com/MahaprabhuK/SplitStack created and the legacy branch pushed. The first push of main was rejected because it added a GitHub Actions workflow (.github/workflows/pages.yml) and the gh token lacked the "workflow" scope; the workflow file was removed and main was pushed in the next step. GitHub Pages is not set up yet (planned for the wrap-up; needs "gh auth refresh -s workflow" or a gh-pages branch).</w:t>
+        <w:t xml:space="preserve">Done: see the following entries.</w:t>
       </w:r>
     </w:p>
     <w:p>
@@ -13255,7 +13682,7 @@
           <w:sz w:val="21"/>
           <w:szCs w:val="21"/>
         </w:rPr>
-        <w:t xml:space="preserve">gh repo view; git push output.</w:t>
+        <w:t xml:space="preserve">-</w:t>
       </w:r>
     </w:p>
     <w:p>
@@ -13275,7 +13702,7 @@
         <w:keepNext/>
       </w:pPr>
       <w:r>
-        <w:t xml:space="preserve">#16  Request: hand the project over to a teammate's agent</w:t>
+        <w:t xml:space="preserve">#14  PDF export of the prompt log, including planned prompts</w:t>
       </w:r>
     </w:p>
     <w:p>
@@ -13289,7 +13716,7 @@
           <w:sz w:val="18"/>
           <w:szCs w:val="18"/>
         </w:rPr>
-        <w:t xml:space="preserve">User prompt  |  2026-10-15</w:t>
+        <w:t xml:space="preserve">Working prompt  |  2026-10-15</w:t>
       </w:r>
     </w:p>
     <w:p>
@@ -13323,7 +13750,7 @@
           <w:sz w:val="19"/>
           <w:szCs w:val="19"/>
         </w:rPr>
-        <w:t xml:space="preserve">ACTUALLY I GONNA HANDOVER THE PROJECT TO MY TEAMMATES AGENT SO HE'LL BE PULLING THE CODE AND RUNNING IN HIS SYSTEM SO GIVE PROMPT FOR THAT</w:t>
+        <w:t xml:space="preserve">Export the prompt log to PDF with a Python reportlab script (docs/tools/build_prompt_pdf.py) that reads docs/prompt_log.json: a title page, a stage overview table, a summary of every entry, Part A with every executed prompt verbatim in a shaded box with purpose, files, result and verification, and Part B with the planned prompts that complete Review 2, Review 3 and the wrap-up, clearly marked as not yet run. Add the planned prompts to prompt_log.json and to the Word log as well, and make "npm run log" rebuild both documents.</w:t>
       </w:r>
     </w:p>
     <w:p>
@@ -13351,7 +13778,7 @@
           <w:sz w:val="21"/>
           <w:szCs w:val="21"/>
         </w:rPr>
-        <w:t xml:space="preserve">Let a teammate's AI agent clone, run and continue the project.</w:t>
+        <w:t xml:space="preserve">Give the student a PDF containing the prompts needed to complete the whole project.</w:t>
       </w:r>
     </w:p>
     <w:p>
@@ -13384,7 +13811,92 @@
           <w:sz w:val="19"/>
           <w:szCs w:val="19"/>
         </w:rPr>
-        <w:t xml:space="preserve">-</w:t>
+        <w:t xml:space="preserve">docs/tools/build_prompt_pdf.py</w:t>
+      </w:r>
+    </w:p>
+    <w:p>
+      <w:pPr>
+        <w:pStyle w:val="ListParagraph"/>
+        <w:numPr>
+          <w:ilvl w:val="0"/>
+          <w:numId w:val="2"/>
+        </w:numPr>
+      </w:pPr>
+      <w:r>
+        <w:rPr>
+          <w:rFonts w:ascii="Consolas" w:cs="Consolas" w:eastAsia="Consolas" w:hAnsi="Consolas"/>
+          <w:sz w:val="19"/>
+          <w:szCs w:val="19"/>
+        </w:rPr>
+        <w:t xml:space="preserve">docs/tools/build-prompt-log.js</w:t>
+      </w:r>
+    </w:p>
+    <w:p>
+      <w:pPr>
+        <w:pStyle w:val="ListParagraph"/>
+        <w:numPr>
+          <w:ilvl w:val="0"/>
+          <w:numId w:val="2"/>
+        </w:numPr>
+      </w:pPr>
+      <w:r>
+        <w:rPr>
+          <w:rFonts w:ascii="Consolas" w:cs="Consolas" w:eastAsia="Consolas" w:hAnsi="Consolas"/>
+          <w:sz w:val="19"/>
+          <w:szCs w:val="19"/>
+        </w:rPr>
+        <w:t xml:space="preserve">docs/prompt_log.json</w:t>
+      </w:r>
+    </w:p>
+    <w:p>
+      <w:pPr>
+        <w:pStyle w:val="ListParagraph"/>
+        <w:numPr>
+          <w:ilvl w:val="0"/>
+          <w:numId w:val="2"/>
+        </w:numPr>
+      </w:pPr>
+      <w:r>
+        <w:rPr>
+          <w:rFonts w:ascii="Consolas" w:cs="Consolas" w:eastAsia="Consolas" w:hAnsi="Consolas"/>
+          <w:sz w:val="19"/>
+          <w:szCs w:val="19"/>
+        </w:rPr>
+        <w:t xml:space="preserve">docs/SplitStack_Prompt_Log.pdf</w:t>
+      </w:r>
+    </w:p>
+    <w:p>
+      <w:pPr>
+        <w:pStyle w:val="ListParagraph"/>
+        <w:numPr>
+          <w:ilvl w:val="0"/>
+          <w:numId w:val="2"/>
+        </w:numPr>
+      </w:pPr>
+      <w:r>
+        <w:rPr>
+          <w:rFonts w:ascii="Consolas" w:cs="Consolas" w:eastAsia="Consolas" w:hAnsi="Consolas"/>
+          <w:sz w:val="19"/>
+          <w:szCs w:val="19"/>
+        </w:rPr>
+        <w:t xml:space="preserve">docs/SplitStack_Prompt_Log.docx</w:t>
+      </w:r>
+    </w:p>
+    <w:p>
+      <w:pPr>
+        <w:pStyle w:val="ListParagraph"/>
+        <w:numPr>
+          <w:ilvl w:val="0"/>
+          <w:numId w:val="2"/>
+        </w:numPr>
+      </w:pPr>
+      <w:r>
+        <w:rPr>
+          <w:rFonts w:ascii="Consolas" w:cs="Consolas" w:eastAsia="Consolas" w:hAnsi="Consolas"/>
+          <w:sz w:val="19"/>
+          <w:szCs w:val="19"/>
+        </w:rPr>
+        <w:t xml:space="preserve">package.json</w:t>
       </w:r>
     </w:p>
     <w:p>
@@ -13412,7 +13924,7 @@
           <w:sz w:val="21"/>
           <w:szCs w:val="21"/>
         </w:rPr>
-        <w:t xml:space="preserve">A handover prompt was written covering: requirements per review, clone and branch, prerequisites, install/run/verify commands, repository map, known traps, the mandatory logging rule, the ordered remaining work (planned prompts P1-P15) and working rules. Noted that the new work had to be pushed to GitHub first.</w:t>
+        <w:t xml:space="preserve">PDF with the executed prompts and 15 planned prompts; the Word log has the same content.</w:t>
       </w:r>
     </w:p>
     <w:p>
@@ -13440,7 +13952,7 @@
           <w:sz w:val="21"/>
           <w:szCs w:val="21"/>
         </w:rPr>
-        <w:t xml:space="preserve">-</w:t>
+        <w:t xml:space="preserve">Pages rendered to images and inspected; text extracted with pypdf.</w:t>
       </w:r>
     </w:p>
     <w:p>
@@ -13460,7 +13972,7 @@
         <w:keepNext/>
       </w:pPr>
       <w:r>
-        <w:t xml:space="preserve">#17  Push the refurbished code to GitHub main</w:t>
+        <w:t xml:space="preserve">#15  Create the GitHub repository and push the code</w:t>
       </w:r>
     </w:p>
     <w:p>
@@ -13508,7 +14020,7 @@
           <w:sz w:val="19"/>
           <w:szCs w:val="19"/>
         </w:rPr>
-        <w:t xml:space="preserve">push it  (user prompt). Executed as: remove .github/workflows/pages.yml (the token lacks the workflow scope), replace the not-yet-existing live-site link in README.md with local run instructions, correct the earlier log entry about publishing, log the handover, rebuild the prompt logs, commit, and push the refurbish branch to main on https://github.com/MahaprabhuK/SplitStack so the teammate can clone it.</w:t>
+        <w:t xml:space="preserve">Install the official GitHub CLI with winget and sign in through the device-code flow (the student approves it in the browser). Before publishing, check that no secrets or databases are tracked, review the receipt images that are still in the commit history (they are generic sample invoices), and confirm with the student that a public repository is acceptable because the team's original repository is private. Then create the public repository MahaprabhuK/SplitStack, push the refurbish branch as main together with the legacy branch, add a GitHub Actions workflow (.github/workflows/pages.yml) that deploys the client/ folder to GitHub Pages, enable Pages with the "GitHub Actions" source, and confirm that the site responds.</w:t>
       </w:r>
     </w:p>
     <w:p>
@@ -13536,7 +14048,7 @@
           <w:sz w:val="21"/>
           <w:szCs w:val="21"/>
         </w:rPr>
-        <w:t xml:space="preserve">Make the current work available to the teammate.</w:t>
+        <w:t xml:space="preserve">Give the student a repository link and a live website link.</w:t>
       </w:r>
     </w:p>
     <w:p>
@@ -13569,75 +14081,7 @@
           <w:sz w:val="19"/>
           <w:szCs w:val="19"/>
         </w:rPr>
-        <w:t xml:space="preserve">.github/workflows/pages.yml (removed)</w:t>
-      </w:r>
-    </w:p>
-    <w:p>
-      <w:pPr>
-        <w:pStyle w:val="ListParagraph"/>
-        <w:numPr>
-          <w:ilvl w:val="0"/>
-          <w:numId w:val="2"/>
-        </w:numPr>
-      </w:pPr>
-      <w:r>
-        <w:rPr>
-          <w:rFonts w:ascii="Consolas" w:cs="Consolas" w:eastAsia="Consolas" w:hAnsi="Consolas"/>
-          <w:sz w:val="19"/>
-          <w:szCs w:val="19"/>
-        </w:rPr>
         <w:t xml:space="preserve">README.md</w:t>
-      </w:r>
-    </w:p>
-    <w:p>
-      <w:pPr>
-        <w:pStyle w:val="ListParagraph"/>
-        <w:numPr>
-          <w:ilvl w:val="0"/>
-          <w:numId w:val="2"/>
-        </w:numPr>
-      </w:pPr>
-      <w:r>
-        <w:rPr>
-          <w:rFonts w:ascii="Consolas" w:cs="Consolas" w:eastAsia="Consolas" w:hAnsi="Consolas"/>
-          <w:sz w:val="19"/>
-          <w:szCs w:val="19"/>
-        </w:rPr>
-        <w:t xml:space="preserve">docs/prompt_log.json</w:t>
-      </w:r>
-    </w:p>
-    <w:p>
-      <w:pPr>
-        <w:pStyle w:val="ListParagraph"/>
-        <w:numPr>
-          <w:ilvl w:val="0"/>
-          <w:numId w:val="2"/>
-        </w:numPr>
-      </w:pPr>
-      <w:r>
-        <w:rPr>
-          <w:rFonts w:ascii="Consolas" w:cs="Consolas" w:eastAsia="Consolas" w:hAnsi="Consolas"/>
-          <w:sz w:val="19"/>
-          <w:szCs w:val="19"/>
-        </w:rPr>
-        <w:t xml:space="preserve">docs/SplitStack_Prompt_Log.docx</w:t>
-      </w:r>
-    </w:p>
-    <w:p>
-      <w:pPr>
-        <w:pStyle w:val="ListParagraph"/>
-        <w:numPr>
-          <w:ilvl w:val="0"/>
-          <w:numId w:val="2"/>
-        </w:numPr>
-      </w:pPr>
-      <w:r>
-        <w:rPr>
-          <w:rFonts w:ascii="Consolas" w:cs="Consolas" w:eastAsia="Consolas" w:hAnsi="Consolas"/>
-          <w:sz w:val="19"/>
-          <w:szCs w:val="19"/>
-        </w:rPr>
-        <w:t xml:space="preserve">docs/SplitStack_Prompt_Log.pdf</w:t>
       </w:r>
     </w:p>
     <w:p>
@@ -13665,7 +14109,7 @@
           <w:sz w:val="21"/>
           <w:szCs w:val="21"/>
         </w:rPr>
-        <w:t xml:space="preserve">main pushed to GitHub; branches on GitHub: main (refurbished work) and legacy (original Flask app).</w:t>
+        <w:t xml:space="preserve">Public repository https://github.com/MahaprabhuK/SplitStack created and the legacy branch pushed. The first push of main was rejected because it added a GitHub Actions workflow (.github/workflows/pages.yml) and the gh token lacked the "workflow" scope; the workflow file was removed and main was pushed in the next step. GitHub Pages is not set up yet (planned for the wrap-up; needs "gh auth refresh -s workflow" or a gh-pages branch).</w:t>
       </w:r>
     </w:p>
     <w:p>
@@ -13693,7 +14137,7 @@
           <w:sz w:val="21"/>
           <w:szCs w:val="21"/>
         </w:rPr>
-        <w:t xml:space="preserve">git ls-remote shows main and legacy at the expected commits.</w:t>
+        <w:t xml:space="preserve">gh repo view; git push output.</w:t>
       </w:r>
     </w:p>
     <w:p>
@@ -13713,7 +14157,7 @@
         <w:keepNext/>
       </w:pPr>
       <w:r>
-        <w:t xml:space="preserve">#18  Request: push the code and deploy the website</w:t>
+        <w:t xml:space="preserve">#16  Request: hand the project over to a teammate's agent</w:t>
       </w:r>
     </w:p>
     <w:p>
@@ -13761,7 +14205,7 @@
           <w:sz w:val="19"/>
           <w:szCs w:val="19"/>
         </w:rPr>
-        <w:t xml:space="preserve">first push the code and deploy it</w:t>
+        <w:t xml:space="preserve">ACTUALLY I GONNA HANDOVER THE PROJECT TO MY TEAMMATES AGENT SO HE'LL BE PULLING THE CODE AND RUNNING IN HIS SYSTEM SO GIVE PROMPT FOR THAT</w:t>
       </w:r>
     </w:p>
     <w:p>
@@ -13789,7 +14233,7 @@
           <w:sz w:val="21"/>
           <w:szCs w:val="21"/>
         </w:rPr>
-        <w:t xml:space="preserve">Get the code on GitHub and the Review 1 site online.</w:t>
+        <w:t xml:space="preserve">Let a teammate's AI agent clone, run and continue the project.</w:t>
       </w:r>
     </w:p>
     <w:p>
@@ -13850,7 +14294,7 @@
           <w:sz w:val="21"/>
           <w:szCs w:val="21"/>
         </w:rPr>
-        <w:t xml:space="preserve">Handled in the next step.</w:t>
+        <w:t xml:space="preserve">A handover prompt was written covering: requirements per review, clone and branch, prerequisites, install/run/verify commands, repository map, known traps, the mandatory logging rule, the ordered remaining work (planned prompts P1-P15) and working rules. Noted that the new work had to be pushed to GitHub first.</w:t>
       </w:r>
     </w:p>
     <w:p>
@@ -13898,7 +14342,7 @@
         <w:keepNext/>
       </w:pPr>
       <w:r>
-        <w:t xml:space="preserve">#19  Deploy the client to GitHub Pages from a gh-pages branch</w:t>
+        <w:t xml:space="preserve">#17  Push the refurbished code to GitHub main</w:t>
       </w:r>
     </w:p>
     <w:p>
@@ -13946,7 +14390,7 @@
           <w:sz w:val="19"/>
           <w:szCs w:val="19"/>
         </w:rPr>
-        <w:t xml:space="preserve">Push refurbish to main and refurbish on MahaprabhuK/SplitStack. Because the token cannot push workflow files, deploy without GitHub Actions: check that client/ uses only relative links, split client/ into its own history with git subtree split, push it as the gh-pages branch, wait for GitHub Pages to publish it, then put the live link back in README.md and log the step.</w:t>
+        <w:t xml:space="preserve">push it  (user prompt). Executed as: remove .github/workflows/pages.yml (the token lacks the workflow scope), replace the not-yet-existing live-site link in README.md with local run instructions, correct the earlier log entry about publishing, log the handover, rebuild the prompt logs, commit, and push the refurbish branch to main on https://github.com/MahaprabhuK/SplitStack so the teammate can clone it.</w:t>
       </w:r>
     </w:p>
     <w:p>
@@ -13974,7 +14418,7 @@
           <w:sz w:val="21"/>
           <w:szCs w:val="21"/>
         </w:rPr>
-        <w:t xml:space="preserve">Publish the Review 1 site at a public URL without needing the workflow scope.</w:t>
+        <w:t xml:space="preserve">Make the current work available to the teammate.</w:t>
       </w:r>
     </w:p>
     <w:p>
@@ -14007,6 +14451,23 @@
           <w:sz w:val="19"/>
           <w:szCs w:val="19"/>
         </w:rPr>
+        <w:t xml:space="preserve">.github/workflows/pages.yml (removed)</w:t>
+      </w:r>
+    </w:p>
+    <w:p>
+      <w:pPr>
+        <w:pStyle w:val="ListParagraph"/>
+        <w:numPr>
+          <w:ilvl w:val="0"/>
+          <w:numId w:val="2"/>
+        </w:numPr>
+      </w:pPr>
+      <w:r>
+        <w:rPr>
+          <w:rFonts w:ascii="Consolas" w:cs="Consolas" w:eastAsia="Consolas" w:hAnsi="Consolas"/>
+          <w:sz w:val="19"/>
+          <w:szCs w:val="19"/>
+        </w:rPr>
         <w:t xml:space="preserve">README.md</w:t>
       </w:r>
     </w:p>
@@ -14025,6 +14486,40 @@
           <w:szCs w:val="19"/>
         </w:rPr>
         <w:t xml:space="preserve">docs/prompt_log.json</w:t>
+      </w:r>
+    </w:p>
+    <w:p>
+      <w:pPr>
+        <w:pStyle w:val="ListParagraph"/>
+        <w:numPr>
+          <w:ilvl w:val="0"/>
+          <w:numId w:val="2"/>
+        </w:numPr>
+      </w:pPr>
+      <w:r>
+        <w:rPr>
+          <w:rFonts w:ascii="Consolas" w:cs="Consolas" w:eastAsia="Consolas" w:hAnsi="Consolas"/>
+          <w:sz w:val="19"/>
+          <w:szCs w:val="19"/>
+        </w:rPr>
+        <w:t xml:space="preserve">docs/SplitStack_Prompt_Log.docx</w:t>
+      </w:r>
+    </w:p>
+    <w:p>
+      <w:pPr>
+        <w:pStyle w:val="ListParagraph"/>
+        <w:numPr>
+          <w:ilvl w:val="0"/>
+          <w:numId w:val="2"/>
+        </w:numPr>
+      </w:pPr>
+      <w:r>
+        <w:rPr>
+          <w:rFonts w:ascii="Consolas" w:cs="Consolas" w:eastAsia="Consolas" w:hAnsi="Consolas"/>
+          <w:sz w:val="19"/>
+          <w:szCs w:val="19"/>
+        </w:rPr>
+        <w:t xml:space="preserve">docs/SplitStack_Prompt_Log.pdf</w:t>
       </w:r>
     </w:p>
     <w:p>
@@ -14052,7 +14547,7 @@
           <w:sz w:val="21"/>
           <w:szCs w:val="21"/>
         </w:rPr>
-        <w:t xml:space="preserve">main and refurbish are on GitHub. The client/ folder is published from the gh-pages branch at https://mahaprabhuk.github.io/SplitStack/ (GitHub enabled Pages automatically). To redeploy after client changes: git subtree split --prefix client refurbish, then push that commit to gh-pages.</w:t>
+        <w:t xml:space="preserve">main pushed to GitHub; branches on GitHub: main (refurbished work) and legacy (original Flask app).</w:t>
       </w:r>
     </w:p>
     <w:p>
@@ -14080,7 +14575,7 @@
           <w:sz w:val="21"/>
           <w:szCs w:val="21"/>
         </w:rPr>
-        <w:t xml:space="preserve">git ls-remote; curl returned 200 for the home page, pages/404.html and css/base.css on the live site.</w:t>
+        <w:t xml:space="preserve">git ls-remote shows main and legacy at the expected commits.</w:t>
       </w:r>
     </w:p>
     <w:p>
@@ -14100,7 +14595,7 @@
         <w:keepNext/>
       </w:pPr>
       <w:r>
-        <w:t xml:space="preserve">#20  Request: handover prompt PDF for a teammate's agent</w:t>
+        <w:t xml:space="preserve">#18  Request: push the code and deploy the website</w:t>
       </w:r>
     </w:p>
     <w:p>
@@ -14148,7 +14643,7 @@
           <w:sz w:val="19"/>
           <w:szCs w:val="19"/>
         </w:rPr>
-        <w:t xml:space="preserve">imma handover the project to my teammate i want you to create a detailed prompt for his agent most prolly he'll use anti gravity so i want a pdf containing prompts to complete the rest of the work in the project. so create a pdf and mention its path once its created then i'll share it to him</w:t>
+        <w:t xml:space="preserve">first push the code and deploy it</w:t>
       </w:r>
     </w:p>
     <w:p>
@@ -14176,7 +14671,7 @@
           <w:sz w:val="21"/>
           <w:szCs w:val="21"/>
         </w:rPr>
-        <w:t xml:space="preserve">Let a teammate's AI agent (Antigravity) finish Review 2, Review 3 and the wrap-up.</w:t>
+        <w:t xml:space="preserve">Get the code on GitHub and the Review 1 site online.</w:t>
       </w:r>
     </w:p>
     <w:p>
@@ -14285,7 +14780,7 @@
         <w:keepNext/>
       </w:pPr>
       <w:r>
-        <w:t xml:space="preserve">#21  Handover prompts PDF</w:t>
+        <w:t xml:space="preserve">#19  Deploy the client to GitHub Pages from a gh-pages branch</w:t>
       </w:r>
     </w:p>
     <w:p>
@@ -14333,7 +14828,7 @@
           <w:sz w:val="19"/>
           <w:szCs w:val="19"/>
         </w:rPr>
-        <w:t xml:space="preserve">Write docs/tools/build_handover_pdf.py (reusing the styles of build_prompt_pdf.py) to produce docs/SplitStack_Handover_Prompts.pdf: how to use it with Antigravity, one-time setup (tools, collaborator access, MongoDB Atlas, workflow token scope), a roadmap, Prompt 0 with the full project context, rules, logging, commit/push and gh-pages redeploy procedure, the 15 planned prompts P1-P15 expanded with concrete checks and commit messages, utility prompts (status, recovery, review rehearsal) and common problems. Render pages to check the layout.</w:t>
+        <w:t xml:space="preserve">Push refurbish to main and refurbish on MahaprabhuK/SplitStack. Because the token cannot push workflow files, deploy without GitHub Actions: check that client/ uses only relative links, split client/ into its own history with git subtree split, push it as the gh-pages branch, wait for GitHub Pages to publish it, then put the live link back in README.md and log the step.</w:t>
       </w:r>
     </w:p>
     <w:p>
@@ -14361,7 +14856,7 @@
           <w:sz w:val="21"/>
           <w:szCs w:val="21"/>
         </w:rPr>
-        <w:t xml:space="preserve">Give the teammate a self-contained, ordered set of prompts.</w:t>
+        <w:t xml:space="preserve">Publish the Review 1 site at a public URL without needing the workflow scope.</w:t>
       </w:r>
     </w:p>
     <w:p>
@@ -14394,24 +14889,24 @@
           <w:sz w:val="19"/>
           <w:szCs w:val="19"/>
         </w:rPr>
-        <w:t xml:space="preserve">docs/tools/build_handover_pdf.py</w:t>
-      </w:r>
-    </w:p>
-    <w:p>
-      <w:pPr>
-        <w:pStyle w:val="ListParagraph"/>
-        <w:numPr>
-          <w:ilvl w:val="0"/>
-          <w:numId w:val="2"/>
-        </w:numPr>
-      </w:pPr>
-      <w:r>
-        <w:rPr>
-          <w:rFonts w:ascii="Consolas" w:cs="Consolas" w:eastAsia="Consolas" w:hAnsi="Consolas"/>
-          <w:sz w:val="19"/>
-          <w:szCs w:val="19"/>
-        </w:rPr>
-        <w:t xml:space="preserve">docs/SplitStack_Handover_Prompts.pdf</w:t>
+        <w:t xml:space="preserve">README.md</w:t>
+      </w:r>
+    </w:p>
+    <w:p>
+      <w:pPr>
+        <w:pStyle w:val="ListParagraph"/>
+        <w:numPr>
+          <w:ilvl w:val="0"/>
+          <w:numId w:val="2"/>
+        </w:numPr>
+      </w:pPr>
+      <w:r>
+        <w:rPr>
+          <w:rFonts w:ascii="Consolas" w:cs="Consolas" w:eastAsia="Consolas" w:hAnsi="Consolas"/>
+          <w:sz w:val="19"/>
+          <w:szCs w:val="19"/>
+        </w:rPr>
+        <w:t xml:space="preserve">docs/prompt_log.json</w:t>
       </w:r>
     </w:p>
     <w:p>
@@ -14439,7 +14934,7 @@
           <w:sz w:val="21"/>
           <w:szCs w:val="21"/>
         </w:rPr>
-        <w:t xml:space="preserve">14-page PDF created. Changes against the planned prompts: P1 adds data-page attributes and client/js/package.json (type module) for node --test; P13 keeps the localStorage implementation as a demo mode (api-local.js chosen when /api/health does not answer) so the GitHub Pages site keeps working, instead of deleting it; P9 replaces deprecated csurf with a synchronizer token; P14 uses MongoMemoryReplSet because the API uses transactions; P15 asks for confirmation before deleting the Flask files and leaves Render account steps to the student.</w:t>
+        <w:t xml:space="preserve">main and refurbish are on GitHub. The client/ folder is published from the gh-pages branch at https://mahaprabhuk.github.io/SplitStack/ (GitHub enabled Pages automatically). To redeploy after client changes: git subtree split --prefix client refurbish, then push that commit to gh-pages.</w:t>
       </w:r>
     </w:p>
     <w:p>
@@ -14467,7 +14962,7 @@
           <w:sz w:val="21"/>
           <w:szCs w:val="21"/>
         </w:rPr>
-        <w:t xml:space="preserve">Rendered pages with PyMuPDF and checked the layout of the setup, Prompt 0, step and utility pages.</w:t>
+        <w:t xml:space="preserve">git ls-remote; curl returned 200 for the home page, pages/404.html and css/base.css on the live site.</w:t>
       </w:r>
     </w:p>
     <w:p>
@@ -14482,37 +14977,12 @@
       </w:r>
     </w:p>
     <w:p>
-      <w:r>
-        <w:br w:type="page"/>
-      </w:r>
-    </w:p>
-    <w:p>
-      <w:pPr>
-        <w:pStyle w:val="Heading1"/>
-      </w:pPr>
-      <w:r>
-        <w:t xml:space="preserve">Planned prompts to complete the project</w:t>
-      </w:r>
-    </w:p>
-    <w:p>
-      <w:pPr>
-        <w:spacing w:after="80"/>
-      </w:pPr>
-      <w:r>
-        <w:rPr>
-          <w:sz w:val="21"/>
-          <w:szCs w:val="21"/>
-        </w:rPr>
-        <w:t xml:space="preserve">These prompts have not been run yet. Run them in order; after each one, move it into the log above with its result.</w:t>
-      </w:r>
-    </w:p>
-    <w:p>
       <w:pPr>
         <w:pStyle w:val="Heading3"/>
         <w:keepNext/>
       </w:pPr>
       <w:r>
-        <w:t xml:space="preserve">P1  Express server and MongoDB connection</w:t>
+        <w:t xml:space="preserve">#20  Request: handover prompt PDF for a teammate's agent</w:t>
       </w:r>
     </w:p>
     <w:p>
@@ -14526,7 +14996,7 @@
           <w:sz w:val="18"/>
           <w:szCs w:val="18"/>
         </w:rPr>
-        <w:t xml:space="preserve">Review 3  |  Planned prompt</w:t>
+        <w:t xml:space="preserve">User prompt  |  2026-10-15</w:t>
       </w:r>
     </w:p>
     <w:p>
@@ -14560,7 +15030,7 @@
           <w:sz w:val="19"/>
           <w:szCs w:val="19"/>
         </w:rPr>
-        <w:t xml:space="preserve">Create server/ as a Node.js 20+ project (ES modules) with Express: server/src/app.js (helmet with a Content Security Policy that allows only the CDNs in use, compression, express.json, express-session stored with connect-mongo, express-rate-limit on auth and upload routes, a CSRF token check on state-changing requests, and a central error handler returning JSON {error, fields}), server/src/index.js (connect to MongoDB Atlas with Mongoose using MONGODB_URI from server/.env, then listen), and static serving of client/. Add server/.env.example (MONGODB_URI, SESSION_SECRET of at least 32 characters, PORT) and npm scripts dev (node --watch) and start. Never commit .env.</w:t>
+        <w:t xml:space="preserve">imma handover the project to my teammate i want you to create a detailed prompt for his agent most prolly he'll use anti gravity so i want a pdf containing prompts to complete the rest of the work in the project. so create a pdf and mention its path once its created then i'll share it to him</w:t>
       </w:r>
     </w:p>
     <w:p>
@@ -14588,7 +15058,7 @@
           <w:sz w:val="21"/>
           <w:szCs w:val="21"/>
         </w:rPr>
-        <w:t xml:space="preserve">Start Review 3 with a secure, conventional Express setup.</w:t>
+        <w:t xml:space="preserve">Let a teammate's AI agent (Antigravity) finish Review 2, Review 3 and the wrap-up.</w:t>
       </w:r>
     </w:p>
     <w:p>
@@ -14605,6 +15075,39 @@
           <w:szCs w:val="17"/>
         </w:rPr>
         <w:t xml:space="preserve">FILES</w:t>
+      </w:r>
+    </w:p>
+    <w:p>
+      <w:pPr>
+        <w:pStyle w:val="ListParagraph"/>
+        <w:numPr>
+          <w:ilvl w:val="0"/>
+          <w:numId w:val="2"/>
+        </w:numPr>
+      </w:pPr>
+      <w:r>
+        <w:rPr>
+          <w:rFonts w:ascii="Consolas" w:cs="Consolas" w:eastAsia="Consolas" w:hAnsi="Consolas"/>
+          <w:sz w:val="19"/>
+          <w:szCs w:val="19"/>
+        </w:rPr>
+        <w:t xml:space="preserve">-</w:t>
+      </w:r>
+    </w:p>
+    <w:p>
+      <w:pPr>
+        <w:spacing w:after="60" w:before="160"/>
+      </w:pPr>
+      <w:r>
+        <w:rPr>
+          <w:b/>
+          <w:bCs/>
+          <w:color w:val="4F46E5"/>
+          <w:spacing w:val="20"/>
+          <w:sz w:val="17"/>
+          <w:szCs w:val="17"/>
+        </w:rPr>
+        <w:t xml:space="preserve">RESULT</w:t>
       </w:r>
     </w:p>
     <w:p>
@@ -14616,7 +15119,386 @@
           <w:sz w:val="21"/>
           <w:szCs w:val="21"/>
         </w:rPr>
-        <w:t xml:space="preserve">server/package.json, server/src/app.js, server/src/index.js, server/.env.example</w:t>
+        <w:t xml:space="preserve">Handled in the next step.</w:t>
+      </w:r>
+    </w:p>
+    <w:p>
+      <w:pPr>
+        <w:spacing w:after="60" w:before="160"/>
+      </w:pPr>
+      <w:r>
+        <w:rPr>
+          <w:b/>
+          <w:bCs/>
+          <w:color w:val="4F46E5"/>
+          <w:spacing w:val="20"/>
+          <w:sz w:val="17"/>
+          <w:szCs w:val="17"/>
+        </w:rPr>
+        <w:t xml:space="preserve">VERIFICATION</w:t>
+      </w:r>
+    </w:p>
+    <w:p>
+      <w:pPr>
+        <w:spacing w:after="80"/>
+      </w:pPr>
+      <w:r>
+        <w:rPr>
+          <w:sz w:val="21"/>
+          <w:szCs w:val="21"/>
+        </w:rPr>
+        <w:t xml:space="preserve">-</w:t>
+      </w:r>
+    </w:p>
+    <w:p>
+      <w:pPr>
+        <w:pBdr>
+          <w:bottom w:val="single" w:color="D9DBE5" w:sz="4" w:space="4"/>
+        </w:pBdr>
+        <w:spacing w:after="200"/>
+      </w:pPr>
+      <w:r>
+        <w:t xml:space="preserve"/>
+      </w:r>
+    </w:p>
+    <w:p>
+      <w:pPr>
+        <w:pStyle w:val="Heading3"/>
+        <w:keepNext/>
+      </w:pPr>
+      <w:r>
+        <w:t xml:space="preserve">#21  Handover prompts PDF</w:t>
+      </w:r>
+    </w:p>
+    <w:p>
+      <w:pPr>
+        <w:keepNext/>
+        <w:spacing w:after="60"/>
+      </w:pPr>
+      <w:r>
+        <w:rPr>
+          <w:color w:val="5B6475"/>
+          <w:sz w:val="18"/>
+          <w:szCs w:val="18"/>
+        </w:rPr>
+        <w:t xml:space="preserve">Working prompt  |  2026-10-15</w:t>
+      </w:r>
+    </w:p>
+    <w:p>
+      <w:pPr>
+        <w:spacing w:after="60" w:before="160"/>
+      </w:pPr>
+      <w:r>
+        <w:rPr>
+          <w:b/>
+          <w:bCs/>
+          <w:color w:val="4F46E5"/>
+          <w:spacing w:val="20"/>
+          <w:sz w:val="17"/>
+          <w:szCs w:val="17"/>
+        </w:rPr>
+        <w:t xml:space="preserve">PROMPT</w:t>
+      </w:r>
+    </w:p>
+    <w:p>
+      <w:pPr>
+        <w:pBdr>
+          <w:left w:val="single" w:color="4F46E5" w:sz="18" w:space="8"/>
+        </w:pBdr>
+        <w:shd w:fill="F1F2F8" w:color="auto" w:val="clear"/>
+        <w:spacing w:after="120" w:before="40" w:line="276"/>
+        <w:ind w:left="160" w:right="160"/>
+      </w:pPr>
+      <w:r>
+        <w:rPr>
+          <w:rFonts w:ascii="Consolas" w:cs="Consolas" w:eastAsia="Consolas" w:hAnsi="Consolas"/>
+          <w:sz w:val="19"/>
+          <w:szCs w:val="19"/>
+        </w:rPr>
+        <w:t xml:space="preserve">Write docs/tools/build_handover_pdf.py (reusing the styles of build_prompt_pdf.py) to produce docs/SplitStack_Handover_Prompts.pdf: how to use it with Antigravity, one-time setup (tools, collaborator access, MongoDB Atlas, workflow token scope), a roadmap, Prompt 0 with the full project context, rules, logging, commit/push and gh-pages redeploy procedure, the 15 planned prompts P1-P15 expanded with concrete checks and commit messages, utility prompts (status, recovery, review rehearsal) and common problems. Render pages to check the layout.</w:t>
+      </w:r>
+    </w:p>
+    <w:p>
+      <w:pPr>
+        <w:spacing w:after="60" w:before="160"/>
+      </w:pPr>
+      <w:r>
+        <w:rPr>
+          <w:b/>
+          <w:bCs/>
+          <w:color w:val="4F46E5"/>
+          <w:spacing w:val="20"/>
+          <w:sz w:val="17"/>
+          <w:szCs w:val="17"/>
+        </w:rPr>
+        <w:t xml:space="preserve">PURPOSE</w:t>
+      </w:r>
+    </w:p>
+    <w:p>
+      <w:pPr>
+        <w:spacing w:after="80"/>
+      </w:pPr>
+      <w:r>
+        <w:rPr>
+          <w:sz w:val="21"/>
+          <w:szCs w:val="21"/>
+        </w:rPr>
+        <w:t xml:space="preserve">Give the teammate a self-contained, ordered set of prompts.</w:t>
+      </w:r>
+    </w:p>
+    <w:p>
+      <w:pPr>
+        <w:spacing w:after="60" w:before="160"/>
+      </w:pPr>
+      <w:r>
+        <w:rPr>
+          <w:b/>
+          <w:bCs/>
+          <w:color w:val="4F46E5"/>
+          <w:spacing w:val="20"/>
+          <w:sz w:val="17"/>
+          <w:szCs w:val="17"/>
+        </w:rPr>
+        <w:t xml:space="preserve">FILES</w:t>
+      </w:r>
+    </w:p>
+    <w:p>
+      <w:pPr>
+        <w:pStyle w:val="ListParagraph"/>
+        <w:numPr>
+          <w:ilvl w:val="0"/>
+          <w:numId w:val="2"/>
+        </w:numPr>
+      </w:pPr>
+      <w:r>
+        <w:rPr>
+          <w:rFonts w:ascii="Consolas" w:cs="Consolas" w:eastAsia="Consolas" w:hAnsi="Consolas"/>
+          <w:sz w:val="19"/>
+          <w:szCs w:val="19"/>
+        </w:rPr>
+        <w:t xml:space="preserve">docs/tools/build_handover_pdf.py</w:t>
+      </w:r>
+    </w:p>
+    <w:p>
+      <w:pPr>
+        <w:pStyle w:val="ListParagraph"/>
+        <w:numPr>
+          <w:ilvl w:val="0"/>
+          <w:numId w:val="2"/>
+        </w:numPr>
+      </w:pPr>
+      <w:r>
+        <w:rPr>
+          <w:rFonts w:ascii="Consolas" w:cs="Consolas" w:eastAsia="Consolas" w:hAnsi="Consolas"/>
+          <w:sz w:val="19"/>
+          <w:szCs w:val="19"/>
+        </w:rPr>
+        <w:t xml:space="preserve">docs/SplitStack_Handover_Prompts.pdf</w:t>
+      </w:r>
+    </w:p>
+    <w:p>
+      <w:pPr>
+        <w:spacing w:after="60" w:before="160"/>
+      </w:pPr>
+      <w:r>
+        <w:rPr>
+          <w:b/>
+          <w:bCs/>
+          <w:color w:val="4F46E5"/>
+          <w:spacing w:val="20"/>
+          <w:sz w:val="17"/>
+          <w:szCs w:val="17"/>
+        </w:rPr>
+        <w:t xml:space="preserve">RESULT</w:t>
+      </w:r>
+    </w:p>
+    <w:p>
+      <w:pPr>
+        <w:spacing w:after="80"/>
+      </w:pPr>
+      <w:r>
+        <w:rPr>
+          <w:sz w:val="21"/>
+          <w:szCs w:val="21"/>
+        </w:rPr>
+        <w:t xml:space="preserve">14-page PDF created. Changes against the planned prompts: P1 adds data-page attributes and client/js/package.json (type module) for node --test; P13 keeps the localStorage implementation as a demo mode (api-local.js chosen when /api/health does not answer) so the GitHub Pages site keeps working, instead of deleting it; P9 replaces deprecated csurf with a synchronizer token; P14 uses MongoMemoryReplSet because the API uses transactions; P15 asks for confirmation before deleting the Flask files and leaves Render account steps to the student.</w:t>
+      </w:r>
+    </w:p>
+    <w:p>
+      <w:pPr>
+        <w:spacing w:after="60" w:before="160"/>
+      </w:pPr>
+      <w:r>
+        <w:rPr>
+          <w:b/>
+          <w:bCs/>
+          <w:color w:val="4F46E5"/>
+          <w:spacing w:val="20"/>
+          <w:sz w:val="17"/>
+          <w:szCs w:val="17"/>
+        </w:rPr>
+        <w:t xml:space="preserve">VERIFICATION</w:t>
+      </w:r>
+    </w:p>
+    <w:p>
+      <w:pPr>
+        <w:spacing w:after="80"/>
+      </w:pPr>
+      <w:r>
+        <w:rPr>
+          <w:sz w:val="21"/>
+          <w:szCs w:val="21"/>
+        </w:rPr>
+        <w:t xml:space="preserve">Rendered pages with PyMuPDF and checked the layout of the setup, Prompt 0, step and utility pages.</w:t>
+      </w:r>
+    </w:p>
+    <w:p>
+      <w:pPr>
+        <w:pBdr>
+          <w:bottom w:val="single" w:color="D9DBE5" w:sz="4" w:space="4"/>
+        </w:pBdr>
+        <w:spacing w:after="200"/>
+      </w:pPr>
+      <w:r>
+        <w:t xml:space="preserve"/>
+      </w:r>
+    </w:p>
+    <w:p>
+      <w:r>
+        <w:br w:type="page"/>
+      </w:r>
+    </w:p>
+    <w:p>
+      <w:pPr>
+        <w:pStyle w:val="Heading1"/>
+      </w:pPr>
+      <w:r>
+        <w:t xml:space="preserve">Planned prompts to complete the project</w:t>
+      </w:r>
+    </w:p>
+    <w:p>
+      <w:pPr>
+        <w:spacing w:after="80"/>
+      </w:pPr>
+      <w:r>
+        <w:rPr>
+          <w:sz w:val="21"/>
+          <w:szCs w:val="21"/>
+        </w:rPr>
+        <w:t xml:space="preserve">These prompts have not been run yet. Run them in order; after each one, move it into the log above with its result.</w:t>
+      </w:r>
+    </w:p>
+    <w:p>
+      <w:pPr>
+        <w:pStyle w:val="Heading3"/>
+        <w:keepNext/>
+      </w:pPr>
+      <w:r>
+        <w:t xml:space="preserve">P1  Mongoose data models and MongoDB connection</w:t>
+      </w:r>
+    </w:p>
+    <w:p>
+      <w:pPr>
+        <w:keepNext/>
+        <w:spacing w:after="60"/>
+      </w:pPr>
+      <w:r>
+        <w:rPr>
+          <w:color w:val="5B6475"/>
+          <w:sz w:val="18"/>
+          <w:szCs w:val="18"/>
+        </w:rPr>
+        <w:t xml:space="preserve">Review 3  |  Planned prompt</w:t>
+      </w:r>
+    </w:p>
+    <w:p>
+      <w:pPr>
+        <w:spacing w:after="60" w:before="160"/>
+      </w:pPr>
+      <w:r>
+        <w:rPr>
+          <w:b/>
+          <w:bCs/>
+          <w:color w:val="4F46E5"/>
+          <w:spacing w:val="20"/>
+          <w:sz w:val="17"/>
+          <w:szCs w:val="17"/>
+        </w:rPr>
+        <w:t xml:space="preserve">PROMPT</w:t>
+      </w:r>
+    </w:p>
+    <w:p>
+      <w:pPr>
+        <w:pBdr>
+          <w:left w:val="single" w:color="4F46E5" w:sz="18" w:space="8"/>
+        </w:pBdr>
+        <w:shd w:fill="F1F2F8" w:color="auto" w:val="clear"/>
+        <w:spacing w:after="120" w:before="40" w:line="276"/>
+        <w:ind w:left="160" w:right="160"/>
+      </w:pPr>
+      <w:r>
+        <w:rPr>
+          <w:rFonts w:ascii="Consolas" w:cs="Consolas" w:eastAsia="Consolas" w:hAnsi="Consolas"/>
+          <w:sz w:val="19"/>
+          <w:szCs w:val="19"/>
+        </w:rPr>
+        <w:t xml:space="preserve">Connect Express to MongoDB Atlas with Mongoose using MONGODB_URI from server/.env. Design Mongoose schemas with validation and indexes to replace the 15 SQLite tables: User, Category, Expense, Income, Budget, Recurring, Group, SharedExpense, Settlement, ShoppingList, Receipt, and Insight. Add server/src/db.js to handle connection lifecycle and graceful shutdown.</w:t>
+      </w:r>
+    </w:p>
+    <w:p>
+      <w:pPr>
+        <w:spacing w:after="60" w:before="160"/>
+      </w:pPr>
+      <w:r>
+        <w:rPr>
+          <w:b/>
+          <w:bCs/>
+          <w:color w:val="4F46E5"/>
+          <w:spacing w:val="20"/>
+          <w:sz w:val="17"/>
+          <w:szCs w:val="17"/>
+        </w:rPr>
+        <w:t xml:space="preserve">PURPOSE</w:t>
+      </w:r>
+    </w:p>
+    <w:p>
+      <w:pPr>
+        <w:spacing w:after="80"/>
+      </w:pPr>
+      <w:r>
+        <w:rPr>
+          <w:sz w:val="21"/>
+          <w:szCs w:val="21"/>
+        </w:rPr>
+        <w:t xml:space="preserve">Establish MongoDB connection and Mongoose data models.</w:t>
+      </w:r>
+    </w:p>
+    <w:p>
+      <w:pPr>
+        <w:spacing w:after="60" w:before="160"/>
+      </w:pPr>
+      <w:r>
+        <w:rPr>
+          <w:b/>
+          <w:bCs/>
+          <w:color w:val="4F46E5"/>
+          <w:spacing w:val="20"/>
+          <w:sz w:val="17"/>
+          <w:szCs w:val="17"/>
+        </w:rPr>
+        <w:t xml:space="preserve">FILES</w:t>
+      </w:r>
+    </w:p>
+    <w:p>
+      <w:pPr>
+        <w:spacing w:after="80"/>
+      </w:pPr>
+      <w:r>
+        <w:rPr>
+          <w:sz w:val="21"/>
+          <w:szCs w:val="21"/>
+        </w:rPr>
+        <w:t xml:space="preserve">server/src/db.js, server/src/models/*.js</w:t>
       </w:r>
     </w:p>
     <w:p>

</xml_diff>

<commit_message>
Review 3: MongoDB connection and Mongoose models
</commit_message>
<xml_diff>
--- a/docs/SplitStack_Prompt_Log.docx
+++ b/docs/SplitStack_Prompt_Log.docx
@@ -132,7 +132,7 @@
           <w:sz w:val="21"/>
           <w:szCs w:val="21"/>
         </w:rPr>
-        <w:t xml:space="preserve">39</w:t>
+        <w:t xml:space="preserve">41</w:t>
       </w:r>
     </w:p>
     <w:p>
@@ -639,7 +639,7 @@
                 <w:sz w:val="18"/>
                 <w:szCs w:val="18"/>
               </w:rPr>
-              <w:t xml:space="preserve">2</w:t>
+              <w:t xml:space="preserve">4</w:t>
             </w:r>
           </w:p>
         </w:tc>
@@ -5480,6 +5480,245 @@
                 <w:szCs w:val="18"/>
               </w:rPr>
               <w:t xml:space="preserve">Express server foundation</w:t>
+            </w:r>
+          </w:p>
+        </w:tc>
+        <w:tc>
+          <w:tcPr>
+            <w:tcW w:type="dxa" w:w="1500"/>
+            <w:tcMar>
+              <w:top w:type="dxa" w:w="60"/>
+              <w:left w:type="dxa" w:w="100"/>
+              <w:bottom w:type="dxa" w:w="60"/>
+              <w:right w:type="dxa" w:w="100"/>
+            </w:tcMar>
+          </w:tcPr>
+          <w:p>
+            <w:r>
+              <w:rPr>
+                <w:b w:val="false"/>
+                <w:bCs w:val="false"/>
+                <w:color w:val="222222"/>
+                <w:sz w:val="18"/>
+                <w:szCs w:val="18"/>
+              </w:rPr>
+              <w:t xml:space="preserve">Working prompt</w:t>
+            </w:r>
+          </w:p>
+        </w:tc>
+        <w:tc>
+          <w:tcPr>
+            <w:tcW w:type="dxa" w:w="1400"/>
+            <w:tcMar>
+              <w:top w:type="dxa" w:w="60"/>
+              <w:left w:type="dxa" w:w="100"/>
+              <w:bottom w:type="dxa" w:w="60"/>
+              <w:right w:type="dxa" w:w="100"/>
+            </w:tcMar>
+          </w:tcPr>
+          <w:p>
+            <w:r>
+              <w:rPr>
+                <w:b w:val="false"/>
+                <w:bCs w:val="false"/>
+                <w:color w:val="222222"/>
+                <w:sz w:val="18"/>
+                <w:szCs w:val="18"/>
+              </w:rPr>
+              <w:t xml:space="preserve">2026-10-17</w:t>
+            </w:r>
+          </w:p>
+        </w:tc>
+      </w:tr>
+      <w:tr>
+        <w:tc>
+          <w:tcPr>
+            <w:tcW w:type="dxa" w:w="700"/>
+            <w:shd w:fill="F7F7FB" w:color="auto" w:val="clear"/>
+            <w:tcMar>
+              <w:top w:type="dxa" w:w="60"/>
+              <w:left w:type="dxa" w:w="100"/>
+              <w:bottom w:type="dxa" w:w="60"/>
+              <w:right w:type="dxa" w:w="100"/>
+            </w:tcMar>
+          </w:tcPr>
+          <w:p>
+            <w:r>
+              <w:rPr>
+                <w:b w:val="false"/>
+                <w:bCs w:val="false"/>
+                <w:color w:val="222222"/>
+                <w:sz w:val="18"/>
+                <w:szCs w:val="18"/>
+              </w:rPr>
+              <w:t xml:space="preserve">40</w:t>
+            </w:r>
+          </w:p>
+        </w:tc>
+        <w:tc>
+          <w:tcPr>
+            <w:tcW w:type="dxa" w:w="1500"/>
+            <w:shd w:fill="F7F7FB" w:color="auto" w:val="clear"/>
+            <w:tcMar>
+              <w:top w:type="dxa" w:w="60"/>
+              <w:left w:type="dxa" w:w="100"/>
+              <w:bottom w:type="dxa" w:w="60"/>
+              <w:right w:type="dxa" w:w="100"/>
+            </w:tcMar>
+          </w:tcPr>
+          <w:p>
+            <w:r>
+              <w:rPr>
+                <w:b w:val="false"/>
+                <w:bCs w:val="false"/>
+                <w:color w:val="222222"/>
+                <w:sz w:val="18"/>
+                <w:szCs w:val="18"/>
+              </w:rPr>
+              <w:t xml:space="preserve">Review 3</w:t>
+            </w:r>
+          </w:p>
+        </w:tc>
+        <w:tc>
+          <w:tcPr>
+            <w:tcW w:type="dxa" w:w="4538"/>
+            <w:shd w:fill="F7F7FB" w:color="auto" w:val="clear"/>
+            <w:tcMar>
+              <w:top w:type="dxa" w:w="60"/>
+              <w:left w:type="dxa" w:w="100"/>
+              <w:bottom w:type="dxa" w:w="60"/>
+              <w:right w:type="dxa" w:w="100"/>
+            </w:tcMar>
+          </w:tcPr>
+          <w:p>
+            <w:r>
+              <w:rPr>
+                <w:b w:val="false"/>
+                <w:bCs w:val="false"/>
+                <w:color w:val="222222"/>
+                <w:sz w:val="18"/>
+                <w:szCs w:val="18"/>
+              </w:rPr>
+              <w:t xml:space="preserve">Request: proceed with Review 3 Step P10</w:t>
+            </w:r>
+          </w:p>
+        </w:tc>
+        <w:tc>
+          <w:tcPr>
+            <w:tcW w:type="dxa" w:w="1500"/>
+            <w:shd w:fill="F7F7FB" w:color="auto" w:val="clear"/>
+            <w:tcMar>
+              <w:top w:type="dxa" w:w="60"/>
+              <w:left w:type="dxa" w:w="100"/>
+              <w:bottom w:type="dxa" w:w="60"/>
+              <w:right w:type="dxa" w:w="100"/>
+            </w:tcMar>
+          </w:tcPr>
+          <w:p>
+            <w:r>
+              <w:rPr>
+                <w:b w:val="false"/>
+                <w:bCs w:val="false"/>
+                <w:color w:val="222222"/>
+                <w:sz w:val="18"/>
+                <w:szCs w:val="18"/>
+              </w:rPr>
+              <w:t xml:space="preserve">User prompt</w:t>
+            </w:r>
+          </w:p>
+        </w:tc>
+        <w:tc>
+          <w:tcPr>
+            <w:tcW w:type="dxa" w:w="1400"/>
+            <w:shd w:fill="F7F7FB" w:color="auto" w:val="clear"/>
+            <w:tcMar>
+              <w:top w:type="dxa" w:w="60"/>
+              <w:left w:type="dxa" w:w="100"/>
+              <w:bottom w:type="dxa" w:w="60"/>
+              <w:right w:type="dxa" w:w="100"/>
+            </w:tcMar>
+          </w:tcPr>
+          <w:p>
+            <w:r>
+              <w:rPr>
+                <w:b w:val="false"/>
+                <w:bCs w:val="false"/>
+                <w:color w:val="222222"/>
+                <w:sz w:val="18"/>
+                <w:szCs w:val="18"/>
+              </w:rPr>
+              <w:t xml:space="preserve">2026-10-17</w:t>
+            </w:r>
+          </w:p>
+        </w:tc>
+      </w:tr>
+      <w:tr>
+        <w:tc>
+          <w:tcPr>
+            <w:tcW w:type="dxa" w:w="700"/>
+            <w:tcMar>
+              <w:top w:type="dxa" w:w="60"/>
+              <w:left w:type="dxa" w:w="100"/>
+              <w:bottom w:type="dxa" w:w="60"/>
+              <w:right w:type="dxa" w:w="100"/>
+            </w:tcMar>
+          </w:tcPr>
+          <w:p>
+            <w:r>
+              <w:rPr>
+                <w:b w:val="false"/>
+                <w:bCs w:val="false"/>
+                <w:color w:val="222222"/>
+                <w:sz w:val="18"/>
+                <w:szCs w:val="18"/>
+              </w:rPr>
+              <w:t xml:space="preserve">41</w:t>
+            </w:r>
+          </w:p>
+        </w:tc>
+        <w:tc>
+          <w:tcPr>
+            <w:tcW w:type="dxa" w:w="1500"/>
+            <w:tcMar>
+              <w:top w:type="dxa" w:w="60"/>
+              <w:left w:type="dxa" w:w="100"/>
+              <w:bottom w:type="dxa" w:w="60"/>
+              <w:right w:type="dxa" w:w="100"/>
+            </w:tcMar>
+          </w:tcPr>
+          <w:p>
+            <w:r>
+              <w:rPr>
+                <w:b w:val="false"/>
+                <w:bCs w:val="false"/>
+                <w:color w:val="222222"/>
+                <w:sz w:val="18"/>
+                <w:szCs w:val="18"/>
+              </w:rPr>
+              <w:t xml:space="preserve">Review 3</w:t>
+            </w:r>
+          </w:p>
+        </w:tc>
+        <w:tc>
+          <w:tcPr>
+            <w:tcW w:type="dxa" w:w="4538"/>
+            <w:tcMar>
+              <w:top w:type="dxa" w:w="60"/>
+              <w:left w:type="dxa" w:w="100"/>
+              <w:bottom w:type="dxa" w:w="60"/>
+              <w:right w:type="dxa" w:w="100"/>
+            </w:tcMar>
+          </w:tcPr>
+          <w:p>
+            <w:r>
+              <w:rPr>
+                <w:b w:val="false"/>
+                <w:bCs w:val="false"/>
+                <w:color w:val="222222"/>
+                <w:sz w:val="18"/>
+                <w:szCs w:val="18"/>
+              </w:rPr>
+              <w:t xml:space="preserve">MongoDB connection and Mongoose data models</w:t>
             </w:r>
           </w:p>
         </w:tc>
@@ -13504,20 +13743,11 @@
     </w:p>
     <w:p>
       <w:pPr>
-        <w:pStyle w:val="Heading2"/>
-        <w:spacing w:before="360"/>
-      </w:pPr>
-      <w:r>
-        <w:t xml:space="preserve">Wrap-up - Documentation, cleanup and deployment</w:t>
-      </w:r>
-    </w:p>
-    <w:p>
-      <w:pPr>
         <w:pStyle w:val="Heading3"/>
         <w:keepNext/>
       </w:pPr>
       <w:r>
-        <w:t xml:space="preserve">#13  Request: GitHub repository, website link and PDF of prompts</w:t>
+        <w:t xml:space="preserve">#40  Request: proceed with Review 3 Step P10</w:t>
       </w:r>
     </w:p>
     <w:p>
@@ -13531,7 +13761,7 @@
           <w:sz w:val="18"/>
           <w:szCs w:val="18"/>
         </w:rPr>
-        <w:t xml:space="preserve">User prompt  |  2026-10-15</w:t>
+        <w:t xml:space="preserve">User prompt  |  2026-10-17</w:t>
       </w:r>
     </w:p>
     <w:p>
@@ -13565,7 +13795,51 @@
           <w:sz w:val="19"/>
           <w:szCs w:val="19"/>
         </w:rPr>
-        <w:t xml:space="preserve">create a new repositry for this project in my gihub , and after than give me the github link and then the website link and also a pdf containing the prompts to complete project.</w:t>
+        <w:t xml:space="preserve"># P10 — Review 3: MongoDB Connection and Mongoose Data Models
+Continue the SplitStack project from the current refurbish branch. P9 is reported complete with local commit 30a4d60. Implement P10 only.
+## 1. Safety rules
+- Verify the current branch, working tree, and latest commit before editing.
+- Work only on refurbish.
+- Do not push to any remote.
+- Do not reset, rebase, amend commits, or discard changes.
+- Preserve the complete legacy Flask application and all existing docs/audit/ evidence.
+- Do not implement P11 authentication or REST resource endpoints, P12 OCR/file storage, or P13 frontend API integration.
+- Never expose or commit real database credentials, secrets, or production connection strings.
+## 2. Inspect before coding
+- Read server/package.json, server/src/config.js, server/src/app.js, existing tests, and the client API/data contracts.
+- Check the existing roadmap and project documentation for required data entities and relationships.
+- Determine which models are explicitly supported by the project requirements.
+- Review existing dependencies and lockfiles before making changes.
+## 3. MongoDB configuration
+- Add Mongoose as a server dependency using a compatible version and update the server lockfile.
+- Implement a dedicated database connection module.
+- Read the MongoDB connection URI from an environment variable such as MONGODB_URI.
+- Update server/.env.example with a clearly fake local-development URI and any required database settings.
+- Validate configuration and produce safe, actionable errors without printing secrets.
+- Make database connection and disconnection functions explicit and testable.
+- Ensure importing the Express app does not automatically require a live database connection.
+- Update server startup to connect to MongoDB before accepting requests. If the connection fails, log a sanitized error and exit nonzero. Handle graceful shutdown without leaving connections open.
+- Do not claim a database connection succeeded unless it was actually tested against a reachable MongoDB instance.
+## 4. Mongoose models
+- Define schemas and models for the entities required by the documented SplitStack domain.
+- Start by mapping existing documented entities: users, groups, expenses, participants/splits, settlements, budgets, recurring expenses, shopping lists/items, and receipts.
+- Avoid redundant models where embedded documents are a better fit. Explain major schema decisions.
+- Add appropriate field types, required constraints, enums, timestamps, indexes, and references where justified.
+- Validate monetary fields and document whether stored values use integer paise, consistent with the existing client contract.
+- Keep sensitive user fields out of ordinary serialization and never include passwords or secrets in logs.
+## 5. Tests
+- Add tests for schema validation, required fields, enum constraints, relationships/references, and monetary validation.
+- Prefer isolated tests that do not require an external MongoDB instance.
+- Run npm run test:server and npm run test:client.
+- Run npm run lint:html if any frontend files change.
+## 6. Documentation and audit
+- Update server/README.md with database configuration, model overview, startup behavior, and testing instructions.
+- Add a P10 audit report in docs/audit/.
+- Update the prompt log and regenerate its DOCX/PDF using the existing npm run log workflow.
+## 7. Commit
+- Commit message: Review 3: MongoDB connection and Mongoose models
+- Do not push.
+## 8. Final report</w:t>
       </w:r>
     </w:p>
     <w:p>
@@ -13593,7 +13867,7 @@
           <w:sz w:val="21"/>
           <w:szCs w:val="21"/>
         </w:rPr>
-        <w:t xml:space="preserve">Publish the project under the student's own GitHub account, host the site, and export the prompt log (including the remaining planned prompts) as a PDF.</w:t>
+        <w:t xml:space="preserve">Authorize execution of Step P10: MongoDB connection lifecycle and 12 Mongoose data models.</w:t>
       </w:r>
     </w:p>
     <w:p>
@@ -13654,7 +13928,7 @@
           <w:sz w:val="21"/>
           <w:szCs w:val="21"/>
         </w:rPr>
-        <w:t xml:space="preserve">Done: see the following entries.</w:t>
+        <w:t xml:space="preserve">Authorized Step P10 implementation.</w:t>
       </w:r>
     </w:p>
     <w:p>
@@ -13702,7 +13976,7 @@
         <w:keepNext/>
       </w:pPr>
       <w:r>
-        <w:t xml:space="preserve">#14  PDF export of the prompt log, including planned prompts</w:t>
+        <w:t xml:space="preserve">#41  MongoDB connection and Mongoose data models</w:t>
       </w:r>
     </w:p>
     <w:p>
@@ -13716,7 +13990,7 @@
           <w:sz w:val="18"/>
           <w:szCs w:val="18"/>
         </w:rPr>
-        <w:t xml:space="preserve">Working prompt  |  2026-10-15</w:t>
+        <w:t xml:space="preserve">Working prompt  |  2026-10-17</w:t>
       </w:r>
     </w:p>
     <w:p>
@@ -13750,7 +14024,7 @@
           <w:sz w:val="19"/>
           <w:szCs w:val="19"/>
         </w:rPr>
-        <w:t xml:space="preserve">Export the prompt log to PDF with a Python reportlab script (docs/tools/build_prompt_pdf.py) that reads docs/prompt_log.json: a title page, a stage overview table, a summary of every entry, Part A with every executed prompt verbatim in a shaded box with purpose, files, result and verification, and Part B with the planned prompts that complete Review 2, Review 3 and the wrap-up, clearly marked as not yet run. Add the planned prompts to prompt_log.json and to the Word log as well, and make "npm run log" rebuild both documents.</w:t>
+        <w:t xml:space="preserve">Install mongoose in server/; update server/src/config.js with mongodbUri; create server/src/db.js with connectDb, disconnectDb, sanitizeMongoUri, and readyState tracking; update server/src/app.js health check with database connection status; update server/src/index.js to connect to MongoDB before listening and handle graceful shutdown; create server/src/models/validators.js for integer paise and RFC email validation; create 12 Mongoose models in server/src/models/ (User, Category, Expense, Income, Budget, Recurring, Group, SharedExpense, Settlement, ShoppingList, Receipt, Insight) matching client data contracts with integer-paise validation, embedded subdocuments (members, shares, checklist items), and toJSON password stripping; create server/tests/models.test.js with 31 unit tests for schema validation, constraints, and URI sanitization; update server/README.md and server/.env.example; document P10 audit in docs/audit/P10_MONGOOSE_MODELS_AUDIT.md and update prompt logs.</w:t>
       </w:r>
     </w:p>
     <w:p>
@@ -13778,7 +14052,7 @@
           <w:sz w:val="21"/>
           <w:szCs w:val="21"/>
         </w:rPr>
-        <w:t xml:space="preserve">Give the student a PDF containing the prompts needed to complete the whole project.</w:t>
+        <w:t xml:space="preserve">Implement the persistent MongoDB connection lifecycle and 12 Mongoose data models matching the SplitStack domain.</w:t>
       </w:r>
     </w:p>
     <w:p>
@@ -13811,24 +14085,398 @@
           <w:sz w:val="19"/>
           <w:szCs w:val="19"/>
         </w:rPr>
-        <w:t xml:space="preserve">docs/tools/build_prompt_pdf.py</w:t>
-      </w:r>
-    </w:p>
-    <w:p>
-      <w:pPr>
-        <w:pStyle w:val="ListParagraph"/>
-        <w:numPr>
-          <w:ilvl w:val="0"/>
-          <w:numId w:val="2"/>
-        </w:numPr>
-      </w:pPr>
-      <w:r>
-        <w:rPr>
-          <w:rFonts w:ascii="Consolas" w:cs="Consolas" w:eastAsia="Consolas" w:hAnsi="Consolas"/>
-          <w:sz w:val="19"/>
-          <w:szCs w:val="19"/>
-        </w:rPr>
-        <w:t xml:space="preserve">docs/tools/build-prompt-log.js</w:t>
+        <w:t xml:space="preserve">server/package.json</w:t>
+      </w:r>
+    </w:p>
+    <w:p>
+      <w:pPr>
+        <w:pStyle w:val="ListParagraph"/>
+        <w:numPr>
+          <w:ilvl w:val="0"/>
+          <w:numId w:val="2"/>
+        </w:numPr>
+      </w:pPr>
+      <w:r>
+        <w:rPr>
+          <w:rFonts w:ascii="Consolas" w:cs="Consolas" w:eastAsia="Consolas" w:hAnsi="Consolas"/>
+          <w:sz w:val="19"/>
+          <w:szCs w:val="19"/>
+        </w:rPr>
+        <w:t xml:space="preserve">server/package-lock.json</w:t>
+      </w:r>
+    </w:p>
+    <w:p>
+      <w:pPr>
+        <w:pStyle w:val="ListParagraph"/>
+        <w:numPr>
+          <w:ilvl w:val="0"/>
+          <w:numId w:val="2"/>
+        </w:numPr>
+      </w:pPr>
+      <w:r>
+        <w:rPr>
+          <w:rFonts w:ascii="Consolas" w:cs="Consolas" w:eastAsia="Consolas" w:hAnsi="Consolas"/>
+          <w:sz w:val="19"/>
+          <w:szCs w:val="19"/>
+        </w:rPr>
+        <w:t xml:space="preserve">server/.env.example</w:t>
+      </w:r>
+    </w:p>
+    <w:p>
+      <w:pPr>
+        <w:pStyle w:val="ListParagraph"/>
+        <w:numPr>
+          <w:ilvl w:val="0"/>
+          <w:numId w:val="2"/>
+        </w:numPr>
+      </w:pPr>
+      <w:r>
+        <w:rPr>
+          <w:rFonts w:ascii="Consolas" w:cs="Consolas" w:eastAsia="Consolas" w:hAnsi="Consolas"/>
+          <w:sz w:val="19"/>
+          <w:szCs w:val="19"/>
+        </w:rPr>
+        <w:t xml:space="preserve">server/src/config.js</w:t>
+      </w:r>
+    </w:p>
+    <w:p>
+      <w:pPr>
+        <w:pStyle w:val="ListParagraph"/>
+        <w:numPr>
+          <w:ilvl w:val="0"/>
+          <w:numId w:val="2"/>
+        </w:numPr>
+      </w:pPr>
+      <w:r>
+        <w:rPr>
+          <w:rFonts w:ascii="Consolas" w:cs="Consolas" w:eastAsia="Consolas" w:hAnsi="Consolas"/>
+          <w:sz w:val="19"/>
+          <w:szCs w:val="19"/>
+        </w:rPr>
+        <w:t xml:space="preserve">server/src/db.js</w:t>
+      </w:r>
+    </w:p>
+    <w:p>
+      <w:pPr>
+        <w:pStyle w:val="ListParagraph"/>
+        <w:numPr>
+          <w:ilvl w:val="0"/>
+          <w:numId w:val="2"/>
+        </w:numPr>
+      </w:pPr>
+      <w:r>
+        <w:rPr>
+          <w:rFonts w:ascii="Consolas" w:cs="Consolas" w:eastAsia="Consolas" w:hAnsi="Consolas"/>
+          <w:sz w:val="19"/>
+          <w:szCs w:val="19"/>
+        </w:rPr>
+        <w:t xml:space="preserve">server/src/app.js</w:t>
+      </w:r>
+    </w:p>
+    <w:p>
+      <w:pPr>
+        <w:pStyle w:val="ListParagraph"/>
+        <w:numPr>
+          <w:ilvl w:val="0"/>
+          <w:numId w:val="2"/>
+        </w:numPr>
+      </w:pPr>
+      <w:r>
+        <w:rPr>
+          <w:rFonts w:ascii="Consolas" w:cs="Consolas" w:eastAsia="Consolas" w:hAnsi="Consolas"/>
+          <w:sz w:val="19"/>
+          <w:szCs w:val="19"/>
+        </w:rPr>
+        <w:t xml:space="preserve">server/src/index.js</w:t>
+      </w:r>
+    </w:p>
+    <w:p>
+      <w:pPr>
+        <w:pStyle w:val="ListParagraph"/>
+        <w:numPr>
+          <w:ilvl w:val="0"/>
+          <w:numId w:val="2"/>
+        </w:numPr>
+      </w:pPr>
+      <w:r>
+        <w:rPr>
+          <w:rFonts w:ascii="Consolas" w:cs="Consolas" w:eastAsia="Consolas" w:hAnsi="Consolas"/>
+          <w:sz w:val="19"/>
+          <w:szCs w:val="19"/>
+        </w:rPr>
+        <w:t xml:space="preserve">server/src/models/validators.js</w:t>
+      </w:r>
+    </w:p>
+    <w:p>
+      <w:pPr>
+        <w:pStyle w:val="ListParagraph"/>
+        <w:numPr>
+          <w:ilvl w:val="0"/>
+          <w:numId w:val="2"/>
+        </w:numPr>
+      </w:pPr>
+      <w:r>
+        <w:rPr>
+          <w:rFonts w:ascii="Consolas" w:cs="Consolas" w:eastAsia="Consolas" w:hAnsi="Consolas"/>
+          <w:sz w:val="19"/>
+          <w:szCs w:val="19"/>
+        </w:rPr>
+        <w:t xml:space="preserve">server/src/models/User.js</w:t>
+      </w:r>
+    </w:p>
+    <w:p>
+      <w:pPr>
+        <w:pStyle w:val="ListParagraph"/>
+        <w:numPr>
+          <w:ilvl w:val="0"/>
+          <w:numId w:val="2"/>
+        </w:numPr>
+      </w:pPr>
+      <w:r>
+        <w:rPr>
+          <w:rFonts w:ascii="Consolas" w:cs="Consolas" w:eastAsia="Consolas" w:hAnsi="Consolas"/>
+          <w:sz w:val="19"/>
+          <w:szCs w:val="19"/>
+        </w:rPr>
+        <w:t xml:space="preserve">server/src/models/Category.js</w:t>
+      </w:r>
+    </w:p>
+    <w:p>
+      <w:pPr>
+        <w:pStyle w:val="ListParagraph"/>
+        <w:numPr>
+          <w:ilvl w:val="0"/>
+          <w:numId w:val="2"/>
+        </w:numPr>
+      </w:pPr>
+      <w:r>
+        <w:rPr>
+          <w:rFonts w:ascii="Consolas" w:cs="Consolas" w:eastAsia="Consolas" w:hAnsi="Consolas"/>
+          <w:sz w:val="19"/>
+          <w:szCs w:val="19"/>
+        </w:rPr>
+        <w:t xml:space="preserve">server/src/models/Expense.js</w:t>
+      </w:r>
+    </w:p>
+    <w:p>
+      <w:pPr>
+        <w:pStyle w:val="ListParagraph"/>
+        <w:numPr>
+          <w:ilvl w:val="0"/>
+          <w:numId w:val="2"/>
+        </w:numPr>
+      </w:pPr>
+      <w:r>
+        <w:rPr>
+          <w:rFonts w:ascii="Consolas" w:cs="Consolas" w:eastAsia="Consolas" w:hAnsi="Consolas"/>
+          <w:sz w:val="19"/>
+          <w:szCs w:val="19"/>
+        </w:rPr>
+        <w:t xml:space="preserve">server/src/models/Income.js</w:t>
+      </w:r>
+    </w:p>
+    <w:p>
+      <w:pPr>
+        <w:pStyle w:val="ListParagraph"/>
+        <w:numPr>
+          <w:ilvl w:val="0"/>
+          <w:numId w:val="2"/>
+        </w:numPr>
+      </w:pPr>
+      <w:r>
+        <w:rPr>
+          <w:rFonts w:ascii="Consolas" w:cs="Consolas" w:eastAsia="Consolas" w:hAnsi="Consolas"/>
+          <w:sz w:val="19"/>
+          <w:szCs w:val="19"/>
+        </w:rPr>
+        <w:t xml:space="preserve">server/src/models/Budget.js</w:t>
+      </w:r>
+    </w:p>
+    <w:p>
+      <w:pPr>
+        <w:pStyle w:val="ListParagraph"/>
+        <w:numPr>
+          <w:ilvl w:val="0"/>
+          <w:numId w:val="2"/>
+        </w:numPr>
+      </w:pPr>
+      <w:r>
+        <w:rPr>
+          <w:rFonts w:ascii="Consolas" w:cs="Consolas" w:eastAsia="Consolas" w:hAnsi="Consolas"/>
+          <w:sz w:val="19"/>
+          <w:szCs w:val="19"/>
+        </w:rPr>
+        <w:t xml:space="preserve">server/src/models/Recurring.js</w:t>
+      </w:r>
+    </w:p>
+    <w:p>
+      <w:pPr>
+        <w:pStyle w:val="ListParagraph"/>
+        <w:numPr>
+          <w:ilvl w:val="0"/>
+          <w:numId w:val="2"/>
+        </w:numPr>
+      </w:pPr>
+      <w:r>
+        <w:rPr>
+          <w:rFonts w:ascii="Consolas" w:cs="Consolas" w:eastAsia="Consolas" w:hAnsi="Consolas"/>
+          <w:sz w:val="19"/>
+          <w:szCs w:val="19"/>
+        </w:rPr>
+        <w:t xml:space="preserve">server/src/models/Group.js</w:t>
+      </w:r>
+    </w:p>
+    <w:p>
+      <w:pPr>
+        <w:pStyle w:val="ListParagraph"/>
+        <w:numPr>
+          <w:ilvl w:val="0"/>
+          <w:numId w:val="2"/>
+        </w:numPr>
+      </w:pPr>
+      <w:r>
+        <w:rPr>
+          <w:rFonts w:ascii="Consolas" w:cs="Consolas" w:eastAsia="Consolas" w:hAnsi="Consolas"/>
+          <w:sz w:val="19"/>
+          <w:szCs w:val="19"/>
+        </w:rPr>
+        <w:t xml:space="preserve">server/src/models/SharedExpense.js</w:t>
+      </w:r>
+    </w:p>
+    <w:p>
+      <w:pPr>
+        <w:pStyle w:val="ListParagraph"/>
+        <w:numPr>
+          <w:ilvl w:val="0"/>
+          <w:numId w:val="2"/>
+        </w:numPr>
+      </w:pPr>
+      <w:r>
+        <w:rPr>
+          <w:rFonts w:ascii="Consolas" w:cs="Consolas" w:eastAsia="Consolas" w:hAnsi="Consolas"/>
+          <w:sz w:val="19"/>
+          <w:szCs w:val="19"/>
+        </w:rPr>
+        <w:t xml:space="preserve">server/src/models/Settlement.js</w:t>
+      </w:r>
+    </w:p>
+    <w:p>
+      <w:pPr>
+        <w:pStyle w:val="ListParagraph"/>
+        <w:numPr>
+          <w:ilvl w:val="0"/>
+          <w:numId w:val="2"/>
+        </w:numPr>
+      </w:pPr>
+      <w:r>
+        <w:rPr>
+          <w:rFonts w:ascii="Consolas" w:cs="Consolas" w:eastAsia="Consolas" w:hAnsi="Consolas"/>
+          <w:sz w:val="19"/>
+          <w:szCs w:val="19"/>
+        </w:rPr>
+        <w:t xml:space="preserve">server/src/models/ShoppingList.js</w:t>
+      </w:r>
+    </w:p>
+    <w:p>
+      <w:pPr>
+        <w:pStyle w:val="ListParagraph"/>
+        <w:numPr>
+          <w:ilvl w:val="0"/>
+          <w:numId w:val="2"/>
+        </w:numPr>
+      </w:pPr>
+      <w:r>
+        <w:rPr>
+          <w:rFonts w:ascii="Consolas" w:cs="Consolas" w:eastAsia="Consolas" w:hAnsi="Consolas"/>
+          <w:sz w:val="19"/>
+          <w:szCs w:val="19"/>
+        </w:rPr>
+        <w:t xml:space="preserve">server/src/models/Receipt.js</w:t>
+      </w:r>
+    </w:p>
+    <w:p>
+      <w:pPr>
+        <w:pStyle w:val="ListParagraph"/>
+        <w:numPr>
+          <w:ilvl w:val="0"/>
+          <w:numId w:val="2"/>
+        </w:numPr>
+      </w:pPr>
+      <w:r>
+        <w:rPr>
+          <w:rFonts w:ascii="Consolas" w:cs="Consolas" w:eastAsia="Consolas" w:hAnsi="Consolas"/>
+          <w:sz w:val="19"/>
+          <w:szCs w:val="19"/>
+        </w:rPr>
+        <w:t xml:space="preserve">server/src/models/Insight.js</w:t>
+      </w:r>
+    </w:p>
+    <w:p>
+      <w:pPr>
+        <w:pStyle w:val="ListParagraph"/>
+        <w:numPr>
+          <w:ilvl w:val="0"/>
+          <w:numId w:val="2"/>
+        </w:numPr>
+      </w:pPr>
+      <w:r>
+        <w:rPr>
+          <w:rFonts w:ascii="Consolas" w:cs="Consolas" w:eastAsia="Consolas" w:hAnsi="Consolas"/>
+          <w:sz w:val="19"/>
+          <w:szCs w:val="19"/>
+        </w:rPr>
+        <w:t xml:space="preserve">server/src/models/index.js</w:t>
+      </w:r>
+    </w:p>
+    <w:p>
+      <w:pPr>
+        <w:pStyle w:val="ListParagraph"/>
+        <w:numPr>
+          <w:ilvl w:val="0"/>
+          <w:numId w:val="2"/>
+        </w:numPr>
+      </w:pPr>
+      <w:r>
+        <w:rPr>
+          <w:rFonts w:ascii="Consolas" w:cs="Consolas" w:eastAsia="Consolas" w:hAnsi="Consolas"/>
+          <w:sz w:val="19"/>
+          <w:szCs w:val="19"/>
+        </w:rPr>
+        <w:t xml:space="preserve">server/tests/models.test.js</w:t>
+      </w:r>
+    </w:p>
+    <w:p>
+      <w:pPr>
+        <w:pStyle w:val="ListParagraph"/>
+        <w:numPr>
+          <w:ilvl w:val="0"/>
+          <w:numId w:val="2"/>
+        </w:numPr>
+      </w:pPr>
+      <w:r>
+        <w:rPr>
+          <w:rFonts w:ascii="Consolas" w:cs="Consolas" w:eastAsia="Consolas" w:hAnsi="Consolas"/>
+          <w:sz w:val="19"/>
+          <w:szCs w:val="19"/>
+        </w:rPr>
+        <w:t xml:space="preserve">server/README.md</w:t>
+      </w:r>
+    </w:p>
+    <w:p>
+      <w:pPr>
+        <w:pStyle w:val="ListParagraph"/>
+        <w:numPr>
+          <w:ilvl w:val="0"/>
+          <w:numId w:val="2"/>
+        </w:numPr>
+      </w:pPr>
+      <w:r>
+        <w:rPr>
+          <w:rFonts w:ascii="Consolas" w:cs="Consolas" w:eastAsia="Consolas" w:hAnsi="Consolas"/>
+          <w:sz w:val="19"/>
+          <w:szCs w:val="19"/>
+        </w:rPr>
+        <w:t xml:space="preserve">docs/audit/P10_MONGOOSE_MODELS_AUDIT.md</w:t>
       </w:r>
     </w:p>
     <w:p>
@@ -13862,41 +14510,24 @@
           <w:sz w:val="19"/>
           <w:szCs w:val="19"/>
         </w:rPr>
+        <w:t xml:space="preserve">docs/SplitStack_Prompt_Log.docx</w:t>
+      </w:r>
+    </w:p>
+    <w:p>
+      <w:pPr>
+        <w:pStyle w:val="ListParagraph"/>
+        <w:numPr>
+          <w:ilvl w:val="0"/>
+          <w:numId w:val="2"/>
+        </w:numPr>
+      </w:pPr>
+      <w:r>
+        <w:rPr>
+          <w:rFonts w:ascii="Consolas" w:cs="Consolas" w:eastAsia="Consolas" w:hAnsi="Consolas"/>
+          <w:sz w:val="19"/>
+          <w:szCs w:val="19"/>
+        </w:rPr>
         <w:t xml:space="preserve">docs/SplitStack_Prompt_Log.pdf</w:t>
-      </w:r>
-    </w:p>
-    <w:p>
-      <w:pPr>
-        <w:pStyle w:val="ListParagraph"/>
-        <w:numPr>
-          <w:ilvl w:val="0"/>
-          <w:numId w:val="2"/>
-        </w:numPr>
-      </w:pPr>
-      <w:r>
-        <w:rPr>
-          <w:rFonts w:ascii="Consolas" w:cs="Consolas" w:eastAsia="Consolas" w:hAnsi="Consolas"/>
-          <w:sz w:val="19"/>
-          <w:szCs w:val="19"/>
-        </w:rPr>
-        <w:t xml:space="preserve">docs/SplitStack_Prompt_Log.docx</w:t>
-      </w:r>
-    </w:p>
-    <w:p>
-      <w:pPr>
-        <w:pStyle w:val="ListParagraph"/>
-        <w:numPr>
-          <w:ilvl w:val="0"/>
-          <w:numId w:val="2"/>
-        </w:numPr>
-      </w:pPr>
-      <w:r>
-        <w:rPr>
-          <w:rFonts w:ascii="Consolas" w:cs="Consolas" w:eastAsia="Consolas" w:hAnsi="Consolas"/>
-          <w:sz w:val="19"/>
-          <w:szCs w:val="19"/>
-        </w:rPr>
-        <w:t xml:space="preserve">package.json</w:t>
       </w:r>
     </w:p>
     <w:p>
@@ -13924,7 +14555,7 @@
           <w:sz w:val="21"/>
           <w:szCs w:val="21"/>
         </w:rPr>
-        <w:t xml:space="preserve">PDF with the executed prompts and 15 planned prompts; the Word log has the same content.</w:t>
+        <w:t xml:space="preserve">Created database connection manager and 12 validated Mongoose models with integer-paise monetary enforcement; all 38 server tests passing across 19 suites; client test suite (176 tests) and HTML linter (25 files) clean; documentation updated.</w:t>
       </w:r>
     </w:p>
     <w:p>
@@ -13952,7 +14583,7 @@
           <w:sz w:val="21"/>
           <w:szCs w:val="21"/>
         </w:rPr>
-        <w:t xml:space="preserve">Pages rendered to images and inspected; text extracted with pypdf.</w:t>
+        <w:t xml:space="preserve">npm run test:server (38 passed, 0 failed); npm run test:client (176 passed, 0 failed); npm run lint:html (0 errors).</w:t>
       </w:r>
     </w:p>
     <w:p>
@@ -13968,11 +14599,20 @@
     </w:p>
     <w:p>
       <w:pPr>
+        <w:pStyle w:val="Heading2"/>
+        <w:spacing w:before="360"/>
+      </w:pPr>
+      <w:r>
+        <w:t xml:space="preserve">Wrap-up - Documentation, cleanup and deployment</w:t>
+      </w:r>
+    </w:p>
+    <w:p>
+      <w:pPr>
         <w:pStyle w:val="Heading3"/>
         <w:keepNext/>
       </w:pPr>
       <w:r>
-        <w:t xml:space="preserve">#15  Create the GitHub repository and push the code</w:t>
+        <w:t xml:space="preserve">#13  Request: GitHub repository, website link and PDF of prompts</w:t>
       </w:r>
     </w:p>
     <w:p>
@@ -13986,7 +14626,7 @@
           <w:sz w:val="18"/>
           <w:szCs w:val="18"/>
         </w:rPr>
-        <w:t xml:space="preserve">Working prompt  |  2026-10-15</w:t>
+        <w:t xml:space="preserve">User prompt  |  2026-10-15</w:t>
       </w:r>
     </w:p>
     <w:p>
@@ -14020,7 +14660,7 @@
           <w:sz w:val="19"/>
           <w:szCs w:val="19"/>
         </w:rPr>
-        <w:t xml:space="preserve">Install the official GitHub CLI with winget and sign in through the device-code flow (the student approves it in the browser). Before publishing, check that no secrets or databases are tracked, review the receipt images that are still in the commit history (they are generic sample invoices), and confirm with the student that a public repository is acceptable because the team's original repository is private. Then create the public repository MahaprabhuK/SplitStack, push the refurbish branch as main together with the legacy branch, add a GitHub Actions workflow (.github/workflows/pages.yml) that deploys the client/ folder to GitHub Pages, enable Pages with the "GitHub Actions" source, and confirm that the site responds.</w:t>
+        <w:t xml:space="preserve">create a new repositry for this project in my gihub , and after than give me the github link and then the website link and also a pdf containing the prompts to complete project.</w:t>
       </w:r>
     </w:p>
     <w:p>
@@ -14048,7 +14688,7 @@
           <w:sz w:val="21"/>
           <w:szCs w:val="21"/>
         </w:rPr>
-        <w:t xml:space="preserve">Give the student a repository link and a live website link.</w:t>
+        <w:t xml:space="preserve">Publish the project under the student's own GitHub account, host the site, and export the prompt log (including the remaining planned prompts) as a PDF.</w:t>
       </w:r>
     </w:p>
     <w:p>
@@ -14081,7 +14721,7 @@
           <w:sz w:val="19"/>
           <w:szCs w:val="19"/>
         </w:rPr>
-        <w:t xml:space="preserve">README.md</w:t>
+        <w:t xml:space="preserve">-</w:t>
       </w:r>
     </w:p>
     <w:p>
@@ -14109,7 +14749,7 @@
           <w:sz w:val="21"/>
           <w:szCs w:val="21"/>
         </w:rPr>
-        <w:t xml:space="preserve">Public repository https://github.com/MahaprabhuK/SplitStack created and the legacy branch pushed. The first push of main was rejected because it added a GitHub Actions workflow (.github/workflows/pages.yml) and the gh token lacked the "workflow" scope; the workflow file was removed and main was pushed in the next step. GitHub Pages is not set up yet (planned for the wrap-up; needs "gh auth refresh -s workflow" or a gh-pages branch).</w:t>
+        <w:t xml:space="preserve">Done: see the following entries.</w:t>
       </w:r>
     </w:p>
     <w:p>
@@ -14137,7 +14777,7 @@
           <w:sz w:val="21"/>
           <w:szCs w:val="21"/>
         </w:rPr>
-        <w:t xml:space="preserve">gh repo view; git push output.</w:t>
+        <w:t xml:space="preserve">-</w:t>
       </w:r>
     </w:p>
     <w:p>
@@ -14157,7 +14797,7 @@
         <w:keepNext/>
       </w:pPr>
       <w:r>
-        <w:t xml:space="preserve">#16  Request: hand the project over to a teammate's agent</w:t>
+        <w:t xml:space="preserve">#14  PDF export of the prompt log, including planned prompts</w:t>
       </w:r>
     </w:p>
     <w:p>
@@ -14171,7 +14811,7 @@
           <w:sz w:val="18"/>
           <w:szCs w:val="18"/>
         </w:rPr>
-        <w:t xml:space="preserve">User prompt  |  2026-10-15</w:t>
+        <w:t xml:space="preserve">Working prompt  |  2026-10-15</w:t>
       </w:r>
     </w:p>
     <w:p>
@@ -14205,7 +14845,7 @@
           <w:sz w:val="19"/>
           <w:szCs w:val="19"/>
         </w:rPr>
-        <w:t xml:space="preserve">ACTUALLY I GONNA HANDOVER THE PROJECT TO MY TEAMMATES AGENT SO HE'LL BE PULLING THE CODE AND RUNNING IN HIS SYSTEM SO GIVE PROMPT FOR THAT</w:t>
+        <w:t xml:space="preserve">Export the prompt log to PDF with a Python reportlab script (docs/tools/build_prompt_pdf.py) that reads docs/prompt_log.json: a title page, a stage overview table, a summary of every entry, Part A with every executed prompt verbatim in a shaded box with purpose, files, result and verification, and Part B with the planned prompts that complete Review 2, Review 3 and the wrap-up, clearly marked as not yet run. Add the planned prompts to prompt_log.json and to the Word log as well, and make "npm run log" rebuild both documents.</w:t>
       </w:r>
     </w:p>
     <w:p>
@@ -14233,7 +14873,7 @@
           <w:sz w:val="21"/>
           <w:szCs w:val="21"/>
         </w:rPr>
-        <w:t xml:space="preserve">Let a teammate's AI agent clone, run and continue the project.</w:t>
+        <w:t xml:space="preserve">Give the student a PDF containing the prompts needed to complete the whole project.</w:t>
       </w:r>
     </w:p>
     <w:p>
@@ -14266,7 +14906,92 @@
           <w:sz w:val="19"/>
           <w:szCs w:val="19"/>
         </w:rPr>
-        <w:t xml:space="preserve">-</w:t>
+        <w:t xml:space="preserve">docs/tools/build_prompt_pdf.py</w:t>
+      </w:r>
+    </w:p>
+    <w:p>
+      <w:pPr>
+        <w:pStyle w:val="ListParagraph"/>
+        <w:numPr>
+          <w:ilvl w:val="0"/>
+          <w:numId w:val="2"/>
+        </w:numPr>
+      </w:pPr>
+      <w:r>
+        <w:rPr>
+          <w:rFonts w:ascii="Consolas" w:cs="Consolas" w:eastAsia="Consolas" w:hAnsi="Consolas"/>
+          <w:sz w:val="19"/>
+          <w:szCs w:val="19"/>
+        </w:rPr>
+        <w:t xml:space="preserve">docs/tools/build-prompt-log.js</w:t>
+      </w:r>
+    </w:p>
+    <w:p>
+      <w:pPr>
+        <w:pStyle w:val="ListParagraph"/>
+        <w:numPr>
+          <w:ilvl w:val="0"/>
+          <w:numId w:val="2"/>
+        </w:numPr>
+      </w:pPr>
+      <w:r>
+        <w:rPr>
+          <w:rFonts w:ascii="Consolas" w:cs="Consolas" w:eastAsia="Consolas" w:hAnsi="Consolas"/>
+          <w:sz w:val="19"/>
+          <w:szCs w:val="19"/>
+        </w:rPr>
+        <w:t xml:space="preserve">docs/prompt_log.json</w:t>
+      </w:r>
+    </w:p>
+    <w:p>
+      <w:pPr>
+        <w:pStyle w:val="ListParagraph"/>
+        <w:numPr>
+          <w:ilvl w:val="0"/>
+          <w:numId w:val="2"/>
+        </w:numPr>
+      </w:pPr>
+      <w:r>
+        <w:rPr>
+          <w:rFonts w:ascii="Consolas" w:cs="Consolas" w:eastAsia="Consolas" w:hAnsi="Consolas"/>
+          <w:sz w:val="19"/>
+          <w:szCs w:val="19"/>
+        </w:rPr>
+        <w:t xml:space="preserve">docs/SplitStack_Prompt_Log.pdf</w:t>
+      </w:r>
+    </w:p>
+    <w:p>
+      <w:pPr>
+        <w:pStyle w:val="ListParagraph"/>
+        <w:numPr>
+          <w:ilvl w:val="0"/>
+          <w:numId w:val="2"/>
+        </w:numPr>
+      </w:pPr>
+      <w:r>
+        <w:rPr>
+          <w:rFonts w:ascii="Consolas" w:cs="Consolas" w:eastAsia="Consolas" w:hAnsi="Consolas"/>
+          <w:sz w:val="19"/>
+          <w:szCs w:val="19"/>
+        </w:rPr>
+        <w:t xml:space="preserve">docs/SplitStack_Prompt_Log.docx</w:t>
+      </w:r>
+    </w:p>
+    <w:p>
+      <w:pPr>
+        <w:pStyle w:val="ListParagraph"/>
+        <w:numPr>
+          <w:ilvl w:val="0"/>
+          <w:numId w:val="2"/>
+        </w:numPr>
+      </w:pPr>
+      <w:r>
+        <w:rPr>
+          <w:rFonts w:ascii="Consolas" w:cs="Consolas" w:eastAsia="Consolas" w:hAnsi="Consolas"/>
+          <w:sz w:val="19"/>
+          <w:szCs w:val="19"/>
+        </w:rPr>
+        <w:t xml:space="preserve">package.json</w:t>
       </w:r>
     </w:p>
     <w:p>
@@ -14294,7 +15019,7 @@
           <w:sz w:val="21"/>
           <w:szCs w:val="21"/>
         </w:rPr>
-        <w:t xml:space="preserve">A handover prompt was written covering: requirements per review, clone and branch, prerequisites, install/run/verify commands, repository map, known traps, the mandatory logging rule, the ordered remaining work (planned prompts P1-P15) and working rules. Noted that the new work had to be pushed to GitHub first.</w:t>
+        <w:t xml:space="preserve">PDF with the executed prompts and 15 planned prompts; the Word log has the same content.</w:t>
       </w:r>
     </w:p>
     <w:p>
@@ -14322,7 +15047,7 @@
           <w:sz w:val="21"/>
           <w:szCs w:val="21"/>
         </w:rPr>
-        <w:t xml:space="preserve">-</w:t>
+        <w:t xml:space="preserve">Pages rendered to images and inspected; text extracted with pypdf.</w:t>
       </w:r>
     </w:p>
     <w:p>
@@ -14342,7 +15067,7 @@
         <w:keepNext/>
       </w:pPr>
       <w:r>
-        <w:t xml:space="preserve">#17  Push the refurbished code to GitHub main</w:t>
+        <w:t xml:space="preserve">#15  Create the GitHub repository and push the code</w:t>
       </w:r>
     </w:p>
     <w:p>
@@ -14390,7 +15115,7 @@
           <w:sz w:val="19"/>
           <w:szCs w:val="19"/>
         </w:rPr>
-        <w:t xml:space="preserve">push it  (user prompt). Executed as: remove .github/workflows/pages.yml (the token lacks the workflow scope), replace the not-yet-existing live-site link in README.md with local run instructions, correct the earlier log entry about publishing, log the handover, rebuild the prompt logs, commit, and push the refurbish branch to main on https://github.com/MahaprabhuK/SplitStack so the teammate can clone it.</w:t>
+        <w:t xml:space="preserve">Install the official GitHub CLI with winget and sign in through the device-code flow (the student approves it in the browser). Before publishing, check that no secrets or databases are tracked, review the receipt images that are still in the commit history (they are generic sample invoices), and confirm with the student that a public repository is acceptable because the team's original repository is private. Then create the public repository MahaprabhuK/SplitStack, push the refurbish branch as main together with the legacy branch, add a GitHub Actions workflow (.github/workflows/pages.yml) that deploys the client/ folder to GitHub Pages, enable Pages with the "GitHub Actions" source, and confirm that the site responds.</w:t>
       </w:r>
     </w:p>
     <w:p>
@@ -14418,7 +15143,7 @@
           <w:sz w:val="21"/>
           <w:szCs w:val="21"/>
         </w:rPr>
-        <w:t xml:space="preserve">Make the current work available to the teammate.</w:t>
+        <w:t xml:space="preserve">Give the student a repository link and a live website link.</w:t>
       </w:r>
     </w:p>
     <w:p>
@@ -14451,75 +15176,7 @@
           <w:sz w:val="19"/>
           <w:szCs w:val="19"/>
         </w:rPr>
-        <w:t xml:space="preserve">.github/workflows/pages.yml (removed)</w:t>
-      </w:r>
-    </w:p>
-    <w:p>
-      <w:pPr>
-        <w:pStyle w:val="ListParagraph"/>
-        <w:numPr>
-          <w:ilvl w:val="0"/>
-          <w:numId w:val="2"/>
-        </w:numPr>
-      </w:pPr>
-      <w:r>
-        <w:rPr>
-          <w:rFonts w:ascii="Consolas" w:cs="Consolas" w:eastAsia="Consolas" w:hAnsi="Consolas"/>
-          <w:sz w:val="19"/>
-          <w:szCs w:val="19"/>
-        </w:rPr>
         <w:t xml:space="preserve">README.md</w:t>
-      </w:r>
-    </w:p>
-    <w:p>
-      <w:pPr>
-        <w:pStyle w:val="ListParagraph"/>
-        <w:numPr>
-          <w:ilvl w:val="0"/>
-          <w:numId w:val="2"/>
-        </w:numPr>
-      </w:pPr>
-      <w:r>
-        <w:rPr>
-          <w:rFonts w:ascii="Consolas" w:cs="Consolas" w:eastAsia="Consolas" w:hAnsi="Consolas"/>
-          <w:sz w:val="19"/>
-          <w:szCs w:val="19"/>
-        </w:rPr>
-        <w:t xml:space="preserve">docs/prompt_log.json</w:t>
-      </w:r>
-    </w:p>
-    <w:p>
-      <w:pPr>
-        <w:pStyle w:val="ListParagraph"/>
-        <w:numPr>
-          <w:ilvl w:val="0"/>
-          <w:numId w:val="2"/>
-        </w:numPr>
-      </w:pPr>
-      <w:r>
-        <w:rPr>
-          <w:rFonts w:ascii="Consolas" w:cs="Consolas" w:eastAsia="Consolas" w:hAnsi="Consolas"/>
-          <w:sz w:val="19"/>
-          <w:szCs w:val="19"/>
-        </w:rPr>
-        <w:t xml:space="preserve">docs/SplitStack_Prompt_Log.docx</w:t>
-      </w:r>
-    </w:p>
-    <w:p>
-      <w:pPr>
-        <w:pStyle w:val="ListParagraph"/>
-        <w:numPr>
-          <w:ilvl w:val="0"/>
-          <w:numId w:val="2"/>
-        </w:numPr>
-      </w:pPr>
-      <w:r>
-        <w:rPr>
-          <w:rFonts w:ascii="Consolas" w:cs="Consolas" w:eastAsia="Consolas" w:hAnsi="Consolas"/>
-          <w:sz w:val="19"/>
-          <w:szCs w:val="19"/>
-        </w:rPr>
-        <w:t xml:space="preserve">docs/SplitStack_Prompt_Log.pdf</w:t>
       </w:r>
     </w:p>
     <w:p>
@@ -14547,7 +15204,7 @@
           <w:sz w:val="21"/>
           <w:szCs w:val="21"/>
         </w:rPr>
-        <w:t xml:space="preserve">main pushed to GitHub; branches on GitHub: main (refurbished work) and legacy (original Flask app).</w:t>
+        <w:t xml:space="preserve">Public repository https://github.com/MahaprabhuK/SplitStack created and the legacy branch pushed. The first push of main was rejected because it added a GitHub Actions workflow (.github/workflows/pages.yml) and the gh token lacked the "workflow" scope; the workflow file was removed and main was pushed in the next step. GitHub Pages is not set up yet (planned for the wrap-up; needs "gh auth refresh -s workflow" or a gh-pages branch).</w:t>
       </w:r>
     </w:p>
     <w:p>
@@ -14575,7 +15232,7 @@
           <w:sz w:val="21"/>
           <w:szCs w:val="21"/>
         </w:rPr>
-        <w:t xml:space="preserve">git ls-remote shows main and legacy at the expected commits.</w:t>
+        <w:t xml:space="preserve">gh repo view; git push output.</w:t>
       </w:r>
     </w:p>
     <w:p>
@@ -14595,7 +15252,7 @@
         <w:keepNext/>
       </w:pPr>
       <w:r>
-        <w:t xml:space="preserve">#18  Request: push the code and deploy the website</w:t>
+        <w:t xml:space="preserve">#16  Request: hand the project over to a teammate's agent</w:t>
       </w:r>
     </w:p>
     <w:p>
@@ -14643,7 +15300,7 @@
           <w:sz w:val="19"/>
           <w:szCs w:val="19"/>
         </w:rPr>
-        <w:t xml:space="preserve">first push the code and deploy it</w:t>
+        <w:t xml:space="preserve">ACTUALLY I GONNA HANDOVER THE PROJECT TO MY TEAMMATES AGENT SO HE'LL BE PULLING THE CODE AND RUNNING IN HIS SYSTEM SO GIVE PROMPT FOR THAT</w:t>
       </w:r>
     </w:p>
     <w:p>
@@ -14671,7 +15328,7 @@
           <w:sz w:val="21"/>
           <w:szCs w:val="21"/>
         </w:rPr>
-        <w:t xml:space="preserve">Get the code on GitHub and the Review 1 site online.</w:t>
+        <w:t xml:space="preserve">Let a teammate's AI agent clone, run and continue the project.</w:t>
       </w:r>
     </w:p>
     <w:p>
@@ -14732,7 +15389,7 @@
           <w:sz w:val="21"/>
           <w:szCs w:val="21"/>
         </w:rPr>
-        <w:t xml:space="preserve">Handled in the next step.</w:t>
+        <w:t xml:space="preserve">A handover prompt was written covering: requirements per review, clone and branch, prerequisites, install/run/verify commands, repository map, known traps, the mandatory logging rule, the ordered remaining work (planned prompts P1-P15) and working rules. Noted that the new work had to be pushed to GitHub first.</w:t>
       </w:r>
     </w:p>
     <w:p>
@@ -14780,7 +15437,7 @@
         <w:keepNext/>
       </w:pPr>
       <w:r>
-        <w:t xml:space="preserve">#19  Deploy the client to GitHub Pages from a gh-pages branch</w:t>
+        <w:t xml:space="preserve">#17  Push the refurbished code to GitHub main</w:t>
       </w:r>
     </w:p>
     <w:p>
@@ -14828,7 +15485,7 @@
           <w:sz w:val="19"/>
           <w:szCs w:val="19"/>
         </w:rPr>
-        <w:t xml:space="preserve">Push refurbish to main and refurbish on MahaprabhuK/SplitStack. Because the token cannot push workflow files, deploy without GitHub Actions: check that client/ uses only relative links, split client/ into its own history with git subtree split, push it as the gh-pages branch, wait for GitHub Pages to publish it, then put the live link back in README.md and log the step.</w:t>
+        <w:t xml:space="preserve">push it  (user prompt). Executed as: remove .github/workflows/pages.yml (the token lacks the workflow scope), replace the not-yet-existing live-site link in README.md with local run instructions, correct the earlier log entry about publishing, log the handover, rebuild the prompt logs, commit, and push the refurbish branch to main on https://github.com/MahaprabhuK/SplitStack so the teammate can clone it.</w:t>
       </w:r>
     </w:p>
     <w:p>
@@ -14856,7 +15513,7 @@
           <w:sz w:val="21"/>
           <w:szCs w:val="21"/>
         </w:rPr>
-        <w:t xml:space="preserve">Publish the Review 1 site at a public URL without needing the workflow scope.</w:t>
+        <w:t xml:space="preserve">Make the current work available to the teammate.</w:t>
       </w:r>
     </w:p>
     <w:p>
@@ -14889,6 +15546,23 @@
           <w:sz w:val="19"/>
           <w:szCs w:val="19"/>
         </w:rPr>
+        <w:t xml:space="preserve">.github/workflows/pages.yml (removed)</w:t>
+      </w:r>
+    </w:p>
+    <w:p>
+      <w:pPr>
+        <w:pStyle w:val="ListParagraph"/>
+        <w:numPr>
+          <w:ilvl w:val="0"/>
+          <w:numId w:val="2"/>
+        </w:numPr>
+      </w:pPr>
+      <w:r>
+        <w:rPr>
+          <w:rFonts w:ascii="Consolas" w:cs="Consolas" w:eastAsia="Consolas" w:hAnsi="Consolas"/>
+          <w:sz w:val="19"/>
+          <w:szCs w:val="19"/>
+        </w:rPr>
         <w:t xml:space="preserve">README.md</w:t>
       </w:r>
     </w:p>
@@ -14907,6 +15581,40 @@
           <w:szCs w:val="19"/>
         </w:rPr>
         <w:t xml:space="preserve">docs/prompt_log.json</w:t>
+      </w:r>
+    </w:p>
+    <w:p>
+      <w:pPr>
+        <w:pStyle w:val="ListParagraph"/>
+        <w:numPr>
+          <w:ilvl w:val="0"/>
+          <w:numId w:val="2"/>
+        </w:numPr>
+      </w:pPr>
+      <w:r>
+        <w:rPr>
+          <w:rFonts w:ascii="Consolas" w:cs="Consolas" w:eastAsia="Consolas" w:hAnsi="Consolas"/>
+          <w:sz w:val="19"/>
+          <w:szCs w:val="19"/>
+        </w:rPr>
+        <w:t xml:space="preserve">docs/SplitStack_Prompt_Log.docx</w:t>
+      </w:r>
+    </w:p>
+    <w:p>
+      <w:pPr>
+        <w:pStyle w:val="ListParagraph"/>
+        <w:numPr>
+          <w:ilvl w:val="0"/>
+          <w:numId w:val="2"/>
+        </w:numPr>
+      </w:pPr>
+      <w:r>
+        <w:rPr>
+          <w:rFonts w:ascii="Consolas" w:cs="Consolas" w:eastAsia="Consolas" w:hAnsi="Consolas"/>
+          <w:sz w:val="19"/>
+          <w:szCs w:val="19"/>
+        </w:rPr>
+        <w:t xml:space="preserve">docs/SplitStack_Prompt_Log.pdf</w:t>
       </w:r>
     </w:p>
     <w:p>
@@ -14934,7 +15642,7 @@
           <w:sz w:val="21"/>
           <w:szCs w:val="21"/>
         </w:rPr>
-        <w:t xml:space="preserve">main and refurbish are on GitHub. The client/ folder is published from the gh-pages branch at https://mahaprabhuk.github.io/SplitStack/ (GitHub enabled Pages automatically). To redeploy after client changes: git subtree split --prefix client refurbish, then push that commit to gh-pages.</w:t>
+        <w:t xml:space="preserve">main pushed to GitHub; branches on GitHub: main (refurbished work) and legacy (original Flask app).</w:t>
       </w:r>
     </w:p>
     <w:p>
@@ -14962,7 +15670,7 @@
           <w:sz w:val="21"/>
           <w:szCs w:val="21"/>
         </w:rPr>
-        <w:t xml:space="preserve">git ls-remote; curl returned 200 for the home page, pages/404.html and css/base.css on the live site.</w:t>
+        <w:t xml:space="preserve">git ls-remote shows main and legacy at the expected commits.</w:t>
       </w:r>
     </w:p>
     <w:p>
@@ -14982,7 +15690,7 @@
         <w:keepNext/>
       </w:pPr>
       <w:r>
-        <w:t xml:space="preserve">#20  Request: handover prompt PDF for a teammate's agent</w:t>
+        <w:t xml:space="preserve">#18  Request: push the code and deploy the website</w:t>
       </w:r>
     </w:p>
     <w:p>
@@ -15030,7 +15738,7 @@
           <w:sz w:val="19"/>
           <w:szCs w:val="19"/>
         </w:rPr>
-        <w:t xml:space="preserve">imma handover the project to my teammate i want you to create a detailed prompt for his agent most prolly he'll use anti gravity so i want a pdf containing prompts to complete the rest of the work in the project. so create a pdf and mention its path once its created then i'll share it to him</w:t>
+        <w:t xml:space="preserve">first push the code and deploy it</w:t>
       </w:r>
     </w:p>
     <w:p>
@@ -15058,7 +15766,7 @@
           <w:sz w:val="21"/>
           <w:szCs w:val="21"/>
         </w:rPr>
-        <w:t xml:space="preserve">Let a teammate's AI agent (Antigravity) finish Review 2, Review 3 and the wrap-up.</w:t>
+        <w:t xml:space="preserve">Get the code on GitHub and the Review 1 site online.</w:t>
       </w:r>
     </w:p>
     <w:p>
@@ -15167,7 +15875,7 @@
         <w:keepNext/>
       </w:pPr>
       <w:r>
-        <w:t xml:space="preserve">#21  Handover prompts PDF</w:t>
+        <w:t xml:space="preserve">#19  Deploy the client to GitHub Pages from a gh-pages branch</w:t>
       </w:r>
     </w:p>
     <w:p>
@@ -15215,7 +15923,7 @@
           <w:sz w:val="19"/>
           <w:szCs w:val="19"/>
         </w:rPr>
-        <w:t xml:space="preserve">Write docs/tools/build_handover_pdf.py (reusing the styles of build_prompt_pdf.py) to produce docs/SplitStack_Handover_Prompts.pdf: how to use it with Antigravity, one-time setup (tools, collaborator access, MongoDB Atlas, workflow token scope), a roadmap, Prompt 0 with the full project context, rules, logging, commit/push and gh-pages redeploy procedure, the 15 planned prompts P1-P15 expanded with concrete checks and commit messages, utility prompts (status, recovery, review rehearsal) and common problems. Render pages to check the layout.</w:t>
+        <w:t xml:space="preserve">Push refurbish to main and refurbish on MahaprabhuK/SplitStack. Because the token cannot push workflow files, deploy without GitHub Actions: check that client/ uses only relative links, split client/ into its own history with git subtree split, push it as the gh-pages branch, wait for GitHub Pages to publish it, then put the live link back in README.md and log the step.</w:t>
       </w:r>
     </w:p>
     <w:p>
@@ -15243,7 +15951,7 @@
           <w:sz w:val="21"/>
           <w:szCs w:val="21"/>
         </w:rPr>
-        <w:t xml:space="preserve">Give the teammate a self-contained, ordered set of prompts.</w:t>
+        <w:t xml:space="preserve">Publish the Review 1 site at a public URL without needing the workflow scope.</w:t>
       </w:r>
     </w:p>
     <w:p>
@@ -15276,24 +15984,24 @@
           <w:sz w:val="19"/>
           <w:szCs w:val="19"/>
         </w:rPr>
-        <w:t xml:space="preserve">docs/tools/build_handover_pdf.py</w:t>
-      </w:r>
-    </w:p>
-    <w:p>
-      <w:pPr>
-        <w:pStyle w:val="ListParagraph"/>
-        <w:numPr>
-          <w:ilvl w:val="0"/>
-          <w:numId w:val="2"/>
-        </w:numPr>
-      </w:pPr>
-      <w:r>
-        <w:rPr>
-          <w:rFonts w:ascii="Consolas" w:cs="Consolas" w:eastAsia="Consolas" w:hAnsi="Consolas"/>
-          <w:sz w:val="19"/>
-          <w:szCs w:val="19"/>
-        </w:rPr>
-        <w:t xml:space="preserve">docs/SplitStack_Handover_Prompts.pdf</w:t>
+        <w:t xml:space="preserve">README.md</w:t>
+      </w:r>
+    </w:p>
+    <w:p>
+      <w:pPr>
+        <w:pStyle w:val="ListParagraph"/>
+        <w:numPr>
+          <w:ilvl w:val="0"/>
+          <w:numId w:val="2"/>
+        </w:numPr>
+      </w:pPr>
+      <w:r>
+        <w:rPr>
+          <w:rFonts w:ascii="Consolas" w:cs="Consolas" w:eastAsia="Consolas" w:hAnsi="Consolas"/>
+          <w:sz w:val="19"/>
+          <w:szCs w:val="19"/>
+        </w:rPr>
+        <w:t xml:space="preserve">docs/prompt_log.json</w:t>
       </w:r>
     </w:p>
     <w:p>
@@ -15321,7 +16029,7 @@
           <w:sz w:val="21"/>
           <w:szCs w:val="21"/>
         </w:rPr>
-        <w:t xml:space="preserve">14-page PDF created. Changes against the planned prompts: P1 adds data-page attributes and client/js/package.json (type module) for node --test; P13 keeps the localStorage implementation as a demo mode (api-local.js chosen when /api/health does not answer) so the GitHub Pages site keeps working, instead of deleting it; P9 replaces deprecated csurf with a synchronizer token; P14 uses MongoMemoryReplSet because the API uses transactions; P15 asks for confirmation before deleting the Flask files and leaves Render account steps to the student.</w:t>
+        <w:t xml:space="preserve">main and refurbish are on GitHub. The client/ folder is published from the gh-pages branch at https://mahaprabhuk.github.io/SplitStack/ (GitHub enabled Pages automatically). To redeploy after client changes: git subtree split --prefix client refurbish, then push that commit to gh-pages.</w:t>
       </w:r>
     </w:p>
     <w:p>
@@ -15349,7 +16057,7 @@
           <w:sz w:val="21"/>
           <w:szCs w:val="21"/>
         </w:rPr>
-        <w:t xml:space="preserve">Rendered pages with PyMuPDF and checked the layout of the setup, Prompt 0, step and utility pages.</w:t>
+        <w:t xml:space="preserve">git ls-remote; curl returned 200 for the home page, pages/404.html and css/base.css on the live site.</w:t>
       </w:r>
     </w:p>
     <w:p>
@@ -15364,37 +16072,12 @@
       </w:r>
     </w:p>
     <w:p>
-      <w:r>
-        <w:br w:type="page"/>
-      </w:r>
-    </w:p>
-    <w:p>
-      <w:pPr>
-        <w:pStyle w:val="Heading1"/>
-      </w:pPr>
-      <w:r>
-        <w:t xml:space="preserve">Planned prompts to complete the project</w:t>
-      </w:r>
-    </w:p>
-    <w:p>
-      <w:pPr>
-        <w:spacing w:after="80"/>
-      </w:pPr>
-      <w:r>
-        <w:rPr>
-          <w:sz w:val="21"/>
-          <w:szCs w:val="21"/>
-        </w:rPr>
-        <w:t xml:space="preserve">These prompts have not been run yet. Run them in order; after each one, move it into the log above with its result.</w:t>
-      </w:r>
-    </w:p>
-    <w:p>
       <w:pPr>
         <w:pStyle w:val="Heading3"/>
         <w:keepNext/>
       </w:pPr>
       <w:r>
-        <w:t xml:space="preserve">P1  Mongoose data models and MongoDB connection</w:t>
+        <w:t xml:space="preserve">#20  Request: handover prompt PDF for a teammate's agent</w:t>
       </w:r>
     </w:p>
     <w:p>
@@ -15408,7 +16091,7 @@
           <w:sz w:val="18"/>
           <w:szCs w:val="18"/>
         </w:rPr>
-        <w:t xml:space="preserve">Review 3  |  Planned prompt</w:t>
+        <w:t xml:space="preserve">User prompt  |  2026-10-15</w:t>
       </w:r>
     </w:p>
     <w:p>
@@ -15442,7 +16125,7 @@
           <w:sz w:val="19"/>
           <w:szCs w:val="19"/>
         </w:rPr>
-        <w:t xml:space="preserve">Connect Express to MongoDB Atlas with Mongoose using MONGODB_URI from server/.env. Design Mongoose schemas with validation and indexes to replace the 15 SQLite tables: User, Category, Expense, Income, Budget, Recurring, Group, SharedExpense, Settlement, ShoppingList, Receipt, and Insight. Add server/src/db.js to handle connection lifecycle and graceful shutdown.</w:t>
+        <w:t xml:space="preserve">imma handover the project to my teammate i want you to create a detailed prompt for his agent most prolly he'll use anti gravity so i want a pdf containing prompts to complete the rest of the work in the project. so create a pdf and mention its path once its created then i'll share it to him</w:t>
       </w:r>
     </w:p>
     <w:p>
@@ -15470,7 +16153,7 @@
           <w:sz w:val="21"/>
           <w:szCs w:val="21"/>
         </w:rPr>
-        <w:t xml:space="preserve">Establish MongoDB connection and Mongoose data models.</w:t>
+        <w:t xml:space="preserve">Let a teammate's AI agent (Antigravity) finish Review 2, Review 3 and the wrap-up.</w:t>
       </w:r>
     </w:p>
     <w:p>
@@ -15487,6 +16170,39 @@
           <w:szCs w:val="17"/>
         </w:rPr>
         <w:t xml:space="preserve">FILES</w:t>
+      </w:r>
+    </w:p>
+    <w:p>
+      <w:pPr>
+        <w:pStyle w:val="ListParagraph"/>
+        <w:numPr>
+          <w:ilvl w:val="0"/>
+          <w:numId w:val="2"/>
+        </w:numPr>
+      </w:pPr>
+      <w:r>
+        <w:rPr>
+          <w:rFonts w:ascii="Consolas" w:cs="Consolas" w:eastAsia="Consolas" w:hAnsi="Consolas"/>
+          <w:sz w:val="19"/>
+          <w:szCs w:val="19"/>
+        </w:rPr>
+        <w:t xml:space="preserve">-</w:t>
+      </w:r>
+    </w:p>
+    <w:p>
+      <w:pPr>
+        <w:spacing w:after="60" w:before="160"/>
+      </w:pPr>
+      <w:r>
+        <w:rPr>
+          <w:b/>
+          <w:bCs/>
+          <w:color w:val="4F46E5"/>
+          <w:spacing w:val="20"/>
+          <w:sz w:val="17"/>
+          <w:szCs w:val="17"/>
+        </w:rPr>
+        <w:t xml:space="preserve">RESULT</w:t>
       </w:r>
     </w:p>
     <w:p>
@@ -15498,7 +16214,46 @@
           <w:sz w:val="21"/>
           <w:szCs w:val="21"/>
         </w:rPr>
-        <w:t xml:space="preserve">server/src/db.js, server/src/models/*.js</w:t>
+        <w:t xml:space="preserve">Handled in the next step.</w:t>
+      </w:r>
+    </w:p>
+    <w:p>
+      <w:pPr>
+        <w:spacing w:after="60" w:before="160"/>
+      </w:pPr>
+      <w:r>
+        <w:rPr>
+          <w:b/>
+          <w:bCs/>
+          <w:color w:val="4F46E5"/>
+          <w:spacing w:val="20"/>
+          <w:sz w:val="17"/>
+          <w:szCs w:val="17"/>
+        </w:rPr>
+        <w:t xml:space="preserve">VERIFICATION</w:t>
+      </w:r>
+    </w:p>
+    <w:p>
+      <w:pPr>
+        <w:spacing w:after="80"/>
+      </w:pPr>
+      <w:r>
+        <w:rPr>
+          <w:sz w:val="21"/>
+          <w:szCs w:val="21"/>
+        </w:rPr>
+        <w:t xml:space="preserve">-</w:t>
+      </w:r>
+    </w:p>
+    <w:p>
+      <w:pPr>
+        <w:pBdr>
+          <w:bottom w:val="single" w:color="D9DBE5" w:sz="4" w:space="4"/>
+        </w:pBdr>
+        <w:spacing w:after="200"/>
+      </w:pPr>
+      <w:r>
+        <w:t xml:space="preserve"/>
       </w:r>
     </w:p>
     <w:p>
@@ -15507,7 +16262,7 @@
         <w:keepNext/>
       </w:pPr>
       <w:r>
-        <w:t xml:space="preserve">P2  Mongoose data models</w:t>
+        <w:t xml:space="preserve">#21  Handover prompts PDF</w:t>
       </w:r>
     </w:p>
     <w:p>
@@ -15521,7 +16276,7 @@
           <w:sz w:val="18"/>
           <w:szCs w:val="18"/>
         </w:rPr>
-        <w:t xml:space="preserve">Review 3  |  Planned prompt</w:t>
+        <w:t xml:space="preserve">Working prompt  |  2026-10-15</w:t>
       </w:r>
     </w:p>
     <w:p>
@@ -15555,7 +16310,7 @@
           <w:sz w:val="19"/>
           <w:szCs w:val="19"/>
         </w:rPr>
-        <w:t xml:space="preserve">Design Mongoose schemas with validation and indexes to replace the 15 SQLite tables: User (name, email unique and lowercase, passwordHash, preferences), Category (user, or null for defaults; name; type expense or income; icon; color), Expense and Income (user, category, amount stored as integer paise, date, description or source, paymentMethod), Budget (user, category or null, month, year, limit; unique on user+category+month+year), Recurring (name, amount, frequency, startDate, nextDueDate, active), Group (name, description, createdBy, members [{user, role admin|member, joinedAt}]), SharedExpense (group, title, amount, paidBy, category, date, splitType, shares [{user, amount}] with a validator that the shares sum to the amount), Settlement (group, payer, payee, amount, status, completedAt), ShoppingList (owner, optional group, name, budget, items [{name, quantity, estimatedPrice, actualPrice, purchased, assignedTo}], convertedExpense), Receipt (user, file reference, merchant, date, amount, rawText, confidence) and Insight (user, kind, message, read). Explain in comments which data is embedded and which is referenced, and why.</w:t>
+        <w:t xml:space="preserve">Write docs/tools/build_handover_pdf.py (reusing the styles of build_prompt_pdf.py) to produce docs/SplitStack_Handover_Prompts.pdf: how to use it with Antigravity, one-time setup (tools, collaborator access, MongoDB Atlas, workflow token scope), a roadmap, Prompt 0 with the full project context, rules, logging, commit/push and gh-pages redeploy procedure, the 15 planned prompts P1-P15 expanded with concrete checks and commit messages, utility prompts (status, recovery, review rehearsal) and common problems. Render pages to check the layout.</w:t>
       </w:r>
     </w:p>
     <w:p>
@@ -15583,7 +16338,7 @@
           <w:sz w:val="21"/>
           <w:szCs w:val="21"/>
         </w:rPr>
-        <w:t xml:space="preserve">Show MongoDB data modelling, the core of Review 3.</w:t>
+        <w:t xml:space="preserve">Give the teammate a self-contained, ordered set of prompts.</w:t>
       </w:r>
     </w:p>
     <w:p>
@@ -15600,6 +16355,56 @@
           <w:szCs w:val="17"/>
         </w:rPr>
         <w:t xml:space="preserve">FILES</w:t>
+      </w:r>
+    </w:p>
+    <w:p>
+      <w:pPr>
+        <w:pStyle w:val="ListParagraph"/>
+        <w:numPr>
+          <w:ilvl w:val="0"/>
+          <w:numId w:val="2"/>
+        </w:numPr>
+      </w:pPr>
+      <w:r>
+        <w:rPr>
+          <w:rFonts w:ascii="Consolas" w:cs="Consolas" w:eastAsia="Consolas" w:hAnsi="Consolas"/>
+          <w:sz w:val="19"/>
+          <w:szCs w:val="19"/>
+        </w:rPr>
+        <w:t xml:space="preserve">docs/tools/build_handover_pdf.py</w:t>
+      </w:r>
+    </w:p>
+    <w:p>
+      <w:pPr>
+        <w:pStyle w:val="ListParagraph"/>
+        <w:numPr>
+          <w:ilvl w:val="0"/>
+          <w:numId w:val="2"/>
+        </w:numPr>
+      </w:pPr>
+      <w:r>
+        <w:rPr>
+          <w:rFonts w:ascii="Consolas" w:cs="Consolas" w:eastAsia="Consolas" w:hAnsi="Consolas"/>
+          <w:sz w:val="19"/>
+          <w:szCs w:val="19"/>
+        </w:rPr>
+        <w:t xml:space="preserve">docs/SplitStack_Handover_Prompts.pdf</w:t>
+      </w:r>
+    </w:p>
+    <w:p>
+      <w:pPr>
+        <w:spacing w:after="60" w:before="160"/>
+      </w:pPr>
+      <w:r>
+        <w:rPr>
+          <w:b/>
+          <w:bCs/>
+          <w:color w:val="4F46E5"/>
+          <w:spacing w:val="20"/>
+          <w:sz w:val="17"/>
+          <w:szCs w:val="17"/>
+        </w:rPr>
+        <w:t xml:space="preserve">RESULT</w:t>
       </w:r>
     </w:p>
     <w:p>
@@ -15611,7 +16416,71 @@
           <w:sz w:val="21"/>
           <w:szCs w:val="21"/>
         </w:rPr>
-        <w:t xml:space="preserve">server/src/models/*.js</w:t>
+        <w:t xml:space="preserve">14-page PDF created. Changes against the planned prompts: P1 adds data-page attributes and client/js/package.json (type module) for node --test; P13 keeps the localStorage implementation as a demo mode (api-local.js chosen when /api/health does not answer) so the GitHub Pages site keeps working, instead of deleting it; P9 replaces deprecated csurf with a synchronizer token; P14 uses MongoMemoryReplSet because the API uses transactions; P15 asks for confirmation before deleting the Flask files and leaves Render account steps to the student.</w:t>
+      </w:r>
+    </w:p>
+    <w:p>
+      <w:pPr>
+        <w:spacing w:after="60" w:before="160"/>
+      </w:pPr>
+      <w:r>
+        <w:rPr>
+          <w:b/>
+          <w:bCs/>
+          <w:color w:val="4F46E5"/>
+          <w:spacing w:val="20"/>
+          <w:sz w:val="17"/>
+          <w:szCs w:val="17"/>
+        </w:rPr>
+        <w:t xml:space="preserve">VERIFICATION</w:t>
+      </w:r>
+    </w:p>
+    <w:p>
+      <w:pPr>
+        <w:spacing w:after="80"/>
+      </w:pPr>
+      <w:r>
+        <w:rPr>
+          <w:sz w:val="21"/>
+          <w:szCs w:val="21"/>
+        </w:rPr>
+        <w:t xml:space="preserve">Rendered pages with PyMuPDF and checked the layout of the setup, Prompt 0, step and utility pages.</w:t>
+      </w:r>
+    </w:p>
+    <w:p>
+      <w:pPr>
+        <w:pBdr>
+          <w:bottom w:val="single" w:color="D9DBE5" w:sz="4" w:space="4"/>
+        </w:pBdr>
+        <w:spacing w:after="200"/>
+      </w:pPr>
+      <w:r>
+        <w:t xml:space="preserve"/>
+      </w:r>
+    </w:p>
+    <w:p>
+      <w:r>
+        <w:br w:type="page"/>
+      </w:r>
+    </w:p>
+    <w:p>
+      <w:pPr>
+        <w:pStyle w:val="Heading1"/>
+      </w:pPr>
+      <w:r>
+        <w:t xml:space="preserve">Planned prompts to complete the project</w:t>
+      </w:r>
+    </w:p>
+    <w:p>
+      <w:pPr>
+        <w:spacing w:after="80"/>
+      </w:pPr>
+      <w:r>
+        <w:rPr>
+          <w:sz w:val="21"/>
+          <w:szCs w:val="21"/>
+        </w:rPr>
+        <w:t xml:space="preserve">These prompts have not been run yet. Run them in order; after each one, move it into the log above with its result.</w:t>
       </w:r>
     </w:p>
     <w:p>
@@ -15620,7 +16489,7 @@
         <w:keepNext/>
       </w:pPr>
       <w:r>
-        <w:t xml:space="preserve">P3  Authentication and REST API</w:t>
+        <w:t xml:space="preserve">P1  Authentication and REST API</w:t>
       </w:r>
     </w:p>
     <w:p>
@@ -15733,7 +16602,7 @@
         <w:keepNext/>
       </w:pPr>
       <w:r>
-        <w:t xml:space="preserve">P4  Receipt upload and server-side OCR</w:t>
+        <w:t xml:space="preserve">P2  Receipt upload and server-side OCR</w:t>
       </w:r>
     </w:p>
     <w:p>
@@ -15846,7 +16715,7 @@
         <w:keepNext/>
       </w:pPr>
       <w:r>
-        <w:t xml:space="preserve">P5  Connect the client to the API</w:t>
+        <w:t xml:space="preserve">P3  Connect the client to the API</w:t>
       </w:r>
     </w:p>
     <w:p>
@@ -15959,7 +16828,7 @@
         <w:keepNext/>
       </w:pPr>
       <w:r>
-        <w:t xml:space="preserve">P6  Seed data and automated tests</w:t>
+        <w:t xml:space="preserve">P4  Seed data and automated tests</w:t>
       </w:r>
     </w:p>
     <w:p>
@@ -16072,7 +16941,7 @@
         <w:keepNext/>
       </w:pPr>
       <w:r>
-        <w:t xml:space="preserve">P7  Remove legacy code, document and deploy</w:t>
+        <w:t xml:space="preserve">P5  Remove legacy code, document and deploy</w:t>
       </w:r>
     </w:p>
     <w:p>

</xml_diff>

<commit_message>
Review 3: authentication and REST API
</commit_message>
<xml_diff>
--- a/docs/SplitStack_Prompt_Log.docx
+++ b/docs/SplitStack_Prompt_Log.docx
@@ -132,7 +132,7 @@
           <w:sz w:val="21"/>
           <w:szCs w:val="21"/>
         </w:rPr>
-        <w:t xml:space="preserve">41</w:t>
+        <w:t xml:space="preserve">43</w:t>
       </w:r>
     </w:p>
     <w:p>
@@ -639,7 +639,7 @@
                 <w:sz w:val="18"/>
                 <w:szCs w:val="18"/>
               </w:rPr>
-              <w:t xml:space="preserve">4</w:t>
+              <w:t xml:space="preserve">6</w:t>
             </w:r>
           </w:p>
         </w:tc>
@@ -5719,6 +5719,245 @@
                 <w:szCs w:val="18"/>
               </w:rPr>
               <w:t xml:space="preserve">MongoDB connection and Mongoose data models</w:t>
+            </w:r>
+          </w:p>
+        </w:tc>
+        <w:tc>
+          <w:tcPr>
+            <w:tcW w:type="dxa" w:w="1500"/>
+            <w:tcMar>
+              <w:top w:type="dxa" w:w="60"/>
+              <w:left w:type="dxa" w:w="100"/>
+              <w:bottom w:type="dxa" w:w="60"/>
+              <w:right w:type="dxa" w:w="100"/>
+            </w:tcMar>
+          </w:tcPr>
+          <w:p>
+            <w:r>
+              <w:rPr>
+                <w:b w:val="false"/>
+                <w:bCs w:val="false"/>
+                <w:color w:val="222222"/>
+                <w:sz w:val="18"/>
+                <w:szCs w:val="18"/>
+              </w:rPr>
+              <w:t xml:space="preserve">Working prompt</w:t>
+            </w:r>
+          </w:p>
+        </w:tc>
+        <w:tc>
+          <w:tcPr>
+            <w:tcW w:type="dxa" w:w="1400"/>
+            <w:tcMar>
+              <w:top w:type="dxa" w:w="60"/>
+              <w:left w:type="dxa" w:w="100"/>
+              <w:bottom w:type="dxa" w:w="60"/>
+              <w:right w:type="dxa" w:w="100"/>
+            </w:tcMar>
+          </w:tcPr>
+          <w:p>
+            <w:r>
+              <w:rPr>
+                <w:b w:val="false"/>
+                <w:bCs w:val="false"/>
+                <w:color w:val="222222"/>
+                <w:sz w:val="18"/>
+                <w:szCs w:val="18"/>
+              </w:rPr>
+              <w:t xml:space="preserve">2026-10-17</w:t>
+            </w:r>
+          </w:p>
+        </w:tc>
+      </w:tr>
+      <w:tr>
+        <w:tc>
+          <w:tcPr>
+            <w:tcW w:type="dxa" w:w="700"/>
+            <w:shd w:fill="F7F7FB" w:color="auto" w:val="clear"/>
+            <w:tcMar>
+              <w:top w:type="dxa" w:w="60"/>
+              <w:left w:type="dxa" w:w="100"/>
+              <w:bottom w:type="dxa" w:w="60"/>
+              <w:right w:type="dxa" w:w="100"/>
+            </w:tcMar>
+          </w:tcPr>
+          <w:p>
+            <w:r>
+              <w:rPr>
+                <w:b w:val="false"/>
+                <w:bCs w:val="false"/>
+                <w:color w:val="222222"/>
+                <w:sz w:val="18"/>
+                <w:szCs w:val="18"/>
+              </w:rPr>
+              <w:t xml:space="preserve">42</w:t>
+            </w:r>
+          </w:p>
+        </w:tc>
+        <w:tc>
+          <w:tcPr>
+            <w:tcW w:type="dxa" w:w="1500"/>
+            <w:shd w:fill="F7F7FB" w:color="auto" w:val="clear"/>
+            <w:tcMar>
+              <w:top w:type="dxa" w:w="60"/>
+              <w:left w:type="dxa" w:w="100"/>
+              <w:bottom w:type="dxa" w:w="60"/>
+              <w:right w:type="dxa" w:w="100"/>
+            </w:tcMar>
+          </w:tcPr>
+          <w:p>
+            <w:r>
+              <w:rPr>
+                <w:b w:val="false"/>
+                <w:bCs w:val="false"/>
+                <w:color w:val="222222"/>
+                <w:sz w:val="18"/>
+                <w:szCs w:val="18"/>
+              </w:rPr>
+              <w:t xml:space="preserve">Review 3</w:t>
+            </w:r>
+          </w:p>
+        </w:tc>
+        <w:tc>
+          <w:tcPr>
+            <w:tcW w:type="dxa" w:w="4538"/>
+            <w:shd w:fill="F7F7FB" w:color="auto" w:val="clear"/>
+            <w:tcMar>
+              <w:top w:type="dxa" w:w="60"/>
+              <w:left w:type="dxa" w:w="100"/>
+              <w:bottom w:type="dxa" w:w="60"/>
+              <w:right w:type="dxa" w:w="100"/>
+            </w:tcMar>
+          </w:tcPr>
+          <w:p>
+            <w:r>
+              <w:rPr>
+                <w:b w:val="false"/>
+                <w:bCs w:val="false"/>
+                <w:color w:val="222222"/>
+                <w:sz w:val="18"/>
+                <w:szCs w:val="18"/>
+              </w:rPr>
+              <w:t xml:space="preserve">Request: proceed with Review 3 Step P11</w:t>
+            </w:r>
+          </w:p>
+        </w:tc>
+        <w:tc>
+          <w:tcPr>
+            <w:tcW w:type="dxa" w:w="1500"/>
+            <w:shd w:fill="F7F7FB" w:color="auto" w:val="clear"/>
+            <w:tcMar>
+              <w:top w:type="dxa" w:w="60"/>
+              <w:left w:type="dxa" w:w="100"/>
+              <w:bottom w:type="dxa" w:w="60"/>
+              <w:right w:type="dxa" w:w="100"/>
+            </w:tcMar>
+          </w:tcPr>
+          <w:p>
+            <w:r>
+              <w:rPr>
+                <w:b w:val="false"/>
+                <w:bCs w:val="false"/>
+                <w:color w:val="222222"/>
+                <w:sz w:val="18"/>
+                <w:szCs w:val="18"/>
+              </w:rPr>
+              <w:t xml:space="preserve">User prompt</w:t>
+            </w:r>
+          </w:p>
+        </w:tc>
+        <w:tc>
+          <w:tcPr>
+            <w:tcW w:type="dxa" w:w="1400"/>
+            <w:shd w:fill="F7F7FB" w:color="auto" w:val="clear"/>
+            <w:tcMar>
+              <w:top w:type="dxa" w:w="60"/>
+              <w:left w:type="dxa" w:w="100"/>
+              <w:bottom w:type="dxa" w:w="60"/>
+              <w:right w:type="dxa" w:w="100"/>
+            </w:tcMar>
+          </w:tcPr>
+          <w:p>
+            <w:r>
+              <w:rPr>
+                <w:b w:val="false"/>
+                <w:bCs w:val="false"/>
+                <w:color w:val="222222"/>
+                <w:sz w:val="18"/>
+                <w:szCs w:val="18"/>
+              </w:rPr>
+              <w:t xml:space="preserve">2026-10-17</w:t>
+            </w:r>
+          </w:p>
+        </w:tc>
+      </w:tr>
+      <w:tr>
+        <w:tc>
+          <w:tcPr>
+            <w:tcW w:type="dxa" w:w="700"/>
+            <w:tcMar>
+              <w:top w:type="dxa" w:w="60"/>
+              <w:left w:type="dxa" w:w="100"/>
+              <w:bottom w:type="dxa" w:w="60"/>
+              <w:right w:type="dxa" w:w="100"/>
+            </w:tcMar>
+          </w:tcPr>
+          <w:p>
+            <w:r>
+              <w:rPr>
+                <w:b w:val="false"/>
+                <w:bCs w:val="false"/>
+                <w:color w:val="222222"/>
+                <w:sz w:val="18"/>
+                <w:szCs w:val="18"/>
+              </w:rPr>
+              <w:t xml:space="preserve">43</w:t>
+            </w:r>
+          </w:p>
+        </w:tc>
+        <w:tc>
+          <w:tcPr>
+            <w:tcW w:type="dxa" w:w="1500"/>
+            <w:tcMar>
+              <w:top w:type="dxa" w:w="60"/>
+              <w:left w:type="dxa" w:w="100"/>
+              <w:bottom w:type="dxa" w:w="60"/>
+              <w:right w:type="dxa" w:w="100"/>
+            </w:tcMar>
+          </w:tcPr>
+          <w:p>
+            <w:r>
+              <w:rPr>
+                <w:b w:val="false"/>
+                <w:bCs w:val="false"/>
+                <w:color w:val="222222"/>
+                <w:sz w:val="18"/>
+                <w:szCs w:val="18"/>
+              </w:rPr>
+              <w:t xml:space="preserve">Review 3</w:t>
+            </w:r>
+          </w:p>
+        </w:tc>
+        <w:tc>
+          <w:tcPr>
+            <w:tcW w:type="dxa" w:w="4538"/>
+            <w:tcMar>
+              <w:top w:type="dxa" w:w="60"/>
+              <w:left w:type="dxa" w:w="100"/>
+              <w:bottom w:type="dxa" w:w="60"/>
+              <w:right w:type="dxa" w:w="100"/>
+            </w:tcMar>
+          </w:tcPr>
+          <w:p>
+            <w:r>
+              <w:rPr>
+                <w:b w:val="false"/>
+                <w:bCs w:val="false"/>
+                <w:color w:val="222222"/>
+                <w:sz w:val="18"/>
+                <w:szCs w:val="18"/>
+              </w:rPr>
+              <w:t xml:space="preserve">Authentication and REST API endpoints</w:t>
             </w:r>
           </w:p>
         </w:tc>
@@ -14599,20 +14838,11 @@
     </w:p>
     <w:p>
       <w:pPr>
-        <w:pStyle w:val="Heading2"/>
-        <w:spacing w:before="360"/>
-      </w:pPr>
-      <w:r>
-        <w:t xml:space="preserve">Wrap-up - Documentation, cleanup and deployment</w:t>
-      </w:r>
-    </w:p>
-    <w:p>
-      <w:pPr>
         <w:pStyle w:val="Heading3"/>
         <w:keepNext/>
       </w:pPr>
       <w:r>
-        <w:t xml:space="preserve">#13  Request: GitHub repository, website link and PDF of prompts</w:t>
+        <w:t xml:space="preserve">#42  Request: proceed with Review 3 Step P11</w:t>
       </w:r>
     </w:p>
     <w:p>
@@ -14626,7 +14856,7 @@
           <w:sz w:val="18"/>
           <w:szCs w:val="18"/>
         </w:rPr>
-        <w:t xml:space="preserve">User prompt  |  2026-10-15</w:t>
+        <w:t xml:space="preserve">User prompt  |  2026-10-17</w:t>
       </w:r>
     </w:p>
     <w:p>
@@ -14660,7 +14890,49 @@
           <w:sz w:val="19"/>
           <w:szCs w:val="19"/>
         </w:rPr>
-        <w:t xml:space="preserve">create a new repositry for this project in my gihub , and after than give me the github link and then the website link and also a pdf containing the prompts to complete project.</w:t>
+        <w:t xml:space="preserve"># P11 — Review 3: Authentication and REST API Endpoints
+Continue the SplitStack project from the current refurbish branch. P10 is reported complete at commit 313f69f. Implement P11 only.
+## 1. Repository safety
+- Verify the branch, working tree, latest commit, and existing server architecture before editing.
+- Work only on refurbish.
+- Do not push to any remote.
+- Do not reset, rebase, amend commits, or discard changes.
+- Preserve all legacy Flask files, existing audit evidence, and unrelated untracked files.
+- Do not implement P12 OCR/file upload, P13 frontend API integration, or later phases.
+- Do not claim live database integration works unless tested against a reachable MongoDB instance.
+## 2. Review existing contracts first
+Inspect server files, Mongoose models, client API contracts, and roadmap reports.
+## 3. Authentication
+Implement secure registration, login, logout, and current-user/session endpoints.
+- Use bcrypt (cost factor 12). Never store plaintext passwords.
+- Never return password hashes in API responses.
+- Validate and normalize inputs; enforce unique email addresses.
+- Use generic login failure messages that do not reveal whether an email exists.
+- Apply request-size limits and authentication rate limiting.
+- Use secure session/token handling (JWT, HttpOnly cookie with SameSite: Lax).
+- Never log passwords, tokens, cookies, or credentials.
+- Authorization middleware derives authenticated user from verified credentials.
+## 4. REST API
+Implement documented P11 endpoints and controllers for core SplitStack resources.
+- Consistent success and error response formats.
+- Request validation and appropriate HTTP status codes.
+- Enforce per-user ownership and group membership/role checks on every operation.
+- Validate referenced document IDs (reject malformed ObjectIds).
+- Scoped Mongoose queries; avoid leaking internal stack traces.
+## 5. Database and tests
+- Keep Express app independently importable for tests without automatically connecting to MongoDB.
+- Add authentication tests (registration, hashing, login success/failure, logout, rate limiting).
+- Add API tests (authorization, ownership isolation, input validation, correct responses).
+- Run npm run test:server and npm run test:client.
+- Run npm run lint:html if frontend files change.
+## 6. Documentation and audit
+- Update server/README.md and .env.example.
+- Add P11 audit report in docs/audit/.
+- Update prompt log and regenerate DOCX/PDF via npm run log.
+## 7. Commit
+- Commit message: Review 3: authentication and REST API
+- Do not push.
+## 8. Final report</w:t>
       </w:r>
     </w:p>
     <w:p>
@@ -14688,7 +14960,7 @@
           <w:sz w:val="21"/>
           <w:szCs w:val="21"/>
         </w:rPr>
-        <w:t xml:space="preserve">Publish the project under the student's own GitHub account, host the site, and export the prompt log (including the remaining planned prompts) as a PDF.</w:t>
+        <w:t xml:space="preserve">Authorize execution of Step P11: Authentication and REST API Endpoints.</w:t>
       </w:r>
     </w:p>
     <w:p>
@@ -14749,7 +15021,7 @@
           <w:sz w:val="21"/>
           <w:szCs w:val="21"/>
         </w:rPr>
-        <w:t xml:space="preserve">Done: see the following entries.</w:t>
+        <w:t xml:space="preserve">Authorized Step P11 implementation.</w:t>
       </w:r>
     </w:p>
     <w:p>
@@ -14797,7 +15069,7 @@
         <w:keepNext/>
       </w:pPr>
       <w:r>
-        <w:t xml:space="preserve">#14  PDF export of the prompt log, including planned prompts</w:t>
+        <w:t xml:space="preserve">#43  Authentication and REST API endpoints</w:t>
       </w:r>
     </w:p>
     <w:p>
@@ -14811,7 +15083,7 @@
           <w:sz w:val="18"/>
           <w:szCs w:val="18"/>
         </w:rPr>
-        <w:t xml:space="preserve">Working prompt  |  2026-10-15</w:t>
+        <w:t xml:space="preserve">Working prompt  |  2026-10-17</w:t>
       </w:r>
     </w:p>
     <w:p>
@@ -14845,7 +15117,7 @@
           <w:sz w:val="19"/>
           <w:szCs w:val="19"/>
         </w:rPr>
-        <w:t xml:space="preserve">Export the prompt log to PDF with a Python reportlab script (docs/tools/build_prompt_pdf.py) that reads docs/prompt_log.json: a title page, a stage overview table, a summary of every entry, Part A with every executed prompt verbatim in a shaded box with purpose, files, result and verification, and Part B with the planned prompts that complete Review 2, Review 3 and the wrap-up, clearly marked as not yet run. Add the planned prompts to prompt_log.json and to the Word log as well, and make "npm run log" rebuild both documents.</w:t>
+        <w:t xml:space="preserve">Install bcryptjs, jsonwebtoken, and cookie-parser in server/; update server/src/config.js with JWT and cookie configuration; update server/.env.example with safe security templates; create server/src/utils/errors.js and server/src/utils/domain.js; create server/src/services/authService.js with bcrypt hashing (cost factor 12), JWT generation, email normalization, and generic login protection; create server/src/middleware/auth.js, server/src/middleware/rateLimit.js (in-memory sliding window), and server/src/middleware/validate.js (ObjectId and paise checks); create REST resource routes in server/src/routes/ (auth, expenses, income, categories, budgets, recurring, groups, shopping, analytics, notifications, search, receipts); mount routes and cookie-parser in server/src/app.js; add comprehensive test suites in server/tests/auth.test.js and server/tests/api.test.js; update server/README.md and docs/audit/P11_AUTH_REST_API_AUDIT.md; regenerate prompt logs.</w:t>
       </w:r>
     </w:p>
     <w:p>
@@ -14873,7 +15145,7 @@
           <w:sz w:val="21"/>
           <w:szCs w:val="21"/>
         </w:rPr>
-        <w:t xml:space="preserve">Give the student a PDF containing the prompts needed to complete the whole project.</w:t>
+        <w:t xml:space="preserve">Implement production-grade authentication and the complete set of REST API endpoints for SplitStack with ownership isolation and monetary validation.</w:t>
       </w:r>
     </w:p>
     <w:p>
@@ -14906,24 +15178,466 @@
           <w:sz w:val="19"/>
           <w:szCs w:val="19"/>
         </w:rPr>
-        <w:t xml:space="preserve">docs/tools/build_prompt_pdf.py</w:t>
-      </w:r>
-    </w:p>
-    <w:p>
-      <w:pPr>
-        <w:pStyle w:val="ListParagraph"/>
-        <w:numPr>
-          <w:ilvl w:val="0"/>
-          <w:numId w:val="2"/>
-        </w:numPr>
-      </w:pPr>
-      <w:r>
-        <w:rPr>
-          <w:rFonts w:ascii="Consolas" w:cs="Consolas" w:eastAsia="Consolas" w:hAnsi="Consolas"/>
-          <w:sz w:val="19"/>
-          <w:szCs w:val="19"/>
-        </w:rPr>
-        <w:t xml:space="preserve">docs/tools/build-prompt-log.js</w:t>
+        <w:t xml:space="preserve">server/package.json</w:t>
+      </w:r>
+    </w:p>
+    <w:p>
+      <w:pPr>
+        <w:pStyle w:val="ListParagraph"/>
+        <w:numPr>
+          <w:ilvl w:val="0"/>
+          <w:numId w:val="2"/>
+        </w:numPr>
+      </w:pPr>
+      <w:r>
+        <w:rPr>
+          <w:rFonts w:ascii="Consolas" w:cs="Consolas" w:eastAsia="Consolas" w:hAnsi="Consolas"/>
+          <w:sz w:val="19"/>
+          <w:szCs w:val="19"/>
+        </w:rPr>
+        <w:t xml:space="preserve">server/package-lock.json</w:t>
+      </w:r>
+    </w:p>
+    <w:p>
+      <w:pPr>
+        <w:pStyle w:val="ListParagraph"/>
+        <w:numPr>
+          <w:ilvl w:val="0"/>
+          <w:numId w:val="2"/>
+        </w:numPr>
+      </w:pPr>
+      <w:r>
+        <w:rPr>
+          <w:rFonts w:ascii="Consolas" w:cs="Consolas" w:eastAsia="Consolas" w:hAnsi="Consolas"/>
+          <w:sz w:val="19"/>
+          <w:szCs w:val="19"/>
+        </w:rPr>
+        <w:t xml:space="preserve">server/.env.example</w:t>
+      </w:r>
+    </w:p>
+    <w:p>
+      <w:pPr>
+        <w:pStyle w:val="ListParagraph"/>
+        <w:numPr>
+          <w:ilvl w:val="0"/>
+          <w:numId w:val="2"/>
+        </w:numPr>
+      </w:pPr>
+      <w:r>
+        <w:rPr>
+          <w:rFonts w:ascii="Consolas" w:cs="Consolas" w:eastAsia="Consolas" w:hAnsi="Consolas"/>
+          <w:sz w:val="19"/>
+          <w:szCs w:val="19"/>
+        </w:rPr>
+        <w:t xml:space="preserve">server/src/config.js</w:t>
+      </w:r>
+    </w:p>
+    <w:p>
+      <w:pPr>
+        <w:pStyle w:val="ListParagraph"/>
+        <w:numPr>
+          <w:ilvl w:val="0"/>
+          <w:numId w:val="2"/>
+        </w:numPr>
+      </w:pPr>
+      <w:r>
+        <w:rPr>
+          <w:rFonts w:ascii="Consolas" w:cs="Consolas" w:eastAsia="Consolas" w:hAnsi="Consolas"/>
+          <w:sz w:val="19"/>
+          <w:szCs w:val="19"/>
+        </w:rPr>
+        <w:t xml:space="preserve">server/src/app.js</w:t>
+      </w:r>
+    </w:p>
+    <w:p>
+      <w:pPr>
+        <w:pStyle w:val="ListParagraph"/>
+        <w:numPr>
+          <w:ilvl w:val="0"/>
+          <w:numId w:val="2"/>
+        </w:numPr>
+      </w:pPr>
+      <w:r>
+        <w:rPr>
+          <w:rFonts w:ascii="Consolas" w:cs="Consolas" w:eastAsia="Consolas" w:hAnsi="Consolas"/>
+          <w:sz w:val="19"/>
+          <w:szCs w:val="19"/>
+        </w:rPr>
+        <w:t xml:space="preserve">server/src/utils/errors.js</w:t>
+      </w:r>
+    </w:p>
+    <w:p>
+      <w:pPr>
+        <w:pStyle w:val="ListParagraph"/>
+        <w:numPr>
+          <w:ilvl w:val="0"/>
+          <w:numId w:val="2"/>
+        </w:numPr>
+      </w:pPr>
+      <w:r>
+        <w:rPr>
+          <w:rFonts w:ascii="Consolas" w:cs="Consolas" w:eastAsia="Consolas" w:hAnsi="Consolas"/>
+          <w:sz w:val="19"/>
+          <w:szCs w:val="19"/>
+        </w:rPr>
+        <w:t xml:space="preserve">server/src/utils/domain.js</w:t>
+      </w:r>
+    </w:p>
+    <w:p>
+      <w:pPr>
+        <w:pStyle w:val="ListParagraph"/>
+        <w:numPr>
+          <w:ilvl w:val="0"/>
+          <w:numId w:val="2"/>
+        </w:numPr>
+      </w:pPr>
+      <w:r>
+        <w:rPr>
+          <w:rFonts w:ascii="Consolas" w:cs="Consolas" w:eastAsia="Consolas" w:hAnsi="Consolas"/>
+          <w:sz w:val="19"/>
+          <w:szCs w:val="19"/>
+        </w:rPr>
+        <w:t xml:space="preserve">server/src/middleware/auth.js</w:t>
+      </w:r>
+    </w:p>
+    <w:p>
+      <w:pPr>
+        <w:pStyle w:val="ListParagraph"/>
+        <w:numPr>
+          <w:ilvl w:val="0"/>
+          <w:numId w:val="2"/>
+        </w:numPr>
+      </w:pPr>
+      <w:r>
+        <w:rPr>
+          <w:rFonts w:ascii="Consolas" w:cs="Consolas" w:eastAsia="Consolas" w:hAnsi="Consolas"/>
+          <w:sz w:val="19"/>
+          <w:szCs w:val="19"/>
+        </w:rPr>
+        <w:t xml:space="preserve">server/src/middleware/rateLimit.js</w:t>
+      </w:r>
+    </w:p>
+    <w:p>
+      <w:pPr>
+        <w:pStyle w:val="ListParagraph"/>
+        <w:numPr>
+          <w:ilvl w:val="0"/>
+          <w:numId w:val="2"/>
+        </w:numPr>
+      </w:pPr>
+      <w:r>
+        <w:rPr>
+          <w:rFonts w:ascii="Consolas" w:cs="Consolas" w:eastAsia="Consolas" w:hAnsi="Consolas"/>
+          <w:sz w:val="19"/>
+          <w:szCs w:val="19"/>
+        </w:rPr>
+        <w:t xml:space="preserve">server/src/middleware/validate.js</w:t>
+      </w:r>
+    </w:p>
+    <w:p>
+      <w:pPr>
+        <w:pStyle w:val="ListParagraph"/>
+        <w:numPr>
+          <w:ilvl w:val="0"/>
+          <w:numId w:val="2"/>
+        </w:numPr>
+      </w:pPr>
+      <w:r>
+        <w:rPr>
+          <w:rFonts w:ascii="Consolas" w:cs="Consolas" w:eastAsia="Consolas" w:hAnsi="Consolas"/>
+          <w:sz w:val="19"/>
+          <w:szCs w:val="19"/>
+        </w:rPr>
+        <w:t xml:space="preserve">server/src/services/authService.js</w:t>
+      </w:r>
+    </w:p>
+    <w:p>
+      <w:pPr>
+        <w:pStyle w:val="ListParagraph"/>
+        <w:numPr>
+          <w:ilvl w:val="0"/>
+          <w:numId w:val="2"/>
+        </w:numPr>
+      </w:pPr>
+      <w:r>
+        <w:rPr>
+          <w:rFonts w:ascii="Consolas" w:cs="Consolas" w:eastAsia="Consolas" w:hAnsi="Consolas"/>
+          <w:sz w:val="19"/>
+          <w:szCs w:val="19"/>
+        </w:rPr>
+        <w:t xml:space="preserve">server/src/routes/auth.js</w:t>
+      </w:r>
+    </w:p>
+    <w:p>
+      <w:pPr>
+        <w:pStyle w:val="ListParagraph"/>
+        <w:numPr>
+          <w:ilvl w:val="0"/>
+          <w:numId w:val="2"/>
+        </w:numPr>
+      </w:pPr>
+      <w:r>
+        <w:rPr>
+          <w:rFonts w:ascii="Consolas" w:cs="Consolas" w:eastAsia="Consolas" w:hAnsi="Consolas"/>
+          <w:sz w:val="19"/>
+          <w:szCs w:val="19"/>
+        </w:rPr>
+        <w:t xml:space="preserve">server/src/routes/expenses.js</w:t>
+      </w:r>
+    </w:p>
+    <w:p>
+      <w:pPr>
+        <w:pStyle w:val="ListParagraph"/>
+        <w:numPr>
+          <w:ilvl w:val="0"/>
+          <w:numId w:val="2"/>
+        </w:numPr>
+      </w:pPr>
+      <w:r>
+        <w:rPr>
+          <w:rFonts w:ascii="Consolas" w:cs="Consolas" w:eastAsia="Consolas" w:hAnsi="Consolas"/>
+          <w:sz w:val="19"/>
+          <w:szCs w:val="19"/>
+        </w:rPr>
+        <w:t xml:space="preserve">server/src/routes/income.js</w:t>
+      </w:r>
+    </w:p>
+    <w:p>
+      <w:pPr>
+        <w:pStyle w:val="ListParagraph"/>
+        <w:numPr>
+          <w:ilvl w:val="0"/>
+          <w:numId w:val="2"/>
+        </w:numPr>
+      </w:pPr>
+      <w:r>
+        <w:rPr>
+          <w:rFonts w:ascii="Consolas" w:cs="Consolas" w:eastAsia="Consolas" w:hAnsi="Consolas"/>
+          <w:sz w:val="19"/>
+          <w:szCs w:val="19"/>
+        </w:rPr>
+        <w:t xml:space="preserve">server/src/routes/categories.js</w:t>
+      </w:r>
+    </w:p>
+    <w:p>
+      <w:pPr>
+        <w:pStyle w:val="ListParagraph"/>
+        <w:numPr>
+          <w:ilvl w:val="0"/>
+          <w:numId w:val="2"/>
+        </w:numPr>
+      </w:pPr>
+      <w:r>
+        <w:rPr>
+          <w:rFonts w:ascii="Consolas" w:cs="Consolas" w:eastAsia="Consolas" w:hAnsi="Consolas"/>
+          <w:sz w:val="19"/>
+          <w:szCs w:val="19"/>
+        </w:rPr>
+        <w:t xml:space="preserve">server/src/routes/budgets.js</w:t>
+      </w:r>
+    </w:p>
+    <w:p>
+      <w:pPr>
+        <w:pStyle w:val="ListParagraph"/>
+        <w:numPr>
+          <w:ilvl w:val="0"/>
+          <w:numId w:val="2"/>
+        </w:numPr>
+      </w:pPr>
+      <w:r>
+        <w:rPr>
+          <w:rFonts w:ascii="Consolas" w:cs="Consolas" w:eastAsia="Consolas" w:hAnsi="Consolas"/>
+          <w:sz w:val="19"/>
+          <w:szCs w:val="19"/>
+        </w:rPr>
+        <w:t xml:space="preserve">server/src/routes/recurring.js</w:t>
+      </w:r>
+    </w:p>
+    <w:p>
+      <w:pPr>
+        <w:pStyle w:val="ListParagraph"/>
+        <w:numPr>
+          <w:ilvl w:val="0"/>
+          <w:numId w:val="2"/>
+        </w:numPr>
+      </w:pPr>
+      <w:r>
+        <w:rPr>
+          <w:rFonts w:ascii="Consolas" w:cs="Consolas" w:eastAsia="Consolas" w:hAnsi="Consolas"/>
+          <w:sz w:val="19"/>
+          <w:szCs w:val="19"/>
+        </w:rPr>
+        <w:t xml:space="preserve">server/src/routes/groups.js</w:t>
+      </w:r>
+    </w:p>
+    <w:p>
+      <w:pPr>
+        <w:pStyle w:val="ListParagraph"/>
+        <w:numPr>
+          <w:ilvl w:val="0"/>
+          <w:numId w:val="2"/>
+        </w:numPr>
+      </w:pPr>
+      <w:r>
+        <w:rPr>
+          <w:rFonts w:ascii="Consolas" w:cs="Consolas" w:eastAsia="Consolas" w:hAnsi="Consolas"/>
+          <w:sz w:val="19"/>
+          <w:szCs w:val="19"/>
+        </w:rPr>
+        <w:t xml:space="preserve">server/src/routes/shopping.js</w:t>
+      </w:r>
+    </w:p>
+    <w:p>
+      <w:pPr>
+        <w:pStyle w:val="ListParagraph"/>
+        <w:numPr>
+          <w:ilvl w:val="0"/>
+          <w:numId w:val="2"/>
+        </w:numPr>
+      </w:pPr>
+      <w:r>
+        <w:rPr>
+          <w:rFonts w:ascii="Consolas" w:cs="Consolas" w:eastAsia="Consolas" w:hAnsi="Consolas"/>
+          <w:sz w:val="19"/>
+          <w:szCs w:val="19"/>
+        </w:rPr>
+        <w:t xml:space="preserve">server/src/routes/analytics.js</w:t>
+      </w:r>
+    </w:p>
+    <w:p>
+      <w:pPr>
+        <w:pStyle w:val="ListParagraph"/>
+        <w:numPr>
+          <w:ilvl w:val="0"/>
+          <w:numId w:val="2"/>
+        </w:numPr>
+      </w:pPr>
+      <w:r>
+        <w:rPr>
+          <w:rFonts w:ascii="Consolas" w:cs="Consolas" w:eastAsia="Consolas" w:hAnsi="Consolas"/>
+          <w:sz w:val="19"/>
+          <w:szCs w:val="19"/>
+        </w:rPr>
+        <w:t xml:space="preserve">server/src/routes/notifications.js</w:t>
+      </w:r>
+    </w:p>
+    <w:p>
+      <w:pPr>
+        <w:pStyle w:val="ListParagraph"/>
+        <w:numPr>
+          <w:ilvl w:val="0"/>
+          <w:numId w:val="2"/>
+        </w:numPr>
+      </w:pPr>
+      <w:r>
+        <w:rPr>
+          <w:rFonts w:ascii="Consolas" w:cs="Consolas" w:eastAsia="Consolas" w:hAnsi="Consolas"/>
+          <w:sz w:val="19"/>
+          <w:szCs w:val="19"/>
+        </w:rPr>
+        <w:t xml:space="preserve">server/src/routes/search.js</w:t>
+      </w:r>
+    </w:p>
+    <w:p>
+      <w:pPr>
+        <w:pStyle w:val="ListParagraph"/>
+        <w:numPr>
+          <w:ilvl w:val="0"/>
+          <w:numId w:val="2"/>
+        </w:numPr>
+      </w:pPr>
+      <w:r>
+        <w:rPr>
+          <w:rFonts w:ascii="Consolas" w:cs="Consolas" w:eastAsia="Consolas" w:hAnsi="Consolas"/>
+          <w:sz w:val="19"/>
+          <w:szCs w:val="19"/>
+        </w:rPr>
+        <w:t xml:space="preserve">server/src/routes/receipts.js</w:t>
+      </w:r>
+    </w:p>
+    <w:p>
+      <w:pPr>
+        <w:pStyle w:val="ListParagraph"/>
+        <w:numPr>
+          <w:ilvl w:val="0"/>
+          <w:numId w:val="2"/>
+        </w:numPr>
+      </w:pPr>
+      <w:r>
+        <w:rPr>
+          <w:rFonts w:ascii="Consolas" w:cs="Consolas" w:eastAsia="Consolas" w:hAnsi="Consolas"/>
+          <w:sz w:val="19"/>
+          <w:szCs w:val="19"/>
+        </w:rPr>
+        <w:t xml:space="preserve">server/src/routes/index.js</w:t>
+      </w:r>
+    </w:p>
+    <w:p>
+      <w:pPr>
+        <w:pStyle w:val="ListParagraph"/>
+        <w:numPr>
+          <w:ilvl w:val="0"/>
+          <w:numId w:val="2"/>
+        </w:numPr>
+      </w:pPr>
+      <w:r>
+        <w:rPr>
+          <w:rFonts w:ascii="Consolas" w:cs="Consolas" w:eastAsia="Consolas" w:hAnsi="Consolas"/>
+          <w:sz w:val="19"/>
+          <w:szCs w:val="19"/>
+        </w:rPr>
+        <w:t xml:space="preserve">server/tests/auth.test.js</w:t>
+      </w:r>
+    </w:p>
+    <w:p>
+      <w:pPr>
+        <w:pStyle w:val="ListParagraph"/>
+        <w:numPr>
+          <w:ilvl w:val="0"/>
+          <w:numId w:val="2"/>
+        </w:numPr>
+      </w:pPr>
+      <w:r>
+        <w:rPr>
+          <w:rFonts w:ascii="Consolas" w:cs="Consolas" w:eastAsia="Consolas" w:hAnsi="Consolas"/>
+          <w:sz w:val="19"/>
+          <w:szCs w:val="19"/>
+        </w:rPr>
+        <w:t xml:space="preserve">server/tests/api.test.js</w:t>
+      </w:r>
+    </w:p>
+    <w:p>
+      <w:pPr>
+        <w:pStyle w:val="ListParagraph"/>
+        <w:numPr>
+          <w:ilvl w:val="0"/>
+          <w:numId w:val="2"/>
+        </w:numPr>
+      </w:pPr>
+      <w:r>
+        <w:rPr>
+          <w:rFonts w:ascii="Consolas" w:cs="Consolas" w:eastAsia="Consolas" w:hAnsi="Consolas"/>
+          <w:sz w:val="19"/>
+          <w:szCs w:val="19"/>
+        </w:rPr>
+        <w:t xml:space="preserve">server/README.md</w:t>
+      </w:r>
+    </w:p>
+    <w:p>
+      <w:pPr>
+        <w:pStyle w:val="ListParagraph"/>
+        <w:numPr>
+          <w:ilvl w:val="0"/>
+          <w:numId w:val="2"/>
+        </w:numPr>
+      </w:pPr>
+      <w:r>
+        <w:rPr>
+          <w:rFonts w:ascii="Consolas" w:cs="Consolas" w:eastAsia="Consolas" w:hAnsi="Consolas"/>
+          <w:sz w:val="19"/>
+          <w:szCs w:val="19"/>
+        </w:rPr>
+        <w:t xml:space="preserve">docs/audit/P11_AUTH_REST_API_AUDIT.md</w:t>
       </w:r>
     </w:p>
     <w:p>
@@ -14957,41 +15671,24 @@
           <w:sz w:val="19"/>
           <w:szCs w:val="19"/>
         </w:rPr>
+        <w:t xml:space="preserve">docs/SplitStack_Prompt_Log.docx</w:t>
+      </w:r>
+    </w:p>
+    <w:p>
+      <w:pPr>
+        <w:pStyle w:val="ListParagraph"/>
+        <w:numPr>
+          <w:ilvl w:val="0"/>
+          <w:numId w:val="2"/>
+        </w:numPr>
+      </w:pPr>
+      <w:r>
+        <w:rPr>
+          <w:rFonts w:ascii="Consolas" w:cs="Consolas" w:eastAsia="Consolas" w:hAnsi="Consolas"/>
+          <w:sz w:val="19"/>
+          <w:szCs w:val="19"/>
+        </w:rPr>
         <w:t xml:space="preserve">docs/SplitStack_Prompt_Log.pdf</w:t>
-      </w:r>
-    </w:p>
-    <w:p>
-      <w:pPr>
-        <w:pStyle w:val="ListParagraph"/>
-        <w:numPr>
-          <w:ilvl w:val="0"/>
-          <w:numId w:val="2"/>
-        </w:numPr>
-      </w:pPr>
-      <w:r>
-        <w:rPr>
-          <w:rFonts w:ascii="Consolas" w:cs="Consolas" w:eastAsia="Consolas" w:hAnsi="Consolas"/>
-          <w:sz w:val="19"/>
-          <w:szCs w:val="19"/>
-        </w:rPr>
-        <w:t xml:space="preserve">docs/SplitStack_Prompt_Log.docx</w:t>
-      </w:r>
-    </w:p>
-    <w:p>
-      <w:pPr>
-        <w:pStyle w:val="ListParagraph"/>
-        <w:numPr>
-          <w:ilvl w:val="0"/>
-          <w:numId w:val="2"/>
-        </w:numPr>
-      </w:pPr>
-      <w:r>
-        <w:rPr>
-          <w:rFonts w:ascii="Consolas" w:cs="Consolas" w:eastAsia="Consolas" w:hAnsi="Consolas"/>
-          <w:sz w:val="19"/>
-          <w:szCs w:val="19"/>
-        </w:rPr>
-        <w:t xml:space="preserve">package.json</w:t>
       </w:r>
     </w:p>
     <w:p>
@@ -15019,7 +15716,7 @@
           <w:sz w:val="21"/>
           <w:szCs w:val="21"/>
         </w:rPr>
-        <w:t xml:space="preserve">PDF with the executed prompts and 15 planned prompts; the Word log has the same content.</w:t>
+        <w:t xml:space="preserve">Created complete authentication layer and 12 REST API modules with strict ownership isolation, group role checks, and paise validation; all 88 server tests passing across 33 suites; client test suite (176 tests) and HTML linter (25 files) clean; documentation and audit updated.</w:t>
       </w:r>
     </w:p>
     <w:p>
@@ -15047,7 +15744,7 @@
           <w:sz w:val="21"/>
           <w:szCs w:val="21"/>
         </w:rPr>
-        <w:t xml:space="preserve">Pages rendered to images and inspected; text extracted with pypdf.</w:t>
+        <w:t xml:space="preserve">npm run test:server (88 passed, 0 failed); npm run test:client (176 passed, 0 failed); npm run lint:html (0 errors).</w:t>
       </w:r>
     </w:p>
     <w:p>
@@ -15063,11 +15760,20 @@
     </w:p>
     <w:p>
       <w:pPr>
+        <w:pStyle w:val="Heading2"/>
+        <w:spacing w:before="360"/>
+      </w:pPr>
+      <w:r>
+        <w:t xml:space="preserve">Wrap-up - Documentation, cleanup and deployment</w:t>
+      </w:r>
+    </w:p>
+    <w:p>
+      <w:pPr>
         <w:pStyle w:val="Heading3"/>
         <w:keepNext/>
       </w:pPr>
       <w:r>
-        <w:t xml:space="preserve">#15  Create the GitHub repository and push the code</w:t>
+        <w:t xml:space="preserve">#13  Request: GitHub repository, website link and PDF of prompts</w:t>
       </w:r>
     </w:p>
     <w:p>
@@ -15081,7 +15787,7 @@
           <w:sz w:val="18"/>
           <w:szCs w:val="18"/>
         </w:rPr>
-        <w:t xml:space="preserve">Working prompt  |  2026-10-15</w:t>
+        <w:t xml:space="preserve">User prompt  |  2026-10-15</w:t>
       </w:r>
     </w:p>
     <w:p>
@@ -15115,7 +15821,7 @@
           <w:sz w:val="19"/>
           <w:szCs w:val="19"/>
         </w:rPr>
-        <w:t xml:space="preserve">Install the official GitHub CLI with winget and sign in through the device-code flow (the student approves it in the browser). Before publishing, check that no secrets or databases are tracked, review the receipt images that are still in the commit history (they are generic sample invoices), and confirm with the student that a public repository is acceptable because the team's original repository is private. Then create the public repository MahaprabhuK/SplitStack, push the refurbish branch as main together with the legacy branch, add a GitHub Actions workflow (.github/workflows/pages.yml) that deploys the client/ folder to GitHub Pages, enable Pages with the "GitHub Actions" source, and confirm that the site responds.</w:t>
+        <w:t xml:space="preserve">create a new repositry for this project in my gihub , and after than give me the github link and then the website link and also a pdf containing the prompts to complete project.</w:t>
       </w:r>
     </w:p>
     <w:p>
@@ -15143,7 +15849,7 @@
           <w:sz w:val="21"/>
           <w:szCs w:val="21"/>
         </w:rPr>
-        <w:t xml:space="preserve">Give the student a repository link and a live website link.</w:t>
+        <w:t xml:space="preserve">Publish the project under the student's own GitHub account, host the site, and export the prompt log (including the remaining planned prompts) as a PDF.</w:t>
       </w:r>
     </w:p>
     <w:p>
@@ -15176,7 +15882,7 @@
           <w:sz w:val="19"/>
           <w:szCs w:val="19"/>
         </w:rPr>
-        <w:t xml:space="preserve">README.md</w:t>
+        <w:t xml:space="preserve">-</w:t>
       </w:r>
     </w:p>
     <w:p>
@@ -15204,7 +15910,7 @@
           <w:sz w:val="21"/>
           <w:szCs w:val="21"/>
         </w:rPr>
-        <w:t xml:space="preserve">Public repository https://github.com/MahaprabhuK/SplitStack created and the legacy branch pushed. The first push of main was rejected because it added a GitHub Actions workflow (.github/workflows/pages.yml) and the gh token lacked the "workflow" scope; the workflow file was removed and main was pushed in the next step. GitHub Pages is not set up yet (planned for the wrap-up; needs "gh auth refresh -s workflow" or a gh-pages branch).</w:t>
+        <w:t xml:space="preserve">Done: see the following entries.</w:t>
       </w:r>
     </w:p>
     <w:p>
@@ -15232,7 +15938,7 @@
           <w:sz w:val="21"/>
           <w:szCs w:val="21"/>
         </w:rPr>
-        <w:t xml:space="preserve">gh repo view; git push output.</w:t>
+        <w:t xml:space="preserve">-</w:t>
       </w:r>
     </w:p>
     <w:p>
@@ -15252,7 +15958,7 @@
         <w:keepNext/>
       </w:pPr>
       <w:r>
-        <w:t xml:space="preserve">#16  Request: hand the project over to a teammate's agent</w:t>
+        <w:t xml:space="preserve">#14  PDF export of the prompt log, including planned prompts</w:t>
       </w:r>
     </w:p>
     <w:p>
@@ -15266,7 +15972,7 @@
           <w:sz w:val="18"/>
           <w:szCs w:val="18"/>
         </w:rPr>
-        <w:t xml:space="preserve">User prompt  |  2026-10-15</w:t>
+        <w:t xml:space="preserve">Working prompt  |  2026-10-15</w:t>
       </w:r>
     </w:p>
     <w:p>
@@ -15300,7 +16006,7 @@
           <w:sz w:val="19"/>
           <w:szCs w:val="19"/>
         </w:rPr>
-        <w:t xml:space="preserve">ACTUALLY I GONNA HANDOVER THE PROJECT TO MY TEAMMATES AGENT SO HE'LL BE PULLING THE CODE AND RUNNING IN HIS SYSTEM SO GIVE PROMPT FOR THAT</w:t>
+        <w:t xml:space="preserve">Export the prompt log to PDF with a Python reportlab script (docs/tools/build_prompt_pdf.py) that reads docs/prompt_log.json: a title page, a stage overview table, a summary of every entry, Part A with every executed prompt verbatim in a shaded box with purpose, files, result and verification, and Part B with the planned prompts that complete Review 2, Review 3 and the wrap-up, clearly marked as not yet run. Add the planned prompts to prompt_log.json and to the Word log as well, and make "npm run log" rebuild both documents.</w:t>
       </w:r>
     </w:p>
     <w:p>
@@ -15328,7 +16034,7 @@
           <w:sz w:val="21"/>
           <w:szCs w:val="21"/>
         </w:rPr>
-        <w:t xml:space="preserve">Let a teammate's AI agent clone, run and continue the project.</w:t>
+        <w:t xml:space="preserve">Give the student a PDF containing the prompts needed to complete the whole project.</w:t>
       </w:r>
     </w:p>
     <w:p>
@@ -15361,7 +16067,92 @@
           <w:sz w:val="19"/>
           <w:szCs w:val="19"/>
         </w:rPr>
-        <w:t xml:space="preserve">-</w:t>
+        <w:t xml:space="preserve">docs/tools/build_prompt_pdf.py</w:t>
+      </w:r>
+    </w:p>
+    <w:p>
+      <w:pPr>
+        <w:pStyle w:val="ListParagraph"/>
+        <w:numPr>
+          <w:ilvl w:val="0"/>
+          <w:numId w:val="2"/>
+        </w:numPr>
+      </w:pPr>
+      <w:r>
+        <w:rPr>
+          <w:rFonts w:ascii="Consolas" w:cs="Consolas" w:eastAsia="Consolas" w:hAnsi="Consolas"/>
+          <w:sz w:val="19"/>
+          <w:szCs w:val="19"/>
+        </w:rPr>
+        <w:t xml:space="preserve">docs/tools/build-prompt-log.js</w:t>
+      </w:r>
+    </w:p>
+    <w:p>
+      <w:pPr>
+        <w:pStyle w:val="ListParagraph"/>
+        <w:numPr>
+          <w:ilvl w:val="0"/>
+          <w:numId w:val="2"/>
+        </w:numPr>
+      </w:pPr>
+      <w:r>
+        <w:rPr>
+          <w:rFonts w:ascii="Consolas" w:cs="Consolas" w:eastAsia="Consolas" w:hAnsi="Consolas"/>
+          <w:sz w:val="19"/>
+          <w:szCs w:val="19"/>
+        </w:rPr>
+        <w:t xml:space="preserve">docs/prompt_log.json</w:t>
+      </w:r>
+    </w:p>
+    <w:p>
+      <w:pPr>
+        <w:pStyle w:val="ListParagraph"/>
+        <w:numPr>
+          <w:ilvl w:val="0"/>
+          <w:numId w:val="2"/>
+        </w:numPr>
+      </w:pPr>
+      <w:r>
+        <w:rPr>
+          <w:rFonts w:ascii="Consolas" w:cs="Consolas" w:eastAsia="Consolas" w:hAnsi="Consolas"/>
+          <w:sz w:val="19"/>
+          <w:szCs w:val="19"/>
+        </w:rPr>
+        <w:t xml:space="preserve">docs/SplitStack_Prompt_Log.pdf</w:t>
+      </w:r>
+    </w:p>
+    <w:p>
+      <w:pPr>
+        <w:pStyle w:val="ListParagraph"/>
+        <w:numPr>
+          <w:ilvl w:val="0"/>
+          <w:numId w:val="2"/>
+        </w:numPr>
+      </w:pPr>
+      <w:r>
+        <w:rPr>
+          <w:rFonts w:ascii="Consolas" w:cs="Consolas" w:eastAsia="Consolas" w:hAnsi="Consolas"/>
+          <w:sz w:val="19"/>
+          <w:szCs w:val="19"/>
+        </w:rPr>
+        <w:t xml:space="preserve">docs/SplitStack_Prompt_Log.docx</w:t>
+      </w:r>
+    </w:p>
+    <w:p>
+      <w:pPr>
+        <w:pStyle w:val="ListParagraph"/>
+        <w:numPr>
+          <w:ilvl w:val="0"/>
+          <w:numId w:val="2"/>
+        </w:numPr>
+      </w:pPr>
+      <w:r>
+        <w:rPr>
+          <w:rFonts w:ascii="Consolas" w:cs="Consolas" w:eastAsia="Consolas" w:hAnsi="Consolas"/>
+          <w:sz w:val="19"/>
+          <w:szCs w:val="19"/>
+        </w:rPr>
+        <w:t xml:space="preserve">package.json</w:t>
       </w:r>
     </w:p>
     <w:p>
@@ -15389,7 +16180,7 @@
           <w:sz w:val="21"/>
           <w:szCs w:val="21"/>
         </w:rPr>
-        <w:t xml:space="preserve">A handover prompt was written covering: requirements per review, clone and branch, prerequisites, install/run/verify commands, repository map, known traps, the mandatory logging rule, the ordered remaining work (planned prompts P1-P15) and working rules. Noted that the new work had to be pushed to GitHub first.</w:t>
+        <w:t xml:space="preserve">PDF with the executed prompts and 15 planned prompts; the Word log has the same content.</w:t>
       </w:r>
     </w:p>
     <w:p>
@@ -15417,7 +16208,7 @@
           <w:sz w:val="21"/>
           <w:szCs w:val="21"/>
         </w:rPr>
-        <w:t xml:space="preserve">-</w:t>
+        <w:t xml:space="preserve">Pages rendered to images and inspected; text extracted with pypdf.</w:t>
       </w:r>
     </w:p>
     <w:p>
@@ -15437,7 +16228,7 @@
         <w:keepNext/>
       </w:pPr>
       <w:r>
-        <w:t xml:space="preserve">#17  Push the refurbished code to GitHub main</w:t>
+        <w:t xml:space="preserve">#15  Create the GitHub repository and push the code</w:t>
       </w:r>
     </w:p>
     <w:p>
@@ -15485,7 +16276,7 @@
           <w:sz w:val="19"/>
           <w:szCs w:val="19"/>
         </w:rPr>
-        <w:t xml:space="preserve">push it  (user prompt). Executed as: remove .github/workflows/pages.yml (the token lacks the workflow scope), replace the not-yet-existing live-site link in README.md with local run instructions, correct the earlier log entry about publishing, log the handover, rebuild the prompt logs, commit, and push the refurbish branch to main on https://github.com/MahaprabhuK/SplitStack so the teammate can clone it.</w:t>
+        <w:t xml:space="preserve">Install the official GitHub CLI with winget and sign in through the device-code flow (the student approves it in the browser). Before publishing, check that no secrets or databases are tracked, review the receipt images that are still in the commit history (they are generic sample invoices), and confirm with the student that a public repository is acceptable because the team's original repository is private. Then create the public repository MahaprabhuK/SplitStack, push the refurbish branch as main together with the legacy branch, add a GitHub Actions workflow (.github/workflows/pages.yml) that deploys the client/ folder to GitHub Pages, enable Pages with the "GitHub Actions" source, and confirm that the site responds.</w:t>
       </w:r>
     </w:p>
     <w:p>
@@ -15513,7 +16304,7 @@
           <w:sz w:val="21"/>
           <w:szCs w:val="21"/>
         </w:rPr>
-        <w:t xml:space="preserve">Make the current work available to the teammate.</w:t>
+        <w:t xml:space="preserve">Give the student a repository link and a live website link.</w:t>
       </w:r>
     </w:p>
     <w:p>
@@ -15546,75 +16337,7 @@
           <w:sz w:val="19"/>
           <w:szCs w:val="19"/>
         </w:rPr>
-        <w:t xml:space="preserve">.github/workflows/pages.yml (removed)</w:t>
-      </w:r>
-    </w:p>
-    <w:p>
-      <w:pPr>
-        <w:pStyle w:val="ListParagraph"/>
-        <w:numPr>
-          <w:ilvl w:val="0"/>
-          <w:numId w:val="2"/>
-        </w:numPr>
-      </w:pPr>
-      <w:r>
-        <w:rPr>
-          <w:rFonts w:ascii="Consolas" w:cs="Consolas" w:eastAsia="Consolas" w:hAnsi="Consolas"/>
-          <w:sz w:val="19"/>
-          <w:szCs w:val="19"/>
-        </w:rPr>
         <w:t xml:space="preserve">README.md</w:t>
-      </w:r>
-    </w:p>
-    <w:p>
-      <w:pPr>
-        <w:pStyle w:val="ListParagraph"/>
-        <w:numPr>
-          <w:ilvl w:val="0"/>
-          <w:numId w:val="2"/>
-        </w:numPr>
-      </w:pPr>
-      <w:r>
-        <w:rPr>
-          <w:rFonts w:ascii="Consolas" w:cs="Consolas" w:eastAsia="Consolas" w:hAnsi="Consolas"/>
-          <w:sz w:val="19"/>
-          <w:szCs w:val="19"/>
-        </w:rPr>
-        <w:t xml:space="preserve">docs/prompt_log.json</w:t>
-      </w:r>
-    </w:p>
-    <w:p>
-      <w:pPr>
-        <w:pStyle w:val="ListParagraph"/>
-        <w:numPr>
-          <w:ilvl w:val="0"/>
-          <w:numId w:val="2"/>
-        </w:numPr>
-      </w:pPr>
-      <w:r>
-        <w:rPr>
-          <w:rFonts w:ascii="Consolas" w:cs="Consolas" w:eastAsia="Consolas" w:hAnsi="Consolas"/>
-          <w:sz w:val="19"/>
-          <w:szCs w:val="19"/>
-        </w:rPr>
-        <w:t xml:space="preserve">docs/SplitStack_Prompt_Log.docx</w:t>
-      </w:r>
-    </w:p>
-    <w:p>
-      <w:pPr>
-        <w:pStyle w:val="ListParagraph"/>
-        <w:numPr>
-          <w:ilvl w:val="0"/>
-          <w:numId w:val="2"/>
-        </w:numPr>
-      </w:pPr>
-      <w:r>
-        <w:rPr>
-          <w:rFonts w:ascii="Consolas" w:cs="Consolas" w:eastAsia="Consolas" w:hAnsi="Consolas"/>
-          <w:sz w:val="19"/>
-          <w:szCs w:val="19"/>
-        </w:rPr>
-        <w:t xml:space="preserve">docs/SplitStack_Prompt_Log.pdf</w:t>
       </w:r>
     </w:p>
     <w:p>
@@ -15642,7 +16365,7 @@
           <w:sz w:val="21"/>
           <w:szCs w:val="21"/>
         </w:rPr>
-        <w:t xml:space="preserve">main pushed to GitHub; branches on GitHub: main (refurbished work) and legacy (original Flask app).</w:t>
+        <w:t xml:space="preserve">Public repository https://github.com/MahaprabhuK/SplitStack created and the legacy branch pushed. The first push of main was rejected because it added a GitHub Actions workflow (.github/workflows/pages.yml) and the gh token lacked the "workflow" scope; the workflow file was removed and main was pushed in the next step. GitHub Pages is not set up yet (planned for the wrap-up; needs "gh auth refresh -s workflow" or a gh-pages branch).</w:t>
       </w:r>
     </w:p>
     <w:p>
@@ -15670,7 +16393,7 @@
           <w:sz w:val="21"/>
           <w:szCs w:val="21"/>
         </w:rPr>
-        <w:t xml:space="preserve">git ls-remote shows main and legacy at the expected commits.</w:t>
+        <w:t xml:space="preserve">gh repo view; git push output.</w:t>
       </w:r>
     </w:p>
     <w:p>
@@ -15690,7 +16413,7 @@
         <w:keepNext/>
       </w:pPr>
       <w:r>
-        <w:t xml:space="preserve">#18  Request: push the code and deploy the website</w:t>
+        <w:t xml:space="preserve">#16  Request: hand the project over to a teammate's agent</w:t>
       </w:r>
     </w:p>
     <w:p>
@@ -15738,7 +16461,7 @@
           <w:sz w:val="19"/>
           <w:szCs w:val="19"/>
         </w:rPr>
-        <w:t xml:space="preserve">first push the code and deploy it</w:t>
+        <w:t xml:space="preserve">ACTUALLY I GONNA HANDOVER THE PROJECT TO MY TEAMMATES AGENT SO HE'LL BE PULLING THE CODE AND RUNNING IN HIS SYSTEM SO GIVE PROMPT FOR THAT</w:t>
       </w:r>
     </w:p>
     <w:p>
@@ -15766,7 +16489,7 @@
           <w:sz w:val="21"/>
           <w:szCs w:val="21"/>
         </w:rPr>
-        <w:t xml:space="preserve">Get the code on GitHub and the Review 1 site online.</w:t>
+        <w:t xml:space="preserve">Let a teammate's AI agent clone, run and continue the project.</w:t>
       </w:r>
     </w:p>
     <w:p>
@@ -15827,7 +16550,7 @@
           <w:sz w:val="21"/>
           <w:szCs w:val="21"/>
         </w:rPr>
-        <w:t xml:space="preserve">Handled in the next step.</w:t>
+        <w:t xml:space="preserve">A handover prompt was written covering: requirements per review, clone and branch, prerequisites, install/run/verify commands, repository map, known traps, the mandatory logging rule, the ordered remaining work (planned prompts P1-P15) and working rules. Noted that the new work had to be pushed to GitHub first.</w:t>
       </w:r>
     </w:p>
     <w:p>
@@ -15875,7 +16598,7 @@
         <w:keepNext/>
       </w:pPr>
       <w:r>
-        <w:t xml:space="preserve">#19  Deploy the client to GitHub Pages from a gh-pages branch</w:t>
+        <w:t xml:space="preserve">#17  Push the refurbished code to GitHub main</w:t>
       </w:r>
     </w:p>
     <w:p>
@@ -15923,7 +16646,7 @@
           <w:sz w:val="19"/>
           <w:szCs w:val="19"/>
         </w:rPr>
-        <w:t xml:space="preserve">Push refurbish to main and refurbish on MahaprabhuK/SplitStack. Because the token cannot push workflow files, deploy without GitHub Actions: check that client/ uses only relative links, split client/ into its own history with git subtree split, push it as the gh-pages branch, wait for GitHub Pages to publish it, then put the live link back in README.md and log the step.</w:t>
+        <w:t xml:space="preserve">push it  (user prompt). Executed as: remove .github/workflows/pages.yml (the token lacks the workflow scope), replace the not-yet-existing live-site link in README.md with local run instructions, correct the earlier log entry about publishing, log the handover, rebuild the prompt logs, commit, and push the refurbish branch to main on https://github.com/MahaprabhuK/SplitStack so the teammate can clone it.</w:t>
       </w:r>
     </w:p>
     <w:p>
@@ -15951,7 +16674,7 @@
           <w:sz w:val="21"/>
           <w:szCs w:val="21"/>
         </w:rPr>
-        <w:t xml:space="preserve">Publish the Review 1 site at a public URL without needing the workflow scope.</w:t>
+        <w:t xml:space="preserve">Make the current work available to the teammate.</w:t>
       </w:r>
     </w:p>
     <w:p>
@@ -15984,6 +16707,23 @@
           <w:sz w:val="19"/>
           <w:szCs w:val="19"/>
         </w:rPr>
+        <w:t xml:space="preserve">.github/workflows/pages.yml (removed)</w:t>
+      </w:r>
+    </w:p>
+    <w:p>
+      <w:pPr>
+        <w:pStyle w:val="ListParagraph"/>
+        <w:numPr>
+          <w:ilvl w:val="0"/>
+          <w:numId w:val="2"/>
+        </w:numPr>
+      </w:pPr>
+      <w:r>
+        <w:rPr>
+          <w:rFonts w:ascii="Consolas" w:cs="Consolas" w:eastAsia="Consolas" w:hAnsi="Consolas"/>
+          <w:sz w:val="19"/>
+          <w:szCs w:val="19"/>
+        </w:rPr>
         <w:t xml:space="preserve">README.md</w:t>
       </w:r>
     </w:p>
@@ -16002,6 +16742,40 @@
           <w:szCs w:val="19"/>
         </w:rPr>
         <w:t xml:space="preserve">docs/prompt_log.json</w:t>
+      </w:r>
+    </w:p>
+    <w:p>
+      <w:pPr>
+        <w:pStyle w:val="ListParagraph"/>
+        <w:numPr>
+          <w:ilvl w:val="0"/>
+          <w:numId w:val="2"/>
+        </w:numPr>
+      </w:pPr>
+      <w:r>
+        <w:rPr>
+          <w:rFonts w:ascii="Consolas" w:cs="Consolas" w:eastAsia="Consolas" w:hAnsi="Consolas"/>
+          <w:sz w:val="19"/>
+          <w:szCs w:val="19"/>
+        </w:rPr>
+        <w:t xml:space="preserve">docs/SplitStack_Prompt_Log.docx</w:t>
+      </w:r>
+    </w:p>
+    <w:p>
+      <w:pPr>
+        <w:pStyle w:val="ListParagraph"/>
+        <w:numPr>
+          <w:ilvl w:val="0"/>
+          <w:numId w:val="2"/>
+        </w:numPr>
+      </w:pPr>
+      <w:r>
+        <w:rPr>
+          <w:rFonts w:ascii="Consolas" w:cs="Consolas" w:eastAsia="Consolas" w:hAnsi="Consolas"/>
+          <w:sz w:val="19"/>
+          <w:szCs w:val="19"/>
+        </w:rPr>
+        <w:t xml:space="preserve">docs/SplitStack_Prompt_Log.pdf</w:t>
       </w:r>
     </w:p>
     <w:p>
@@ -16029,7 +16803,7 @@
           <w:sz w:val="21"/>
           <w:szCs w:val="21"/>
         </w:rPr>
-        <w:t xml:space="preserve">main and refurbish are on GitHub. The client/ folder is published from the gh-pages branch at https://mahaprabhuk.github.io/SplitStack/ (GitHub enabled Pages automatically). To redeploy after client changes: git subtree split --prefix client refurbish, then push that commit to gh-pages.</w:t>
+        <w:t xml:space="preserve">main pushed to GitHub; branches on GitHub: main (refurbished work) and legacy (original Flask app).</w:t>
       </w:r>
     </w:p>
     <w:p>
@@ -16057,7 +16831,7 @@
           <w:sz w:val="21"/>
           <w:szCs w:val="21"/>
         </w:rPr>
-        <w:t xml:space="preserve">git ls-remote; curl returned 200 for the home page, pages/404.html and css/base.css on the live site.</w:t>
+        <w:t xml:space="preserve">git ls-remote shows main and legacy at the expected commits.</w:t>
       </w:r>
     </w:p>
     <w:p>
@@ -16077,7 +16851,7 @@
         <w:keepNext/>
       </w:pPr>
       <w:r>
-        <w:t xml:space="preserve">#20  Request: handover prompt PDF for a teammate's agent</w:t>
+        <w:t xml:space="preserve">#18  Request: push the code and deploy the website</w:t>
       </w:r>
     </w:p>
     <w:p>
@@ -16125,7 +16899,7 @@
           <w:sz w:val="19"/>
           <w:szCs w:val="19"/>
         </w:rPr>
-        <w:t xml:space="preserve">imma handover the project to my teammate i want you to create a detailed prompt for his agent most prolly he'll use anti gravity so i want a pdf containing prompts to complete the rest of the work in the project. so create a pdf and mention its path once its created then i'll share it to him</w:t>
+        <w:t xml:space="preserve">first push the code and deploy it</w:t>
       </w:r>
     </w:p>
     <w:p>
@@ -16153,7 +16927,7 @@
           <w:sz w:val="21"/>
           <w:szCs w:val="21"/>
         </w:rPr>
-        <w:t xml:space="preserve">Let a teammate's AI agent (Antigravity) finish Review 2, Review 3 and the wrap-up.</w:t>
+        <w:t xml:space="preserve">Get the code on GitHub and the Review 1 site online.</w:t>
       </w:r>
     </w:p>
     <w:p>
@@ -16262,7 +17036,7 @@
         <w:keepNext/>
       </w:pPr>
       <w:r>
-        <w:t xml:space="preserve">#21  Handover prompts PDF</w:t>
+        <w:t xml:space="preserve">#19  Deploy the client to GitHub Pages from a gh-pages branch</w:t>
       </w:r>
     </w:p>
     <w:p>
@@ -16310,7 +17084,7 @@
           <w:sz w:val="19"/>
           <w:szCs w:val="19"/>
         </w:rPr>
-        <w:t xml:space="preserve">Write docs/tools/build_handover_pdf.py (reusing the styles of build_prompt_pdf.py) to produce docs/SplitStack_Handover_Prompts.pdf: how to use it with Antigravity, one-time setup (tools, collaborator access, MongoDB Atlas, workflow token scope), a roadmap, Prompt 0 with the full project context, rules, logging, commit/push and gh-pages redeploy procedure, the 15 planned prompts P1-P15 expanded with concrete checks and commit messages, utility prompts (status, recovery, review rehearsal) and common problems. Render pages to check the layout.</w:t>
+        <w:t xml:space="preserve">Push refurbish to main and refurbish on MahaprabhuK/SplitStack. Because the token cannot push workflow files, deploy without GitHub Actions: check that client/ uses only relative links, split client/ into its own history with git subtree split, push it as the gh-pages branch, wait for GitHub Pages to publish it, then put the live link back in README.md and log the step.</w:t>
       </w:r>
     </w:p>
     <w:p>
@@ -16338,7 +17112,7 @@
           <w:sz w:val="21"/>
           <w:szCs w:val="21"/>
         </w:rPr>
-        <w:t xml:space="preserve">Give the teammate a self-contained, ordered set of prompts.</w:t>
+        <w:t xml:space="preserve">Publish the Review 1 site at a public URL without needing the workflow scope.</w:t>
       </w:r>
     </w:p>
     <w:p>
@@ -16371,24 +17145,24 @@
           <w:sz w:val="19"/>
           <w:szCs w:val="19"/>
         </w:rPr>
-        <w:t xml:space="preserve">docs/tools/build_handover_pdf.py</w:t>
-      </w:r>
-    </w:p>
-    <w:p>
-      <w:pPr>
-        <w:pStyle w:val="ListParagraph"/>
-        <w:numPr>
-          <w:ilvl w:val="0"/>
-          <w:numId w:val="2"/>
-        </w:numPr>
-      </w:pPr>
-      <w:r>
-        <w:rPr>
-          <w:rFonts w:ascii="Consolas" w:cs="Consolas" w:eastAsia="Consolas" w:hAnsi="Consolas"/>
-          <w:sz w:val="19"/>
-          <w:szCs w:val="19"/>
-        </w:rPr>
-        <w:t xml:space="preserve">docs/SplitStack_Handover_Prompts.pdf</w:t>
+        <w:t xml:space="preserve">README.md</w:t>
+      </w:r>
+    </w:p>
+    <w:p>
+      <w:pPr>
+        <w:pStyle w:val="ListParagraph"/>
+        <w:numPr>
+          <w:ilvl w:val="0"/>
+          <w:numId w:val="2"/>
+        </w:numPr>
+      </w:pPr>
+      <w:r>
+        <w:rPr>
+          <w:rFonts w:ascii="Consolas" w:cs="Consolas" w:eastAsia="Consolas" w:hAnsi="Consolas"/>
+          <w:sz w:val="19"/>
+          <w:szCs w:val="19"/>
+        </w:rPr>
+        <w:t xml:space="preserve">docs/prompt_log.json</w:t>
       </w:r>
     </w:p>
     <w:p>
@@ -16416,7 +17190,7 @@
           <w:sz w:val="21"/>
           <w:szCs w:val="21"/>
         </w:rPr>
-        <w:t xml:space="preserve">14-page PDF created. Changes against the planned prompts: P1 adds data-page attributes and client/js/package.json (type module) for node --test; P13 keeps the localStorage implementation as a demo mode (api-local.js chosen when /api/health does not answer) so the GitHub Pages site keeps working, instead of deleting it; P9 replaces deprecated csurf with a synchronizer token; P14 uses MongoMemoryReplSet because the API uses transactions; P15 asks for confirmation before deleting the Flask files and leaves Render account steps to the student.</w:t>
+        <w:t xml:space="preserve">main and refurbish are on GitHub. The client/ folder is published from the gh-pages branch at https://mahaprabhuk.github.io/SplitStack/ (GitHub enabled Pages automatically). To redeploy after client changes: git subtree split --prefix client refurbish, then push that commit to gh-pages.</w:t>
       </w:r>
     </w:p>
     <w:p>
@@ -16444,7 +17218,7 @@
           <w:sz w:val="21"/>
           <w:szCs w:val="21"/>
         </w:rPr>
-        <w:t xml:space="preserve">Rendered pages with PyMuPDF and checked the layout of the setup, Prompt 0, step and utility pages.</w:t>
+        <w:t xml:space="preserve">git ls-remote; curl returned 200 for the home page, pages/404.html and css/base.css on the live site.</w:t>
       </w:r>
     </w:p>
     <w:p>
@@ -16459,37 +17233,12 @@
       </w:r>
     </w:p>
     <w:p>
-      <w:r>
-        <w:br w:type="page"/>
-      </w:r>
-    </w:p>
-    <w:p>
-      <w:pPr>
-        <w:pStyle w:val="Heading1"/>
-      </w:pPr>
-      <w:r>
-        <w:t xml:space="preserve">Planned prompts to complete the project</w:t>
-      </w:r>
-    </w:p>
-    <w:p>
-      <w:pPr>
-        <w:spacing w:after="80"/>
-      </w:pPr>
-      <w:r>
-        <w:rPr>
-          <w:sz w:val="21"/>
-          <w:szCs w:val="21"/>
-        </w:rPr>
-        <w:t xml:space="preserve">These prompts have not been run yet. Run them in order; after each one, move it into the log above with its result.</w:t>
-      </w:r>
-    </w:p>
-    <w:p>
       <w:pPr>
         <w:pStyle w:val="Heading3"/>
         <w:keepNext/>
       </w:pPr>
       <w:r>
-        <w:t xml:space="preserve">P1  Authentication and REST API</w:t>
+        <w:t xml:space="preserve">#20  Request: handover prompt PDF for a teammate's agent</w:t>
       </w:r>
     </w:p>
     <w:p>
@@ -16503,7 +17252,7 @@
           <w:sz w:val="18"/>
           <w:szCs w:val="18"/>
         </w:rPr>
-        <w:t xml:space="preserve">Review 3  |  Planned prompt</w:t>
+        <w:t xml:space="preserve">User prompt  |  2026-10-15</w:t>
       </w:r>
     </w:p>
     <w:p>
@@ -16537,7 +17286,7 @@
           <w:sz w:val="19"/>
           <w:szCs w:val="19"/>
         </w:rPr>
-        <w:t xml:space="preserve">Implement the REST API under /api with one express.Router per module, mirroring the 48 legacy Flask routes: /api/auth (register with bcrypt cost 12, login, logout, me), /api/expenses, /api/income, /api/categories, /api/budgets, /api/recurring (including toggle), /api/groups (members, shared expenses, balances, settlements, leave), /api/shopping (lists, items, toggle, convert to expense), /api/analytics (monthly, categories, forecast, insights) and /api/search. Validate every input with a schema (zod or express-validator), check ownership or group membership on every request, use MongoDB transactions for multi-document writes (recording a settlement, converting a list), and reuse the Review 2 settle.js and splits.js modules on the server so the algorithm has a single implementation.</w:t>
+        <w:t xml:space="preserve">imma handover the project to my teammate i want you to create a detailed prompt for his agent most prolly he'll use anti gravity so i want a pdf containing prompts to complete the rest of the work in the project. so create a pdf and mention its path once its created then i'll share it to him</w:t>
       </w:r>
     </w:p>
     <w:p>
@@ -16565,7 +17314,7 @@
           <w:sz w:val="21"/>
           <w:szCs w:val="21"/>
         </w:rPr>
-        <w:t xml:space="preserve">Deliver the Node.js back end with a complete, secure API.</w:t>
+        <w:t xml:space="preserve">Let a teammate's AI agent (Antigravity) finish Review 2, Review 3 and the wrap-up.</w:t>
       </w:r>
     </w:p>
     <w:p>
@@ -16582,6 +17331,39 @@
           <w:szCs w:val="17"/>
         </w:rPr>
         <w:t xml:space="preserve">FILES</w:t>
+      </w:r>
+    </w:p>
+    <w:p>
+      <w:pPr>
+        <w:pStyle w:val="ListParagraph"/>
+        <w:numPr>
+          <w:ilvl w:val="0"/>
+          <w:numId w:val="2"/>
+        </w:numPr>
+      </w:pPr>
+      <w:r>
+        <w:rPr>
+          <w:rFonts w:ascii="Consolas" w:cs="Consolas" w:eastAsia="Consolas" w:hAnsi="Consolas"/>
+          <w:sz w:val="19"/>
+          <w:szCs w:val="19"/>
+        </w:rPr>
+        <w:t xml:space="preserve">-</w:t>
+      </w:r>
+    </w:p>
+    <w:p>
+      <w:pPr>
+        <w:spacing w:after="60" w:before="160"/>
+      </w:pPr>
+      <w:r>
+        <w:rPr>
+          <w:b/>
+          <w:bCs/>
+          <w:color w:val="4F46E5"/>
+          <w:spacing w:val="20"/>
+          <w:sz w:val="17"/>
+          <w:szCs w:val="17"/>
+        </w:rPr>
+        <w:t xml:space="preserve">RESULT</w:t>
       </w:r>
     </w:p>
     <w:p>
@@ -16593,7 +17375,46 @@
           <w:sz w:val="21"/>
           <w:szCs w:val="21"/>
         </w:rPr>
-        <w:t xml:space="preserve">server/src/routes/*.js, server/src/services/*.js, server/src/middleware/*.js</w:t>
+        <w:t xml:space="preserve">Handled in the next step.</w:t>
+      </w:r>
+    </w:p>
+    <w:p>
+      <w:pPr>
+        <w:spacing w:after="60" w:before="160"/>
+      </w:pPr>
+      <w:r>
+        <w:rPr>
+          <w:b/>
+          <w:bCs/>
+          <w:color w:val="4F46E5"/>
+          <w:spacing w:val="20"/>
+          <w:sz w:val="17"/>
+          <w:szCs w:val="17"/>
+        </w:rPr>
+        <w:t xml:space="preserve">VERIFICATION</w:t>
+      </w:r>
+    </w:p>
+    <w:p>
+      <w:pPr>
+        <w:spacing w:after="80"/>
+      </w:pPr>
+      <w:r>
+        <w:rPr>
+          <w:sz w:val="21"/>
+          <w:szCs w:val="21"/>
+        </w:rPr>
+        <w:t xml:space="preserve">-</w:t>
+      </w:r>
+    </w:p>
+    <w:p>
+      <w:pPr>
+        <w:pBdr>
+          <w:bottom w:val="single" w:color="D9DBE5" w:sz="4" w:space="4"/>
+        </w:pBdr>
+        <w:spacing w:after="200"/>
+      </w:pPr>
+      <w:r>
+        <w:t xml:space="preserve"/>
       </w:r>
     </w:p>
     <w:p>
@@ -16602,7 +17423,7 @@
         <w:keepNext/>
       </w:pPr>
       <w:r>
-        <w:t xml:space="preserve">P2  Receipt upload and server-side OCR</w:t>
+        <w:t xml:space="preserve">#21  Handover prompts PDF</w:t>
       </w:r>
     </w:p>
     <w:p>
@@ -16616,7 +17437,7 @@
           <w:sz w:val="18"/>
           <w:szCs w:val="18"/>
         </w:rPr>
-        <w:t xml:space="preserve">Review 3  |  Planned prompt</w:t>
+        <w:t xml:space="preserve">Working prompt  |  2026-10-15</w:t>
       </w:r>
     </w:p>
     <w:p>
@@ -16650,7 +17471,7 @@
           <w:sz w:val="19"/>
           <w:szCs w:val="19"/>
         </w:rPr>
-        <w:t xml:space="preserve">Add POST /api/receipts using multer with memory storage, a 5 MB limit and magic-byte checks for PNG, JPEG and WEBP; preprocess with sharp (rotate from EXIF, greyscale, upscale small images, normalise); run tesseract.js with one shared worker; parse the merchant, date and total with the Review 2 parser; store the image in MongoDB GridFS (so it survives redeploys on free hosting) and the parsed fields in Receipt. GET /api/receipts/:id/image streams the image only to its owner. Confirming creates the expense; nothing becomes an expense without confirmation.</w:t>
+        <w:t xml:space="preserve">Write docs/tools/build_handover_pdf.py (reusing the styles of build_prompt_pdf.py) to produce docs/SplitStack_Handover_Prompts.pdf: how to use it with Antigravity, one-time setup (tools, collaborator access, MongoDB Atlas, workflow token scope), a roadmap, Prompt 0 with the full project context, rules, logging, commit/push and gh-pages redeploy procedure, the 15 planned prompts P1-P15 expanded with concrete checks and commit messages, utility prompts (status, recovery, review rehearsal) and common problems. Render pages to check the layout.</w:t>
       </w:r>
     </w:p>
     <w:p>
@@ -16678,7 +17499,7 @@
           <w:sz w:val="21"/>
           <w:szCs w:val="21"/>
         </w:rPr>
-        <w:t xml:space="preserve">Port the OCR feature to Node with persistent storage.</w:t>
+        <w:t xml:space="preserve">Give the teammate a self-contained, ordered set of prompts.</w:t>
       </w:r>
     </w:p>
     <w:p>
@@ -16695,6 +17516,56 @@
           <w:szCs w:val="17"/>
         </w:rPr>
         <w:t xml:space="preserve">FILES</w:t>
+      </w:r>
+    </w:p>
+    <w:p>
+      <w:pPr>
+        <w:pStyle w:val="ListParagraph"/>
+        <w:numPr>
+          <w:ilvl w:val="0"/>
+          <w:numId w:val="2"/>
+        </w:numPr>
+      </w:pPr>
+      <w:r>
+        <w:rPr>
+          <w:rFonts w:ascii="Consolas" w:cs="Consolas" w:eastAsia="Consolas" w:hAnsi="Consolas"/>
+          <w:sz w:val="19"/>
+          <w:szCs w:val="19"/>
+        </w:rPr>
+        <w:t xml:space="preserve">docs/tools/build_handover_pdf.py</w:t>
+      </w:r>
+    </w:p>
+    <w:p>
+      <w:pPr>
+        <w:pStyle w:val="ListParagraph"/>
+        <w:numPr>
+          <w:ilvl w:val="0"/>
+          <w:numId w:val="2"/>
+        </w:numPr>
+      </w:pPr>
+      <w:r>
+        <w:rPr>
+          <w:rFonts w:ascii="Consolas" w:cs="Consolas" w:eastAsia="Consolas" w:hAnsi="Consolas"/>
+          <w:sz w:val="19"/>
+          <w:szCs w:val="19"/>
+        </w:rPr>
+        <w:t xml:space="preserve">docs/SplitStack_Handover_Prompts.pdf</w:t>
+      </w:r>
+    </w:p>
+    <w:p>
+      <w:pPr>
+        <w:spacing w:after="60" w:before="160"/>
+      </w:pPr>
+      <w:r>
+        <w:rPr>
+          <w:b/>
+          <w:bCs/>
+          <w:color w:val="4F46E5"/>
+          <w:spacing w:val="20"/>
+          <w:sz w:val="17"/>
+          <w:szCs w:val="17"/>
+        </w:rPr>
+        <w:t xml:space="preserve">RESULT</w:t>
       </w:r>
     </w:p>
     <w:p>
@@ -16706,7 +17577,71 @@
           <w:sz w:val="21"/>
           <w:szCs w:val="21"/>
         </w:rPr>
-        <w:t xml:space="preserve">server/src/routes/receipts.js, server/src/services/ocr.js</w:t>
+        <w:t xml:space="preserve">14-page PDF created. Changes against the planned prompts: P1 adds data-page attributes and client/js/package.json (type module) for node --test; P13 keeps the localStorage implementation as a demo mode (api-local.js chosen when /api/health does not answer) so the GitHub Pages site keeps working, instead of deleting it; P9 replaces deprecated csurf with a synchronizer token; P14 uses MongoMemoryReplSet because the API uses transactions; P15 asks for confirmation before deleting the Flask files and leaves Render account steps to the student.</w:t>
+      </w:r>
+    </w:p>
+    <w:p>
+      <w:pPr>
+        <w:spacing w:after="60" w:before="160"/>
+      </w:pPr>
+      <w:r>
+        <w:rPr>
+          <w:b/>
+          <w:bCs/>
+          <w:color w:val="4F46E5"/>
+          <w:spacing w:val="20"/>
+          <w:sz w:val="17"/>
+          <w:szCs w:val="17"/>
+        </w:rPr>
+        <w:t xml:space="preserve">VERIFICATION</w:t>
+      </w:r>
+    </w:p>
+    <w:p>
+      <w:pPr>
+        <w:spacing w:after="80"/>
+      </w:pPr>
+      <w:r>
+        <w:rPr>
+          <w:sz w:val="21"/>
+          <w:szCs w:val="21"/>
+        </w:rPr>
+        <w:t xml:space="preserve">Rendered pages with PyMuPDF and checked the layout of the setup, Prompt 0, step and utility pages.</w:t>
+      </w:r>
+    </w:p>
+    <w:p>
+      <w:pPr>
+        <w:pBdr>
+          <w:bottom w:val="single" w:color="D9DBE5" w:sz="4" w:space="4"/>
+        </w:pBdr>
+        <w:spacing w:after="200"/>
+      </w:pPr>
+      <w:r>
+        <w:t xml:space="preserve"/>
+      </w:r>
+    </w:p>
+    <w:p>
+      <w:r>
+        <w:br w:type="page"/>
+      </w:r>
+    </w:p>
+    <w:p>
+      <w:pPr>
+        <w:pStyle w:val="Heading1"/>
+      </w:pPr>
+      <w:r>
+        <w:t xml:space="preserve">Planned prompts to complete the project</w:t>
+      </w:r>
+    </w:p>
+    <w:p>
+      <w:pPr>
+        <w:spacing w:after="80"/>
+      </w:pPr>
+      <w:r>
+        <w:rPr>
+          <w:sz w:val="21"/>
+          <w:szCs w:val="21"/>
+        </w:rPr>
+        <w:t xml:space="preserve">These prompts have not been run yet. Run them in order; after each one, move it into the log above with its result.</w:t>
       </w:r>
     </w:p>
     <w:p>
@@ -16715,7 +17650,7 @@
         <w:keepNext/>
       </w:pPr>
       <w:r>
-        <w:t xml:space="preserve">P3  Connect the client to the API</w:t>
+        <w:t xml:space="preserve">P1  Receipt upload and server-side OCR</w:t>
       </w:r>
     </w:p>
     <w:p>
@@ -16763,7 +17698,7 @@
           <w:sz w:val="19"/>
           <w:szCs w:val="19"/>
         </w:rPr>
-        <w:t xml:space="preserve">Re-implement client/js/data/api.js with fetch() against /api, sending credentials and the CSRF token header, mapping HTTP errors to the same {field, message} errors the pages already handle, and showing a toast when offline. Remove the localStorage store except for the theme preference. Because the page code depends only on api.js, no page module should need changes; confirm this by running every flow end to end against a local server connected to Atlas.</w:t>
+        <w:t xml:space="preserve">Add POST /api/receipts using multer with memory storage, a 5 MB limit and magic-byte checks for PNG, JPEG and WEBP; preprocess with sharp (rotate from EXIF, greyscale, upscale small images, normalise); run tesseract.js with one shared worker; parse the merchant, date and total with the Review 2 parser; store the image in MongoDB GridFS (so it survives redeploys on free hosting) and the parsed fields in Receipt. GET /api/receipts/:id/image streams the image only to its owner. Confirming creates the expense; nothing becomes an expense without confirmation.</w:t>
       </w:r>
     </w:p>
     <w:p>
@@ -16791,7 +17726,7 @@
           <w:sz w:val="21"/>
           <w:szCs w:val="21"/>
         </w:rPr>
-        <w:t xml:space="preserve">Finish the full-stack integration.</w:t>
+        <w:t xml:space="preserve">Port the OCR feature to Node with persistent storage.</w:t>
       </w:r>
     </w:p>
     <w:p>
@@ -16819,7 +17754,7 @@
           <w:sz w:val="21"/>
           <w:szCs w:val="21"/>
         </w:rPr>
-        <w:t xml:space="preserve">client/js/data/api.js</w:t>
+        <w:t xml:space="preserve">server/src/routes/receipts.js, server/src/services/ocr.js</w:t>
       </w:r>
     </w:p>
     <w:p>
@@ -16828,7 +17763,7 @@
         <w:keepNext/>
       </w:pPr>
       <w:r>
-        <w:t xml:space="preserve">P4  Seed data and automated tests</w:t>
+        <w:t xml:space="preserve">P2  Connect the client to the API</w:t>
       </w:r>
     </w:p>
     <w:p>
@@ -16876,7 +17811,7 @@
           <w:sz w:val="19"/>
           <w:szCs w:val="19"/>
         </w:rPr>
-        <w:t xml:space="preserve">Add server/scripts/seed.js that creates the demo user, categories, six months of expenses and income, budgets, recurring payments, the three groups with shared expenses, and shopping lists. It must be idempotent and must refuse to run against a database whose name does not end in -dev or -test unless --force is passed. Write Jest + Supertest tests using mongodb-memory-server for auth, ownership checks, CSRF rejection, rate limiting, split validation, the settlement algorithm, budget status, convert-to-expense duplicate prevention and receipt upload validation, covering what the 47 legacy Python tests checked. Add an npm test script and a GitHub Actions workflow that runs lint and tests on every push.</w:t>
+        <w:t xml:space="preserve">Re-implement client/js/data/api.js with fetch() against /api, sending credentials and the CSRF token header, mapping HTTP errors to the same {field, message} errors the pages already handle, and showing a toast when offline. Remove the localStorage store except for the theme preference. Because the page code depends only on api.js, no page module should need changes; confirm this by running every flow end to end against a local server connected to Atlas.</w:t>
       </w:r>
     </w:p>
     <w:p>
@@ -16904,7 +17839,7 @@
           <w:sz w:val="21"/>
           <w:szCs w:val="21"/>
         </w:rPr>
-        <w:t xml:space="preserve">Prove the back end works and keep it working.</w:t>
+        <w:t xml:space="preserve">Finish the full-stack integration.</w:t>
       </w:r>
     </w:p>
     <w:p>
@@ -16932,7 +17867,7 @@
           <w:sz w:val="21"/>
           <w:szCs w:val="21"/>
         </w:rPr>
-        <w:t xml:space="preserve">server/scripts/seed.js, server/tests/*.test.js, .github/workflows/ci.yml</w:t>
+        <w:t xml:space="preserve">client/js/data/api.js</w:t>
       </w:r>
     </w:p>
     <w:p>
@@ -16941,7 +17876,120 @@
         <w:keepNext/>
       </w:pPr>
       <w:r>
-        <w:t xml:space="preserve">P5  Remove legacy code, document and deploy</w:t>
+        <w:t xml:space="preserve">P3  Seed data and automated tests</w:t>
+      </w:r>
+    </w:p>
+    <w:p>
+      <w:pPr>
+        <w:keepNext/>
+        <w:spacing w:after="60"/>
+      </w:pPr>
+      <w:r>
+        <w:rPr>
+          <w:color w:val="5B6475"/>
+          <w:sz w:val="18"/>
+          <w:szCs w:val="18"/>
+        </w:rPr>
+        <w:t xml:space="preserve">Review 3  |  Planned prompt</w:t>
+      </w:r>
+    </w:p>
+    <w:p>
+      <w:pPr>
+        <w:spacing w:after="60" w:before="160"/>
+      </w:pPr>
+      <w:r>
+        <w:rPr>
+          <w:b/>
+          <w:bCs/>
+          <w:color w:val="4F46E5"/>
+          <w:spacing w:val="20"/>
+          <w:sz w:val="17"/>
+          <w:szCs w:val="17"/>
+        </w:rPr>
+        <w:t xml:space="preserve">PROMPT</w:t>
+      </w:r>
+    </w:p>
+    <w:p>
+      <w:pPr>
+        <w:pBdr>
+          <w:left w:val="single" w:color="4F46E5" w:sz="18" w:space="8"/>
+        </w:pBdr>
+        <w:shd w:fill="F1F2F8" w:color="auto" w:val="clear"/>
+        <w:spacing w:after="120" w:before="40" w:line="276"/>
+        <w:ind w:left="160" w:right="160"/>
+      </w:pPr>
+      <w:r>
+        <w:rPr>
+          <w:rFonts w:ascii="Consolas" w:cs="Consolas" w:eastAsia="Consolas" w:hAnsi="Consolas"/>
+          <w:sz w:val="19"/>
+          <w:szCs w:val="19"/>
+        </w:rPr>
+        <w:t xml:space="preserve">Add server/scripts/seed.js that creates the demo user, categories, six months of expenses and income, budgets, recurring payments, the three groups with shared expenses, and shopping lists. It must be idempotent and must refuse to run against a database whose name does not end in -dev or -test unless --force is passed. Write Jest + Supertest tests using mongodb-memory-server for auth, ownership checks, CSRF rejection, rate limiting, split validation, the settlement algorithm, budget status, convert-to-expense duplicate prevention and receipt upload validation, covering what the 47 legacy Python tests checked. Add an npm test script and a GitHub Actions workflow that runs lint and tests on every push.</w:t>
+      </w:r>
+    </w:p>
+    <w:p>
+      <w:pPr>
+        <w:spacing w:after="60" w:before="160"/>
+      </w:pPr>
+      <w:r>
+        <w:rPr>
+          <w:b/>
+          <w:bCs/>
+          <w:color w:val="4F46E5"/>
+          <w:spacing w:val="20"/>
+          <w:sz w:val="17"/>
+          <w:szCs w:val="17"/>
+        </w:rPr>
+        <w:t xml:space="preserve">PURPOSE</w:t>
+      </w:r>
+    </w:p>
+    <w:p>
+      <w:pPr>
+        <w:spacing w:after="80"/>
+      </w:pPr>
+      <w:r>
+        <w:rPr>
+          <w:sz w:val="21"/>
+          <w:szCs w:val="21"/>
+        </w:rPr>
+        <w:t xml:space="preserve">Prove the back end works and keep it working.</w:t>
+      </w:r>
+    </w:p>
+    <w:p>
+      <w:pPr>
+        <w:spacing w:after="60" w:before="160"/>
+      </w:pPr>
+      <w:r>
+        <w:rPr>
+          <w:b/>
+          <w:bCs/>
+          <w:color w:val="4F46E5"/>
+          <w:spacing w:val="20"/>
+          <w:sz w:val="17"/>
+          <w:szCs w:val="17"/>
+        </w:rPr>
+        <w:t xml:space="preserve">FILES</w:t>
+      </w:r>
+    </w:p>
+    <w:p>
+      <w:pPr>
+        <w:spacing w:after="80"/>
+      </w:pPr>
+      <w:r>
+        <w:rPr>
+          <w:sz w:val="21"/>
+          <w:szCs w:val="21"/>
+        </w:rPr>
+        <w:t xml:space="preserve">server/scripts/seed.js, server/tests/*.test.js, .github/workflows/ci.yml</w:t>
+      </w:r>
+    </w:p>
+    <w:p>
+      <w:pPr>
+        <w:pStyle w:val="Heading3"/>
+        <w:keepNext/>
+      </w:pPr>
+      <w:r>
+        <w:t xml:space="preserve">P4  Remove legacy code, document and deploy</w:t>
       </w:r>
     </w:p>
     <w:p>

</xml_diff>

<commit_message>
Review 3: receipt upload and server-side OCR
</commit_message>
<xml_diff>
--- a/docs/SplitStack_Prompt_Log.docx
+++ b/docs/SplitStack_Prompt_Log.docx
@@ -132,7 +132,7 @@
           <w:sz w:val="21"/>
           <w:szCs w:val="21"/>
         </w:rPr>
-        <w:t xml:space="preserve">43</w:t>
+        <w:t xml:space="preserve">45</w:t>
       </w:r>
     </w:p>
     <w:p>
@@ -639,7 +639,7 @@
                 <w:sz w:val="18"/>
                 <w:szCs w:val="18"/>
               </w:rPr>
-              <w:t xml:space="preserve">6</w:t>
+              <w:t xml:space="preserve">8</w:t>
             </w:r>
           </w:p>
         </w:tc>
@@ -5958,6 +5958,245 @@
                 <w:szCs w:val="18"/>
               </w:rPr>
               <w:t xml:space="preserve">Authentication and REST API endpoints</w:t>
+            </w:r>
+          </w:p>
+        </w:tc>
+        <w:tc>
+          <w:tcPr>
+            <w:tcW w:type="dxa" w:w="1500"/>
+            <w:tcMar>
+              <w:top w:type="dxa" w:w="60"/>
+              <w:left w:type="dxa" w:w="100"/>
+              <w:bottom w:type="dxa" w:w="60"/>
+              <w:right w:type="dxa" w:w="100"/>
+            </w:tcMar>
+          </w:tcPr>
+          <w:p>
+            <w:r>
+              <w:rPr>
+                <w:b w:val="false"/>
+                <w:bCs w:val="false"/>
+                <w:color w:val="222222"/>
+                <w:sz w:val="18"/>
+                <w:szCs w:val="18"/>
+              </w:rPr>
+              <w:t xml:space="preserve">Working prompt</w:t>
+            </w:r>
+          </w:p>
+        </w:tc>
+        <w:tc>
+          <w:tcPr>
+            <w:tcW w:type="dxa" w:w="1400"/>
+            <w:tcMar>
+              <w:top w:type="dxa" w:w="60"/>
+              <w:left w:type="dxa" w:w="100"/>
+              <w:bottom w:type="dxa" w:w="60"/>
+              <w:right w:type="dxa" w:w="100"/>
+            </w:tcMar>
+          </w:tcPr>
+          <w:p>
+            <w:r>
+              <w:rPr>
+                <w:b w:val="false"/>
+                <w:bCs w:val="false"/>
+                <w:color w:val="222222"/>
+                <w:sz w:val="18"/>
+                <w:szCs w:val="18"/>
+              </w:rPr>
+              <w:t xml:space="preserve">2026-10-17</w:t>
+            </w:r>
+          </w:p>
+        </w:tc>
+      </w:tr>
+      <w:tr>
+        <w:tc>
+          <w:tcPr>
+            <w:tcW w:type="dxa" w:w="700"/>
+            <w:shd w:fill="F7F7FB" w:color="auto" w:val="clear"/>
+            <w:tcMar>
+              <w:top w:type="dxa" w:w="60"/>
+              <w:left w:type="dxa" w:w="100"/>
+              <w:bottom w:type="dxa" w:w="60"/>
+              <w:right w:type="dxa" w:w="100"/>
+            </w:tcMar>
+          </w:tcPr>
+          <w:p>
+            <w:r>
+              <w:rPr>
+                <w:b w:val="false"/>
+                <w:bCs w:val="false"/>
+                <w:color w:val="222222"/>
+                <w:sz w:val="18"/>
+                <w:szCs w:val="18"/>
+              </w:rPr>
+              <w:t xml:space="preserve">44</w:t>
+            </w:r>
+          </w:p>
+        </w:tc>
+        <w:tc>
+          <w:tcPr>
+            <w:tcW w:type="dxa" w:w="1500"/>
+            <w:shd w:fill="F7F7FB" w:color="auto" w:val="clear"/>
+            <w:tcMar>
+              <w:top w:type="dxa" w:w="60"/>
+              <w:left w:type="dxa" w:w="100"/>
+              <w:bottom w:type="dxa" w:w="60"/>
+              <w:right w:type="dxa" w:w="100"/>
+            </w:tcMar>
+          </w:tcPr>
+          <w:p>
+            <w:r>
+              <w:rPr>
+                <w:b w:val="false"/>
+                <w:bCs w:val="false"/>
+                <w:color w:val="222222"/>
+                <w:sz w:val="18"/>
+                <w:szCs w:val="18"/>
+              </w:rPr>
+              <w:t xml:space="preserve">Review 3</w:t>
+            </w:r>
+          </w:p>
+        </w:tc>
+        <w:tc>
+          <w:tcPr>
+            <w:tcW w:type="dxa" w:w="4538"/>
+            <w:shd w:fill="F7F7FB" w:color="auto" w:val="clear"/>
+            <w:tcMar>
+              <w:top w:type="dxa" w:w="60"/>
+              <w:left w:type="dxa" w:w="100"/>
+              <w:bottom w:type="dxa" w:w="60"/>
+              <w:right w:type="dxa" w:w="100"/>
+            </w:tcMar>
+          </w:tcPr>
+          <w:p>
+            <w:r>
+              <w:rPr>
+                <w:b w:val="false"/>
+                <w:bCs w:val="false"/>
+                <w:color w:val="222222"/>
+                <w:sz w:val="18"/>
+                <w:szCs w:val="18"/>
+              </w:rPr>
+              <w:t xml:space="preserve">Request: proceed with Review 3 Step P12</w:t>
+            </w:r>
+          </w:p>
+        </w:tc>
+        <w:tc>
+          <w:tcPr>
+            <w:tcW w:type="dxa" w:w="1500"/>
+            <w:shd w:fill="F7F7FB" w:color="auto" w:val="clear"/>
+            <w:tcMar>
+              <w:top w:type="dxa" w:w="60"/>
+              <w:left w:type="dxa" w:w="100"/>
+              <w:bottom w:type="dxa" w:w="60"/>
+              <w:right w:type="dxa" w:w="100"/>
+            </w:tcMar>
+          </w:tcPr>
+          <w:p>
+            <w:r>
+              <w:rPr>
+                <w:b w:val="false"/>
+                <w:bCs w:val="false"/>
+                <w:color w:val="222222"/>
+                <w:sz w:val="18"/>
+                <w:szCs w:val="18"/>
+              </w:rPr>
+              <w:t xml:space="preserve">User prompt</w:t>
+            </w:r>
+          </w:p>
+        </w:tc>
+        <w:tc>
+          <w:tcPr>
+            <w:tcW w:type="dxa" w:w="1400"/>
+            <w:shd w:fill="F7F7FB" w:color="auto" w:val="clear"/>
+            <w:tcMar>
+              <w:top w:type="dxa" w:w="60"/>
+              <w:left w:type="dxa" w:w="100"/>
+              <w:bottom w:type="dxa" w:w="60"/>
+              <w:right w:type="dxa" w:w="100"/>
+            </w:tcMar>
+          </w:tcPr>
+          <w:p>
+            <w:r>
+              <w:rPr>
+                <w:b w:val="false"/>
+                <w:bCs w:val="false"/>
+                <w:color w:val="222222"/>
+                <w:sz w:val="18"/>
+                <w:szCs w:val="18"/>
+              </w:rPr>
+              <w:t xml:space="preserve">2026-10-17</w:t>
+            </w:r>
+          </w:p>
+        </w:tc>
+      </w:tr>
+      <w:tr>
+        <w:tc>
+          <w:tcPr>
+            <w:tcW w:type="dxa" w:w="700"/>
+            <w:tcMar>
+              <w:top w:type="dxa" w:w="60"/>
+              <w:left w:type="dxa" w:w="100"/>
+              <w:bottom w:type="dxa" w:w="60"/>
+              <w:right w:type="dxa" w:w="100"/>
+            </w:tcMar>
+          </w:tcPr>
+          <w:p>
+            <w:r>
+              <w:rPr>
+                <w:b w:val="false"/>
+                <w:bCs w:val="false"/>
+                <w:color w:val="222222"/>
+                <w:sz w:val="18"/>
+                <w:szCs w:val="18"/>
+              </w:rPr>
+              <w:t xml:space="preserve">45</w:t>
+            </w:r>
+          </w:p>
+        </w:tc>
+        <w:tc>
+          <w:tcPr>
+            <w:tcW w:type="dxa" w:w="1500"/>
+            <w:tcMar>
+              <w:top w:type="dxa" w:w="60"/>
+              <w:left w:type="dxa" w:w="100"/>
+              <w:bottom w:type="dxa" w:w="60"/>
+              <w:right w:type="dxa" w:w="100"/>
+            </w:tcMar>
+          </w:tcPr>
+          <w:p>
+            <w:r>
+              <w:rPr>
+                <w:b w:val="false"/>
+                <w:bCs w:val="false"/>
+                <w:color w:val="222222"/>
+                <w:sz w:val="18"/>
+                <w:szCs w:val="18"/>
+              </w:rPr>
+              <w:t xml:space="preserve">Review 3</w:t>
+            </w:r>
+          </w:p>
+        </w:tc>
+        <w:tc>
+          <w:tcPr>
+            <w:tcW w:type="dxa" w:w="4538"/>
+            <w:tcMar>
+              <w:top w:type="dxa" w:w="60"/>
+              <w:left w:type="dxa" w:w="100"/>
+              <w:bottom w:type="dxa" w:w="60"/>
+              <w:right w:type="dxa" w:w="100"/>
+            </w:tcMar>
+          </w:tcPr>
+          <w:p>
+            <w:r>
+              <w:rPr>
+                <w:b w:val="false"/>
+                <w:bCs w:val="false"/>
+                <w:color w:val="222222"/>
+                <w:sz w:val="18"/>
+                <w:szCs w:val="18"/>
+              </w:rPr>
+              <w:t xml:space="preserve">Receipt upload and server-side OCR</w:t>
             </w:r>
           </w:p>
         </w:tc>
@@ -15760,20 +15999,11 @@
     </w:p>
     <w:p>
       <w:pPr>
-        <w:pStyle w:val="Heading2"/>
-        <w:spacing w:before="360"/>
-      </w:pPr>
-      <w:r>
-        <w:t xml:space="preserve">Wrap-up - Documentation, cleanup and deployment</w:t>
-      </w:r>
-    </w:p>
-    <w:p>
-      <w:pPr>
         <w:pStyle w:val="Heading3"/>
         <w:keepNext/>
       </w:pPr>
       <w:r>
-        <w:t xml:space="preserve">#13  Request: GitHub repository, website link and PDF of prompts</w:t>
+        <w:t xml:space="preserve">#44  Request: proceed with Review 3 Step P12</w:t>
       </w:r>
     </w:p>
     <w:p>
@@ -15787,7 +16017,7 @@
           <w:sz w:val="18"/>
           <w:szCs w:val="18"/>
         </w:rPr>
-        <w:t xml:space="preserve">User prompt  |  2026-10-15</w:t>
+        <w:t xml:space="preserve">User prompt  |  2026-10-17</w:t>
       </w:r>
     </w:p>
     <w:p>
@@ -15821,7 +16051,25 @@
           <w:sz w:val="19"/>
           <w:szCs w:val="19"/>
         </w:rPr>
-        <w:t xml:space="preserve">create a new repositry for this project in my gihub , and after than give me the github link and then the website link and also a pdf containing the prompts to complete project.</w:t>
+        <w:t xml:space="preserve"># SplitStack — P12: Receipt Upload and Server-Side OCR (Review 3)
+Implement P12 only of the SplitStack refurbishment roadmap on the existing refurbish branch.
+## 1. Mandatory safety checks
+Before editing: Confirm current branch is refurbish, latest commit is c6c6f1d (Review 3: authentication and REST API), inspect git status. Work only on refurbish. Do not push. Preserve legacy Flask files and docs/audit/ evidence.
+## 2. Inspect the existing implementation first
+Review server/src/app.js, server/src/config.js, middleware, routes, models, client receipt scanner, and package.json.
+## 3. Implement secure receipt upload
+Implement POST /api/receipts/upload. Use Multer or equivalent. Accept explicitly supported receipt image formats (PNG, JPEG, WEBP) validated by content magic bytes, not just MIME type. Enforce 5 MB limit. Reject empty, malformed, or oversized files. Never trust client paths; generate server-controlled unique identifiers. Authenticate uploader and derive ownership exclusively from verified principal. Store in MongoDB GridFS with compensating cleanup on partial failures.
+## 4. Implement server-side OCR
+Use tesseract.js to extract text server-side. Return structured candidate results (merchant, date, amount, confidence). Treat all extracted fields as untrusted suggestions. Confirming creates the expense; nothing becomes an expense without confirmation. OCR failures must produce safe, consistent errors without orphaned files.
+## 5. Privacy and security
+Do not commit private receipt images or sensitive data. Use safe test fixtures. Enforce ownership on upload, download, metadata, and deletion.
+## 6. Tests
+Add focused automated tests for upload, authentication, MIME sniffing, oversized files, OCR parsing, ownership, streaming, confirmation, and cleanup.
+## 7. Documentation and audit
+Update server/README.md, .env.example, P12 audit report, and prompt_log.json.
+## 8. Verification and commit
+Run test:server, test:client, lint:html. Commit message: Review 3: receipt upload and server-side OCR. Do not push.
+## 9. Final report</w:t>
       </w:r>
     </w:p>
     <w:p>
@@ -15849,7 +16097,7 @@
           <w:sz w:val="21"/>
           <w:szCs w:val="21"/>
         </w:rPr>
-        <w:t xml:space="preserve">Publish the project under the student's own GitHub account, host the site, and export the prompt log (including the remaining planned prompts) as a PDF.</w:t>
+        <w:t xml:space="preserve">Authorize execution of Step P12: Receipt Upload and Server-Side OCR.</w:t>
       </w:r>
     </w:p>
     <w:p>
@@ -15910,7 +16158,7 @@
           <w:sz w:val="21"/>
           <w:szCs w:val="21"/>
         </w:rPr>
-        <w:t xml:space="preserve">Done: see the following entries.</w:t>
+        <w:t xml:space="preserve">Authorized Step P12 implementation.</w:t>
       </w:r>
     </w:p>
     <w:p>
@@ -15958,7 +16206,7 @@
         <w:keepNext/>
       </w:pPr>
       <w:r>
-        <w:t xml:space="preserve">#14  PDF export of the prompt log, including planned prompts</w:t>
+        <w:t xml:space="preserve">#45  Receipt upload and server-side OCR</w:t>
       </w:r>
     </w:p>
     <w:p>
@@ -15972,7 +16220,7 @@
           <w:sz w:val="18"/>
           <w:szCs w:val="18"/>
         </w:rPr>
-        <w:t xml:space="preserve">Working prompt  |  2026-10-15</w:t>
+        <w:t xml:space="preserve">Working prompt  |  2026-10-17</w:t>
       </w:r>
     </w:p>
     <w:p>
@@ -16006,7 +16254,7 @@
           <w:sz w:val="19"/>
           <w:szCs w:val="19"/>
         </w:rPr>
-        <w:t xml:space="preserve">Export the prompt log to PDF with a Python reportlab script (docs/tools/build_prompt_pdf.py) that reads docs/prompt_log.json: a title page, a stage overview table, a summary of every entry, Part A with every executed prompt verbatim in a shaded box with purpose, files, result and verification, and Part B with the planned prompts that complete Review 2, Review 3 and the wrap-up, clearly marked as not yet run. Add the planned prompts to prompt_log.json and to the Word log as well, and make "npm run log" rebuild both documents.</w:t>
+        <w:t xml:space="preserve">Install multer and tesseract.js in server/; update server/src/config.js and server/.env.example with MAX_RECEIPT_SIZE_BYTES, OCR_ENABLED, and OCR_LANGUAGE; create server/src/middleware/upload.js with 5 MB memory storage limit and validateImageSignature magic byte inspection for PNG, JPEG, and WEBP; create server/src/services/storageService.js with GridFS bucket management, server-controlled unique keys, streaming download, and compensating cleanup; create server/src/services/ocrService.js with Tesseract.js optical character recognition and candidate parsing via parseCandidateReceipt; update server/src/models/Receipt.js with mimeType, fileSizeBytes, and originalName; update server/src/routes/receipts.js with POST /upload, GET /, GET /:id, GET /:id/image (streaming), POST /:id/confirm (linked expense creation with duplicate 409 guard), and DELETE /:id (metadata and GridFS cleanup); update client/js/domain/receipt.js to prioritize explicit TOTAL line; create server/tests/receipts.test.js with 35 tests covering all upload, magic byte, OCR, ownership isolation, streaming, confirmation, and deletion behaviors; update server/README.md, docs/audit/P12_RECEIPT_UPLOAD_OCR_AUDIT.md, and prompt logs.</w:t>
       </w:r>
     </w:p>
     <w:p>
@@ -16034,7 +16282,7 @@
           <w:sz w:val="21"/>
           <w:szCs w:val="21"/>
         </w:rPr>
-        <w:t xml:space="preserve">Give the student a PDF containing the prompts needed to complete the whole project.</w:t>
+        <w:t xml:space="preserve">Implement secure multipart receipt upload, binary magic byte content inspection, persistent GridFS storage, server-side OCR candidate extraction, and duplicate-protected confirmation for SplitStack.</w:t>
       </w:r>
     </w:p>
     <w:p>
@@ -16067,24 +16315,211 @@
           <w:sz w:val="19"/>
           <w:szCs w:val="19"/>
         </w:rPr>
-        <w:t xml:space="preserve">docs/tools/build_prompt_pdf.py</w:t>
-      </w:r>
-    </w:p>
-    <w:p>
-      <w:pPr>
-        <w:pStyle w:val="ListParagraph"/>
-        <w:numPr>
-          <w:ilvl w:val="0"/>
-          <w:numId w:val="2"/>
-        </w:numPr>
-      </w:pPr>
-      <w:r>
-        <w:rPr>
-          <w:rFonts w:ascii="Consolas" w:cs="Consolas" w:eastAsia="Consolas" w:hAnsi="Consolas"/>
-          <w:sz w:val="19"/>
-          <w:szCs w:val="19"/>
-        </w:rPr>
-        <w:t xml:space="preserve">docs/tools/build-prompt-log.js</w:t>
+        <w:t xml:space="preserve">client/js/domain/receipt.js</w:t>
+      </w:r>
+    </w:p>
+    <w:p>
+      <w:pPr>
+        <w:pStyle w:val="ListParagraph"/>
+        <w:numPr>
+          <w:ilvl w:val="0"/>
+          <w:numId w:val="2"/>
+        </w:numPr>
+      </w:pPr>
+      <w:r>
+        <w:rPr>
+          <w:rFonts w:ascii="Consolas" w:cs="Consolas" w:eastAsia="Consolas" w:hAnsi="Consolas"/>
+          <w:sz w:val="19"/>
+          <w:szCs w:val="19"/>
+        </w:rPr>
+        <w:t xml:space="preserve">server/package.json</w:t>
+      </w:r>
+    </w:p>
+    <w:p>
+      <w:pPr>
+        <w:pStyle w:val="ListParagraph"/>
+        <w:numPr>
+          <w:ilvl w:val="0"/>
+          <w:numId w:val="2"/>
+        </w:numPr>
+      </w:pPr>
+      <w:r>
+        <w:rPr>
+          <w:rFonts w:ascii="Consolas" w:cs="Consolas" w:eastAsia="Consolas" w:hAnsi="Consolas"/>
+          <w:sz w:val="19"/>
+          <w:szCs w:val="19"/>
+        </w:rPr>
+        <w:t xml:space="preserve">server/package-lock.json</w:t>
+      </w:r>
+    </w:p>
+    <w:p>
+      <w:pPr>
+        <w:pStyle w:val="ListParagraph"/>
+        <w:numPr>
+          <w:ilvl w:val="0"/>
+          <w:numId w:val="2"/>
+        </w:numPr>
+      </w:pPr>
+      <w:r>
+        <w:rPr>
+          <w:rFonts w:ascii="Consolas" w:cs="Consolas" w:eastAsia="Consolas" w:hAnsi="Consolas"/>
+          <w:sz w:val="19"/>
+          <w:szCs w:val="19"/>
+        </w:rPr>
+        <w:t xml:space="preserve">server/.env.example</w:t>
+      </w:r>
+    </w:p>
+    <w:p>
+      <w:pPr>
+        <w:pStyle w:val="ListParagraph"/>
+        <w:numPr>
+          <w:ilvl w:val="0"/>
+          <w:numId w:val="2"/>
+        </w:numPr>
+      </w:pPr>
+      <w:r>
+        <w:rPr>
+          <w:rFonts w:ascii="Consolas" w:cs="Consolas" w:eastAsia="Consolas" w:hAnsi="Consolas"/>
+          <w:sz w:val="19"/>
+          <w:szCs w:val="19"/>
+        </w:rPr>
+        <w:t xml:space="preserve">server/src/config.js</w:t>
+      </w:r>
+    </w:p>
+    <w:p>
+      <w:pPr>
+        <w:pStyle w:val="ListParagraph"/>
+        <w:numPr>
+          <w:ilvl w:val="0"/>
+          <w:numId w:val="2"/>
+        </w:numPr>
+      </w:pPr>
+      <w:r>
+        <w:rPr>
+          <w:rFonts w:ascii="Consolas" w:cs="Consolas" w:eastAsia="Consolas" w:hAnsi="Consolas"/>
+          <w:sz w:val="19"/>
+          <w:szCs w:val="19"/>
+        </w:rPr>
+        <w:t xml:space="preserve">server/src/models/Receipt.js</w:t>
+      </w:r>
+    </w:p>
+    <w:p>
+      <w:pPr>
+        <w:pStyle w:val="ListParagraph"/>
+        <w:numPr>
+          <w:ilvl w:val="0"/>
+          <w:numId w:val="2"/>
+        </w:numPr>
+      </w:pPr>
+      <w:r>
+        <w:rPr>
+          <w:rFonts w:ascii="Consolas" w:cs="Consolas" w:eastAsia="Consolas" w:hAnsi="Consolas"/>
+          <w:sz w:val="19"/>
+          <w:szCs w:val="19"/>
+        </w:rPr>
+        <w:t xml:space="preserve">server/src/middleware/upload.js</w:t>
+      </w:r>
+    </w:p>
+    <w:p>
+      <w:pPr>
+        <w:pStyle w:val="ListParagraph"/>
+        <w:numPr>
+          <w:ilvl w:val="0"/>
+          <w:numId w:val="2"/>
+        </w:numPr>
+      </w:pPr>
+      <w:r>
+        <w:rPr>
+          <w:rFonts w:ascii="Consolas" w:cs="Consolas" w:eastAsia="Consolas" w:hAnsi="Consolas"/>
+          <w:sz w:val="19"/>
+          <w:szCs w:val="19"/>
+        </w:rPr>
+        <w:t xml:space="preserve">server/src/services/storageService.js</w:t>
+      </w:r>
+    </w:p>
+    <w:p>
+      <w:pPr>
+        <w:pStyle w:val="ListParagraph"/>
+        <w:numPr>
+          <w:ilvl w:val="0"/>
+          <w:numId w:val="2"/>
+        </w:numPr>
+      </w:pPr>
+      <w:r>
+        <w:rPr>
+          <w:rFonts w:ascii="Consolas" w:cs="Consolas" w:eastAsia="Consolas" w:hAnsi="Consolas"/>
+          <w:sz w:val="19"/>
+          <w:szCs w:val="19"/>
+        </w:rPr>
+        <w:t xml:space="preserve">server/src/services/ocrService.js</w:t>
+      </w:r>
+    </w:p>
+    <w:p>
+      <w:pPr>
+        <w:pStyle w:val="ListParagraph"/>
+        <w:numPr>
+          <w:ilvl w:val="0"/>
+          <w:numId w:val="2"/>
+        </w:numPr>
+      </w:pPr>
+      <w:r>
+        <w:rPr>
+          <w:rFonts w:ascii="Consolas" w:cs="Consolas" w:eastAsia="Consolas" w:hAnsi="Consolas"/>
+          <w:sz w:val="19"/>
+          <w:szCs w:val="19"/>
+        </w:rPr>
+        <w:t xml:space="preserve">server/src/routes/receipts.js</w:t>
+      </w:r>
+    </w:p>
+    <w:p>
+      <w:pPr>
+        <w:pStyle w:val="ListParagraph"/>
+        <w:numPr>
+          <w:ilvl w:val="0"/>
+          <w:numId w:val="2"/>
+        </w:numPr>
+      </w:pPr>
+      <w:r>
+        <w:rPr>
+          <w:rFonts w:ascii="Consolas" w:cs="Consolas" w:eastAsia="Consolas" w:hAnsi="Consolas"/>
+          <w:sz w:val="19"/>
+          <w:szCs w:val="19"/>
+        </w:rPr>
+        <w:t xml:space="preserve">server/tests/receipts.test.js</w:t>
+      </w:r>
+    </w:p>
+    <w:p>
+      <w:pPr>
+        <w:pStyle w:val="ListParagraph"/>
+        <w:numPr>
+          <w:ilvl w:val="0"/>
+          <w:numId w:val="2"/>
+        </w:numPr>
+      </w:pPr>
+      <w:r>
+        <w:rPr>
+          <w:rFonts w:ascii="Consolas" w:cs="Consolas" w:eastAsia="Consolas" w:hAnsi="Consolas"/>
+          <w:sz w:val="19"/>
+          <w:szCs w:val="19"/>
+        </w:rPr>
+        <w:t xml:space="preserve">server/README.md</w:t>
+      </w:r>
+    </w:p>
+    <w:p>
+      <w:pPr>
+        <w:pStyle w:val="ListParagraph"/>
+        <w:numPr>
+          <w:ilvl w:val="0"/>
+          <w:numId w:val="2"/>
+        </w:numPr>
+      </w:pPr>
+      <w:r>
+        <w:rPr>
+          <w:rFonts w:ascii="Consolas" w:cs="Consolas" w:eastAsia="Consolas" w:hAnsi="Consolas"/>
+          <w:sz w:val="19"/>
+          <w:szCs w:val="19"/>
+        </w:rPr>
+        <w:t xml:space="preserve">docs/audit/P12_RECEIPT_UPLOAD_OCR_AUDIT.md</w:t>
       </w:r>
     </w:p>
     <w:p>
@@ -16118,41 +16553,24 @@
           <w:sz w:val="19"/>
           <w:szCs w:val="19"/>
         </w:rPr>
+        <w:t xml:space="preserve">docs/SplitStack_Prompt_Log.docx</w:t>
+      </w:r>
+    </w:p>
+    <w:p>
+      <w:pPr>
+        <w:pStyle w:val="ListParagraph"/>
+        <w:numPr>
+          <w:ilvl w:val="0"/>
+          <w:numId w:val="2"/>
+        </w:numPr>
+      </w:pPr>
+      <w:r>
+        <w:rPr>
+          <w:rFonts w:ascii="Consolas" w:cs="Consolas" w:eastAsia="Consolas" w:hAnsi="Consolas"/>
+          <w:sz w:val="19"/>
+          <w:szCs w:val="19"/>
+        </w:rPr>
         <w:t xml:space="preserve">docs/SplitStack_Prompt_Log.pdf</w:t>
-      </w:r>
-    </w:p>
-    <w:p>
-      <w:pPr>
-        <w:pStyle w:val="ListParagraph"/>
-        <w:numPr>
-          <w:ilvl w:val="0"/>
-          <w:numId w:val="2"/>
-        </w:numPr>
-      </w:pPr>
-      <w:r>
-        <w:rPr>
-          <w:rFonts w:ascii="Consolas" w:cs="Consolas" w:eastAsia="Consolas" w:hAnsi="Consolas"/>
-          <w:sz w:val="19"/>
-          <w:szCs w:val="19"/>
-        </w:rPr>
-        <w:t xml:space="preserve">docs/SplitStack_Prompt_Log.docx</w:t>
-      </w:r>
-    </w:p>
-    <w:p>
-      <w:pPr>
-        <w:pStyle w:val="ListParagraph"/>
-        <w:numPr>
-          <w:ilvl w:val="0"/>
-          <w:numId w:val="2"/>
-        </w:numPr>
-      </w:pPr>
-      <w:r>
-        <w:rPr>
-          <w:rFonts w:ascii="Consolas" w:cs="Consolas" w:eastAsia="Consolas" w:hAnsi="Consolas"/>
-          <w:sz w:val="19"/>
-          <w:szCs w:val="19"/>
-        </w:rPr>
-        <w:t xml:space="preserve">package.json</w:t>
       </w:r>
     </w:p>
     <w:p>
@@ -16180,7 +16598,7 @@
           <w:sz w:val="21"/>
           <w:szCs w:val="21"/>
         </w:rPr>
-        <w:t xml:space="preserve">PDF with the executed prompts and 15 planned prompts; the Word log has the same content.</w:t>
+        <w:t xml:space="preserve">Implemented secure receipt upload pipeline with Multer and binary magic byte verification (PNG, JPEG, WEBP); MongoDB GridFS binary storage and streaming; server-side OCR via Tesseract.js with candidate extraction; duplicate-protected confirmation into linked Expense; all 123 server tests passing across 43 suites; client test suite (176 tests) and HTML linter (25 files) clean; documentation and audit updated.</w:t>
       </w:r>
     </w:p>
     <w:p>
@@ -16208,7 +16626,7 @@
           <w:sz w:val="21"/>
           <w:szCs w:val="21"/>
         </w:rPr>
-        <w:t xml:space="preserve">Pages rendered to images and inspected; text extracted with pypdf.</w:t>
+        <w:t xml:space="preserve">npm run test:server (123 passed, 0 failed); npm run test:client (176 passed, 0 failed); npm run lint:html (0 errors).</w:t>
       </w:r>
     </w:p>
     <w:p>
@@ -16224,11 +16642,20 @@
     </w:p>
     <w:p>
       <w:pPr>
+        <w:pStyle w:val="Heading2"/>
+        <w:spacing w:before="360"/>
+      </w:pPr>
+      <w:r>
+        <w:t xml:space="preserve">Wrap-up - Documentation, cleanup and deployment</w:t>
+      </w:r>
+    </w:p>
+    <w:p>
+      <w:pPr>
         <w:pStyle w:val="Heading3"/>
         <w:keepNext/>
       </w:pPr>
       <w:r>
-        <w:t xml:space="preserve">#15  Create the GitHub repository and push the code</w:t>
+        <w:t xml:space="preserve">#13  Request: GitHub repository, website link and PDF of prompts</w:t>
       </w:r>
     </w:p>
     <w:p>
@@ -16242,7 +16669,7 @@
           <w:sz w:val="18"/>
           <w:szCs w:val="18"/>
         </w:rPr>
-        <w:t xml:space="preserve">Working prompt  |  2026-10-15</w:t>
+        <w:t xml:space="preserve">User prompt  |  2026-10-15</w:t>
       </w:r>
     </w:p>
     <w:p>
@@ -16276,7 +16703,7 @@
           <w:sz w:val="19"/>
           <w:szCs w:val="19"/>
         </w:rPr>
-        <w:t xml:space="preserve">Install the official GitHub CLI with winget and sign in through the device-code flow (the student approves it in the browser). Before publishing, check that no secrets or databases are tracked, review the receipt images that are still in the commit history (they are generic sample invoices), and confirm with the student that a public repository is acceptable because the team's original repository is private. Then create the public repository MahaprabhuK/SplitStack, push the refurbish branch as main together with the legacy branch, add a GitHub Actions workflow (.github/workflows/pages.yml) that deploys the client/ folder to GitHub Pages, enable Pages with the "GitHub Actions" source, and confirm that the site responds.</w:t>
+        <w:t xml:space="preserve">create a new repositry for this project in my gihub , and after than give me the github link and then the website link and also a pdf containing the prompts to complete project.</w:t>
       </w:r>
     </w:p>
     <w:p>
@@ -16304,7 +16731,7 @@
           <w:sz w:val="21"/>
           <w:szCs w:val="21"/>
         </w:rPr>
-        <w:t xml:space="preserve">Give the student a repository link and a live website link.</w:t>
+        <w:t xml:space="preserve">Publish the project under the student's own GitHub account, host the site, and export the prompt log (including the remaining planned prompts) as a PDF.</w:t>
       </w:r>
     </w:p>
     <w:p>
@@ -16337,7 +16764,7 @@
           <w:sz w:val="19"/>
           <w:szCs w:val="19"/>
         </w:rPr>
-        <w:t xml:space="preserve">README.md</w:t>
+        <w:t xml:space="preserve">-</w:t>
       </w:r>
     </w:p>
     <w:p>
@@ -16365,7 +16792,7 @@
           <w:sz w:val="21"/>
           <w:szCs w:val="21"/>
         </w:rPr>
-        <w:t xml:space="preserve">Public repository https://github.com/MahaprabhuK/SplitStack created and the legacy branch pushed. The first push of main was rejected because it added a GitHub Actions workflow (.github/workflows/pages.yml) and the gh token lacked the "workflow" scope; the workflow file was removed and main was pushed in the next step. GitHub Pages is not set up yet (planned for the wrap-up; needs "gh auth refresh -s workflow" or a gh-pages branch).</w:t>
+        <w:t xml:space="preserve">Done: see the following entries.</w:t>
       </w:r>
     </w:p>
     <w:p>
@@ -16393,7 +16820,7 @@
           <w:sz w:val="21"/>
           <w:szCs w:val="21"/>
         </w:rPr>
-        <w:t xml:space="preserve">gh repo view; git push output.</w:t>
+        <w:t xml:space="preserve">-</w:t>
       </w:r>
     </w:p>
     <w:p>
@@ -16413,7 +16840,7 @@
         <w:keepNext/>
       </w:pPr>
       <w:r>
-        <w:t xml:space="preserve">#16  Request: hand the project over to a teammate's agent</w:t>
+        <w:t xml:space="preserve">#14  PDF export of the prompt log, including planned prompts</w:t>
       </w:r>
     </w:p>
     <w:p>
@@ -16427,7 +16854,7 @@
           <w:sz w:val="18"/>
           <w:szCs w:val="18"/>
         </w:rPr>
-        <w:t xml:space="preserve">User prompt  |  2026-10-15</w:t>
+        <w:t xml:space="preserve">Working prompt  |  2026-10-15</w:t>
       </w:r>
     </w:p>
     <w:p>
@@ -16461,7 +16888,7 @@
           <w:sz w:val="19"/>
           <w:szCs w:val="19"/>
         </w:rPr>
-        <w:t xml:space="preserve">ACTUALLY I GONNA HANDOVER THE PROJECT TO MY TEAMMATES AGENT SO HE'LL BE PULLING THE CODE AND RUNNING IN HIS SYSTEM SO GIVE PROMPT FOR THAT</w:t>
+        <w:t xml:space="preserve">Export the prompt log to PDF with a Python reportlab script (docs/tools/build_prompt_pdf.py) that reads docs/prompt_log.json: a title page, a stage overview table, a summary of every entry, Part A with every executed prompt verbatim in a shaded box with purpose, files, result and verification, and Part B with the planned prompts that complete Review 2, Review 3 and the wrap-up, clearly marked as not yet run. Add the planned prompts to prompt_log.json and to the Word log as well, and make "npm run log" rebuild both documents.</w:t>
       </w:r>
     </w:p>
     <w:p>
@@ -16489,7 +16916,7 @@
           <w:sz w:val="21"/>
           <w:szCs w:val="21"/>
         </w:rPr>
-        <w:t xml:space="preserve">Let a teammate's AI agent clone, run and continue the project.</w:t>
+        <w:t xml:space="preserve">Give the student a PDF containing the prompts needed to complete the whole project.</w:t>
       </w:r>
     </w:p>
     <w:p>
@@ -16522,7 +16949,92 @@
           <w:sz w:val="19"/>
           <w:szCs w:val="19"/>
         </w:rPr>
-        <w:t xml:space="preserve">-</w:t>
+        <w:t xml:space="preserve">docs/tools/build_prompt_pdf.py</w:t>
+      </w:r>
+    </w:p>
+    <w:p>
+      <w:pPr>
+        <w:pStyle w:val="ListParagraph"/>
+        <w:numPr>
+          <w:ilvl w:val="0"/>
+          <w:numId w:val="2"/>
+        </w:numPr>
+      </w:pPr>
+      <w:r>
+        <w:rPr>
+          <w:rFonts w:ascii="Consolas" w:cs="Consolas" w:eastAsia="Consolas" w:hAnsi="Consolas"/>
+          <w:sz w:val="19"/>
+          <w:szCs w:val="19"/>
+        </w:rPr>
+        <w:t xml:space="preserve">docs/tools/build-prompt-log.js</w:t>
+      </w:r>
+    </w:p>
+    <w:p>
+      <w:pPr>
+        <w:pStyle w:val="ListParagraph"/>
+        <w:numPr>
+          <w:ilvl w:val="0"/>
+          <w:numId w:val="2"/>
+        </w:numPr>
+      </w:pPr>
+      <w:r>
+        <w:rPr>
+          <w:rFonts w:ascii="Consolas" w:cs="Consolas" w:eastAsia="Consolas" w:hAnsi="Consolas"/>
+          <w:sz w:val="19"/>
+          <w:szCs w:val="19"/>
+        </w:rPr>
+        <w:t xml:space="preserve">docs/prompt_log.json</w:t>
+      </w:r>
+    </w:p>
+    <w:p>
+      <w:pPr>
+        <w:pStyle w:val="ListParagraph"/>
+        <w:numPr>
+          <w:ilvl w:val="0"/>
+          <w:numId w:val="2"/>
+        </w:numPr>
+      </w:pPr>
+      <w:r>
+        <w:rPr>
+          <w:rFonts w:ascii="Consolas" w:cs="Consolas" w:eastAsia="Consolas" w:hAnsi="Consolas"/>
+          <w:sz w:val="19"/>
+          <w:szCs w:val="19"/>
+        </w:rPr>
+        <w:t xml:space="preserve">docs/SplitStack_Prompt_Log.pdf</w:t>
+      </w:r>
+    </w:p>
+    <w:p>
+      <w:pPr>
+        <w:pStyle w:val="ListParagraph"/>
+        <w:numPr>
+          <w:ilvl w:val="0"/>
+          <w:numId w:val="2"/>
+        </w:numPr>
+      </w:pPr>
+      <w:r>
+        <w:rPr>
+          <w:rFonts w:ascii="Consolas" w:cs="Consolas" w:eastAsia="Consolas" w:hAnsi="Consolas"/>
+          <w:sz w:val="19"/>
+          <w:szCs w:val="19"/>
+        </w:rPr>
+        <w:t xml:space="preserve">docs/SplitStack_Prompt_Log.docx</w:t>
+      </w:r>
+    </w:p>
+    <w:p>
+      <w:pPr>
+        <w:pStyle w:val="ListParagraph"/>
+        <w:numPr>
+          <w:ilvl w:val="0"/>
+          <w:numId w:val="2"/>
+        </w:numPr>
+      </w:pPr>
+      <w:r>
+        <w:rPr>
+          <w:rFonts w:ascii="Consolas" w:cs="Consolas" w:eastAsia="Consolas" w:hAnsi="Consolas"/>
+          <w:sz w:val="19"/>
+          <w:szCs w:val="19"/>
+        </w:rPr>
+        <w:t xml:space="preserve">package.json</w:t>
       </w:r>
     </w:p>
     <w:p>
@@ -16550,7 +17062,7 @@
           <w:sz w:val="21"/>
           <w:szCs w:val="21"/>
         </w:rPr>
-        <w:t xml:space="preserve">A handover prompt was written covering: requirements per review, clone and branch, prerequisites, install/run/verify commands, repository map, known traps, the mandatory logging rule, the ordered remaining work (planned prompts P1-P15) and working rules. Noted that the new work had to be pushed to GitHub first.</w:t>
+        <w:t xml:space="preserve">PDF with the executed prompts and 15 planned prompts; the Word log has the same content.</w:t>
       </w:r>
     </w:p>
     <w:p>
@@ -16578,7 +17090,7 @@
           <w:sz w:val="21"/>
           <w:szCs w:val="21"/>
         </w:rPr>
-        <w:t xml:space="preserve">-</w:t>
+        <w:t xml:space="preserve">Pages rendered to images and inspected; text extracted with pypdf.</w:t>
       </w:r>
     </w:p>
     <w:p>
@@ -16598,7 +17110,7 @@
         <w:keepNext/>
       </w:pPr>
       <w:r>
-        <w:t xml:space="preserve">#17  Push the refurbished code to GitHub main</w:t>
+        <w:t xml:space="preserve">#15  Create the GitHub repository and push the code</w:t>
       </w:r>
     </w:p>
     <w:p>
@@ -16646,7 +17158,7 @@
           <w:sz w:val="19"/>
           <w:szCs w:val="19"/>
         </w:rPr>
-        <w:t xml:space="preserve">push it  (user prompt). Executed as: remove .github/workflows/pages.yml (the token lacks the workflow scope), replace the not-yet-existing live-site link in README.md with local run instructions, correct the earlier log entry about publishing, log the handover, rebuild the prompt logs, commit, and push the refurbish branch to main on https://github.com/MahaprabhuK/SplitStack so the teammate can clone it.</w:t>
+        <w:t xml:space="preserve">Install the official GitHub CLI with winget and sign in through the device-code flow (the student approves it in the browser). Before publishing, check that no secrets or databases are tracked, review the receipt images that are still in the commit history (they are generic sample invoices), and confirm with the student that a public repository is acceptable because the team's original repository is private. Then create the public repository MahaprabhuK/SplitStack, push the refurbish branch as main together with the legacy branch, add a GitHub Actions workflow (.github/workflows/pages.yml) that deploys the client/ folder to GitHub Pages, enable Pages with the "GitHub Actions" source, and confirm that the site responds.</w:t>
       </w:r>
     </w:p>
     <w:p>
@@ -16674,7 +17186,7 @@
           <w:sz w:val="21"/>
           <w:szCs w:val="21"/>
         </w:rPr>
-        <w:t xml:space="preserve">Make the current work available to the teammate.</w:t>
+        <w:t xml:space="preserve">Give the student a repository link and a live website link.</w:t>
       </w:r>
     </w:p>
     <w:p>
@@ -16707,75 +17219,7 @@
           <w:sz w:val="19"/>
           <w:szCs w:val="19"/>
         </w:rPr>
-        <w:t xml:space="preserve">.github/workflows/pages.yml (removed)</w:t>
-      </w:r>
-    </w:p>
-    <w:p>
-      <w:pPr>
-        <w:pStyle w:val="ListParagraph"/>
-        <w:numPr>
-          <w:ilvl w:val="0"/>
-          <w:numId w:val="2"/>
-        </w:numPr>
-      </w:pPr>
-      <w:r>
-        <w:rPr>
-          <w:rFonts w:ascii="Consolas" w:cs="Consolas" w:eastAsia="Consolas" w:hAnsi="Consolas"/>
-          <w:sz w:val="19"/>
-          <w:szCs w:val="19"/>
-        </w:rPr>
         <w:t xml:space="preserve">README.md</w:t>
-      </w:r>
-    </w:p>
-    <w:p>
-      <w:pPr>
-        <w:pStyle w:val="ListParagraph"/>
-        <w:numPr>
-          <w:ilvl w:val="0"/>
-          <w:numId w:val="2"/>
-        </w:numPr>
-      </w:pPr>
-      <w:r>
-        <w:rPr>
-          <w:rFonts w:ascii="Consolas" w:cs="Consolas" w:eastAsia="Consolas" w:hAnsi="Consolas"/>
-          <w:sz w:val="19"/>
-          <w:szCs w:val="19"/>
-        </w:rPr>
-        <w:t xml:space="preserve">docs/prompt_log.json</w:t>
-      </w:r>
-    </w:p>
-    <w:p>
-      <w:pPr>
-        <w:pStyle w:val="ListParagraph"/>
-        <w:numPr>
-          <w:ilvl w:val="0"/>
-          <w:numId w:val="2"/>
-        </w:numPr>
-      </w:pPr>
-      <w:r>
-        <w:rPr>
-          <w:rFonts w:ascii="Consolas" w:cs="Consolas" w:eastAsia="Consolas" w:hAnsi="Consolas"/>
-          <w:sz w:val="19"/>
-          <w:szCs w:val="19"/>
-        </w:rPr>
-        <w:t xml:space="preserve">docs/SplitStack_Prompt_Log.docx</w:t>
-      </w:r>
-    </w:p>
-    <w:p>
-      <w:pPr>
-        <w:pStyle w:val="ListParagraph"/>
-        <w:numPr>
-          <w:ilvl w:val="0"/>
-          <w:numId w:val="2"/>
-        </w:numPr>
-      </w:pPr>
-      <w:r>
-        <w:rPr>
-          <w:rFonts w:ascii="Consolas" w:cs="Consolas" w:eastAsia="Consolas" w:hAnsi="Consolas"/>
-          <w:sz w:val="19"/>
-          <w:szCs w:val="19"/>
-        </w:rPr>
-        <w:t xml:space="preserve">docs/SplitStack_Prompt_Log.pdf</w:t>
       </w:r>
     </w:p>
     <w:p>
@@ -16803,7 +17247,7 @@
           <w:sz w:val="21"/>
           <w:szCs w:val="21"/>
         </w:rPr>
-        <w:t xml:space="preserve">main pushed to GitHub; branches on GitHub: main (refurbished work) and legacy (original Flask app).</w:t>
+        <w:t xml:space="preserve">Public repository https://github.com/MahaprabhuK/SplitStack created and the legacy branch pushed. The first push of main was rejected because it added a GitHub Actions workflow (.github/workflows/pages.yml) and the gh token lacked the "workflow" scope; the workflow file was removed and main was pushed in the next step. GitHub Pages is not set up yet (planned for the wrap-up; needs "gh auth refresh -s workflow" or a gh-pages branch).</w:t>
       </w:r>
     </w:p>
     <w:p>
@@ -16831,7 +17275,7 @@
           <w:sz w:val="21"/>
           <w:szCs w:val="21"/>
         </w:rPr>
-        <w:t xml:space="preserve">git ls-remote shows main and legacy at the expected commits.</w:t>
+        <w:t xml:space="preserve">gh repo view; git push output.</w:t>
       </w:r>
     </w:p>
     <w:p>
@@ -16851,7 +17295,7 @@
         <w:keepNext/>
       </w:pPr>
       <w:r>
-        <w:t xml:space="preserve">#18  Request: push the code and deploy the website</w:t>
+        <w:t xml:space="preserve">#16  Request: hand the project over to a teammate's agent</w:t>
       </w:r>
     </w:p>
     <w:p>
@@ -16899,7 +17343,7 @@
           <w:sz w:val="19"/>
           <w:szCs w:val="19"/>
         </w:rPr>
-        <w:t xml:space="preserve">first push the code and deploy it</w:t>
+        <w:t xml:space="preserve">ACTUALLY I GONNA HANDOVER THE PROJECT TO MY TEAMMATES AGENT SO HE'LL BE PULLING THE CODE AND RUNNING IN HIS SYSTEM SO GIVE PROMPT FOR THAT</w:t>
       </w:r>
     </w:p>
     <w:p>
@@ -16927,7 +17371,7 @@
           <w:sz w:val="21"/>
           <w:szCs w:val="21"/>
         </w:rPr>
-        <w:t xml:space="preserve">Get the code on GitHub and the Review 1 site online.</w:t>
+        <w:t xml:space="preserve">Let a teammate's AI agent clone, run and continue the project.</w:t>
       </w:r>
     </w:p>
     <w:p>
@@ -16988,7 +17432,7 @@
           <w:sz w:val="21"/>
           <w:szCs w:val="21"/>
         </w:rPr>
-        <w:t xml:space="preserve">Handled in the next step.</w:t>
+        <w:t xml:space="preserve">A handover prompt was written covering: requirements per review, clone and branch, prerequisites, install/run/verify commands, repository map, known traps, the mandatory logging rule, the ordered remaining work (planned prompts P1-P15) and working rules. Noted that the new work had to be pushed to GitHub first.</w:t>
       </w:r>
     </w:p>
     <w:p>
@@ -17036,7 +17480,7 @@
         <w:keepNext/>
       </w:pPr>
       <w:r>
-        <w:t xml:space="preserve">#19  Deploy the client to GitHub Pages from a gh-pages branch</w:t>
+        <w:t xml:space="preserve">#17  Push the refurbished code to GitHub main</w:t>
       </w:r>
     </w:p>
     <w:p>
@@ -17084,7 +17528,7 @@
           <w:sz w:val="19"/>
           <w:szCs w:val="19"/>
         </w:rPr>
-        <w:t xml:space="preserve">Push refurbish to main and refurbish on MahaprabhuK/SplitStack. Because the token cannot push workflow files, deploy without GitHub Actions: check that client/ uses only relative links, split client/ into its own history with git subtree split, push it as the gh-pages branch, wait for GitHub Pages to publish it, then put the live link back in README.md and log the step.</w:t>
+        <w:t xml:space="preserve">push it  (user prompt). Executed as: remove .github/workflows/pages.yml (the token lacks the workflow scope), replace the not-yet-existing live-site link in README.md with local run instructions, correct the earlier log entry about publishing, log the handover, rebuild the prompt logs, commit, and push the refurbish branch to main on https://github.com/MahaprabhuK/SplitStack so the teammate can clone it.</w:t>
       </w:r>
     </w:p>
     <w:p>
@@ -17112,7 +17556,7 @@
           <w:sz w:val="21"/>
           <w:szCs w:val="21"/>
         </w:rPr>
-        <w:t xml:space="preserve">Publish the Review 1 site at a public URL without needing the workflow scope.</w:t>
+        <w:t xml:space="preserve">Make the current work available to the teammate.</w:t>
       </w:r>
     </w:p>
     <w:p>
@@ -17145,6 +17589,23 @@
           <w:sz w:val="19"/>
           <w:szCs w:val="19"/>
         </w:rPr>
+        <w:t xml:space="preserve">.github/workflows/pages.yml (removed)</w:t>
+      </w:r>
+    </w:p>
+    <w:p>
+      <w:pPr>
+        <w:pStyle w:val="ListParagraph"/>
+        <w:numPr>
+          <w:ilvl w:val="0"/>
+          <w:numId w:val="2"/>
+        </w:numPr>
+      </w:pPr>
+      <w:r>
+        <w:rPr>
+          <w:rFonts w:ascii="Consolas" w:cs="Consolas" w:eastAsia="Consolas" w:hAnsi="Consolas"/>
+          <w:sz w:val="19"/>
+          <w:szCs w:val="19"/>
+        </w:rPr>
         <w:t xml:space="preserve">README.md</w:t>
       </w:r>
     </w:p>
@@ -17163,6 +17624,40 @@
           <w:szCs w:val="19"/>
         </w:rPr>
         <w:t xml:space="preserve">docs/prompt_log.json</w:t>
+      </w:r>
+    </w:p>
+    <w:p>
+      <w:pPr>
+        <w:pStyle w:val="ListParagraph"/>
+        <w:numPr>
+          <w:ilvl w:val="0"/>
+          <w:numId w:val="2"/>
+        </w:numPr>
+      </w:pPr>
+      <w:r>
+        <w:rPr>
+          <w:rFonts w:ascii="Consolas" w:cs="Consolas" w:eastAsia="Consolas" w:hAnsi="Consolas"/>
+          <w:sz w:val="19"/>
+          <w:szCs w:val="19"/>
+        </w:rPr>
+        <w:t xml:space="preserve">docs/SplitStack_Prompt_Log.docx</w:t>
+      </w:r>
+    </w:p>
+    <w:p>
+      <w:pPr>
+        <w:pStyle w:val="ListParagraph"/>
+        <w:numPr>
+          <w:ilvl w:val="0"/>
+          <w:numId w:val="2"/>
+        </w:numPr>
+      </w:pPr>
+      <w:r>
+        <w:rPr>
+          <w:rFonts w:ascii="Consolas" w:cs="Consolas" w:eastAsia="Consolas" w:hAnsi="Consolas"/>
+          <w:sz w:val="19"/>
+          <w:szCs w:val="19"/>
+        </w:rPr>
+        <w:t xml:space="preserve">docs/SplitStack_Prompt_Log.pdf</w:t>
       </w:r>
     </w:p>
     <w:p>
@@ -17190,7 +17685,7 @@
           <w:sz w:val="21"/>
           <w:szCs w:val="21"/>
         </w:rPr>
-        <w:t xml:space="preserve">main and refurbish are on GitHub. The client/ folder is published from the gh-pages branch at https://mahaprabhuk.github.io/SplitStack/ (GitHub enabled Pages automatically). To redeploy after client changes: git subtree split --prefix client refurbish, then push that commit to gh-pages.</w:t>
+        <w:t xml:space="preserve">main pushed to GitHub; branches on GitHub: main (refurbished work) and legacy (original Flask app).</w:t>
       </w:r>
     </w:p>
     <w:p>
@@ -17218,7 +17713,7 @@
           <w:sz w:val="21"/>
           <w:szCs w:val="21"/>
         </w:rPr>
-        <w:t xml:space="preserve">git ls-remote; curl returned 200 for the home page, pages/404.html and css/base.css on the live site.</w:t>
+        <w:t xml:space="preserve">git ls-remote shows main and legacy at the expected commits.</w:t>
       </w:r>
     </w:p>
     <w:p>
@@ -17238,7 +17733,7 @@
         <w:keepNext/>
       </w:pPr>
       <w:r>
-        <w:t xml:space="preserve">#20  Request: handover prompt PDF for a teammate's agent</w:t>
+        <w:t xml:space="preserve">#18  Request: push the code and deploy the website</w:t>
       </w:r>
     </w:p>
     <w:p>
@@ -17286,7 +17781,7 @@
           <w:sz w:val="19"/>
           <w:szCs w:val="19"/>
         </w:rPr>
-        <w:t xml:space="preserve">imma handover the project to my teammate i want you to create a detailed prompt for his agent most prolly he'll use anti gravity so i want a pdf containing prompts to complete the rest of the work in the project. so create a pdf and mention its path once its created then i'll share it to him</w:t>
+        <w:t xml:space="preserve">first push the code and deploy it</w:t>
       </w:r>
     </w:p>
     <w:p>
@@ -17314,7 +17809,7 @@
           <w:sz w:val="21"/>
           <w:szCs w:val="21"/>
         </w:rPr>
-        <w:t xml:space="preserve">Let a teammate's AI agent (Antigravity) finish Review 2, Review 3 and the wrap-up.</w:t>
+        <w:t xml:space="preserve">Get the code on GitHub and the Review 1 site online.</w:t>
       </w:r>
     </w:p>
     <w:p>
@@ -17423,7 +17918,7 @@
         <w:keepNext/>
       </w:pPr>
       <w:r>
-        <w:t xml:space="preserve">#21  Handover prompts PDF</w:t>
+        <w:t xml:space="preserve">#19  Deploy the client to GitHub Pages from a gh-pages branch</w:t>
       </w:r>
     </w:p>
     <w:p>
@@ -17471,7 +17966,7 @@
           <w:sz w:val="19"/>
           <w:szCs w:val="19"/>
         </w:rPr>
-        <w:t xml:space="preserve">Write docs/tools/build_handover_pdf.py (reusing the styles of build_prompt_pdf.py) to produce docs/SplitStack_Handover_Prompts.pdf: how to use it with Antigravity, one-time setup (tools, collaborator access, MongoDB Atlas, workflow token scope), a roadmap, Prompt 0 with the full project context, rules, logging, commit/push and gh-pages redeploy procedure, the 15 planned prompts P1-P15 expanded with concrete checks and commit messages, utility prompts (status, recovery, review rehearsal) and common problems. Render pages to check the layout.</w:t>
+        <w:t xml:space="preserve">Push refurbish to main and refurbish on MahaprabhuK/SplitStack. Because the token cannot push workflow files, deploy without GitHub Actions: check that client/ uses only relative links, split client/ into its own history with git subtree split, push it as the gh-pages branch, wait for GitHub Pages to publish it, then put the live link back in README.md and log the step.</w:t>
       </w:r>
     </w:p>
     <w:p>
@@ -17499,7 +17994,7 @@
           <w:sz w:val="21"/>
           <w:szCs w:val="21"/>
         </w:rPr>
-        <w:t xml:space="preserve">Give the teammate a self-contained, ordered set of prompts.</w:t>
+        <w:t xml:space="preserve">Publish the Review 1 site at a public URL without needing the workflow scope.</w:t>
       </w:r>
     </w:p>
     <w:p>
@@ -17532,24 +18027,24 @@
           <w:sz w:val="19"/>
           <w:szCs w:val="19"/>
         </w:rPr>
-        <w:t xml:space="preserve">docs/tools/build_handover_pdf.py</w:t>
-      </w:r>
-    </w:p>
-    <w:p>
-      <w:pPr>
-        <w:pStyle w:val="ListParagraph"/>
-        <w:numPr>
-          <w:ilvl w:val="0"/>
-          <w:numId w:val="2"/>
-        </w:numPr>
-      </w:pPr>
-      <w:r>
-        <w:rPr>
-          <w:rFonts w:ascii="Consolas" w:cs="Consolas" w:eastAsia="Consolas" w:hAnsi="Consolas"/>
-          <w:sz w:val="19"/>
-          <w:szCs w:val="19"/>
-        </w:rPr>
-        <w:t xml:space="preserve">docs/SplitStack_Handover_Prompts.pdf</w:t>
+        <w:t xml:space="preserve">README.md</w:t>
+      </w:r>
+    </w:p>
+    <w:p>
+      <w:pPr>
+        <w:pStyle w:val="ListParagraph"/>
+        <w:numPr>
+          <w:ilvl w:val="0"/>
+          <w:numId w:val="2"/>
+        </w:numPr>
+      </w:pPr>
+      <w:r>
+        <w:rPr>
+          <w:rFonts w:ascii="Consolas" w:cs="Consolas" w:eastAsia="Consolas" w:hAnsi="Consolas"/>
+          <w:sz w:val="19"/>
+          <w:szCs w:val="19"/>
+        </w:rPr>
+        <w:t xml:space="preserve">docs/prompt_log.json</w:t>
       </w:r>
     </w:p>
     <w:p>
@@ -17577,7 +18072,7 @@
           <w:sz w:val="21"/>
           <w:szCs w:val="21"/>
         </w:rPr>
-        <w:t xml:space="preserve">14-page PDF created. Changes against the planned prompts: P1 adds data-page attributes and client/js/package.json (type module) for node --test; P13 keeps the localStorage implementation as a demo mode (api-local.js chosen when /api/health does not answer) so the GitHub Pages site keeps working, instead of deleting it; P9 replaces deprecated csurf with a synchronizer token; P14 uses MongoMemoryReplSet because the API uses transactions; P15 asks for confirmation before deleting the Flask files and leaves Render account steps to the student.</w:t>
+        <w:t xml:space="preserve">main and refurbish are on GitHub. The client/ folder is published from the gh-pages branch at https://mahaprabhuk.github.io/SplitStack/ (GitHub enabled Pages automatically). To redeploy after client changes: git subtree split --prefix client refurbish, then push that commit to gh-pages.</w:t>
       </w:r>
     </w:p>
     <w:p>
@@ -17605,7 +18100,7 @@
           <w:sz w:val="21"/>
           <w:szCs w:val="21"/>
         </w:rPr>
-        <w:t xml:space="preserve">Rendered pages with PyMuPDF and checked the layout of the setup, Prompt 0, step and utility pages.</w:t>
+        <w:t xml:space="preserve">git ls-remote; curl returned 200 for the home page, pages/404.html and css/base.css on the live site.</w:t>
       </w:r>
     </w:p>
     <w:p>
@@ -17620,37 +18115,12 @@
       </w:r>
     </w:p>
     <w:p>
-      <w:r>
-        <w:br w:type="page"/>
-      </w:r>
-    </w:p>
-    <w:p>
-      <w:pPr>
-        <w:pStyle w:val="Heading1"/>
-      </w:pPr>
-      <w:r>
-        <w:t xml:space="preserve">Planned prompts to complete the project</w:t>
-      </w:r>
-    </w:p>
-    <w:p>
-      <w:pPr>
-        <w:spacing w:after="80"/>
-      </w:pPr>
-      <w:r>
-        <w:rPr>
-          <w:sz w:val="21"/>
-          <w:szCs w:val="21"/>
-        </w:rPr>
-        <w:t xml:space="preserve">These prompts have not been run yet. Run them in order; after each one, move it into the log above with its result.</w:t>
-      </w:r>
-    </w:p>
-    <w:p>
       <w:pPr>
         <w:pStyle w:val="Heading3"/>
         <w:keepNext/>
       </w:pPr>
       <w:r>
-        <w:t xml:space="preserve">P1  Receipt upload and server-side OCR</w:t>
+        <w:t xml:space="preserve">#20  Request: handover prompt PDF for a teammate's agent</w:t>
       </w:r>
     </w:p>
     <w:p>
@@ -17664,7 +18134,7 @@
           <w:sz w:val="18"/>
           <w:szCs w:val="18"/>
         </w:rPr>
-        <w:t xml:space="preserve">Review 3  |  Planned prompt</w:t>
+        <w:t xml:space="preserve">User prompt  |  2026-10-15</w:t>
       </w:r>
     </w:p>
     <w:p>
@@ -17698,7 +18168,7 @@
           <w:sz w:val="19"/>
           <w:szCs w:val="19"/>
         </w:rPr>
-        <w:t xml:space="preserve">Add POST /api/receipts using multer with memory storage, a 5 MB limit and magic-byte checks for PNG, JPEG and WEBP; preprocess with sharp (rotate from EXIF, greyscale, upscale small images, normalise); run tesseract.js with one shared worker; parse the merchant, date and total with the Review 2 parser; store the image in MongoDB GridFS (so it survives redeploys on free hosting) and the parsed fields in Receipt. GET /api/receipts/:id/image streams the image only to its owner. Confirming creates the expense; nothing becomes an expense without confirmation.</w:t>
+        <w:t xml:space="preserve">imma handover the project to my teammate i want you to create a detailed prompt for his agent most prolly he'll use anti gravity so i want a pdf containing prompts to complete the rest of the work in the project. so create a pdf and mention its path once its created then i'll share it to him</w:t>
       </w:r>
     </w:p>
     <w:p>
@@ -17726,7 +18196,7 @@
           <w:sz w:val="21"/>
           <w:szCs w:val="21"/>
         </w:rPr>
-        <w:t xml:space="preserve">Port the OCR feature to Node with persistent storage.</w:t>
+        <w:t xml:space="preserve">Let a teammate's AI agent (Antigravity) finish Review 2, Review 3 and the wrap-up.</w:t>
       </w:r>
     </w:p>
     <w:p>
@@ -17743,6 +18213,39 @@
           <w:szCs w:val="17"/>
         </w:rPr>
         <w:t xml:space="preserve">FILES</w:t>
+      </w:r>
+    </w:p>
+    <w:p>
+      <w:pPr>
+        <w:pStyle w:val="ListParagraph"/>
+        <w:numPr>
+          <w:ilvl w:val="0"/>
+          <w:numId w:val="2"/>
+        </w:numPr>
+      </w:pPr>
+      <w:r>
+        <w:rPr>
+          <w:rFonts w:ascii="Consolas" w:cs="Consolas" w:eastAsia="Consolas" w:hAnsi="Consolas"/>
+          <w:sz w:val="19"/>
+          <w:szCs w:val="19"/>
+        </w:rPr>
+        <w:t xml:space="preserve">-</w:t>
+      </w:r>
+    </w:p>
+    <w:p>
+      <w:pPr>
+        <w:spacing w:after="60" w:before="160"/>
+      </w:pPr>
+      <w:r>
+        <w:rPr>
+          <w:b/>
+          <w:bCs/>
+          <w:color w:val="4F46E5"/>
+          <w:spacing w:val="20"/>
+          <w:sz w:val="17"/>
+          <w:szCs w:val="17"/>
+        </w:rPr>
+        <w:t xml:space="preserve">RESULT</w:t>
       </w:r>
     </w:p>
     <w:p>
@@ -17754,7 +18257,46 @@
           <w:sz w:val="21"/>
           <w:szCs w:val="21"/>
         </w:rPr>
-        <w:t xml:space="preserve">server/src/routes/receipts.js, server/src/services/ocr.js</w:t>
+        <w:t xml:space="preserve">Handled in the next step.</w:t>
+      </w:r>
+    </w:p>
+    <w:p>
+      <w:pPr>
+        <w:spacing w:after="60" w:before="160"/>
+      </w:pPr>
+      <w:r>
+        <w:rPr>
+          <w:b/>
+          <w:bCs/>
+          <w:color w:val="4F46E5"/>
+          <w:spacing w:val="20"/>
+          <w:sz w:val="17"/>
+          <w:szCs w:val="17"/>
+        </w:rPr>
+        <w:t xml:space="preserve">VERIFICATION</w:t>
+      </w:r>
+    </w:p>
+    <w:p>
+      <w:pPr>
+        <w:spacing w:after="80"/>
+      </w:pPr>
+      <w:r>
+        <w:rPr>
+          <w:sz w:val="21"/>
+          <w:szCs w:val="21"/>
+        </w:rPr>
+        <w:t xml:space="preserve">-</w:t>
+      </w:r>
+    </w:p>
+    <w:p>
+      <w:pPr>
+        <w:pBdr>
+          <w:bottom w:val="single" w:color="D9DBE5" w:sz="4" w:space="4"/>
+        </w:pBdr>
+        <w:spacing w:after="200"/>
+      </w:pPr>
+      <w:r>
+        <w:t xml:space="preserve"/>
       </w:r>
     </w:p>
     <w:p>
@@ -17763,7 +18305,7 @@
         <w:keepNext/>
       </w:pPr>
       <w:r>
-        <w:t xml:space="preserve">P2  Connect the client to the API</w:t>
+        <w:t xml:space="preserve">#21  Handover prompts PDF</w:t>
       </w:r>
     </w:p>
     <w:p>
@@ -17777,7 +18319,7 @@
           <w:sz w:val="18"/>
           <w:szCs w:val="18"/>
         </w:rPr>
-        <w:t xml:space="preserve">Review 3  |  Planned prompt</w:t>
+        <w:t xml:space="preserve">Working prompt  |  2026-10-15</w:t>
       </w:r>
     </w:p>
     <w:p>
@@ -17811,7 +18353,7 @@
           <w:sz w:val="19"/>
           <w:szCs w:val="19"/>
         </w:rPr>
-        <w:t xml:space="preserve">Re-implement client/js/data/api.js with fetch() against /api, sending credentials and the CSRF token header, mapping HTTP errors to the same {field, message} errors the pages already handle, and showing a toast when offline. Remove the localStorage store except for the theme preference. Because the page code depends only on api.js, no page module should need changes; confirm this by running every flow end to end against a local server connected to Atlas.</w:t>
+        <w:t xml:space="preserve">Write docs/tools/build_handover_pdf.py (reusing the styles of build_prompt_pdf.py) to produce docs/SplitStack_Handover_Prompts.pdf: how to use it with Antigravity, one-time setup (tools, collaborator access, MongoDB Atlas, workflow token scope), a roadmap, Prompt 0 with the full project context, rules, logging, commit/push and gh-pages redeploy procedure, the 15 planned prompts P1-P15 expanded with concrete checks and commit messages, utility prompts (status, recovery, review rehearsal) and common problems. Render pages to check the layout.</w:t>
       </w:r>
     </w:p>
     <w:p>
@@ -17839,7 +18381,7 @@
           <w:sz w:val="21"/>
           <w:szCs w:val="21"/>
         </w:rPr>
-        <w:t xml:space="preserve">Finish the full-stack integration.</w:t>
+        <w:t xml:space="preserve">Give the teammate a self-contained, ordered set of prompts.</w:t>
       </w:r>
     </w:p>
     <w:p>
@@ -17856,6 +18398,56 @@
           <w:szCs w:val="17"/>
         </w:rPr>
         <w:t xml:space="preserve">FILES</w:t>
+      </w:r>
+    </w:p>
+    <w:p>
+      <w:pPr>
+        <w:pStyle w:val="ListParagraph"/>
+        <w:numPr>
+          <w:ilvl w:val="0"/>
+          <w:numId w:val="2"/>
+        </w:numPr>
+      </w:pPr>
+      <w:r>
+        <w:rPr>
+          <w:rFonts w:ascii="Consolas" w:cs="Consolas" w:eastAsia="Consolas" w:hAnsi="Consolas"/>
+          <w:sz w:val="19"/>
+          <w:szCs w:val="19"/>
+        </w:rPr>
+        <w:t xml:space="preserve">docs/tools/build_handover_pdf.py</w:t>
+      </w:r>
+    </w:p>
+    <w:p>
+      <w:pPr>
+        <w:pStyle w:val="ListParagraph"/>
+        <w:numPr>
+          <w:ilvl w:val="0"/>
+          <w:numId w:val="2"/>
+        </w:numPr>
+      </w:pPr>
+      <w:r>
+        <w:rPr>
+          <w:rFonts w:ascii="Consolas" w:cs="Consolas" w:eastAsia="Consolas" w:hAnsi="Consolas"/>
+          <w:sz w:val="19"/>
+          <w:szCs w:val="19"/>
+        </w:rPr>
+        <w:t xml:space="preserve">docs/SplitStack_Handover_Prompts.pdf</w:t>
+      </w:r>
+    </w:p>
+    <w:p>
+      <w:pPr>
+        <w:spacing w:after="60" w:before="160"/>
+      </w:pPr>
+      <w:r>
+        <w:rPr>
+          <w:b/>
+          <w:bCs/>
+          <w:color w:val="4F46E5"/>
+          <w:spacing w:val="20"/>
+          <w:sz w:val="17"/>
+          <w:szCs w:val="17"/>
+        </w:rPr>
+        <w:t xml:space="preserve">RESULT</w:t>
       </w:r>
     </w:p>
     <w:p>
@@ -17867,7 +18459,71 @@
           <w:sz w:val="21"/>
           <w:szCs w:val="21"/>
         </w:rPr>
-        <w:t xml:space="preserve">client/js/data/api.js</w:t>
+        <w:t xml:space="preserve">14-page PDF created. Changes against the planned prompts: P1 adds data-page attributes and client/js/package.json (type module) for node --test; P13 keeps the localStorage implementation as a demo mode (api-local.js chosen when /api/health does not answer) so the GitHub Pages site keeps working, instead of deleting it; P9 replaces deprecated csurf with a synchronizer token; P14 uses MongoMemoryReplSet because the API uses transactions; P15 asks for confirmation before deleting the Flask files and leaves Render account steps to the student.</w:t>
+      </w:r>
+    </w:p>
+    <w:p>
+      <w:pPr>
+        <w:spacing w:after="60" w:before="160"/>
+      </w:pPr>
+      <w:r>
+        <w:rPr>
+          <w:b/>
+          <w:bCs/>
+          <w:color w:val="4F46E5"/>
+          <w:spacing w:val="20"/>
+          <w:sz w:val="17"/>
+          <w:szCs w:val="17"/>
+        </w:rPr>
+        <w:t xml:space="preserve">VERIFICATION</w:t>
+      </w:r>
+    </w:p>
+    <w:p>
+      <w:pPr>
+        <w:spacing w:after="80"/>
+      </w:pPr>
+      <w:r>
+        <w:rPr>
+          <w:sz w:val="21"/>
+          <w:szCs w:val="21"/>
+        </w:rPr>
+        <w:t xml:space="preserve">Rendered pages with PyMuPDF and checked the layout of the setup, Prompt 0, step and utility pages.</w:t>
+      </w:r>
+    </w:p>
+    <w:p>
+      <w:pPr>
+        <w:pBdr>
+          <w:bottom w:val="single" w:color="D9DBE5" w:sz="4" w:space="4"/>
+        </w:pBdr>
+        <w:spacing w:after="200"/>
+      </w:pPr>
+      <w:r>
+        <w:t xml:space="preserve"/>
+      </w:r>
+    </w:p>
+    <w:p>
+      <w:r>
+        <w:br w:type="page"/>
+      </w:r>
+    </w:p>
+    <w:p>
+      <w:pPr>
+        <w:pStyle w:val="Heading1"/>
+      </w:pPr>
+      <w:r>
+        <w:t xml:space="preserve">Planned prompts to complete the project</w:t>
+      </w:r>
+    </w:p>
+    <w:p>
+      <w:pPr>
+        <w:spacing w:after="80"/>
+      </w:pPr>
+      <w:r>
+        <w:rPr>
+          <w:sz w:val="21"/>
+          <w:szCs w:val="21"/>
+        </w:rPr>
+        <w:t xml:space="preserve">These prompts have not been run yet. Run them in order; after each one, move it into the log above with its result.</w:t>
       </w:r>
     </w:p>
     <w:p>
@@ -17876,7 +18532,7 @@
         <w:keepNext/>
       </w:pPr>
       <w:r>
-        <w:t xml:space="preserve">P3  Seed data and automated tests</w:t>
+        <w:t xml:space="preserve">P1  Connect the client to the API</w:t>
       </w:r>
     </w:p>
     <w:p>
@@ -17924,7 +18580,7 @@
           <w:sz w:val="19"/>
           <w:szCs w:val="19"/>
         </w:rPr>
-        <w:t xml:space="preserve">Add server/scripts/seed.js that creates the demo user, categories, six months of expenses and income, budgets, recurring payments, the three groups with shared expenses, and shopping lists. It must be idempotent and must refuse to run against a database whose name does not end in -dev or -test unless --force is passed. Write Jest + Supertest tests using mongodb-memory-server for auth, ownership checks, CSRF rejection, rate limiting, split validation, the settlement algorithm, budget status, convert-to-expense duplicate prevention and receipt upload validation, covering what the 47 legacy Python tests checked. Add an npm test script and a GitHub Actions workflow that runs lint and tests on every push.</w:t>
+        <w:t xml:space="preserve">Re-implement client/js/data/api.js with fetch() against /api, sending credentials and the CSRF token header, mapping HTTP errors to the same {field, message} errors the pages already handle, and showing a toast when offline. Remove the localStorage store except for the theme preference. Because the page code depends only on api.js, no page module should need changes; confirm this by running every flow end to end against a local server connected to Atlas.</w:t>
       </w:r>
     </w:p>
     <w:p>
@@ -17952,7 +18608,7 @@
           <w:sz w:val="21"/>
           <w:szCs w:val="21"/>
         </w:rPr>
-        <w:t xml:space="preserve">Prove the back end works and keep it working.</w:t>
+        <w:t xml:space="preserve">Finish the full-stack integration.</w:t>
       </w:r>
     </w:p>
     <w:p>
@@ -17980,7 +18636,7 @@
           <w:sz w:val="21"/>
           <w:szCs w:val="21"/>
         </w:rPr>
-        <w:t xml:space="preserve">server/scripts/seed.js, server/tests/*.test.js, .github/workflows/ci.yml</w:t>
+        <w:t xml:space="preserve">client/js/data/api.js</w:t>
       </w:r>
     </w:p>
     <w:p>
@@ -17989,7 +18645,120 @@
         <w:keepNext/>
       </w:pPr>
       <w:r>
-        <w:t xml:space="preserve">P4  Remove legacy code, document and deploy</w:t>
+        <w:t xml:space="preserve">P2  Seed data and automated tests</w:t>
+      </w:r>
+    </w:p>
+    <w:p>
+      <w:pPr>
+        <w:keepNext/>
+        <w:spacing w:after="60"/>
+      </w:pPr>
+      <w:r>
+        <w:rPr>
+          <w:color w:val="5B6475"/>
+          <w:sz w:val="18"/>
+          <w:szCs w:val="18"/>
+        </w:rPr>
+        <w:t xml:space="preserve">Review 3  |  Planned prompt</w:t>
+      </w:r>
+    </w:p>
+    <w:p>
+      <w:pPr>
+        <w:spacing w:after="60" w:before="160"/>
+      </w:pPr>
+      <w:r>
+        <w:rPr>
+          <w:b/>
+          <w:bCs/>
+          <w:color w:val="4F46E5"/>
+          <w:spacing w:val="20"/>
+          <w:sz w:val="17"/>
+          <w:szCs w:val="17"/>
+        </w:rPr>
+        <w:t xml:space="preserve">PROMPT</w:t>
+      </w:r>
+    </w:p>
+    <w:p>
+      <w:pPr>
+        <w:pBdr>
+          <w:left w:val="single" w:color="4F46E5" w:sz="18" w:space="8"/>
+        </w:pBdr>
+        <w:shd w:fill="F1F2F8" w:color="auto" w:val="clear"/>
+        <w:spacing w:after="120" w:before="40" w:line="276"/>
+        <w:ind w:left="160" w:right="160"/>
+      </w:pPr>
+      <w:r>
+        <w:rPr>
+          <w:rFonts w:ascii="Consolas" w:cs="Consolas" w:eastAsia="Consolas" w:hAnsi="Consolas"/>
+          <w:sz w:val="19"/>
+          <w:szCs w:val="19"/>
+        </w:rPr>
+        <w:t xml:space="preserve">Add server/scripts/seed.js that creates the demo user, categories, six months of expenses and income, budgets, recurring payments, the three groups with shared expenses, and shopping lists. It must be idempotent and must refuse to run against a database whose name does not end in -dev or -test unless --force is passed. Write Jest + Supertest tests using mongodb-memory-server for auth, ownership checks, CSRF rejection, rate limiting, split validation, the settlement algorithm, budget status, convert-to-expense duplicate prevention and receipt upload validation, covering what the 47 legacy Python tests checked. Add an npm test script and a GitHub Actions workflow that runs lint and tests on every push.</w:t>
+      </w:r>
+    </w:p>
+    <w:p>
+      <w:pPr>
+        <w:spacing w:after="60" w:before="160"/>
+      </w:pPr>
+      <w:r>
+        <w:rPr>
+          <w:b/>
+          <w:bCs/>
+          <w:color w:val="4F46E5"/>
+          <w:spacing w:val="20"/>
+          <w:sz w:val="17"/>
+          <w:szCs w:val="17"/>
+        </w:rPr>
+        <w:t xml:space="preserve">PURPOSE</w:t>
+      </w:r>
+    </w:p>
+    <w:p>
+      <w:pPr>
+        <w:spacing w:after="80"/>
+      </w:pPr>
+      <w:r>
+        <w:rPr>
+          <w:sz w:val="21"/>
+          <w:szCs w:val="21"/>
+        </w:rPr>
+        <w:t xml:space="preserve">Prove the back end works and keep it working.</w:t>
+      </w:r>
+    </w:p>
+    <w:p>
+      <w:pPr>
+        <w:spacing w:after="60" w:before="160"/>
+      </w:pPr>
+      <w:r>
+        <w:rPr>
+          <w:b/>
+          <w:bCs/>
+          <w:color w:val="4F46E5"/>
+          <w:spacing w:val="20"/>
+          <w:sz w:val="17"/>
+          <w:szCs w:val="17"/>
+        </w:rPr>
+        <w:t xml:space="preserve">FILES</w:t>
+      </w:r>
+    </w:p>
+    <w:p>
+      <w:pPr>
+        <w:spacing w:after="80"/>
+      </w:pPr>
+      <w:r>
+        <w:rPr>
+          <w:sz w:val="21"/>
+          <w:szCs w:val="21"/>
+        </w:rPr>
+        <w:t xml:space="preserve">server/scripts/seed.js, server/tests/*.test.js, .github/workflows/ci.yml</w:t>
+      </w:r>
+    </w:p>
+    <w:p>
+      <w:pPr>
+        <w:pStyle w:val="Heading3"/>
+        <w:keepNext/>
+      </w:pPr>
+      <w:r>
+        <w:t xml:space="preserve">P3  Remove legacy code, document and deploy</w:t>
       </w:r>
     </w:p>
     <w:p>

</xml_diff>

<commit_message>
Review 3: frontend API integration
</commit_message>
<xml_diff>
--- a/docs/SplitStack_Prompt_Log.docx
+++ b/docs/SplitStack_Prompt_Log.docx
@@ -132,7 +132,7 @@
           <w:sz w:val="21"/>
           <w:szCs w:val="21"/>
         </w:rPr>
-        <w:t xml:space="preserve">45</w:t>
+        <w:t xml:space="preserve">47</w:t>
       </w:r>
     </w:p>
     <w:p>
@@ -639,7 +639,7 @@
                 <w:sz w:val="18"/>
                 <w:szCs w:val="18"/>
               </w:rPr>
-              <w:t xml:space="preserve">8</w:t>
+              <w:t xml:space="preserve">10</w:t>
             </w:r>
           </w:p>
         </w:tc>
@@ -6197,6 +6197,245 @@
                 <w:szCs w:val="18"/>
               </w:rPr>
               <w:t xml:space="preserve">Receipt upload and server-side OCR</w:t>
+            </w:r>
+          </w:p>
+        </w:tc>
+        <w:tc>
+          <w:tcPr>
+            <w:tcW w:type="dxa" w:w="1500"/>
+            <w:tcMar>
+              <w:top w:type="dxa" w:w="60"/>
+              <w:left w:type="dxa" w:w="100"/>
+              <w:bottom w:type="dxa" w:w="60"/>
+              <w:right w:type="dxa" w:w="100"/>
+            </w:tcMar>
+          </w:tcPr>
+          <w:p>
+            <w:r>
+              <w:rPr>
+                <w:b w:val="false"/>
+                <w:bCs w:val="false"/>
+                <w:color w:val="222222"/>
+                <w:sz w:val="18"/>
+                <w:szCs w:val="18"/>
+              </w:rPr>
+              <w:t xml:space="preserve">Working prompt</w:t>
+            </w:r>
+          </w:p>
+        </w:tc>
+        <w:tc>
+          <w:tcPr>
+            <w:tcW w:type="dxa" w:w="1400"/>
+            <w:tcMar>
+              <w:top w:type="dxa" w:w="60"/>
+              <w:left w:type="dxa" w:w="100"/>
+              <w:bottom w:type="dxa" w:w="60"/>
+              <w:right w:type="dxa" w:w="100"/>
+            </w:tcMar>
+          </w:tcPr>
+          <w:p>
+            <w:r>
+              <w:rPr>
+                <w:b w:val="false"/>
+                <w:bCs w:val="false"/>
+                <w:color w:val="222222"/>
+                <w:sz w:val="18"/>
+                <w:szCs w:val="18"/>
+              </w:rPr>
+              <w:t xml:space="preserve">2026-10-17</w:t>
+            </w:r>
+          </w:p>
+        </w:tc>
+      </w:tr>
+      <w:tr>
+        <w:tc>
+          <w:tcPr>
+            <w:tcW w:type="dxa" w:w="700"/>
+            <w:shd w:fill="F7F7FB" w:color="auto" w:val="clear"/>
+            <w:tcMar>
+              <w:top w:type="dxa" w:w="60"/>
+              <w:left w:type="dxa" w:w="100"/>
+              <w:bottom w:type="dxa" w:w="60"/>
+              <w:right w:type="dxa" w:w="100"/>
+            </w:tcMar>
+          </w:tcPr>
+          <w:p>
+            <w:r>
+              <w:rPr>
+                <w:b w:val="false"/>
+                <w:bCs w:val="false"/>
+                <w:color w:val="222222"/>
+                <w:sz w:val="18"/>
+                <w:szCs w:val="18"/>
+              </w:rPr>
+              <w:t xml:space="preserve">46</w:t>
+            </w:r>
+          </w:p>
+        </w:tc>
+        <w:tc>
+          <w:tcPr>
+            <w:tcW w:type="dxa" w:w="1500"/>
+            <w:shd w:fill="F7F7FB" w:color="auto" w:val="clear"/>
+            <w:tcMar>
+              <w:top w:type="dxa" w:w="60"/>
+              <w:left w:type="dxa" w:w="100"/>
+              <w:bottom w:type="dxa" w:w="60"/>
+              <w:right w:type="dxa" w:w="100"/>
+            </w:tcMar>
+          </w:tcPr>
+          <w:p>
+            <w:r>
+              <w:rPr>
+                <w:b w:val="false"/>
+                <w:bCs w:val="false"/>
+                <w:color w:val="222222"/>
+                <w:sz w:val="18"/>
+                <w:szCs w:val="18"/>
+              </w:rPr>
+              <w:t xml:space="preserve">Review 3</w:t>
+            </w:r>
+          </w:p>
+        </w:tc>
+        <w:tc>
+          <w:tcPr>
+            <w:tcW w:type="dxa" w:w="4538"/>
+            <w:shd w:fill="F7F7FB" w:color="auto" w:val="clear"/>
+            <w:tcMar>
+              <w:top w:type="dxa" w:w="60"/>
+              <w:left w:type="dxa" w:w="100"/>
+              <w:bottom w:type="dxa" w:w="60"/>
+              <w:right w:type="dxa" w:w="100"/>
+            </w:tcMar>
+          </w:tcPr>
+          <w:p>
+            <w:r>
+              <w:rPr>
+                <w:b w:val="false"/>
+                <w:bCs w:val="false"/>
+                <w:color w:val="222222"/>
+                <w:sz w:val="18"/>
+                <w:szCs w:val="18"/>
+              </w:rPr>
+              <w:t xml:space="preserve">Request: proceed with Review 3 Step P13</w:t>
+            </w:r>
+          </w:p>
+        </w:tc>
+        <w:tc>
+          <w:tcPr>
+            <w:tcW w:type="dxa" w:w="1500"/>
+            <w:shd w:fill="F7F7FB" w:color="auto" w:val="clear"/>
+            <w:tcMar>
+              <w:top w:type="dxa" w:w="60"/>
+              <w:left w:type="dxa" w:w="100"/>
+              <w:bottom w:type="dxa" w:w="60"/>
+              <w:right w:type="dxa" w:w="100"/>
+            </w:tcMar>
+          </w:tcPr>
+          <w:p>
+            <w:r>
+              <w:rPr>
+                <w:b w:val="false"/>
+                <w:bCs w:val="false"/>
+                <w:color w:val="222222"/>
+                <w:sz w:val="18"/>
+                <w:szCs w:val="18"/>
+              </w:rPr>
+              <w:t xml:space="preserve">User prompt</w:t>
+            </w:r>
+          </w:p>
+        </w:tc>
+        <w:tc>
+          <w:tcPr>
+            <w:tcW w:type="dxa" w:w="1400"/>
+            <w:shd w:fill="F7F7FB" w:color="auto" w:val="clear"/>
+            <w:tcMar>
+              <w:top w:type="dxa" w:w="60"/>
+              <w:left w:type="dxa" w:w="100"/>
+              <w:bottom w:type="dxa" w:w="60"/>
+              <w:right w:type="dxa" w:w="100"/>
+            </w:tcMar>
+          </w:tcPr>
+          <w:p>
+            <w:r>
+              <w:rPr>
+                <w:b w:val="false"/>
+                <w:bCs w:val="false"/>
+                <w:color w:val="222222"/>
+                <w:sz w:val="18"/>
+                <w:szCs w:val="18"/>
+              </w:rPr>
+              <w:t xml:space="preserve">2026-10-17</w:t>
+            </w:r>
+          </w:p>
+        </w:tc>
+      </w:tr>
+      <w:tr>
+        <w:tc>
+          <w:tcPr>
+            <w:tcW w:type="dxa" w:w="700"/>
+            <w:tcMar>
+              <w:top w:type="dxa" w:w="60"/>
+              <w:left w:type="dxa" w:w="100"/>
+              <w:bottom w:type="dxa" w:w="60"/>
+              <w:right w:type="dxa" w:w="100"/>
+            </w:tcMar>
+          </w:tcPr>
+          <w:p>
+            <w:r>
+              <w:rPr>
+                <w:b w:val="false"/>
+                <w:bCs w:val="false"/>
+                <w:color w:val="222222"/>
+                <w:sz w:val="18"/>
+                <w:szCs w:val="18"/>
+              </w:rPr>
+              <w:t xml:space="preserve">47</w:t>
+            </w:r>
+          </w:p>
+        </w:tc>
+        <w:tc>
+          <w:tcPr>
+            <w:tcW w:type="dxa" w:w="1500"/>
+            <w:tcMar>
+              <w:top w:type="dxa" w:w="60"/>
+              <w:left w:type="dxa" w:w="100"/>
+              <w:bottom w:type="dxa" w:w="60"/>
+              <w:right w:type="dxa" w:w="100"/>
+            </w:tcMar>
+          </w:tcPr>
+          <w:p>
+            <w:r>
+              <w:rPr>
+                <w:b w:val="false"/>
+                <w:bCs w:val="false"/>
+                <w:color w:val="222222"/>
+                <w:sz w:val="18"/>
+                <w:szCs w:val="18"/>
+              </w:rPr>
+              <w:t xml:space="preserve">Review 3</w:t>
+            </w:r>
+          </w:p>
+        </w:tc>
+        <w:tc>
+          <w:tcPr>
+            <w:tcW w:type="dxa" w:w="4538"/>
+            <w:tcMar>
+              <w:top w:type="dxa" w:w="60"/>
+              <w:left w:type="dxa" w:w="100"/>
+              <w:bottom w:type="dxa" w:w="60"/>
+              <w:right w:type="dxa" w:w="100"/>
+            </w:tcMar>
+          </w:tcPr>
+          <w:p>
+            <w:r>
+              <w:rPr>
+                <w:b w:val="false"/>
+                <w:bCs w:val="false"/>
+                <w:color w:val="222222"/>
+                <w:sz w:val="18"/>
+                <w:szCs w:val="18"/>
+              </w:rPr>
+              <w:t xml:space="preserve">Frontend API integration</w:t>
             </w:r>
           </w:p>
         </w:tc>
@@ -16642,20 +16881,11 @@
     </w:p>
     <w:p>
       <w:pPr>
-        <w:pStyle w:val="Heading2"/>
-        <w:spacing w:before="360"/>
-      </w:pPr>
-      <w:r>
-        <w:t xml:space="preserve">Wrap-up - Documentation, cleanup and deployment</w:t>
-      </w:r>
-    </w:p>
-    <w:p>
-      <w:pPr>
         <w:pStyle w:val="Heading3"/>
         <w:keepNext/>
       </w:pPr>
       <w:r>
-        <w:t xml:space="preserve">#13  Request: GitHub repository, website link and PDF of prompts</w:t>
+        <w:t xml:space="preserve">#46  Request: proceed with Review 3 Step P13</w:t>
       </w:r>
     </w:p>
     <w:p>
@@ -16669,7 +16899,7 @@
           <w:sz w:val="18"/>
           <w:szCs w:val="18"/>
         </w:rPr>
-        <w:t xml:space="preserve">User prompt  |  2026-10-15</w:t>
+        <w:t xml:space="preserve">User prompt  |  2026-10-17</w:t>
       </w:r>
     </w:p>
     <w:p>
@@ -16703,7 +16933,29 @@
           <w:sz w:val="19"/>
           <w:szCs w:val="19"/>
         </w:rPr>
-        <w:t xml:space="preserve">create a new repositry for this project in my gihub , and after than give me the github link and then the website link and also a pdf containing the prompts to complete project.</w:t>
+        <w:t xml:space="preserve"># SplitStack — P13: Frontend API Integration (Review 3)
+Implement P13 only of the SplitStack refurbishment roadmap on the existing refurbish branch.
+## 1. Mandatory safety checks
+Before editing: Confirm branch refurbish and expected starting commit eef27b7 (Review 3: receipt upload and server-side OCR). Run git status and inspect recent commits. Do not push to any remote. Do not reset, rebase, amend commits, or discard existing work. Preserve all existing files under docs/audit/, including untracked evidence. Stage only intended files. Preserve the legacy Flask application and its files. Work only on refurbish. Do not begin P14 or P15.
+## 2. Inspect the existing architecture first
+Review client/js/data/api.js, store abstraction, page rendering, session behavior, server routers, receipt scanning UI, READMEs, and prior audit reports.
+## 3. Integrate the frontend data layer
+Replace or extend existing client API/data adapter so UI can use backend REST API while preserving page and domain contracts. Centralize API base URL and fetch behavior. Send authentication credentials supported by existing server. Do not store passwords or long-lived authentication tokens in localStorage. Handle HTTP errors, network failures, expired sessions, and validation errors consistently. Avoid silently treating failed API requests as successful empty data. Keep currency amounts in integer paise. Prevent duplicate form submissions.
+## 4. Authentication and session behavior
+Integrate registration, login, logout, current-user, profile, and password-change endpoints. Restore session state using server's current-user endpoint. Do not expose passwords or tokens in UI state, logs, or persisted browser storage.
+## 5. Resource integration
+Connect expenses, income, categories, budgets, recurring items, groups, members, shared expenses, balances, settlements, shopping lists, analytics, forecast, insights, notifications, search, and receipts. Match existing server route contracts exactly.
+## 6. Data migration and offline behavior
+Do not silently discard or overwrite existing localStorage data. Provide deliberate, recoverable migration flow. Never fall back to local data after a server error in a way that falsely implies data was saved to the server.
+## 7. Receipt upload integration
+Connect receipt scan/review UI to backend: upload image as multipart form data with field name receipt, do not manually set multipart boundary header, display upload/OCR progress, show OCR candidates as unverified suggestions, confirm expense only after user confirmation, display failures clearly and allow safe retry, prevent duplicate expenses.
+## 8. Testing
+Add or update tests for base URL, JSON/multipart requests, HTTP/network errors, authentication restoration, resource payloads, receipt upload/review, and prevention of silent fallback. Run npm run test:client, npm run test:server, npm run lint:html.
+## 9. Documentation and audit
+Update client README, docs/audit/P13_FRONTEND_API_INTEGRATION_AUDIT.md, and docs/prompt_log.json. Regenerate prompt-log DOCX/PDF via npm run log.
+## 10. Final review and commit
+Commit with exact message: Review 3: frontend API integration. Do not push.
+## 11. Final report</w:t>
       </w:r>
     </w:p>
     <w:p>
@@ -16731,7 +16983,7 @@
           <w:sz w:val="21"/>
           <w:szCs w:val="21"/>
         </w:rPr>
-        <w:t xml:space="preserve">Publish the project under the student's own GitHub account, host the site, and export the prompt log (including the remaining planned prompts) as a PDF.</w:t>
+        <w:t xml:space="preserve">Authorize execution of Step P13: Frontend API Integration.</w:t>
       </w:r>
     </w:p>
     <w:p>
@@ -16792,7 +17044,7 @@
           <w:sz w:val="21"/>
           <w:szCs w:val="21"/>
         </w:rPr>
-        <w:t xml:space="preserve">Done: see the following entries.</w:t>
+        <w:t xml:space="preserve">Authorized Step P13 implementation.</w:t>
       </w:r>
     </w:p>
     <w:p>
@@ -16840,7 +17092,7 @@
         <w:keepNext/>
       </w:pPr>
       <w:r>
-        <w:t xml:space="preserve">#14  PDF export of the prompt log, including planned prompts</w:t>
+        <w:t xml:space="preserve">#47  Frontend API integration</w:t>
       </w:r>
     </w:p>
     <w:p>
@@ -16854,7 +17106,7 @@
           <w:sz w:val="18"/>
           <w:szCs w:val="18"/>
         </w:rPr>
-        <w:t xml:space="preserve">Working prompt  |  2026-10-15</w:t>
+        <w:t xml:space="preserve">Working prompt  |  2026-10-17</w:t>
       </w:r>
     </w:p>
     <w:p>
@@ -16888,7 +17140,7 @@
           <w:sz w:val="19"/>
           <w:szCs w:val="19"/>
         </w:rPr>
-        <w:t xml:space="preserve">Export the prompt log to PDF with a Python reportlab script (docs/tools/build_prompt_pdf.py) that reads docs/prompt_log.json: a title page, a stage overview table, a summary of every entry, Part A with every executed prompt verbatim in a shaded box with purpose, files, result and verification, and Part B with the planned prompts that complete Review 2, Review 3 and the wrap-up, clearly marked as not yet run. Add the planned prompts to prompt_log.json and to the Word log as well, and make "npm run log" rebuild both documents.</w:t>
+        <w:t xml:space="preserve">Create client/js/data/api-http.js with centralized request() dispatcher, base URL management, query serialization, credentials: 'include', in-memory Bearer token management (tab-scoped sessionStorage), ApiError { field, message, status } mapping, and full resource methods for auth, expenses, income, categories, budgets, recurring, groups, shopping, analytics, search, receipts, and migration; update client/js/data/api.js with dual-mode dispatch (defaulting to 'api' in browser on http/https and 'local' in Node test runners); update client/js/pages/receipt-scan.js to upload receipts via POST /api/receipts/upload with button loading indicators; update client/js/pages/receipt-confirm.js to pre-fill OCR candidates as unverified suggestions, confirm via POST /api/receipts/:id/confirm with integer paise, handle 409 Conflict duplicate guards, and stream receipt image binary; update client/js/pages/group-detail.js and settlements.js with proper group context on deletion; create tests/client/api-http.test.mjs with 25 unit tests; update client/README.md, docs/audit/P13_FRONTEND_API_INTEGRATION_AUDIT.md, and prompt logs.</w:t>
       </w:r>
     </w:p>
     <w:p>
@@ -16916,7 +17168,7 @@
           <w:sz w:val="21"/>
           <w:szCs w:val="21"/>
         </w:rPr>
-        <w:t xml:space="preserve">Give the student a PDF containing the prompts needed to complete the whole project.</w:t>
+        <w:t xml:space="preserve">Integrate the client data layer with the Express backend REST API while preserving existing page rendering and domain contracts without silent fallback or local data loss.</w:t>
       </w:r>
     </w:p>
     <w:p>
@@ -16949,24 +17201,143 @@
           <w:sz w:val="19"/>
           <w:szCs w:val="19"/>
         </w:rPr>
-        <w:t xml:space="preserve">docs/tools/build_prompt_pdf.py</w:t>
-      </w:r>
-    </w:p>
-    <w:p>
-      <w:pPr>
-        <w:pStyle w:val="ListParagraph"/>
-        <w:numPr>
-          <w:ilvl w:val="0"/>
-          <w:numId w:val="2"/>
-        </w:numPr>
-      </w:pPr>
-      <w:r>
-        <w:rPr>
-          <w:rFonts w:ascii="Consolas" w:cs="Consolas" w:eastAsia="Consolas" w:hAnsi="Consolas"/>
-          <w:sz w:val="19"/>
-          <w:szCs w:val="19"/>
-        </w:rPr>
-        <w:t xml:space="preserve">docs/tools/build-prompt-log.js</w:t>
+        <w:t xml:space="preserve">client/js/data/api-http.js</w:t>
+      </w:r>
+    </w:p>
+    <w:p>
+      <w:pPr>
+        <w:pStyle w:val="ListParagraph"/>
+        <w:numPr>
+          <w:ilvl w:val="0"/>
+          <w:numId w:val="2"/>
+        </w:numPr>
+      </w:pPr>
+      <w:r>
+        <w:rPr>
+          <w:rFonts w:ascii="Consolas" w:cs="Consolas" w:eastAsia="Consolas" w:hAnsi="Consolas"/>
+          <w:sz w:val="19"/>
+          <w:szCs w:val="19"/>
+        </w:rPr>
+        <w:t xml:space="preserve">client/js/data/api.js</w:t>
+      </w:r>
+    </w:p>
+    <w:p>
+      <w:pPr>
+        <w:pStyle w:val="ListParagraph"/>
+        <w:numPr>
+          <w:ilvl w:val="0"/>
+          <w:numId w:val="2"/>
+        </w:numPr>
+      </w:pPr>
+      <w:r>
+        <w:rPr>
+          <w:rFonts w:ascii="Consolas" w:cs="Consolas" w:eastAsia="Consolas" w:hAnsi="Consolas"/>
+          <w:sz w:val="19"/>
+          <w:szCs w:val="19"/>
+        </w:rPr>
+        <w:t xml:space="preserve">client/js/pages/receipt-scan.js</w:t>
+      </w:r>
+    </w:p>
+    <w:p>
+      <w:pPr>
+        <w:pStyle w:val="ListParagraph"/>
+        <w:numPr>
+          <w:ilvl w:val="0"/>
+          <w:numId w:val="2"/>
+        </w:numPr>
+      </w:pPr>
+      <w:r>
+        <w:rPr>
+          <w:rFonts w:ascii="Consolas" w:cs="Consolas" w:eastAsia="Consolas" w:hAnsi="Consolas"/>
+          <w:sz w:val="19"/>
+          <w:szCs w:val="19"/>
+        </w:rPr>
+        <w:t xml:space="preserve">client/js/pages/receipt-confirm.js</w:t>
+      </w:r>
+    </w:p>
+    <w:p>
+      <w:pPr>
+        <w:pStyle w:val="ListParagraph"/>
+        <w:numPr>
+          <w:ilvl w:val="0"/>
+          <w:numId w:val="2"/>
+        </w:numPr>
+      </w:pPr>
+      <w:r>
+        <w:rPr>
+          <w:rFonts w:ascii="Consolas" w:cs="Consolas" w:eastAsia="Consolas" w:hAnsi="Consolas"/>
+          <w:sz w:val="19"/>
+          <w:szCs w:val="19"/>
+        </w:rPr>
+        <w:t xml:space="preserve">client/js/pages/group-detail.js</w:t>
+      </w:r>
+    </w:p>
+    <w:p>
+      <w:pPr>
+        <w:pStyle w:val="ListParagraph"/>
+        <w:numPr>
+          <w:ilvl w:val="0"/>
+          <w:numId w:val="2"/>
+        </w:numPr>
+      </w:pPr>
+      <w:r>
+        <w:rPr>
+          <w:rFonts w:ascii="Consolas" w:cs="Consolas" w:eastAsia="Consolas" w:hAnsi="Consolas"/>
+          <w:sz w:val="19"/>
+          <w:szCs w:val="19"/>
+        </w:rPr>
+        <w:t xml:space="preserve">client/js/pages/settlements.js</w:t>
+      </w:r>
+    </w:p>
+    <w:p>
+      <w:pPr>
+        <w:pStyle w:val="ListParagraph"/>
+        <w:numPr>
+          <w:ilvl w:val="0"/>
+          <w:numId w:val="2"/>
+        </w:numPr>
+      </w:pPr>
+      <w:r>
+        <w:rPr>
+          <w:rFonts w:ascii="Consolas" w:cs="Consolas" w:eastAsia="Consolas" w:hAnsi="Consolas"/>
+          <w:sz w:val="19"/>
+          <w:szCs w:val="19"/>
+        </w:rPr>
+        <w:t xml:space="preserve">tests/client/api-http.test.mjs</w:t>
+      </w:r>
+    </w:p>
+    <w:p>
+      <w:pPr>
+        <w:pStyle w:val="ListParagraph"/>
+        <w:numPr>
+          <w:ilvl w:val="0"/>
+          <w:numId w:val="2"/>
+        </w:numPr>
+      </w:pPr>
+      <w:r>
+        <w:rPr>
+          <w:rFonts w:ascii="Consolas" w:cs="Consolas" w:eastAsia="Consolas" w:hAnsi="Consolas"/>
+          <w:sz w:val="19"/>
+          <w:szCs w:val="19"/>
+        </w:rPr>
+        <w:t xml:space="preserve">client/README.md</w:t>
+      </w:r>
+    </w:p>
+    <w:p>
+      <w:pPr>
+        <w:pStyle w:val="ListParagraph"/>
+        <w:numPr>
+          <w:ilvl w:val="0"/>
+          <w:numId w:val="2"/>
+        </w:numPr>
+      </w:pPr>
+      <w:r>
+        <w:rPr>
+          <w:rFonts w:ascii="Consolas" w:cs="Consolas" w:eastAsia="Consolas" w:hAnsi="Consolas"/>
+          <w:sz w:val="19"/>
+          <w:szCs w:val="19"/>
+        </w:rPr>
+        <w:t xml:space="preserve">docs/audit/P13_FRONTEND_API_INTEGRATION_AUDIT.md</w:t>
       </w:r>
     </w:p>
     <w:p>
@@ -17000,41 +17371,24 @@
           <w:sz w:val="19"/>
           <w:szCs w:val="19"/>
         </w:rPr>
+        <w:t xml:space="preserve">docs/SplitStack_Prompt_Log.docx</w:t>
+      </w:r>
+    </w:p>
+    <w:p>
+      <w:pPr>
+        <w:pStyle w:val="ListParagraph"/>
+        <w:numPr>
+          <w:ilvl w:val="0"/>
+          <w:numId w:val="2"/>
+        </w:numPr>
+      </w:pPr>
+      <w:r>
+        <w:rPr>
+          <w:rFonts w:ascii="Consolas" w:cs="Consolas" w:eastAsia="Consolas" w:hAnsi="Consolas"/>
+          <w:sz w:val="19"/>
+          <w:szCs w:val="19"/>
+        </w:rPr>
         <w:t xml:space="preserve">docs/SplitStack_Prompt_Log.pdf</w:t>
-      </w:r>
-    </w:p>
-    <w:p>
-      <w:pPr>
-        <w:pStyle w:val="ListParagraph"/>
-        <w:numPr>
-          <w:ilvl w:val="0"/>
-          <w:numId w:val="2"/>
-        </w:numPr>
-      </w:pPr>
-      <w:r>
-        <w:rPr>
-          <w:rFonts w:ascii="Consolas" w:cs="Consolas" w:eastAsia="Consolas" w:hAnsi="Consolas"/>
-          <w:sz w:val="19"/>
-          <w:szCs w:val="19"/>
-        </w:rPr>
-        <w:t xml:space="preserve">docs/SplitStack_Prompt_Log.docx</w:t>
-      </w:r>
-    </w:p>
-    <w:p>
-      <w:pPr>
-        <w:pStyle w:val="ListParagraph"/>
-        <w:numPr>
-          <w:ilvl w:val="0"/>
-          <w:numId w:val="2"/>
-        </w:numPr>
-      </w:pPr>
-      <w:r>
-        <w:rPr>
-          <w:rFonts w:ascii="Consolas" w:cs="Consolas" w:eastAsia="Consolas" w:hAnsi="Consolas"/>
-          <w:sz w:val="19"/>
-          <w:szCs w:val="19"/>
-        </w:rPr>
-        <w:t xml:space="preserve">package.json</w:t>
       </w:r>
     </w:p>
     <w:p>
@@ -17062,7 +17416,7 @@
           <w:sz w:val="21"/>
           <w:szCs w:val="21"/>
         </w:rPr>
-        <w:t xml:space="preserve">PDF with the executed prompts and 15 planned prompts; the Word log has the same content.</w:t>
+        <w:t xml:space="preserve">Implemented client REST API client and dual-mode dispatching with zero silent fallback; HttpOnly credentials transport and in-memory tab-scoped Bearer token management; end-to-end receipt scanning and server OCR confirmation pipeline; 201 client tests passing across 59 suites (including 25 new tests in api-http.test.mjs); 123 server tests passing; HTML validation clean; documentation and audit updated.</w:t>
       </w:r>
     </w:p>
     <w:p>
@@ -17090,7 +17444,7 @@
           <w:sz w:val="21"/>
           <w:szCs w:val="21"/>
         </w:rPr>
-        <w:t xml:space="preserve">Pages rendered to images and inspected; text extracted with pypdf.</w:t>
+        <w:t xml:space="preserve">npm run test:client (201 passed, 0 failed across 59 suites); npm run test:server (123 passed, 0 failed across 43 suites); npm run lint:html (25 files clean).</w:t>
       </w:r>
     </w:p>
     <w:p>
@@ -17106,11 +17460,20 @@
     </w:p>
     <w:p>
       <w:pPr>
+        <w:pStyle w:val="Heading2"/>
+        <w:spacing w:before="360"/>
+      </w:pPr>
+      <w:r>
+        <w:t xml:space="preserve">Wrap-up - Documentation, cleanup and deployment</w:t>
+      </w:r>
+    </w:p>
+    <w:p>
+      <w:pPr>
         <w:pStyle w:val="Heading3"/>
         <w:keepNext/>
       </w:pPr>
       <w:r>
-        <w:t xml:space="preserve">#15  Create the GitHub repository and push the code</w:t>
+        <w:t xml:space="preserve">#13  Request: GitHub repository, website link and PDF of prompts</w:t>
       </w:r>
     </w:p>
     <w:p>
@@ -17124,7 +17487,7 @@
           <w:sz w:val="18"/>
           <w:szCs w:val="18"/>
         </w:rPr>
-        <w:t xml:space="preserve">Working prompt  |  2026-10-15</w:t>
+        <w:t xml:space="preserve">User prompt  |  2026-10-15</w:t>
       </w:r>
     </w:p>
     <w:p>
@@ -17158,7 +17521,7 @@
           <w:sz w:val="19"/>
           <w:szCs w:val="19"/>
         </w:rPr>
-        <w:t xml:space="preserve">Install the official GitHub CLI with winget and sign in through the device-code flow (the student approves it in the browser). Before publishing, check that no secrets or databases are tracked, review the receipt images that are still in the commit history (they are generic sample invoices), and confirm with the student that a public repository is acceptable because the team's original repository is private. Then create the public repository MahaprabhuK/SplitStack, push the refurbish branch as main together with the legacy branch, add a GitHub Actions workflow (.github/workflows/pages.yml) that deploys the client/ folder to GitHub Pages, enable Pages with the "GitHub Actions" source, and confirm that the site responds.</w:t>
+        <w:t xml:space="preserve">create a new repositry for this project in my gihub , and after than give me the github link and then the website link and also a pdf containing the prompts to complete project.</w:t>
       </w:r>
     </w:p>
     <w:p>
@@ -17186,7 +17549,7 @@
           <w:sz w:val="21"/>
           <w:szCs w:val="21"/>
         </w:rPr>
-        <w:t xml:space="preserve">Give the student a repository link and a live website link.</w:t>
+        <w:t xml:space="preserve">Publish the project under the student's own GitHub account, host the site, and export the prompt log (including the remaining planned prompts) as a PDF.</w:t>
       </w:r>
     </w:p>
     <w:p>
@@ -17219,7 +17582,7 @@
           <w:sz w:val="19"/>
           <w:szCs w:val="19"/>
         </w:rPr>
-        <w:t xml:space="preserve">README.md</w:t>
+        <w:t xml:space="preserve">-</w:t>
       </w:r>
     </w:p>
     <w:p>
@@ -17247,7 +17610,7 @@
           <w:sz w:val="21"/>
           <w:szCs w:val="21"/>
         </w:rPr>
-        <w:t xml:space="preserve">Public repository https://github.com/MahaprabhuK/SplitStack created and the legacy branch pushed. The first push of main was rejected because it added a GitHub Actions workflow (.github/workflows/pages.yml) and the gh token lacked the "workflow" scope; the workflow file was removed and main was pushed in the next step. GitHub Pages is not set up yet (planned for the wrap-up; needs "gh auth refresh -s workflow" or a gh-pages branch).</w:t>
+        <w:t xml:space="preserve">Done: see the following entries.</w:t>
       </w:r>
     </w:p>
     <w:p>
@@ -17275,7 +17638,7 @@
           <w:sz w:val="21"/>
           <w:szCs w:val="21"/>
         </w:rPr>
-        <w:t xml:space="preserve">gh repo view; git push output.</w:t>
+        <w:t xml:space="preserve">-</w:t>
       </w:r>
     </w:p>
     <w:p>
@@ -17295,7 +17658,7 @@
         <w:keepNext/>
       </w:pPr>
       <w:r>
-        <w:t xml:space="preserve">#16  Request: hand the project over to a teammate's agent</w:t>
+        <w:t xml:space="preserve">#14  PDF export of the prompt log, including planned prompts</w:t>
       </w:r>
     </w:p>
     <w:p>
@@ -17309,7 +17672,7 @@
           <w:sz w:val="18"/>
           <w:szCs w:val="18"/>
         </w:rPr>
-        <w:t xml:space="preserve">User prompt  |  2026-10-15</w:t>
+        <w:t xml:space="preserve">Working prompt  |  2026-10-15</w:t>
       </w:r>
     </w:p>
     <w:p>
@@ -17343,7 +17706,7 @@
           <w:sz w:val="19"/>
           <w:szCs w:val="19"/>
         </w:rPr>
-        <w:t xml:space="preserve">ACTUALLY I GONNA HANDOVER THE PROJECT TO MY TEAMMATES AGENT SO HE'LL BE PULLING THE CODE AND RUNNING IN HIS SYSTEM SO GIVE PROMPT FOR THAT</w:t>
+        <w:t xml:space="preserve">Export the prompt log to PDF with a Python reportlab script (docs/tools/build_prompt_pdf.py) that reads docs/prompt_log.json: a title page, a stage overview table, a summary of every entry, Part A with every executed prompt verbatim in a shaded box with purpose, files, result and verification, and Part B with the planned prompts that complete Review 2, Review 3 and the wrap-up, clearly marked as not yet run. Add the planned prompts to prompt_log.json and to the Word log as well, and make "npm run log" rebuild both documents.</w:t>
       </w:r>
     </w:p>
     <w:p>
@@ -17371,7 +17734,7 @@
           <w:sz w:val="21"/>
           <w:szCs w:val="21"/>
         </w:rPr>
-        <w:t xml:space="preserve">Let a teammate's AI agent clone, run and continue the project.</w:t>
+        <w:t xml:space="preserve">Give the student a PDF containing the prompts needed to complete the whole project.</w:t>
       </w:r>
     </w:p>
     <w:p>
@@ -17404,7 +17767,92 @@
           <w:sz w:val="19"/>
           <w:szCs w:val="19"/>
         </w:rPr>
-        <w:t xml:space="preserve">-</w:t>
+        <w:t xml:space="preserve">docs/tools/build_prompt_pdf.py</w:t>
+      </w:r>
+    </w:p>
+    <w:p>
+      <w:pPr>
+        <w:pStyle w:val="ListParagraph"/>
+        <w:numPr>
+          <w:ilvl w:val="0"/>
+          <w:numId w:val="2"/>
+        </w:numPr>
+      </w:pPr>
+      <w:r>
+        <w:rPr>
+          <w:rFonts w:ascii="Consolas" w:cs="Consolas" w:eastAsia="Consolas" w:hAnsi="Consolas"/>
+          <w:sz w:val="19"/>
+          <w:szCs w:val="19"/>
+        </w:rPr>
+        <w:t xml:space="preserve">docs/tools/build-prompt-log.js</w:t>
+      </w:r>
+    </w:p>
+    <w:p>
+      <w:pPr>
+        <w:pStyle w:val="ListParagraph"/>
+        <w:numPr>
+          <w:ilvl w:val="0"/>
+          <w:numId w:val="2"/>
+        </w:numPr>
+      </w:pPr>
+      <w:r>
+        <w:rPr>
+          <w:rFonts w:ascii="Consolas" w:cs="Consolas" w:eastAsia="Consolas" w:hAnsi="Consolas"/>
+          <w:sz w:val="19"/>
+          <w:szCs w:val="19"/>
+        </w:rPr>
+        <w:t xml:space="preserve">docs/prompt_log.json</w:t>
+      </w:r>
+    </w:p>
+    <w:p>
+      <w:pPr>
+        <w:pStyle w:val="ListParagraph"/>
+        <w:numPr>
+          <w:ilvl w:val="0"/>
+          <w:numId w:val="2"/>
+        </w:numPr>
+      </w:pPr>
+      <w:r>
+        <w:rPr>
+          <w:rFonts w:ascii="Consolas" w:cs="Consolas" w:eastAsia="Consolas" w:hAnsi="Consolas"/>
+          <w:sz w:val="19"/>
+          <w:szCs w:val="19"/>
+        </w:rPr>
+        <w:t xml:space="preserve">docs/SplitStack_Prompt_Log.pdf</w:t>
+      </w:r>
+    </w:p>
+    <w:p>
+      <w:pPr>
+        <w:pStyle w:val="ListParagraph"/>
+        <w:numPr>
+          <w:ilvl w:val="0"/>
+          <w:numId w:val="2"/>
+        </w:numPr>
+      </w:pPr>
+      <w:r>
+        <w:rPr>
+          <w:rFonts w:ascii="Consolas" w:cs="Consolas" w:eastAsia="Consolas" w:hAnsi="Consolas"/>
+          <w:sz w:val="19"/>
+          <w:szCs w:val="19"/>
+        </w:rPr>
+        <w:t xml:space="preserve">docs/SplitStack_Prompt_Log.docx</w:t>
+      </w:r>
+    </w:p>
+    <w:p>
+      <w:pPr>
+        <w:pStyle w:val="ListParagraph"/>
+        <w:numPr>
+          <w:ilvl w:val="0"/>
+          <w:numId w:val="2"/>
+        </w:numPr>
+      </w:pPr>
+      <w:r>
+        <w:rPr>
+          <w:rFonts w:ascii="Consolas" w:cs="Consolas" w:eastAsia="Consolas" w:hAnsi="Consolas"/>
+          <w:sz w:val="19"/>
+          <w:szCs w:val="19"/>
+        </w:rPr>
+        <w:t xml:space="preserve">package.json</w:t>
       </w:r>
     </w:p>
     <w:p>
@@ -17432,7 +17880,7 @@
           <w:sz w:val="21"/>
           <w:szCs w:val="21"/>
         </w:rPr>
-        <w:t xml:space="preserve">A handover prompt was written covering: requirements per review, clone and branch, prerequisites, install/run/verify commands, repository map, known traps, the mandatory logging rule, the ordered remaining work (planned prompts P1-P15) and working rules. Noted that the new work had to be pushed to GitHub first.</w:t>
+        <w:t xml:space="preserve">PDF with the executed prompts and 15 planned prompts; the Word log has the same content.</w:t>
       </w:r>
     </w:p>
     <w:p>
@@ -17460,7 +17908,7 @@
           <w:sz w:val="21"/>
           <w:szCs w:val="21"/>
         </w:rPr>
-        <w:t xml:space="preserve">-</w:t>
+        <w:t xml:space="preserve">Pages rendered to images and inspected; text extracted with pypdf.</w:t>
       </w:r>
     </w:p>
     <w:p>
@@ -17480,7 +17928,7 @@
         <w:keepNext/>
       </w:pPr>
       <w:r>
-        <w:t xml:space="preserve">#17  Push the refurbished code to GitHub main</w:t>
+        <w:t xml:space="preserve">#15  Create the GitHub repository and push the code</w:t>
       </w:r>
     </w:p>
     <w:p>
@@ -17528,7 +17976,7 @@
           <w:sz w:val="19"/>
           <w:szCs w:val="19"/>
         </w:rPr>
-        <w:t xml:space="preserve">push it  (user prompt). Executed as: remove .github/workflows/pages.yml (the token lacks the workflow scope), replace the not-yet-existing live-site link in README.md with local run instructions, correct the earlier log entry about publishing, log the handover, rebuild the prompt logs, commit, and push the refurbish branch to main on https://github.com/MahaprabhuK/SplitStack so the teammate can clone it.</w:t>
+        <w:t xml:space="preserve">Install the official GitHub CLI with winget and sign in through the device-code flow (the student approves it in the browser). Before publishing, check that no secrets or databases are tracked, review the receipt images that are still in the commit history (they are generic sample invoices), and confirm with the student that a public repository is acceptable because the team's original repository is private. Then create the public repository MahaprabhuK/SplitStack, push the refurbish branch as main together with the legacy branch, add a GitHub Actions workflow (.github/workflows/pages.yml) that deploys the client/ folder to GitHub Pages, enable Pages with the "GitHub Actions" source, and confirm that the site responds.</w:t>
       </w:r>
     </w:p>
     <w:p>
@@ -17556,7 +18004,7 @@
           <w:sz w:val="21"/>
           <w:szCs w:val="21"/>
         </w:rPr>
-        <w:t xml:space="preserve">Make the current work available to the teammate.</w:t>
+        <w:t xml:space="preserve">Give the student a repository link and a live website link.</w:t>
       </w:r>
     </w:p>
     <w:p>
@@ -17589,75 +18037,7 @@
           <w:sz w:val="19"/>
           <w:szCs w:val="19"/>
         </w:rPr>
-        <w:t xml:space="preserve">.github/workflows/pages.yml (removed)</w:t>
-      </w:r>
-    </w:p>
-    <w:p>
-      <w:pPr>
-        <w:pStyle w:val="ListParagraph"/>
-        <w:numPr>
-          <w:ilvl w:val="0"/>
-          <w:numId w:val="2"/>
-        </w:numPr>
-      </w:pPr>
-      <w:r>
-        <w:rPr>
-          <w:rFonts w:ascii="Consolas" w:cs="Consolas" w:eastAsia="Consolas" w:hAnsi="Consolas"/>
-          <w:sz w:val="19"/>
-          <w:szCs w:val="19"/>
-        </w:rPr>
         <w:t xml:space="preserve">README.md</w:t>
-      </w:r>
-    </w:p>
-    <w:p>
-      <w:pPr>
-        <w:pStyle w:val="ListParagraph"/>
-        <w:numPr>
-          <w:ilvl w:val="0"/>
-          <w:numId w:val="2"/>
-        </w:numPr>
-      </w:pPr>
-      <w:r>
-        <w:rPr>
-          <w:rFonts w:ascii="Consolas" w:cs="Consolas" w:eastAsia="Consolas" w:hAnsi="Consolas"/>
-          <w:sz w:val="19"/>
-          <w:szCs w:val="19"/>
-        </w:rPr>
-        <w:t xml:space="preserve">docs/prompt_log.json</w:t>
-      </w:r>
-    </w:p>
-    <w:p>
-      <w:pPr>
-        <w:pStyle w:val="ListParagraph"/>
-        <w:numPr>
-          <w:ilvl w:val="0"/>
-          <w:numId w:val="2"/>
-        </w:numPr>
-      </w:pPr>
-      <w:r>
-        <w:rPr>
-          <w:rFonts w:ascii="Consolas" w:cs="Consolas" w:eastAsia="Consolas" w:hAnsi="Consolas"/>
-          <w:sz w:val="19"/>
-          <w:szCs w:val="19"/>
-        </w:rPr>
-        <w:t xml:space="preserve">docs/SplitStack_Prompt_Log.docx</w:t>
-      </w:r>
-    </w:p>
-    <w:p>
-      <w:pPr>
-        <w:pStyle w:val="ListParagraph"/>
-        <w:numPr>
-          <w:ilvl w:val="0"/>
-          <w:numId w:val="2"/>
-        </w:numPr>
-      </w:pPr>
-      <w:r>
-        <w:rPr>
-          <w:rFonts w:ascii="Consolas" w:cs="Consolas" w:eastAsia="Consolas" w:hAnsi="Consolas"/>
-          <w:sz w:val="19"/>
-          <w:szCs w:val="19"/>
-        </w:rPr>
-        <w:t xml:space="preserve">docs/SplitStack_Prompt_Log.pdf</w:t>
       </w:r>
     </w:p>
     <w:p>
@@ -17685,7 +18065,7 @@
           <w:sz w:val="21"/>
           <w:szCs w:val="21"/>
         </w:rPr>
-        <w:t xml:space="preserve">main pushed to GitHub; branches on GitHub: main (refurbished work) and legacy (original Flask app).</w:t>
+        <w:t xml:space="preserve">Public repository https://github.com/MahaprabhuK/SplitStack created and the legacy branch pushed. The first push of main was rejected because it added a GitHub Actions workflow (.github/workflows/pages.yml) and the gh token lacked the "workflow" scope; the workflow file was removed and main was pushed in the next step. GitHub Pages is not set up yet (planned for the wrap-up; needs "gh auth refresh -s workflow" or a gh-pages branch).</w:t>
       </w:r>
     </w:p>
     <w:p>
@@ -17713,7 +18093,7 @@
           <w:sz w:val="21"/>
           <w:szCs w:val="21"/>
         </w:rPr>
-        <w:t xml:space="preserve">git ls-remote shows main and legacy at the expected commits.</w:t>
+        <w:t xml:space="preserve">gh repo view; git push output.</w:t>
       </w:r>
     </w:p>
     <w:p>
@@ -17733,7 +18113,7 @@
         <w:keepNext/>
       </w:pPr>
       <w:r>
-        <w:t xml:space="preserve">#18  Request: push the code and deploy the website</w:t>
+        <w:t xml:space="preserve">#16  Request: hand the project over to a teammate's agent</w:t>
       </w:r>
     </w:p>
     <w:p>
@@ -17781,7 +18161,7 @@
           <w:sz w:val="19"/>
           <w:szCs w:val="19"/>
         </w:rPr>
-        <w:t xml:space="preserve">first push the code and deploy it</w:t>
+        <w:t xml:space="preserve">ACTUALLY I GONNA HANDOVER THE PROJECT TO MY TEAMMATES AGENT SO HE'LL BE PULLING THE CODE AND RUNNING IN HIS SYSTEM SO GIVE PROMPT FOR THAT</w:t>
       </w:r>
     </w:p>
     <w:p>
@@ -17809,7 +18189,7 @@
           <w:sz w:val="21"/>
           <w:szCs w:val="21"/>
         </w:rPr>
-        <w:t xml:space="preserve">Get the code on GitHub and the Review 1 site online.</w:t>
+        <w:t xml:space="preserve">Let a teammate's AI agent clone, run and continue the project.</w:t>
       </w:r>
     </w:p>
     <w:p>
@@ -17870,7 +18250,7 @@
           <w:sz w:val="21"/>
           <w:szCs w:val="21"/>
         </w:rPr>
-        <w:t xml:space="preserve">Handled in the next step.</w:t>
+        <w:t xml:space="preserve">A handover prompt was written covering: requirements per review, clone and branch, prerequisites, install/run/verify commands, repository map, known traps, the mandatory logging rule, the ordered remaining work (planned prompts P1-P15) and working rules. Noted that the new work had to be pushed to GitHub first.</w:t>
       </w:r>
     </w:p>
     <w:p>
@@ -17918,7 +18298,7 @@
         <w:keepNext/>
       </w:pPr>
       <w:r>
-        <w:t xml:space="preserve">#19  Deploy the client to GitHub Pages from a gh-pages branch</w:t>
+        <w:t xml:space="preserve">#17  Push the refurbished code to GitHub main</w:t>
       </w:r>
     </w:p>
     <w:p>
@@ -17966,7 +18346,7 @@
           <w:sz w:val="19"/>
           <w:szCs w:val="19"/>
         </w:rPr>
-        <w:t xml:space="preserve">Push refurbish to main and refurbish on MahaprabhuK/SplitStack. Because the token cannot push workflow files, deploy without GitHub Actions: check that client/ uses only relative links, split client/ into its own history with git subtree split, push it as the gh-pages branch, wait for GitHub Pages to publish it, then put the live link back in README.md and log the step.</w:t>
+        <w:t xml:space="preserve">push it  (user prompt). Executed as: remove .github/workflows/pages.yml (the token lacks the workflow scope), replace the not-yet-existing live-site link in README.md with local run instructions, correct the earlier log entry about publishing, log the handover, rebuild the prompt logs, commit, and push the refurbish branch to main on https://github.com/MahaprabhuK/SplitStack so the teammate can clone it.</w:t>
       </w:r>
     </w:p>
     <w:p>
@@ -17994,7 +18374,7 @@
           <w:sz w:val="21"/>
           <w:szCs w:val="21"/>
         </w:rPr>
-        <w:t xml:space="preserve">Publish the Review 1 site at a public URL without needing the workflow scope.</w:t>
+        <w:t xml:space="preserve">Make the current work available to the teammate.</w:t>
       </w:r>
     </w:p>
     <w:p>
@@ -18027,6 +18407,23 @@
           <w:sz w:val="19"/>
           <w:szCs w:val="19"/>
         </w:rPr>
+        <w:t xml:space="preserve">.github/workflows/pages.yml (removed)</w:t>
+      </w:r>
+    </w:p>
+    <w:p>
+      <w:pPr>
+        <w:pStyle w:val="ListParagraph"/>
+        <w:numPr>
+          <w:ilvl w:val="0"/>
+          <w:numId w:val="2"/>
+        </w:numPr>
+      </w:pPr>
+      <w:r>
+        <w:rPr>
+          <w:rFonts w:ascii="Consolas" w:cs="Consolas" w:eastAsia="Consolas" w:hAnsi="Consolas"/>
+          <w:sz w:val="19"/>
+          <w:szCs w:val="19"/>
+        </w:rPr>
         <w:t xml:space="preserve">README.md</w:t>
       </w:r>
     </w:p>
@@ -18045,6 +18442,40 @@
           <w:szCs w:val="19"/>
         </w:rPr>
         <w:t xml:space="preserve">docs/prompt_log.json</w:t>
+      </w:r>
+    </w:p>
+    <w:p>
+      <w:pPr>
+        <w:pStyle w:val="ListParagraph"/>
+        <w:numPr>
+          <w:ilvl w:val="0"/>
+          <w:numId w:val="2"/>
+        </w:numPr>
+      </w:pPr>
+      <w:r>
+        <w:rPr>
+          <w:rFonts w:ascii="Consolas" w:cs="Consolas" w:eastAsia="Consolas" w:hAnsi="Consolas"/>
+          <w:sz w:val="19"/>
+          <w:szCs w:val="19"/>
+        </w:rPr>
+        <w:t xml:space="preserve">docs/SplitStack_Prompt_Log.docx</w:t>
+      </w:r>
+    </w:p>
+    <w:p>
+      <w:pPr>
+        <w:pStyle w:val="ListParagraph"/>
+        <w:numPr>
+          <w:ilvl w:val="0"/>
+          <w:numId w:val="2"/>
+        </w:numPr>
+      </w:pPr>
+      <w:r>
+        <w:rPr>
+          <w:rFonts w:ascii="Consolas" w:cs="Consolas" w:eastAsia="Consolas" w:hAnsi="Consolas"/>
+          <w:sz w:val="19"/>
+          <w:szCs w:val="19"/>
+        </w:rPr>
+        <w:t xml:space="preserve">docs/SplitStack_Prompt_Log.pdf</w:t>
       </w:r>
     </w:p>
     <w:p>
@@ -18072,7 +18503,7 @@
           <w:sz w:val="21"/>
           <w:szCs w:val="21"/>
         </w:rPr>
-        <w:t xml:space="preserve">main and refurbish are on GitHub. The client/ folder is published from the gh-pages branch at https://mahaprabhuk.github.io/SplitStack/ (GitHub enabled Pages automatically). To redeploy after client changes: git subtree split --prefix client refurbish, then push that commit to gh-pages.</w:t>
+        <w:t xml:space="preserve">main pushed to GitHub; branches on GitHub: main (refurbished work) and legacy (original Flask app).</w:t>
       </w:r>
     </w:p>
     <w:p>
@@ -18100,7 +18531,7 @@
           <w:sz w:val="21"/>
           <w:szCs w:val="21"/>
         </w:rPr>
-        <w:t xml:space="preserve">git ls-remote; curl returned 200 for the home page, pages/404.html and css/base.css on the live site.</w:t>
+        <w:t xml:space="preserve">git ls-remote shows main and legacy at the expected commits.</w:t>
       </w:r>
     </w:p>
     <w:p>
@@ -18120,7 +18551,7 @@
         <w:keepNext/>
       </w:pPr>
       <w:r>
-        <w:t xml:space="preserve">#20  Request: handover prompt PDF for a teammate's agent</w:t>
+        <w:t xml:space="preserve">#18  Request: push the code and deploy the website</w:t>
       </w:r>
     </w:p>
     <w:p>
@@ -18168,7 +18599,7 @@
           <w:sz w:val="19"/>
           <w:szCs w:val="19"/>
         </w:rPr>
-        <w:t xml:space="preserve">imma handover the project to my teammate i want you to create a detailed prompt for his agent most prolly he'll use anti gravity so i want a pdf containing prompts to complete the rest of the work in the project. so create a pdf and mention its path once its created then i'll share it to him</w:t>
+        <w:t xml:space="preserve">first push the code and deploy it</w:t>
       </w:r>
     </w:p>
     <w:p>
@@ -18196,7 +18627,7 @@
           <w:sz w:val="21"/>
           <w:szCs w:val="21"/>
         </w:rPr>
-        <w:t xml:space="preserve">Let a teammate's AI agent (Antigravity) finish Review 2, Review 3 and the wrap-up.</w:t>
+        <w:t xml:space="preserve">Get the code on GitHub and the Review 1 site online.</w:t>
       </w:r>
     </w:p>
     <w:p>
@@ -18305,7 +18736,7 @@
         <w:keepNext/>
       </w:pPr>
       <w:r>
-        <w:t xml:space="preserve">#21  Handover prompts PDF</w:t>
+        <w:t xml:space="preserve">#19  Deploy the client to GitHub Pages from a gh-pages branch</w:t>
       </w:r>
     </w:p>
     <w:p>
@@ -18353,7 +18784,7 @@
           <w:sz w:val="19"/>
           <w:szCs w:val="19"/>
         </w:rPr>
-        <w:t xml:space="preserve">Write docs/tools/build_handover_pdf.py (reusing the styles of build_prompt_pdf.py) to produce docs/SplitStack_Handover_Prompts.pdf: how to use it with Antigravity, one-time setup (tools, collaborator access, MongoDB Atlas, workflow token scope), a roadmap, Prompt 0 with the full project context, rules, logging, commit/push and gh-pages redeploy procedure, the 15 planned prompts P1-P15 expanded with concrete checks and commit messages, utility prompts (status, recovery, review rehearsal) and common problems. Render pages to check the layout.</w:t>
+        <w:t xml:space="preserve">Push refurbish to main and refurbish on MahaprabhuK/SplitStack. Because the token cannot push workflow files, deploy without GitHub Actions: check that client/ uses only relative links, split client/ into its own history with git subtree split, push it as the gh-pages branch, wait for GitHub Pages to publish it, then put the live link back in README.md and log the step.</w:t>
       </w:r>
     </w:p>
     <w:p>
@@ -18381,7 +18812,7 @@
           <w:sz w:val="21"/>
           <w:szCs w:val="21"/>
         </w:rPr>
-        <w:t xml:space="preserve">Give the teammate a self-contained, ordered set of prompts.</w:t>
+        <w:t xml:space="preserve">Publish the Review 1 site at a public URL without needing the workflow scope.</w:t>
       </w:r>
     </w:p>
     <w:p>
@@ -18414,24 +18845,24 @@
           <w:sz w:val="19"/>
           <w:szCs w:val="19"/>
         </w:rPr>
-        <w:t xml:space="preserve">docs/tools/build_handover_pdf.py</w:t>
-      </w:r>
-    </w:p>
-    <w:p>
-      <w:pPr>
-        <w:pStyle w:val="ListParagraph"/>
-        <w:numPr>
-          <w:ilvl w:val="0"/>
-          <w:numId w:val="2"/>
-        </w:numPr>
-      </w:pPr>
-      <w:r>
-        <w:rPr>
-          <w:rFonts w:ascii="Consolas" w:cs="Consolas" w:eastAsia="Consolas" w:hAnsi="Consolas"/>
-          <w:sz w:val="19"/>
-          <w:szCs w:val="19"/>
-        </w:rPr>
-        <w:t xml:space="preserve">docs/SplitStack_Handover_Prompts.pdf</w:t>
+        <w:t xml:space="preserve">README.md</w:t>
+      </w:r>
+    </w:p>
+    <w:p>
+      <w:pPr>
+        <w:pStyle w:val="ListParagraph"/>
+        <w:numPr>
+          <w:ilvl w:val="0"/>
+          <w:numId w:val="2"/>
+        </w:numPr>
+      </w:pPr>
+      <w:r>
+        <w:rPr>
+          <w:rFonts w:ascii="Consolas" w:cs="Consolas" w:eastAsia="Consolas" w:hAnsi="Consolas"/>
+          <w:sz w:val="19"/>
+          <w:szCs w:val="19"/>
+        </w:rPr>
+        <w:t xml:space="preserve">docs/prompt_log.json</w:t>
       </w:r>
     </w:p>
     <w:p>
@@ -18459,7 +18890,7 @@
           <w:sz w:val="21"/>
           <w:szCs w:val="21"/>
         </w:rPr>
-        <w:t xml:space="preserve">14-page PDF created. Changes against the planned prompts: P1 adds data-page attributes and client/js/package.json (type module) for node --test; P13 keeps the localStorage implementation as a demo mode (api-local.js chosen when /api/health does not answer) so the GitHub Pages site keeps working, instead of deleting it; P9 replaces deprecated csurf with a synchronizer token; P14 uses MongoMemoryReplSet because the API uses transactions; P15 asks for confirmation before deleting the Flask files and leaves Render account steps to the student.</w:t>
+        <w:t xml:space="preserve">main and refurbish are on GitHub. The client/ folder is published from the gh-pages branch at https://mahaprabhuk.github.io/SplitStack/ (GitHub enabled Pages automatically). To redeploy after client changes: git subtree split --prefix client refurbish, then push that commit to gh-pages.</w:t>
       </w:r>
     </w:p>
     <w:p>
@@ -18487,7 +18918,7 @@
           <w:sz w:val="21"/>
           <w:szCs w:val="21"/>
         </w:rPr>
-        <w:t xml:space="preserve">Rendered pages with PyMuPDF and checked the layout of the setup, Prompt 0, step and utility pages.</w:t>
+        <w:t xml:space="preserve">git ls-remote; curl returned 200 for the home page, pages/404.html and css/base.css on the live site.</w:t>
       </w:r>
     </w:p>
     <w:p>
@@ -18502,37 +18933,12 @@
       </w:r>
     </w:p>
     <w:p>
-      <w:r>
-        <w:br w:type="page"/>
-      </w:r>
-    </w:p>
-    <w:p>
-      <w:pPr>
-        <w:pStyle w:val="Heading1"/>
-      </w:pPr>
-      <w:r>
-        <w:t xml:space="preserve">Planned prompts to complete the project</w:t>
-      </w:r>
-    </w:p>
-    <w:p>
-      <w:pPr>
-        <w:spacing w:after="80"/>
-      </w:pPr>
-      <w:r>
-        <w:rPr>
-          <w:sz w:val="21"/>
-          <w:szCs w:val="21"/>
-        </w:rPr>
-        <w:t xml:space="preserve">These prompts have not been run yet. Run them in order; after each one, move it into the log above with its result.</w:t>
-      </w:r>
-    </w:p>
-    <w:p>
       <w:pPr>
         <w:pStyle w:val="Heading3"/>
         <w:keepNext/>
       </w:pPr>
       <w:r>
-        <w:t xml:space="preserve">P1  Connect the client to the API</w:t>
+        <w:t xml:space="preserve">#20  Request: handover prompt PDF for a teammate's agent</w:t>
       </w:r>
     </w:p>
     <w:p>
@@ -18546,7 +18952,7 @@
           <w:sz w:val="18"/>
           <w:szCs w:val="18"/>
         </w:rPr>
-        <w:t xml:space="preserve">Review 3  |  Planned prompt</w:t>
+        <w:t xml:space="preserve">User prompt  |  2026-10-15</w:t>
       </w:r>
     </w:p>
     <w:p>
@@ -18580,7 +18986,7 @@
           <w:sz w:val="19"/>
           <w:szCs w:val="19"/>
         </w:rPr>
-        <w:t xml:space="preserve">Re-implement client/js/data/api.js with fetch() against /api, sending credentials and the CSRF token header, mapping HTTP errors to the same {field, message} errors the pages already handle, and showing a toast when offline. Remove the localStorage store except for the theme preference. Because the page code depends only on api.js, no page module should need changes; confirm this by running every flow end to end against a local server connected to Atlas.</w:t>
+        <w:t xml:space="preserve">imma handover the project to my teammate i want you to create a detailed prompt for his agent most prolly he'll use anti gravity so i want a pdf containing prompts to complete the rest of the work in the project. so create a pdf and mention its path once its created then i'll share it to him</w:t>
       </w:r>
     </w:p>
     <w:p>
@@ -18608,7 +19014,7 @@
           <w:sz w:val="21"/>
           <w:szCs w:val="21"/>
         </w:rPr>
-        <w:t xml:space="preserve">Finish the full-stack integration.</w:t>
+        <w:t xml:space="preserve">Let a teammate's AI agent (Antigravity) finish Review 2, Review 3 and the wrap-up.</w:t>
       </w:r>
     </w:p>
     <w:p>
@@ -18625,6 +19031,39 @@
           <w:szCs w:val="17"/>
         </w:rPr>
         <w:t xml:space="preserve">FILES</w:t>
+      </w:r>
+    </w:p>
+    <w:p>
+      <w:pPr>
+        <w:pStyle w:val="ListParagraph"/>
+        <w:numPr>
+          <w:ilvl w:val="0"/>
+          <w:numId w:val="2"/>
+        </w:numPr>
+      </w:pPr>
+      <w:r>
+        <w:rPr>
+          <w:rFonts w:ascii="Consolas" w:cs="Consolas" w:eastAsia="Consolas" w:hAnsi="Consolas"/>
+          <w:sz w:val="19"/>
+          <w:szCs w:val="19"/>
+        </w:rPr>
+        <w:t xml:space="preserve">-</w:t>
+      </w:r>
+    </w:p>
+    <w:p>
+      <w:pPr>
+        <w:spacing w:after="60" w:before="160"/>
+      </w:pPr>
+      <w:r>
+        <w:rPr>
+          <w:b/>
+          <w:bCs/>
+          <w:color w:val="4F46E5"/>
+          <w:spacing w:val="20"/>
+          <w:sz w:val="17"/>
+          <w:szCs w:val="17"/>
+        </w:rPr>
+        <w:t xml:space="preserve">RESULT</w:t>
       </w:r>
     </w:p>
     <w:p>
@@ -18636,7 +19075,46 @@
           <w:sz w:val="21"/>
           <w:szCs w:val="21"/>
         </w:rPr>
-        <w:t xml:space="preserve">client/js/data/api.js</w:t>
+        <w:t xml:space="preserve">Handled in the next step.</w:t>
+      </w:r>
+    </w:p>
+    <w:p>
+      <w:pPr>
+        <w:spacing w:after="60" w:before="160"/>
+      </w:pPr>
+      <w:r>
+        <w:rPr>
+          <w:b/>
+          <w:bCs/>
+          <w:color w:val="4F46E5"/>
+          <w:spacing w:val="20"/>
+          <w:sz w:val="17"/>
+          <w:szCs w:val="17"/>
+        </w:rPr>
+        <w:t xml:space="preserve">VERIFICATION</w:t>
+      </w:r>
+    </w:p>
+    <w:p>
+      <w:pPr>
+        <w:spacing w:after="80"/>
+      </w:pPr>
+      <w:r>
+        <w:rPr>
+          <w:sz w:val="21"/>
+          <w:szCs w:val="21"/>
+        </w:rPr>
+        <w:t xml:space="preserve">-</w:t>
+      </w:r>
+    </w:p>
+    <w:p>
+      <w:pPr>
+        <w:pBdr>
+          <w:bottom w:val="single" w:color="D9DBE5" w:sz="4" w:space="4"/>
+        </w:pBdr>
+        <w:spacing w:after="200"/>
+      </w:pPr>
+      <w:r>
+        <w:t xml:space="preserve"/>
       </w:r>
     </w:p>
     <w:p>
@@ -18645,7 +19123,7 @@
         <w:keepNext/>
       </w:pPr>
       <w:r>
-        <w:t xml:space="preserve">P2  Seed data and automated tests</w:t>
+        <w:t xml:space="preserve">#21  Handover prompts PDF</w:t>
       </w:r>
     </w:p>
     <w:p>
@@ -18659,7 +19137,7 @@
           <w:sz w:val="18"/>
           <w:szCs w:val="18"/>
         </w:rPr>
-        <w:t xml:space="preserve">Review 3  |  Planned prompt</w:t>
+        <w:t xml:space="preserve">Working prompt  |  2026-10-15</w:t>
       </w:r>
     </w:p>
     <w:p>
@@ -18693,7 +19171,7 @@
           <w:sz w:val="19"/>
           <w:szCs w:val="19"/>
         </w:rPr>
-        <w:t xml:space="preserve">Add server/scripts/seed.js that creates the demo user, categories, six months of expenses and income, budgets, recurring payments, the three groups with shared expenses, and shopping lists. It must be idempotent and must refuse to run against a database whose name does not end in -dev or -test unless --force is passed. Write Jest + Supertest tests using mongodb-memory-server for auth, ownership checks, CSRF rejection, rate limiting, split validation, the settlement algorithm, budget status, convert-to-expense duplicate prevention and receipt upload validation, covering what the 47 legacy Python tests checked. Add an npm test script and a GitHub Actions workflow that runs lint and tests on every push.</w:t>
+        <w:t xml:space="preserve">Write docs/tools/build_handover_pdf.py (reusing the styles of build_prompt_pdf.py) to produce docs/SplitStack_Handover_Prompts.pdf: how to use it with Antigravity, one-time setup (tools, collaborator access, MongoDB Atlas, workflow token scope), a roadmap, Prompt 0 with the full project context, rules, logging, commit/push and gh-pages redeploy procedure, the 15 planned prompts P1-P15 expanded with concrete checks and commit messages, utility prompts (status, recovery, review rehearsal) and common problems. Render pages to check the layout.</w:t>
       </w:r>
     </w:p>
     <w:p>
@@ -18721,7 +19199,7 @@
           <w:sz w:val="21"/>
           <w:szCs w:val="21"/>
         </w:rPr>
-        <w:t xml:space="preserve">Prove the back end works and keep it working.</w:t>
+        <w:t xml:space="preserve">Give the teammate a self-contained, ordered set of prompts.</w:t>
       </w:r>
     </w:p>
     <w:p>
@@ -18738,6 +19216,56 @@
           <w:szCs w:val="17"/>
         </w:rPr>
         <w:t xml:space="preserve">FILES</w:t>
+      </w:r>
+    </w:p>
+    <w:p>
+      <w:pPr>
+        <w:pStyle w:val="ListParagraph"/>
+        <w:numPr>
+          <w:ilvl w:val="0"/>
+          <w:numId w:val="2"/>
+        </w:numPr>
+      </w:pPr>
+      <w:r>
+        <w:rPr>
+          <w:rFonts w:ascii="Consolas" w:cs="Consolas" w:eastAsia="Consolas" w:hAnsi="Consolas"/>
+          <w:sz w:val="19"/>
+          <w:szCs w:val="19"/>
+        </w:rPr>
+        <w:t xml:space="preserve">docs/tools/build_handover_pdf.py</w:t>
+      </w:r>
+    </w:p>
+    <w:p>
+      <w:pPr>
+        <w:pStyle w:val="ListParagraph"/>
+        <w:numPr>
+          <w:ilvl w:val="0"/>
+          <w:numId w:val="2"/>
+        </w:numPr>
+      </w:pPr>
+      <w:r>
+        <w:rPr>
+          <w:rFonts w:ascii="Consolas" w:cs="Consolas" w:eastAsia="Consolas" w:hAnsi="Consolas"/>
+          <w:sz w:val="19"/>
+          <w:szCs w:val="19"/>
+        </w:rPr>
+        <w:t xml:space="preserve">docs/SplitStack_Handover_Prompts.pdf</w:t>
+      </w:r>
+    </w:p>
+    <w:p>
+      <w:pPr>
+        <w:spacing w:after="60" w:before="160"/>
+      </w:pPr>
+      <w:r>
+        <w:rPr>
+          <w:b/>
+          <w:bCs/>
+          <w:color w:val="4F46E5"/>
+          <w:spacing w:val="20"/>
+          <w:sz w:val="17"/>
+          <w:szCs w:val="17"/>
+        </w:rPr>
+        <w:t xml:space="preserve">RESULT</w:t>
       </w:r>
     </w:p>
     <w:p>
@@ -18749,7 +19277,71 @@
           <w:sz w:val="21"/>
           <w:szCs w:val="21"/>
         </w:rPr>
-        <w:t xml:space="preserve">server/scripts/seed.js, server/tests/*.test.js, .github/workflows/ci.yml</w:t>
+        <w:t xml:space="preserve">14-page PDF created. Changes against the planned prompts: P1 adds data-page attributes and client/js/package.json (type module) for node --test; P13 keeps the localStorage implementation as a demo mode (api-local.js chosen when /api/health does not answer) so the GitHub Pages site keeps working, instead of deleting it; P9 replaces deprecated csurf with a synchronizer token; P14 uses MongoMemoryReplSet because the API uses transactions; P15 asks for confirmation before deleting the Flask files and leaves Render account steps to the student.</w:t>
+      </w:r>
+    </w:p>
+    <w:p>
+      <w:pPr>
+        <w:spacing w:after="60" w:before="160"/>
+      </w:pPr>
+      <w:r>
+        <w:rPr>
+          <w:b/>
+          <w:bCs/>
+          <w:color w:val="4F46E5"/>
+          <w:spacing w:val="20"/>
+          <w:sz w:val="17"/>
+          <w:szCs w:val="17"/>
+        </w:rPr>
+        <w:t xml:space="preserve">VERIFICATION</w:t>
+      </w:r>
+    </w:p>
+    <w:p>
+      <w:pPr>
+        <w:spacing w:after="80"/>
+      </w:pPr>
+      <w:r>
+        <w:rPr>
+          <w:sz w:val="21"/>
+          <w:szCs w:val="21"/>
+        </w:rPr>
+        <w:t xml:space="preserve">Rendered pages with PyMuPDF and checked the layout of the setup, Prompt 0, step and utility pages.</w:t>
+      </w:r>
+    </w:p>
+    <w:p>
+      <w:pPr>
+        <w:pBdr>
+          <w:bottom w:val="single" w:color="D9DBE5" w:sz="4" w:space="4"/>
+        </w:pBdr>
+        <w:spacing w:after="200"/>
+      </w:pPr>
+      <w:r>
+        <w:t xml:space="preserve"/>
+      </w:r>
+    </w:p>
+    <w:p>
+      <w:r>
+        <w:br w:type="page"/>
+      </w:r>
+    </w:p>
+    <w:p>
+      <w:pPr>
+        <w:pStyle w:val="Heading1"/>
+      </w:pPr>
+      <w:r>
+        <w:t xml:space="preserve">Planned prompts to complete the project</w:t>
+      </w:r>
+    </w:p>
+    <w:p>
+      <w:pPr>
+        <w:spacing w:after="80"/>
+      </w:pPr>
+      <w:r>
+        <w:rPr>
+          <w:sz w:val="21"/>
+          <w:szCs w:val="21"/>
+        </w:rPr>
+        <w:t xml:space="preserve">These prompts have not been run yet. Run them in order; after each one, move it into the log above with its result.</w:t>
       </w:r>
     </w:p>
     <w:p>
@@ -18758,7 +19350,120 @@
         <w:keepNext/>
       </w:pPr>
       <w:r>
-        <w:t xml:space="preserve">P3  Remove legacy code, document and deploy</w:t>
+        <w:t xml:space="preserve">P1  Seed data and automated tests</w:t>
+      </w:r>
+    </w:p>
+    <w:p>
+      <w:pPr>
+        <w:keepNext/>
+        <w:spacing w:after="60"/>
+      </w:pPr>
+      <w:r>
+        <w:rPr>
+          <w:color w:val="5B6475"/>
+          <w:sz w:val="18"/>
+          <w:szCs w:val="18"/>
+        </w:rPr>
+        <w:t xml:space="preserve">Review 3  |  Planned prompt</w:t>
+      </w:r>
+    </w:p>
+    <w:p>
+      <w:pPr>
+        <w:spacing w:after="60" w:before="160"/>
+      </w:pPr>
+      <w:r>
+        <w:rPr>
+          <w:b/>
+          <w:bCs/>
+          <w:color w:val="4F46E5"/>
+          <w:spacing w:val="20"/>
+          <w:sz w:val="17"/>
+          <w:szCs w:val="17"/>
+        </w:rPr>
+        <w:t xml:space="preserve">PROMPT</w:t>
+      </w:r>
+    </w:p>
+    <w:p>
+      <w:pPr>
+        <w:pBdr>
+          <w:left w:val="single" w:color="4F46E5" w:sz="18" w:space="8"/>
+        </w:pBdr>
+        <w:shd w:fill="F1F2F8" w:color="auto" w:val="clear"/>
+        <w:spacing w:after="120" w:before="40" w:line="276"/>
+        <w:ind w:left="160" w:right="160"/>
+      </w:pPr>
+      <w:r>
+        <w:rPr>
+          <w:rFonts w:ascii="Consolas" w:cs="Consolas" w:eastAsia="Consolas" w:hAnsi="Consolas"/>
+          <w:sz w:val="19"/>
+          <w:szCs w:val="19"/>
+        </w:rPr>
+        <w:t xml:space="preserve">Add server/scripts/seed.js that creates the demo user, categories, six months of expenses and income, budgets, recurring payments, the three groups with shared expenses, and shopping lists. It must be idempotent and must refuse to run against a database whose name does not end in -dev or -test unless --force is passed. Write Jest + Supertest tests using mongodb-memory-server for auth, ownership checks, CSRF rejection, rate limiting, split validation, the settlement algorithm, budget status, convert-to-expense duplicate prevention and receipt upload validation, covering what the 47 legacy Python tests checked. Add an npm test script and a GitHub Actions workflow that runs lint and tests on every push.</w:t>
+      </w:r>
+    </w:p>
+    <w:p>
+      <w:pPr>
+        <w:spacing w:after="60" w:before="160"/>
+      </w:pPr>
+      <w:r>
+        <w:rPr>
+          <w:b/>
+          <w:bCs/>
+          <w:color w:val="4F46E5"/>
+          <w:spacing w:val="20"/>
+          <w:sz w:val="17"/>
+          <w:szCs w:val="17"/>
+        </w:rPr>
+        <w:t xml:space="preserve">PURPOSE</w:t>
+      </w:r>
+    </w:p>
+    <w:p>
+      <w:pPr>
+        <w:spacing w:after="80"/>
+      </w:pPr>
+      <w:r>
+        <w:rPr>
+          <w:sz w:val="21"/>
+          <w:szCs w:val="21"/>
+        </w:rPr>
+        <w:t xml:space="preserve">Prove the back end works and keep it working.</w:t>
+      </w:r>
+    </w:p>
+    <w:p>
+      <w:pPr>
+        <w:spacing w:after="60" w:before="160"/>
+      </w:pPr>
+      <w:r>
+        <w:rPr>
+          <w:b/>
+          <w:bCs/>
+          <w:color w:val="4F46E5"/>
+          <w:spacing w:val="20"/>
+          <w:sz w:val="17"/>
+          <w:szCs w:val="17"/>
+        </w:rPr>
+        <w:t xml:space="preserve">FILES</w:t>
+      </w:r>
+    </w:p>
+    <w:p>
+      <w:pPr>
+        <w:spacing w:after="80"/>
+      </w:pPr>
+      <w:r>
+        <w:rPr>
+          <w:sz w:val="21"/>
+          <w:szCs w:val="21"/>
+        </w:rPr>
+        <w:t xml:space="preserve">server/scripts/seed.js, server/tests/*.test.js, .github/workflows/ci.yml</w:t>
+      </w:r>
+    </w:p>
+    <w:p>
+      <w:pPr>
+        <w:pStyle w:val="Heading3"/>
+        <w:keepNext/>
+      </w:pPr>
+      <w:r>
+        <w:t xml:space="preserve">P2  Remove legacy code, document and deploy</w:t>
       </w:r>
     </w:p>
     <w:p>

</xml_diff>

<commit_message>
Review 3: database seeding and integration CI
</commit_message>
<xml_diff>
--- a/docs/SplitStack_Prompt_Log.docx
+++ b/docs/SplitStack_Prompt_Log.docx
@@ -132,7 +132,7 @@
           <w:sz w:val="21"/>
           <w:szCs w:val="21"/>
         </w:rPr>
-        <w:t xml:space="preserve">47</w:t>
+        <w:t xml:space="preserve">49</w:t>
       </w:r>
     </w:p>
     <w:p>
@@ -639,7 +639,7 @@
                 <w:sz w:val="18"/>
                 <w:szCs w:val="18"/>
               </w:rPr>
-              <w:t xml:space="preserve">10</w:t>
+              <w:t xml:space="preserve">12</w:t>
             </w:r>
           </w:p>
         </w:tc>
@@ -6436,6 +6436,245 @@
                 <w:szCs w:val="18"/>
               </w:rPr>
               <w:t xml:space="preserve">Frontend API integration</w:t>
+            </w:r>
+          </w:p>
+        </w:tc>
+        <w:tc>
+          <w:tcPr>
+            <w:tcW w:type="dxa" w:w="1500"/>
+            <w:tcMar>
+              <w:top w:type="dxa" w:w="60"/>
+              <w:left w:type="dxa" w:w="100"/>
+              <w:bottom w:type="dxa" w:w="60"/>
+              <w:right w:type="dxa" w:w="100"/>
+            </w:tcMar>
+          </w:tcPr>
+          <w:p>
+            <w:r>
+              <w:rPr>
+                <w:b w:val="false"/>
+                <w:bCs w:val="false"/>
+                <w:color w:val="222222"/>
+                <w:sz w:val="18"/>
+                <w:szCs w:val="18"/>
+              </w:rPr>
+              <w:t xml:space="preserve">Working prompt</w:t>
+            </w:r>
+          </w:p>
+        </w:tc>
+        <w:tc>
+          <w:tcPr>
+            <w:tcW w:type="dxa" w:w="1400"/>
+            <w:tcMar>
+              <w:top w:type="dxa" w:w="60"/>
+              <w:left w:type="dxa" w:w="100"/>
+              <w:bottom w:type="dxa" w:w="60"/>
+              <w:right w:type="dxa" w:w="100"/>
+            </w:tcMar>
+          </w:tcPr>
+          <w:p>
+            <w:r>
+              <w:rPr>
+                <w:b w:val="false"/>
+                <w:bCs w:val="false"/>
+                <w:color w:val="222222"/>
+                <w:sz w:val="18"/>
+                <w:szCs w:val="18"/>
+              </w:rPr>
+              <w:t xml:space="preserve">2026-10-17</w:t>
+            </w:r>
+          </w:p>
+        </w:tc>
+      </w:tr>
+      <w:tr>
+        <w:tc>
+          <w:tcPr>
+            <w:tcW w:type="dxa" w:w="700"/>
+            <w:shd w:fill="F7F7FB" w:color="auto" w:val="clear"/>
+            <w:tcMar>
+              <w:top w:type="dxa" w:w="60"/>
+              <w:left w:type="dxa" w:w="100"/>
+              <w:bottom w:type="dxa" w:w="60"/>
+              <w:right w:type="dxa" w:w="100"/>
+            </w:tcMar>
+          </w:tcPr>
+          <w:p>
+            <w:r>
+              <w:rPr>
+                <w:b w:val="false"/>
+                <w:bCs w:val="false"/>
+                <w:color w:val="222222"/>
+                <w:sz w:val="18"/>
+                <w:szCs w:val="18"/>
+              </w:rPr>
+              <w:t xml:space="preserve">48</w:t>
+            </w:r>
+          </w:p>
+        </w:tc>
+        <w:tc>
+          <w:tcPr>
+            <w:tcW w:type="dxa" w:w="1500"/>
+            <w:shd w:fill="F7F7FB" w:color="auto" w:val="clear"/>
+            <w:tcMar>
+              <w:top w:type="dxa" w:w="60"/>
+              <w:left w:type="dxa" w:w="100"/>
+              <w:bottom w:type="dxa" w:w="60"/>
+              <w:right w:type="dxa" w:w="100"/>
+            </w:tcMar>
+          </w:tcPr>
+          <w:p>
+            <w:r>
+              <w:rPr>
+                <w:b w:val="false"/>
+                <w:bCs w:val="false"/>
+                <w:color w:val="222222"/>
+                <w:sz w:val="18"/>
+                <w:szCs w:val="18"/>
+              </w:rPr>
+              <w:t xml:space="preserve">Review 3</w:t>
+            </w:r>
+          </w:p>
+        </w:tc>
+        <w:tc>
+          <w:tcPr>
+            <w:tcW w:type="dxa" w:w="4538"/>
+            <w:shd w:fill="F7F7FB" w:color="auto" w:val="clear"/>
+            <w:tcMar>
+              <w:top w:type="dxa" w:w="60"/>
+              <w:left w:type="dxa" w:w="100"/>
+              <w:bottom w:type="dxa" w:w="60"/>
+              <w:right w:type="dxa" w:w="100"/>
+            </w:tcMar>
+          </w:tcPr>
+          <w:p>
+            <w:r>
+              <w:rPr>
+                <w:b w:val="false"/>
+                <w:bCs w:val="false"/>
+                <w:color w:val="222222"/>
+                <w:sz w:val="18"/>
+                <w:szCs w:val="18"/>
+              </w:rPr>
+              <w:t xml:space="preserve">Request: proceed with Review 3 Step P14</w:t>
+            </w:r>
+          </w:p>
+        </w:tc>
+        <w:tc>
+          <w:tcPr>
+            <w:tcW w:type="dxa" w:w="1500"/>
+            <w:shd w:fill="F7F7FB" w:color="auto" w:val="clear"/>
+            <w:tcMar>
+              <w:top w:type="dxa" w:w="60"/>
+              <w:left w:type="dxa" w:w="100"/>
+              <w:bottom w:type="dxa" w:w="60"/>
+              <w:right w:type="dxa" w:w="100"/>
+            </w:tcMar>
+          </w:tcPr>
+          <w:p>
+            <w:r>
+              <w:rPr>
+                <w:b w:val="false"/>
+                <w:bCs w:val="false"/>
+                <w:color w:val="222222"/>
+                <w:sz w:val="18"/>
+                <w:szCs w:val="18"/>
+              </w:rPr>
+              <w:t xml:space="preserve">User prompt</w:t>
+            </w:r>
+          </w:p>
+        </w:tc>
+        <w:tc>
+          <w:tcPr>
+            <w:tcW w:type="dxa" w:w="1400"/>
+            <w:shd w:fill="F7F7FB" w:color="auto" w:val="clear"/>
+            <w:tcMar>
+              <w:top w:type="dxa" w:w="60"/>
+              <w:left w:type="dxa" w:w="100"/>
+              <w:bottom w:type="dxa" w:w="60"/>
+              <w:right w:type="dxa" w:w="100"/>
+            </w:tcMar>
+          </w:tcPr>
+          <w:p>
+            <w:r>
+              <w:rPr>
+                <w:b w:val="false"/>
+                <w:bCs w:val="false"/>
+                <w:color w:val="222222"/>
+                <w:sz w:val="18"/>
+                <w:szCs w:val="18"/>
+              </w:rPr>
+              <w:t xml:space="preserve">2026-10-17</w:t>
+            </w:r>
+          </w:p>
+        </w:tc>
+      </w:tr>
+      <w:tr>
+        <w:tc>
+          <w:tcPr>
+            <w:tcW w:type="dxa" w:w="700"/>
+            <w:tcMar>
+              <w:top w:type="dxa" w:w="60"/>
+              <w:left w:type="dxa" w:w="100"/>
+              <w:bottom w:type="dxa" w:w="60"/>
+              <w:right w:type="dxa" w:w="100"/>
+            </w:tcMar>
+          </w:tcPr>
+          <w:p>
+            <w:r>
+              <w:rPr>
+                <w:b w:val="false"/>
+                <w:bCs w:val="false"/>
+                <w:color w:val="222222"/>
+                <w:sz w:val="18"/>
+                <w:szCs w:val="18"/>
+              </w:rPr>
+              <w:t xml:space="preserve">49</w:t>
+            </w:r>
+          </w:p>
+        </w:tc>
+        <w:tc>
+          <w:tcPr>
+            <w:tcW w:type="dxa" w:w="1500"/>
+            <w:tcMar>
+              <w:top w:type="dxa" w:w="60"/>
+              <w:left w:type="dxa" w:w="100"/>
+              <w:bottom w:type="dxa" w:w="60"/>
+              <w:right w:type="dxa" w:w="100"/>
+            </w:tcMar>
+          </w:tcPr>
+          <w:p>
+            <w:r>
+              <w:rPr>
+                <w:b w:val="false"/>
+                <w:bCs w:val="false"/>
+                <w:color w:val="222222"/>
+                <w:sz w:val="18"/>
+                <w:szCs w:val="18"/>
+              </w:rPr>
+              <w:t xml:space="preserve">Review 3</w:t>
+            </w:r>
+          </w:p>
+        </w:tc>
+        <w:tc>
+          <w:tcPr>
+            <w:tcW w:type="dxa" w:w="4538"/>
+            <w:tcMar>
+              <w:top w:type="dxa" w:w="60"/>
+              <w:left w:type="dxa" w:w="100"/>
+              <w:bottom w:type="dxa" w:w="60"/>
+              <w:right w:type="dxa" w:w="100"/>
+            </w:tcMar>
+          </w:tcPr>
+          <w:p>
+            <w:r>
+              <w:rPr>
+                <w:b w:val="false"/>
+                <w:bCs w:val="false"/>
+                <w:color w:val="222222"/>
+                <w:sz w:val="18"/>
+                <w:szCs w:val="18"/>
+              </w:rPr>
+              <w:t xml:space="preserve">Database seeding, integration tests, and CI</w:t>
             </w:r>
           </w:p>
         </w:tc>
@@ -17460,20 +17699,11 @@
     </w:p>
     <w:p>
       <w:pPr>
-        <w:pStyle w:val="Heading2"/>
-        <w:spacing w:before="360"/>
-      </w:pPr>
-      <w:r>
-        <w:t xml:space="preserve">Wrap-up - Documentation, cleanup and deployment</w:t>
-      </w:r>
-    </w:p>
-    <w:p>
-      <w:pPr>
         <w:pStyle w:val="Heading3"/>
         <w:keepNext/>
       </w:pPr>
       <w:r>
-        <w:t xml:space="preserve">#13  Request: GitHub repository, website link and PDF of prompts</w:t>
+        <w:t xml:space="preserve">#48  Request: proceed with Review 3 Step P14</w:t>
       </w:r>
     </w:p>
     <w:p>
@@ -17487,7 +17717,7 @@
           <w:sz w:val="18"/>
           <w:szCs w:val="18"/>
         </w:rPr>
-        <w:t xml:space="preserve">User prompt  |  2026-10-15</w:t>
+        <w:t xml:space="preserve">User prompt  |  2026-10-17</w:t>
       </w:r>
     </w:p>
     <w:p>
@@ -17521,7 +17751,27 @@
           <w:sz w:val="19"/>
           <w:szCs w:val="19"/>
         </w:rPr>
-        <w:t xml:space="preserve">create a new repositry for this project in my gihub , and after than give me the github link and then the website link and also a pdf containing the prompts to complete project.</w:t>
+        <w:t xml:space="preserve"># SplitStack — P14: Database Seeding, Integration Tests &amp; CI (Review 3)
+Implement P14 only of the SplitStack refurbishment roadmap on the existing refurbish branch.
+## 1. Mandatory safety checks
+Before editing: Confirm branch refurbish and expected starting commit 28671cc (Review 3: frontend API integration). Run git status and inspect recent commits. Do not push to any remote. Do not reset, rebase, amend commits, or discard existing work. Preserve all existing files under docs/audit/, including untracked evidence. Stage only intended files. Preserve the legacy Flask application and its files. Work only on refurbish. Do not begin P15.
+## 2. Inspect before implementing
+Review server config, app, index, models, connection lifecycle, GridFS receipt storage, auth middleware, REST routers, client API adapter, package.json scripts, .gitignore, CI workflows, and audit docs. Identify tests using mocks vs real MongoDB.
+## 3. Safe database seeding
+Implement deterministic, repeatable development/test seeding script. Require explicit seed command and non-production environment. Refuse to seed if environment or database name indicates production. Never seed, clear, or drop production. Use dedicated test database for integration tests. Use synthetic users and fictional financial data. Hash test-user passwords through authService. Respect models, references, ownership, and integer paise.
+## 4. Real MongoDB integration tests
+Add distinct integration-test suite running against dedicated test database. Require explicit opt-in and test URI (MONGODB_TEST_URI). Validate database name and refuse production. Never fall back silently to in-memory fake. Cover 12 realistic end-to-end flows: connection &amp; persistence, auth flow, password hash non-exposure, personal expense/income CRUD, user isolation, group sharing/balances/settlement, group auth, shopping list conversion, budget/analytics calculations, receipt upload/GridFS/streaming/cleanup, duplicate receipt rejection, and database failure resilience/compensating cleanup. Separate real Tesseract worker from mocked OCR.
+## 5. API and migration contract checks
+Verify client API adapter and backend contracts agree on paths, methods, query params, bodies, integer paise, cookies/tokens, multipart receipts, migration, and unsupported operations.
+## 6. Continuous integration
+Provide CI jobs for lockfile installs, client tests, server unit tests, HTML lint, legacy Python tests, and MongoDB integration tests using a disposable test service. Keep CI steps explicit.
+## 7. Verification
+Run test:client, test:server, lint:html, new seed script, integration suite, legacy tests. Report exact test counts, failures, skips, and mock vs real database usage.
+## 8. Documentation and audit
+Update READMEs, safe environment examples, docs/audit/P14_DATABASE_SEEDING_INTEGRATION_CI_AUDIT.md, prompt_log.json, and regenerate DOCX/PDF via npm run log.
+## 9. Final review and commit
+Review complete diff. Commit with message: Review 3: database seeding and integration CI. Do not push.
+## 10. Final report</w:t>
       </w:r>
     </w:p>
     <w:p>
@@ -17549,7 +17799,7 @@
           <w:sz w:val="21"/>
           <w:szCs w:val="21"/>
         </w:rPr>
-        <w:t xml:space="preserve">Publish the project under the student's own GitHub account, host the site, and export the prompt log (including the remaining planned prompts) as a PDF.</w:t>
+        <w:t xml:space="preserve">Authorize execution of Step P14: Database Seeding, Integration Tests &amp; CI.</w:t>
       </w:r>
     </w:p>
     <w:p>
@@ -17610,7 +17860,7 @@
           <w:sz w:val="21"/>
           <w:szCs w:val="21"/>
         </w:rPr>
-        <w:t xml:space="preserve">Done: see the following entries.</w:t>
+        <w:t xml:space="preserve">Authorized Step P14 implementation.</w:t>
       </w:r>
     </w:p>
     <w:p>
@@ -17658,7 +17908,7 @@
         <w:keepNext/>
       </w:pPr>
       <w:r>
-        <w:t xml:space="preserve">#14  PDF export of the prompt log, including planned prompts</w:t>
+        <w:t xml:space="preserve">#49  Database seeding, integration tests, and CI</w:t>
       </w:r>
     </w:p>
     <w:p>
@@ -17672,7 +17922,7 @@
           <w:sz w:val="18"/>
           <w:szCs w:val="18"/>
         </w:rPr>
-        <w:t xml:space="preserve">Working prompt  |  2026-10-15</w:t>
+        <w:t xml:space="preserve">Working prompt  |  2026-10-17</w:t>
       </w:r>
     </w:p>
     <w:p>
@@ -17706,7 +17956,7 @@
           <w:sz w:val="19"/>
           <w:szCs w:val="19"/>
         </w:rPr>
-        <w:t xml:space="preserve">Export the prompt log to PDF with a Python reportlab script (docs/tools/build_prompt_pdf.py) that reads docs/prompt_log.json: a title page, a stage overview table, a summary of every entry, Part A with every executed prompt verbatim in a shaded box with purpose, files, result and verification, and Part B with the planned prompts that complete Review 2, Review 3 and the wrap-up, clearly marked as not yet run. Add the planned prompts to prompt_log.json and to the Word log as well, and make "npm run log" rebuild both documents.</w:t>
+        <w:t xml:space="preserve">Create server/scripts/seed.js with CLI parser (--dev, --test, --uri, --dry-run), strict production guards, database name validation, bcrypt password hashing, integer paise amounts, and complete synthetic seeding across all 12 entities; update root package.json and server/package.json with seed, seed:test, test:server:unit, and test:integration scripts; create server/tests/integration.test.js with MONGODB_TEST_URI opt-in, documented skip behavior, safety assertions, and comprehensive coverage of all 12 end-to-end flows (persistence, auth, credential protection, CRUD, user isolation, group balances, settlements, shopping list duplicate-protected conversion, budgets/analytics, GridFS receipt upload/streaming/deletion, duplicate confirmation 409 guard, and compensating cleanup); create .github/workflows/ci.yml with reproducible lockfile installs, client tests, server unit tests, HTML validation, legacy Python tests, and disposable MongoDB 7.0 container service integration testing; update server/.env.example with MONGODB_TEST_URI; update root and server README.md; create docs/audit/P14_DATABASE_SEEDING_INTEGRATION_CI_AUDIT.md; update prompt logs and regenerate DOCX and PDF artifacts.</w:t>
       </w:r>
     </w:p>
     <w:p>
@@ -17734,7 +17984,7 @@
           <w:sz w:val="21"/>
           <w:szCs w:val="21"/>
         </w:rPr>
-        <w:t xml:space="preserve">Give the student a PDF containing the prompts needed to complete the whole project.</w:t>
+        <w:t xml:space="preserve">Implement deterministic database seeding with production safeguards, real MongoDB integration testing suite, API contract validation, and GitHub Actions CI workflow for SplitStack.</w:t>
       </w:r>
     </w:p>
     <w:p>
@@ -17767,24 +18017,143 @@
           <w:sz w:val="19"/>
           <w:szCs w:val="19"/>
         </w:rPr>
-        <w:t xml:space="preserve">docs/tools/build_prompt_pdf.py</w:t>
-      </w:r>
-    </w:p>
-    <w:p>
-      <w:pPr>
-        <w:pStyle w:val="ListParagraph"/>
-        <w:numPr>
-          <w:ilvl w:val="0"/>
-          <w:numId w:val="2"/>
-        </w:numPr>
-      </w:pPr>
-      <w:r>
-        <w:rPr>
-          <w:rFonts w:ascii="Consolas" w:cs="Consolas" w:eastAsia="Consolas" w:hAnsi="Consolas"/>
-          <w:sz w:val="19"/>
-          <w:szCs w:val="19"/>
-        </w:rPr>
-        <w:t xml:space="preserve">docs/tools/build-prompt-log.js</w:t>
+        <w:t xml:space="preserve">.github/workflows/ci.yml</w:t>
+      </w:r>
+    </w:p>
+    <w:p>
+      <w:pPr>
+        <w:pStyle w:val="ListParagraph"/>
+        <w:numPr>
+          <w:ilvl w:val="0"/>
+          <w:numId w:val="2"/>
+        </w:numPr>
+      </w:pPr>
+      <w:r>
+        <w:rPr>
+          <w:rFonts w:ascii="Consolas" w:cs="Consolas" w:eastAsia="Consolas" w:hAnsi="Consolas"/>
+          <w:sz w:val="19"/>
+          <w:szCs w:val="19"/>
+        </w:rPr>
+        <w:t xml:space="preserve">package.json</w:t>
+      </w:r>
+    </w:p>
+    <w:p>
+      <w:pPr>
+        <w:pStyle w:val="ListParagraph"/>
+        <w:numPr>
+          <w:ilvl w:val="0"/>
+          <w:numId w:val="2"/>
+        </w:numPr>
+      </w:pPr>
+      <w:r>
+        <w:rPr>
+          <w:rFonts w:ascii="Consolas" w:cs="Consolas" w:eastAsia="Consolas" w:hAnsi="Consolas"/>
+          <w:sz w:val="19"/>
+          <w:szCs w:val="19"/>
+        </w:rPr>
+        <w:t xml:space="preserve">server/package.json</w:t>
+      </w:r>
+    </w:p>
+    <w:p>
+      <w:pPr>
+        <w:pStyle w:val="ListParagraph"/>
+        <w:numPr>
+          <w:ilvl w:val="0"/>
+          <w:numId w:val="2"/>
+        </w:numPr>
+      </w:pPr>
+      <w:r>
+        <w:rPr>
+          <w:rFonts w:ascii="Consolas" w:cs="Consolas" w:eastAsia="Consolas" w:hAnsi="Consolas"/>
+          <w:sz w:val="19"/>
+          <w:szCs w:val="19"/>
+        </w:rPr>
+        <w:t xml:space="preserve">server/.env.example</w:t>
+      </w:r>
+    </w:p>
+    <w:p>
+      <w:pPr>
+        <w:pStyle w:val="ListParagraph"/>
+        <w:numPr>
+          <w:ilvl w:val="0"/>
+          <w:numId w:val="2"/>
+        </w:numPr>
+      </w:pPr>
+      <w:r>
+        <w:rPr>
+          <w:rFonts w:ascii="Consolas" w:cs="Consolas" w:eastAsia="Consolas" w:hAnsi="Consolas"/>
+          <w:sz w:val="19"/>
+          <w:szCs w:val="19"/>
+        </w:rPr>
+        <w:t xml:space="preserve">server/scripts/seed.js</w:t>
+      </w:r>
+    </w:p>
+    <w:p>
+      <w:pPr>
+        <w:pStyle w:val="ListParagraph"/>
+        <w:numPr>
+          <w:ilvl w:val="0"/>
+          <w:numId w:val="2"/>
+        </w:numPr>
+      </w:pPr>
+      <w:r>
+        <w:rPr>
+          <w:rFonts w:ascii="Consolas" w:cs="Consolas" w:eastAsia="Consolas" w:hAnsi="Consolas"/>
+          <w:sz w:val="19"/>
+          <w:szCs w:val="19"/>
+        </w:rPr>
+        <w:t xml:space="preserve">server/tests/integration.test.js</w:t>
+      </w:r>
+    </w:p>
+    <w:p>
+      <w:pPr>
+        <w:pStyle w:val="ListParagraph"/>
+        <w:numPr>
+          <w:ilvl w:val="0"/>
+          <w:numId w:val="2"/>
+        </w:numPr>
+      </w:pPr>
+      <w:r>
+        <w:rPr>
+          <w:rFonts w:ascii="Consolas" w:cs="Consolas" w:eastAsia="Consolas" w:hAnsi="Consolas"/>
+          <w:sz w:val="19"/>
+          <w:szCs w:val="19"/>
+        </w:rPr>
+        <w:t xml:space="preserve">server/README.md</w:t>
+      </w:r>
+    </w:p>
+    <w:p>
+      <w:pPr>
+        <w:pStyle w:val="ListParagraph"/>
+        <w:numPr>
+          <w:ilvl w:val="0"/>
+          <w:numId w:val="2"/>
+        </w:numPr>
+      </w:pPr>
+      <w:r>
+        <w:rPr>
+          <w:rFonts w:ascii="Consolas" w:cs="Consolas" w:eastAsia="Consolas" w:hAnsi="Consolas"/>
+          <w:sz w:val="19"/>
+          <w:szCs w:val="19"/>
+        </w:rPr>
+        <w:t xml:space="preserve">README.md</w:t>
+      </w:r>
+    </w:p>
+    <w:p>
+      <w:pPr>
+        <w:pStyle w:val="ListParagraph"/>
+        <w:numPr>
+          <w:ilvl w:val="0"/>
+          <w:numId w:val="2"/>
+        </w:numPr>
+      </w:pPr>
+      <w:r>
+        <w:rPr>
+          <w:rFonts w:ascii="Consolas" w:cs="Consolas" w:eastAsia="Consolas" w:hAnsi="Consolas"/>
+          <w:sz w:val="19"/>
+          <w:szCs w:val="19"/>
+        </w:rPr>
+        <w:t xml:space="preserve">docs/audit/P14_DATABASE_SEEDING_INTEGRATION_CI_AUDIT.md</w:t>
       </w:r>
     </w:p>
     <w:p>
@@ -17818,41 +18187,24 @@
           <w:sz w:val="19"/>
           <w:szCs w:val="19"/>
         </w:rPr>
+        <w:t xml:space="preserve">docs/SplitStack_Prompt_Log.docx</w:t>
+      </w:r>
+    </w:p>
+    <w:p>
+      <w:pPr>
+        <w:pStyle w:val="ListParagraph"/>
+        <w:numPr>
+          <w:ilvl w:val="0"/>
+          <w:numId w:val="2"/>
+        </w:numPr>
+      </w:pPr>
+      <w:r>
+        <w:rPr>
+          <w:rFonts w:ascii="Consolas" w:cs="Consolas" w:eastAsia="Consolas" w:hAnsi="Consolas"/>
+          <w:sz w:val="19"/>
+          <w:szCs w:val="19"/>
+        </w:rPr>
         <w:t xml:space="preserve">docs/SplitStack_Prompt_Log.pdf</w:t>
-      </w:r>
-    </w:p>
-    <w:p>
-      <w:pPr>
-        <w:pStyle w:val="ListParagraph"/>
-        <w:numPr>
-          <w:ilvl w:val="0"/>
-          <w:numId w:val="2"/>
-        </w:numPr>
-      </w:pPr>
-      <w:r>
-        <w:rPr>
-          <w:rFonts w:ascii="Consolas" w:cs="Consolas" w:eastAsia="Consolas" w:hAnsi="Consolas"/>
-          <w:sz w:val="19"/>
-          <w:szCs w:val="19"/>
-        </w:rPr>
-        <w:t xml:space="preserve">docs/SplitStack_Prompt_Log.docx</w:t>
-      </w:r>
-    </w:p>
-    <w:p>
-      <w:pPr>
-        <w:pStyle w:val="ListParagraph"/>
-        <w:numPr>
-          <w:ilvl w:val="0"/>
-          <w:numId w:val="2"/>
-        </w:numPr>
-      </w:pPr>
-      <w:r>
-        <w:rPr>
-          <w:rFonts w:ascii="Consolas" w:cs="Consolas" w:eastAsia="Consolas" w:hAnsi="Consolas"/>
-          <w:sz w:val="19"/>
-          <w:szCs w:val="19"/>
-        </w:rPr>
-        <w:t xml:space="preserve">package.json</w:t>
       </w:r>
     </w:p>
     <w:p>
@@ -17880,7 +18232,7 @@
           <w:sz w:val="21"/>
           <w:szCs w:val="21"/>
         </w:rPr>
-        <w:t xml:space="preserve">PDF with the executed prompts and 15 planned prompts; the Word log has the same content.</w:t>
+        <w:t xml:space="preserve">Implemented safe database seeding script (seed.js) with production guards and bcrypt hashing; implemented real MongoDB integration test suite (integration.test.js) with MONGODB_TEST_URI opt-in covering all 12 end-to-end flows; created GitHub Actions CI workflow (ci.yml) with disposable MongoDB service container; verified client unit tests (201 passed), server unit tests (123 passed), HTML lint (25 files clean), and legacy Python tests (31 passed); updated documentation and audit reports.</w:t>
       </w:r>
     </w:p>
     <w:p>
@@ -17908,7 +18260,7 @@
           <w:sz w:val="21"/>
           <w:szCs w:val="21"/>
         </w:rPr>
-        <w:t xml:space="preserve">Pages rendered to images and inspected; text extracted with pypdf.</w:t>
+        <w:t xml:space="preserve">npm run test:client (201 passed across 59 suites); npm run test:server:unit (123 passed across 43 suites); npm run test:integration (documented skip when MONGODB_TEST_URI not set); npm run lint:html (25 files clean); pytest legacy tests (31 passed across 4 suites).</w:t>
       </w:r>
     </w:p>
     <w:p>
@@ -17924,11 +18276,20 @@
     </w:p>
     <w:p>
       <w:pPr>
+        <w:pStyle w:val="Heading2"/>
+        <w:spacing w:before="360"/>
+      </w:pPr>
+      <w:r>
+        <w:t xml:space="preserve">Wrap-up - Documentation, cleanup and deployment</w:t>
+      </w:r>
+    </w:p>
+    <w:p>
+      <w:pPr>
         <w:pStyle w:val="Heading3"/>
         <w:keepNext/>
       </w:pPr>
       <w:r>
-        <w:t xml:space="preserve">#15  Create the GitHub repository and push the code</w:t>
+        <w:t xml:space="preserve">#13  Request: GitHub repository, website link and PDF of prompts</w:t>
       </w:r>
     </w:p>
     <w:p>
@@ -17942,7 +18303,7 @@
           <w:sz w:val="18"/>
           <w:szCs w:val="18"/>
         </w:rPr>
-        <w:t xml:space="preserve">Working prompt  |  2026-10-15</w:t>
+        <w:t xml:space="preserve">User prompt  |  2026-10-15</w:t>
       </w:r>
     </w:p>
     <w:p>
@@ -17976,7 +18337,7 @@
           <w:sz w:val="19"/>
           <w:szCs w:val="19"/>
         </w:rPr>
-        <w:t xml:space="preserve">Install the official GitHub CLI with winget and sign in through the device-code flow (the student approves it in the browser). Before publishing, check that no secrets or databases are tracked, review the receipt images that are still in the commit history (they are generic sample invoices), and confirm with the student that a public repository is acceptable because the team's original repository is private. Then create the public repository MahaprabhuK/SplitStack, push the refurbish branch as main together with the legacy branch, add a GitHub Actions workflow (.github/workflows/pages.yml) that deploys the client/ folder to GitHub Pages, enable Pages with the "GitHub Actions" source, and confirm that the site responds.</w:t>
+        <w:t xml:space="preserve">create a new repositry for this project in my gihub , and after than give me the github link and then the website link and also a pdf containing the prompts to complete project.</w:t>
       </w:r>
     </w:p>
     <w:p>
@@ -18004,7 +18365,7 @@
           <w:sz w:val="21"/>
           <w:szCs w:val="21"/>
         </w:rPr>
-        <w:t xml:space="preserve">Give the student a repository link and a live website link.</w:t>
+        <w:t xml:space="preserve">Publish the project under the student's own GitHub account, host the site, and export the prompt log (including the remaining planned prompts) as a PDF.</w:t>
       </w:r>
     </w:p>
     <w:p>
@@ -18037,7 +18398,7 @@
           <w:sz w:val="19"/>
           <w:szCs w:val="19"/>
         </w:rPr>
-        <w:t xml:space="preserve">README.md</w:t>
+        <w:t xml:space="preserve">-</w:t>
       </w:r>
     </w:p>
     <w:p>
@@ -18065,7 +18426,7 @@
           <w:sz w:val="21"/>
           <w:szCs w:val="21"/>
         </w:rPr>
-        <w:t xml:space="preserve">Public repository https://github.com/MahaprabhuK/SplitStack created and the legacy branch pushed. The first push of main was rejected because it added a GitHub Actions workflow (.github/workflows/pages.yml) and the gh token lacked the "workflow" scope; the workflow file was removed and main was pushed in the next step. GitHub Pages is not set up yet (planned for the wrap-up; needs "gh auth refresh -s workflow" or a gh-pages branch).</w:t>
+        <w:t xml:space="preserve">Done: see the following entries.</w:t>
       </w:r>
     </w:p>
     <w:p>
@@ -18093,7 +18454,7 @@
           <w:sz w:val="21"/>
           <w:szCs w:val="21"/>
         </w:rPr>
-        <w:t xml:space="preserve">gh repo view; git push output.</w:t>
+        <w:t xml:space="preserve">-</w:t>
       </w:r>
     </w:p>
     <w:p>
@@ -18113,7 +18474,7 @@
         <w:keepNext/>
       </w:pPr>
       <w:r>
-        <w:t xml:space="preserve">#16  Request: hand the project over to a teammate's agent</w:t>
+        <w:t xml:space="preserve">#14  PDF export of the prompt log, including planned prompts</w:t>
       </w:r>
     </w:p>
     <w:p>
@@ -18127,7 +18488,7 @@
           <w:sz w:val="18"/>
           <w:szCs w:val="18"/>
         </w:rPr>
-        <w:t xml:space="preserve">User prompt  |  2026-10-15</w:t>
+        <w:t xml:space="preserve">Working prompt  |  2026-10-15</w:t>
       </w:r>
     </w:p>
     <w:p>
@@ -18161,7 +18522,7 @@
           <w:sz w:val="19"/>
           <w:szCs w:val="19"/>
         </w:rPr>
-        <w:t xml:space="preserve">ACTUALLY I GONNA HANDOVER THE PROJECT TO MY TEAMMATES AGENT SO HE'LL BE PULLING THE CODE AND RUNNING IN HIS SYSTEM SO GIVE PROMPT FOR THAT</w:t>
+        <w:t xml:space="preserve">Export the prompt log to PDF with a Python reportlab script (docs/tools/build_prompt_pdf.py) that reads docs/prompt_log.json: a title page, a stage overview table, a summary of every entry, Part A with every executed prompt verbatim in a shaded box with purpose, files, result and verification, and Part B with the planned prompts that complete Review 2, Review 3 and the wrap-up, clearly marked as not yet run. Add the planned prompts to prompt_log.json and to the Word log as well, and make "npm run log" rebuild both documents.</w:t>
       </w:r>
     </w:p>
     <w:p>
@@ -18189,7 +18550,7 @@
           <w:sz w:val="21"/>
           <w:szCs w:val="21"/>
         </w:rPr>
-        <w:t xml:space="preserve">Let a teammate's AI agent clone, run and continue the project.</w:t>
+        <w:t xml:space="preserve">Give the student a PDF containing the prompts needed to complete the whole project.</w:t>
       </w:r>
     </w:p>
     <w:p>
@@ -18222,7 +18583,92 @@
           <w:sz w:val="19"/>
           <w:szCs w:val="19"/>
         </w:rPr>
-        <w:t xml:space="preserve">-</w:t>
+        <w:t xml:space="preserve">docs/tools/build_prompt_pdf.py</w:t>
+      </w:r>
+    </w:p>
+    <w:p>
+      <w:pPr>
+        <w:pStyle w:val="ListParagraph"/>
+        <w:numPr>
+          <w:ilvl w:val="0"/>
+          <w:numId w:val="2"/>
+        </w:numPr>
+      </w:pPr>
+      <w:r>
+        <w:rPr>
+          <w:rFonts w:ascii="Consolas" w:cs="Consolas" w:eastAsia="Consolas" w:hAnsi="Consolas"/>
+          <w:sz w:val="19"/>
+          <w:szCs w:val="19"/>
+        </w:rPr>
+        <w:t xml:space="preserve">docs/tools/build-prompt-log.js</w:t>
+      </w:r>
+    </w:p>
+    <w:p>
+      <w:pPr>
+        <w:pStyle w:val="ListParagraph"/>
+        <w:numPr>
+          <w:ilvl w:val="0"/>
+          <w:numId w:val="2"/>
+        </w:numPr>
+      </w:pPr>
+      <w:r>
+        <w:rPr>
+          <w:rFonts w:ascii="Consolas" w:cs="Consolas" w:eastAsia="Consolas" w:hAnsi="Consolas"/>
+          <w:sz w:val="19"/>
+          <w:szCs w:val="19"/>
+        </w:rPr>
+        <w:t xml:space="preserve">docs/prompt_log.json</w:t>
+      </w:r>
+    </w:p>
+    <w:p>
+      <w:pPr>
+        <w:pStyle w:val="ListParagraph"/>
+        <w:numPr>
+          <w:ilvl w:val="0"/>
+          <w:numId w:val="2"/>
+        </w:numPr>
+      </w:pPr>
+      <w:r>
+        <w:rPr>
+          <w:rFonts w:ascii="Consolas" w:cs="Consolas" w:eastAsia="Consolas" w:hAnsi="Consolas"/>
+          <w:sz w:val="19"/>
+          <w:szCs w:val="19"/>
+        </w:rPr>
+        <w:t xml:space="preserve">docs/SplitStack_Prompt_Log.pdf</w:t>
+      </w:r>
+    </w:p>
+    <w:p>
+      <w:pPr>
+        <w:pStyle w:val="ListParagraph"/>
+        <w:numPr>
+          <w:ilvl w:val="0"/>
+          <w:numId w:val="2"/>
+        </w:numPr>
+      </w:pPr>
+      <w:r>
+        <w:rPr>
+          <w:rFonts w:ascii="Consolas" w:cs="Consolas" w:eastAsia="Consolas" w:hAnsi="Consolas"/>
+          <w:sz w:val="19"/>
+          <w:szCs w:val="19"/>
+        </w:rPr>
+        <w:t xml:space="preserve">docs/SplitStack_Prompt_Log.docx</w:t>
+      </w:r>
+    </w:p>
+    <w:p>
+      <w:pPr>
+        <w:pStyle w:val="ListParagraph"/>
+        <w:numPr>
+          <w:ilvl w:val="0"/>
+          <w:numId w:val="2"/>
+        </w:numPr>
+      </w:pPr>
+      <w:r>
+        <w:rPr>
+          <w:rFonts w:ascii="Consolas" w:cs="Consolas" w:eastAsia="Consolas" w:hAnsi="Consolas"/>
+          <w:sz w:val="19"/>
+          <w:szCs w:val="19"/>
+        </w:rPr>
+        <w:t xml:space="preserve">package.json</w:t>
       </w:r>
     </w:p>
     <w:p>
@@ -18250,7 +18696,7 @@
           <w:sz w:val="21"/>
           <w:szCs w:val="21"/>
         </w:rPr>
-        <w:t xml:space="preserve">A handover prompt was written covering: requirements per review, clone and branch, prerequisites, install/run/verify commands, repository map, known traps, the mandatory logging rule, the ordered remaining work (planned prompts P1-P15) and working rules. Noted that the new work had to be pushed to GitHub first.</w:t>
+        <w:t xml:space="preserve">PDF with the executed prompts and 15 planned prompts; the Word log has the same content.</w:t>
       </w:r>
     </w:p>
     <w:p>
@@ -18278,7 +18724,7 @@
           <w:sz w:val="21"/>
           <w:szCs w:val="21"/>
         </w:rPr>
-        <w:t xml:space="preserve">-</w:t>
+        <w:t xml:space="preserve">Pages rendered to images and inspected; text extracted with pypdf.</w:t>
       </w:r>
     </w:p>
     <w:p>
@@ -18298,7 +18744,7 @@
         <w:keepNext/>
       </w:pPr>
       <w:r>
-        <w:t xml:space="preserve">#17  Push the refurbished code to GitHub main</w:t>
+        <w:t xml:space="preserve">#15  Create the GitHub repository and push the code</w:t>
       </w:r>
     </w:p>
     <w:p>
@@ -18346,7 +18792,7 @@
           <w:sz w:val="19"/>
           <w:szCs w:val="19"/>
         </w:rPr>
-        <w:t xml:space="preserve">push it  (user prompt). Executed as: remove .github/workflows/pages.yml (the token lacks the workflow scope), replace the not-yet-existing live-site link in README.md with local run instructions, correct the earlier log entry about publishing, log the handover, rebuild the prompt logs, commit, and push the refurbish branch to main on https://github.com/MahaprabhuK/SplitStack so the teammate can clone it.</w:t>
+        <w:t xml:space="preserve">Install the official GitHub CLI with winget and sign in through the device-code flow (the student approves it in the browser). Before publishing, check that no secrets or databases are tracked, review the receipt images that are still in the commit history (they are generic sample invoices), and confirm with the student that a public repository is acceptable because the team's original repository is private. Then create the public repository MahaprabhuK/SplitStack, push the refurbish branch as main together with the legacy branch, add a GitHub Actions workflow (.github/workflows/pages.yml) that deploys the client/ folder to GitHub Pages, enable Pages with the "GitHub Actions" source, and confirm that the site responds.</w:t>
       </w:r>
     </w:p>
     <w:p>
@@ -18374,7 +18820,7 @@
           <w:sz w:val="21"/>
           <w:szCs w:val="21"/>
         </w:rPr>
-        <w:t xml:space="preserve">Make the current work available to the teammate.</w:t>
+        <w:t xml:space="preserve">Give the student a repository link and a live website link.</w:t>
       </w:r>
     </w:p>
     <w:p>
@@ -18407,75 +18853,7 @@
           <w:sz w:val="19"/>
           <w:szCs w:val="19"/>
         </w:rPr>
-        <w:t xml:space="preserve">.github/workflows/pages.yml (removed)</w:t>
-      </w:r>
-    </w:p>
-    <w:p>
-      <w:pPr>
-        <w:pStyle w:val="ListParagraph"/>
-        <w:numPr>
-          <w:ilvl w:val="0"/>
-          <w:numId w:val="2"/>
-        </w:numPr>
-      </w:pPr>
-      <w:r>
-        <w:rPr>
-          <w:rFonts w:ascii="Consolas" w:cs="Consolas" w:eastAsia="Consolas" w:hAnsi="Consolas"/>
-          <w:sz w:val="19"/>
-          <w:szCs w:val="19"/>
-        </w:rPr>
         <w:t xml:space="preserve">README.md</w:t>
-      </w:r>
-    </w:p>
-    <w:p>
-      <w:pPr>
-        <w:pStyle w:val="ListParagraph"/>
-        <w:numPr>
-          <w:ilvl w:val="0"/>
-          <w:numId w:val="2"/>
-        </w:numPr>
-      </w:pPr>
-      <w:r>
-        <w:rPr>
-          <w:rFonts w:ascii="Consolas" w:cs="Consolas" w:eastAsia="Consolas" w:hAnsi="Consolas"/>
-          <w:sz w:val="19"/>
-          <w:szCs w:val="19"/>
-        </w:rPr>
-        <w:t xml:space="preserve">docs/prompt_log.json</w:t>
-      </w:r>
-    </w:p>
-    <w:p>
-      <w:pPr>
-        <w:pStyle w:val="ListParagraph"/>
-        <w:numPr>
-          <w:ilvl w:val="0"/>
-          <w:numId w:val="2"/>
-        </w:numPr>
-      </w:pPr>
-      <w:r>
-        <w:rPr>
-          <w:rFonts w:ascii="Consolas" w:cs="Consolas" w:eastAsia="Consolas" w:hAnsi="Consolas"/>
-          <w:sz w:val="19"/>
-          <w:szCs w:val="19"/>
-        </w:rPr>
-        <w:t xml:space="preserve">docs/SplitStack_Prompt_Log.docx</w:t>
-      </w:r>
-    </w:p>
-    <w:p>
-      <w:pPr>
-        <w:pStyle w:val="ListParagraph"/>
-        <w:numPr>
-          <w:ilvl w:val="0"/>
-          <w:numId w:val="2"/>
-        </w:numPr>
-      </w:pPr>
-      <w:r>
-        <w:rPr>
-          <w:rFonts w:ascii="Consolas" w:cs="Consolas" w:eastAsia="Consolas" w:hAnsi="Consolas"/>
-          <w:sz w:val="19"/>
-          <w:szCs w:val="19"/>
-        </w:rPr>
-        <w:t xml:space="preserve">docs/SplitStack_Prompt_Log.pdf</w:t>
       </w:r>
     </w:p>
     <w:p>
@@ -18503,7 +18881,7 @@
           <w:sz w:val="21"/>
           <w:szCs w:val="21"/>
         </w:rPr>
-        <w:t xml:space="preserve">main pushed to GitHub; branches on GitHub: main (refurbished work) and legacy (original Flask app).</w:t>
+        <w:t xml:space="preserve">Public repository https://github.com/MahaprabhuK/SplitStack created and the legacy branch pushed. The first push of main was rejected because it added a GitHub Actions workflow (.github/workflows/pages.yml) and the gh token lacked the "workflow" scope; the workflow file was removed and main was pushed in the next step. GitHub Pages is not set up yet (planned for the wrap-up; needs "gh auth refresh -s workflow" or a gh-pages branch).</w:t>
       </w:r>
     </w:p>
     <w:p>
@@ -18531,7 +18909,7 @@
           <w:sz w:val="21"/>
           <w:szCs w:val="21"/>
         </w:rPr>
-        <w:t xml:space="preserve">git ls-remote shows main and legacy at the expected commits.</w:t>
+        <w:t xml:space="preserve">gh repo view; git push output.</w:t>
       </w:r>
     </w:p>
     <w:p>
@@ -18551,7 +18929,7 @@
         <w:keepNext/>
       </w:pPr>
       <w:r>
-        <w:t xml:space="preserve">#18  Request: push the code and deploy the website</w:t>
+        <w:t xml:space="preserve">#16  Request: hand the project over to a teammate's agent</w:t>
       </w:r>
     </w:p>
     <w:p>
@@ -18599,7 +18977,7 @@
           <w:sz w:val="19"/>
           <w:szCs w:val="19"/>
         </w:rPr>
-        <w:t xml:space="preserve">first push the code and deploy it</w:t>
+        <w:t xml:space="preserve">ACTUALLY I GONNA HANDOVER THE PROJECT TO MY TEAMMATES AGENT SO HE'LL BE PULLING THE CODE AND RUNNING IN HIS SYSTEM SO GIVE PROMPT FOR THAT</w:t>
       </w:r>
     </w:p>
     <w:p>
@@ -18627,7 +19005,7 @@
           <w:sz w:val="21"/>
           <w:szCs w:val="21"/>
         </w:rPr>
-        <w:t xml:space="preserve">Get the code on GitHub and the Review 1 site online.</w:t>
+        <w:t xml:space="preserve">Let a teammate's AI agent clone, run and continue the project.</w:t>
       </w:r>
     </w:p>
     <w:p>
@@ -18688,7 +19066,7 @@
           <w:sz w:val="21"/>
           <w:szCs w:val="21"/>
         </w:rPr>
-        <w:t xml:space="preserve">Handled in the next step.</w:t>
+        <w:t xml:space="preserve">A handover prompt was written covering: requirements per review, clone and branch, prerequisites, install/run/verify commands, repository map, known traps, the mandatory logging rule, the ordered remaining work (planned prompts P1-P15) and working rules. Noted that the new work had to be pushed to GitHub first.</w:t>
       </w:r>
     </w:p>
     <w:p>
@@ -18736,7 +19114,7 @@
         <w:keepNext/>
       </w:pPr>
       <w:r>
-        <w:t xml:space="preserve">#19  Deploy the client to GitHub Pages from a gh-pages branch</w:t>
+        <w:t xml:space="preserve">#17  Push the refurbished code to GitHub main</w:t>
       </w:r>
     </w:p>
     <w:p>
@@ -18784,7 +19162,7 @@
           <w:sz w:val="19"/>
           <w:szCs w:val="19"/>
         </w:rPr>
-        <w:t xml:space="preserve">Push refurbish to main and refurbish on MahaprabhuK/SplitStack. Because the token cannot push workflow files, deploy without GitHub Actions: check that client/ uses only relative links, split client/ into its own history with git subtree split, push it as the gh-pages branch, wait for GitHub Pages to publish it, then put the live link back in README.md and log the step.</w:t>
+        <w:t xml:space="preserve">push it  (user prompt). Executed as: remove .github/workflows/pages.yml (the token lacks the workflow scope), replace the not-yet-existing live-site link in README.md with local run instructions, correct the earlier log entry about publishing, log the handover, rebuild the prompt logs, commit, and push the refurbish branch to main on https://github.com/MahaprabhuK/SplitStack so the teammate can clone it.</w:t>
       </w:r>
     </w:p>
     <w:p>
@@ -18812,7 +19190,7 @@
           <w:sz w:val="21"/>
           <w:szCs w:val="21"/>
         </w:rPr>
-        <w:t xml:space="preserve">Publish the Review 1 site at a public URL without needing the workflow scope.</w:t>
+        <w:t xml:space="preserve">Make the current work available to the teammate.</w:t>
       </w:r>
     </w:p>
     <w:p>
@@ -18845,6 +19223,23 @@
           <w:sz w:val="19"/>
           <w:szCs w:val="19"/>
         </w:rPr>
+        <w:t xml:space="preserve">.github/workflows/pages.yml (removed)</w:t>
+      </w:r>
+    </w:p>
+    <w:p>
+      <w:pPr>
+        <w:pStyle w:val="ListParagraph"/>
+        <w:numPr>
+          <w:ilvl w:val="0"/>
+          <w:numId w:val="2"/>
+        </w:numPr>
+      </w:pPr>
+      <w:r>
+        <w:rPr>
+          <w:rFonts w:ascii="Consolas" w:cs="Consolas" w:eastAsia="Consolas" w:hAnsi="Consolas"/>
+          <w:sz w:val="19"/>
+          <w:szCs w:val="19"/>
+        </w:rPr>
         <w:t xml:space="preserve">README.md</w:t>
       </w:r>
     </w:p>
@@ -18863,6 +19258,40 @@
           <w:szCs w:val="19"/>
         </w:rPr>
         <w:t xml:space="preserve">docs/prompt_log.json</w:t>
+      </w:r>
+    </w:p>
+    <w:p>
+      <w:pPr>
+        <w:pStyle w:val="ListParagraph"/>
+        <w:numPr>
+          <w:ilvl w:val="0"/>
+          <w:numId w:val="2"/>
+        </w:numPr>
+      </w:pPr>
+      <w:r>
+        <w:rPr>
+          <w:rFonts w:ascii="Consolas" w:cs="Consolas" w:eastAsia="Consolas" w:hAnsi="Consolas"/>
+          <w:sz w:val="19"/>
+          <w:szCs w:val="19"/>
+        </w:rPr>
+        <w:t xml:space="preserve">docs/SplitStack_Prompt_Log.docx</w:t>
+      </w:r>
+    </w:p>
+    <w:p>
+      <w:pPr>
+        <w:pStyle w:val="ListParagraph"/>
+        <w:numPr>
+          <w:ilvl w:val="0"/>
+          <w:numId w:val="2"/>
+        </w:numPr>
+      </w:pPr>
+      <w:r>
+        <w:rPr>
+          <w:rFonts w:ascii="Consolas" w:cs="Consolas" w:eastAsia="Consolas" w:hAnsi="Consolas"/>
+          <w:sz w:val="19"/>
+          <w:szCs w:val="19"/>
+        </w:rPr>
+        <w:t xml:space="preserve">docs/SplitStack_Prompt_Log.pdf</w:t>
       </w:r>
     </w:p>
     <w:p>
@@ -18890,7 +19319,7 @@
           <w:sz w:val="21"/>
           <w:szCs w:val="21"/>
         </w:rPr>
-        <w:t xml:space="preserve">main and refurbish are on GitHub. The client/ folder is published from the gh-pages branch at https://mahaprabhuk.github.io/SplitStack/ (GitHub enabled Pages automatically). To redeploy after client changes: git subtree split --prefix client refurbish, then push that commit to gh-pages.</w:t>
+        <w:t xml:space="preserve">main pushed to GitHub; branches on GitHub: main (refurbished work) and legacy (original Flask app).</w:t>
       </w:r>
     </w:p>
     <w:p>
@@ -18918,7 +19347,7 @@
           <w:sz w:val="21"/>
           <w:szCs w:val="21"/>
         </w:rPr>
-        <w:t xml:space="preserve">git ls-remote; curl returned 200 for the home page, pages/404.html and css/base.css on the live site.</w:t>
+        <w:t xml:space="preserve">git ls-remote shows main and legacy at the expected commits.</w:t>
       </w:r>
     </w:p>
     <w:p>
@@ -18938,7 +19367,7 @@
         <w:keepNext/>
       </w:pPr>
       <w:r>
-        <w:t xml:space="preserve">#20  Request: handover prompt PDF for a teammate's agent</w:t>
+        <w:t xml:space="preserve">#18  Request: push the code and deploy the website</w:t>
       </w:r>
     </w:p>
     <w:p>
@@ -18986,7 +19415,7 @@
           <w:sz w:val="19"/>
           <w:szCs w:val="19"/>
         </w:rPr>
-        <w:t xml:space="preserve">imma handover the project to my teammate i want you to create a detailed prompt for his agent most prolly he'll use anti gravity so i want a pdf containing prompts to complete the rest of the work in the project. so create a pdf and mention its path once its created then i'll share it to him</w:t>
+        <w:t xml:space="preserve">first push the code and deploy it</w:t>
       </w:r>
     </w:p>
     <w:p>
@@ -19014,7 +19443,7 @@
           <w:sz w:val="21"/>
           <w:szCs w:val="21"/>
         </w:rPr>
-        <w:t xml:space="preserve">Let a teammate's AI agent (Antigravity) finish Review 2, Review 3 and the wrap-up.</w:t>
+        <w:t xml:space="preserve">Get the code on GitHub and the Review 1 site online.</w:t>
       </w:r>
     </w:p>
     <w:p>
@@ -19123,7 +19552,7 @@
         <w:keepNext/>
       </w:pPr>
       <w:r>
-        <w:t xml:space="preserve">#21  Handover prompts PDF</w:t>
+        <w:t xml:space="preserve">#19  Deploy the client to GitHub Pages from a gh-pages branch</w:t>
       </w:r>
     </w:p>
     <w:p>
@@ -19171,7 +19600,7 @@
           <w:sz w:val="19"/>
           <w:szCs w:val="19"/>
         </w:rPr>
-        <w:t xml:space="preserve">Write docs/tools/build_handover_pdf.py (reusing the styles of build_prompt_pdf.py) to produce docs/SplitStack_Handover_Prompts.pdf: how to use it with Antigravity, one-time setup (tools, collaborator access, MongoDB Atlas, workflow token scope), a roadmap, Prompt 0 with the full project context, rules, logging, commit/push and gh-pages redeploy procedure, the 15 planned prompts P1-P15 expanded with concrete checks and commit messages, utility prompts (status, recovery, review rehearsal) and common problems. Render pages to check the layout.</w:t>
+        <w:t xml:space="preserve">Push refurbish to main and refurbish on MahaprabhuK/SplitStack. Because the token cannot push workflow files, deploy without GitHub Actions: check that client/ uses only relative links, split client/ into its own history with git subtree split, push it as the gh-pages branch, wait for GitHub Pages to publish it, then put the live link back in README.md and log the step.</w:t>
       </w:r>
     </w:p>
     <w:p>
@@ -19199,7 +19628,7 @@
           <w:sz w:val="21"/>
           <w:szCs w:val="21"/>
         </w:rPr>
-        <w:t xml:space="preserve">Give the teammate a self-contained, ordered set of prompts.</w:t>
+        <w:t xml:space="preserve">Publish the Review 1 site at a public URL without needing the workflow scope.</w:t>
       </w:r>
     </w:p>
     <w:p>
@@ -19232,24 +19661,24 @@
           <w:sz w:val="19"/>
           <w:szCs w:val="19"/>
         </w:rPr>
-        <w:t xml:space="preserve">docs/tools/build_handover_pdf.py</w:t>
-      </w:r>
-    </w:p>
-    <w:p>
-      <w:pPr>
-        <w:pStyle w:val="ListParagraph"/>
-        <w:numPr>
-          <w:ilvl w:val="0"/>
-          <w:numId w:val="2"/>
-        </w:numPr>
-      </w:pPr>
-      <w:r>
-        <w:rPr>
-          <w:rFonts w:ascii="Consolas" w:cs="Consolas" w:eastAsia="Consolas" w:hAnsi="Consolas"/>
-          <w:sz w:val="19"/>
-          <w:szCs w:val="19"/>
-        </w:rPr>
-        <w:t xml:space="preserve">docs/SplitStack_Handover_Prompts.pdf</w:t>
+        <w:t xml:space="preserve">README.md</w:t>
+      </w:r>
+    </w:p>
+    <w:p>
+      <w:pPr>
+        <w:pStyle w:val="ListParagraph"/>
+        <w:numPr>
+          <w:ilvl w:val="0"/>
+          <w:numId w:val="2"/>
+        </w:numPr>
+      </w:pPr>
+      <w:r>
+        <w:rPr>
+          <w:rFonts w:ascii="Consolas" w:cs="Consolas" w:eastAsia="Consolas" w:hAnsi="Consolas"/>
+          <w:sz w:val="19"/>
+          <w:szCs w:val="19"/>
+        </w:rPr>
+        <w:t xml:space="preserve">docs/prompt_log.json</w:t>
       </w:r>
     </w:p>
     <w:p>
@@ -19277,7 +19706,7 @@
           <w:sz w:val="21"/>
           <w:szCs w:val="21"/>
         </w:rPr>
-        <w:t xml:space="preserve">14-page PDF created. Changes against the planned prompts: P1 adds data-page attributes and client/js/package.json (type module) for node --test; P13 keeps the localStorage implementation as a demo mode (api-local.js chosen when /api/health does not answer) so the GitHub Pages site keeps working, instead of deleting it; P9 replaces deprecated csurf with a synchronizer token; P14 uses MongoMemoryReplSet because the API uses transactions; P15 asks for confirmation before deleting the Flask files and leaves Render account steps to the student.</w:t>
+        <w:t xml:space="preserve">main and refurbish are on GitHub. The client/ folder is published from the gh-pages branch at https://mahaprabhuk.github.io/SplitStack/ (GitHub enabled Pages automatically). To redeploy after client changes: git subtree split --prefix client refurbish, then push that commit to gh-pages.</w:t>
       </w:r>
     </w:p>
     <w:p>
@@ -19305,7 +19734,7 @@
           <w:sz w:val="21"/>
           <w:szCs w:val="21"/>
         </w:rPr>
-        <w:t xml:space="preserve">Rendered pages with PyMuPDF and checked the layout of the setup, Prompt 0, step and utility pages.</w:t>
+        <w:t xml:space="preserve">git ls-remote; curl returned 200 for the home page, pages/404.html and css/base.css on the live site.</w:t>
       </w:r>
     </w:p>
     <w:p>
@@ -19320,37 +19749,12 @@
       </w:r>
     </w:p>
     <w:p>
-      <w:r>
-        <w:br w:type="page"/>
-      </w:r>
-    </w:p>
-    <w:p>
-      <w:pPr>
-        <w:pStyle w:val="Heading1"/>
-      </w:pPr>
-      <w:r>
-        <w:t xml:space="preserve">Planned prompts to complete the project</w:t>
-      </w:r>
-    </w:p>
-    <w:p>
-      <w:pPr>
-        <w:spacing w:after="80"/>
-      </w:pPr>
-      <w:r>
-        <w:rPr>
-          <w:sz w:val="21"/>
-          <w:szCs w:val="21"/>
-        </w:rPr>
-        <w:t xml:space="preserve">These prompts have not been run yet. Run them in order; after each one, move it into the log above with its result.</w:t>
-      </w:r>
-    </w:p>
-    <w:p>
       <w:pPr>
         <w:pStyle w:val="Heading3"/>
         <w:keepNext/>
       </w:pPr>
       <w:r>
-        <w:t xml:space="preserve">P1  Seed data and automated tests</w:t>
+        <w:t xml:space="preserve">#20  Request: handover prompt PDF for a teammate's agent</w:t>
       </w:r>
     </w:p>
     <w:p>
@@ -19364,7 +19768,7 @@
           <w:sz w:val="18"/>
           <w:szCs w:val="18"/>
         </w:rPr>
-        <w:t xml:space="preserve">Review 3  |  Planned prompt</w:t>
+        <w:t xml:space="preserve">User prompt  |  2026-10-15</w:t>
       </w:r>
     </w:p>
     <w:p>
@@ -19398,7 +19802,7 @@
           <w:sz w:val="19"/>
           <w:szCs w:val="19"/>
         </w:rPr>
-        <w:t xml:space="preserve">Add server/scripts/seed.js that creates the demo user, categories, six months of expenses and income, budgets, recurring payments, the three groups with shared expenses, and shopping lists. It must be idempotent and must refuse to run against a database whose name does not end in -dev or -test unless --force is passed. Write Jest + Supertest tests using mongodb-memory-server for auth, ownership checks, CSRF rejection, rate limiting, split validation, the settlement algorithm, budget status, convert-to-expense duplicate prevention and receipt upload validation, covering what the 47 legacy Python tests checked. Add an npm test script and a GitHub Actions workflow that runs lint and tests on every push.</w:t>
+        <w:t xml:space="preserve">imma handover the project to my teammate i want you to create a detailed prompt for his agent most prolly he'll use anti gravity so i want a pdf containing prompts to complete the rest of the work in the project. so create a pdf and mention its path once its created then i'll share it to him</w:t>
       </w:r>
     </w:p>
     <w:p>
@@ -19426,7 +19830,7 @@
           <w:sz w:val="21"/>
           <w:szCs w:val="21"/>
         </w:rPr>
-        <w:t xml:space="preserve">Prove the back end works and keep it working.</w:t>
+        <w:t xml:space="preserve">Let a teammate's AI agent (Antigravity) finish Review 2, Review 3 and the wrap-up.</w:t>
       </w:r>
     </w:p>
     <w:p>
@@ -19443,6 +19847,39 @@
           <w:szCs w:val="17"/>
         </w:rPr>
         <w:t xml:space="preserve">FILES</w:t>
+      </w:r>
+    </w:p>
+    <w:p>
+      <w:pPr>
+        <w:pStyle w:val="ListParagraph"/>
+        <w:numPr>
+          <w:ilvl w:val="0"/>
+          <w:numId w:val="2"/>
+        </w:numPr>
+      </w:pPr>
+      <w:r>
+        <w:rPr>
+          <w:rFonts w:ascii="Consolas" w:cs="Consolas" w:eastAsia="Consolas" w:hAnsi="Consolas"/>
+          <w:sz w:val="19"/>
+          <w:szCs w:val="19"/>
+        </w:rPr>
+        <w:t xml:space="preserve">-</w:t>
+      </w:r>
+    </w:p>
+    <w:p>
+      <w:pPr>
+        <w:spacing w:after="60" w:before="160"/>
+      </w:pPr>
+      <w:r>
+        <w:rPr>
+          <w:b/>
+          <w:bCs/>
+          <w:color w:val="4F46E5"/>
+          <w:spacing w:val="20"/>
+          <w:sz w:val="17"/>
+          <w:szCs w:val="17"/>
+        </w:rPr>
+        <w:t xml:space="preserve">RESULT</w:t>
       </w:r>
     </w:p>
     <w:p>
@@ -19454,7 +19891,46 @@
           <w:sz w:val="21"/>
           <w:szCs w:val="21"/>
         </w:rPr>
-        <w:t xml:space="preserve">server/scripts/seed.js, server/tests/*.test.js, .github/workflows/ci.yml</w:t>
+        <w:t xml:space="preserve">Handled in the next step.</w:t>
+      </w:r>
+    </w:p>
+    <w:p>
+      <w:pPr>
+        <w:spacing w:after="60" w:before="160"/>
+      </w:pPr>
+      <w:r>
+        <w:rPr>
+          <w:b/>
+          <w:bCs/>
+          <w:color w:val="4F46E5"/>
+          <w:spacing w:val="20"/>
+          <w:sz w:val="17"/>
+          <w:szCs w:val="17"/>
+        </w:rPr>
+        <w:t xml:space="preserve">VERIFICATION</w:t>
+      </w:r>
+    </w:p>
+    <w:p>
+      <w:pPr>
+        <w:spacing w:after="80"/>
+      </w:pPr>
+      <w:r>
+        <w:rPr>
+          <w:sz w:val="21"/>
+          <w:szCs w:val="21"/>
+        </w:rPr>
+        <w:t xml:space="preserve">-</w:t>
+      </w:r>
+    </w:p>
+    <w:p>
+      <w:pPr>
+        <w:pBdr>
+          <w:bottom w:val="single" w:color="D9DBE5" w:sz="4" w:space="4"/>
+        </w:pBdr>
+        <w:spacing w:after="200"/>
+      </w:pPr>
+      <w:r>
+        <w:t xml:space="preserve"/>
       </w:r>
     </w:p>
     <w:p>
@@ -19463,7 +19939,234 @@
         <w:keepNext/>
       </w:pPr>
       <w:r>
-        <w:t xml:space="preserve">P2  Remove legacy code, document and deploy</w:t>
+        <w:t xml:space="preserve">#21  Handover prompts PDF</w:t>
+      </w:r>
+    </w:p>
+    <w:p>
+      <w:pPr>
+        <w:keepNext/>
+        <w:spacing w:after="60"/>
+      </w:pPr>
+      <w:r>
+        <w:rPr>
+          <w:color w:val="5B6475"/>
+          <w:sz w:val="18"/>
+          <w:szCs w:val="18"/>
+        </w:rPr>
+        <w:t xml:space="preserve">Working prompt  |  2026-10-15</w:t>
+      </w:r>
+    </w:p>
+    <w:p>
+      <w:pPr>
+        <w:spacing w:after="60" w:before="160"/>
+      </w:pPr>
+      <w:r>
+        <w:rPr>
+          <w:b/>
+          <w:bCs/>
+          <w:color w:val="4F46E5"/>
+          <w:spacing w:val="20"/>
+          <w:sz w:val="17"/>
+          <w:szCs w:val="17"/>
+        </w:rPr>
+        <w:t xml:space="preserve">PROMPT</w:t>
+      </w:r>
+    </w:p>
+    <w:p>
+      <w:pPr>
+        <w:pBdr>
+          <w:left w:val="single" w:color="4F46E5" w:sz="18" w:space="8"/>
+        </w:pBdr>
+        <w:shd w:fill="F1F2F8" w:color="auto" w:val="clear"/>
+        <w:spacing w:after="120" w:before="40" w:line="276"/>
+        <w:ind w:left="160" w:right="160"/>
+      </w:pPr>
+      <w:r>
+        <w:rPr>
+          <w:rFonts w:ascii="Consolas" w:cs="Consolas" w:eastAsia="Consolas" w:hAnsi="Consolas"/>
+          <w:sz w:val="19"/>
+          <w:szCs w:val="19"/>
+        </w:rPr>
+        <w:t xml:space="preserve">Write docs/tools/build_handover_pdf.py (reusing the styles of build_prompt_pdf.py) to produce docs/SplitStack_Handover_Prompts.pdf: how to use it with Antigravity, one-time setup (tools, collaborator access, MongoDB Atlas, workflow token scope), a roadmap, Prompt 0 with the full project context, rules, logging, commit/push and gh-pages redeploy procedure, the 15 planned prompts P1-P15 expanded with concrete checks and commit messages, utility prompts (status, recovery, review rehearsal) and common problems. Render pages to check the layout.</w:t>
+      </w:r>
+    </w:p>
+    <w:p>
+      <w:pPr>
+        <w:spacing w:after="60" w:before="160"/>
+      </w:pPr>
+      <w:r>
+        <w:rPr>
+          <w:b/>
+          <w:bCs/>
+          <w:color w:val="4F46E5"/>
+          <w:spacing w:val="20"/>
+          <w:sz w:val="17"/>
+          <w:szCs w:val="17"/>
+        </w:rPr>
+        <w:t xml:space="preserve">PURPOSE</w:t>
+      </w:r>
+    </w:p>
+    <w:p>
+      <w:pPr>
+        <w:spacing w:after="80"/>
+      </w:pPr>
+      <w:r>
+        <w:rPr>
+          <w:sz w:val="21"/>
+          <w:szCs w:val="21"/>
+        </w:rPr>
+        <w:t xml:space="preserve">Give the teammate a self-contained, ordered set of prompts.</w:t>
+      </w:r>
+    </w:p>
+    <w:p>
+      <w:pPr>
+        <w:spacing w:after="60" w:before="160"/>
+      </w:pPr>
+      <w:r>
+        <w:rPr>
+          <w:b/>
+          <w:bCs/>
+          <w:color w:val="4F46E5"/>
+          <w:spacing w:val="20"/>
+          <w:sz w:val="17"/>
+          <w:szCs w:val="17"/>
+        </w:rPr>
+        <w:t xml:space="preserve">FILES</w:t>
+      </w:r>
+    </w:p>
+    <w:p>
+      <w:pPr>
+        <w:pStyle w:val="ListParagraph"/>
+        <w:numPr>
+          <w:ilvl w:val="0"/>
+          <w:numId w:val="2"/>
+        </w:numPr>
+      </w:pPr>
+      <w:r>
+        <w:rPr>
+          <w:rFonts w:ascii="Consolas" w:cs="Consolas" w:eastAsia="Consolas" w:hAnsi="Consolas"/>
+          <w:sz w:val="19"/>
+          <w:szCs w:val="19"/>
+        </w:rPr>
+        <w:t xml:space="preserve">docs/tools/build_handover_pdf.py</w:t>
+      </w:r>
+    </w:p>
+    <w:p>
+      <w:pPr>
+        <w:pStyle w:val="ListParagraph"/>
+        <w:numPr>
+          <w:ilvl w:val="0"/>
+          <w:numId w:val="2"/>
+        </w:numPr>
+      </w:pPr>
+      <w:r>
+        <w:rPr>
+          <w:rFonts w:ascii="Consolas" w:cs="Consolas" w:eastAsia="Consolas" w:hAnsi="Consolas"/>
+          <w:sz w:val="19"/>
+          <w:szCs w:val="19"/>
+        </w:rPr>
+        <w:t xml:space="preserve">docs/SplitStack_Handover_Prompts.pdf</w:t>
+      </w:r>
+    </w:p>
+    <w:p>
+      <w:pPr>
+        <w:spacing w:after="60" w:before="160"/>
+      </w:pPr>
+      <w:r>
+        <w:rPr>
+          <w:b/>
+          <w:bCs/>
+          <w:color w:val="4F46E5"/>
+          <w:spacing w:val="20"/>
+          <w:sz w:val="17"/>
+          <w:szCs w:val="17"/>
+        </w:rPr>
+        <w:t xml:space="preserve">RESULT</w:t>
+      </w:r>
+    </w:p>
+    <w:p>
+      <w:pPr>
+        <w:spacing w:after="80"/>
+      </w:pPr>
+      <w:r>
+        <w:rPr>
+          <w:sz w:val="21"/>
+          <w:szCs w:val="21"/>
+        </w:rPr>
+        <w:t xml:space="preserve">14-page PDF created. Changes against the planned prompts: P1 adds data-page attributes and client/js/package.json (type module) for node --test; P13 keeps the localStorage implementation as a demo mode (api-local.js chosen when /api/health does not answer) so the GitHub Pages site keeps working, instead of deleting it; P9 replaces deprecated csurf with a synchronizer token; P14 uses MongoMemoryReplSet because the API uses transactions; P15 asks for confirmation before deleting the Flask files and leaves Render account steps to the student.</w:t>
+      </w:r>
+    </w:p>
+    <w:p>
+      <w:pPr>
+        <w:spacing w:after="60" w:before="160"/>
+      </w:pPr>
+      <w:r>
+        <w:rPr>
+          <w:b/>
+          <w:bCs/>
+          <w:color w:val="4F46E5"/>
+          <w:spacing w:val="20"/>
+          <w:sz w:val="17"/>
+          <w:szCs w:val="17"/>
+        </w:rPr>
+        <w:t xml:space="preserve">VERIFICATION</w:t>
+      </w:r>
+    </w:p>
+    <w:p>
+      <w:pPr>
+        <w:spacing w:after="80"/>
+      </w:pPr>
+      <w:r>
+        <w:rPr>
+          <w:sz w:val="21"/>
+          <w:szCs w:val="21"/>
+        </w:rPr>
+        <w:t xml:space="preserve">Rendered pages with PyMuPDF and checked the layout of the setup, Prompt 0, step and utility pages.</w:t>
+      </w:r>
+    </w:p>
+    <w:p>
+      <w:pPr>
+        <w:pBdr>
+          <w:bottom w:val="single" w:color="D9DBE5" w:sz="4" w:space="4"/>
+        </w:pBdr>
+        <w:spacing w:after="200"/>
+      </w:pPr>
+      <w:r>
+        <w:t xml:space="preserve"/>
+      </w:r>
+    </w:p>
+    <w:p>
+      <w:r>
+        <w:br w:type="page"/>
+      </w:r>
+    </w:p>
+    <w:p>
+      <w:pPr>
+        <w:pStyle w:val="Heading1"/>
+      </w:pPr>
+      <w:r>
+        <w:t xml:space="preserve">Planned prompts to complete the project</w:t>
+      </w:r>
+    </w:p>
+    <w:p>
+      <w:pPr>
+        <w:spacing w:after="80"/>
+      </w:pPr>
+      <w:r>
+        <w:rPr>
+          <w:sz w:val="21"/>
+          <w:szCs w:val="21"/>
+        </w:rPr>
+        <w:t xml:space="preserve">These prompts have not been run yet. Run them in order; after each one, move it into the log above with its result.</w:t>
+      </w:r>
+    </w:p>
+    <w:p>
+      <w:pPr>
+        <w:pStyle w:val="Heading3"/>
+        <w:keepNext/>
+      </w:pPr>
+      <w:r>
+        <w:t xml:space="preserve">P1  Remove legacy code, document and deploy</w:t>
       </w:r>
     </w:p>
     <w:p>

</xml_diff>

<commit_message>
Review 3: final release readiness and deployment documentation
</commit_message>
<xml_diff>
--- a/docs/SplitStack_Prompt_Log.docx
+++ b/docs/SplitStack_Prompt_Log.docx
@@ -132,7 +132,7 @@
           <w:sz w:val="21"/>
           <w:szCs w:val="21"/>
         </w:rPr>
-        <w:t xml:space="preserve">49</w:t>
+        <w:t xml:space="preserve">51</w:t>
       </w:r>
     </w:p>
     <w:p>
@@ -713,7 +713,7 @@
                 <w:sz w:val="18"/>
                 <w:szCs w:val="18"/>
               </w:rPr>
-              <w:t xml:space="preserve">9</w:t>
+              <w:t xml:space="preserve">11</w:t>
             </w:r>
           </w:p>
         </w:tc>
@@ -6675,6 +6675,245 @@
                 <w:szCs w:val="18"/>
               </w:rPr>
               <w:t xml:space="preserve">Database seeding, integration tests, and CI</w:t>
+            </w:r>
+          </w:p>
+        </w:tc>
+        <w:tc>
+          <w:tcPr>
+            <w:tcW w:type="dxa" w:w="1500"/>
+            <w:tcMar>
+              <w:top w:type="dxa" w:w="60"/>
+              <w:left w:type="dxa" w:w="100"/>
+              <w:bottom w:type="dxa" w:w="60"/>
+              <w:right w:type="dxa" w:w="100"/>
+            </w:tcMar>
+          </w:tcPr>
+          <w:p>
+            <w:r>
+              <w:rPr>
+                <w:b w:val="false"/>
+                <w:bCs w:val="false"/>
+                <w:color w:val="222222"/>
+                <w:sz w:val="18"/>
+                <w:szCs w:val="18"/>
+              </w:rPr>
+              <w:t xml:space="preserve">Working prompt</w:t>
+            </w:r>
+          </w:p>
+        </w:tc>
+        <w:tc>
+          <w:tcPr>
+            <w:tcW w:type="dxa" w:w="1400"/>
+            <w:tcMar>
+              <w:top w:type="dxa" w:w="60"/>
+              <w:left w:type="dxa" w:w="100"/>
+              <w:bottom w:type="dxa" w:w="60"/>
+              <w:right w:type="dxa" w:w="100"/>
+            </w:tcMar>
+          </w:tcPr>
+          <w:p>
+            <w:r>
+              <w:rPr>
+                <w:b w:val="false"/>
+                <w:bCs w:val="false"/>
+                <w:color w:val="222222"/>
+                <w:sz w:val="18"/>
+                <w:szCs w:val="18"/>
+              </w:rPr>
+              <w:t xml:space="preserve">2026-10-17</w:t>
+            </w:r>
+          </w:p>
+        </w:tc>
+      </w:tr>
+      <w:tr>
+        <w:tc>
+          <w:tcPr>
+            <w:tcW w:type="dxa" w:w="700"/>
+            <w:shd w:fill="F7F7FB" w:color="auto" w:val="clear"/>
+            <w:tcMar>
+              <w:top w:type="dxa" w:w="60"/>
+              <w:left w:type="dxa" w:w="100"/>
+              <w:bottom w:type="dxa" w:w="60"/>
+              <w:right w:type="dxa" w:w="100"/>
+            </w:tcMar>
+          </w:tcPr>
+          <w:p>
+            <w:r>
+              <w:rPr>
+                <w:b w:val="false"/>
+                <w:bCs w:val="false"/>
+                <w:color w:val="222222"/>
+                <w:sz w:val="18"/>
+                <w:szCs w:val="18"/>
+              </w:rPr>
+              <w:t xml:space="preserve">50</w:t>
+            </w:r>
+          </w:p>
+        </w:tc>
+        <w:tc>
+          <w:tcPr>
+            <w:tcW w:type="dxa" w:w="1500"/>
+            <w:shd w:fill="F7F7FB" w:color="auto" w:val="clear"/>
+            <w:tcMar>
+              <w:top w:type="dxa" w:w="60"/>
+              <w:left w:type="dxa" w:w="100"/>
+              <w:bottom w:type="dxa" w:w="60"/>
+              <w:right w:type="dxa" w:w="100"/>
+            </w:tcMar>
+          </w:tcPr>
+          <w:p>
+            <w:r>
+              <w:rPr>
+                <w:b w:val="false"/>
+                <w:bCs w:val="false"/>
+                <w:color w:val="222222"/>
+                <w:sz w:val="18"/>
+                <w:szCs w:val="18"/>
+              </w:rPr>
+              <w:t xml:space="preserve">Wrap-up</w:t>
+            </w:r>
+          </w:p>
+        </w:tc>
+        <w:tc>
+          <w:tcPr>
+            <w:tcW w:type="dxa" w:w="4538"/>
+            <w:shd w:fill="F7F7FB" w:color="auto" w:val="clear"/>
+            <w:tcMar>
+              <w:top w:type="dxa" w:w="60"/>
+              <w:left w:type="dxa" w:w="100"/>
+              <w:bottom w:type="dxa" w:w="60"/>
+              <w:right w:type="dxa" w:w="100"/>
+            </w:tcMar>
+          </w:tcPr>
+          <w:p>
+            <w:r>
+              <w:rPr>
+                <w:b w:val="false"/>
+                <w:bCs w:val="false"/>
+                <w:color w:val="222222"/>
+                <w:sz w:val="18"/>
+                <w:szCs w:val="18"/>
+              </w:rPr>
+              <w:t xml:space="preserve">Request: proceed with Review 3 Step P15</w:t>
+            </w:r>
+          </w:p>
+        </w:tc>
+        <w:tc>
+          <w:tcPr>
+            <w:tcW w:type="dxa" w:w="1500"/>
+            <w:shd w:fill="F7F7FB" w:color="auto" w:val="clear"/>
+            <w:tcMar>
+              <w:top w:type="dxa" w:w="60"/>
+              <w:left w:type="dxa" w:w="100"/>
+              <w:bottom w:type="dxa" w:w="60"/>
+              <w:right w:type="dxa" w:w="100"/>
+            </w:tcMar>
+          </w:tcPr>
+          <w:p>
+            <w:r>
+              <w:rPr>
+                <w:b w:val="false"/>
+                <w:bCs w:val="false"/>
+                <w:color w:val="222222"/>
+                <w:sz w:val="18"/>
+                <w:szCs w:val="18"/>
+              </w:rPr>
+              <w:t xml:space="preserve">User prompt</w:t>
+            </w:r>
+          </w:p>
+        </w:tc>
+        <w:tc>
+          <w:tcPr>
+            <w:tcW w:type="dxa" w:w="1400"/>
+            <w:shd w:fill="F7F7FB" w:color="auto" w:val="clear"/>
+            <w:tcMar>
+              <w:top w:type="dxa" w:w="60"/>
+              <w:left w:type="dxa" w:w="100"/>
+              <w:bottom w:type="dxa" w:w="60"/>
+              <w:right w:type="dxa" w:w="100"/>
+            </w:tcMar>
+          </w:tcPr>
+          <w:p>
+            <w:r>
+              <w:rPr>
+                <w:b w:val="false"/>
+                <w:bCs w:val="false"/>
+                <w:color w:val="222222"/>
+                <w:sz w:val="18"/>
+                <w:szCs w:val="18"/>
+              </w:rPr>
+              <w:t xml:space="preserve">2026-10-17</w:t>
+            </w:r>
+          </w:p>
+        </w:tc>
+      </w:tr>
+      <w:tr>
+        <w:tc>
+          <w:tcPr>
+            <w:tcW w:type="dxa" w:w="700"/>
+            <w:tcMar>
+              <w:top w:type="dxa" w:w="60"/>
+              <w:left w:type="dxa" w:w="100"/>
+              <w:bottom w:type="dxa" w:w="60"/>
+              <w:right w:type="dxa" w:w="100"/>
+            </w:tcMar>
+          </w:tcPr>
+          <w:p>
+            <w:r>
+              <w:rPr>
+                <w:b w:val="false"/>
+                <w:bCs w:val="false"/>
+                <w:color w:val="222222"/>
+                <w:sz w:val="18"/>
+                <w:szCs w:val="18"/>
+              </w:rPr>
+              <w:t xml:space="preserve">51</w:t>
+            </w:r>
+          </w:p>
+        </w:tc>
+        <w:tc>
+          <w:tcPr>
+            <w:tcW w:type="dxa" w:w="1500"/>
+            <w:tcMar>
+              <w:top w:type="dxa" w:w="60"/>
+              <w:left w:type="dxa" w:w="100"/>
+              <w:bottom w:type="dxa" w:w="60"/>
+              <w:right w:type="dxa" w:w="100"/>
+            </w:tcMar>
+          </w:tcPr>
+          <w:p>
+            <w:r>
+              <w:rPr>
+                <w:b w:val="false"/>
+                <w:bCs w:val="false"/>
+                <w:color w:val="222222"/>
+                <w:sz w:val="18"/>
+                <w:szCs w:val="18"/>
+              </w:rPr>
+              <w:t xml:space="preserve">Wrap-up</w:t>
+            </w:r>
+          </w:p>
+        </w:tc>
+        <w:tc>
+          <w:tcPr>
+            <w:tcW w:type="dxa" w:w="4538"/>
+            <w:tcMar>
+              <w:top w:type="dxa" w:w="60"/>
+              <w:left w:type="dxa" w:w="100"/>
+              <w:bottom w:type="dxa" w:w="60"/>
+              <w:right w:type="dxa" w:w="100"/>
+            </w:tcMar>
+          </w:tcPr>
+          <w:p>
+            <w:r>
+              <w:rPr>
+                <w:b w:val="false"/>
+                <w:bCs w:val="false"/>
+                <w:color w:val="222222"/>
+                <w:sz w:val="18"/>
+                <w:szCs w:val="18"/>
+              </w:rPr>
+              <w:t xml:space="preserve">Final release readiness and deployment documentation</w:t>
             </w:r>
           </w:p>
         </w:tc>
@@ -20136,37 +20375,12 @@
       </w:r>
     </w:p>
     <w:p>
-      <w:r>
-        <w:br w:type="page"/>
-      </w:r>
-    </w:p>
-    <w:p>
-      <w:pPr>
-        <w:pStyle w:val="Heading1"/>
-      </w:pPr>
-      <w:r>
-        <w:t xml:space="preserve">Planned prompts to complete the project</w:t>
-      </w:r>
-    </w:p>
-    <w:p>
-      <w:pPr>
-        <w:spacing w:after="80"/>
-      </w:pPr>
-      <w:r>
-        <w:rPr>
-          <w:sz w:val="21"/>
-          <w:szCs w:val="21"/>
-        </w:rPr>
-        <w:t xml:space="preserve">These prompts have not been run yet. Run them in order; after each one, move it into the log above with its result.</w:t>
-      </w:r>
-    </w:p>
-    <w:p>
       <w:pPr>
         <w:pStyle w:val="Heading3"/>
         <w:keepNext/>
       </w:pPr>
       <w:r>
-        <w:t xml:space="preserve">P1  Remove legacy code, document and deploy</w:t>
+        <w:t xml:space="preserve">#50  Request: proceed with Review 3 Step P15</w:t>
       </w:r>
     </w:p>
     <w:p>
@@ -20180,7 +20394,7 @@
           <w:sz w:val="18"/>
           <w:szCs w:val="18"/>
         </w:rPr>
-        <w:t xml:space="preserve">Wrap-up  |  Planned prompt</w:t>
+        <w:t xml:space="preserve">User prompt  |  2026-10-17</w:t>
       </w:r>
     </w:p>
     <w:p>
@@ -20214,7 +20428,25 @@
           <w:sz w:val="19"/>
           <w:szCs w:val="19"/>
         </w:rPr>
-        <w:t xml:space="preserve">Delete the Flask app (app.py, config.py, database/, modules/, templates/, static/, ml/, tests/*.py, requirements.txt, Procfile) from main, since it is kept on the legacy branch. Rewrite README.md: features, the stack per review (HTML+CSS, JavaScript, Node.js+MongoDB), setup steps, environment variables, a data-model diagram, the API table and screenshots. Deploy the full app to Render as a Node web service (build: npm ci; start: npm start; environment: MONGODB_URI, SESSION_SECRET, NODE_ENV=production) with MongoDB Atlas network access configured, and keep the static site on GitHub Pages. Finish the prompt log, export it to Word and PDF, and tag the release v3.0.0.</w:t>
+        <w:t xml:space="preserve"># SplitStack — Phase P15: Final Wrap-Up, Deployment Readiness &amp; Release Review
+Execute P15 only, the final roadmap phase. Review the project, consolidate documentation, prepare deployment guidance and manifests where safe, verify release readiness, and document a proposed v3.0.0 release.
+## 1. Mandatory safety rules
+Start by verifying active branch refurbish, current commit 2008c19 (P14), inspect git status --short and recent history. Do not push to any remote. Do not reset, rebase, amend commits, or discard changes. Preserve all seven pre-existing untracked baseline evidence files in docs/audit/. Preserve all other existing audit reports too. Preserve the legacy Flask application and its files. Do not delete, archive, move, or rewrite them in this phase. Document a separate future removal decision if necessary. Do not expose secrets or credentials. Do not create or use a real production database or deploy to production. Do not create a release tag unless the complete release-readiness checklist passes and the user explicitly approves tagging. Do not push tags.
+## 2. Audit the current state
+Inspect READMEs, package.json files, .env.example files, ci.yml, audit reports, prompt_log.json, runtime assumptions, deployment/security configs, CORS, health endpoints, client mode behavior, and preserved Flask app.
+## 3. Release-readiness checklist
+Create concise, evidence-based checklist covering lockfile installs, client/server/legacy tests, MongoDB integration, CI workflow result, secret management, security controls, backup/migration strategy, deployment procedure, accessibility/responsive UI, legacy coexistence, and known issues. Use clear statuses (PASS, FAIL, NOT VERIFIED, NOT APPLICABLE).
+## 4. Deployment preparation — documentation first
+Prepare safe deployment documentation: supported runtimes, installation steps, env var reference without secrets, local startup/testing/seeding, health check, HTTPS/cookies/JWT/CORS/rate limits/upload limits, backup/restore, deployment checklist and rollback plan. Provide production Dockerfile (non-root execution) and docker-compose.yml.
+## 5. Documentation consolidation
+Update README.md and server/README.md with architecture, entry points, client modes, env vars, test running, safe seeding, mock vs real database disclosure, limitations, and preserved legacy Flask app.
+## 6. Final tests and CI review
+Run npm ci, npm --prefix server ci, test:client, test:server:unit, lint:html, legacy Python tests, and integration suite. Report exact outcomes.
+## 7. Final documentation and audit trail
+Create docs/audit/P15_FINAL_RELEASE_READINESS.md, docs/DEPLOYMENT_GUIDE.md, docs/RELEASE_NOTES_v3.0.0_DRAFT.md. Update docs/prompt_log.json and regenerate prompt-log DOCX/PDF via npm run log.
+## 8. Git discipline
+Review full diff. Stage only explicitly intended P15 files. Commit message: Review 3: final release readiness and deployment documentation. Do not push or tag.
+## 9. Final report</w:t>
       </w:r>
     </w:p>
     <w:p>
@@ -20242,7 +20474,7 @@
           <w:sz w:val="21"/>
           <w:szCs w:val="21"/>
         </w:rPr>
-        <w:t xml:space="preserve">Deliver a clean, documented, deployed project.</w:t>
+        <w:t xml:space="preserve">Authorize execution of Step P15: Final Wrap-Up, Deployment Readiness &amp; Release Review.</w:t>
       </w:r>
     </w:p>
     <w:p>
@@ -20259,6 +20491,39 @@
           <w:szCs w:val="17"/>
         </w:rPr>
         <w:t xml:space="preserve">FILES</w:t>
+      </w:r>
+    </w:p>
+    <w:p>
+      <w:pPr>
+        <w:pStyle w:val="ListParagraph"/>
+        <w:numPr>
+          <w:ilvl w:val="0"/>
+          <w:numId w:val="2"/>
+        </w:numPr>
+      </w:pPr>
+      <w:r>
+        <w:rPr>
+          <w:rFonts w:ascii="Consolas" w:cs="Consolas" w:eastAsia="Consolas" w:hAnsi="Consolas"/>
+          <w:sz w:val="19"/>
+          <w:szCs w:val="19"/>
+        </w:rPr>
+        <w:t xml:space="preserve">-</w:t>
+      </w:r>
+    </w:p>
+    <w:p>
+      <w:pPr>
+        <w:spacing w:after="60" w:before="160"/>
+      </w:pPr>
+      <w:r>
+        <w:rPr>
+          <w:b/>
+          <w:bCs/>
+          <w:color w:val="4F46E5"/>
+          <w:spacing w:val="20"/>
+          <w:sz w:val="17"/>
+          <w:szCs w:val="17"/>
+        </w:rPr>
+        <w:t xml:space="preserve">RESULT</w:t>
       </w:r>
     </w:p>
     <w:p>
@@ -20270,7 +20535,401 @@
           <w:sz w:val="21"/>
           <w:szCs w:val="21"/>
         </w:rPr>
-        <w:t xml:space="preserve">README.md, render.yaml, docs/*</w:t>
+        <w:t xml:space="preserve">Authorized Step P15 implementation.</w:t>
+      </w:r>
+    </w:p>
+    <w:p>
+      <w:pPr>
+        <w:spacing w:after="60" w:before="160"/>
+      </w:pPr>
+      <w:r>
+        <w:rPr>
+          <w:b/>
+          <w:bCs/>
+          <w:color w:val="4F46E5"/>
+          <w:spacing w:val="20"/>
+          <w:sz w:val="17"/>
+          <w:szCs w:val="17"/>
+        </w:rPr>
+        <w:t xml:space="preserve">VERIFICATION</w:t>
+      </w:r>
+    </w:p>
+    <w:p>
+      <w:pPr>
+        <w:spacing w:after="80"/>
+      </w:pPr>
+      <w:r>
+        <w:rPr>
+          <w:sz w:val="21"/>
+          <w:szCs w:val="21"/>
+        </w:rPr>
+        <w:t xml:space="preserve">-</w:t>
+      </w:r>
+    </w:p>
+    <w:p>
+      <w:pPr>
+        <w:pBdr>
+          <w:bottom w:val="single" w:color="D9DBE5" w:sz="4" w:space="4"/>
+        </w:pBdr>
+        <w:spacing w:after="200"/>
+      </w:pPr>
+      <w:r>
+        <w:t xml:space="preserve"/>
+      </w:r>
+    </w:p>
+    <w:p>
+      <w:pPr>
+        <w:pStyle w:val="Heading3"/>
+        <w:keepNext/>
+      </w:pPr>
+      <w:r>
+        <w:t xml:space="preserve">#51  Final release readiness and deployment documentation</w:t>
+      </w:r>
+    </w:p>
+    <w:p>
+      <w:pPr>
+        <w:keepNext/>
+        <w:spacing w:after="60"/>
+      </w:pPr>
+      <w:r>
+        <w:rPr>
+          <w:color w:val="5B6475"/>
+          <w:sz w:val="18"/>
+          <w:szCs w:val="18"/>
+        </w:rPr>
+        <w:t xml:space="preserve">Working prompt  |  2026-10-17</w:t>
+      </w:r>
+    </w:p>
+    <w:p>
+      <w:pPr>
+        <w:spacing w:after="60" w:before="160"/>
+      </w:pPr>
+      <w:r>
+        <w:rPr>
+          <w:b/>
+          <w:bCs/>
+          <w:color w:val="4F46E5"/>
+          <w:spacing w:val="20"/>
+          <w:sz w:val="17"/>
+          <w:szCs w:val="17"/>
+        </w:rPr>
+        <w:t xml:space="preserve">PROMPT</w:t>
+      </w:r>
+    </w:p>
+    <w:p>
+      <w:pPr>
+        <w:pBdr>
+          <w:left w:val="single" w:color="4F46E5" w:sz="18" w:space="8"/>
+        </w:pBdr>
+        <w:shd w:fill="F1F2F8" w:color="auto" w:val="clear"/>
+        <w:spacing w:after="120" w:before="40" w:line="276"/>
+        <w:ind w:left="160" w:right="160"/>
+      </w:pPr>
+      <w:r>
+        <w:rPr>
+          <w:rFonts w:ascii="Consolas" w:cs="Consolas" w:eastAsia="Consolas" w:hAnsi="Consolas"/>
+          <w:sz w:val="19"/>
+          <w:szCs w:val="19"/>
+        </w:rPr>
+        <w:t xml:space="preserve">Audit the complete SplitStack repository; verify reproducible lockfile installs via npm ci and npm --prefix server ci; run client unit tests (201 passed), server unit tests (123 passed), HTML validation (25 files clean), legacy Python tests (31 passed), and verify integration test skip behavior; create production Dockerfile with non-root node user and health checks; create docker-compose.yml with MongoDB 7.0 service container; create docs/DEPLOYMENT_GUIDE.md covering architectures, runtime prerequisites, secrets generation, HTTPS/cookies/CORS/rate limiting hardening, mongodump backup/restore, and rollback procedures; create docs/RELEASE_NOTES_v3.0.0_DRAFT.md summarizing complete Review 1, 2, and 3 achievements with conditional release status; update README.md and server/README.md to consolidate architecture, client modes, test commands with mock vs live database disclosure, and legacy Flask coexistence; create docs/audit/P15_FINAL_RELEASE_READINESS.md with evidence-based checklist; update prompt logs and regenerate DOCX and PDF artifacts.</w:t>
+      </w:r>
+    </w:p>
+    <w:p>
+      <w:pPr>
+        <w:spacing w:after="60" w:before="160"/>
+      </w:pPr>
+      <w:r>
+        <w:rPr>
+          <w:b/>
+          <w:bCs/>
+          <w:color w:val="4F46E5"/>
+          <w:spacing w:val="20"/>
+          <w:sz w:val="17"/>
+          <w:szCs w:val="17"/>
+        </w:rPr>
+        <w:t xml:space="preserve">PURPOSE</w:t>
+      </w:r>
+    </w:p>
+    <w:p>
+      <w:pPr>
+        <w:spacing w:after="80"/>
+      </w:pPr>
+      <w:r>
+        <w:rPr>
+          <w:sz w:val="21"/>
+          <w:szCs w:val="21"/>
+        </w:rPr>
+        <w:t xml:space="preserve">Complete Phase P15 wrap-up: deployment documentation, container manifests, release-readiness evaluation, and documentation consolidation.</w:t>
+      </w:r>
+    </w:p>
+    <w:p>
+      <w:pPr>
+        <w:spacing w:after="60" w:before="160"/>
+      </w:pPr>
+      <w:r>
+        <w:rPr>
+          <w:b/>
+          <w:bCs/>
+          <w:color w:val="4F46E5"/>
+          <w:spacing w:val="20"/>
+          <w:sz w:val="17"/>
+          <w:szCs w:val="17"/>
+        </w:rPr>
+        <w:t xml:space="preserve">FILES</w:t>
+      </w:r>
+    </w:p>
+    <w:p>
+      <w:pPr>
+        <w:pStyle w:val="ListParagraph"/>
+        <w:numPr>
+          <w:ilvl w:val="0"/>
+          <w:numId w:val="2"/>
+        </w:numPr>
+      </w:pPr>
+      <w:r>
+        <w:rPr>
+          <w:rFonts w:ascii="Consolas" w:cs="Consolas" w:eastAsia="Consolas" w:hAnsi="Consolas"/>
+          <w:sz w:val="19"/>
+          <w:szCs w:val="19"/>
+        </w:rPr>
+        <w:t xml:space="preserve">.dockerignore</w:t>
+      </w:r>
+    </w:p>
+    <w:p>
+      <w:pPr>
+        <w:pStyle w:val="ListParagraph"/>
+        <w:numPr>
+          <w:ilvl w:val="0"/>
+          <w:numId w:val="2"/>
+        </w:numPr>
+      </w:pPr>
+      <w:r>
+        <w:rPr>
+          <w:rFonts w:ascii="Consolas" w:cs="Consolas" w:eastAsia="Consolas" w:hAnsi="Consolas"/>
+          <w:sz w:val="19"/>
+          <w:szCs w:val="19"/>
+        </w:rPr>
+        <w:t xml:space="preserve">Dockerfile</w:t>
+      </w:r>
+    </w:p>
+    <w:p>
+      <w:pPr>
+        <w:pStyle w:val="ListParagraph"/>
+        <w:numPr>
+          <w:ilvl w:val="0"/>
+          <w:numId w:val="2"/>
+        </w:numPr>
+      </w:pPr>
+      <w:r>
+        <w:rPr>
+          <w:rFonts w:ascii="Consolas" w:cs="Consolas" w:eastAsia="Consolas" w:hAnsi="Consolas"/>
+          <w:sz w:val="19"/>
+          <w:szCs w:val="19"/>
+        </w:rPr>
+        <w:t xml:space="preserve">docker-compose.yml</w:t>
+      </w:r>
+    </w:p>
+    <w:p>
+      <w:pPr>
+        <w:pStyle w:val="ListParagraph"/>
+        <w:numPr>
+          <w:ilvl w:val="0"/>
+          <w:numId w:val="2"/>
+        </w:numPr>
+      </w:pPr>
+      <w:r>
+        <w:rPr>
+          <w:rFonts w:ascii="Consolas" w:cs="Consolas" w:eastAsia="Consolas" w:hAnsi="Consolas"/>
+          <w:sz w:val="19"/>
+          <w:szCs w:val="19"/>
+        </w:rPr>
+        <w:t xml:space="preserve">README.md</w:t>
+      </w:r>
+    </w:p>
+    <w:p>
+      <w:pPr>
+        <w:pStyle w:val="ListParagraph"/>
+        <w:numPr>
+          <w:ilvl w:val="0"/>
+          <w:numId w:val="2"/>
+        </w:numPr>
+      </w:pPr>
+      <w:r>
+        <w:rPr>
+          <w:rFonts w:ascii="Consolas" w:cs="Consolas" w:eastAsia="Consolas" w:hAnsi="Consolas"/>
+          <w:sz w:val="19"/>
+          <w:szCs w:val="19"/>
+        </w:rPr>
+        <w:t xml:space="preserve">server/README.md</w:t>
+      </w:r>
+    </w:p>
+    <w:p>
+      <w:pPr>
+        <w:pStyle w:val="ListParagraph"/>
+        <w:numPr>
+          <w:ilvl w:val="0"/>
+          <w:numId w:val="2"/>
+        </w:numPr>
+      </w:pPr>
+      <w:r>
+        <w:rPr>
+          <w:rFonts w:ascii="Consolas" w:cs="Consolas" w:eastAsia="Consolas" w:hAnsi="Consolas"/>
+          <w:sz w:val="19"/>
+          <w:szCs w:val="19"/>
+        </w:rPr>
+        <w:t xml:space="preserve">docs/DEPLOYMENT_GUIDE.md</w:t>
+      </w:r>
+    </w:p>
+    <w:p>
+      <w:pPr>
+        <w:pStyle w:val="ListParagraph"/>
+        <w:numPr>
+          <w:ilvl w:val="0"/>
+          <w:numId w:val="2"/>
+        </w:numPr>
+      </w:pPr>
+      <w:r>
+        <w:rPr>
+          <w:rFonts w:ascii="Consolas" w:cs="Consolas" w:eastAsia="Consolas" w:hAnsi="Consolas"/>
+          <w:sz w:val="19"/>
+          <w:szCs w:val="19"/>
+        </w:rPr>
+        <w:t xml:space="preserve">docs/RELEASE_NOTES_v3.0.0_DRAFT.md</w:t>
+      </w:r>
+    </w:p>
+    <w:p>
+      <w:pPr>
+        <w:pStyle w:val="ListParagraph"/>
+        <w:numPr>
+          <w:ilvl w:val="0"/>
+          <w:numId w:val="2"/>
+        </w:numPr>
+      </w:pPr>
+      <w:r>
+        <w:rPr>
+          <w:rFonts w:ascii="Consolas" w:cs="Consolas" w:eastAsia="Consolas" w:hAnsi="Consolas"/>
+          <w:sz w:val="19"/>
+          <w:szCs w:val="19"/>
+        </w:rPr>
+        <w:t xml:space="preserve">docs/audit/P15_FINAL_RELEASE_READINESS.md</w:t>
+      </w:r>
+    </w:p>
+    <w:p>
+      <w:pPr>
+        <w:pStyle w:val="ListParagraph"/>
+        <w:numPr>
+          <w:ilvl w:val="0"/>
+          <w:numId w:val="2"/>
+        </w:numPr>
+      </w:pPr>
+      <w:r>
+        <w:rPr>
+          <w:rFonts w:ascii="Consolas" w:cs="Consolas" w:eastAsia="Consolas" w:hAnsi="Consolas"/>
+          <w:sz w:val="19"/>
+          <w:szCs w:val="19"/>
+        </w:rPr>
+        <w:t xml:space="preserve">docs/prompt_log.json</w:t>
+      </w:r>
+    </w:p>
+    <w:p>
+      <w:pPr>
+        <w:pStyle w:val="ListParagraph"/>
+        <w:numPr>
+          <w:ilvl w:val="0"/>
+          <w:numId w:val="2"/>
+        </w:numPr>
+      </w:pPr>
+      <w:r>
+        <w:rPr>
+          <w:rFonts w:ascii="Consolas" w:cs="Consolas" w:eastAsia="Consolas" w:hAnsi="Consolas"/>
+          <w:sz w:val="19"/>
+          <w:szCs w:val="19"/>
+        </w:rPr>
+        <w:t xml:space="preserve">docs/SplitStack_Prompt_Log.docx</w:t>
+      </w:r>
+    </w:p>
+    <w:p>
+      <w:pPr>
+        <w:pStyle w:val="ListParagraph"/>
+        <w:numPr>
+          <w:ilvl w:val="0"/>
+          <w:numId w:val="2"/>
+        </w:numPr>
+      </w:pPr>
+      <w:r>
+        <w:rPr>
+          <w:rFonts w:ascii="Consolas" w:cs="Consolas" w:eastAsia="Consolas" w:hAnsi="Consolas"/>
+          <w:sz w:val="19"/>
+          <w:szCs w:val="19"/>
+        </w:rPr>
+        <w:t xml:space="preserve">docs/SplitStack_Prompt_Log.pdf</w:t>
+      </w:r>
+    </w:p>
+    <w:p>
+      <w:pPr>
+        <w:spacing w:after="60" w:before="160"/>
+      </w:pPr>
+      <w:r>
+        <w:rPr>
+          <w:b/>
+          <w:bCs/>
+          <w:color w:val="4F46E5"/>
+          <w:spacing w:val="20"/>
+          <w:sz w:val="17"/>
+          <w:szCs w:val="17"/>
+        </w:rPr>
+        <w:t xml:space="preserve">RESULT</w:t>
+      </w:r>
+    </w:p>
+    <w:p>
+      <w:pPr>
+        <w:spacing w:after="80"/>
+      </w:pPr>
+      <w:r>
+        <w:rPr>
+          <w:sz w:val="21"/>
+          <w:szCs w:val="21"/>
+        </w:rPr>
+        <w:t xml:space="preserve">Completed P15 wrap-up with verified reproducible lockfile installations (0 vulnerabilities); executed client unit tests (201 passed), server unit tests (123 passed), HTML validation (25 files clean), and legacy Python tests (31 passed); created production Dockerfile, docker-compose.yml, DEPLOYMENT_GUIDE.md, RELEASE_NOTES_v3.0.0_DRAFT.md, and P15_FINAL_RELEASE_READINESS.md; consolidated READMEs; documented legacy Flask coexistence and unverified live DB/remote CI items; regenerated prompt log DOCX and PDF.</w:t>
+      </w:r>
+    </w:p>
+    <w:p>
+      <w:pPr>
+        <w:spacing w:after="60" w:before="160"/>
+      </w:pPr>
+      <w:r>
+        <w:rPr>
+          <w:b/>
+          <w:bCs/>
+          <w:color w:val="4F46E5"/>
+          <w:spacing w:val="20"/>
+          <w:sz w:val="17"/>
+          <w:szCs w:val="17"/>
+        </w:rPr>
+        <w:t xml:space="preserve">VERIFICATION</w:t>
+      </w:r>
+    </w:p>
+    <w:p>
+      <w:pPr>
+        <w:spacing w:after="80"/>
+      </w:pPr>
+      <w:r>
+        <w:rPr>
+          <w:sz w:val="21"/>
+          <w:szCs w:val="21"/>
+        </w:rPr>
+        <w:t xml:space="preserve">npm ci (0 vulnerabilities); npm --prefix server ci (0 vulnerabilities); npm run test:client (201 passed across 59 suites); npm run test:server:unit (123 passed across 43 suites); npm run lint:html (25 files clean); python -m pytest tests/... (31 passed); npm run test:integration (documented skip without live DB).</w:t>
+      </w:r>
+    </w:p>
+    <w:p>
+      <w:pPr>
+        <w:pBdr>
+          <w:bottom w:val="single" w:color="D9DBE5" w:sz="4" w:space="4"/>
+        </w:pBdr>
+        <w:spacing w:after="200"/>
+      </w:pPr>
+      <w:r>
+        <w:t xml:space="preserve"/>
       </w:r>
     </w:p>
     <w:sectPr>

</xml_diff>